<commit_message>
Refactored bank accoount page and backend side
</commit_message>
<xml_diff>
--- a/AiNetsoft Functions Description.docx
+++ b/AiNetsoft Functions Description.docx
@@ -26,10 +26,450 @@
       </w:r>
     </w:p>
     <w:p/>
+    <w:p>
+      <w:pPr>
+        <w:pStyle w:val="ListParagraph"/>
+        <w:numPr>
+          <w:ilvl w:val="0"/>
+          <w:numId w:val="5"/>
+        </w:numPr>
+      </w:pPr>
+      <w:r>
+        <w:t>In case</w:t>
+      </w:r>
+      <w:r>
+        <w:t xml:space="preserve"> of normal users, the screen </w:t>
+      </w:r>
+      <w:proofErr w:type="gramStart"/>
+      <w:r>
+        <w:t>appear</w:t>
+      </w:r>
+      <w:proofErr w:type="gramEnd"/>
+      <w:r>
+        <w:t xml:space="preserve"> in</w:t>
+      </w:r>
+      <w:r>
+        <w:t xml:space="preserve"> general as below</w:t>
+      </w:r>
+      <w:r>
+        <w:br/>
+      </w:r>
+      <w:r>
+        <w:drawing>
+          <wp:inline distT="0" distB="0" distL="0" distR="0" wp14:anchorId="192F310E" wp14:editId="5036CEEE">
+            <wp:extent cx="5943600" cy="2712085"/>
+            <wp:effectExtent l="0" t="0" r="0" b="0"/>
+            <wp:docPr id="2145969053" name="Picture 1"/>
+            <wp:cNvGraphicFramePr>
+              <a:graphicFrameLocks xmlns:a="http://schemas.openxmlformats.org/drawingml/2006/main" noChangeAspect="1"/>
+            </wp:cNvGraphicFramePr>
+            <a:graphic xmlns:a="http://schemas.openxmlformats.org/drawingml/2006/main">
+              <a:graphicData uri="http://schemas.openxmlformats.org/drawingml/2006/picture">
+                <pic:pic xmlns:pic="http://schemas.openxmlformats.org/drawingml/2006/picture">
+                  <pic:nvPicPr>
+                    <pic:cNvPr id="2145969053" name=""/>
+                    <pic:cNvPicPr/>
+                  </pic:nvPicPr>
+                  <pic:blipFill>
+                    <a:blip r:embed="rId5"/>
+                    <a:stretch>
+                      <a:fillRect/>
+                    </a:stretch>
+                  </pic:blipFill>
+                  <pic:spPr>
+                    <a:xfrm>
+                      <a:off x="0" y="0"/>
+                      <a:ext cx="5943600" cy="2712085"/>
+                    </a:xfrm>
+                    <a:prstGeom prst="rect">
+                      <a:avLst/>
+                    </a:prstGeom>
+                  </pic:spPr>
+                </pic:pic>
+              </a:graphicData>
+            </a:graphic>
+          </wp:inline>
+        </w:drawing>
+      </w:r>
+    </w:p>
+    <w:p>
+      <w:r>
+        <w:t>Normal users can edit their information via each page</w:t>
+      </w:r>
+    </w:p>
+    <w:p>
+      <w:pPr>
+        <w:pStyle w:val="ListParagraph"/>
+        <w:numPr>
+          <w:ilvl w:val="0"/>
+          <w:numId w:val="5"/>
+        </w:numPr>
+      </w:pPr>
+      <w:r>
+        <w:t xml:space="preserve">Edit all needed fields as the </w:t>
+      </w:r>
+      <w:proofErr w:type="gramStart"/>
+      <w:r>
+        <w:t>“ Ho</w:t>
+      </w:r>
+      <w:proofErr w:type="gramEnd"/>
+      <w:r>
+        <w:t xml:space="preserve"> so ca </w:t>
+      </w:r>
+      <w:proofErr w:type="spellStart"/>
+      <w:r>
+        <w:t>nhan</w:t>
+      </w:r>
+      <w:proofErr w:type="spellEnd"/>
+      <w:r>
+        <w:t xml:space="preserve">”.  The scenario that Phone number can be sync from the Sell request data to this page, also same for email. Data is </w:t>
+      </w:r>
+      <w:proofErr w:type="gramStart"/>
+      <w:r>
+        <w:t>storing</w:t>
+      </w:r>
+      <w:proofErr w:type="gramEnd"/>
+      <w:r>
+        <w:t xml:space="preserve"> in the User collection</w:t>
+      </w:r>
+    </w:p>
+    <w:p>
+      <w:pPr>
+        <w:pStyle w:val="ListParagraph"/>
+        <w:numPr>
+          <w:ilvl w:val="0"/>
+          <w:numId w:val="5"/>
+        </w:numPr>
+      </w:pPr>
+      <w:r>
+        <w:t xml:space="preserve">Tài </w:t>
+      </w:r>
+      <w:proofErr w:type="spellStart"/>
+      <w:r>
+        <w:t>khoản</w:t>
+      </w:r>
+      <w:proofErr w:type="spellEnd"/>
+      <w:r>
+        <w:t xml:space="preserve"> </w:t>
+      </w:r>
+      <w:proofErr w:type="spellStart"/>
+      <w:r>
+        <w:t>ngân</w:t>
+      </w:r>
+      <w:proofErr w:type="spellEnd"/>
+      <w:r>
+        <w:t xml:space="preserve"> hang is being s</w:t>
+      </w:r>
+      <w:r>
+        <w:t xml:space="preserve">tored in the </w:t>
+      </w:r>
+      <w:proofErr w:type="spellStart"/>
+      <w:r>
+        <w:t>bank_account</w:t>
+      </w:r>
+      <w:proofErr w:type="spellEnd"/>
+      <w:r>
+        <w:t xml:space="preserve"> collection. This also be sync when user request to become a Seller</w:t>
+      </w:r>
+    </w:p>
+    <w:p>
+      <w:r>
+        <w:drawing>
+          <wp:inline distT="0" distB="0" distL="0" distR="0" wp14:anchorId="671817B6" wp14:editId="2D54E67D">
+            <wp:extent cx="5943600" cy="2378075"/>
+            <wp:effectExtent l="0" t="0" r="0" b="3175"/>
+            <wp:docPr id="1674224159" name="Picture 1"/>
+            <wp:cNvGraphicFramePr>
+              <a:graphicFrameLocks xmlns:a="http://schemas.openxmlformats.org/drawingml/2006/main" noChangeAspect="1"/>
+            </wp:cNvGraphicFramePr>
+            <a:graphic xmlns:a="http://schemas.openxmlformats.org/drawingml/2006/main">
+              <a:graphicData uri="http://schemas.openxmlformats.org/drawingml/2006/picture">
+                <pic:pic xmlns:pic="http://schemas.openxmlformats.org/drawingml/2006/picture">
+                  <pic:nvPicPr>
+                    <pic:cNvPr id="1674224159" name=""/>
+                    <pic:cNvPicPr/>
+                  </pic:nvPicPr>
+                  <pic:blipFill>
+                    <a:blip r:embed="rId6"/>
+                    <a:stretch>
+                      <a:fillRect/>
+                    </a:stretch>
+                  </pic:blipFill>
+                  <pic:spPr>
+                    <a:xfrm>
+                      <a:off x="0" y="0"/>
+                      <a:ext cx="5943600" cy="2378075"/>
+                    </a:xfrm>
+                    <a:prstGeom prst="rect">
+                      <a:avLst/>
+                    </a:prstGeom>
+                  </pic:spPr>
+                </pic:pic>
+              </a:graphicData>
+            </a:graphic>
+          </wp:inline>
+        </w:drawing>
+      </w:r>
+    </w:p>
+    <w:p>
+      <w:pPr>
+        <w:pStyle w:val="ListParagraph"/>
+        <w:numPr>
+          <w:ilvl w:val="0"/>
+          <w:numId w:val="5"/>
+        </w:numPr>
+      </w:pPr>
+      <w:proofErr w:type="spellStart"/>
+      <w:r>
+        <w:lastRenderedPageBreak/>
+        <w:t>Địa</w:t>
+      </w:r>
+      <w:proofErr w:type="spellEnd"/>
+      <w:r>
+        <w:t xml:space="preserve"> </w:t>
+      </w:r>
+      <w:proofErr w:type="spellStart"/>
+      <w:r>
+        <w:t>chỉ</w:t>
+      </w:r>
+      <w:proofErr w:type="spellEnd"/>
+      <w:r>
+        <w:t xml:space="preserve"> </w:t>
+      </w:r>
+      <w:proofErr w:type="spellStart"/>
+      <w:r>
+        <w:t>nhận</w:t>
+      </w:r>
+      <w:proofErr w:type="spellEnd"/>
+      <w:r>
+        <w:t xml:space="preserve"> hang: Users can update data here. This is also synced to the Seller registry from if use request to become a Seller</w:t>
+      </w:r>
+    </w:p>
+    <w:p>
+      <w:r>
+        <w:drawing>
+          <wp:inline distT="0" distB="0" distL="0" distR="0" wp14:anchorId="4CB8BE21" wp14:editId="7CBF7B96">
+            <wp:extent cx="5943600" cy="2908935"/>
+            <wp:effectExtent l="0" t="0" r="0" b="5715"/>
+            <wp:docPr id="1567492959" name="Picture 1"/>
+            <wp:cNvGraphicFramePr>
+              <a:graphicFrameLocks xmlns:a="http://schemas.openxmlformats.org/drawingml/2006/main" noChangeAspect="1"/>
+            </wp:cNvGraphicFramePr>
+            <a:graphic xmlns:a="http://schemas.openxmlformats.org/drawingml/2006/main">
+              <a:graphicData uri="http://schemas.openxmlformats.org/drawingml/2006/picture">
+                <pic:pic xmlns:pic="http://schemas.openxmlformats.org/drawingml/2006/picture">
+                  <pic:nvPicPr>
+                    <pic:cNvPr id="1567492959" name=""/>
+                    <pic:cNvPicPr/>
+                  </pic:nvPicPr>
+                  <pic:blipFill>
+                    <a:blip r:embed="rId7"/>
+                    <a:stretch>
+                      <a:fillRect/>
+                    </a:stretch>
+                  </pic:blipFill>
+                  <pic:spPr>
+                    <a:xfrm>
+                      <a:off x="0" y="0"/>
+                      <a:ext cx="5943600" cy="2908935"/>
+                    </a:xfrm>
+                    <a:prstGeom prst="rect">
+                      <a:avLst/>
+                    </a:prstGeom>
+                  </pic:spPr>
+                </pic:pic>
+              </a:graphicData>
+            </a:graphic>
+          </wp:inline>
+        </w:drawing>
+      </w:r>
+    </w:p>
+    <w:p>
+      <w:pPr>
+        <w:pStyle w:val="ListParagraph"/>
+        <w:numPr>
+          <w:ilvl w:val="0"/>
+          <w:numId w:val="5"/>
+        </w:numPr>
+      </w:pPr>
+      <w:r>
+        <w:t>Change password: The change password is offered here</w:t>
+      </w:r>
+      <w:r>
+        <w:rPr>
+          <w:highlight w:val="yellow"/>
+        </w:rPr>
+        <w:t xml:space="preserve">. Future will implement a validation email account to make sure fake email is not available. </w:t>
+      </w:r>
+      <w:proofErr w:type="gramStart"/>
+      <w:r>
+        <w:rPr>
+          <w:highlight w:val="yellow"/>
+        </w:rPr>
+        <w:t>Also</w:t>
+      </w:r>
+      <w:proofErr w:type="gramEnd"/>
+      <w:r>
+        <w:rPr>
+          <w:highlight w:val="yellow"/>
+        </w:rPr>
+        <w:t xml:space="preserve"> the password constrain will be asked for stronger.</w:t>
+      </w:r>
+    </w:p>
+    <w:p>
+      <w:pPr>
+        <w:pStyle w:val="ListParagraph"/>
+      </w:pPr>
+      <w:r>
+        <w:drawing>
+          <wp:inline distT="0" distB="0" distL="0" distR="0" wp14:anchorId="54CCB5FC" wp14:editId="535D6361">
+            <wp:extent cx="5943600" cy="2646045"/>
+            <wp:effectExtent l="0" t="0" r="0" b="1905"/>
+            <wp:docPr id="464095102" name="Picture 1"/>
+            <wp:cNvGraphicFramePr>
+              <a:graphicFrameLocks xmlns:a="http://schemas.openxmlformats.org/drawingml/2006/main" noChangeAspect="1"/>
+            </wp:cNvGraphicFramePr>
+            <a:graphic xmlns:a="http://schemas.openxmlformats.org/drawingml/2006/main">
+              <a:graphicData uri="http://schemas.openxmlformats.org/drawingml/2006/picture">
+                <pic:pic xmlns:pic="http://schemas.openxmlformats.org/drawingml/2006/picture">
+                  <pic:nvPicPr>
+                    <pic:cNvPr id="464095102" name=""/>
+                    <pic:cNvPicPr/>
+                  </pic:nvPicPr>
+                  <pic:blipFill>
+                    <a:blip r:embed="rId8"/>
+                    <a:stretch>
+                      <a:fillRect/>
+                    </a:stretch>
+                  </pic:blipFill>
+                  <pic:spPr>
+                    <a:xfrm>
+                      <a:off x="0" y="0"/>
+                      <a:ext cx="5943600" cy="2646045"/>
+                    </a:xfrm>
+                    <a:prstGeom prst="rect">
+                      <a:avLst/>
+                    </a:prstGeom>
+                  </pic:spPr>
+                </pic:pic>
+              </a:graphicData>
+            </a:graphic>
+          </wp:inline>
+        </w:drawing>
+      </w:r>
+    </w:p>
+    <w:p>
+      <w:pPr>
+        <w:pStyle w:val="ListParagraph"/>
+        <w:numPr>
+          <w:ilvl w:val="0"/>
+          <w:numId w:val="5"/>
+        </w:numPr>
+      </w:pPr>
+      <w:r>
+        <w:t xml:space="preserve">Users purchasing status: Users can track their purchasing status here </w:t>
+      </w:r>
+    </w:p>
+    <w:p>
+      <w:r>
+        <w:lastRenderedPageBreak/>
+        <w:drawing>
+          <wp:inline distT="0" distB="0" distL="0" distR="0" wp14:anchorId="309E4F4B" wp14:editId="45173F7B">
+            <wp:extent cx="5943600" cy="2635250"/>
+            <wp:effectExtent l="0" t="0" r="0" b="0"/>
+            <wp:docPr id="773846673" name="Picture 1"/>
+            <wp:cNvGraphicFramePr>
+              <a:graphicFrameLocks xmlns:a="http://schemas.openxmlformats.org/drawingml/2006/main" noChangeAspect="1"/>
+            </wp:cNvGraphicFramePr>
+            <a:graphic xmlns:a="http://schemas.openxmlformats.org/drawingml/2006/main">
+              <a:graphicData uri="http://schemas.openxmlformats.org/drawingml/2006/picture">
+                <pic:pic xmlns:pic="http://schemas.openxmlformats.org/drawingml/2006/picture">
+                  <pic:nvPicPr>
+                    <pic:cNvPr id="773846673" name=""/>
+                    <pic:cNvPicPr/>
+                  </pic:nvPicPr>
+                  <pic:blipFill>
+                    <a:blip r:embed="rId9"/>
+                    <a:stretch>
+                      <a:fillRect/>
+                    </a:stretch>
+                  </pic:blipFill>
+                  <pic:spPr>
+                    <a:xfrm>
+                      <a:off x="0" y="0"/>
+                      <a:ext cx="5943600" cy="2635250"/>
+                    </a:xfrm>
+                    <a:prstGeom prst="rect">
+                      <a:avLst/>
+                    </a:prstGeom>
+                  </pic:spPr>
+                </pic:pic>
+              </a:graphicData>
+            </a:graphic>
+          </wp:inline>
+        </w:drawing>
+      </w:r>
+    </w:p>
     <w:p/>
-    <w:p/>
-    <w:p/>
-    <w:p/>
+    <w:p>
+      <w:pPr>
+        <w:pStyle w:val="ListParagraph"/>
+        <w:numPr>
+          <w:ilvl w:val="0"/>
+          <w:numId w:val="5"/>
+        </w:numPr>
+      </w:pPr>
+      <w:r>
+        <w:t xml:space="preserve">Become a seller: This contains a </w:t>
+      </w:r>
+      <w:proofErr w:type="gramStart"/>
+      <w:r>
+        <w:t>huge complex steps</w:t>
+      </w:r>
+      <w:proofErr w:type="gramEnd"/>
+      <w:r>
+        <w:t xml:space="preserve"> to register to become a Seller with using AI connection service support to scan to detect the fake CCCD info</w:t>
+      </w:r>
+    </w:p>
+    <w:p>
+      <w:r>
+        <w:drawing>
+          <wp:inline distT="0" distB="0" distL="0" distR="0" wp14:anchorId="28A55FF1" wp14:editId="1F817A24">
+            <wp:extent cx="5943600" cy="3066415"/>
+            <wp:effectExtent l="0" t="0" r="0" b="635"/>
+            <wp:docPr id="1073234817" name="Picture 1"/>
+            <wp:cNvGraphicFramePr>
+              <a:graphicFrameLocks xmlns:a="http://schemas.openxmlformats.org/drawingml/2006/main" noChangeAspect="1"/>
+            </wp:cNvGraphicFramePr>
+            <a:graphic xmlns:a="http://schemas.openxmlformats.org/drawingml/2006/main">
+              <a:graphicData uri="http://schemas.openxmlformats.org/drawingml/2006/picture">
+                <pic:pic xmlns:pic="http://schemas.openxmlformats.org/drawingml/2006/picture">
+                  <pic:nvPicPr>
+                    <pic:cNvPr id="1073234817" name=""/>
+                    <pic:cNvPicPr/>
+                  </pic:nvPicPr>
+                  <pic:blipFill>
+                    <a:blip r:embed="rId10"/>
+                    <a:stretch>
+                      <a:fillRect/>
+                    </a:stretch>
+                  </pic:blipFill>
+                  <pic:spPr>
+                    <a:xfrm>
+                      <a:off x="0" y="0"/>
+                      <a:ext cx="5943600" cy="3066415"/>
+                    </a:xfrm>
+                    <a:prstGeom prst="rect">
+                      <a:avLst/>
+                    </a:prstGeom>
+                  </pic:spPr>
+                </pic:pic>
+              </a:graphicData>
+            </a:graphic>
+          </wp:inline>
+        </w:drawing>
+      </w:r>
+    </w:p>
     <w:p>
       <w:pPr>
         <w:pStyle w:val="ListParagraph"/>
@@ -67,6 +507,7 @@
     <w:p/>
     <w:p>
       <w:r>
+        <w:lastRenderedPageBreak/>
         <w:t xml:space="preserve">        - </w:t>
       </w:r>
       <w:r>
@@ -358,7 +799,7 @@
                     <pic:cNvPicPr/>
                   </pic:nvPicPr>
                   <pic:blipFill>
-                    <a:blip r:embed="rId5"/>
+                    <a:blip r:embed="rId11"/>
                     <a:stretch>
                       <a:fillRect/>
                     </a:stretch>
@@ -438,755 +879,755 @@
     </w:p>
     <w:p>
       <w:r>
+        <w:t xml:space="preserve">                </w:t>
+      </w:r>
+      <w:proofErr w:type="spellStart"/>
+      <w:r>
+        <w:t>Hồ</w:t>
+      </w:r>
+      <w:proofErr w:type="spellEnd"/>
+      <w:r>
+        <w:t xml:space="preserve"> </w:t>
+      </w:r>
+      <w:proofErr w:type="spellStart"/>
+      <w:r>
+        <w:t>sơ</w:t>
+      </w:r>
+      <w:proofErr w:type="spellEnd"/>
+      <w:r>
+        <w:t xml:space="preserve"> </w:t>
+      </w:r>
+      <w:proofErr w:type="spellStart"/>
+      <w:r>
+        <w:t>của</w:t>
+      </w:r>
+      <w:proofErr w:type="spellEnd"/>
+      <w:r>
+        <w:t xml:space="preserve"> </w:t>
+      </w:r>
+      <w:proofErr w:type="spellStart"/>
+      <w:r>
+        <w:t>bạn</w:t>
+      </w:r>
+      <w:proofErr w:type="spellEnd"/>
+      <w:r>
+        <w:t xml:space="preserve"> </w:t>
+      </w:r>
+      <w:proofErr w:type="spellStart"/>
+      <w:r>
+        <w:t>đã</w:t>
+      </w:r>
+      <w:proofErr w:type="spellEnd"/>
+      <w:r>
+        <w:t xml:space="preserve"> </w:t>
+      </w:r>
+      <w:proofErr w:type="spellStart"/>
+      <w:r>
+        <w:t>được</w:t>
+      </w:r>
+      <w:proofErr w:type="spellEnd"/>
+      <w:r>
+        <w:t xml:space="preserve"> </w:t>
+      </w:r>
+      <w:proofErr w:type="spellStart"/>
+      <w:r>
+        <w:t>gửi</w:t>
+      </w:r>
+      <w:proofErr w:type="spellEnd"/>
+      <w:r>
+        <w:t xml:space="preserve">. </w:t>
+      </w:r>
+      <w:proofErr w:type="spellStart"/>
+      <w:r>
+        <w:t>Chúng</w:t>
+      </w:r>
+      <w:proofErr w:type="spellEnd"/>
+      <w:r>
+        <w:t xml:space="preserve"> </w:t>
+      </w:r>
+      <w:proofErr w:type="spellStart"/>
+      <w:r>
+        <w:t>tôi</w:t>
+      </w:r>
+      <w:proofErr w:type="spellEnd"/>
+      <w:r>
+        <w:t xml:space="preserve"> </w:t>
+      </w:r>
+      <w:proofErr w:type="spellStart"/>
+      <w:r>
+        <w:t>đã</w:t>
+      </w:r>
+      <w:proofErr w:type="spellEnd"/>
+      <w:r>
+        <w:t xml:space="preserve"> </w:t>
+      </w:r>
+      <w:proofErr w:type="spellStart"/>
+      <w:r>
+        <w:t>gửi</w:t>
+      </w:r>
+      <w:proofErr w:type="spellEnd"/>
+      <w:r>
+        <w:t xml:space="preserve"> email </w:t>
+      </w:r>
+      <w:proofErr w:type="spellStart"/>
+      <w:r>
+        <w:t>xác</w:t>
+      </w:r>
+      <w:proofErr w:type="spellEnd"/>
+      <w:r>
+        <w:t xml:space="preserve"> </w:t>
+      </w:r>
+      <w:proofErr w:type="spellStart"/>
+      <w:r>
+        <w:t>nhận</w:t>
+      </w:r>
+      <w:proofErr w:type="spellEnd"/>
+      <w:r>
+        <w:t xml:space="preserve"> </w:t>
+      </w:r>
+      <w:proofErr w:type="spellStart"/>
+      <w:r>
+        <w:t>đến</w:t>
+      </w:r>
+      <w:proofErr w:type="spellEnd"/>
+      <w:r>
+        <w:t xml:space="preserve"> pending@ainetsoft.com.</w:t>
+      </w:r>
+    </w:p>
+    <w:p/>
+    <w:p>
+      <w:r>
+        <w:t xml:space="preserve">                Phản </w:t>
+      </w:r>
+      <w:proofErr w:type="spellStart"/>
+      <w:r>
+        <w:t>hồi</w:t>
+      </w:r>
+      <w:proofErr w:type="spellEnd"/>
+      <w:r>
+        <w:t xml:space="preserve"> </w:t>
+      </w:r>
+      <w:proofErr w:type="spellStart"/>
+      <w:r>
+        <w:t>chậm</w:t>
+      </w:r>
+      <w:proofErr w:type="spellEnd"/>
+      <w:r>
+        <w:t xml:space="preserve"> </w:t>
+      </w:r>
+      <w:proofErr w:type="spellStart"/>
+      <w:r>
+        <w:t>nhất</w:t>
+      </w:r>
+      <w:proofErr w:type="spellEnd"/>
+      <w:r>
+        <w:t xml:space="preserve"> </w:t>
+      </w:r>
+      <w:proofErr w:type="spellStart"/>
+      <w:r>
+        <w:t>trong</w:t>
+      </w:r>
+      <w:proofErr w:type="spellEnd"/>
+      <w:r>
+        <w:t xml:space="preserve"> </w:t>
+      </w:r>
+      <w:proofErr w:type="spellStart"/>
+      <w:r>
+        <w:t>vòng</w:t>
+      </w:r>
+      <w:proofErr w:type="spellEnd"/>
+      <w:r>
+        <w:t xml:space="preserve"> 24h"</w:t>
+      </w:r>
+    </w:p>
+    <w:p>
+      <w:pPr>
+        <w:rPr>
+          <w:color w:val="EE0000"/>
+        </w:rPr>
+      </w:pPr>
+      <w:r>
+        <w:t xml:space="preserve">        -   When the seller </w:t>
+      </w:r>
+      <w:r>
+        <w:t>submission</w:t>
+      </w:r>
+      <w:r>
+        <w:t xml:space="preserve"> is denied, a message will be </w:t>
+      </w:r>
+      <w:r>
+        <w:t>raised</w:t>
+      </w:r>
+      <w:r>
+        <w:t xml:space="preserve"> in user dashboard like</w:t>
+      </w:r>
+      <w:r>
+        <w:t xml:space="preserve">: </w:t>
+      </w:r>
+      <w:r>
+        <w:tab/>
+      </w:r>
+      <w:r>
+        <w:rPr>
+          <w:color w:val="EE0000"/>
+        </w:rPr>
+        <w:t xml:space="preserve"> "</w:t>
+      </w:r>
+      <w:proofErr w:type="spellStart"/>
+      <w:r>
+        <w:rPr>
+          <w:color w:val="EE0000"/>
+        </w:rPr>
+        <w:t>Hồ</w:t>
+      </w:r>
+      <w:proofErr w:type="spellEnd"/>
+      <w:r>
+        <w:rPr>
+          <w:color w:val="EE0000"/>
+        </w:rPr>
+        <w:t xml:space="preserve"> </w:t>
+      </w:r>
+      <w:proofErr w:type="spellStart"/>
+      <w:r>
+        <w:rPr>
+          <w:color w:val="EE0000"/>
+        </w:rPr>
+        <w:t>sơ</w:t>
+      </w:r>
+      <w:proofErr w:type="spellEnd"/>
+      <w:r>
+        <w:rPr>
+          <w:color w:val="EE0000"/>
+        </w:rPr>
+        <w:t xml:space="preserve"> </w:t>
+      </w:r>
+      <w:proofErr w:type="spellStart"/>
+      <w:r>
+        <w:rPr>
+          <w:color w:val="EE0000"/>
+        </w:rPr>
+        <w:t>bị</w:t>
+      </w:r>
+      <w:proofErr w:type="spellEnd"/>
+      <w:r>
+        <w:rPr>
+          <w:color w:val="EE0000"/>
+        </w:rPr>
+        <w:t xml:space="preserve"> </w:t>
+      </w:r>
+      <w:proofErr w:type="spellStart"/>
+      <w:r>
+        <w:rPr>
+          <w:color w:val="EE0000"/>
+        </w:rPr>
+        <w:t>từ</w:t>
+      </w:r>
+      <w:proofErr w:type="spellEnd"/>
+      <w:r>
+        <w:rPr>
+          <w:color w:val="EE0000"/>
+        </w:rPr>
+        <w:t xml:space="preserve"> </w:t>
+      </w:r>
+      <w:proofErr w:type="spellStart"/>
+      <w:r>
+        <w:rPr>
+          <w:color w:val="EE0000"/>
+        </w:rPr>
+        <w:t>chối</w:t>
+      </w:r>
+      <w:proofErr w:type="spellEnd"/>
+    </w:p>
+    <w:p>
+      <w:pPr>
+        <w:rPr>
+          <w:color w:val="EE0000"/>
+        </w:rPr>
+      </w:pPr>
+      <w:r>
+        <w:rPr>
+          <w:color w:val="EE0000"/>
+        </w:rPr>
+        <w:t xml:space="preserve">                Lý </w:t>
+      </w:r>
+      <w:proofErr w:type="gramStart"/>
+      <w:r>
+        <w:rPr>
+          <w:color w:val="EE0000"/>
+        </w:rPr>
+        <w:t>do</w:t>
+      </w:r>
+      <w:proofErr w:type="gramEnd"/>
+      <w:r>
+        <w:rPr>
+          <w:color w:val="EE0000"/>
+        </w:rPr>
+        <w:t xml:space="preserve">: </w:t>
+      </w:r>
+      <w:proofErr w:type="spellStart"/>
+      <w:r>
+        <w:rPr>
+          <w:color w:val="EE0000"/>
+        </w:rPr>
+        <w:t>Chụp</w:t>
+      </w:r>
+      <w:proofErr w:type="spellEnd"/>
+      <w:r>
+        <w:rPr>
+          <w:color w:val="EE0000"/>
+        </w:rPr>
+        <w:t xml:space="preserve"> </w:t>
+      </w:r>
+      <w:proofErr w:type="spellStart"/>
+      <w:r>
+        <w:rPr>
+          <w:color w:val="EE0000"/>
+        </w:rPr>
+        <w:t>lại</w:t>
+      </w:r>
+      <w:proofErr w:type="spellEnd"/>
+      <w:r>
+        <w:rPr>
+          <w:color w:val="EE0000"/>
+        </w:rPr>
+        <w:t xml:space="preserve"> </w:t>
+      </w:r>
+      <w:proofErr w:type="spellStart"/>
+      <w:r>
+        <w:rPr>
+          <w:color w:val="EE0000"/>
+        </w:rPr>
+        <w:t>ảnh</w:t>
+      </w:r>
+      <w:proofErr w:type="spellEnd"/>
+      <w:r>
+        <w:rPr>
+          <w:color w:val="EE0000"/>
+        </w:rPr>
+        <w:t xml:space="preserve"> CCCD.</w:t>
+      </w:r>
+    </w:p>
+    <w:p>
+      <w:pPr>
+        <w:rPr>
+          <w:color w:val="EE0000"/>
+        </w:rPr>
+      </w:pPr>
+      <w:r>
+        <w:rPr>
+          <w:color w:val="EE0000"/>
+        </w:rPr>
+        <w:t xml:space="preserve">                </w:t>
+      </w:r>
+      <w:proofErr w:type="spellStart"/>
+      <w:r>
+        <w:rPr>
+          <w:color w:val="EE0000"/>
+        </w:rPr>
+        <w:t>Hệ</w:t>
+      </w:r>
+      <w:proofErr w:type="spellEnd"/>
+      <w:r>
+        <w:rPr>
+          <w:color w:val="EE0000"/>
+        </w:rPr>
+        <w:t xml:space="preserve"> </w:t>
+      </w:r>
+      <w:proofErr w:type="spellStart"/>
+      <w:r>
+        <w:rPr>
+          <w:color w:val="EE0000"/>
+        </w:rPr>
+        <w:t>thống</w:t>
+      </w:r>
+      <w:proofErr w:type="spellEnd"/>
+      <w:r>
+        <w:rPr>
+          <w:color w:val="EE0000"/>
+        </w:rPr>
+        <w:t xml:space="preserve"> </w:t>
+      </w:r>
+      <w:proofErr w:type="spellStart"/>
+      <w:r>
+        <w:rPr>
+          <w:color w:val="EE0000"/>
+        </w:rPr>
+        <w:t>không</w:t>
+      </w:r>
+      <w:proofErr w:type="spellEnd"/>
+      <w:r>
+        <w:rPr>
+          <w:color w:val="EE0000"/>
+        </w:rPr>
+        <w:t xml:space="preserve"> </w:t>
+      </w:r>
+      <w:proofErr w:type="spellStart"/>
+      <w:r>
+        <w:rPr>
+          <w:color w:val="EE0000"/>
+        </w:rPr>
+        <w:t>thể</w:t>
+      </w:r>
+      <w:proofErr w:type="spellEnd"/>
+      <w:r>
+        <w:rPr>
+          <w:color w:val="EE0000"/>
+        </w:rPr>
+        <w:t xml:space="preserve"> </w:t>
+      </w:r>
+      <w:proofErr w:type="spellStart"/>
+      <w:r>
+        <w:rPr>
+          <w:color w:val="EE0000"/>
+        </w:rPr>
+        <w:t>xác</w:t>
+      </w:r>
+      <w:proofErr w:type="spellEnd"/>
+      <w:r>
+        <w:rPr>
+          <w:color w:val="EE0000"/>
+        </w:rPr>
+        <w:t xml:space="preserve"> </w:t>
+      </w:r>
+      <w:proofErr w:type="spellStart"/>
+      <w:r>
+        <w:rPr>
+          <w:color w:val="EE0000"/>
+        </w:rPr>
+        <w:t>thực</w:t>
+      </w:r>
+      <w:proofErr w:type="spellEnd"/>
+      <w:r>
+        <w:rPr>
+          <w:color w:val="EE0000"/>
+        </w:rPr>
+        <w:t xml:space="preserve"> </w:t>
+      </w:r>
+      <w:proofErr w:type="spellStart"/>
+      <w:r>
+        <w:rPr>
+          <w:color w:val="EE0000"/>
+        </w:rPr>
+        <w:t>một</w:t>
+      </w:r>
+      <w:proofErr w:type="spellEnd"/>
+      <w:r>
+        <w:rPr>
+          <w:color w:val="EE0000"/>
+        </w:rPr>
+        <w:t xml:space="preserve"> </w:t>
+      </w:r>
+      <w:proofErr w:type="spellStart"/>
+      <w:r>
+        <w:rPr>
+          <w:color w:val="EE0000"/>
+        </w:rPr>
+        <w:t>số</w:t>
+      </w:r>
+      <w:proofErr w:type="spellEnd"/>
+      <w:r>
+        <w:rPr>
+          <w:color w:val="EE0000"/>
+        </w:rPr>
+        <w:t xml:space="preserve"> </w:t>
+      </w:r>
+      <w:proofErr w:type="spellStart"/>
+      <w:r>
+        <w:rPr>
+          <w:color w:val="EE0000"/>
+        </w:rPr>
+        <w:t>thông</w:t>
+      </w:r>
+      <w:proofErr w:type="spellEnd"/>
+      <w:r>
+        <w:rPr>
+          <w:color w:val="EE0000"/>
+        </w:rPr>
+        <w:t xml:space="preserve"> tin </w:t>
+      </w:r>
+      <w:proofErr w:type="spellStart"/>
+      <w:r>
+        <w:rPr>
+          <w:color w:val="EE0000"/>
+        </w:rPr>
+        <w:t>của</w:t>
+      </w:r>
+      <w:proofErr w:type="spellEnd"/>
+      <w:r>
+        <w:rPr>
+          <w:color w:val="EE0000"/>
+        </w:rPr>
+        <w:t xml:space="preserve"> </w:t>
+      </w:r>
+      <w:proofErr w:type="spellStart"/>
+      <w:r>
+        <w:rPr>
+          <w:color w:val="EE0000"/>
+        </w:rPr>
+        <w:t>bạn</w:t>
+      </w:r>
+      <w:proofErr w:type="spellEnd"/>
+      <w:r>
+        <w:rPr>
+          <w:color w:val="EE0000"/>
+        </w:rPr>
+        <w:t xml:space="preserve">. Vui </w:t>
+      </w:r>
+      <w:proofErr w:type="spellStart"/>
+      <w:r>
+        <w:rPr>
+          <w:color w:val="EE0000"/>
+        </w:rPr>
+        <w:t>lòng</w:t>
+      </w:r>
+      <w:proofErr w:type="spellEnd"/>
+      <w:r>
+        <w:rPr>
+          <w:color w:val="EE0000"/>
+        </w:rPr>
+        <w:t xml:space="preserve"> </w:t>
+      </w:r>
+      <w:proofErr w:type="spellStart"/>
+      <w:r>
+        <w:rPr>
+          <w:color w:val="EE0000"/>
+        </w:rPr>
+        <w:t>kiểm</w:t>
+      </w:r>
+      <w:proofErr w:type="spellEnd"/>
+      <w:r>
+        <w:rPr>
+          <w:color w:val="EE0000"/>
+        </w:rPr>
+        <w:t xml:space="preserve"> </w:t>
+      </w:r>
+      <w:proofErr w:type="spellStart"/>
+      <w:r>
+        <w:rPr>
+          <w:color w:val="EE0000"/>
+        </w:rPr>
+        <w:t>tra</w:t>
+      </w:r>
+      <w:proofErr w:type="spellEnd"/>
+      <w:r>
+        <w:rPr>
+          <w:color w:val="EE0000"/>
+        </w:rPr>
+        <w:t xml:space="preserve"> </w:t>
+      </w:r>
+      <w:proofErr w:type="spellStart"/>
+      <w:r>
+        <w:rPr>
+          <w:color w:val="EE0000"/>
+        </w:rPr>
+        <w:t>lại</w:t>
+      </w:r>
+      <w:proofErr w:type="spellEnd"/>
+      <w:r>
+        <w:rPr>
+          <w:color w:val="EE0000"/>
+        </w:rPr>
+        <w:t xml:space="preserve"> </w:t>
+      </w:r>
+      <w:proofErr w:type="spellStart"/>
+      <w:r>
+        <w:rPr>
+          <w:color w:val="EE0000"/>
+        </w:rPr>
+        <w:t>lý</w:t>
+      </w:r>
+      <w:proofErr w:type="spellEnd"/>
+      <w:r>
+        <w:rPr>
+          <w:color w:val="EE0000"/>
+        </w:rPr>
+        <w:t xml:space="preserve"> do </w:t>
+      </w:r>
+      <w:proofErr w:type="spellStart"/>
+      <w:r>
+        <w:rPr>
+          <w:color w:val="EE0000"/>
+        </w:rPr>
+        <w:t>trên</w:t>
+      </w:r>
+      <w:proofErr w:type="spellEnd"/>
+      <w:r>
+        <w:rPr>
+          <w:color w:val="EE0000"/>
+        </w:rPr>
+        <w:t xml:space="preserve"> </w:t>
+      </w:r>
+      <w:proofErr w:type="spellStart"/>
+      <w:r>
+        <w:rPr>
+          <w:color w:val="EE0000"/>
+        </w:rPr>
+        <w:t>và</w:t>
+      </w:r>
+      <w:proofErr w:type="spellEnd"/>
+      <w:r>
+        <w:rPr>
+          <w:color w:val="EE0000"/>
+        </w:rPr>
+        <w:t xml:space="preserve"> </w:t>
+      </w:r>
+      <w:proofErr w:type="spellStart"/>
+      <w:r>
+        <w:rPr>
+          <w:color w:val="EE0000"/>
+        </w:rPr>
+        <w:t>cập</w:t>
+      </w:r>
+      <w:proofErr w:type="spellEnd"/>
+      <w:r>
+        <w:rPr>
+          <w:color w:val="EE0000"/>
+        </w:rPr>
+        <w:t xml:space="preserve"> </w:t>
+      </w:r>
+      <w:proofErr w:type="spellStart"/>
+      <w:r>
+        <w:rPr>
+          <w:color w:val="EE0000"/>
+        </w:rPr>
+        <w:t>nhật</w:t>
+      </w:r>
+      <w:proofErr w:type="spellEnd"/>
+      <w:r>
+        <w:rPr>
+          <w:color w:val="EE0000"/>
+        </w:rPr>
+        <w:t xml:space="preserve"> </w:t>
+      </w:r>
+      <w:proofErr w:type="spellStart"/>
+      <w:r>
+        <w:rPr>
+          <w:color w:val="EE0000"/>
+        </w:rPr>
+        <w:t>hồ</w:t>
+      </w:r>
+      <w:proofErr w:type="spellEnd"/>
+      <w:r>
+        <w:rPr>
+          <w:color w:val="EE0000"/>
+        </w:rPr>
+        <w:t xml:space="preserve"> </w:t>
+      </w:r>
+      <w:proofErr w:type="spellStart"/>
+      <w:r>
+        <w:rPr>
+          <w:color w:val="EE0000"/>
+        </w:rPr>
+        <w:t>sơ</w:t>
+      </w:r>
+      <w:proofErr w:type="spellEnd"/>
+      <w:r>
+        <w:rPr>
+          <w:color w:val="EE0000"/>
+        </w:rPr>
+        <w:t xml:space="preserve"> </w:t>
+      </w:r>
+      <w:proofErr w:type="spellStart"/>
+      <w:r>
+        <w:rPr>
+          <w:color w:val="EE0000"/>
+        </w:rPr>
+        <w:t>chính</w:t>
+      </w:r>
+      <w:proofErr w:type="spellEnd"/>
+      <w:r>
+        <w:rPr>
+          <w:color w:val="EE0000"/>
+        </w:rPr>
+        <w:t xml:space="preserve"> </w:t>
+      </w:r>
+      <w:proofErr w:type="spellStart"/>
+      <w:r>
+        <w:rPr>
+          <w:color w:val="EE0000"/>
+        </w:rPr>
+        <w:t>xác</w:t>
+      </w:r>
+      <w:proofErr w:type="spellEnd"/>
+      <w:r>
+        <w:rPr>
+          <w:color w:val="EE0000"/>
+        </w:rPr>
+        <w:t xml:space="preserve"> </w:t>
+      </w:r>
+      <w:proofErr w:type="spellStart"/>
+      <w:r>
+        <w:rPr>
+          <w:color w:val="EE0000"/>
+        </w:rPr>
+        <w:t>trước</w:t>
+      </w:r>
+      <w:proofErr w:type="spellEnd"/>
+      <w:r>
+        <w:rPr>
+          <w:color w:val="EE0000"/>
+        </w:rPr>
+        <w:t xml:space="preserve"> </w:t>
+      </w:r>
+      <w:proofErr w:type="spellStart"/>
+      <w:r>
+        <w:rPr>
+          <w:color w:val="EE0000"/>
+        </w:rPr>
+        <w:t>khi</w:t>
+      </w:r>
+      <w:proofErr w:type="spellEnd"/>
+      <w:r>
+        <w:rPr>
+          <w:color w:val="EE0000"/>
+        </w:rPr>
+        <w:t xml:space="preserve"> </w:t>
+      </w:r>
+      <w:proofErr w:type="spellStart"/>
+      <w:r>
+        <w:rPr>
+          <w:color w:val="EE0000"/>
+        </w:rPr>
+        <w:t>gửi</w:t>
+      </w:r>
+      <w:proofErr w:type="spellEnd"/>
+      <w:r>
+        <w:rPr>
+          <w:color w:val="EE0000"/>
+        </w:rPr>
+        <w:t xml:space="preserve"> </w:t>
+      </w:r>
+      <w:proofErr w:type="spellStart"/>
+      <w:r>
+        <w:rPr>
+          <w:color w:val="EE0000"/>
+        </w:rPr>
+        <w:t>lại</w:t>
+      </w:r>
+      <w:proofErr w:type="spellEnd"/>
+      <w:r>
+        <w:rPr>
+          <w:color w:val="EE0000"/>
+        </w:rPr>
+        <w:t>."</w:t>
+      </w:r>
+    </w:p>
+    <w:p/>
+    <w:p>
+      <w:r>
+        <w:t xml:space="preserve">                A button also </w:t>
+      </w:r>
+      <w:r>
+        <w:t>sees</w:t>
+      </w:r>
+      <w:r>
+        <w:t xml:space="preserve"> here to ask the user back from scratch and resend the "become seller" request again</w:t>
+      </w:r>
+    </w:p>
+    <w:p/>
+    <w:p>
+      <w:r>
         <w:lastRenderedPageBreak/>
-        <w:t xml:space="preserve">                </w:t>
-      </w:r>
-      <w:proofErr w:type="spellStart"/>
-      <w:r>
-        <w:t>Hồ</w:t>
-      </w:r>
-      <w:proofErr w:type="spellEnd"/>
-      <w:r>
-        <w:t xml:space="preserve"> </w:t>
-      </w:r>
-      <w:proofErr w:type="spellStart"/>
-      <w:r>
-        <w:t>sơ</w:t>
-      </w:r>
-      <w:proofErr w:type="spellEnd"/>
-      <w:r>
-        <w:t xml:space="preserve"> </w:t>
-      </w:r>
-      <w:proofErr w:type="spellStart"/>
-      <w:r>
-        <w:t>của</w:t>
-      </w:r>
-      <w:proofErr w:type="spellEnd"/>
-      <w:r>
-        <w:t xml:space="preserve"> </w:t>
-      </w:r>
-      <w:proofErr w:type="spellStart"/>
-      <w:r>
-        <w:t>bạn</w:t>
-      </w:r>
-      <w:proofErr w:type="spellEnd"/>
-      <w:r>
-        <w:t xml:space="preserve"> </w:t>
-      </w:r>
-      <w:proofErr w:type="spellStart"/>
-      <w:r>
-        <w:t>đã</w:t>
-      </w:r>
-      <w:proofErr w:type="spellEnd"/>
-      <w:r>
-        <w:t xml:space="preserve"> </w:t>
-      </w:r>
-      <w:proofErr w:type="spellStart"/>
-      <w:r>
-        <w:t>được</w:t>
-      </w:r>
-      <w:proofErr w:type="spellEnd"/>
-      <w:r>
-        <w:t xml:space="preserve"> </w:t>
-      </w:r>
-      <w:proofErr w:type="spellStart"/>
-      <w:r>
-        <w:t>gửi</w:t>
-      </w:r>
-      <w:proofErr w:type="spellEnd"/>
-      <w:r>
-        <w:t xml:space="preserve">. </w:t>
-      </w:r>
-      <w:proofErr w:type="spellStart"/>
-      <w:r>
-        <w:t>Chúng</w:t>
-      </w:r>
-      <w:proofErr w:type="spellEnd"/>
-      <w:r>
-        <w:t xml:space="preserve"> </w:t>
-      </w:r>
-      <w:proofErr w:type="spellStart"/>
-      <w:r>
-        <w:t>tôi</w:t>
-      </w:r>
-      <w:proofErr w:type="spellEnd"/>
-      <w:r>
-        <w:t xml:space="preserve"> </w:t>
-      </w:r>
-      <w:proofErr w:type="spellStart"/>
-      <w:r>
-        <w:t>đã</w:t>
-      </w:r>
-      <w:proofErr w:type="spellEnd"/>
-      <w:r>
-        <w:t xml:space="preserve"> </w:t>
-      </w:r>
-      <w:proofErr w:type="spellStart"/>
-      <w:r>
-        <w:t>gửi</w:t>
-      </w:r>
-      <w:proofErr w:type="spellEnd"/>
-      <w:r>
-        <w:t xml:space="preserve"> email </w:t>
-      </w:r>
-      <w:proofErr w:type="spellStart"/>
-      <w:r>
-        <w:t>xác</w:t>
-      </w:r>
-      <w:proofErr w:type="spellEnd"/>
-      <w:r>
-        <w:t xml:space="preserve"> </w:t>
-      </w:r>
-      <w:proofErr w:type="spellStart"/>
-      <w:r>
-        <w:t>nhận</w:t>
-      </w:r>
-      <w:proofErr w:type="spellEnd"/>
-      <w:r>
-        <w:t xml:space="preserve"> </w:t>
-      </w:r>
-      <w:proofErr w:type="spellStart"/>
-      <w:r>
-        <w:t>đến</w:t>
-      </w:r>
-      <w:proofErr w:type="spellEnd"/>
-      <w:r>
-        <w:t xml:space="preserve"> pending@ainetsoft.com.</w:t>
-      </w:r>
-    </w:p>
-    <w:p/>
-    <w:p>
-      <w:r>
-        <w:t xml:space="preserve">                Phản </w:t>
-      </w:r>
-      <w:proofErr w:type="spellStart"/>
-      <w:r>
-        <w:t>hồi</w:t>
-      </w:r>
-      <w:proofErr w:type="spellEnd"/>
-      <w:r>
-        <w:t xml:space="preserve"> </w:t>
-      </w:r>
-      <w:proofErr w:type="spellStart"/>
-      <w:r>
-        <w:t>chậm</w:t>
-      </w:r>
-      <w:proofErr w:type="spellEnd"/>
-      <w:r>
-        <w:t xml:space="preserve"> </w:t>
-      </w:r>
-      <w:proofErr w:type="spellStart"/>
-      <w:r>
-        <w:t>nhất</w:t>
-      </w:r>
-      <w:proofErr w:type="spellEnd"/>
-      <w:r>
-        <w:t xml:space="preserve"> </w:t>
-      </w:r>
-      <w:proofErr w:type="spellStart"/>
-      <w:r>
-        <w:t>trong</w:t>
-      </w:r>
-      <w:proofErr w:type="spellEnd"/>
-      <w:r>
-        <w:t xml:space="preserve"> </w:t>
-      </w:r>
-      <w:proofErr w:type="spellStart"/>
-      <w:r>
-        <w:t>vòng</w:t>
-      </w:r>
-      <w:proofErr w:type="spellEnd"/>
-      <w:r>
-        <w:t xml:space="preserve"> 24h"</w:t>
-      </w:r>
-    </w:p>
-    <w:p>
-      <w:pPr>
-        <w:rPr>
-          <w:color w:val="EE0000"/>
-        </w:rPr>
-      </w:pPr>
-      <w:r>
-        <w:t xml:space="preserve">        -   When the seller </w:t>
-      </w:r>
-      <w:r>
-        <w:t>submission</w:t>
-      </w:r>
-      <w:r>
-        <w:t xml:space="preserve"> is denied, a message will be </w:t>
-      </w:r>
-      <w:r>
-        <w:t>raised</w:t>
-      </w:r>
-      <w:r>
-        <w:t xml:space="preserve"> in user dashboard like</w:t>
-      </w:r>
-      <w:r>
-        <w:t xml:space="preserve">: </w:t>
-      </w:r>
-      <w:r>
-        <w:tab/>
-      </w:r>
-      <w:r>
-        <w:rPr>
-          <w:color w:val="EE0000"/>
-        </w:rPr>
-        <w:t xml:space="preserve"> "</w:t>
-      </w:r>
-      <w:proofErr w:type="spellStart"/>
-      <w:r>
-        <w:rPr>
-          <w:color w:val="EE0000"/>
-        </w:rPr>
-        <w:t>Hồ</w:t>
-      </w:r>
-      <w:proofErr w:type="spellEnd"/>
-      <w:r>
-        <w:rPr>
-          <w:color w:val="EE0000"/>
-        </w:rPr>
-        <w:t xml:space="preserve"> </w:t>
-      </w:r>
-      <w:proofErr w:type="spellStart"/>
-      <w:r>
-        <w:rPr>
-          <w:color w:val="EE0000"/>
-        </w:rPr>
-        <w:t>sơ</w:t>
-      </w:r>
-      <w:proofErr w:type="spellEnd"/>
-      <w:r>
-        <w:rPr>
-          <w:color w:val="EE0000"/>
-        </w:rPr>
-        <w:t xml:space="preserve"> </w:t>
-      </w:r>
-      <w:proofErr w:type="spellStart"/>
-      <w:r>
-        <w:rPr>
-          <w:color w:val="EE0000"/>
-        </w:rPr>
-        <w:t>bị</w:t>
-      </w:r>
-      <w:proofErr w:type="spellEnd"/>
-      <w:r>
-        <w:rPr>
-          <w:color w:val="EE0000"/>
-        </w:rPr>
-        <w:t xml:space="preserve"> </w:t>
-      </w:r>
-      <w:proofErr w:type="spellStart"/>
-      <w:r>
-        <w:rPr>
-          <w:color w:val="EE0000"/>
-        </w:rPr>
-        <w:t>từ</w:t>
-      </w:r>
-      <w:proofErr w:type="spellEnd"/>
-      <w:r>
-        <w:rPr>
-          <w:color w:val="EE0000"/>
-        </w:rPr>
-        <w:t xml:space="preserve"> </w:t>
-      </w:r>
-      <w:proofErr w:type="spellStart"/>
-      <w:r>
-        <w:rPr>
-          <w:color w:val="EE0000"/>
-        </w:rPr>
-        <w:t>chối</w:t>
-      </w:r>
-      <w:proofErr w:type="spellEnd"/>
-    </w:p>
-    <w:p>
-      <w:pPr>
-        <w:rPr>
-          <w:color w:val="EE0000"/>
-        </w:rPr>
-      </w:pPr>
-      <w:r>
-        <w:rPr>
-          <w:color w:val="EE0000"/>
-        </w:rPr>
-        <w:t xml:space="preserve">                Lý </w:t>
-      </w:r>
-      <w:proofErr w:type="gramStart"/>
-      <w:r>
-        <w:rPr>
-          <w:color w:val="EE0000"/>
-        </w:rPr>
-        <w:t>do</w:t>
-      </w:r>
-      <w:proofErr w:type="gramEnd"/>
-      <w:r>
-        <w:rPr>
-          <w:color w:val="EE0000"/>
-        </w:rPr>
-        <w:t xml:space="preserve">: </w:t>
-      </w:r>
-      <w:proofErr w:type="spellStart"/>
-      <w:r>
-        <w:rPr>
-          <w:color w:val="EE0000"/>
-        </w:rPr>
-        <w:t>Chụp</w:t>
-      </w:r>
-      <w:proofErr w:type="spellEnd"/>
-      <w:r>
-        <w:rPr>
-          <w:color w:val="EE0000"/>
-        </w:rPr>
-        <w:t xml:space="preserve"> </w:t>
-      </w:r>
-      <w:proofErr w:type="spellStart"/>
-      <w:r>
-        <w:rPr>
-          <w:color w:val="EE0000"/>
-        </w:rPr>
-        <w:t>lại</w:t>
-      </w:r>
-      <w:proofErr w:type="spellEnd"/>
-      <w:r>
-        <w:rPr>
-          <w:color w:val="EE0000"/>
-        </w:rPr>
-        <w:t xml:space="preserve"> </w:t>
-      </w:r>
-      <w:proofErr w:type="spellStart"/>
-      <w:r>
-        <w:rPr>
-          <w:color w:val="EE0000"/>
-        </w:rPr>
-        <w:t>ảnh</w:t>
-      </w:r>
-      <w:proofErr w:type="spellEnd"/>
-      <w:r>
-        <w:rPr>
-          <w:color w:val="EE0000"/>
-        </w:rPr>
-        <w:t xml:space="preserve"> CCCD.</w:t>
-      </w:r>
-    </w:p>
-    <w:p>
-      <w:pPr>
-        <w:rPr>
-          <w:color w:val="EE0000"/>
-        </w:rPr>
-      </w:pPr>
-      <w:r>
-        <w:rPr>
-          <w:color w:val="EE0000"/>
-        </w:rPr>
-        <w:t xml:space="preserve">                </w:t>
-      </w:r>
-      <w:proofErr w:type="spellStart"/>
-      <w:r>
-        <w:rPr>
-          <w:color w:val="EE0000"/>
-        </w:rPr>
-        <w:t>Hệ</w:t>
-      </w:r>
-      <w:proofErr w:type="spellEnd"/>
-      <w:r>
-        <w:rPr>
-          <w:color w:val="EE0000"/>
-        </w:rPr>
-        <w:t xml:space="preserve"> </w:t>
-      </w:r>
-      <w:proofErr w:type="spellStart"/>
-      <w:r>
-        <w:rPr>
-          <w:color w:val="EE0000"/>
-        </w:rPr>
-        <w:t>thống</w:t>
-      </w:r>
-      <w:proofErr w:type="spellEnd"/>
-      <w:r>
-        <w:rPr>
-          <w:color w:val="EE0000"/>
-        </w:rPr>
-        <w:t xml:space="preserve"> </w:t>
-      </w:r>
-      <w:proofErr w:type="spellStart"/>
-      <w:r>
-        <w:rPr>
-          <w:color w:val="EE0000"/>
-        </w:rPr>
-        <w:t>không</w:t>
-      </w:r>
-      <w:proofErr w:type="spellEnd"/>
-      <w:r>
-        <w:rPr>
-          <w:color w:val="EE0000"/>
-        </w:rPr>
-        <w:t xml:space="preserve"> </w:t>
-      </w:r>
-      <w:proofErr w:type="spellStart"/>
-      <w:r>
-        <w:rPr>
-          <w:color w:val="EE0000"/>
-        </w:rPr>
-        <w:t>thể</w:t>
-      </w:r>
-      <w:proofErr w:type="spellEnd"/>
-      <w:r>
-        <w:rPr>
-          <w:color w:val="EE0000"/>
-        </w:rPr>
-        <w:t xml:space="preserve"> </w:t>
-      </w:r>
-      <w:proofErr w:type="spellStart"/>
-      <w:r>
-        <w:rPr>
-          <w:color w:val="EE0000"/>
-        </w:rPr>
-        <w:t>xác</w:t>
-      </w:r>
-      <w:proofErr w:type="spellEnd"/>
-      <w:r>
-        <w:rPr>
-          <w:color w:val="EE0000"/>
-        </w:rPr>
-        <w:t xml:space="preserve"> </w:t>
-      </w:r>
-      <w:proofErr w:type="spellStart"/>
-      <w:r>
-        <w:rPr>
-          <w:color w:val="EE0000"/>
-        </w:rPr>
-        <w:t>thực</w:t>
-      </w:r>
-      <w:proofErr w:type="spellEnd"/>
-      <w:r>
-        <w:rPr>
-          <w:color w:val="EE0000"/>
-        </w:rPr>
-        <w:t xml:space="preserve"> </w:t>
-      </w:r>
-      <w:proofErr w:type="spellStart"/>
-      <w:r>
-        <w:rPr>
-          <w:color w:val="EE0000"/>
-        </w:rPr>
-        <w:t>một</w:t>
-      </w:r>
-      <w:proofErr w:type="spellEnd"/>
-      <w:r>
-        <w:rPr>
-          <w:color w:val="EE0000"/>
-        </w:rPr>
-        <w:t xml:space="preserve"> </w:t>
-      </w:r>
-      <w:proofErr w:type="spellStart"/>
-      <w:r>
-        <w:rPr>
-          <w:color w:val="EE0000"/>
-        </w:rPr>
-        <w:t>số</w:t>
-      </w:r>
-      <w:proofErr w:type="spellEnd"/>
-      <w:r>
-        <w:rPr>
-          <w:color w:val="EE0000"/>
-        </w:rPr>
-        <w:t xml:space="preserve"> </w:t>
-      </w:r>
-      <w:proofErr w:type="spellStart"/>
-      <w:r>
-        <w:rPr>
-          <w:color w:val="EE0000"/>
-        </w:rPr>
-        <w:t>thông</w:t>
-      </w:r>
-      <w:proofErr w:type="spellEnd"/>
-      <w:r>
-        <w:rPr>
-          <w:color w:val="EE0000"/>
-        </w:rPr>
-        <w:t xml:space="preserve"> tin </w:t>
-      </w:r>
-      <w:proofErr w:type="spellStart"/>
-      <w:r>
-        <w:rPr>
-          <w:color w:val="EE0000"/>
-        </w:rPr>
-        <w:t>của</w:t>
-      </w:r>
-      <w:proofErr w:type="spellEnd"/>
-      <w:r>
-        <w:rPr>
-          <w:color w:val="EE0000"/>
-        </w:rPr>
-        <w:t xml:space="preserve"> </w:t>
-      </w:r>
-      <w:proofErr w:type="spellStart"/>
-      <w:r>
-        <w:rPr>
-          <w:color w:val="EE0000"/>
-        </w:rPr>
-        <w:t>bạn</w:t>
-      </w:r>
-      <w:proofErr w:type="spellEnd"/>
-      <w:r>
-        <w:rPr>
-          <w:color w:val="EE0000"/>
-        </w:rPr>
-        <w:t xml:space="preserve">. Vui </w:t>
-      </w:r>
-      <w:proofErr w:type="spellStart"/>
-      <w:r>
-        <w:rPr>
-          <w:color w:val="EE0000"/>
-        </w:rPr>
-        <w:t>lòng</w:t>
-      </w:r>
-      <w:proofErr w:type="spellEnd"/>
-      <w:r>
-        <w:rPr>
-          <w:color w:val="EE0000"/>
-        </w:rPr>
-        <w:t xml:space="preserve"> </w:t>
-      </w:r>
-      <w:proofErr w:type="spellStart"/>
-      <w:r>
-        <w:rPr>
-          <w:color w:val="EE0000"/>
-        </w:rPr>
-        <w:t>kiểm</w:t>
-      </w:r>
-      <w:proofErr w:type="spellEnd"/>
-      <w:r>
-        <w:rPr>
-          <w:color w:val="EE0000"/>
-        </w:rPr>
-        <w:t xml:space="preserve"> </w:t>
-      </w:r>
-      <w:proofErr w:type="spellStart"/>
-      <w:r>
-        <w:rPr>
-          <w:color w:val="EE0000"/>
-        </w:rPr>
-        <w:t>tra</w:t>
-      </w:r>
-      <w:proofErr w:type="spellEnd"/>
-      <w:r>
-        <w:rPr>
-          <w:color w:val="EE0000"/>
-        </w:rPr>
-        <w:t xml:space="preserve"> </w:t>
-      </w:r>
-      <w:proofErr w:type="spellStart"/>
-      <w:r>
-        <w:rPr>
-          <w:color w:val="EE0000"/>
-        </w:rPr>
-        <w:t>lại</w:t>
-      </w:r>
-      <w:proofErr w:type="spellEnd"/>
-      <w:r>
-        <w:rPr>
-          <w:color w:val="EE0000"/>
-        </w:rPr>
-        <w:t xml:space="preserve"> </w:t>
-      </w:r>
-      <w:proofErr w:type="spellStart"/>
-      <w:r>
-        <w:rPr>
-          <w:color w:val="EE0000"/>
-        </w:rPr>
-        <w:t>lý</w:t>
-      </w:r>
-      <w:proofErr w:type="spellEnd"/>
-      <w:r>
-        <w:rPr>
-          <w:color w:val="EE0000"/>
-        </w:rPr>
-        <w:t xml:space="preserve"> do </w:t>
-      </w:r>
-      <w:proofErr w:type="spellStart"/>
-      <w:r>
-        <w:rPr>
-          <w:color w:val="EE0000"/>
-        </w:rPr>
-        <w:t>trên</w:t>
-      </w:r>
-      <w:proofErr w:type="spellEnd"/>
-      <w:r>
-        <w:rPr>
-          <w:color w:val="EE0000"/>
-        </w:rPr>
-        <w:t xml:space="preserve"> </w:t>
-      </w:r>
-      <w:proofErr w:type="spellStart"/>
-      <w:r>
-        <w:rPr>
-          <w:color w:val="EE0000"/>
-        </w:rPr>
-        <w:t>và</w:t>
-      </w:r>
-      <w:proofErr w:type="spellEnd"/>
-      <w:r>
-        <w:rPr>
-          <w:color w:val="EE0000"/>
-        </w:rPr>
-        <w:t xml:space="preserve"> </w:t>
-      </w:r>
-      <w:proofErr w:type="spellStart"/>
-      <w:r>
-        <w:rPr>
-          <w:color w:val="EE0000"/>
-        </w:rPr>
-        <w:t>cập</w:t>
-      </w:r>
-      <w:proofErr w:type="spellEnd"/>
-      <w:r>
-        <w:rPr>
-          <w:color w:val="EE0000"/>
-        </w:rPr>
-        <w:t xml:space="preserve"> </w:t>
-      </w:r>
-      <w:proofErr w:type="spellStart"/>
-      <w:r>
-        <w:rPr>
-          <w:color w:val="EE0000"/>
-        </w:rPr>
-        <w:t>nhật</w:t>
-      </w:r>
-      <w:proofErr w:type="spellEnd"/>
-      <w:r>
-        <w:rPr>
-          <w:color w:val="EE0000"/>
-        </w:rPr>
-        <w:t xml:space="preserve"> </w:t>
-      </w:r>
-      <w:proofErr w:type="spellStart"/>
-      <w:r>
-        <w:rPr>
-          <w:color w:val="EE0000"/>
-        </w:rPr>
-        <w:t>hồ</w:t>
-      </w:r>
-      <w:proofErr w:type="spellEnd"/>
-      <w:r>
-        <w:rPr>
-          <w:color w:val="EE0000"/>
-        </w:rPr>
-        <w:t xml:space="preserve"> </w:t>
-      </w:r>
-      <w:proofErr w:type="spellStart"/>
-      <w:r>
-        <w:rPr>
-          <w:color w:val="EE0000"/>
-        </w:rPr>
-        <w:t>sơ</w:t>
-      </w:r>
-      <w:proofErr w:type="spellEnd"/>
-      <w:r>
-        <w:rPr>
-          <w:color w:val="EE0000"/>
-        </w:rPr>
-        <w:t xml:space="preserve"> </w:t>
-      </w:r>
-      <w:proofErr w:type="spellStart"/>
-      <w:r>
-        <w:rPr>
-          <w:color w:val="EE0000"/>
-        </w:rPr>
-        <w:t>chính</w:t>
-      </w:r>
-      <w:proofErr w:type="spellEnd"/>
-      <w:r>
-        <w:rPr>
-          <w:color w:val="EE0000"/>
-        </w:rPr>
-        <w:t xml:space="preserve"> </w:t>
-      </w:r>
-      <w:proofErr w:type="spellStart"/>
-      <w:r>
-        <w:rPr>
-          <w:color w:val="EE0000"/>
-        </w:rPr>
-        <w:t>xác</w:t>
-      </w:r>
-      <w:proofErr w:type="spellEnd"/>
-      <w:r>
-        <w:rPr>
-          <w:color w:val="EE0000"/>
-        </w:rPr>
-        <w:t xml:space="preserve"> </w:t>
-      </w:r>
-      <w:proofErr w:type="spellStart"/>
-      <w:r>
-        <w:rPr>
-          <w:color w:val="EE0000"/>
-        </w:rPr>
-        <w:t>trước</w:t>
-      </w:r>
-      <w:proofErr w:type="spellEnd"/>
-      <w:r>
-        <w:rPr>
-          <w:color w:val="EE0000"/>
-        </w:rPr>
-        <w:t xml:space="preserve"> </w:t>
-      </w:r>
-      <w:proofErr w:type="spellStart"/>
-      <w:r>
-        <w:rPr>
-          <w:color w:val="EE0000"/>
-        </w:rPr>
-        <w:t>khi</w:t>
-      </w:r>
-      <w:proofErr w:type="spellEnd"/>
-      <w:r>
-        <w:rPr>
-          <w:color w:val="EE0000"/>
-        </w:rPr>
-        <w:t xml:space="preserve"> </w:t>
-      </w:r>
-      <w:proofErr w:type="spellStart"/>
-      <w:r>
-        <w:rPr>
-          <w:color w:val="EE0000"/>
-        </w:rPr>
-        <w:t>gửi</w:t>
-      </w:r>
-      <w:proofErr w:type="spellEnd"/>
-      <w:r>
-        <w:rPr>
-          <w:color w:val="EE0000"/>
-        </w:rPr>
-        <w:t xml:space="preserve"> </w:t>
-      </w:r>
-      <w:proofErr w:type="spellStart"/>
-      <w:r>
-        <w:rPr>
-          <w:color w:val="EE0000"/>
-        </w:rPr>
-        <w:t>lại</w:t>
-      </w:r>
-      <w:proofErr w:type="spellEnd"/>
-      <w:r>
-        <w:rPr>
-          <w:color w:val="EE0000"/>
-        </w:rPr>
-        <w:t>."</w:t>
-      </w:r>
-    </w:p>
-    <w:p/>
-    <w:p>
-      <w:r>
-        <w:t xml:space="preserve">                A button also </w:t>
-      </w:r>
-      <w:r>
-        <w:t>sees</w:t>
-      </w:r>
-      <w:r>
-        <w:t xml:space="preserve"> here to ask the user back from scratch and resend the "become seller" request again</w:t>
-      </w:r>
-    </w:p>
-    <w:p/>
-    <w:p>
-      <w:r>
         <w:drawing>
           <wp:inline distT="0" distB="0" distL="0" distR="0" wp14:anchorId="66776B84" wp14:editId="3EC3BCF6">
             <wp:extent cx="5943600" cy="3060065"/>
@@ -1203,7 +1644,7 @@
                     <pic:cNvPicPr/>
                   </pic:nvPicPr>
                   <pic:blipFill>
-                    <a:blip r:embed="rId6"/>
+                    <a:blip r:embed="rId12"/>
                     <a:stretch>
                       <a:fillRect/>
                     </a:stretch>
@@ -1244,7 +1685,6 @@
     <w:p/>
     <w:p>
       <w:r>
-        <w:lastRenderedPageBreak/>
         <w:drawing>
           <wp:inline distT="0" distB="0" distL="0" distR="0" wp14:anchorId="5E655DE5" wp14:editId="3FBB1AEB">
             <wp:extent cx="5943600" cy="2404745"/>
@@ -1261,7 +1701,7 @@
                     <pic:cNvPicPr/>
                   </pic:nvPicPr>
                   <pic:blipFill>
-                    <a:blip r:embed="rId7"/>
+                    <a:blip r:embed="rId13"/>
                     <a:stretch>
                       <a:fillRect/>
                     </a:stretch>
@@ -1296,6 +1736,7 @@
         </w:numPr>
       </w:pPr>
       <w:r>
+        <w:lastRenderedPageBreak/>
         <w:t>Seller receives a Bell notification as below</w:t>
       </w:r>
       <w:r>
@@ -1318,7 +1759,7 @@
                     <pic:cNvPicPr/>
                   </pic:nvPicPr>
                   <pic:blipFill>
-                    <a:blip r:embed="rId8"/>
+                    <a:blip r:embed="rId14"/>
                     <a:stretch>
                       <a:fillRect/>
                     </a:stretch>
@@ -1370,7 +1811,7 @@
                     <pic:cNvPicPr/>
                   </pic:nvPicPr>
                   <pic:blipFill>
-                    <a:blip r:embed="rId9"/>
+                    <a:blip r:embed="rId15"/>
                     <a:stretch>
                       <a:fillRect/>
                     </a:stretch>
@@ -1392,6 +1833,257 @@
       </w:r>
     </w:p>
     <w:p>
+      <w:r>
+        <w:t>3. Seller Admin Dashboard</w:t>
+      </w:r>
+    </w:p>
+    <w:p>
+      <w:r>
+        <w:t xml:space="preserve">- After users became aware </w:t>
+      </w:r>
+      <w:r>
+        <w:t>of being</w:t>
+      </w:r>
+      <w:r>
+        <w:t xml:space="preserve"> a Seller, the Admin dashboard as below</w:t>
+      </w:r>
+    </w:p>
+    <w:p>
+      <w:r>
+        <w:drawing>
+          <wp:inline distT="0" distB="0" distL="0" distR="0" wp14:anchorId="66F9451A" wp14:editId="6B235494">
+            <wp:extent cx="5943600" cy="2701290"/>
+            <wp:effectExtent l="0" t="0" r="0" b="3810"/>
+            <wp:docPr id="623508663" name="Picture 1"/>
+            <wp:cNvGraphicFramePr>
+              <a:graphicFrameLocks xmlns:a="http://schemas.openxmlformats.org/drawingml/2006/main" noChangeAspect="1"/>
+            </wp:cNvGraphicFramePr>
+            <a:graphic xmlns:a="http://schemas.openxmlformats.org/drawingml/2006/main">
+              <a:graphicData uri="http://schemas.openxmlformats.org/drawingml/2006/picture">
+                <pic:pic xmlns:pic="http://schemas.openxmlformats.org/drawingml/2006/picture">
+                  <pic:nvPicPr>
+                    <pic:cNvPr id="623508663" name=""/>
+                    <pic:cNvPicPr/>
+                  </pic:nvPicPr>
+                  <pic:blipFill>
+                    <a:blip r:embed="rId16"/>
+                    <a:stretch>
+                      <a:fillRect/>
+                    </a:stretch>
+                  </pic:blipFill>
+                  <pic:spPr>
+                    <a:xfrm>
+                      <a:off x="0" y="0"/>
+                      <a:ext cx="5943600" cy="2701290"/>
+                    </a:xfrm>
+                    <a:prstGeom prst="rect">
+                      <a:avLst/>
+                    </a:prstGeom>
+                  </pic:spPr>
+                </pic:pic>
+              </a:graphicData>
+            </a:graphic>
+          </wp:inline>
+        </w:drawing>
+      </w:r>
+    </w:p>
+    <w:p/>
+    <w:p>
+      <w:r>
+        <w:t xml:space="preserve">Danh </w:t>
+      </w:r>
+      <w:proofErr w:type="spellStart"/>
+      <w:r>
+        <w:t>sách</w:t>
+      </w:r>
+      <w:proofErr w:type="spellEnd"/>
+      <w:r>
+        <w:t xml:space="preserve"> </w:t>
+      </w:r>
+      <w:proofErr w:type="spellStart"/>
+      <w:r>
+        <w:t>sản</w:t>
+      </w:r>
+      <w:proofErr w:type="spellEnd"/>
+      <w:r>
+        <w:t xml:space="preserve"> </w:t>
+      </w:r>
+      <w:proofErr w:type="spellStart"/>
+      <w:r>
+        <w:t>phẩm</w:t>
+      </w:r>
+      <w:proofErr w:type="spellEnd"/>
+      <w:r>
+        <w:t>:</w:t>
+      </w:r>
+    </w:p>
+    <w:p>
+      <w:r>
+        <w:drawing>
+          <wp:inline distT="0" distB="0" distL="0" distR="0" wp14:anchorId="75654145" wp14:editId="61D599A2">
+            <wp:extent cx="5943600" cy="2834005"/>
+            <wp:effectExtent l="0" t="0" r="0" b="4445"/>
+            <wp:docPr id="510714826" name="Picture 1"/>
+            <wp:cNvGraphicFramePr>
+              <a:graphicFrameLocks xmlns:a="http://schemas.openxmlformats.org/drawingml/2006/main" noChangeAspect="1"/>
+            </wp:cNvGraphicFramePr>
+            <a:graphic xmlns:a="http://schemas.openxmlformats.org/drawingml/2006/main">
+              <a:graphicData uri="http://schemas.openxmlformats.org/drawingml/2006/picture">
+                <pic:pic xmlns:pic="http://schemas.openxmlformats.org/drawingml/2006/picture">
+                  <pic:nvPicPr>
+                    <pic:cNvPr id="510714826" name=""/>
+                    <pic:cNvPicPr/>
+                  </pic:nvPicPr>
+                  <pic:blipFill>
+                    <a:blip r:embed="rId17"/>
+                    <a:stretch>
+                      <a:fillRect/>
+                    </a:stretch>
+                  </pic:blipFill>
+                  <pic:spPr>
+                    <a:xfrm>
+                      <a:off x="0" y="0"/>
+                      <a:ext cx="5943600" cy="2834005"/>
+                    </a:xfrm>
+                    <a:prstGeom prst="rect">
+                      <a:avLst/>
+                    </a:prstGeom>
+                  </pic:spPr>
+                </pic:pic>
+              </a:graphicData>
+            </a:graphic>
+          </wp:inline>
+        </w:drawing>
+      </w:r>
+    </w:p>
+    <w:p/>
+    <w:p>
+      <w:r>
+        <w:t xml:space="preserve">Quản </w:t>
+      </w:r>
+      <w:proofErr w:type="spellStart"/>
+      <w:r>
+        <w:t>lý</w:t>
+      </w:r>
+      <w:proofErr w:type="spellEnd"/>
+      <w:r>
+        <w:t xml:space="preserve"> </w:t>
+      </w:r>
+      <w:proofErr w:type="spellStart"/>
+      <w:r>
+        <w:t>đơn</w:t>
+      </w:r>
+      <w:proofErr w:type="spellEnd"/>
+      <w:r>
+        <w:t xml:space="preserve"> hang</w:t>
+      </w:r>
+    </w:p>
+    <w:p/>
+    <w:p>
+      <w:r>
+        <w:drawing>
+          <wp:inline distT="0" distB="0" distL="0" distR="0" wp14:anchorId="0A545CFE" wp14:editId="07E08734">
+            <wp:extent cx="5943600" cy="3142615"/>
+            <wp:effectExtent l="0" t="0" r="0" b="635"/>
+            <wp:docPr id="705342200" name="Picture 1"/>
+            <wp:cNvGraphicFramePr>
+              <a:graphicFrameLocks xmlns:a="http://schemas.openxmlformats.org/drawingml/2006/main" noChangeAspect="1"/>
+            </wp:cNvGraphicFramePr>
+            <a:graphic xmlns:a="http://schemas.openxmlformats.org/drawingml/2006/main">
+              <a:graphicData uri="http://schemas.openxmlformats.org/drawingml/2006/picture">
+                <pic:pic xmlns:pic="http://schemas.openxmlformats.org/drawingml/2006/picture">
+                  <pic:nvPicPr>
+                    <pic:cNvPr id="705342200" name=""/>
+                    <pic:cNvPicPr/>
+                  </pic:nvPicPr>
+                  <pic:blipFill>
+                    <a:blip r:embed="rId18"/>
+                    <a:stretch>
+                      <a:fillRect/>
+                    </a:stretch>
+                  </pic:blipFill>
+                  <pic:spPr>
+                    <a:xfrm>
+                      <a:off x="0" y="0"/>
+                      <a:ext cx="5943600" cy="3142615"/>
+                    </a:xfrm>
+                    <a:prstGeom prst="rect">
+                      <a:avLst/>
+                    </a:prstGeom>
+                  </pic:spPr>
+                </pic:pic>
+              </a:graphicData>
+            </a:graphic>
+          </wp:inline>
+        </w:drawing>
+      </w:r>
+    </w:p>
+    <w:p/>
+    <w:p>
+      <w:proofErr w:type="spellStart"/>
+      <w:r>
+        <w:lastRenderedPageBreak/>
+        <w:t>Thiết</w:t>
+      </w:r>
+      <w:proofErr w:type="spellEnd"/>
+      <w:r>
+        <w:t xml:space="preserve"> </w:t>
+      </w:r>
+      <w:proofErr w:type="spellStart"/>
+      <w:r>
+        <w:t>lập</w:t>
+      </w:r>
+      <w:proofErr w:type="spellEnd"/>
+      <w:r>
+        <w:t xml:space="preserve"> shop:</w:t>
+      </w:r>
+    </w:p>
+    <w:p>
+      <w:r>
+        <w:drawing>
+          <wp:inline distT="0" distB="0" distL="0" distR="0" wp14:anchorId="71E5661F" wp14:editId="2881753B">
+            <wp:extent cx="5943600" cy="4066540"/>
+            <wp:effectExtent l="0" t="0" r="0" b="0"/>
+            <wp:docPr id="502501156" name="Picture 1"/>
+            <wp:cNvGraphicFramePr>
+              <a:graphicFrameLocks xmlns:a="http://schemas.openxmlformats.org/drawingml/2006/main" noChangeAspect="1"/>
+            </wp:cNvGraphicFramePr>
+            <a:graphic xmlns:a="http://schemas.openxmlformats.org/drawingml/2006/main">
+              <a:graphicData uri="http://schemas.openxmlformats.org/drawingml/2006/picture">
+                <pic:pic xmlns:pic="http://schemas.openxmlformats.org/drawingml/2006/picture">
+                  <pic:nvPicPr>
+                    <pic:cNvPr id="502501156" name=""/>
+                    <pic:cNvPicPr/>
+                  </pic:nvPicPr>
+                  <pic:blipFill>
+                    <a:blip r:embed="rId19"/>
+                    <a:stretch>
+                      <a:fillRect/>
+                    </a:stretch>
+                  </pic:blipFill>
+                  <pic:spPr>
+                    <a:xfrm>
+                      <a:off x="0" y="0"/>
+                      <a:ext cx="5943600" cy="4066540"/>
+                    </a:xfrm>
+                    <a:prstGeom prst="rect">
+                      <a:avLst/>
+                    </a:prstGeom>
+                  </pic:spPr>
+                </pic:pic>
+              </a:graphicData>
+            </a:graphic>
+          </wp:inline>
+        </w:drawing>
+      </w:r>
+    </w:p>
+    <w:p/>
+    <w:p>
+      <w:r>
+        <w:br/>
+      </w:r>
+    </w:p>
+    <w:p>
       <w:pPr>
         <w:pStyle w:val="ListParagraph"/>
         <w:numPr>
@@ -1403,6 +2095,830 @@
         <w:t>Administrator:</w:t>
       </w:r>
     </w:p>
+    <w:p>
+      <w:pPr>
+        <w:pStyle w:val="ListParagraph"/>
+        <w:numPr>
+          <w:ilvl w:val="0"/>
+          <w:numId w:val="2"/>
+        </w:numPr>
+      </w:pPr>
+      <w:r>
+        <w:t>Database:</w:t>
+      </w:r>
+    </w:p>
+    <w:p>
+      <w:pPr>
+        <w:pStyle w:val="ListParagraph"/>
+        <w:numPr>
+          <w:ilvl w:val="0"/>
+          <w:numId w:val="4"/>
+        </w:numPr>
+      </w:pPr>
+      <w:r>
+        <w:t>Current collections are created:</w:t>
+      </w:r>
+    </w:p>
+    <w:p/>
+    <w:tbl>
+      <w:tblPr>
+        <w:tblW w:w="0" w:type="auto"/>
+        <w:tblCellSpacing w:w="15" w:type="dxa"/>
+        <w:tblBorders>
+          <w:top w:val="single" w:sz="4" w:space="0" w:color="auto"/>
+          <w:left w:val="single" w:sz="4" w:space="0" w:color="auto"/>
+          <w:bottom w:val="single" w:sz="4" w:space="0" w:color="auto"/>
+          <w:right w:val="single" w:sz="4" w:space="0" w:color="auto"/>
+          <w:insideH w:val="single" w:sz="4" w:space="0" w:color="auto"/>
+          <w:insideV w:val="single" w:sz="4" w:space="0" w:color="auto"/>
+        </w:tblBorders>
+        <w:tblCellMar>
+          <w:top w:w="15" w:type="dxa"/>
+          <w:left w:w="15" w:type="dxa"/>
+          <w:bottom w:w="15" w:type="dxa"/>
+          <w:right w:w="15" w:type="dxa"/>
+        </w:tblCellMar>
+        <w:tblLook w:val="04A0" w:firstRow="1" w:lastRow="0" w:firstColumn="1" w:lastColumn="0" w:noHBand="0" w:noVBand="1"/>
+      </w:tblPr>
+      <w:tblGrid>
+        <w:gridCol w:w="755"/>
+        <w:gridCol w:w="4968"/>
+        <w:gridCol w:w="3627"/>
+      </w:tblGrid>
+      <w:tr>
+        <w:trPr>
+          <w:tblHeader/>
+          <w:tblCellSpacing w:w="15" w:type="dxa"/>
+        </w:trPr>
+        <w:tc>
+          <w:tcPr>
+            <w:tcW w:w="710" w:type="dxa"/>
+            <w:vAlign w:val="center"/>
+            <w:hideMark/>
+          </w:tcPr>
+          <w:p>
+            <w:pPr>
+              <w:jc w:val="center"/>
+              <w:rPr>
+                <w:b/>
+                <w:bCs/>
+              </w:rPr>
+            </w:pPr>
+            <w:r>
+              <w:rPr>
+                <w:b/>
+                <w:bCs/>
+              </w:rPr>
+              <w:t>#</w:t>
+            </w:r>
+          </w:p>
+        </w:tc>
+        <w:tc>
+          <w:tcPr>
+            <w:tcW w:w="4938" w:type="dxa"/>
+            <w:vAlign w:val="center"/>
+            <w:hideMark/>
+          </w:tcPr>
+          <w:p>
+            <w:pPr>
+              <w:jc w:val="center"/>
+              <w:rPr>
+                <w:b/>
+                <w:bCs/>
+              </w:rPr>
+            </w:pPr>
+            <w:r>
+              <w:rPr>
+                <w:b/>
+                <w:bCs/>
+              </w:rPr>
+              <w:t>Collection Name</w:t>
+            </w:r>
+          </w:p>
+        </w:tc>
+        <w:tc>
+          <w:tcPr>
+            <w:tcW w:w="3582" w:type="dxa"/>
+          </w:tcPr>
+          <w:p>
+            <w:pPr>
+              <w:jc w:val="center"/>
+              <w:rPr>
+                <w:b/>
+                <w:bCs/>
+                <w:highlight w:val="yellow"/>
+              </w:rPr>
+            </w:pPr>
+            <w:r>
+              <w:rPr>
+                <w:b/>
+                <w:bCs/>
+                <w:highlight w:val="yellow"/>
+              </w:rPr>
+              <w:t>Description</w:t>
+            </w:r>
+          </w:p>
+        </w:tc>
+      </w:tr>
+      <w:tr>
+        <w:trPr>
+          <w:tblCellSpacing w:w="15" w:type="dxa"/>
+        </w:trPr>
+        <w:tc>
+          <w:tcPr>
+            <w:tcW w:w="710" w:type="dxa"/>
+            <w:vAlign w:val="center"/>
+            <w:hideMark/>
+          </w:tcPr>
+          <w:p>
+            <w:r>
+              <w:t>1</w:t>
+            </w:r>
+          </w:p>
+        </w:tc>
+        <w:tc>
+          <w:tcPr>
+            <w:tcW w:w="4938" w:type="dxa"/>
+            <w:vAlign w:val="center"/>
+            <w:hideMark/>
+          </w:tcPr>
+          <w:p>
+            <w:proofErr w:type="spellStart"/>
+            <w:r>
+              <w:t>audit_logs</w:t>
+            </w:r>
+            <w:proofErr w:type="spellEnd"/>
+          </w:p>
+        </w:tc>
+        <w:tc>
+          <w:tcPr>
+            <w:tcW w:w="3582" w:type="dxa"/>
+          </w:tcPr>
+          <w:p/>
+        </w:tc>
+      </w:tr>
+      <w:tr>
+        <w:trPr>
+          <w:tblCellSpacing w:w="15" w:type="dxa"/>
+        </w:trPr>
+        <w:tc>
+          <w:tcPr>
+            <w:tcW w:w="710" w:type="dxa"/>
+            <w:vAlign w:val="center"/>
+            <w:hideMark/>
+          </w:tcPr>
+          <w:p>
+            <w:r>
+              <w:t>2</w:t>
+            </w:r>
+          </w:p>
+        </w:tc>
+        <w:tc>
+          <w:tcPr>
+            <w:tcW w:w="4938" w:type="dxa"/>
+            <w:vAlign w:val="center"/>
+            <w:hideMark/>
+          </w:tcPr>
+          <w:p>
+            <w:proofErr w:type="spellStart"/>
+            <w:r>
+              <w:t>bank_accounts</w:t>
+            </w:r>
+            <w:proofErr w:type="spellEnd"/>
+          </w:p>
+        </w:tc>
+        <w:tc>
+          <w:tcPr>
+            <w:tcW w:w="3582" w:type="dxa"/>
+          </w:tcPr>
+          <w:p/>
+        </w:tc>
+      </w:tr>
+      <w:tr>
+        <w:trPr>
+          <w:tblCellSpacing w:w="15" w:type="dxa"/>
+        </w:trPr>
+        <w:tc>
+          <w:tcPr>
+            <w:tcW w:w="710" w:type="dxa"/>
+            <w:vAlign w:val="center"/>
+            <w:hideMark/>
+          </w:tcPr>
+          <w:p>
+            <w:r>
+              <w:t>3</w:t>
+            </w:r>
+          </w:p>
+        </w:tc>
+        <w:tc>
+          <w:tcPr>
+            <w:tcW w:w="4938" w:type="dxa"/>
+            <w:vAlign w:val="center"/>
+            <w:hideMark/>
+          </w:tcPr>
+          <w:p>
+            <w:r>
+              <w:t>categories</w:t>
+            </w:r>
+          </w:p>
+        </w:tc>
+        <w:tc>
+          <w:tcPr>
+            <w:tcW w:w="3582" w:type="dxa"/>
+          </w:tcPr>
+          <w:p/>
+        </w:tc>
+      </w:tr>
+      <w:tr>
+        <w:trPr>
+          <w:tblCellSpacing w:w="15" w:type="dxa"/>
+        </w:trPr>
+        <w:tc>
+          <w:tcPr>
+            <w:tcW w:w="710" w:type="dxa"/>
+            <w:vAlign w:val="center"/>
+            <w:hideMark/>
+          </w:tcPr>
+          <w:p>
+            <w:r>
+              <w:lastRenderedPageBreak/>
+              <w:t>4</w:t>
+            </w:r>
+          </w:p>
+        </w:tc>
+        <w:tc>
+          <w:tcPr>
+            <w:tcW w:w="4938" w:type="dxa"/>
+            <w:vAlign w:val="center"/>
+            <w:hideMark/>
+          </w:tcPr>
+          <w:p>
+            <w:proofErr w:type="spellStart"/>
+            <w:r>
+              <w:t>chat_messages</w:t>
+            </w:r>
+            <w:proofErr w:type="spellEnd"/>
+          </w:p>
+        </w:tc>
+        <w:tc>
+          <w:tcPr>
+            <w:tcW w:w="3582" w:type="dxa"/>
+          </w:tcPr>
+          <w:p/>
+        </w:tc>
+      </w:tr>
+      <w:tr>
+        <w:trPr>
+          <w:tblCellSpacing w:w="15" w:type="dxa"/>
+        </w:trPr>
+        <w:tc>
+          <w:tcPr>
+            <w:tcW w:w="710" w:type="dxa"/>
+            <w:vAlign w:val="center"/>
+            <w:hideMark/>
+          </w:tcPr>
+          <w:p>
+            <w:r>
+              <w:t>5</w:t>
+            </w:r>
+          </w:p>
+        </w:tc>
+        <w:tc>
+          <w:tcPr>
+            <w:tcW w:w="4938" w:type="dxa"/>
+            <w:vAlign w:val="center"/>
+            <w:hideMark/>
+          </w:tcPr>
+          <w:p>
+            <w:proofErr w:type="spellStart"/>
+            <w:r>
+              <w:t>content_nodes</w:t>
+            </w:r>
+            <w:proofErr w:type="spellEnd"/>
+          </w:p>
+        </w:tc>
+        <w:tc>
+          <w:tcPr>
+            <w:tcW w:w="3582" w:type="dxa"/>
+          </w:tcPr>
+          <w:p/>
+        </w:tc>
+      </w:tr>
+      <w:tr>
+        <w:trPr>
+          <w:tblCellSpacing w:w="15" w:type="dxa"/>
+        </w:trPr>
+        <w:tc>
+          <w:tcPr>
+            <w:tcW w:w="710" w:type="dxa"/>
+            <w:vAlign w:val="center"/>
+            <w:hideMark/>
+          </w:tcPr>
+          <w:p>
+            <w:r>
+              <w:t>6</w:t>
+            </w:r>
+          </w:p>
+        </w:tc>
+        <w:tc>
+          <w:tcPr>
+            <w:tcW w:w="4938" w:type="dxa"/>
+            <w:vAlign w:val="center"/>
+            <w:hideMark/>
+          </w:tcPr>
+          <w:p>
+            <w:proofErr w:type="spellStart"/>
+            <w:r>
+              <w:t>feedback_templates</w:t>
+            </w:r>
+            <w:proofErr w:type="spellEnd"/>
+          </w:p>
+        </w:tc>
+        <w:tc>
+          <w:tcPr>
+            <w:tcW w:w="3582" w:type="dxa"/>
+          </w:tcPr>
+          <w:p/>
+        </w:tc>
+      </w:tr>
+      <w:tr>
+        <w:trPr>
+          <w:tblCellSpacing w:w="15" w:type="dxa"/>
+        </w:trPr>
+        <w:tc>
+          <w:tcPr>
+            <w:tcW w:w="710" w:type="dxa"/>
+            <w:vAlign w:val="center"/>
+            <w:hideMark/>
+          </w:tcPr>
+          <w:p>
+            <w:r>
+              <w:t>7</w:t>
+            </w:r>
+          </w:p>
+        </w:tc>
+        <w:tc>
+          <w:tcPr>
+            <w:tcW w:w="4938" w:type="dxa"/>
+            <w:vAlign w:val="center"/>
+            <w:hideMark/>
+          </w:tcPr>
+          <w:p>
+            <w:proofErr w:type="spellStart"/>
+            <w:r>
+              <w:t>footer_icons</w:t>
+            </w:r>
+            <w:proofErr w:type="spellEnd"/>
+          </w:p>
+        </w:tc>
+        <w:tc>
+          <w:tcPr>
+            <w:tcW w:w="3582" w:type="dxa"/>
+          </w:tcPr>
+          <w:p/>
+        </w:tc>
+      </w:tr>
+      <w:tr>
+        <w:trPr>
+          <w:tblCellSpacing w:w="15" w:type="dxa"/>
+        </w:trPr>
+        <w:tc>
+          <w:tcPr>
+            <w:tcW w:w="710" w:type="dxa"/>
+            <w:vAlign w:val="center"/>
+            <w:hideMark/>
+          </w:tcPr>
+          <w:p>
+            <w:r>
+              <w:t>8</w:t>
+            </w:r>
+          </w:p>
+        </w:tc>
+        <w:tc>
+          <w:tcPr>
+            <w:tcW w:w="4938" w:type="dxa"/>
+            <w:vAlign w:val="center"/>
+            <w:hideMark/>
+          </w:tcPr>
+          <w:p>
+            <w:proofErr w:type="spellStart"/>
+            <w:r>
+              <w:t>footer_menus</w:t>
+            </w:r>
+            <w:proofErr w:type="spellEnd"/>
+          </w:p>
+        </w:tc>
+        <w:tc>
+          <w:tcPr>
+            <w:tcW w:w="3582" w:type="dxa"/>
+          </w:tcPr>
+          <w:p/>
+        </w:tc>
+      </w:tr>
+      <w:tr>
+        <w:trPr>
+          <w:tblCellSpacing w:w="15" w:type="dxa"/>
+        </w:trPr>
+        <w:tc>
+          <w:tcPr>
+            <w:tcW w:w="710" w:type="dxa"/>
+            <w:vAlign w:val="center"/>
+            <w:hideMark/>
+          </w:tcPr>
+          <w:p>
+            <w:r>
+              <w:t>9</w:t>
+            </w:r>
+          </w:p>
+        </w:tc>
+        <w:tc>
+          <w:tcPr>
+            <w:tcW w:w="4938" w:type="dxa"/>
+            <w:vAlign w:val="center"/>
+            <w:hideMark/>
+          </w:tcPr>
+          <w:p>
+            <w:proofErr w:type="spellStart"/>
+            <w:r>
+              <w:t>help_nodes</w:t>
+            </w:r>
+            <w:proofErr w:type="spellEnd"/>
+          </w:p>
+        </w:tc>
+        <w:tc>
+          <w:tcPr>
+            <w:tcW w:w="3582" w:type="dxa"/>
+          </w:tcPr>
+          <w:p/>
+        </w:tc>
+      </w:tr>
+      <w:tr>
+        <w:trPr>
+          <w:tblCellSpacing w:w="15" w:type="dxa"/>
+        </w:trPr>
+        <w:tc>
+          <w:tcPr>
+            <w:tcW w:w="710" w:type="dxa"/>
+            <w:vAlign w:val="center"/>
+            <w:hideMark/>
+          </w:tcPr>
+          <w:p>
+            <w:r>
+              <w:t>10</w:t>
+            </w:r>
+          </w:p>
+        </w:tc>
+        <w:tc>
+          <w:tcPr>
+            <w:tcW w:w="4938" w:type="dxa"/>
+            <w:vAlign w:val="center"/>
+            <w:hideMark/>
+          </w:tcPr>
+          <w:p>
+            <w:r>
+              <w:t>notifications</w:t>
+            </w:r>
+          </w:p>
+        </w:tc>
+        <w:tc>
+          <w:tcPr>
+            <w:tcW w:w="3582" w:type="dxa"/>
+          </w:tcPr>
+          <w:p/>
+        </w:tc>
+      </w:tr>
+      <w:tr>
+        <w:trPr>
+          <w:tblCellSpacing w:w="15" w:type="dxa"/>
+        </w:trPr>
+        <w:tc>
+          <w:tcPr>
+            <w:tcW w:w="710" w:type="dxa"/>
+            <w:vAlign w:val="center"/>
+            <w:hideMark/>
+          </w:tcPr>
+          <w:p>
+            <w:r>
+              <w:t>11</w:t>
+            </w:r>
+          </w:p>
+        </w:tc>
+        <w:tc>
+          <w:tcPr>
+            <w:tcW w:w="4938" w:type="dxa"/>
+            <w:vAlign w:val="center"/>
+            <w:hideMark/>
+          </w:tcPr>
+          <w:p>
+            <w:r>
+              <w:t>orders</w:t>
+            </w:r>
+          </w:p>
+        </w:tc>
+        <w:tc>
+          <w:tcPr>
+            <w:tcW w:w="3582" w:type="dxa"/>
+          </w:tcPr>
+          <w:p/>
+        </w:tc>
+      </w:tr>
+      <w:tr>
+        <w:trPr>
+          <w:tblCellSpacing w:w="15" w:type="dxa"/>
+        </w:trPr>
+        <w:tc>
+          <w:tcPr>
+            <w:tcW w:w="710" w:type="dxa"/>
+            <w:vAlign w:val="center"/>
+            <w:hideMark/>
+          </w:tcPr>
+          <w:p>
+            <w:r>
+              <w:t>12</w:t>
+            </w:r>
+          </w:p>
+        </w:tc>
+        <w:tc>
+          <w:tcPr>
+            <w:tcW w:w="4938" w:type="dxa"/>
+            <w:vAlign w:val="center"/>
+            <w:hideMark/>
+          </w:tcPr>
+          <w:p>
+            <w:proofErr w:type="spellStart"/>
+            <w:r>
+              <w:t>password_reset_tokens</w:t>
+            </w:r>
+            <w:proofErr w:type="spellEnd"/>
+          </w:p>
+        </w:tc>
+        <w:tc>
+          <w:tcPr>
+            <w:tcW w:w="3582" w:type="dxa"/>
+          </w:tcPr>
+          <w:p/>
+        </w:tc>
+      </w:tr>
+      <w:tr>
+        <w:trPr>
+          <w:tblCellSpacing w:w="15" w:type="dxa"/>
+        </w:trPr>
+        <w:tc>
+          <w:tcPr>
+            <w:tcW w:w="710" w:type="dxa"/>
+            <w:vAlign w:val="center"/>
+            <w:hideMark/>
+          </w:tcPr>
+          <w:p>
+            <w:r>
+              <w:t>13</w:t>
+            </w:r>
+          </w:p>
+        </w:tc>
+        <w:tc>
+          <w:tcPr>
+            <w:tcW w:w="4938" w:type="dxa"/>
+            <w:vAlign w:val="center"/>
+            <w:hideMark/>
+          </w:tcPr>
+          <w:p>
+            <w:proofErr w:type="spellStart"/>
+            <w:r>
+              <w:t>product_reports</w:t>
+            </w:r>
+            <w:proofErr w:type="spellEnd"/>
+          </w:p>
+        </w:tc>
+        <w:tc>
+          <w:tcPr>
+            <w:tcW w:w="3582" w:type="dxa"/>
+          </w:tcPr>
+          <w:p/>
+        </w:tc>
+      </w:tr>
+      <w:tr>
+        <w:trPr>
+          <w:tblCellSpacing w:w="15" w:type="dxa"/>
+        </w:trPr>
+        <w:tc>
+          <w:tcPr>
+            <w:tcW w:w="710" w:type="dxa"/>
+            <w:vAlign w:val="center"/>
+            <w:hideMark/>
+          </w:tcPr>
+          <w:p>
+            <w:r>
+              <w:t>14</w:t>
+            </w:r>
+          </w:p>
+        </w:tc>
+        <w:tc>
+          <w:tcPr>
+            <w:tcW w:w="4938" w:type="dxa"/>
+            <w:vAlign w:val="center"/>
+            <w:hideMark/>
+          </w:tcPr>
+          <w:p>
+            <w:r>
+              <w:t>products</w:t>
+            </w:r>
+          </w:p>
+        </w:tc>
+        <w:tc>
+          <w:tcPr>
+            <w:tcW w:w="3582" w:type="dxa"/>
+          </w:tcPr>
+          <w:p/>
+        </w:tc>
+      </w:tr>
+      <w:tr>
+        <w:trPr>
+          <w:tblCellSpacing w:w="15" w:type="dxa"/>
+        </w:trPr>
+        <w:tc>
+          <w:tcPr>
+            <w:tcW w:w="710" w:type="dxa"/>
+            <w:vAlign w:val="center"/>
+            <w:hideMark/>
+          </w:tcPr>
+          <w:p>
+            <w:r>
+              <w:t>15</w:t>
+            </w:r>
+          </w:p>
+        </w:tc>
+        <w:tc>
+          <w:tcPr>
+            <w:tcW w:w="4938" w:type="dxa"/>
+            <w:vAlign w:val="center"/>
+            <w:hideMark/>
+          </w:tcPr>
+          <w:p>
+            <w:proofErr w:type="spellStart"/>
+            <w:proofErr w:type="gramStart"/>
+            <w:r>
+              <w:t>report</w:t>
+            </w:r>
+            <w:proofErr w:type="gramEnd"/>
+            <w:r>
+              <w:t>_reasons</w:t>
+            </w:r>
+            <w:proofErr w:type="spellEnd"/>
+          </w:p>
+        </w:tc>
+        <w:tc>
+          <w:tcPr>
+            <w:tcW w:w="3582" w:type="dxa"/>
+          </w:tcPr>
+          <w:p/>
+        </w:tc>
+      </w:tr>
+      <w:tr>
+        <w:trPr>
+          <w:tblCellSpacing w:w="15" w:type="dxa"/>
+        </w:trPr>
+        <w:tc>
+          <w:tcPr>
+            <w:tcW w:w="710" w:type="dxa"/>
+            <w:vAlign w:val="center"/>
+            <w:hideMark/>
+          </w:tcPr>
+          <w:p>
+            <w:r>
+              <w:t>16</w:t>
+            </w:r>
+          </w:p>
+        </w:tc>
+        <w:tc>
+          <w:tcPr>
+            <w:tcW w:w="4938" w:type="dxa"/>
+            <w:vAlign w:val="center"/>
+            <w:hideMark/>
+          </w:tcPr>
+          <w:p>
+            <w:r>
+              <w:t>reviews</w:t>
+            </w:r>
+          </w:p>
+        </w:tc>
+        <w:tc>
+          <w:tcPr>
+            <w:tcW w:w="3582" w:type="dxa"/>
+          </w:tcPr>
+          <w:p/>
+        </w:tc>
+      </w:tr>
+      <w:tr>
+        <w:trPr>
+          <w:tblCellSpacing w:w="15" w:type="dxa"/>
+        </w:trPr>
+        <w:tc>
+          <w:tcPr>
+            <w:tcW w:w="710" w:type="dxa"/>
+            <w:vAlign w:val="center"/>
+            <w:hideMark/>
+          </w:tcPr>
+          <w:p>
+            <w:r>
+              <w:t>17</w:t>
+            </w:r>
+          </w:p>
+        </w:tc>
+        <w:tc>
+          <w:tcPr>
+            <w:tcW w:w="4938" w:type="dxa"/>
+            <w:vAlign w:val="center"/>
+            <w:hideMark/>
+          </w:tcPr>
+          <w:p>
+            <w:proofErr w:type="spellStart"/>
+            <w:r>
+              <w:t>shipping_methods</w:t>
+            </w:r>
+            <w:proofErr w:type="spellEnd"/>
+          </w:p>
+        </w:tc>
+        <w:tc>
+          <w:tcPr>
+            <w:tcW w:w="3582" w:type="dxa"/>
+          </w:tcPr>
+          <w:p/>
+        </w:tc>
+      </w:tr>
+      <w:tr>
+        <w:trPr>
+          <w:tblCellSpacing w:w="15" w:type="dxa"/>
+        </w:trPr>
+        <w:tc>
+          <w:tcPr>
+            <w:tcW w:w="710" w:type="dxa"/>
+            <w:vAlign w:val="center"/>
+            <w:hideMark/>
+          </w:tcPr>
+          <w:p>
+            <w:r>
+              <w:t>18</w:t>
+            </w:r>
+          </w:p>
+        </w:tc>
+        <w:tc>
+          <w:tcPr>
+            <w:tcW w:w="4938" w:type="dxa"/>
+            <w:vAlign w:val="center"/>
+            <w:hideMark/>
+          </w:tcPr>
+          <w:p>
+            <w:proofErr w:type="spellStart"/>
+            <w:r>
+              <w:t>system_contents</w:t>
+            </w:r>
+            <w:proofErr w:type="spellEnd"/>
+          </w:p>
+        </w:tc>
+        <w:tc>
+          <w:tcPr>
+            <w:tcW w:w="3582" w:type="dxa"/>
+          </w:tcPr>
+          <w:p/>
+        </w:tc>
+      </w:tr>
+      <w:tr>
+        <w:trPr>
+          <w:tblCellSpacing w:w="15" w:type="dxa"/>
+        </w:trPr>
+        <w:tc>
+          <w:tcPr>
+            <w:tcW w:w="710" w:type="dxa"/>
+            <w:vAlign w:val="center"/>
+            <w:hideMark/>
+          </w:tcPr>
+          <w:p>
+            <w:r>
+              <w:t>19</w:t>
+            </w:r>
+          </w:p>
+        </w:tc>
+        <w:tc>
+          <w:tcPr>
+            <w:tcW w:w="4938" w:type="dxa"/>
+            <w:vAlign w:val="center"/>
+            <w:hideMark/>
+          </w:tcPr>
+          <w:p>
+            <w:r>
+              <w:t>users</w:t>
+            </w:r>
+          </w:p>
+        </w:tc>
+        <w:tc>
+          <w:tcPr>
+            <w:tcW w:w="3582" w:type="dxa"/>
+          </w:tcPr>
+          <w:p/>
+        </w:tc>
+      </w:tr>
+    </w:tbl>
+    <w:p/>
     <w:sectPr>
       <w:pgSz w:w="12240" w:h="15840"/>
       <w:pgMar w:top="1440" w:right="1440" w:bottom="1440" w:left="1440" w:header="720" w:footer="720" w:gutter="0"/>
@@ -1505,6 +3021,119 @@
     </w:lvl>
   </w:abstractNum>
   <w:abstractNum w:abstractNumId="1" w15:restartNumberingAfterBreak="0">
+    <w:nsid w:val="0DB34EB7"/>
+    <w:multiLevelType w:val="hybridMultilevel"/>
+    <w:tmpl w:val="C5420284"/>
+    <w:lvl w:ilvl="0" w:tplc="87BEE42A">
+      <w:start w:val="3"/>
+      <w:numFmt w:val="bullet"/>
+      <w:lvlText w:val="-"/>
+      <w:lvlJc w:val="left"/>
+      <w:pPr>
+        <w:ind w:left="720" w:hanging="360"/>
+      </w:pPr>
+      <w:rPr>
+        <w:rFonts w:ascii="Aptos" w:eastAsiaTheme="minorHAnsi" w:hAnsi="Aptos" w:cstheme="minorBidi" w:hint="default"/>
+      </w:rPr>
+    </w:lvl>
+    <w:lvl w:ilvl="1" w:tplc="04090003" w:tentative="1">
+      <w:start w:val="1"/>
+      <w:numFmt w:val="bullet"/>
+      <w:lvlText w:val="o"/>
+      <w:lvlJc w:val="left"/>
+      <w:pPr>
+        <w:ind w:left="1440" w:hanging="360"/>
+      </w:pPr>
+      <w:rPr>
+        <w:rFonts w:ascii="Courier New" w:hAnsi="Courier New" w:cs="Courier New" w:hint="default"/>
+      </w:rPr>
+    </w:lvl>
+    <w:lvl w:ilvl="2" w:tplc="04090005" w:tentative="1">
+      <w:start w:val="1"/>
+      <w:numFmt w:val="bullet"/>
+      <w:lvlText w:val=""/>
+      <w:lvlJc w:val="left"/>
+      <w:pPr>
+        <w:ind w:left="2160" w:hanging="360"/>
+      </w:pPr>
+      <w:rPr>
+        <w:rFonts w:ascii="Wingdings" w:hAnsi="Wingdings" w:hint="default"/>
+      </w:rPr>
+    </w:lvl>
+    <w:lvl w:ilvl="3" w:tplc="04090001" w:tentative="1">
+      <w:start w:val="1"/>
+      <w:numFmt w:val="bullet"/>
+      <w:lvlText w:val=""/>
+      <w:lvlJc w:val="left"/>
+      <w:pPr>
+        <w:ind w:left="2880" w:hanging="360"/>
+      </w:pPr>
+      <w:rPr>
+        <w:rFonts w:ascii="Symbol" w:hAnsi="Symbol" w:hint="default"/>
+      </w:rPr>
+    </w:lvl>
+    <w:lvl w:ilvl="4" w:tplc="04090003" w:tentative="1">
+      <w:start w:val="1"/>
+      <w:numFmt w:val="bullet"/>
+      <w:lvlText w:val="o"/>
+      <w:lvlJc w:val="left"/>
+      <w:pPr>
+        <w:ind w:left="3600" w:hanging="360"/>
+      </w:pPr>
+      <w:rPr>
+        <w:rFonts w:ascii="Courier New" w:hAnsi="Courier New" w:cs="Courier New" w:hint="default"/>
+      </w:rPr>
+    </w:lvl>
+    <w:lvl w:ilvl="5" w:tplc="04090005" w:tentative="1">
+      <w:start w:val="1"/>
+      <w:numFmt w:val="bullet"/>
+      <w:lvlText w:val=""/>
+      <w:lvlJc w:val="left"/>
+      <w:pPr>
+        <w:ind w:left="4320" w:hanging="360"/>
+      </w:pPr>
+      <w:rPr>
+        <w:rFonts w:ascii="Wingdings" w:hAnsi="Wingdings" w:hint="default"/>
+      </w:rPr>
+    </w:lvl>
+    <w:lvl w:ilvl="6" w:tplc="04090001" w:tentative="1">
+      <w:start w:val="1"/>
+      <w:numFmt w:val="bullet"/>
+      <w:lvlText w:val=""/>
+      <w:lvlJc w:val="left"/>
+      <w:pPr>
+        <w:ind w:left="5040" w:hanging="360"/>
+      </w:pPr>
+      <w:rPr>
+        <w:rFonts w:ascii="Symbol" w:hAnsi="Symbol" w:hint="default"/>
+      </w:rPr>
+    </w:lvl>
+    <w:lvl w:ilvl="7" w:tplc="04090003" w:tentative="1">
+      <w:start w:val="1"/>
+      <w:numFmt w:val="bullet"/>
+      <w:lvlText w:val="o"/>
+      <w:lvlJc w:val="left"/>
+      <w:pPr>
+        <w:ind w:left="5760" w:hanging="360"/>
+      </w:pPr>
+      <w:rPr>
+        <w:rFonts w:ascii="Courier New" w:hAnsi="Courier New" w:cs="Courier New" w:hint="default"/>
+      </w:rPr>
+    </w:lvl>
+    <w:lvl w:ilvl="8" w:tplc="04090005" w:tentative="1">
+      <w:start w:val="1"/>
+      <w:numFmt w:val="bullet"/>
+      <w:lvlText w:val=""/>
+      <w:lvlJc w:val="left"/>
+      <w:pPr>
+        <w:ind w:left="6480" w:hanging="360"/>
+      </w:pPr>
+      <w:rPr>
+        <w:rFonts w:ascii="Wingdings" w:hAnsi="Wingdings" w:hint="default"/>
+      </w:rPr>
+    </w:lvl>
+  </w:abstractNum>
+  <w:abstractNum w:abstractNumId="2" w15:restartNumberingAfterBreak="0">
     <w:nsid w:val="287A1ABB"/>
     <w:multiLevelType w:val="hybridMultilevel"/>
     <w:tmpl w:val="E3E431FC"/>
@@ -1593,7 +3222,7 @@
       </w:pPr>
     </w:lvl>
   </w:abstractNum>
-  <w:abstractNum w:abstractNumId="2" w15:restartNumberingAfterBreak="0">
+  <w:abstractNum w:abstractNumId="3" w15:restartNumberingAfterBreak="0">
     <w:nsid w:val="4B9319F0"/>
     <w:multiLevelType w:val="hybridMultilevel"/>
     <w:tmpl w:val="70AC04D8"/>
@@ -1705,7 +3334,7 @@
       </w:rPr>
     </w:lvl>
   </w:abstractNum>
-  <w:abstractNum w:abstractNumId="3" w15:restartNumberingAfterBreak="0">
+  <w:abstractNum w:abstractNumId="4" w15:restartNumberingAfterBreak="0">
     <w:nsid w:val="695C4555"/>
     <w:multiLevelType w:val="hybridMultilevel"/>
     <w:tmpl w:val="21D8CDE2"/>
@@ -1819,16 +3448,19 @@
     </w:lvl>
   </w:abstractNum>
   <w:num w:numId="1" w16cid:durableId="307444825">
-    <w:abstractNumId w:val="1"/>
+    <w:abstractNumId w:val="2"/>
   </w:num>
   <w:num w:numId="2" w16cid:durableId="844518652">
     <w:abstractNumId w:val="0"/>
   </w:num>
   <w:num w:numId="3" w16cid:durableId="986399927">
+    <w:abstractNumId w:val="4"/>
+  </w:num>
+  <w:num w:numId="4" w16cid:durableId="2140294211">
     <w:abstractNumId w:val="3"/>
   </w:num>
-  <w:num w:numId="4" w16cid:durableId="2140294211">
-    <w:abstractNumId w:val="2"/>
+  <w:num w:numId="5" w16cid:durableId="890191977">
+    <w:abstractNumId w:val="1"/>
   </w:num>
 </w:numbering>
 </file>
@@ -2436,7 +4068,6 @@
   <w:style w:type="character" w:default="1" w:styleId="DefaultParagraphFont">
     <w:name w:val="Default Paragraph Font"/>
     <w:uiPriority w:val="1"/>
-    <w:semiHidden/>
     <w:unhideWhenUsed/>
   </w:style>
   <w:style w:type="table" w:default="1" w:styleId="TableNormal">

</xml_diff>

<commit_message>
Created the Seller admin baord for cash withfrawl
</commit_message>
<xml_diff>
--- a/AiNetsoft Functions Description.docx
+++ b/AiNetsoft Functions Description.docx
@@ -3,13 +3,8 @@
 <w:document xmlns:wpc="http://schemas.microsoft.com/office/word/2010/wordprocessingCanvas" xmlns:cx="http://schemas.microsoft.com/office/drawing/2014/chartex" xmlns:cx1="http://schemas.microsoft.com/office/drawing/2015/9/8/chartex" xmlns:cx2="http://schemas.microsoft.com/office/drawing/2015/10/21/chartex" xmlns:cx3="http://schemas.microsoft.com/office/drawing/2016/5/9/chartex" xmlns:cx4="http://schemas.microsoft.com/office/drawing/2016/5/10/chartex" xmlns:cx5="http://schemas.microsoft.com/office/drawing/2016/5/11/chartex" xmlns:cx6="http://schemas.microsoft.com/office/drawing/2016/5/12/chartex" xmlns:cx7="http://schemas.microsoft.com/office/drawing/2016/5/13/chartex" xmlns:cx8="http://schemas.microsoft.com/office/drawing/2016/5/14/chartex" xmlns:mc="http://schemas.openxmlformats.org/markup-compatibility/2006" xmlns:aink="http://schemas.microsoft.com/office/drawing/2016/ink" xmlns:am3d="http://schemas.microsoft.com/office/drawing/2017/model3d" xmlns:o="urn:schemas-microsoft-com:office:office" xmlns:oel="http://schemas.microsoft.com/office/2019/extlst" xmlns:r="http://schemas.openxmlformats.org/officeDocument/2006/relationships" xmlns:m="http://schemas.openxmlformats.org/officeDocument/2006/math" xmlns:v="urn:schemas-microsoft-com:vml" xmlns:wp14="http://schemas.microsoft.com/office/word/2010/wordprocessingDrawing" xmlns:wp="http://schemas.openxmlformats.org/drawingml/2006/wordprocessingDrawing" xmlns:w10="urn:schemas-microsoft-com:office:word" xmlns:w="http://schemas.openxmlformats.org/wordprocessingml/2006/main" xmlns:w14="http://schemas.microsoft.com/office/word/2010/wordml" xmlns:w15="http://schemas.microsoft.com/office/word/2012/wordml" xmlns:w16cex="http://schemas.microsoft.com/office/word/2018/wordml/cex" xmlns:w16cid="http://schemas.microsoft.com/office/word/2016/wordml/cid" xmlns:w16="http://schemas.microsoft.com/office/word/2018/wordml" xmlns:w16du="http://schemas.microsoft.com/office/word/2023/wordml/word16du" xmlns:w16sdtdh="http://schemas.microsoft.com/office/word/2020/wordml/sdtdatahash" xmlns:w16sdtfl="http://schemas.microsoft.com/office/word/2024/wordml/sdtformatlock" xmlns:w16se="http://schemas.microsoft.com/office/word/2015/wordml/symex" xmlns:wpg="http://schemas.microsoft.com/office/word/2010/wordprocessingGroup" xmlns:wpi="http://schemas.microsoft.com/office/word/2010/wordprocessingInk" xmlns:wne="http://schemas.microsoft.com/office/word/2006/wordml" xmlns:wps="http://schemas.microsoft.com/office/word/2010/wordprocessingShape" mc:Ignorable="w14 w15 w16se w16cid w16 w16cex w16sdtdh w16sdtfl w16du wp14">
   <w:body>
     <w:p>
-      <w:proofErr w:type="spellStart"/>
-      <w:r>
-        <w:t>AiNetsoft</w:t>
-      </w:r>
-      <w:proofErr w:type="spellEnd"/>
-      <w:r>
-        <w:t xml:space="preserve"> Functions Description</w:t>
+      <w:r>
+        <w:t>AiNetsoft Functions Description</w:t>
       </w:r>
     </w:p>
     <w:p/>
@@ -25,7 +20,6 @@
         <w:t>Users:</w:t>
       </w:r>
     </w:p>
-    <w:p/>
     <w:p>
       <w:pPr>
         <w:pStyle w:val="ListParagraph"/>
@@ -114,15 +108,7 @@
       </w:r>
       <w:proofErr w:type="gramEnd"/>
       <w:r>
-        <w:t xml:space="preserve"> so ca </w:t>
-      </w:r>
-      <w:proofErr w:type="spellStart"/>
-      <w:r>
-        <w:t>nhan</w:t>
-      </w:r>
-      <w:proofErr w:type="spellEnd"/>
-      <w:r>
-        <w:t xml:space="preserve">”.  The scenario that Phone number can be sync from the Sell request data to this page, also same for email. Data is </w:t>
+        <w:t xml:space="preserve"> so ca nhan”.  The scenario that Phone number can be sync from the Sell request data to this page, also same for email. Data is </w:t>
       </w:r>
       <w:proofErr w:type="gramStart"/>
       <w:r>
@@ -142,34 +128,10 @@
         </w:numPr>
       </w:pPr>
       <w:r>
-        <w:t xml:space="preserve">Tài </w:t>
-      </w:r>
-      <w:proofErr w:type="spellStart"/>
-      <w:r>
-        <w:t>khoản</w:t>
-      </w:r>
-      <w:proofErr w:type="spellEnd"/>
-      <w:r>
-        <w:t xml:space="preserve"> </w:t>
-      </w:r>
-      <w:proofErr w:type="spellStart"/>
-      <w:r>
-        <w:t>ngân</w:t>
-      </w:r>
-      <w:proofErr w:type="spellEnd"/>
-      <w:r>
-        <w:t xml:space="preserve"> hang is being s</w:t>
-      </w:r>
-      <w:r>
-        <w:t xml:space="preserve">tored in the </w:t>
-      </w:r>
-      <w:proofErr w:type="spellStart"/>
-      <w:r>
-        <w:t>bank_account</w:t>
-      </w:r>
-      <w:proofErr w:type="spellEnd"/>
-      <w:r>
-        <w:t xml:space="preserve"> collection. This also be sync when user request to become a Seller</w:t>
+        <w:t>Tài khoản ngân hang is being s</w:t>
+      </w:r>
+      <w:r>
+        <w:t>tored in the bank_account collection. This also be sync when user request to become a Seller</w:t>
       </w:r>
     </w:p>
     <w:p>
@@ -219,30 +181,9 @@
           <w:numId w:val="5"/>
         </w:numPr>
       </w:pPr>
-      <w:proofErr w:type="spellStart"/>
       <w:r>
         <w:lastRenderedPageBreak/>
-        <w:t>Địa</w:t>
-      </w:r>
-      <w:proofErr w:type="spellEnd"/>
-      <w:r>
-        <w:t xml:space="preserve"> </w:t>
-      </w:r>
-      <w:proofErr w:type="spellStart"/>
-      <w:r>
-        <w:t>chỉ</w:t>
-      </w:r>
-      <w:proofErr w:type="spellEnd"/>
-      <w:r>
-        <w:t xml:space="preserve"> </w:t>
-      </w:r>
-      <w:proofErr w:type="spellStart"/>
-      <w:r>
-        <w:t>nhận</w:t>
-      </w:r>
-      <w:proofErr w:type="spellEnd"/>
-      <w:r>
-        <w:t xml:space="preserve"> hang: Users can update data here. This is also synced to the Seller registry from if use request to become a Seller</w:t>
+        <w:t>Địa chỉ nhận hang: Users can update data here. This is also synced to the Seller registry from if use request to become a Seller</w:t>
       </w:r>
     </w:p>
     <w:p>
@@ -483,10 +424,525 @@
       </w:r>
     </w:p>
     <w:p>
-      <w:r>
-        <w:t xml:space="preserve">    </w:t>
-      </w:r>
-    </w:p>
+      <w:pPr>
+        <w:pStyle w:val="ListParagraph"/>
+        <w:numPr>
+          <w:ilvl w:val="0"/>
+          <w:numId w:val="6"/>
+        </w:numPr>
+      </w:pPr>
+      <w:r>
+        <w:t>Register to become a seller:</w:t>
+      </w:r>
+    </w:p>
+    <w:p>
+      <w:r>
+        <w:t>Step 1 to become a seller:</w:t>
+      </w:r>
+    </w:p>
+    <w:p>
+      <w:r>
+        <w:lastRenderedPageBreak/>
+        <w:drawing>
+          <wp:inline distT="0" distB="0" distL="0" distR="0" wp14:anchorId="73DFCE24" wp14:editId="209ECB89">
+            <wp:extent cx="5943600" cy="3066415"/>
+            <wp:effectExtent l="0" t="0" r="0" b="635"/>
+            <wp:docPr id="1564232945" name="Picture 1"/>
+            <wp:cNvGraphicFramePr>
+              <a:graphicFrameLocks xmlns:a="http://schemas.openxmlformats.org/drawingml/2006/main" noChangeAspect="1"/>
+            </wp:cNvGraphicFramePr>
+            <a:graphic xmlns:a="http://schemas.openxmlformats.org/drawingml/2006/main">
+              <a:graphicData uri="http://schemas.openxmlformats.org/drawingml/2006/picture">
+                <pic:pic xmlns:pic="http://schemas.openxmlformats.org/drawingml/2006/picture">
+                  <pic:nvPicPr>
+                    <pic:cNvPr id="1564232945" name=""/>
+                    <pic:cNvPicPr/>
+                  </pic:nvPicPr>
+                  <pic:blipFill>
+                    <a:blip r:embed="rId10"/>
+                    <a:stretch>
+                      <a:fillRect/>
+                    </a:stretch>
+                  </pic:blipFill>
+                  <pic:spPr>
+                    <a:xfrm>
+                      <a:off x="0" y="0"/>
+                      <a:ext cx="5943600" cy="3066415"/>
+                    </a:xfrm>
+                    <a:prstGeom prst="rect">
+                      <a:avLst/>
+                    </a:prstGeom>
+                  </pic:spPr>
+                </pic:pic>
+              </a:graphicData>
+            </a:graphic>
+          </wp:inline>
+        </w:drawing>
+      </w:r>
+    </w:p>
+    <w:p/>
+    <w:p/>
+    <w:p>
+      <w:r>
+        <w:t>Details address steps</w:t>
+      </w:r>
+    </w:p>
+    <w:p>
+      <w:r>
+        <w:drawing>
+          <wp:inline distT="0" distB="0" distL="0" distR="0" wp14:anchorId="47CF53DD" wp14:editId="51107850">
+            <wp:extent cx="5943600" cy="3136265"/>
+            <wp:effectExtent l="0" t="0" r="0" b="6985"/>
+            <wp:docPr id="1611826058" name="Picture 1"/>
+            <wp:cNvGraphicFramePr>
+              <a:graphicFrameLocks xmlns:a="http://schemas.openxmlformats.org/drawingml/2006/main" noChangeAspect="1"/>
+            </wp:cNvGraphicFramePr>
+            <a:graphic xmlns:a="http://schemas.openxmlformats.org/drawingml/2006/main">
+              <a:graphicData uri="http://schemas.openxmlformats.org/drawingml/2006/picture">
+                <pic:pic xmlns:pic="http://schemas.openxmlformats.org/drawingml/2006/picture">
+                  <pic:nvPicPr>
+                    <pic:cNvPr id="1611826058" name=""/>
+                    <pic:cNvPicPr/>
+                  </pic:nvPicPr>
+                  <pic:blipFill>
+                    <a:blip r:embed="rId11"/>
+                    <a:stretch>
+                      <a:fillRect/>
+                    </a:stretch>
+                  </pic:blipFill>
+                  <pic:spPr>
+                    <a:xfrm>
+                      <a:off x="0" y="0"/>
+                      <a:ext cx="5943600" cy="3136265"/>
+                    </a:xfrm>
+                    <a:prstGeom prst="rect">
+                      <a:avLst/>
+                    </a:prstGeom>
+                  </pic:spPr>
+                </pic:pic>
+              </a:graphicData>
+            </a:graphic>
+          </wp:inline>
+        </w:drawing>
+      </w:r>
+    </w:p>
+    <w:p/>
+    <w:p>
+      <w:r>
+        <w:t>Users must fill in sufficient information to ensure this request is approved by Admin board</w:t>
+      </w:r>
+    </w:p>
+    <w:p>
+      <w:r>
+        <w:lastRenderedPageBreak/>
+        <w:t>Next screen that asks users to fill the method of transportation</w:t>
+      </w:r>
+    </w:p>
+    <w:p>
+      <w:r>
+        <w:drawing>
+          <wp:inline distT="0" distB="0" distL="0" distR="0" wp14:anchorId="7B786FDE" wp14:editId="1E4973DA">
+            <wp:extent cx="5943600" cy="3070860"/>
+            <wp:effectExtent l="0" t="0" r="0" b="0"/>
+            <wp:docPr id="1193265765" name="Picture 1"/>
+            <wp:cNvGraphicFramePr>
+              <a:graphicFrameLocks xmlns:a="http://schemas.openxmlformats.org/drawingml/2006/main" noChangeAspect="1"/>
+            </wp:cNvGraphicFramePr>
+            <a:graphic xmlns:a="http://schemas.openxmlformats.org/drawingml/2006/main">
+              <a:graphicData uri="http://schemas.openxmlformats.org/drawingml/2006/picture">
+                <pic:pic xmlns:pic="http://schemas.openxmlformats.org/drawingml/2006/picture">
+                  <pic:nvPicPr>
+                    <pic:cNvPr id="1193265765" name=""/>
+                    <pic:cNvPicPr/>
+                  </pic:nvPicPr>
+                  <pic:blipFill>
+                    <a:blip r:embed="rId12"/>
+                    <a:stretch>
+                      <a:fillRect/>
+                    </a:stretch>
+                  </pic:blipFill>
+                  <pic:spPr>
+                    <a:xfrm>
+                      <a:off x="0" y="0"/>
+                      <a:ext cx="5943600" cy="3070860"/>
+                    </a:xfrm>
+                    <a:prstGeom prst="rect">
+                      <a:avLst/>
+                    </a:prstGeom>
+                  </pic:spPr>
+                </pic:pic>
+              </a:graphicData>
+            </a:graphic>
+          </wp:inline>
+        </w:drawing>
+      </w:r>
+    </w:p>
+    <w:p/>
+    <w:p/>
+    <w:p/>
+    <w:p/>
+    <w:p/>
+    <w:p>
+      <w:r>
+        <w:t xml:space="preserve">Users must type the business type and </w:t>
+      </w:r>
+      <w:proofErr w:type="gramStart"/>
+      <w:r>
+        <w:t>full</w:t>
+      </w:r>
+      <w:proofErr w:type="gramEnd"/>
+      <w:r>
+        <w:t xml:space="preserve"> fill sufficient info and validation</w:t>
+      </w:r>
+    </w:p>
+    <w:p>
+      <w:r>
+        <w:drawing>
+          <wp:inline distT="0" distB="0" distL="0" distR="0" wp14:anchorId="7C5932C3" wp14:editId="797E6C6F">
+            <wp:extent cx="5943600" cy="2708275"/>
+            <wp:effectExtent l="0" t="0" r="0" b="0"/>
+            <wp:docPr id="382001693" name="Picture 1"/>
+            <wp:cNvGraphicFramePr>
+              <a:graphicFrameLocks xmlns:a="http://schemas.openxmlformats.org/drawingml/2006/main" noChangeAspect="1"/>
+            </wp:cNvGraphicFramePr>
+            <a:graphic xmlns:a="http://schemas.openxmlformats.org/drawingml/2006/main">
+              <a:graphicData uri="http://schemas.openxmlformats.org/drawingml/2006/picture">
+                <pic:pic xmlns:pic="http://schemas.openxmlformats.org/drawingml/2006/picture">
+                  <pic:nvPicPr>
+                    <pic:cNvPr id="382001693" name=""/>
+                    <pic:cNvPicPr/>
+                  </pic:nvPicPr>
+                  <pic:blipFill>
+                    <a:blip r:embed="rId13"/>
+                    <a:stretch>
+                      <a:fillRect/>
+                    </a:stretch>
+                  </pic:blipFill>
+                  <pic:spPr>
+                    <a:xfrm>
+                      <a:off x="0" y="0"/>
+                      <a:ext cx="5943600" cy="2708275"/>
+                    </a:xfrm>
+                    <a:prstGeom prst="rect">
+                      <a:avLst/>
+                    </a:prstGeom>
+                  </pic:spPr>
+                </pic:pic>
+              </a:graphicData>
+            </a:graphic>
+          </wp:inline>
+        </w:drawing>
+      </w:r>
+    </w:p>
+    <w:p>
+      <w:r>
+        <w:lastRenderedPageBreak/>
+        <w:t xml:space="preserve">Personal </w:t>
+      </w:r>
+      <w:proofErr w:type="gramStart"/>
+      <w:r>
+        <w:t>business( Same</w:t>
+      </w:r>
+      <w:proofErr w:type="gramEnd"/>
+      <w:r>
+        <w:t xml:space="preserve"> screen for Company business)</w:t>
+      </w:r>
+    </w:p>
+    <w:p>
+      <w:r>
+        <w:drawing>
+          <wp:inline distT="0" distB="0" distL="0" distR="0" wp14:anchorId="5D8B7361" wp14:editId="407C4BD4">
+            <wp:extent cx="5943600" cy="2977515"/>
+            <wp:effectExtent l="0" t="0" r="0" b="0"/>
+            <wp:docPr id="871475123" name="Picture 1"/>
+            <wp:cNvGraphicFramePr>
+              <a:graphicFrameLocks xmlns:a="http://schemas.openxmlformats.org/drawingml/2006/main" noChangeAspect="1"/>
+            </wp:cNvGraphicFramePr>
+            <a:graphic xmlns:a="http://schemas.openxmlformats.org/drawingml/2006/main">
+              <a:graphicData uri="http://schemas.openxmlformats.org/drawingml/2006/picture">
+                <pic:pic xmlns:pic="http://schemas.openxmlformats.org/drawingml/2006/picture">
+                  <pic:nvPicPr>
+                    <pic:cNvPr id="871475123" name=""/>
+                    <pic:cNvPicPr/>
+                  </pic:nvPicPr>
+                  <pic:blipFill>
+                    <a:blip r:embed="rId14"/>
+                    <a:stretch>
+                      <a:fillRect/>
+                    </a:stretch>
+                  </pic:blipFill>
+                  <pic:spPr>
+                    <a:xfrm>
+                      <a:off x="0" y="0"/>
+                      <a:ext cx="5943600" cy="2977515"/>
+                    </a:xfrm>
+                    <a:prstGeom prst="rect">
+                      <a:avLst/>
+                    </a:prstGeom>
+                  </pic:spPr>
+                </pic:pic>
+              </a:graphicData>
+            </a:graphic>
+          </wp:inline>
+        </w:drawing>
+      </w:r>
+    </w:p>
+    <w:p/>
+    <w:p>
+      <w:r>
+        <w:t xml:space="preserve">Users must </w:t>
+      </w:r>
+      <w:proofErr w:type="gramStart"/>
+      <w:r>
+        <w:t>fill</w:t>
+      </w:r>
+      <w:proofErr w:type="gramEnd"/>
+      <w:r>
+        <w:t xml:space="preserve"> the important information for business owner and will be scanned by AI system to validate the information</w:t>
+      </w:r>
+      <w:r>
+        <w:br/>
+      </w:r>
+      <w:r>
+        <w:br/>
+      </w:r>
+      <w:r>
+        <w:drawing>
+          <wp:inline distT="0" distB="0" distL="0" distR="0" wp14:anchorId="7C774153" wp14:editId="5FD15C07">
+            <wp:extent cx="5943600" cy="3114675"/>
+            <wp:effectExtent l="0" t="0" r="0" b="9525"/>
+            <wp:docPr id="844429743" name="Picture 1"/>
+            <wp:cNvGraphicFramePr>
+              <a:graphicFrameLocks xmlns:a="http://schemas.openxmlformats.org/drawingml/2006/main" noChangeAspect="1"/>
+            </wp:cNvGraphicFramePr>
+            <a:graphic xmlns:a="http://schemas.openxmlformats.org/drawingml/2006/main">
+              <a:graphicData uri="http://schemas.openxmlformats.org/drawingml/2006/picture">
+                <pic:pic xmlns:pic="http://schemas.openxmlformats.org/drawingml/2006/picture">
+                  <pic:nvPicPr>
+                    <pic:cNvPr id="844429743" name=""/>
+                    <pic:cNvPicPr/>
+                  </pic:nvPicPr>
+                  <pic:blipFill>
+                    <a:blip r:embed="rId15"/>
+                    <a:stretch>
+                      <a:fillRect/>
+                    </a:stretch>
+                  </pic:blipFill>
+                  <pic:spPr>
+                    <a:xfrm>
+                      <a:off x="0" y="0"/>
+                      <a:ext cx="5943600" cy="3114675"/>
+                    </a:xfrm>
+                    <a:prstGeom prst="rect">
+                      <a:avLst/>
+                    </a:prstGeom>
+                  </pic:spPr>
+                </pic:pic>
+              </a:graphicData>
+            </a:graphic>
+          </wp:inline>
+        </w:drawing>
+      </w:r>
+    </w:p>
+    <w:p/>
+    <w:p>
+      <w:r>
+        <w:lastRenderedPageBreak/>
+        <w:t xml:space="preserve">Users will be denied moving to next steps if checking failed the result and ask the user </w:t>
+      </w:r>
+      <w:proofErr w:type="gramStart"/>
+      <w:r>
+        <w:t>has to</w:t>
+      </w:r>
+      <w:proofErr w:type="gramEnd"/>
+      <w:r>
+        <w:t xml:space="preserve"> verify and update the correct information</w:t>
+      </w:r>
+    </w:p>
+    <w:p>
+      <w:r>
+        <w:drawing>
+          <wp:inline distT="0" distB="0" distL="0" distR="0" wp14:anchorId="2714DCDE" wp14:editId="72553935">
+            <wp:extent cx="5943600" cy="4973320"/>
+            <wp:effectExtent l="0" t="0" r="0" b="0"/>
+            <wp:docPr id="581917070" name="Picture 1"/>
+            <wp:cNvGraphicFramePr>
+              <a:graphicFrameLocks xmlns:a="http://schemas.openxmlformats.org/drawingml/2006/main" noChangeAspect="1"/>
+            </wp:cNvGraphicFramePr>
+            <a:graphic xmlns:a="http://schemas.openxmlformats.org/drawingml/2006/main">
+              <a:graphicData uri="http://schemas.openxmlformats.org/drawingml/2006/picture">
+                <pic:pic xmlns:pic="http://schemas.openxmlformats.org/drawingml/2006/picture">
+                  <pic:nvPicPr>
+                    <pic:cNvPr id="581917070" name=""/>
+                    <pic:cNvPicPr/>
+                  </pic:nvPicPr>
+                  <pic:blipFill>
+                    <a:blip r:embed="rId16"/>
+                    <a:stretch>
+                      <a:fillRect/>
+                    </a:stretch>
+                  </pic:blipFill>
+                  <pic:spPr>
+                    <a:xfrm>
+                      <a:off x="0" y="0"/>
+                      <a:ext cx="5943600" cy="4973320"/>
+                    </a:xfrm>
+                    <a:prstGeom prst="rect">
+                      <a:avLst/>
+                    </a:prstGeom>
+                  </pic:spPr>
+                </pic:pic>
+              </a:graphicData>
+            </a:graphic>
+          </wp:inline>
+        </w:drawing>
+      </w:r>
+    </w:p>
+    <w:p/>
+    <w:p>
+      <w:r>
+        <w:t>Showcase of invalid information checking</w:t>
+      </w:r>
+    </w:p>
+    <w:p>
+      <w:r>
+        <w:lastRenderedPageBreak/>
+        <w:drawing>
+          <wp:inline distT="0" distB="0" distL="0" distR="0" wp14:anchorId="324424B7" wp14:editId="2D1210C9">
+            <wp:extent cx="5943600" cy="3320415"/>
+            <wp:effectExtent l="0" t="0" r="0" b="0"/>
+            <wp:docPr id="2064447346" name="Picture 1"/>
+            <wp:cNvGraphicFramePr>
+              <a:graphicFrameLocks xmlns:a="http://schemas.openxmlformats.org/drawingml/2006/main" noChangeAspect="1"/>
+            </wp:cNvGraphicFramePr>
+            <a:graphic xmlns:a="http://schemas.openxmlformats.org/drawingml/2006/main">
+              <a:graphicData uri="http://schemas.openxmlformats.org/drawingml/2006/picture">
+                <pic:pic xmlns:pic="http://schemas.openxmlformats.org/drawingml/2006/picture">
+                  <pic:nvPicPr>
+                    <pic:cNvPr id="2064447346" name=""/>
+                    <pic:cNvPicPr/>
+                  </pic:nvPicPr>
+                  <pic:blipFill>
+                    <a:blip r:embed="rId17"/>
+                    <a:stretch>
+                      <a:fillRect/>
+                    </a:stretch>
+                  </pic:blipFill>
+                  <pic:spPr>
+                    <a:xfrm>
+                      <a:off x="0" y="0"/>
+                      <a:ext cx="5943600" cy="3320415"/>
+                    </a:xfrm>
+                    <a:prstGeom prst="rect">
+                      <a:avLst/>
+                    </a:prstGeom>
+                  </pic:spPr>
+                </pic:pic>
+              </a:graphicData>
+            </a:graphic>
+          </wp:inline>
+        </w:drawing>
+      </w:r>
+    </w:p>
+    <w:p/>
+    <w:p>
+      <w:r>
+        <w:t xml:space="preserve">After all information needed </w:t>
+      </w:r>
+      <w:proofErr w:type="gramStart"/>
+      <w:r>
+        <w:t>id</w:t>
+      </w:r>
+      <w:proofErr w:type="gramEnd"/>
+      <w:r>
+        <w:t xml:space="preserve"> valid, the requester will receive the notification and email as below</w:t>
+      </w:r>
+      <w:r>
+        <w:br/>
+      </w:r>
+      <w:r>
+        <w:br/>
+      </w:r>
+      <w:r>
+        <w:drawing>
+          <wp:inline distT="0" distB="0" distL="0" distR="0" wp14:anchorId="67C8281E" wp14:editId="565BDE32">
+            <wp:extent cx="5943600" cy="2729865"/>
+            <wp:effectExtent l="0" t="0" r="0" b="0"/>
+            <wp:docPr id="4117309" name="Picture 1"/>
+            <wp:cNvGraphicFramePr>
+              <a:graphicFrameLocks xmlns:a="http://schemas.openxmlformats.org/drawingml/2006/main" noChangeAspect="1"/>
+            </wp:cNvGraphicFramePr>
+            <a:graphic xmlns:a="http://schemas.openxmlformats.org/drawingml/2006/main">
+              <a:graphicData uri="http://schemas.openxmlformats.org/drawingml/2006/picture">
+                <pic:pic xmlns:pic="http://schemas.openxmlformats.org/drawingml/2006/picture">
+                  <pic:nvPicPr>
+                    <pic:cNvPr id="4117309" name=""/>
+                    <pic:cNvPicPr/>
+                  </pic:nvPicPr>
+                  <pic:blipFill>
+                    <a:blip r:embed="rId18"/>
+                    <a:stretch>
+                      <a:fillRect/>
+                    </a:stretch>
+                  </pic:blipFill>
+                  <pic:spPr>
+                    <a:xfrm>
+                      <a:off x="0" y="0"/>
+                      <a:ext cx="5943600" cy="2729865"/>
+                    </a:xfrm>
+                    <a:prstGeom prst="rect">
+                      <a:avLst/>
+                    </a:prstGeom>
+                  </pic:spPr>
+                </pic:pic>
+              </a:graphicData>
+            </a:graphic>
+          </wp:inline>
+        </w:drawing>
+      </w:r>
+    </w:p>
+    <w:p/>
+    <w:p>
+      <w:r>
+        <w:lastRenderedPageBreak/>
+        <w:drawing>
+          <wp:inline distT="0" distB="0" distL="0" distR="0" wp14:anchorId="307BE867" wp14:editId="30984DF4">
+            <wp:extent cx="5943600" cy="4895850"/>
+            <wp:effectExtent l="0" t="0" r="0" b="0"/>
+            <wp:docPr id="709922797" name="Picture 1"/>
+            <wp:cNvGraphicFramePr>
+              <a:graphicFrameLocks xmlns:a="http://schemas.openxmlformats.org/drawingml/2006/main" noChangeAspect="1"/>
+            </wp:cNvGraphicFramePr>
+            <a:graphic xmlns:a="http://schemas.openxmlformats.org/drawingml/2006/main">
+              <a:graphicData uri="http://schemas.openxmlformats.org/drawingml/2006/picture">
+                <pic:pic xmlns:pic="http://schemas.openxmlformats.org/drawingml/2006/picture">
+                  <pic:nvPicPr>
+                    <pic:cNvPr id="709922797" name=""/>
+                    <pic:cNvPicPr/>
+                  </pic:nvPicPr>
+                  <pic:blipFill>
+                    <a:blip r:embed="rId19"/>
+                    <a:stretch>
+                      <a:fillRect/>
+                    </a:stretch>
+                  </pic:blipFill>
+                  <pic:spPr>
+                    <a:xfrm>
+                      <a:off x="0" y="0"/>
+                      <a:ext cx="5943600" cy="4895850"/>
+                    </a:xfrm>
+                    <a:prstGeom prst="rect">
+                      <a:avLst/>
+                    </a:prstGeom>
+                  </pic:spPr>
+                </pic:pic>
+              </a:graphicData>
+            </a:graphic>
+          </wp:inline>
+        </w:drawing>
+      </w:r>
+    </w:p>
+    <w:p/>
     <w:p>
       <w:r>
         <w:t xml:space="preserve">    1. After </w:t>
@@ -507,7 +963,6 @@
     <w:p/>
     <w:p>
       <w:r>
-        <w:lastRenderedPageBreak/>
         <w:t xml:space="preserve">        - </w:t>
       </w:r>
       <w:r>
@@ -531,239 +986,7 @@
         <w:tab/>
       </w:r>
       <w:r>
-        <w:t>"</w:t>
-      </w:r>
-      <w:proofErr w:type="spellStart"/>
-      <w:r>
-        <w:t>Hồ</w:t>
-      </w:r>
-      <w:proofErr w:type="spellEnd"/>
-      <w:r>
-        <w:t xml:space="preserve"> </w:t>
-      </w:r>
-      <w:proofErr w:type="spellStart"/>
-      <w:r>
-        <w:t>sơ</w:t>
-      </w:r>
-      <w:proofErr w:type="spellEnd"/>
-      <w:r>
-        <w:t xml:space="preserve"> </w:t>
-      </w:r>
-      <w:proofErr w:type="spellStart"/>
-      <w:r>
-        <w:t>đang</w:t>
-      </w:r>
-      <w:proofErr w:type="spellEnd"/>
-      <w:r>
-        <w:t xml:space="preserve"> </w:t>
-      </w:r>
-      <w:proofErr w:type="spellStart"/>
-      <w:r>
-        <w:t>chờ</w:t>
-      </w:r>
-      <w:proofErr w:type="spellEnd"/>
-      <w:r>
-        <w:t xml:space="preserve"> </w:t>
-      </w:r>
-      <w:proofErr w:type="spellStart"/>
-      <w:r>
-        <w:t>phê</w:t>
-      </w:r>
-      <w:proofErr w:type="spellEnd"/>
-      <w:r>
-        <w:t xml:space="preserve"> </w:t>
-      </w:r>
-      <w:proofErr w:type="spellStart"/>
-      <w:r>
-        <w:t>duyệtYêu</w:t>
-      </w:r>
-      <w:proofErr w:type="spellEnd"/>
-      <w:r>
-        <w:t xml:space="preserve"> </w:t>
-      </w:r>
-      <w:proofErr w:type="spellStart"/>
-      <w:r>
-        <w:t>cầu</w:t>
-      </w:r>
-      <w:proofErr w:type="spellEnd"/>
-      <w:r>
-        <w:t xml:space="preserve"> </w:t>
-      </w:r>
-      <w:proofErr w:type="spellStart"/>
-      <w:r>
-        <w:t>đăng</w:t>
-      </w:r>
-      <w:proofErr w:type="spellEnd"/>
-      <w:r>
-        <w:t xml:space="preserve"> </w:t>
-      </w:r>
-      <w:proofErr w:type="spellStart"/>
-      <w:r>
-        <w:t>ký</w:t>
-      </w:r>
-      <w:proofErr w:type="spellEnd"/>
-      <w:r>
-        <w:t xml:space="preserve"> </w:t>
-      </w:r>
-      <w:proofErr w:type="spellStart"/>
-      <w:r>
-        <w:t>Người</w:t>
-      </w:r>
-      <w:proofErr w:type="spellEnd"/>
-      <w:r>
-        <w:t xml:space="preserve"> </w:t>
-      </w:r>
-      <w:proofErr w:type="spellStart"/>
-      <w:r>
-        <w:t>bán</w:t>
-      </w:r>
-      <w:proofErr w:type="spellEnd"/>
-      <w:r>
-        <w:t xml:space="preserve"> </w:t>
-      </w:r>
-      <w:proofErr w:type="spellStart"/>
-      <w:r>
-        <w:t>của</w:t>
-      </w:r>
-      <w:proofErr w:type="spellEnd"/>
-      <w:r>
-        <w:t xml:space="preserve"> </w:t>
-      </w:r>
-      <w:proofErr w:type="spellStart"/>
-      <w:r>
-        <w:t>bạn</w:t>
-      </w:r>
-      <w:proofErr w:type="spellEnd"/>
-      <w:r>
-        <w:t xml:space="preserve"> </w:t>
-      </w:r>
-      <w:proofErr w:type="spellStart"/>
-      <w:r>
-        <w:t>đã</w:t>
-      </w:r>
-      <w:proofErr w:type="spellEnd"/>
-      <w:r>
-        <w:t xml:space="preserve"> </w:t>
-      </w:r>
-      <w:proofErr w:type="spellStart"/>
-      <w:r>
-        <w:t>được</w:t>
-      </w:r>
-      <w:proofErr w:type="spellEnd"/>
-      <w:r>
-        <w:t xml:space="preserve"> </w:t>
-      </w:r>
-      <w:proofErr w:type="spellStart"/>
-      <w:r>
-        <w:t>tiếp</w:t>
-      </w:r>
-      <w:proofErr w:type="spellEnd"/>
-      <w:r>
-        <w:t xml:space="preserve"> </w:t>
-      </w:r>
-      <w:proofErr w:type="spellStart"/>
-      <w:r>
-        <w:t>nhận</w:t>
-      </w:r>
-      <w:proofErr w:type="spellEnd"/>
-      <w:r>
-        <w:t xml:space="preserve">. </w:t>
-      </w:r>
-      <w:proofErr w:type="spellStart"/>
-      <w:r>
-        <w:t>Đội</w:t>
-      </w:r>
-      <w:proofErr w:type="spellEnd"/>
-      <w:r>
-        <w:t xml:space="preserve"> </w:t>
-      </w:r>
-      <w:proofErr w:type="spellStart"/>
-      <w:r>
-        <w:t>ngũ</w:t>
-      </w:r>
-      <w:proofErr w:type="spellEnd"/>
-      <w:r>
-        <w:t xml:space="preserve"> </w:t>
-      </w:r>
-      <w:proofErr w:type="spellStart"/>
-      <w:r>
-        <w:t>kiểm</w:t>
-      </w:r>
-      <w:proofErr w:type="spellEnd"/>
-      <w:r>
-        <w:t xml:space="preserve"> </w:t>
-      </w:r>
-      <w:proofErr w:type="spellStart"/>
-      <w:r>
-        <w:t>duyệt</w:t>
-      </w:r>
-      <w:proofErr w:type="spellEnd"/>
-      <w:r>
-        <w:t xml:space="preserve"> </w:t>
-      </w:r>
-      <w:proofErr w:type="spellStart"/>
-      <w:r>
-        <w:t>sẽ</w:t>
-      </w:r>
-      <w:proofErr w:type="spellEnd"/>
-      <w:r>
-        <w:t xml:space="preserve"> </w:t>
-      </w:r>
-      <w:proofErr w:type="spellStart"/>
-      <w:r>
-        <w:t>phản</w:t>
-      </w:r>
-      <w:proofErr w:type="spellEnd"/>
-      <w:r>
-        <w:t xml:space="preserve"> </w:t>
-      </w:r>
-      <w:proofErr w:type="spellStart"/>
-      <w:r>
-        <w:t>hồi</w:t>
-      </w:r>
-      <w:proofErr w:type="spellEnd"/>
-      <w:r>
-        <w:t xml:space="preserve"> </w:t>
-      </w:r>
-      <w:proofErr w:type="spellStart"/>
-      <w:r>
-        <w:t>trong</w:t>
-      </w:r>
-      <w:proofErr w:type="spellEnd"/>
-      <w:r>
-        <w:t xml:space="preserve"> </w:t>
-      </w:r>
-      <w:proofErr w:type="spellStart"/>
-      <w:r>
-        <w:t>vòng</w:t>
-      </w:r>
-      <w:proofErr w:type="spellEnd"/>
-      <w:r>
-        <w:t xml:space="preserve"> 24 </w:t>
-      </w:r>
-      <w:proofErr w:type="spellStart"/>
-      <w:r>
-        <w:t>giờ</w:t>
-      </w:r>
-      <w:proofErr w:type="spellEnd"/>
-      <w:r>
-        <w:t xml:space="preserve"> </w:t>
-      </w:r>
-      <w:proofErr w:type="spellStart"/>
-      <w:r>
-        <w:t>làm</w:t>
-      </w:r>
-      <w:proofErr w:type="spellEnd"/>
-      <w:r>
-        <w:t xml:space="preserve"> </w:t>
-      </w:r>
-      <w:proofErr w:type="spellStart"/>
-      <w:r>
-        <w:t>việc</w:t>
-      </w:r>
-      <w:proofErr w:type="spellEnd"/>
-      <w:r>
-        <w:t>."</w:t>
+        <w:t>"Hồ sơ đang chờ phê duyệtYêu cầu đăng ký Người bán của bạn đã được tiếp nhận. Đội ngũ kiểm duyệt sẽ phản hồi trong vòng 24 giờ làm việc."</w:t>
       </w:r>
     </w:p>
     <w:p>
@@ -773,16 +996,12 @@
       </w:r>
       <w:r>
         <w:tab/>
-        <w:t xml:space="preserve">An email to the requester to confirm admin received the request and will check and </w:t>
-      </w:r>
-      <w:proofErr w:type="spellStart"/>
-      <w:r>
-        <w:t>appove</w:t>
-      </w:r>
-      <w:proofErr w:type="spellEnd"/>
-    </w:p>
-    <w:p>
-      <w:r>
+        <w:t>An email to the requester to confirm admin received the request and will check and appove</w:t>
+      </w:r>
+    </w:p>
+    <w:p>
+      <w:r>
+        <w:lastRenderedPageBreak/>
         <w:drawing>
           <wp:inline distT="0" distB="0" distL="0" distR="0" wp14:anchorId="16048E08" wp14:editId="33309AF5">
             <wp:extent cx="5943600" cy="1891665"/>
@@ -799,7 +1018,7 @@
                     <pic:cNvPicPr/>
                   </pic:nvPicPr>
                   <pic:blipFill>
-                    <a:blip r:embed="rId11"/>
+                    <a:blip r:embed="rId20"/>
                     <a:stretch>
                       <a:fillRect/>
                     </a:stretch>
@@ -842,202 +1061,18 @@
         <w:t>progress</w:t>
       </w:r>
       <w:r>
-        <w:t xml:space="preserve"> of the status and a notification also appear "</w:t>
-      </w:r>
-      <w:proofErr w:type="spellStart"/>
-      <w:r>
-        <w:t>Đăng</w:t>
-      </w:r>
-      <w:proofErr w:type="spellEnd"/>
-      <w:r>
-        <w:t xml:space="preserve"> </w:t>
-      </w:r>
-      <w:proofErr w:type="spellStart"/>
-      <w:r>
-        <w:t>ký</w:t>
-      </w:r>
-      <w:proofErr w:type="spellEnd"/>
-      <w:r>
-        <w:t xml:space="preserve"> </w:t>
-      </w:r>
-      <w:proofErr w:type="spellStart"/>
-      <w:r>
-        <w:t>thành</w:t>
-      </w:r>
-      <w:proofErr w:type="spellEnd"/>
-      <w:r>
-        <w:t xml:space="preserve"> </w:t>
-      </w:r>
-      <w:proofErr w:type="spellStart"/>
-      <w:r>
-        <w:t>công</w:t>
-      </w:r>
-      <w:proofErr w:type="spellEnd"/>
-      <w:r>
-        <w:t>!</w:t>
-      </w:r>
-    </w:p>
-    <w:p>
-      <w:r>
-        <w:t xml:space="preserve">                </w:t>
-      </w:r>
-      <w:proofErr w:type="spellStart"/>
-      <w:r>
-        <w:t>Hồ</w:t>
-      </w:r>
-      <w:proofErr w:type="spellEnd"/>
-      <w:r>
-        <w:t xml:space="preserve"> </w:t>
-      </w:r>
-      <w:proofErr w:type="spellStart"/>
-      <w:r>
-        <w:t>sơ</w:t>
-      </w:r>
-      <w:proofErr w:type="spellEnd"/>
-      <w:r>
-        <w:t xml:space="preserve"> </w:t>
-      </w:r>
-      <w:proofErr w:type="spellStart"/>
-      <w:r>
-        <w:t>của</w:t>
-      </w:r>
-      <w:proofErr w:type="spellEnd"/>
-      <w:r>
-        <w:t xml:space="preserve"> </w:t>
-      </w:r>
-      <w:proofErr w:type="spellStart"/>
-      <w:r>
-        <w:t>bạn</w:t>
-      </w:r>
-      <w:proofErr w:type="spellEnd"/>
-      <w:r>
-        <w:t xml:space="preserve"> </w:t>
-      </w:r>
-      <w:proofErr w:type="spellStart"/>
-      <w:r>
-        <w:t>đã</w:t>
-      </w:r>
-      <w:proofErr w:type="spellEnd"/>
-      <w:r>
-        <w:t xml:space="preserve"> </w:t>
-      </w:r>
-      <w:proofErr w:type="spellStart"/>
-      <w:r>
-        <w:t>được</w:t>
-      </w:r>
-      <w:proofErr w:type="spellEnd"/>
-      <w:r>
-        <w:t xml:space="preserve"> </w:t>
-      </w:r>
-      <w:proofErr w:type="spellStart"/>
-      <w:r>
-        <w:t>gửi</w:t>
-      </w:r>
-      <w:proofErr w:type="spellEnd"/>
-      <w:r>
-        <w:t xml:space="preserve">. </w:t>
-      </w:r>
-      <w:proofErr w:type="spellStart"/>
-      <w:r>
-        <w:t>Chúng</w:t>
-      </w:r>
-      <w:proofErr w:type="spellEnd"/>
-      <w:r>
-        <w:t xml:space="preserve"> </w:t>
-      </w:r>
-      <w:proofErr w:type="spellStart"/>
-      <w:r>
-        <w:t>tôi</w:t>
-      </w:r>
-      <w:proofErr w:type="spellEnd"/>
-      <w:r>
-        <w:t xml:space="preserve"> </w:t>
-      </w:r>
-      <w:proofErr w:type="spellStart"/>
-      <w:r>
-        <w:t>đã</w:t>
-      </w:r>
-      <w:proofErr w:type="spellEnd"/>
-      <w:r>
-        <w:t xml:space="preserve"> </w:t>
-      </w:r>
-      <w:proofErr w:type="spellStart"/>
-      <w:r>
-        <w:t>gửi</w:t>
-      </w:r>
-      <w:proofErr w:type="spellEnd"/>
-      <w:r>
-        <w:t xml:space="preserve"> email </w:t>
-      </w:r>
-      <w:proofErr w:type="spellStart"/>
-      <w:r>
-        <w:t>xác</w:t>
-      </w:r>
-      <w:proofErr w:type="spellEnd"/>
-      <w:r>
-        <w:t xml:space="preserve"> </w:t>
-      </w:r>
-      <w:proofErr w:type="spellStart"/>
-      <w:r>
-        <w:t>nhận</w:t>
-      </w:r>
-      <w:proofErr w:type="spellEnd"/>
-      <w:r>
-        <w:t xml:space="preserve"> </w:t>
-      </w:r>
-      <w:proofErr w:type="spellStart"/>
-      <w:r>
-        <w:t>đến</w:t>
-      </w:r>
-      <w:proofErr w:type="spellEnd"/>
-      <w:r>
-        <w:t xml:space="preserve"> pending@ainetsoft.com.</w:t>
+        <w:t xml:space="preserve"> of the status and a notification also appear "Đăng ký thành công!</w:t>
+      </w:r>
+    </w:p>
+    <w:p>
+      <w:r>
+        <w:t xml:space="preserve">                Hồ sơ của bạn đã được gửi. Chúng tôi đã gửi email xác nhận đến pending@ainetsoft.com.</w:t>
       </w:r>
     </w:p>
     <w:p/>
     <w:p>
       <w:r>
-        <w:t xml:space="preserve">                Phản </w:t>
-      </w:r>
-      <w:proofErr w:type="spellStart"/>
-      <w:r>
-        <w:t>hồi</w:t>
-      </w:r>
-      <w:proofErr w:type="spellEnd"/>
-      <w:r>
-        <w:t xml:space="preserve"> </w:t>
-      </w:r>
-      <w:proofErr w:type="spellStart"/>
-      <w:r>
-        <w:t>chậm</w:t>
-      </w:r>
-      <w:proofErr w:type="spellEnd"/>
-      <w:r>
-        <w:t xml:space="preserve"> </w:t>
-      </w:r>
-      <w:proofErr w:type="spellStart"/>
-      <w:r>
-        <w:t>nhất</w:t>
-      </w:r>
-      <w:proofErr w:type="spellEnd"/>
-      <w:r>
-        <w:t xml:space="preserve"> </w:t>
-      </w:r>
-      <w:proofErr w:type="spellStart"/>
-      <w:r>
-        <w:t>trong</w:t>
-      </w:r>
-      <w:proofErr w:type="spellEnd"/>
-      <w:r>
-        <w:t xml:space="preserve"> </w:t>
-      </w:r>
-      <w:proofErr w:type="spellStart"/>
-      <w:r>
-        <w:t>vòng</w:t>
-      </w:r>
-      <w:proofErr w:type="spellEnd"/>
-      <w:r>
-        <w:t xml:space="preserve"> 24h"</w:t>
+        <w:t xml:space="preserve">                Phản hồi chậm nhất trong vòng 24h"</w:t>
       </w:r>
     </w:p>
     <w:p>
@@ -1071,72 +1106,8 @@
         <w:rPr>
           <w:color w:val="EE0000"/>
         </w:rPr>
-        <w:t xml:space="preserve"> "</w:t>
-      </w:r>
-      <w:proofErr w:type="spellStart"/>
-      <w:r>
-        <w:rPr>
-          <w:color w:val="EE0000"/>
-        </w:rPr>
-        <w:t>Hồ</w:t>
-      </w:r>
-      <w:proofErr w:type="spellEnd"/>
-      <w:r>
-        <w:rPr>
-          <w:color w:val="EE0000"/>
-        </w:rPr>
-        <w:t xml:space="preserve"> </w:t>
-      </w:r>
-      <w:proofErr w:type="spellStart"/>
-      <w:r>
-        <w:rPr>
-          <w:color w:val="EE0000"/>
-        </w:rPr>
-        <w:t>sơ</w:t>
-      </w:r>
-      <w:proofErr w:type="spellEnd"/>
-      <w:r>
-        <w:rPr>
-          <w:color w:val="EE0000"/>
-        </w:rPr>
-        <w:t xml:space="preserve"> </w:t>
-      </w:r>
-      <w:proofErr w:type="spellStart"/>
-      <w:r>
-        <w:rPr>
-          <w:color w:val="EE0000"/>
-        </w:rPr>
-        <w:t>bị</w:t>
-      </w:r>
-      <w:proofErr w:type="spellEnd"/>
-      <w:r>
-        <w:rPr>
-          <w:color w:val="EE0000"/>
-        </w:rPr>
-        <w:t xml:space="preserve"> </w:t>
-      </w:r>
-      <w:proofErr w:type="spellStart"/>
-      <w:r>
-        <w:rPr>
-          <w:color w:val="EE0000"/>
-        </w:rPr>
-        <w:t>từ</w:t>
-      </w:r>
-      <w:proofErr w:type="spellEnd"/>
-      <w:r>
-        <w:rPr>
-          <w:color w:val="EE0000"/>
-        </w:rPr>
-        <w:t xml:space="preserve"> </w:t>
-      </w:r>
-      <w:proofErr w:type="spellStart"/>
-      <w:r>
-        <w:rPr>
-          <w:color w:val="EE0000"/>
-        </w:rPr>
-        <w:t>chối</w:t>
-      </w:r>
-      <w:proofErr w:type="spellEnd"/>
+        <w:t xml:space="preserve"> "Hồ sơ bị từ chối</w:t>
+      </w:r>
     </w:p>
     <w:p>
       <w:pPr>
@@ -1162,454 +1133,20 @@
         <w:rPr>
           <w:color w:val="EE0000"/>
         </w:rPr>
-        <w:t xml:space="preserve">: </w:t>
-      </w:r>
-      <w:proofErr w:type="spellStart"/>
-      <w:r>
+        <w:t>: Chụp lại ảnh CCCD.</w:t>
+      </w:r>
+    </w:p>
+    <w:p>
+      <w:pPr>
         <w:rPr>
           <w:color w:val="EE0000"/>
         </w:rPr>
-        <w:t>Chụp</w:t>
-      </w:r>
-      <w:proofErr w:type="spellEnd"/>
+      </w:pPr>
       <w:r>
         <w:rPr>
           <w:color w:val="EE0000"/>
         </w:rPr>
-        <w:t xml:space="preserve"> </w:t>
-      </w:r>
-      <w:proofErr w:type="spellStart"/>
-      <w:r>
-        <w:rPr>
-          <w:color w:val="EE0000"/>
-        </w:rPr>
-        <w:t>lại</w:t>
-      </w:r>
-      <w:proofErr w:type="spellEnd"/>
-      <w:r>
-        <w:rPr>
-          <w:color w:val="EE0000"/>
-        </w:rPr>
-        <w:t xml:space="preserve"> </w:t>
-      </w:r>
-      <w:proofErr w:type="spellStart"/>
-      <w:r>
-        <w:rPr>
-          <w:color w:val="EE0000"/>
-        </w:rPr>
-        <w:t>ảnh</w:t>
-      </w:r>
-      <w:proofErr w:type="spellEnd"/>
-      <w:r>
-        <w:rPr>
-          <w:color w:val="EE0000"/>
-        </w:rPr>
-        <w:t xml:space="preserve"> CCCD.</w:t>
-      </w:r>
-    </w:p>
-    <w:p>
-      <w:pPr>
-        <w:rPr>
-          <w:color w:val="EE0000"/>
-        </w:rPr>
-      </w:pPr>
-      <w:r>
-        <w:rPr>
-          <w:color w:val="EE0000"/>
-        </w:rPr>
-        <w:t xml:space="preserve">                </w:t>
-      </w:r>
-      <w:proofErr w:type="spellStart"/>
-      <w:r>
-        <w:rPr>
-          <w:color w:val="EE0000"/>
-        </w:rPr>
-        <w:t>Hệ</w:t>
-      </w:r>
-      <w:proofErr w:type="spellEnd"/>
-      <w:r>
-        <w:rPr>
-          <w:color w:val="EE0000"/>
-        </w:rPr>
-        <w:t xml:space="preserve"> </w:t>
-      </w:r>
-      <w:proofErr w:type="spellStart"/>
-      <w:r>
-        <w:rPr>
-          <w:color w:val="EE0000"/>
-        </w:rPr>
-        <w:t>thống</w:t>
-      </w:r>
-      <w:proofErr w:type="spellEnd"/>
-      <w:r>
-        <w:rPr>
-          <w:color w:val="EE0000"/>
-        </w:rPr>
-        <w:t xml:space="preserve"> </w:t>
-      </w:r>
-      <w:proofErr w:type="spellStart"/>
-      <w:r>
-        <w:rPr>
-          <w:color w:val="EE0000"/>
-        </w:rPr>
-        <w:t>không</w:t>
-      </w:r>
-      <w:proofErr w:type="spellEnd"/>
-      <w:r>
-        <w:rPr>
-          <w:color w:val="EE0000"/>
-        </w:rPr>
-        <w:t xml:space="preserve"> </w:t>
-      </w:r>
-      <w:proofErr w:type="spellStart"/>
-      <w:r>
-        <w:rPr>
-          <w:color w:val="EE0000"/>
-        </w:rPr>
-        <w:t>thể</w:t>
-      </w:r>
-      <w:proofErr w:type="spellEnd"/>
-      <w:r>
-        <w:rPr>
-          <w:color w:val="EE0000"/>
-        </w:rPr>
-        <w:t xml:space="preserve"> </w:t>
-      </w:r>
-      <w:proofErr w:type="spellStart"/>
-      <w:r>
-        <w:rPr>
-          <w:color w:val="EE0000"/>
-        </w:rPr>
-        <w:t>xác</w:t>
-      </w:r>
-      <w:proofErr w:type="spellEnd"/>
-      <w:r>
-        <w:rPr>
-          <w:color w:val="EE0000"/>
-        </w:rPr>
-        <w:t xml:space="preserve"> </w:t>
-      </w:r>
-      <w:proofErr w:type="spellStart"/>
-      <w:r>
-        <w:rPr>
-          <w:color w:val="EE0000"/>
-        </w:rPr>
-        <w:t>thực</w:t>
-      </w:r>
-      <w:proofErr w:type="spellEnd"/>
-      <w:r>
-        <w:rPr>
-          <w:color w:val="EE0000"/>
-        </w:rPr>
-        <w:t xml:space="preserve"> </w:t>
-      </w:r>
-      <w:proofErr w:type="spellStart"/>
-      <w:r>
-        <w:rPr>
-          <w:color w:val="EE0000"/>
-        </w:rPr>
-        <w:t>một</w:t>
-      </w:r>
-      <w:proofErr w:type="spellEnd"/>
-      <w:r>
-        <w:rPr>
-          <w:color w:val="EE0000"/>
-        </w:rPr>
-        <w:t xml:space="preserve"> </w:t>
-      </w:r>
-      <w:proofErr w:type="spellStart"/>
-      <w:r>
-        <w:rPr>
-          <w:color w:val="EE0000"/>
-        </w:rPr>
-        <w:t>số</w:t>
-      </w:r>
-      <w:proofErr w:type="spellEnd"/>
-      <w:r>
-        <w:rPr>
-          <w:color w:val="EE0000"/>
-        </w:rPr>
-        <w:t xml:space="preserve"> </w:t>
-      </w:r>
-      <w:proofErr w:type="spellStart"/>
-      <w:r>
-        <w:rPr>
-          <w:color w:val="EE0000"/>
-        </w:rPr>
-        <w:t>thông</w:t>
-      </w:r>
-      <w:proofErr w:type="spellEnd"/>
-      <w:r>
-        <w:rPr>
-          <w:color w:val="EE0000"/>
-        </w:rPr>
-        <w:t xml:space="preserve"> tin </w:t>
-      </w:r>
-      <w:proofErr w:type="spellStart"/>
-      <w:r>
-        <w:rPr>
-          <w:color w:val="EE0000"/>
-        </w:rPr>
-        <w:t>của</w:t>
-      </w:r>
-      <w:proofErr w:type="spellEnd"/>
-      <w:r>
-        <w:rPr>
-          <w:color w:val="EE0000"/>
-        </w:rPr>
-        <w:t xml:space="preserve"> </w:t>
-      </w:r>
-      <w:proofErr w:type="spellStart"/>
-      <w:r>
-        <w:rPr>
-          <w:color w:val="EE0000"/>
-        </w:rPr>
-        <w:t>bạn</w:t>
-      </w:r>
-      <w:proofErr w:type="spellEnd"/>
-      <w:r>
-        <w:rPr>
-          <w:color w:val="EE0000"/>
-        </w:rPr>
-        <w:t xml:space="preserve">. Vui </w:t>
-      </w:r>
-      <w:proofErr w:type="spellStart"/>
-      <w:r>
-        <w:rPr>
-          <w:color w:val="EE0000"/>
-        </w:rPr>
-        <w:t>lòng</w:t>
-      </w:r>
-      <w:proofErr w:type="spellEnd"/>
-      <w:r>
-        <w:rPr>
-          <w:color w:val="EE0000"/>
-        </w:rPr>
-        <w:t xml:space="preserve"> </w:t>
-      </w:r>
-      <w:proofErr w:type="spellStart"/>
-      <w:r>
-        <w:rPr>
-          <w:color w:val="EE0000"/>
-        </w:rPr>
-        <w:t>kiểm</w:t>
-      </w:r>
-      <w:proofErr w:type="spellEnd"/>
-      <w:r>
-        <w:rPr>
-          <w:color w:val="EE0000"/>
-        </w:rPr>
-        <w:t xml:space="preserve"> </w:t>
-      </w:r>
-      <w:proofErr w:type="spellStart"/>
-      <w:r>
-        <w:rPr>
-          <w:color w:val="EE0000"/>
-        </w:rPr>
-        <w:t>tra</w:t>
-      </w:r>
-      <w:proofErr w:type="spellEnd"/>
-      <w:r>
-        <w:rPr>
-          <w:color w:val="EE0000"/>
-        </w:rPr>
-        <w:t xml:space="preserve"> </w:t>
-      </w:r>
-      <w:proofErr w:type="spellStart"/>
-      <w:r>
-        <w:rPr>
-          <w:color w:val="EE0000"/>
-        </w:rPr>
-        <w:t>lại</w:t>
-      </w:r>
-      <w:proofErr w:type="spellEnd"/>
-      <w:r>
-        <w:rPr>
-          <w:color w:val="EE0000"/>
-        </w:rPr>
-        <w:t xml:space="preserve"> </w:t>
-      </w:r>
-      <w:proofErr w:type="spellStart"/>
-      <w:r>
-        <w:rPr>
-          <w:color w:val="EE0000"/>
-        </w:rPr>
-        <w:t>lý</w:t>
-      </w:r>
-      <w:proofErr w:type="spellEnd"/>
-      <w:r>
-        <w:rPr>
-          <w:color w:val="EE0000"/>
-        </w:rPr>
-        <w:t xml:space="preserve"> do </w:t>
-      </w:r>
-      <w:proofErr w:type="spellStart"/>
-      <w:r>
-        <w:rPr>
-          <w:color w:val="EE0000"/>
-        </w:rPr>
-        <w:t>trên</w:t>
-      </w:r>
-      <w:proofErr w:type="spellEnd"/>
-      <w:r>
-        <w:rPr>
-          <w:color w:val="EE0000"/>
-        </w:rPr>
-        <w:t xml:space="preserve"> </w:t>
-      </w:r>
-      <w:proofErr w:type="spellStart"/>
-      <w:r>
-        <w:rPr>
-          <w:color w:val="EE0000"/>
-        </w:rPr>
-        <w:t>và</w:t>
-      </w:r>
-      <w:proofErr w:type="spellEnd"/>
-      <w:r>
-        <w:rPr>
-          <w:color w:val="EE0000"/>
-        </w:rPr>
-        <w:t xml:space="preserve"> </w:t>
-      </w:r>
-      <w:proofErr w:type="spellStart"/>
-      <w:r>
-        <w:rPr>
-          <w:color w:val="EE0000"/>
-        </w:rPr>
-        <w:t>cập</w:t>
-      </w:r>
-      <w:proofErr w:type="spellEnd"/>
-      <w:r>
-        <w:rPr>
-          <w:color w:val="EE0000"/>
-        </w:rPr>
-        <w:t xml:space="preserve"> </w:t>
-      </w:r>
-      <w:proofErr w:type="spellStart"/>
-      <w:r>
-        <w:rPr>
-          <w:color w:val="EE0000"/>
-        </w:rPr>
-        <w:t>nhật</w:t>
-      </w:r>
-      <w:proofErr w:type="spellEnd"/>
-      <w:r>
-        <w:rPr>
-          <w:color w:val="EE0000"/>
-        </w:rPr>
-        <w:t xml:space="preserve"> </w:t>
-      </w:r>
-      <w:proofErr w:type="spellStart"/>
-      <w:r>
-        <w:rPr>
-          <w:color w:val="EE0000"/>
-        </w:rPr>
-        <w:t>hồ</w:t>
-      </w:r>
-      <w:proofErr w:type="spellEnd"/>
-      <w:r>
-        <w:rPr>
-          <w:color w:val="EE0000"/>
-        </w:rPr>
-        <w:t xml:space="preserve"> </w:t>
-      </w:r>
-      <w:proofErr w:type="spellStart"/>
-      <w:r>
-        <w:rPr>
-          <w:color w:val="EE0000"/>
-        </w:rPr>
-        <w:t>sơ</w:t>
-      </w:r>
-      <w:proofErr w:type="spellEnd"/>
-      <w:r>
-        <w:rPr>
-          <w:color w:val="EE0000"/>
-        </w:rPr>
-        <w:t xml:space="preserve"> </w:t>
-      </w:r>
-      <w:proofErr w:type="spellStart"/>
-      <w:r>
-        <w:rPr>
-          <w:color w:val="EE0000"/>
-        </w:rPr>
-        <w:t>chính</w:t>
-      </w:r>
-      <w:proofErr w:type="spellEnd"/>
-      <w:r>
-        <w:rPr>
-          <w:color w:val="EE0000"/>
-        </w:rPr>
-        <w:t xml:space="preserve"> </w:t>
-      </w:r>
-      <w:proofErr w:type="spellStart"/>
-      <w:r>
-        <w:rPr>
-          <w:color w:val="EE0000"/>
-        </w:rPr>
-        <w:t>xác</w:t>
-      </w:r>
-      <w:proofErr w:type="spellEnd"/>
-      <w:r>
-        <w:rPr>
-          <w:color w:val="EE0000"/>
-        </w:rPr>
-        <w:t xml:space="preserve"> </w:t>
-      </w:r>
-      <w:proofErr w:type="spellStart"/>
-      <w:r>
-        <w:rPr>
-          <w:color w:val="EE0000"/>
-        </w:rPr>
-        <w:t>trước</w:t>
-      </w:r>
-      <w:proofErr w:type="spellEnd"/>
-      <w:r>
-        <w:rPr>
-          <w:color w:val="EE0000"/>
-        </w:rPr>
-        <w:t xml:space="preserve"> </w:t>
-      </w:r>
-      <w:proofErr w:type="spellStart"/>
-      <w:r>
-        <w:rPr>
-          <w:color w:val="EE0000"/>
-        </w:rPr>
-        <w:t>khi</w:t>
-      </w:r>
-      <w:proofErr w:type="spellEnd"/>
-      <w:r>
-        <w:rPr>
-          <w:color w:val="EE0000"/>
-        </w:rPr>
-        <w:t xml:space="preserve"> </w:t>
-      </w:r>
-      <w:proofErr w:type="spellStart"/>
-      <w:r>
-        <w:rPr>
-          <w:color w:val="EE0000"/>
-        </w:rPr>
-        <w:t>gửi</w:t>
-      </w:r>
-      <w:proofErr w:type="spellEnd"/>
-      <w:r>
-        <w:rPr>
-          <w:color w:val="EE0000"/>
-        </w:rPr>
-        <w:t xml:space="preserve"> </w:t>
-      </w:r>
-      <w:proofErr w:type="spellStart"/>
-      <w:r>
-        <w:rPr>
-          <w:color w:val="EE0000"/>
-        </w:rPr>
-        <w:t>lại</w:t>
-      </w:r>
-      <w:proofErr w:type="spellEnd"/>
-      <w:r>
-        <w:rPr>
-          <w:color w:val="EE0000"/>
-        </w:rPr>
-        <w:t>."</w:t>
+        <w:t xml:space="preserve">                Hệ thống không thể xác thực một số thông tin của bạn. Vui lòng kiểm tra lại lý do trên và cập nhật hồ sơ chính xác trước khi gửi lại."</w:t>
       </w:r>
     </w:p>
     <w:p/>
@@ -1644,7 +1181,7 @@
                     <pic:cNvPicPr/>
                   </pic:nvPicPr>
                   <pic:blipFill>
-                    <a:blip r:embed="rId12"/>
+                    <a:blip r:embed="rId21"/>
                     <a:stretch>
                       <a:fillRect/>
                     </a:stretch>
@@ -1701,7 +1238,7 @@
                     <pic:cNvPicPr/>
                   </pic:nvPicPr>
                   <pic:blipFill>
-                    <a:blip r:embed="rId13"/>
+                    <a:blip r:embed="rId22"/>
                     <a:stretch>
                       <a:fillRect/>
                     </a:stretch>
@@ -1759,7 +1296,7 @@
                     <pic:cNvPicPr/>
                   </pic:nvPicPr>
                   <pic:blipFill>
-                    <a:blip r:embed="rId14"/>
+                    <a:blip r:embed="rId23"/>
                     <a:stretch>
                       <a:fillRect/>
                     </a:stretch>
@@ -1811,7 +1348,7 @@
                     <pic:cNvPicPr/>
                   </pic:nvPicPr>
                   <pic:blipFill>
-                    <a:blip r:embed="rId15"/>
+                    <a:blip r:embed="rId24"/>
                     <a:stretch>
                       <a:fillRect/>
                     </a:stretch>
@@ -1866,7 +1403,7 @@
                     <pic:cNvPicPr/>
                   </pic:nvPicPr>
                   <pic:blipFill>
-                    <a:blip r:embed="rId16"/>
+                    <a:blip r:embed="rId25"/>
                     <a:stretch>
                       <a:fillRect/>
                     </a:stretch>
@@ -1890,31 +1427,7 @@
     <w:p/>
     <w:p>
       <w:r>
-        <w:t xml:space="preserve">Danh </w:t>
-      </w:r>
-      <w:proofErr w:type="spellStart"/>
-      <w:r>
-        <w:t>sách</w:t>
-      </w:r>
-      <w:proofErr w:type="spellEnd"/>
-      <w:r>
-        <w:t xml:space="preserve"> </w:t>
-      </w:r>
-      <w:proofErr w:type="spellStart"/>
-      <w:r>
-        <w:t>sản</w:t>
-      </w:r>
-      <w:proofErr w:type="spellEnd"/>
-      <w:r>
-        <w:t xml:space="preserve"> </w:t>
-      </w:r>
-      <w:proofErr w:type="spellStart"/>
-      <w:r>
-        <w:t>phẩm</w:t>
-      </w:r>
-      <w:proofErr w:type="spellEnd"/>
-      <w:r>
-        <w:t>:</w:t>
+        <w:t>Danh sách sản phẩm:</w:t>
       </w:r>
     </w:p>
     <w:p>
@@ -1935,7 +1448,7 @@
                     <pic:cNvPicPr/>
                   </pic:nvPicPr>
                   <pic:blipFill>
-                    <a:blip r:embed="rId17"/>
+                    <a:blip r:embed="rId26"/>
                     <a:stretch>
                       <a:fillRect/>
                     </a:stretch>
@@ -1959,23 +1472,7 @@
     <w:p/>
     <w:p>
       <w:r>
-        <w:t xml:space="preserve">Quản </w:t>
-      </w:r>
-      <w:proofErr w:type="spellStart"/>
-      <w:r>
-        <w:t>lý</w:t>
-      </w:r>
-      <w:proofErr w:type="spellEnd"/>
-      <w:r>
-        <w:t xml:space="preserve"> </w:t>
-      </w:r>
-      <w:proofErr w:type="spellStart"/>
-      <w:r>
-        <w:t>đơn</w:t>
-      </w:r>
-      <w:proofErr w:type="spellEnd"/>
-      <w:r>
-        <w:t xml:space="preserve"> hang</w:t>
+        <w:t>Quản lý đơn hang</w:t>
       </w:r>
     </w:p>
     <w:p/>
@@ -1997,7 +1494,7 @@
                     <pic:cNvPicPr/>
                   </pic:nvPicPr>
                   <pic:blipFill>
-                    <a:blip r:embed="rId18"/>
+                    <a:blip r:embed="rId27"/>
                     <a:stretch>
                       <a:fillRect/>
                     </a:stretch>
@@ -2020,22 +1517,9 @@
     </w:p>
     <w:p/>
     <w:p>
-      <w:proofErr w:type="spellStart"/>
       <w:r>
         <w:lastRenderedPageBreak/>
-        <w:t>Thiết</w:t>
-      </w:r>
-      <w:proofErr w:type="spellEnd"/>
-      <w:r>
-        <w:t xml:space="preserve"> </w:t>
-      </w:r>
-      <w:proofErr w:type="spellStart"/>
-      <w:r>
-        <w:t>lập</w:t>
-      </w:r>
-      <w:proofErr w:type="spellEnd"/>
-      <w:r>
-        <w:t xml:space="preserve"> shop:</w:t>
+        <w:t>Thiết lập shop:</w:t>
       </w:r>
     </w:p>
     <w:p>
@@ -2056,7 +1540,7 @@
                     <pic:cNvPicPr/>
                   </pic:nvPicPr>
                   <pic:blipFill>
-                    <a:blip r:embed="rId19"/>
+                    <a:blip r:embed="rId28"/>
                     <a:stretch>
                       <a:fillRect/>
                     </a:stretch>
@@ -2243,11 +1727,9 @@
             <w:hideMark/>
           </w:tcPr>
           <w:p>
-            <w:proofErr w:type="spellStart"/>
             <w:r>
               <w:t>audit_logs</w:t>
             </w:r>
-            <w:proofErr w:type="spellEnd"/>
           </w:p>
         </w:tc>
         <w:tc>
@@ -2280,11 +1762,9 @@
             <w:hideMark/>
           </w:tcPr>
           <w:p>
-            <w:proofErr w:type="spellStart"/>
             <w:r>
               <w:t>bank_accounts</w:t>
             </w:r>
-            <w:proofErr w:type="spellEnd"/>
           </w:p>
         </w:tc>
         <w:tc>
@@ -2353,11 +1833,9 @@
             <w:hideMark/>
           </w:tcPr>
           <w:p>
-            <w:proofErr w:type="spellStart"/>
             <w:r>
               <w:t>chat_messages</w:t>
             </w:r>
-            <w:proofErr w:type="spellEnd"/>
           </w:p>
         </w:tc>
         <w:tc>
@@ -2390,11 +1868,9 @@
             <w:hideMark/>
           </w:tcPr>
           <w:p>
-            <w:proofErr w:type="spellStart"/>
             <w:r>
               <w:t>content_nodes</w:t>
             </w:r>
-            <w:proofErr w:type="spellEnd"/>
           </w:p>
         </w:tc>
         <w:tc>
@@ -2427,11 +1903,9 @@
             <w:hideMark/>
           </w:tcPr>
           <w:p>
-            <w:proofErr w:type="spellStart"/>
             <w:r>
               <w:t>feedback_templates</w:t>
             </w:r>
-            <w:proofErr w:type="spellEnd"/>
           </w:p>
         </w:tc>
         <w:tc>
@@ -2464,11 +1938,9 @@
             <w:hideMark/>
           </w:tcPr>
           <w:p>
-            <w:proofErr w:type="spellStart"/>
             <w:r>
               <w:t>footer_icons</w:t>
             </w:r>
-            <w:proofErr w:type="spellEnd"/>
           </w:p>
         </w:tc>
         <w:tc>
@@ -2501,11 +1973,9 @@
             <w:hideMark/>
           </w:tcPr>
           <w:p>
-            <w:proofErr w:type="spellStart"/>
             <w:r>
               <w:t>footer_menus</w:t>
             </w:r>
-            <w:proofErr w:type="spellEnd"/>
           </w:p>
         </w:tc>
         <w:tc>
@@ -2538,11 +2008,9 @@
             <w:hideMark/>
           </w:tcPr>
           <w:p>
-            <w:proofErr w:type="spellStart"/>
             <w:r>
               <w:t>help_nodes</w:t>
             </w:r>
-            <w:proofErr w:type="spellEnd"/>
           </w:p>
         </w:tc>
         <w:tc>
@@ -2645,11 +2113,9 @@
             <w:hideMark/>
           </w:tcPr>
           <w:p>
-            <w:proofErr w:type="spellStart"/>
             <w:r>
               <w:t>password_reset_tokens</w:t>
             </w:r>
-            <w:proofErr w:type="spellEnd"/>
           </w:p>
         </w:tc>
         <w:tc>
@@ -2682,11 +2148,9 @@
             <w:hideMark/>
           </w:tcPr>
           <w:p>
-            <w:proofErr w:type="spellStart"/>
             <w:r>
               <w:t>product_reports</w:t>
             </w:r>
-            <w:proofErr w:type="spellEnd"/>
           </w:p>
         </w:tc>
         <w:tc>
@@ -2754,7 +2218,6 @@
             <w:hideMark/>
           </w:tcPr>
           <w:p>
-            <w:proofErr w:type="spellStart"/>
             <w:proofErr w:type="gramStart"/>
             <w:r>
               <w:t>report</w:t>
@@ -2763,7 +2226,6 @@
             <w:r>
               <w:t>_reasons</w:t>
             </w:r>
-            <w:proofErr w:type="spellEnd"/>
           </w:p>
         </w:tc>
         <w:tc>
@@ -2831,11 +2293,9 @@
             <w:hideMark/>
           </w:tcPr>
           <w:p>
-            <w:proofErr w:type="spellStart"/>
             <w:r>
               <w:t>shipping_methods</w:t>
             </w:r>
-            <w:proofErr w:type="spellEnd"/>
           </w:p>
         </w:tc>
         <w:tc>
@@ -2868,11 +2328,9 @@
             <w:hideMark/>
           </w:tcPr>
           <w:p>
-            <w:proofErr w:type="spellStart"/>
             <w:r>
               <w:t>system_contents</w:t>
             </w:r>
-            <w:proofErr w:type="spellEnd"/>
           </w:p>
         </w:tc>
         <w:tc>
@@ -3134,6 +2592,95 @@
     </w:lvl>
   </w:abstractNum>
   <w:abstractNum w:abstractNumId="2" w15:restartNumberingAfterBreak="0">
+    <w:nsid w:val="0E43608B"/>
+    <w:multiLevelType w:val="hybridMultilevel"/>
+    <w:tmpl w:val="4BAC5D5A"/>
+    <w:lvl w:ilvl="0" w:tplc="D6A27E6A">
+      <w:start w:val="1"/>
+      <w:numFmt w:val="decimal"/>
+      <w:lvlText w:val="%1."/>
+      <w:lvlJc w:val="left"/>
+      <w:pPr>
+        <w:ind w:left="555" w:hanging="360"/>
+      </w:pPr>
+      <w:rPr>
+        <w:rFonts w:hint="default"/>
+      </w:rPr>
+    </w:lvl>
+    <w:lvl w:ilvl="1" w:tplc="04090019" w:tentative="1">
+      <w:start w:val="1"/>
+      <w:numFmt w:val="lowerLetter"/>
+      <w:lvlText w:val="%2."/>
+      <w:lvlJc w:val="left"/>
+      <w:pPr>
+        <w:ind w:left="1275" w:hanging="360"/>
+      </w:pPr>
+    </w:lvl>
+    <w:lvl w:ilvl="2" w:tplc="0409001B" w:tentative="1">
+      <w:start w:val="1"/>
+      <w:numFmt w:val="lowerRoman"/>
+      <w:lvlText w:val="%3."/>
+      <w:lvlJc w:val="right"/>
+      <w:pPr>
+        <w:ind w:left="1995" w:hanging="180"/>
+      </w:pPr>
+    </w:lvl>
+    <w:lvl w:ilvl="3" w:tplc="0409000F" w:tentative="1">
+      <w:start w:val="1"/>
+      <w:numFmt w:val="decimal"/>
+      <w:lvlText w:val="%4."/>
+      <w:lvlJc w:val="left"/>
+      <w:pPr>
+        <w:ind w:left="2715" w:hanging="360"/>
+      </w:pPr>
+    </w:lvl>
+    <w:lvl w:ilvl="4" w:tplc="04090019" w:tentative="1">
+      <w:start w:val="1"/>
+      <w:numFmt w:val="lowerLetter"/>
+      <w:lvlText w:val="%5."/>
+      <w:lvlJc w:val="left"/>
+      <w:pPr>
+        <w:ind w:left="3435" w:hanging="360"/>
+      </w:pPr>
+    </w:lvl>
+    <w:lvl w:ilvl="5" w:tplc="0409001B" w:tentative="1">
+      <w:start w:val="1"/>
+      <w:numFmt w:val="lowerRoman"/>
+      <w:lvlText w:val="%6."/>
+      <w:lvlJc w:val="right"/>
+      <w:pPr>
+        <w:ind w:left="4155" w:hanging="180"/>
+      </w:pPr>
+    </w:lvl>
+    <w:lvl w:ilvl="6" w:tplc="0409000F" w:tentative="1">
+      <w:start w:val="1"/>
+      <w:numFmt w:val="decimal"/>
+      <w:lvlText w:val="%7."/>
+      <w:lvlJc w:val="left"/>
+      <w:pPr>
+        <w:ind w:left="4875" w:hanging="360"/>
+      </w:pPr>
+    </w:lvl>
+    <w:lvl w:ilvl="7" w:tplc="04090019" w:tentative="1">
+      <w:start w:val="1"/>
+      <w:numFmt w:val="lowerLetter"/>
+      <w:lvlText w:val="%8."/>
+      <w:lvlJc w:val="left"/>
+      <w:pPr>
+        <w:ind w:left="5595" w:hanging="360"/>
+      </w:pPr>
+    </w:lvl>
+    <w:lvl w:ilvl="8" w:tplc="0409001B" w:tentative="1">
+      <w:start w:val="1"/>
+      <w:numFmt w:val="lowerRoman"/>
+      <w:lvlText w:val="%9."/>
+      <w:lvlJc w:val="right"/>
+      <w:pPr>
+        <w:ind w:left="6315" w:hanging="180"/>
+      </w:pPr>
+    </w:lvl>
+  </w:abstractNum>
+  <w:abstractNum w:abstractNumId="3" w15:restartNumberingAfterBreak="0">
     <w:nsid w:val="287A1ABB"/>
     <w:multiLevelType w:val="hybridMultilevel"/>
     <w:tmpl w:val="E3E431FC"/>
@@ -3222,7 +2769,7 @@
       </w:pPr>
     </w:lvl>
   </w:abstractNum>
-  <w:abstractNum w:abstractNumId="3" w15:restartNumberingAfterBreak="0">
+  <w:abstractNum w:abstractNumId="4" w15:restartNumberingAfterBreak="0">
     <w:nsid w:val="4B9319F0"/>
     <w:multiLevelType w:val="hybridMultilevel"/>
     <w:tmpl w:val="70AC04D8"/>
@@ -3334,7 +2881,7 @@
       </w:rPr>
     </w:lvl>
   </w:abstractNum>
-  <w:abstractNum w:abstractNumId="4" w15:restartNumberingAfterBreak="0">
+  <w:abstractNum w:abstractNumId="5" w15:restartNumberingAfterBreak="0">
     <w:nsid w:val="695C4555"/>
     <w:multiLevelType w:val="hybridMultilevel"/>
     <w:tmpl w:val="21D8CDE2"/>
@@ -3448,19 +2995,22 @@
     </w:lvl>
   </w:abstractNum>
   <w:num w:numId="1" w16cid:durableId="307444825">
-    <w:abstractNumId w:val="2"/>
+    <w:abstractNumId w:val="3"/>
   </w:num>
   <w:num w:numId="2" w16cid:durableId="844518652">
     <w:abstractNumId w:val="0"/>
   </w:num>
   <w:num w:numId="3" w16cid:durableId="986399927">
-    <w:abstractNumId w:val="4"/>
+    <w:abstractNumId w:val="5"/>
   </w:num>
   <w:num w:numId="4" w16cid:durableId="2140294211">
-    <w:abstractNumId w:val="3"/>
+    <w:abstractNumId w:val="4"/>
   </w:num>
   <w:num w:numId="5" w16cid:durableId="890191977">
     <w:abstractNumId w:val="1"/>
+  </w:num>
+  <w:num w:numId="6" w16cid:durableId="1168982786">
+    <w:abstractNumId w:val="2"/>
   </w:num>
 </w:numbering>
 </file>

</xml_diff>

<commit_message>
Code updated for phase 1 admin users
</commit_message>
<xml_diff>
--- a/AiNetsoft Functions Description.docx
+++ b/AiNetsoft Functions Description.docx
@@ -3,8 +3,13 @@
 <w:document xmlns:wpc="http://schemas.microsoft.com/office/word/2010/wordprocessingCanvas" xmlns:cx="http://schemas.microsoft.com/office/drawing/2014/chartex" xmlns:cx1="http://schemas.microsoft.com/office/drawing/2015/9/8/chartex" xmlns:cx2="http://schemas.microsoft.com/office/drawing/2015/10/21/chartex" xmlns:cx3="http://schemas.microsoft.com/office/drawing/2016/5/9/chartex" xmlns:cx4="http://schemas.microsoft.com/office/drawing/2016/5/10/chartex" xmlns:cx5="http://schemas.microsoft.com/office/drawing/2016/5/11/chartex" xmlns:cx6="http://schemas.microsoft.com/office/drawing/2016/5/12/chartex" xmlns:cx7="http://schemas.microsoft.com/office/drawing/2016/5/13/chartex" xmlns:cx8="http://schemas.microsoft.com/office/drawing/2016/5/14/chartex" xmlns:mc="http://schemas.openxmlformats.org/markup-compatibility/2006" xmlns:aink="http://schemas.microsoft.com/office/drawing/2016/ink" xmlns:am3d="http://schemas.microsoft.com/office/drawing/2017/model3d" xmlns:o="urn:schemas-microsoft-com:office:office" xmlns:oel="http://schemas.microsoft.com/office/2019/extlst" xmlns:r="http://schemas.openxmlformats.org/officeDocument/2006/relationships" xmlns:m="http://schemas.openxmlformats.org/officeDocument/2006/math" xmlns:v="urn:schemas-microsoft-com:vml" xmlns:wp14="http://schemas.microsoft.com/office/word/2010/wordprocessingDrawing" xmlns:wp="http://schemas.openxmlformats.org/drawingml/2006/wordprocessingDrawing" xmlns:w10="urn:schemas-microsoft-com:office:word" xmlns:w="http://schemas.openxmlformats.org/wordprocessingml/2006/main" xmlns:w14="http://schemas.microsoft.com/office/word/2010/wordml" xmlns:w15="http://schemas.microsoft.com/office/word/2012/wordml" xmlns:w16cex="http://schemas.microsoft.com/office/word/2018/wordml/cex" xmlns:w16cid="http://schemas.microsoft.com/office/word/2016/wordml/cid" xmlns:w16="http://schemas.microsoft.com/office/word/2018/wordml" xmlns:w16du="http://schemas.microsoft.com/office/word/2023/wordml/word16du" xmlns:w16sdtdh="http://schemas.microsoft.com/office/word/2020/wordml/sdtdatahash" xmlns:w16sdtfl="http://schemas.microsoft.com/office/word/2024/wordml/sdtformatlock" xmlns:w16se="http://schemas.microsoft.com/office/word/2015/wordml/symex" xmlns:wpg="http://schemas.microsoft.com/office/word/2010/wordprocessingGroup" xmlns:wpi="http://schemas.microsoft.com/office/word/2010/wordprocessingInk" xmlns:wne="http://schemas.microsoft.com/office/word/2006/wordml" xmlns:wps="http://schemas.microsoft.com/office/word/2010/wordprocessingShape" mc:Ignorable="w14 w15 w16se w16cid w16 w16cex w16sdtdh w16sdtfl w16du wp14">
   <w:body>
     <w:p>
-      <w:r>
-        <w:t>AiNetsoft Functions Description</w:t>
+      <w:proofErr w:type="spellStart"/>
+      <w:r>
+        <w:t>AiNetsoft</w:t>
+      </w:r>
+      <w:proofErr w:type="spellEnd"/>
+      <w:r>
+        <w:t xml:space="preserve"> Functions Description</w:t>
       </w:r>
     </w:p>
     <w:p/>
@@ -34,11 +39,9 @@
       <w:r>
         <w:t xml:space="preserve"> of normal users, the screen </w:t>
       </w:r>
-      <w:proofErr w:type="gramStart"/>
-      <w:r>
-        <w:t>appear</w:t>
-      </w:r>
-      <w:proofErr w:type="gramEnd"/>
+      <w:r>
+        <w:t>appears</w:t>
+      </w:r>
       <w:r>
         <w:t xml:space="preserve"> in</w:t>
       </w:r>
@@ -49,6 +52,9 @@
         <w:br/>
       </w:r>
       <w:r>
+        <w:rPr>
+          <w:noProof/>
+        </w:rPr>
         <w:drawing>
           <wp:inline distT="0" distB="0" distL="0" distR="0" wp14:anchorId="192F310E" wp14:editId="5036CEEE">
             <wp:extent cx="5943600" cy="2712085"/>
@@ -108,7 +114,15 @@
       </w:r>
       <w:proofErr w:type="gramEnd"/>
       <w:r>
-        <w:t xml:space="preserve"> so ca nhan”.  The scenario that Phone number can be sync from the Sell request data to this page, also same for email. Data is </w:t>
+        <w:t xml:space="preserve"> so ca </w:t>
+      </w:r>
+      <w:proofErr w:type="spellStart"/>
+      <w:r>
+        <w:t>nhan</w:t>
+      </w:r>
+      <w:proofErr w:type="spellEnd"/>
+      <w:r>
+        <w:t xml:space="preserve">”.  The scenario that Phone number can be sync from the Sell request data to this page, also same for email. Data is </w:t>
       </w:r>
       <w:proofErr w:type="gramStart"/>
       <w:r>
@@ -128,14 +142,41 @@
         </w:numPr>
       </w:pPr>
       <w:r>
-        <w:t>Tài khoản ngân hang is being s</w:t>
-      </w:r>
-      <w:r>
-        <w:t>tored in the bank_account collection. This also be sync when user request to become a Seller</w:t>
-      </w:r>
-    </w:p>
-    <w:p>
-      <w:r>
+        <w:t xml:space="preserve">Tài </w:t>
+      </w:r>
+      <w:proofErr w:type="spellStart"/>
+      <w:r>
+        <w:t>khoản</w:t>
+      </w:r>
+      <w:proofErr w:type="spellEnd"/>
+      <w:r>
+        <w:t xml:space="preserve"> </w:t>
+      </w:r>
+      <w:proofErr w:type="spellStart"/>
+      <w:r>
+        <w:t>ngân</w:t>
+      </w:r>
+      <w:proofErr w:type="spellEnd"/>
+      <w:r>
+        <w:t xml:space="preserve"> hang is being s</w:t>
+      </w:r>
+      <w:r>
+        <w:t xml:space="preserve">tored in the </w:t>
+      </w:r>
+      <w:proofErr w:type="spellStart"/>
+      <w:r>
+        <w:t>bank_account</w:t>
+      </w:r>
+      <w:proofErr w:type="spellEnd"/>
+      <w:r>
+        <w:t xml:space="preserve"> collection. This also be sync when user request to become a Seller</w:t>
+      </w:r>
+    </w:p>
+    <w:p>
+      <w:r>
+        <w:rPr>
+          <w:noProof/>
+        </w:rPr>
         <w:drawing>
           <wp:inline distT="0" distB="0" distL="0" distR="0" wp14:anchorId="671817B6" wp14:editId="2D54E67D">
             <wp:extent cx="5943600" cy="2378075"/>
@@ -181,13 +222,37 @@
           <w:numId w:val="5"/>
         </w:numPr>
       </w:pPr>
+      <w:proofErr w:type="spellStart"/>
       <w:r>
         <w:lastRenderedPageBreak/>
-        <w:t>Địa chỉ nhận hang: Users can update data here. This is also synced to the Seller registry from if use request to become a Seller</w:t>
-      </w:r>
-    </w:p>
-    <w:p>
-      <w:r>
+        <w:t>Địa</w:t>
+      </w:r>
+      <w:proofErr w:type="spellEnd"/>
+      <w:r>
+        <w:t xml:space="preserve"> </w:t>
+      </w:r>
+      <w:proofErr w:type="spellStart"/>
+      <w:r>
+        <w:t>chỉ</w:t>
+      </w:r>
+      <w:proofErr w:type="spellEnd"/>
+      <w:r>
+        <w:t xml:space="preserve"> </w:t>
+      </w:r>
+      <w:proofErr w:type="spellStart"/>
+      <w:r>
+        <w:t>nhận</w:t>
+      </w:r>
+      <w:proofErr w:type="spellEnd"/>
+      <w:r>
+        <w:t xml:space="preserve"> hang: Users can update data here. This is also synced to the Seller registry from if use request to become a Seller</w:t>
+      </w:r>
+    </w:p>
+    <w:p>
+      <w:r>
+        <w:rPr>
+          <w:noProof/>
+        </w:rPr>
         <w:drawing>
           <wp:inline distT="0" distB="0" distL="0" distR="0" wp14:anchorId="4CB8BE21" wp14:editId="7CBF7B96">
             <wp:extent cx="5943600" cy="2908935"/>
@@ -262,6 +327,9 @@
         <w:pStyle w:val="ListParagraph"/>
       </w:pPr>
       <w:r>
+        <w:rPr>
+          <w:noProof/>
+        </w:rPr>
         <w:drawing>
           <wp:inline distT="0" distB="0" distL="0" distR="0" wp14:anchorId="54CCB5FC" wp14:editId="535D6361">
             <wp:extent cx="5943600" cy="2646045"/>
@@ -313,6 +381,9 @@
     </w:p>
     <w:p>
       <w:r>
+        <w:rPr>
+          <w:noProof/>
+        </w:rPr>
         <w:lastRenderedPageBreak/>
         <w:drawing>
           <wp:inline distT="0" distB="0" distL="0" distR="0" wp14:anchorId="309E4F4B" wp14:editId="45173F7B">
@@ -374,6 +445,9 @@
     </w:p>
     <w:p>
       <w:r>
+        <w:rPr>
+          <w:noProof/>
+        </w:rPr>
         <w:drawing>
           <wp:inline distT="0" distB="0" distL="0" distR="0" wp14:anchorId="28A55FF1" wp14:editId="1F817A24">
             <wp:extent cx="5943600" cy="3066415"/>
@@ -442,7 +516,66 @@
     </w:p>
     <w:p>
       <w:r>
+        <w:t>Users have to full fill the bank account first. Once users have the correct bank information then that will have able to register to become a seller…</w:t>
+      </w:r>
+      <w:r>
+        <w:br/>
+      </w:r>
+      <w:r>
         <w:lastRenderedPageBreak/>
+        <w:t>The scenario that users will be redirected to the bank account to ask the user fill bank information’s. After fully filled this, the app will redirect to the detail steps of seller register.</w:t>
+      </w:r>
+    </w:p>
+    <w:p>
+      <w:r>
+        <w:drawing>
+          <wp:inline distT="0" distB="0" distL="0" distR="0" wp14:anchorId="6631F90C" wp14:editId="732DD3FB">
+            <wp:extent cx="5943600" cy="1915795"/>
+            <wp:effectExtent l="0" t="0" r="0" b="8255"/>
+            <wp:docPr id="2093299016" name="Picture 1"/>
+            <wp:cNvGraphicFramePr>
+              <a:graphicFrameLocks xmlns:a="http://schemas.openxmlformats.org/drawingml/2006/main" noChangeAspect="1"/>
+            </wp:cNvGraphicFramePr>
+            <a:graphic xmlns:a="http://schemas.openxmlformats.org/drawingml/2006/main">
+              <a:graphicData uri="http://schemas.openxmlformats.org/drawingml/2006/picture">
+                <pic:pic xmlns:pic="http://schemas.openxmlformats.org/drawingml/2006/picture">
+                  <pic:nvPicPr>
+                    <pic:cNvPr id="2093299016" name=""/>
+                    <pic:cNvPicPr/>
+                  </pic:nvPicPr>
+                  <pic:blipFill>
+                    <a:blip r:embed="rId11"/>
+                    <a:stretch>
+                      <a:fillRect/>
+                    </a:stretch>
+                  </pic:blipFill>
+                  <pic:spPr>
+                    <a:xfrm>
+                      <a:off x="0" y="0"/>
+                      <a:ext cx="5943600" cy="1915795"/>
+                    </a:xfrm>
+                    <a:prstGeom prst="rect">
+                      <a:avLst/>
+                    </a:prstGeom>
+                  </pic:spPr>
+                </pic:pic>
+              </a:graphicData>
+            </a:graphic>
+          </wp:inline>
+        </w:drawing>
+      </w:r>
+    </w:p>
+    <w:p/>
+    <w:p>
+      <w:r>
+        <w:t>Details of registration form</w:t>
+      </w:r>
+    </w:p>
+    <w:p>
+      <w:r>
+        <w:rPr>
+          <w:noProof/>
+        </w:rPr>
         <w:drawing>
           <wp:inline distT="0" distB="0" distL="0" distR="0" wp14:anchorId="73DFCE24" wp14:editId="209ECB89">
             <wp:extent cx="5943600" cy="3066415"/>
@@ -489,6 +622,10 @@
     </w:p>
     <w:p>
       <w:r>
+        <w:rPr>
+          <w:noProof/>
+        </w:rPr>
+        <w:lastRenderedPageBreak/>
         <w:drawing>
           <wp:inline distT="0" distB="0" distL="0" distR="0" wp14:anchorId="47CF53DD" wp14:editId="51107850">
             <wp:extent cx="5943600" cy="3136265"/>
@@ -505,7 +642,7 @@
                     <pic:cNvPicPr/>
                   </pic:nvPicPr>
                   <pic:blipFill>
-                    <a:blip r:embed="rId11"/>
+                    <a:blip r:embed="rId12"/>
                     <a:stretch>
                       <a:fillRect/>
                     </a:stretch>
@@ -534,12 +671,14 @@
     </w:p>
     <w:p>
       <w:r>
-        <w:lastRenderedPageBreak/>
         <w:t>Next screen that asks users to fill the method of transportation</w:t>
       </w:r>
     </w:p>
     <w:p>
       <w:r>
+        <w:rPr>
+          <w:noProof/>
+        </w:rPr>
         <w:drawing>
           <wp:inline distT="0" distB="0" distL="0" distR="0" wp14:anchorId="7B786FDE" wp14:editId="1E4973DA">
             <wp:extent cx="5943600" cy="3070860"/>
@@ -556,7 +695,7 @@
                     <pic:cNvPicPr/>
                   </pic:nvPicPr>
                   <pic:blipFill>
-                    <a:blip r:embed="rId12"/>
+                    <a:blip r:embed="rId13"/>
                     <a:stretch>
                       <a:fillRect/>
                     </a:stretch>
@@ -597,6 +736,9 @@
     </w:p>
     <w:p>
       <w:r>
+        <w:rPr>
+          <w:noProof/>
+        </w:rPr>
         <w:drawing>
           <wp:inline distT="0" distB="0" distL="0" distR="0" wp14:anchorId="7C5932C3" wp14:editId="797E6C6F">
             <wp:extent cx="5943600" cy="2708275"/>
@@ -613,7 +755,7 @@
                     <pic:cNvPicPr/>
                   </pic:nvPicPr>
                   <pic:blipFill>
-                    <a:blip r:embed="rId13"/>
+                    <a:blip r:embed="rId14"/>
                     <a:stretch>
                       <a:fillRect/>
                     </a:stretch>
@@ -636,7 +778,6 @@
     </w:p>
     <w:p>
       <w:r>
-        <w:lastRenderedPageBreak/>
         <w:t xml:space="preserve">Personal </w:t>
       </w:r>
       <w:proofErr w:type="gramStart"/>
@@ -650,6 +791,9 @@
     </w:p>
     <w:p>
       <w:r>
+        <w:rPr>
+          <w:noProof/>
+        </w:rPr>
         <w:drawing>
           <wp:inline distT="0" distB="0" distL="0" distR="0" wp14:anchorId="5D8B7361" wp14:editId="407C4BD4">
             <wp:extent cx="5943600" cy="2977515"/>
@@ -666,7 +810,7 @@
                     <pic:cNvPicPr/>
                   </pic:nvPicPr>
                   <pic:blipFill>
-                    <a:blip r:embed="rId14"/>
+                    <a:blip r:embed="rId15"/>
                     <a:stretch>
                       <a:fillRect/>
                     </a:stretch>
@@ -690,13 +834,12 @@
     <w:p/>
     <w:p>
       <w:r>
+        <w:lastRenderedPageBreak/>
         <w:t xml:space="preserve">Users must </w:t>
       </w:r>
-      <w:proofErr w:type="gramStart"/>
-      <w:r>
-        <w:t>fill</w:t>
-      </w:r>
-      <w:proofErr w:type="gramEnd"/>
+      <w:r>
+        <w:t>fill in</w:t>
+      </w:r>
       <w:r>
         <w:t xml:space="preserve"> the important information for business owner and will be scanned by AI system to validate the information</w:t>
       </w:r>
@@ -707,6 +850,9 @@
         <w:br/>
       </w:r>
       <w:r>
+        <w:rPr>
+          <w:noProof/>
+        </w:rPr>
         <w:drawing>
           <wp:inline distT="0" distB="0" distL="0" distR="0" wp14:anchorId="7C774153" wp14:editId="5FD15C07">
             <wp:extent cx="5943600" cy="3114675"/>
@@ -723,7 +869,7 @@
                     <pic:cNvPicPr/>
                   </pic:nvPicPr>
                   <pic:blipFill>
-                    <a:blip r:embed="rId15"/>
+                    <a:blip r:embed="rId16"/>
                     <a:stretch>
                       <a:fillRect/>
                     </a:stretch>
@@ -747,20 +893,23 @@
     <w:p/>
     <w:p>
       <w:r>
+        <w:t xml:space="preserve">Users will be denied moving to next steps if checking failed the result and ask the user </w:t>
+      </w:r>
+      <w:proofErr w:type="gramStart"/>
+      <w:r>
+        <w:t>has to</w:t>
+      </w:r>
+      <w:proofErr w:type="gramEnd"/>
+      <w:r>
+        <w:t xml:space="preserve"> verify and update the correct information</w:t>
+      </w:r>
+    </w:p>
+    <w:p>
+      <w:r>
+        <w:rPr>
+          <w:noProof/>
+        </w:rPr>
         <w:lastRenderedPageBreak/>
-        <w:t xml:space="preserve">Users will be denied moving to next steps if checking failed the result and ask the user </w:t>
-      </w:r>
-      <w:proofErr w:type="gramStart"/>
-      <w:r>
-        <w:t>has to</w:t>
-      </w:r>
-      <w:proofErr w:type="gramEnd"/>
-      <w:r>
-        <w:t xml:space="preserve"> verify and update the correct information</w:t>
-      </w:r>
-    </w:p>
-    <w:p>
-      <w:r>
         <w:drawing>
           <wp:inline distT="0" distB="0" distL="0" distR="0" wp14:anchorId="2714DCDE" wp14:editId="72553935">
             <wp:extent cx="5943600" cy="4973320"/>
@@ -777,7 +926,7 @@
                     <pic:cNvPicPr/>
                   </pic:nvPicPr>
                   <pic:blipFill>
-                    <a:blip r:embed="rId16"/>
+                    <a:blip r:embed="rId17"/>
                     <a:stretch>
                       <a:fillRect/>
                     </a:stretch>
@@ -806,6 +955,9 @@
     </w:p>
     <w:p>
       <w:r>
+        <w:rPr>
+          <w:noProof/>
+        </w:rPr>
         <w:lastRenderedPageBreak/>
         <w:drawing>
           <wp:inline distT="0" distB="0" distL="0" distR="0" wp14:anchorId="324424B7" wp14:editId="2D1210C9">
@@ -823,7 +975,7 @@
                     <pic:cNvPicPr/>
                   </pic:nvPicPr>
                   <pic:blipFill>
-                    <a:blip r:embed="rId17"/>
+                    <a:blip r:embed="rId18"/>
                     <a:stretch>
                       <a:fillRect/>
                     </a:stretch>
@@ -864,6 +1016,9 @@
         <w:br/>
       </w:r>
       <w:r>
+        <w:rPr>
+          <w:noProof/>
+        </w:rPr>
         <w:drawing>
           <wp:inline distT="0" distB="0" distL="0" distR="0" wp14:anchorId="67C8281E" wp14:editId="565BDE32">
             <wp:extent cx="5943600" cy="2729865"/>
@@ -880,7 +1035,7 @@
                     <pic:cNvPicPr/>
                   </pic:nvPicPr>
                   <pic:blipFill>
-                    <a:blip r:embed="rId18"/>
+                    <a:blip r:embed="rId19"/>
                     <a:stretch>
                       <a:fillRect/>
                     </a:stretch>
@@ -904,6 +1059,9 @@
     <w:p/>
     <w:p>
       <w:r>
+        <w:rPr>
+          <w:noProof/>
+        </w:rPr>
         <w:lastRenderedPageBreak/>
         <w:drawing>
           <wp:inline distT="0" distB="0" distL="0" distR="0" wp14:anchorId="307BE867" wp14:editId="30984DF4">
@@ -921,7 +1079,7 @@
                     <pic:cNvPicPr/>
                   </pic:nvPicPr>
                   <pic:blipFill>
-                    <a:blip r:embed="rId19"/>
+                    <a:blip r:embed="rId20"/>
                     <a:stretch>
                       <a:fillRect/>
                     </a:stretch>
@@ -945,13 +1103,7 @@
     <w:p/>
     <w:p>
       <w:r>
-        <w:t xml:space="preserve">    1. After </w:t>
-      </w:r>
-      <w:r>
-        <w:t>sending</w:t>
-      </w:r>
-      <w:r>
-        <w:t xml:space="preserve"> the registration to become a seller and </w:t>
+        <w:t xml:space="preserve">    1. After sending the registration to become a seller and </w:t>
       </w:r>
       <w:r>
         <w:t>still</w:t>
@@ -986,7 +1138,239 @@
         <w:tab/>
       </w:r>
       <w:r>
-        <w:t>"Hồ sơ đang chờ phê duyệtYêu cầu đăng ký Người bán của bạn đã được tiếp nhận. Đội ngũ kiểm duyệt sẽ phản hồi trong vòng 24 giờ làm việc."</w:t>
+        <w:t>"</w:t>
+      </w:r>
+      <w:proofErr w:type="spellStart"/>
+      <w:r>
+        <w:t>Hồ</w:t>
+      </w:r>
+      <w:proofErr w:type="spellEnd"/>
+      <w:r>
+        <w:t xml:space="preserve"> </w:t>
+      </w:r>
+      <w:proofErr w:type="spellStart"/>
+      <w:r>
+        <w:t>sơ</w:t>
+      </w:r>
+      <w:proofErr w:type="spellEnd"/>
+      <w:r>
+        <w:t xml:space="preserve"> </w:t>
+      </w:r>
+      <w:proofErr w:type="spellStart"/>
+      <w:r>
+        <w:t>đang</w:t>
+      </w:r>
+      <w:proofErr w:type="spellEnd"/>
+      <w:r>
+        <w:t xml:space="preserve"> </w:t>
+      </w:r>
+      <w:proofErr w:type="spellStart"/>
+      <w:r>
+        <w:t>chờ</w:t>
+      </w:r>
+      <w:proofErr w:type="spellEnd"/>
+      <w:r>
+        <w:t xml:space="preserve"> </w:t>
+      </w:r>
+      <w:proofErr w:type="spellStart"/>
+      <w:r>
+        <w:t>phê</w:t>
+      </w:r>
+      <w:proofErr w:type="spellEnd"/>
+      <w:r>
+        <w:t xml:space="preserve"> </w:t>
+      </w:r>
+      <w:proofErr w:type="spellStart"/>
+      <w:r>
+        <w:t>duyệtYêu</w:t>
+      </w:r>
+      <w:proofErr w:type="spellEnd"/>
+      <w:r>
+        <w:t xml:space="preserve"> </w:t>
+      </w:r>
+      <w:proofErr w:type="spellStart"/>
+      <w:r>
+        <w:t>cầu</w:t>
+      </w:r>
+      <w:proofErr w:type="spellEnd"/>
+      <w:r>
+        <w:t xml:space="preserve"> </w:t>
+      </w:r>
+      <w:proofErr w:type="spellStart"/>
+      <w:r>
+        <w:t>đăng</w:t>
+      </w:r>
+      <w:proofErr w:type="spellEnd"/>
+      <w:r>
+        <w:t xml:space="preserve"> </w:t>
+      </w:r>
+      <w:proofErr w:type="spellStart"/>
+      <w:r>
+        <w:t>ký</w:t>
+      </w:r>
+      <w:proofErr w:type="spellEnd"/>
+      <w:r>
+        <w:t xml:space="preserve"> </w:t>
+      </w:r>
+      <w:proofErr w:type="spellStart"/>
+      <w:r>
+        <w:t>Người</w:t>
+      </w:r>
+      <w:proofErr w:type="spellEnd"/>
+      <w:r>
+        <w:t xml:space="preserve"> </w:t>
+      </w:r>
+      <w:proofErr w:type="spellStart"/>
+      <w:r>
+        <w:t>bán</w:t>
+      </w:r>
+      <w:proofErr w:type="spellEnd"/>
+      <w:r>
+        <w:t xml:space="preserve"> </w:t>
+      </w:r>
+      <w:proofErr w:type="spellStart"/>
+      <w:r>
+        <w:t>của</w:t>
+      </w:r>
+      <w:proofErr w:type="spellEnd"/>
+      <w:r>
+        <w:t xml:space="preserve"> </w:t>
+      </w:r>
+      <w:proofErr w:type="spellStart"/>
+      <w:r>
+        <w:t>bạn</w:t>
+      </w:r>
+      <w:proofErr w:type="spellEnd"/>
+      <w:r>
+        <w:t xml:space="preserve"> </w:t>
+      </w:r>
+      <w:proofErr w:type="spellStart"/>
+      <w:r>
+        <w:t>đã</w:t>
+      </w:r>
+      <w:proofErr w:type="spellEnd"/>
+      <w:r>
+        <w:t xml:space="preserve"> </w:t>
+      </w:r>
+      <w:proofErr w:type="spellStart"/>
+      <w:r>
+        <w:t>được</w:t>
+      </w:r>
+      <w:proofErr w:type="spellEnd"/>
+      <w:r>
+        <w:t xml:space="preserve"> </w:t>
+      </w:r>
+      <w:proofErr w:type="spellStart"/>
+      <w:r>
+        <w:t>tiếp</w:t>
+      </w:r>
+      <w:proofErr w:type="spellEnd"/>
+      <w:r>
+        <w:t xml:space="preserve"> </w:t>
+      </w:r>
+      <w:proofErr w:type="spellStart"/>
+      <w:r>
+        <w:t>nhận</w:t>
+      </w:r>
+      <w:proofErr w:type="spellEnd"/>
+      <w:r>
+        <w:t xml:space="preserve">. </w:t>
+      </w:r>
+      <w:proofErr w:type="spellStart"/>
+      <w:r>
+        <w:t>Đội</w:t>
+      </w:r>
+      <w:proofErr w:type="spellEnd"/>
+      <w:r>
+        <w:t xml:space="preserve"> </w:t>
+      </w:r>
+      <w:proofErr w:type="spellStart"/>
+      <w:r>
+        <w:t>ngũ</w:t>
+      </w:r>
+      <w:proofErr w:type="spellEnd"/>
+      <w:r>
+        <w:t xml:space="preserve"> </w:t>
+      </w:r>
+      <w:proofErr w:type="spellStart"/>
+      <w:r>
+        <w:t>kiểm</w:t>
+      </w:r>
+      <w:proofErr w:type="spellEnd"/>
+      <w:r>
+        <w:t xml:space="preserve"> </w:t>
+      </w:r>
+      <w:proofErr w:type="spellStart"/>
+      <w:r>
+        <w:t>duyệt</w:t>
+      </w:r>
+      <w:proofErr w:type="spellEnd"/>
+      <w:r>
+        <w:t xml:space="preserve"> </w:t>
+      </w:r>
+      <w:proofErr w:type="spellStart"/>
+      <w:r>
+        <w:t>sẽ</w:t>
+      </w:r>
+      <w:proofErr w:type="spellEnd"/>
+      <w:r>
+        <w:t xml:space="preserve"> </w:t>
+      </w:r>
+      <w:proofErr w:type="spellStart"/>
+      <w:r>
+        <w:t>phản</w:t>
+      </w:r>
+      <w:proofErr w:type="spellEnd"/>
+      <w:r>
+        <w:t xml:space="preserve"> </w:t>
+      </w:r>
+      <w:proofErr w:type="spellStart"/>
+      <w:r>
+        <w:t>hồi</w:t>
+      </w:r>
+      <w:proofErr w:type="spellEnd"/>
+      <w:r>
+        <w:t xml:space="preserve"> </w:t>
+      </w:r>
+      <w:proofErr w:type="spellStart"/>
+      <w:r>
+        <w:t>trong</w:t>
+      </w:r>
+      <w:proofErr w:type="spellEnd"/>
+      <w:r>
+        <w:t xml:space="preserve"> </w:t>
+      </w:r>
+      <w:proofErr w:type="spellStart"/>
+      <w:r>
+        <w:t>vòng</w:t>
+      </w:r>
+      <w:proofErr w:type="spellEnd"/>
+      <w:r>
+        <w:t xml:space="preserve"> 24 </w:t>
+      </w:r>
+      <w:proofErr w:type="spellStart"/>
+      <w:r>
+        <w:t>giờ</w:t>
+      </w:r>
+      <w:proofErr w:type="spellEnd"/>
+      <w:r>
+        <w:t xml:space="preserve"> </w:t>
+      </w:r>
+      <w:proofErr w:type="spellStart"/>
+      <w:r>
+        <w:t>làm</w:t>
+      </w:r>
+      <w:proofErr w:type="spellEnd"/>
+      <w:r>
+        <w:t xml:space="preserve"> </w:t>
+      </w:r>
+      <w:proofErr w:type="spellStart"/>
+      <w:r>
+        <w:t>việc</w:t>
+      </w:r>
+      <w:proofErr w:type="spellEnd"/>
+      <w:r>
+        <w:t>."</w:t>
       </w:r>
     </w:p>
     <w:p>
@@ -996,11 +1380,19 @@
       </w:r>
       <w:r>
         <w:tab/>
-        <w:t>An email to the requester to confirm admin received the request and will check and appove</w:t>
-      </w:r>
-    </w:p>
-    <w:p>
-      <w:r>
+        <w:t xml:space="preserve">An email to the requester to confirm admin received the request and will check and </w:t>
+      </w:r>
+      <w:proofErr w:type="spellStart"/>
+      <w:r>
+        <w:t>appove</w:t>
+      </w:r>
+      <w:proofErr w:type="spellEnd"/>
+    </w:p>
+    <w:p>
+      <w:r>
+        <w:rPr>
+          <w:noProof/>
+        </w:rPr>
         <w:lastRenderedPageBreak/>
         <w:drawing>
           <wp:inline distT="0" distB="0" distL="0" distR="0" wp14:anchorId="16048E08" wp14:editId="33309AF5">
@@ -1018,7 +1410,7 @@
                     <pic:cNvPicPr/>
                   </pic:nvPicPr>
                   <pic:blipFill>
-                    <a:blip r:embed="rId20"/>
+                    <a:blip r:embed="rId21"/>
                     <a:stretch>
                       <a:fillRect/>
                     </a:stretch>
@@ -1061,18 +1453,202 @@
         <w:t>progress</w:t>
       </w:r>
       <w:r>
-        <w:t xml:space="preserve"> of the status and a notification also appear "Đăng ký thành công!</w:t>
-      </w:r>
-    </w:p>
-    <w:p>
-      <w:r>
-        <w:t xml:space="preserve">                Hồ sơ của bạn đã được gửi. Chúng tôi đã gửi email xác nhận đến pending@ainetsoft.com.</w:t>
+        <w:t xml:space="preserve"> of the status and a notification also appear "</w:t>
+      </w:r>
+      <w:proofErr w:type="spellStart"/>
+      <w:r>
+        <w:t>Đăng</w:t>
+      </w:r>
+      <w:proofErr w:type="spellEnd"/>
+      <w:r>
+        <w:t xml:space="preserve"> </w:t>
+      </w:r>
+      <w:proofErr w:type="spellStart"/>
+      <w:r>
+        <w:t>ký</w:t>
+      </w:r>
+      <w:proofErr w:type="spellEnd"/>
+      <w:r>
+        <w:t xml:space="preserve"> </w:t>
+      </w:r>
+      <w:proofErr w:type="spellStart"/>
+      <w:r>
+        <w:t>thành</w:t>
+      </w:r>
+      <w:proofErr w:type="spellEnd"/>
+      <w:r>
+        <w:t xml:space="preserve"> </w:t>
+      </w:r>
+      <w:proofErr w:type="spellStart"/>
+      <w:r>
+        <w:t>công</w:t>
+      </w:r>
+      <w:proofErr w:type="spellEnd"/>
+      <w:r>
+        <w:t>!</w:t>
+      </w:r>
+    </w:p>
+    <w:p>
+      <w:r>
+        <w:t xml:space="preserve">                </w:t>
+      </w:r>
+      <w:proofErr w:type="spellStart"/>
+      <w:r>
+        <w:t>Hồ</w:t>
+      </w:r>
+      <w:proofErr w:type="spellEnd"/>
+      <w:r>
+        <w:t xml:space="preserve"> </w:t>
+      </w:r>
+      <w:proofErr w:type="spellStart"/>
+      <w:r>
+        <w:t>sơ</w:t>
+      </w:r>
+      <w:proofErr w:type="spellEnd"/>
+      <w:r>
+        <w:t xml:space="preserve"> </w:t>
+      </w:r>
+      <w:proofErr w:type="spellStart"/>
+      <w:r>
+        <w:t>của</w:t>
+      </w:r>
+      <w:proofErr w:type="spellEnd"/>
+      <w:r>
+        <w:t xml:space="preserve"> </w:t>
+      </w:r>
+      <w:proofErr w:type="spellStart"/>
+      <w:r>
+        <w:t>bạn</w:t>
+      </w:r>
+      <w:proofErr w:type="spellEnd"/>
+      <w:r>
+        <w:t xml:space="preserve"> </w:t>
+      </w:r>
+      <w:proofErr w:type="spellStart"/>
+      <w:r>
+        <w:t>đã</w:t>
+      </w:r>
+      <w:proofErr w:type="spellEnd"/>
+      <w:r>
+        <w:t xml:space="preserve"> </w:t>
+      </w:r>
+      <w:proofErr w:type="spellStart"/>
+      <w:r>
+        <w:t>được</w:t>
+      </w:r>
+      <w:proofErr w:type="spellEnd"/>
+      <w:r>
+        <w:t xml:space="preserve"> </w:t>
+      </w:r>
+      <w:proofErr w:type="spellStart"/>
+      <w:r>
+        <w:t>gửi</w:t>
+      </w:r>
+      <w:proofErr w:type="spellEnd"/>
+      <w:r>
+        <w:t xml:space="preserve">. </w:t>
+      </w:r>
+      <w:proofErr w:type="spellStart"/>
+      <w:r>
+        <w:t>Chúng</w:t>
+      </w:r>
+      <w:proofErr w:type="spellEnd"/>
+      <w:r>
+        <w:t xml:space="preserve"> </w:t>
+      </w:r>
+      <w:proofErr w:type="spellStart"/>
+      <w:r>
+        <w:t>tôi</w:t>
+      </w:r>
+      <w:proofErr w:type="spellEnd"/>
+      <w:r>
+        <w:t xml:space="preserve"> </w:t>
+      </w:r>
+      <w:proofErr w:type="spellStart"/>
+      <w:r>
+        <w:t>đã</w:t>
+      </w:r>
+      <w:proofErr w:type="spellEnd"/>
+      <w:r>
+        <w:t xml:space="preserve"> </w:t>
+      </w:r>
+      <w:proofErr w:type="spellStart"/>
+      <w:r>
+        <w:t>gửi</w:t>
+      </w:r>
+      <w:proofErr w:type="spellEnd"/>
+      <w:r>
+        <w:t xml:space="preserve"> email </w:t>
+      </w:r>
+      <w:proofErr w:type="spellStart"/>
+      <w:r>
+        <w:t>xác</w:t>
+      </w:r>
+      <w:proofErr w:type="spellEnd"/>
+      <w:r>
+        <w:t xml:space="preserve"> </w:t>
+      </w:r>
+      <w:proofErr w:type="spellStart"/>
+      <w:r>
+        <w:t>nhận</w:t>
+      </w:r>
+      <w:proofErr w:type="spellEnd"/>
+      <w:r>
+        <w:t xml:space="preserve"> </w:t>
+      </w:r>
+      <w:proofErr w:type="spellStart"/>
+      <w:r>
+        <w:t>đến</w:t>
+      </w:r>
+      <w:proofErr w:type="spellEnd"/>
+      <w:r>
+        <w:t xml:space="preserve"> pending@ainetsoft.com.</w:t>
       </w:r>
     </w:p>
     <w:p/>
     <w:p>
       <w:r>
-        <w:t xml:space="preserve">                Phản hồi chậm nhất trong vòng 24h"</w:t>
+        <w:t xml:space="preserve">                Phản </w:t>
+      </w:r>
+      <w:proofErr w:type="spellStart"/>
+      <w:r>
+        <w:t>hồi</w:t>
+      </w:r>
+      <w:proofErr w:type="spellEnd"/>
+      <w:r>
+        <w:t xml:space="preserve"> </w:t>
+      </w:r>
+      <w:proofErr w:type="spellStart"/>
+      <w:r>
+        <w:t>chậm</w:t>
+      </w:r>
+      <w:proofErr w:type="spellEnd"/>
+      <w:r>
+        <w:t xml:space="preserve"> </w:t>
+      </w:r>
+      <w:proofErr w:type="spellStart"/>
+      <w:r>
+        <w:t>nhất</w:t>
+      </w:r>
+      <w:proofErr w:type="spellEnd"/>
+      <w:r>
+        <w:t xml:space="preserve"> </w:t>
+      </w:r>
+      <w:proofErr w:type="spellStart"/>
+      <w:r>
+        <w:t>trong</w:t>
+      </w:r>
+      <w:proofErr w:type="spellEnd"/>
+      <w:r>
+        <w:t xml:space="preserve"> </w:t>
+      </w:r>
+      <w:proofErr w:type="spellStart"/>
+      <w:r>
+        <w:t>vòng</w:t>
+      </w:r>
+      <w:proofErr w:type="spellEnd"/>
+      <w:r>
+        <w:t xml:space="preserve"> 24h"</w:t>
       </w:r>
     </w:p>
     <w:p>
@@ -1106,8 +1682,72 @@
         <w:rPr>
           <w:color w:val="EE0000"/>
         </w:rPr>
-        <w:t xml:space="preserve"> "Hồ sơ bị từ chối</w:t>
-      </w:r>
+        <w:t xml:space="preserve"> "</w:t>
+      </w:r>
+      <w:proofErr w:type="spellStart"/>
+      <w:r>
+        <w:rPr>
+          <w:color w:val="EE0000"/>
+        </w:rPr>
+        <w:t>Hồ</w:t>
+      </w:r>
+      <w:proofErr w:type="spellEnd"/>
+      <w:r>
+        <w:rPr>
+          <w:color w:val="EE0000"/>
+        </w:rPr>
+        <w:t xml:space="preserve"> </w:t>
+      </w:r>
+      <w:proofErr w:type="spellStart"/>
+      <w:r>
+        <w:rPr>
+          <w:color w:val="EE0000"/>
+        </w:rPr>
+        <w:t>sơ</w:t>
+      </w:r>
+      <w:proofErr w:type="spellEnd"/>
+      <w:r>
+        <w:rPr>
+          <w:color w:val="EE0000"/>
+        </w:rPr>
+        <w:t xml:space="preserve"> </w:t>
+      </w:r>
+      <w:proofErr w:type="spellStart"/>
+      <w:r>
+        <w:rPr>
+          <w:color w:val="EE0000"/>
+        </w:rPr>
+        <w:t>bị</w:t>
+      </w:r>
+      <w:proofErr w:type="spellEnd"/>
+      <w:r>
+        <w:rPr>
+          <w:color w:val="EE0000"/>
+        </w:rPr>
+        <w:t xml:space="preserve"> </w:t>
+      </w:r>
+      <w:proofErr w:type="spellStart"/>
+      <w:r>
+        <w:rPr>
+          <w:color w:val="EE0000"/>
+        </w:rPr>
+        <w:t>từ</w:t>
+      </w:r>
+      <w:proofErr w:type="spellEnd"/>
+      <w:r>
+        <w:rPr>
+          <w:color w:val="EE0000"/>
+        </w:rPr>
+        <w:t xml:space="preserve"> </w:t>
+      </w:r>
+      <w:proofErr w:type="spellStart"/>
+      <w:r>
+        <w:rPr>
+          <w:color w:val="EE0000"/>
+        </w:rPr>
+        <w:t>chối</w:t>
+      </w:r>
+      <w:proofErr w:type="spellEnd"/>
     </w:p>
     <w:p>
       <w:pPr>
@@ -1133,20 +1773,454 @@
         <w:rPr>
           <w:color w:val="EE0000"/>
         </w:rPr>
-        <w:t>: Chụp lại ảnh CCCD.</w:t>
-      </w:r>
-    </w:p>
-    <w:p>
-      <w:pPr>
-        <w:rPr>
-          <w:color w:val="EE0000"/>
-        </w:rPr>
-      </w:pPr>
-      <w:r>
-        <w:rPr>
-          <w:color w:val="EE0000"/>
-        </w:rPr>
-        <w:t xml:space="preserve">                Hệ thống không thể xác thực một số thông tin của bạn. Vui lòng kiểm tra lại lý do trên và cập nhật hồ sơ chính xác trước khi gửi lại."</w:t>
+        <w:t xml:space="preserve">: </w:t>
+      </w:r>
+      <w:proofErr w:type="spellStart"/>
+      <w:r>
+        <w:rPr>
+          <w:color w:val="EE0000"/>
+        </w:rPr>
+        <w:t>Chụp</w:t>
+      </w:r>
+      <w:proofErr w:type="spellEnd"/>
+      <w:r>
+        <w:rPr>
+          <w:color w:val="EE0000"/>
+        </w:rPr>
+        <w:t xml:space="preserve"> </w:t>
+      </w:r>
+      <w:proofErr w:type="spellStart"/>
+      <w:r>
+        <w:rPr>
+          <w:color w:val="EE0000"/>
+        </w:rPr>
+        <w:t>lại</w:t>
+      </w:r>
+      <w:proofErr w:type="spellEnd"/>
+      <w:r>
+        <w:rPr>
+          <w:color w:val="EE0000"/>
+        </w:rPr>
+        <w:t xml:space="preserve"> </w:t>
+      </w:r>
+      <w:proofErr w:type="spellStart"/>
+      <w:r>
+        <w:rPr>
+          <w:color w:val="EE0000"/>
+        </w:rPr>
+        <w:t>ảnh</w:t>
+      </w:r>
+      <w:proofErr w:type="spellEnd"/>
+      <w:r>
+        <w:rPr>
+          <w:color w:val="EE0000"/>
+        </w:rPr>
+        <w:t xml:space="preserve"> CCCD.</w:t>
+      </w:r>
+    </w:p>
+    <w:p>
+      <w:pPr>
+        <w:rPr>
+          <w:color w:val="EE0000"/>
+        </w:rPr>
+      </w:pPr>
+      <w:r>
+        <w:rPr>
+          <w:color w:val="EE0000"/>
+        </w:rPr>
+        <w:t xml:space="preserve">                </w:t>
+      </w:r>
+      <w:proofErr w:type="spellStart"/>
+      <w:r>
+        <w:rPr>
+          <w:color w:val="EE0000"/>
+        </w:rPr>
+        <w:t>Hệ</w:t>
+      </w:r>
+      <w:proofErr w:type="spellEnd"/>
+      <w:r>
+        <w:rPr>
+          <w:color w:val="EE0000"/>
+        </w:rPr>
+        <w:t xml:space="preserve"> </w:t>
+      </w:r>
+      <w:proofErr w:type="spellStart"/>
+      <w:r>
+        <w:rPr>
+          <w:color w:val="EE0000"/>
+        </w:rPr>
+        <w:t>thống</w:t>
+      </w:r>
+      <w:proofErr w:type="spellEnd"/>
+      <w:r>
+        <w:rPr>
+          <w:color w:val="EE0000"/>
+        </w:rPr>
+        <w:t xml:space="preserve"> </w:t>
+      </w:r>
+      <w:proofErr w:type="spellStart"/>
+      <w:r>
+        <w:rPr>
+          <w:color w:val="EE0000"/>
+        </w:rPr>
+        <w:t>không</w:t>
+      </w:r>
+      <w:proofErr w:type="spellEnd"/>
+      <w:r>
+        <w:rPr>
+          <w:color w:val="EE0000"/>
+        </w:rPr>
+        <w:t xml:space="preserve"> </w:t>
+      </w:r>
+      <w:proofErr w:type="spellStart"/>
+      <w:r>
+        <w:rPr>
+          <w:color w:val="EE0000"/>
+        </w:rPr>
+        <w:t>thể</w:t>
+      </w:r>
+      <w:proofErr w:type="spellEnd"/>
+      <w:r>
+        <w:rPr>
+          <w:color w:val="EE0000"/>
+        </w:rPr>
+        <w:t xml:space="preserve"> </w:t>
+      </w:r>
+      <w:proofErr w:type="spellStart"/>
+      <w:r>
+        <w:rPr>
+          <w:color w:val="EE0000"/>
+        </w:rPr>
+        <w:t>xác</w:t>
+      </w:r>
+      <w:proofErr w:type="spellEnd"/>
+      <w:r>
+        <w:rPr>
+          <w:color w:val="EE0000"/>
+        </w:rPr>
+        <w:t xml:space="preserve"> </w:t>
+      </w:r>
+      <w:proofErr w:type="spellStart"/>
+      <w:r>
+        <w:rPr>
+          <w:color w:val="EE0000"/>
+        </w:rPr>
+        <w:t>thực</w:t>
+      </w:r>
+      <w:proofErr w:type="spellEnd"/>
+      <w:r>
+        <w:rPr>
+          <w:color w:val="EE0000"/>
+        </w:rPr>
+        <w:t xml:space="preserve"> </w:t>
+      </w:r>
+      <w:proofErr w:type="spellStart"/>
+      <w:r>
+        <w:rPr>
+          <w:color w:val="EE0000"/>
+        </w:rPr>
+        <w:t>một</w:t>
+      </w:r>
+      <w:proofErr w:type="spellEnd"/>
+      <w:r>
+        <w:rPr>
+          <w:color w:val="EE0000"/>
+        </w:rPr>
+        <w:t xml:space="preserve"> </w:t>
+      </w:r>
+      <w:proofErr w:type="spellStart"/>
+      <w:r>
+        <w:rPr>
+          <w:color w:val="EE0000"/>
+        </w:rPr>
+        <w:t>số</w:t>
+      </w:r>
+      <w:proofErr w:type="spellEnd"/>
+      <w:r>
+        <w:rPr>
+          <w:color w:val="EE0000"/>
+        </w:rPr>
+        <w:t xml:space="preserve"> </w:t>
+      </w:r>
+      <w:proofErr w:type="spellStart"/>
+      <w:r>
+        <w:rPr>
+          <w:color w:val="EE0000"/>
+        </w:rPr>
+        <w:t>thông</w:t>
+      </w:r>
+      <w:proofErr w:type="spellEnd"/>
+      <w:r>
+        <w:rPr>
+          <w:color w:val="EE0000"/>
+        </w:rPr>
+        <w:t xml:space="preserve"> tin </w:t>
+      </w:r>
+      <w:proofErr w:type="spellStart"/>
+      <w:r>
+        <w:rPr>
+          <w:color w:val="EE0000"/>
+        </w:rPr>
+        <w:t>của</w:t>
+      </w:r>
+      <w:proofErr w:type="spellEnd"/>
+      <w:r>
+        <w:rPr>
+          <w:color w:val="EE0000"/>
+        </w:rPr>
+        <w:t xml:space="preserve"> </w:t>
+      </w:r>
+      <w:proofErr w:type="spellStart"/>
+      <w:r>
+        <w:rPr>
+          <w:color w:val="EE0000"/>
+        </w:rPr>
+        <w:t>bạn</w:t>
+      </w:r>
+      <w:proofErr w:type="spellEnd"/>
+      <w:r>
+        <w:rPr>
+          <w:color w:val="EE0000"/>
+        </w:rPr>
+        <w:t xml:space="preserve">. Vui </w:t>
+      </w:r>
+      <w:proofErr w:type="spellStart"/>
+      <w:r>
+        <w:rPr>
+          <w:color w:val="EE0000"/>
+        </w:rPr>
+        <w:t>lòng</w:t>
+      </w:r>
+      <w:proofErr w:type="spellEnd"/>
+      <w:r>
+        <w:rPr>
+          <w:color w:val="EE0000"/>
+        </w:rPr>
+        <w:t xml:space="preserve"> </w:t>
+      </w:r>
+      <w:proofErr w:type="spellStart"/>
+      <w:r>
+        <w:rPr>
+          <w:color w:val="EE0000"/>
+        </w:rPr>
+        <w:t>kiểm</w:t>
+      </w:r>
+      <w:proofErr w:type="spellEnd"/>
+      <w:r>
+        <w:rPr>
+          <w:color w:val="EE0000"/>
+        </w:rPr>
+        <w:t xml:space="preserve"> </w:t>
+      </w:r>
+      <w:proofErr w:type="spellStart"/>
+      <w:r>
+        <w:rPr>
+          <w:color w:val="EE0000"/>
+        </w:rPr>
+        <w:t>tra</w:t>
+      </w:r>
+      <w:proofErr w:type="spellEnd"/>
+      <w:r>
+        <w:rPr>
+          <w:color w:val="EE0000"/>
+        </w:rPr>
+        <w:t xml:space="preserve"> </w:t>
+      </w:r>
+      <w:proofErr w:type="spellStart"/>
+      <w:r>
+        <w:rPr>
+          <w:color w:val="EE0000"/>
+        </w:rPr>
+        <w:t>lại</w:t>
+      </w:r>
+      <w:proofErr w:type="spellEnd"/>
+      <w:r>
+        <w:rPr>
+          <w:color w:val="EE0000"/>
+        </w:rPr>
+        <w:t xml:space="preserve"> </w:t>
+      </w:r>
+      <w:proofErr w:type="spellStart"/>
+      <w:r>
+        <w:rPr>
+          <w:color w:val="EE0000"/>
+        </w:rPr>
+        <w:t>lý</w:t>
+      </w:r>
+      <w:proofErr w:type="spellEnd"/>
+      <w:r>
+        <w:rPr>
+          <w:color w:val="EE0000"/>
+        </w:rPr>
+        <w:t xml:space="preserve"> do </w:t>
+      </w:r>
+      <w:proofErr w:type="spellStart"/>
+      <w:r>
+        <w:rPr>
+          <w:color w:val="EE0000"/>
+        </w:rPr>
+        <w:t>trên</w:t>
+      </w:r>
+      <w:proofErr w:type="spellEnd"/>
+      <w:r>
+        <w:rPr>
+          <w:color w:val="EE0000"/>
+        </w:rPr>
+        <w:t xml:space="preserve"> </w:t>
+      </w:r>
+      <w:proofErr w:type="spellStart"/>
+      <w:r>
+        <w:rPr>
+          <w:color w:val="EE0000"/>
+        </w:rPr>
+        <w:t>và</w:t>
+      </w:r>
+      <w:proofErr w:type="spellEnd"/>
+      <w:r>
+        <w:rPr>
+          <w:color w:val="EE0000"/>
+        </w:rPr>
+        <w:t xml:space="preserve"> </w:t>
+      </w:r>
+      <w:proofErr w:type="spellStart"/>
+      <w:r>
+        <w:rPr>
+          <w:color w:val="EE0000"/>
+        </w:rPr>
+        <w:t>cập</w:t>
+      </w:r>
+      <w:proofErr w:type="spellEnd"/>
+      <w:r>
+        <w:rPr>
+          <w:color w:val="EE0000"/>
+        </w:rPr>
+        <w:t xml:space="preserve"> </w:t>
+      </w:r>
+      <w:proofErr w:type="spellStart"/>
+      <w:r>
+        <w:rPr>
+          <w:color w:val="EE0000"/>
+        </w:rPr>
+        <w:t>nhật</w:t>
+      </w:r>
+      <w:proofErr w:type="spellEnd"/>
+      <w:r>
+        <w:rPr>
+          <w:color w:val="EE0000"/>
+        </w:rPr>
+        <w:t xml:space="preserve"> </w:t>
+      </w:r>
+      <w:proofErr w:type="spellStart"/>
+      <w:r>
+        <w:rPr>
+          <w:color w:val="EE0000"/>
+        </w:rPr>
+        <w:t>hồ</w:t>
+      </w:r>
+      <w:proofErr w:type="spellEnd"/>
+      <w:r>
+        <w:rPr>
+          <w:color w:val="EE0000"/>
+        </w:rPr>
+        <w:t xml:space="preserve"> </w:t>
+      </w:r>
+      <w:proofErr w:type="spellStart"/>
+      <w:r>
+        <w:rPr>
+          <w:color w:val="EE0000"/>
+        </w:rPr>
+        <w:t>sơ</w:t>
+      </w:r>
+      <w:proofErr w:type="spellEnd"/>
+      <w:r>
+        <w:rPr>
+          <w:color w:val="EE0000"/>
+        </w:rPr>
+        <w:t xml:space="preserve"> </w:t>
+      </w:r>
+      <w:proofErr w:type="spellStart"/>
+      <w:r>
+        <w:rPr>
+          <w:color w:val="EE0000"/>
+        </w:rPr>
+        <w:t>chính</w:t>
+      </w:r>
+      <w:proofErr w:type="spellEnd"/>
+      <w:r>
+        <w:rPr>
+          <w:color w:val="EE0000"/>
+        </w:rPr>
+        <w:t xml:space="preserve"> </w:t>
+      </w:r>
+      <w:proofErr w:type="spellStart"/>
+      <w:r>
+        <w:rPr>
+          <w:color w:val="EE0000"/>
+        </w:rPr>
+        <w:t>xác</w:t>
+      </w:r>
+      <w:proofErr w:type="spellEnd"/>
+      <w:r>
+        <w:rPr>
+          <w:color w:val="EE0000"/>
+        </w:rPr>
+        <w:t xml:space="preserve"> </w:t>
+      </w:r>
+      <w:proofErr w:type="spellStart"/>
+      <w:r>
+        <w:rPr>
+          <w:color w:val="EE0000"/>
+        </w:rPr>
+        <w:t>trước</w:t>
+      </w:r>
+      <w:proofErr w:type="spellEnd"/>
+      <w:r>
+        <w:rPr>
+          <w:color w:val="EE0000"/>
+        </w:rPr>
+        <w:t xml:space="preserve"> </w:t>
+      </w:r>
+      <w:proofErr w:type="spellStart"/>
+      <w:r>
+        <w:rPr>
+          <w:color w:val="EE0000"/>
+        </w:rPr>
+        <w:t>khi</w:t>
+      </w:r>
+      <w:proofErr w:type="spellEnd"/>
+      <w:r>
+        <w:rPr>
+          <w:color w:val="EE0000"/>
+        </w:rPr>
+        <w:t xml:space="preserve"> </w:t>
+      </w:r>
+      <w:proofErr w:type="spellStart"/>
+      <w:r>
+        <w:rPr>
+          <w:color w:val="EE0000"/>
+        </w:rPr>
+        <w:t>gửi</w:t>
+      </w:r>
+      <w:proofErr w:type="spellEnd"/>
+      <w:r>
+        <w:rPr>
+          <w:color w:val="EE0000"/>
+        </w:rPr>
+        <w:t xml:space="preserve"> </w:t>
+      </w:r>
+      <w:proofErr w:type="spellStart"/>
+      <w:r>
+        <w:rPr>
+          <w:color w:val="EE0000"/>
+        </w:rPr>
+        <w:t>lại</w:t>
+      </w:r>
+      <w:proofErr w:type="spellEnd"/>
+      <w:r>
+        <w:rPr>
+          <w:color w:val="EE0000"/>
+        </w:rPr>
+        <w:t>."</w:t>
       </w:r>
     </w:p>
     <w:p/>
@@ -1164,6 +2238,9 @@
     <w:p/>
     <w:p>
       <w:r>
+        <w:rPr>
+          <w:noProof/>
+        </w:rPr>
         <w:lastRenderedPageBreak/>
         <w:drawing>
           <wp:inline distT="0" distB="0" distL="0" distR="0" wp14:anchorId="66776B84" wp14:editId="3EC3BCF6">
@@ -1181,7 +2258,7 @@
                     <pic:cNvPicPr/>
                   </pic:nvPicPr>
                   <pic:blipFill>
-                    <a:blip r:embed="rId21"/>
+                    <a:blip r:embed="rId22"/>
                     <a:stretch>
                       <a:fillRect/>
                     </a:stretch>
@@ -1222,6 +2299,9 @@
     <w:p/>
     <w:p>
       <w:r>
+        <w:rPr>
+          <w:noProof/>
+        </w:rPr>
         <w:drawing>
           <wp:inline distT="0" distB="0" distL="0" distR="0" wp14:anchorId="5E655DE5" wp14:editId="3FBB1AEB">
             <wp:extent cx="5943600" cy="2404745"/>
@@ -1238,7 +2318,7 @@
                     <pic:cNvPicPr/>
                   </pic:nvPicPr>
                   <pic:blipFill>
-                    <a:blip r:embed="rId22"/>
+                    <a:blip r:embed="rId23"/>
                     <a:stretch>
                       <a:fillRect/>
                     </a:stretch>
@@ -1280,6 +2360,9 @@
         <w:br/>
       </w:r>
       <w:r>
+        <w:rPr>
+          <w:noProof/>
+        </w:rPr>
         <w:drawing>
           <wp:inline distT="0" distB="0" distL="0" distR="0" wp14:anchorId="5F624992" wp14:editId="1E18BC91">
             <wp:extent cx="5943600" cy="2179320"/>
@@ -1296,7 +2379,7 @@
                     <pic:cNvPicPr/>
                   </pic:nvPicPr>
                   <pic:blipFill>
-                    <a:blip r:embed="rId23"/>
+                    <a:blip r:embed="rId24"/>
                     <a:stretch>
                       <a:fillRect/>
                     </a:stretch>
@@ -1332,6 +2415,9 @@
     </w:p>
     <w:p>
       <w:r>
+        <w:rPr>
+          <w:noProof/>
+        </w:rPr>
         <w:drawing>
           <wp:inline distT="0" distB="0" distL="0" distR="0" wp14:anchorId="17EC6F2A" wp14:editId="542AFAFA">
             <wp:extent cx="5943600" cy="1853565"/>
@@ -1348,7 +2434,7 @@
                     <pic:cNvPicPr/>
                   </pic:nvPicPr>
                   <pic:blipFill>
-                    <a:blip r:embed="rId24"/>
+                    <a:blip r:embed="rId25"/>
                     <a:stretch>
                       <a:fillRect/>
                     </a:stretch>
@@ -1373,7 +2459,56 @@
       <w:r>
         <w:t>3. Seller Admin Dashboard</w:t>
       </w:r>
-    </w:p>
+      <w:r>
+        <w:t>:</w:t>
+      </w:r>
+    </w:p>
+    <w:p>
+      <w:r>
+        <w:t>- Seller admin has its own notification page as below:</w:t>
+      </w:r>
+    </w:p>
+    <w:p>
+      <w:r>
+        <w:drawing>
+          <wp:inline distT="0" distB="0" distL="0" distR="0" wp14:anchorId="097D2016" wp14:editId="6862D062">
+            <wp:extent cx="5943600" cy="2296160"/>
+            <wp:effectExtent l="0" t="0" r="0" b="8890"/>
+            <wp:docPr id="666415958" name="Picture 1"/>
+            <wp:cNvGraphicFramePr>
+              <a:graphicFrameLocks xmlns:a="http://schemas.openxmlformats.org/drawingml/2006/main" noChangeAspect="1"/>
+            </wp:cNvGraphicFramePr>
+            <a:graphic xmlns:a="http://schemas.openxmlformats.org/drawingml/2006/main">
+              <a:graphicData uri="http://schemas.openxmlformats.org/drawingml/2006/picture">
+                <pic:pic xmlns:pic="http://schemas.openxmlformats.org/drawingml/2006/picture">
+                  <pic:nvPicPr>
+                    <pic:cNvPr id="666415958" name=""/>
+                    <pic:cNvPicPr/>
+                  </pic:nvPicPr>
+                  <pic:blipFill>
+                    <a:blip r:embed="rId26"/>
+                    <a:stretch>
+                      <a:fillRect/>
+                    </a:stretch>
+                  </pic:blipFill>
+                  <pic:spPr>
+                    <a:xfrm>
+                      <a:off x="0" y="0"/>
+                      <a:ext cx="5943600" cy="2296160"/>
+                    </a:xfrm>
+                    <a:prstGeom prst="rect">
+                      <a:avLst/>
+                    </a:prstGeom>
+                  </pic:spPr>
+                </pic:pic>
+              </a:graphicData>
+            </a:graphic>
+          </wp:inline>
+        </w:drawing>
+      </w:r>
+    </w:p>
+    <w:p/>
+    <w:p/>
     <w:p>
       <w:r>
         <w:t xml:space="preserve">- After users became aware </w:t>
@@ -1387,6 +2522,9 @@
     </w:p>
     <w:p>
       <w:r>
+        <w:rPr>
+          <w:noProof/>
+        </w:rPr>
         <w:drawing>
           <wp:inline distT="0" distB="0" distL="0" distR="0" wp14:anchorId="66F9451A" wp14:editId="6B235494">
             <wp:extent cx="5943600" cy="2701290"/>
@@ -1403,7 +2541,7 @@
                     <pic:cNvPicPr/>
                   </pic:nvPicPr>
                   <pic:blipFill>
-                    <a:blip r:embed="rId25"/>
+                    <a:blip r:embed="rId27"/>
                     <a:stretch>
                       <a:fillRect/>
                     </a:stretch>
@@ -1427,11 +2565,38 @@
     <w:p/>
     <w:p>
       <w:r>
-        <w:t>Danh sách sản phẩm:</w:t>
-      </w:r>
-    </w:p>
-    <w:p>
-      <w:r>
+        <w:t xml:space="preserve">Danh </w:t>
+      </w:r>
+      <w:proofErr w:type="spellStart"/>
+      <w:r>
+        <w:t>sách</w:t>
+      </w:r>
+      <w:proofErr w:type="spellEnd"/>
+      <w:r>
+        <w:t xml:space="preserve"> </w:t>
+      </w:r>
+      <w:proofErr w:type="spellStart"/>
+      <w:r>
+        <w:t>sản</w:t>
+      </w:r>
+      <w:proofErr w:type="spellEnd"/>
+      <w:r>
+        <w:t xml:space="preserve"> </w:t>
+      </w:r>
+      <w:proofErr w:type="spellStart"/>
+      <w:r>
+        <w:t>phẩm</w:t>
+      </w:r>
+      <w:proofErr w:type="spellEnd"/>
+      <w:r>
+        <w:t>:</w:t>
+      </w:r>
+    </w:p>
+    <w:p>
+      <w:r>
+        <w:rPr>
+          <w:noProof/>
+        </w:rPr>
         <w:drawing>
           <wp:inline distT="0" distB="0" distL="0" distR="0" wp14:anchorId="75654145" wp14:editId="61D599A2">
             <wp:extent cx="5943600" cy="2834005"/>
@@ -1448,7 +2613,7 @@
                     <pic:cNvPicPr/>
                   </pic:nvPicPr>
                   <pic:blipFill>
-                    <a:blip r:embed="rId26"/>
+                    <a:blip r:embed="rId28"/>
                     <a:stretch>
                       <a:fillRect/>
                     </a:stretch>
@@ -1472,12 +2637,32 @@
     <w:p/>
     <w:p>
       <w:r>
-        <w:t>Quản lý đơn hang</w:t>
+        <w:t xml:space="preserve">Quản </w:t>
+      </w:r>
+      <w:proofErr w:type="spellStart"/>
+      <w:r>
+        <w:t>lý</w:t>
+      </w:r>
+      <w:proofErr w:type="spellEnd"/>
+      <w:r>
+        <w:t xml:space="preserve"> </w:t>
+      </w:r>
+      <w:proofErr w:type="spellStart"/>
+      <w:r>
+        <w:t>đơn</w:t>
+      </w:r>
+      <w:proofErr w:type="spellEnd"/>
+      <w:r>
+        <w:t xml:space="preserve"> hang</w:t>
       </w:r>
     </w:p>
     <w:p/>
     <w:p>
       <w:r>
+        <w:rPr>
+          <w:noProof/>
+        </w:rPr>
+        <w:lastRenderedPageBreak/>
         <w:drawing>
           <wp:inline distT="0" distB="0" distL="0" distR="0" wp14:anchorId="0A545CFE" wp14:editId="07E08734">
             <wp:extent cx="5943600" cy="3142615"/>
@@ -1494,7 +2679,7 @@
                     <pic:cNvPicPr/>
                   </pic:nvPicPr>
                   <pic:blipFill>
-                    <a:blip r:embed="rId27"/>
+                    <a:blip r:embed="rId29"/>
                     <a:stretch>
                       <a:fillRect/>
                     </a:stretch>
@@ -1517,13 +2702,28 @@
     </w:p>
     <w:p/>
     <w:p>
-      <w:r>
-        <w:lastRenderedPageBreak/>
-        <w:t>Thiết lập shop:</w:t>
-      </w:r>
-    </w:p>
-    <w:p>
-      <w:r>
+      <w:proofErr w:type="spellStart"/>
+      <w:r>
+        <w:t>Thiết</w:t>
+      </w:r>
+      <w:proofErr w:type="spellEnd"/>
+      <w:r>
+        <w:t xml:space="preserve"> </w:t>
+      </w:r>
+      <w:proofErr w:type="spellStart"/>
+      <w:r>
+        <w:t>lập</w:t>
+      </w:r>
+      <w:proofErr w:type="spellEnd"/>
+      <w:r>
+        <w:t xml:space="preserve"> shop:</w:t>
+      </w:r>
+    </w:p>
+    <w:p>
+      <w:r>
+        <w:rPr>
+          <w:noProof/>
+        </w:rPr>
         <w:drawing>
           <wp:inline distT="0" distB="0" distL="0" distR="0" wp14:anchorId="71E5661F" wp14:editId="2881753B">
             <wp:extent cx="5943600" cy="4066540"/>
@@ -1540,7 +2740,7 @@
                     <pic:cNvPicPr/>
                   </pic:nvPicPr>
                   <pic:blipFill>
-                    <a:blip r:embed="rId28"/>
+                    <a:blip r:embed="rId30"/>
                     <a:stretch>
                       <a:fillRect/>
                     </a:stretch>
@@ -1561,10 +2761,118 @@
         </w:drawing>
       </w:r>
     </w:p>
+    <w:p>
+      <w:pPr>
+        <w:pStyle w:val="ListParagraph"/>
+        <w:numPr>
+          <w:ilvl w:val="0"/>
+          <w:numId w:val="4"/>
+        </w:numPr>
+      </w:pPr>
+      <w:r>
+        <w:lastRenderedPageBreak/>
+        <w:t xml:space="preserve">Money withdraw request: Seller can ask </w:t>
+      </w:r>
+      <w:proofErr w:type="spellStart"/>
+      <w:r>
+        <w:t>ainetsoft</w:t>
+      </w:r>
+      <w:proofErr w:type="spellEnd"/>
+      <w:r>
+        <w:t xml:space="preserve"> for a payment withdraw with the details form as below</w:t>
+      </w:r>
+    </w:p>
+    <w:p>
+      <w:r>
+        <w:drawing>
+          <wp:inline distT="0" distB="0" distL="0" distR="0" wp14:anchorId="76C8B276" wp14:editId="4D0B7C7D">
+            <wp:extent cx="5943600" cy="2672080"/>
+            <wp:effectExtent l="0" t="0" r="0" b="0"/>
+            <wp:docPr id="445329566" name="Picture 1"/>
+            <wp:cNvGraphicFramePr>
+              <a:graphicFrameLocks xmlns:a="http://schemas.openxmlformats.org/drawingml/2006/main" noChangeAspect="1"/>
+            </wp:cNvGraphicFramePr>
+            <a:graphic xmlns:a="http://schemas.openxmlformats.org/drawingml/2006/main">
+              <a:graphicData uri="http://schemas.openxmlformats.org/drawingml/2006/picture">
+                <pic:pic xmlns:pic="http://schemas.openxmlformats.org/drawingml/2006/picture">
+                  <pic:nvPicPr>
+                    <pic:cNvPr id="445329566" name=""/>
+                    <pic:cNvPicPr/>
+                  </pic:nvPicPr>
+                  <pic:blipFill>
+                    <a:blip r:embed="rId31"/>
+                    <a:stretch>
+                      <a:fillRect/>
+                    </a:stretch>
+                  </pic:blipFill>
+                  <pic:spPr>
+                    <a:xfrm>
+                      <a:off x="0" y="0"/>
+                      <a:ext cx="5943600" cy="2672080"/>
+                    </a:xfrm>
+                    <a:prstGeom prst="rect">
+                      <a:avLst/>
+                    </a:prstGeom>
+                  </pic:spPr>
+                </pic:pic>
+              </a:graphicData>
+            </a:graphic>
+          </wp:inline>
+        </w:drawing>
+      </w:r>
+      <w:r>
+        <w:br/>
+      </w:r>
+    </w:p>
+    <w:p>
+      <w:r>
+        <w:t xml:space="preserve">Once they got the approval from the Administrator then the notification </w:t>
+      </w:r>
+      <w:r>
+        <w:t>below,</w:t>
+      </w:r>
+      <w:r>
+        <w:t xml:space="preserve"> they should have</w:t>
+      </w:r>
+    </w:p>
     <w:p/>
     <w:p>
       <w:r>
-        <w:br/>
+        <w:drawing>
+          <wp:inline distT="0" distB="0" distL="0" distR="0" wp14:anchorId="0117AFB6" wp14:editId="6C0368B9">
+            <wp:extent cx="5943600" cy="2085340"/>
+            <wp:effectExtent l="0" t="0" r="0" b="0"/>
+            <wp:docPr id="353324808" name="Picture 1"/>
+            <wp:cNvGraphicFramePr>
+              <a:graphicFrameLocks xmlns:a="http://schemas.openxmlformats.org/drawingml/2006/main" noChangeAspect="1"/>
+            </wp:cNvGraphicFramePr>
+            <a:graphic xmlns:a="http://schemas.openxmlformats.org/drawingml/2006/main">
+              <a:graphicData uri="http://schemas.openxmlformats.org/drawingml/2006/picture">
+                <pic:pic xmlns:pic="http://schemas.openxmlformats.org/drawingml/2006/picture">
+                  <pic:nvPicPr>
+                    <pic:cNvPr id="353324808" name=""/>
+                    <pic:cNvPicPr/>
+                  </pic:nvPicPr>
+                  <pic:blipFill>
+                    <a:blip r:embed="rId32"/>
+                    <a:stretch>
+                      <a:fillRect/>
+                    </a:stretch>
+                  </pic:blipFill>
+                  <pic:spPr>
+                    <a:xfrm>
+                      <a:off x="0" y="0"/>
+                      <a:ext cx="5943600" cy="2085340"/>
+                    </a:xfrm>
+                    <a:prstGeom prst="rect">
+                      <a:avLst/>
+                    </a:prstGeom>
+                  </pic:spPr>
+                </pic:pic>
+              </a:graphicData>
+            </a:graphic>
+          </wp:inline>
+        </w:drawing>
       </w:r>
     </w:p>
     <w:p>
@@ -1576,9 +2884,232 @@
         </w:numPr>
       </w:pPr>
       <w:r>
-        <w:t>Administrator:</w:t>
-      </w:r>
-    </w:p>
+        <w:t>Administrator</w:t>
+      </w:r>
+      <w:r>
+        <w:t>’s page</w:t>
+      </w:r>
+      <w:r>
+        <w:t>:</w:t>
+      </w:r>
+    </w:p>
+    <w:p>
+      <w:pPr>
+        <w:pStyle w:val="ListParagraph"/>
+        <w:numPr>
+          <w:ilvl w:val="0"/>
+          <w:numId w:val="4"/>
+        </w:numPr>
+      </w:pPr>
+      <w:r>
+        <w:t>The administrator also has its own notification page with details as the screenshot</w:t>
+      </w:r>
+    </w:p>
+    <w:p>
+      <w:r>
+        <w:lastRenderedPageBreak/>
+        <w:drawing>
+          <wp:inline distT="0" distB="0" distL="0" distR="0" wp14:anchorId="46AF4CCB" wp14:editId="19F19FB7">
+            <wp:extent cx="5943600" cy="2252980"/>
+            <wp:effectExtent l="0" t="0" r="0" b="0"/>
+            <wp:docPr id="1875997928" name="Picture 1"/>
+            <wp:cNvGraphicFramePr>
+              <a:graphicFrameLocks xmlns:a="http://schemas.openxmlformats.org/drawingml/2006/main" noChangeAspect="1"/>
+            </wp:cNvGraphicFramePr>
+            <a:graphic xmlns:a="http://schemas.openxmlformats.org/drawingml/2006/main">
+              <a:graphicData uri="http://schemas.openxmlformats.org/drawingml/2006/picture">
+                <pic:pic xmlns:pic="http://schemas.openxmlformats.org/drawingml/2006/picture">
+                  <pic:nvPicPr>
+                    <pic:cNvPr id="1875997928" name=""/>
+                    <pic:cNvPicPr/>
+                  </pic:nvPicPr>
+                  <pic:blipFill>
+                    <a:blip r:embed="rId33"/>
+                    <a:stretch>
+                      <a:fillRect/>
+                    </a:stretch>
+                  </pic:blipFill>
+                  <pic:spPr>
+                    <a:xfrm>
+                      <a:off x="0" y="0"/>
+                      <a:ext cx="5943600" cy="2252980"/>
+                    </a:xfrm>
+                    <a:prstGeom prst="rect">
+                      <a:avLst/>
+                    </a:prstGeom>
+                  </pic:spPr>
+                </pic:pic>
+              </a:graphicData>
+            </a:graphic>
+          </wp:inline>
+        </w:drawing>
+      </w:r>
+    </w:p>
+    <w:p/>
+    <w:p>
+      <w:pPr>
+        <w:pStyle w:val="ListParagraph"/>
+        <w:numPr>
+          <w:ilvl w:val="0"/>
+          <w:numId w:val="4"/>
+        </w:numPr>
+      </w:pPr>
+      <w:r>
+        <w:t>Withdraw request: Administrator can manage the withdraw requests based on this form</w:t>
+      </w:r>
+    </w:p>
+    <w:p>
+      <w:r>
+        <w:drawing>
+          <wp:inline distT="0" distB="0" distL="0" distR="0" wp14:anchorId="01D8CA9D" wp14:editId="6980E033">
+            <wp:extent cx="5943600" cy="2715260"/>
+            <wp:effectExtent l="0" t="0" r="0" b="8890"/>
+            <wp:docPr id="843965189" name="Picture 1"/>
+            <wp:cNvGraphicFramePr>
+              <a:graphicFrameLocks xmlns:a="http://schemas.openxmlformats.org/drawingml/2006/main" noChangeAspect="1"/>
+            </wp:cNvGraphicFramePr>
+            <a:graphic xmlns:a="http://schemas.openxmlformats.org/drawingml/2006/main">
+              <a:graphicData uri="http://schemas.openxmlformats.org/drawingml/2006/picture">
+                <pic:pic xmlns:pic="http://schemas.openxmlformats.org/drawingml/2006/picture">
+                  <pic:nvPicPr>
+                    <pic:cNvPr id="843965189" name=""/>
+                    <pic:cNvPicPr/>
+                  </pic:nvPicPr>
+                  <pic:blipFill>
+                    <a:blip r:embed="rId34"/>
+                    <a:stretch>
+                      <a:fillRect/>
+                    </a:stretch>
+                  </pic:blipFill>
+                  <pic:spPr>
+                    <a:xfrm>
+                      <a:off x="0" y="0"/>
+                      <a:ext cx="5943600" cy="2715260"/>
+                    </a:xfrm>
+                    <a:prstGeom prst="rect">
+                      <a:avLst/>
+                    </a:prstGeom>
+                  </pic:spPr>
+                </pic:pic>
+              </a:graphicData>
+            </a:graphic>
+          </wp:inline>
+        </w:drawing>
+      </w:r>
+    </w:p>
+    <w:p/>
+    <w:p>
+      <w:pPr>
+        <w:ind w:left="720" w:hanging="720"/>
+      </w:pPr>
+      <w:r>
+        <w:t xml:space="preserve">When having any requests coming, the admin will </w:t>
+      </w:r>
+      <w:proofErr w:type="gramStart"/>
+      <w:r>
+        <w:t>see  in</w:t>
+      </w:r>
+      <w:proofErr w:type="gramEnd"/>
+      <w:r>
+        <w:t xml:space="preserve"> their Notification belling as below</w:t>
+      </w:r>
+    </w:p>
+    <w:p>
+      <w:pPr>
+        <w:ind w:left="720" w:hanging="720"/>
+      </w:pPr>
+      <w:r>
+        <w:lastRenderedPageBreak/>
+        <w:drawing>
+          <wp:inline distT="0" distB="0" distL="0" distR="0" wp14:anchorId="21DAC788" wp14:editId="66A947E7">
+            <wp:extent cx="5943600" cy="1638935"/>
+            <wp:effectExtent l="0" t="0" r="0" b="0"/>
+            <wp:docPr id="304885572" name="Picture 1"/>
+            <wp:cNvGraphicFramePr>
+              <a:graphicFrameLocks xmlns:a="http://schemas.openxmlformats.org/drawingml/2006/main" noChangeAspect="1"/>
+            </wp:cNvGraphicFramePr>
+            <a:graphic xmlns:a="http://schemas.openxmlformats.org/drawingml/2006/main">
+              <a:graphicData uri="http://schemas.openxmlformats.org/drawingml/2006/picture">
+                <pic:pic xmlns:pic="http://schemas.openxmlformats.org/drawingml/2006/picture">
+                  <pic:nvPicPr>
+                    <pic:cNvPr id="304885572" name=""/>
+                    <pic:cNvPicPr/>
+                  </pic:nvPicPr>
+                  <pic:blipFill>
+                    <a:blip r:embed="rId35"/>
+                    <a:stretch>
+                      <a:fillRect/>
+                    </a:stretch>
+                  </pic:blipFill>
+                  <pic:spPr>
+                    <a:xfrm>
+                      <a:off x="0" y="0"/>
+                      <a:ext cx="5943600" cy="1638935"/>
+                    </a:xfrm>
+                    <a:prstGeom prst="rect">
+                      <a:avLst/>
+                    </a:prstGeom>
+                  </pic:spPr>
+                </pic:pic>
+              </a:graphicData>
+            </a:graphic>
+          </wp:inline>
+        </w:drawing>
+      </w:r>
+    </w:p>
+    <w:p>
+      <w:pPr>
+        <w:ind w:left="720" w:hanging="720"/>
+      </w:pPr>
+    </w:p>
+    <w:p>
+      <w:r>
+        <w:t>There is a filtering box that help the users can filter based on what that want for the seller request status</w:t>
+      </w:r>
+      <w:r>
+        <w:br/>
+      </w:r>
+      <w:r>
+        <w:drawing>
+          <wp:inline distT="0" distB="0" distL="0" distR="0" wp14:anchorId="1952F657" wp14:editId="5BB49912">
+            <wp:extent cx="5943600" cy="2368550"/>
+            <wp:effectExtent l="0" t="0" r="0" b="0"/>
+            <wp:docPr id="1498493503" name="Picture 1"/>
+            <wp:cNvGraphicFramePr>
+              <a:graphicFrameLocks xmlns:a="http://schemas.openxmlformats.org/drawingml/2006/main" noChangeAspect="1"/>
+            </wp:cNvGraphicFramePr>
+            <a:graphic xmlns:a="http://schemas.openxmlformats.org/drawingml/2006/main">
+              <a:graphicData uri="http://schemas.openxmlformats.org/drawingml/2006/picture">
+                <pic:pic xmlns:pic="http://schemas.openxmlformats.org/drawingml/2006/picture">
+                  <pic:nvPicPr>
+                    <pic:cNvPr id="1498493503" name=""/>
+                    <pic:cNvPicPr/>
+                  </pic:nvPicPr>
+                  <pic:blipFill>
+                    <a:blip r:embed="rId36"/>
+                    <a:stretch>
+                      <a:fillRect/>
+                    </a:stretch>
+                  </pic:blipFill>
+                  <pic:spPr>
+                    <a:xfrm>
+                      <a:off x="0" y="0"/>
+                      <a:ext cx="5943600" cy="2368550"/>
+                    </a:xfrm>
+                    <a:prstGeom prst="rect">
+                      <a:avLst/>
+                    </a:prstGeom>
+                  </pic:spPr>
+                </pic:pic>
+              </a:graphicData>
+            </a:graphic>
+          </wp:inline>
+        </w:drawing>
+      </w:r>
+    </w:p>
+    <w:p/>
+    <w:p/>
+    <w:p/>
     <w:p>
       <w:pPr>
         <w:pStyle w:val="ListParagraph"/>
@@ -1727,9 +3258,11 @@
             <w:hideMark/>
           </w:tcPr>
           <w:p>
+            <w:proofErr w:type="spellStart"/>
             <w:r>
               <w:t>audit_logs</w:t>
             </w:r>
+            <w:proofErr w:type="spellEnd"/>
           </w:p>
         </w:tc>
         <w:tc>
@@ -1762,9 +3295,11 @@
             <w:hideMark/>
           </w:tcPr>
           <w:p>
+            <w:proofErr w:type="spellStart"/>
             <w:r>
               <w:t>bank_accounts</w:t>
             </w:r>
+            <w:proofErr w:type="spellEnd"/>
           </w:p>
         </w:tc>
         <w:tc>
@@ -1786,6 +3321,7 @@
           </w:tcPr>
           <w:p>
             <w:r>
+              <w:lastRenderedPageBreak/>
               <w:t>3</w:t>
             </w:r>
           </w:p>
@@ -1821,7 +3357,6 @@
           </w:tcPr>
           <w:p>
             <w:r>
-              <w:lastRenderedPageBreak/>
               <w:t>4</w:t>
             </w:r>
           </w:p>
@@ -1833,9 +3368,11 @@
             <w:hideMark/>
           </w:tcPr>
           <w:p>
+            <w:proofErr w:type="spellStart"/>
             <w:r>
               <w:t>chat_messages</w:t>
             </w:r>
+            <w:proofErr w:type="spellEnd"/>
           </w:p>
         </w:tc>
         <w:tc>
@@ -1868,9 +3405,11 @@
             <w:hideMark/>
           </w:tcPr>
           <w:p>
+            <w:proofErr w:type="spellStart"/>
             <w:r>
               <w:t>content_nodes</w:t>
             </w:r>
+            <w:proofErr w:type="spellEnd"/>
           </w:p>
         </w:tc>
         <w:tc>
@@ -1903,9 +3442,11 @@
             <w:hideMark/>
           </w:tcPr>
           <w:p>
+            <w:proofErr w:type="spellStart"/>
             <w:r>
               <w:t>feedback_templates</w:t>
             </w:r>
+            <w:proofErr w:type="spellEnd"/>
           </w:p>
         </w:tc>
         <w:tc>
@@ -1938,9 +3479,11 @@
             <w:hideMark/>
           </w:tcPr>
           <w:p>
+            <w:proofErr w:type="spellStart"/>
             <w:r>
               <w:t>footer_icons</w:t>
             </w:r>
+            <w:proofErr w:type="spellEnd"/>
           </w:p>
         </w:tc>
         <w:tc>
@@ -1973,9 +3516,11 @@
             <w:hideMark/>
           </w:tcPr>
           <w:p>
+            <w:proofErr w:type="spellStart"/>
             <w:r>
               <w:t>footer_menus</w:t>
             </w:r>
+            <w:proofErr w:type="spellEnd"/>
           </w:p>
         </w:tc>
         <w:tc>
@@ -2008,9 +3553,11 @@
             <w:hideMark/>
           </w:tcPr>
           <w:p>
+            <w:proofErr w:type="spellStart"/>
             <w:r>
               <w:t>help_nodes</w:t>
             </w:r>
+            <w:proofErr w:type="spellEnd"/>
           </w:p>
         </w:tc>
         <w:tc>
@@ -2113,9 +3660,11 @@
             <w:hideMark/>
           </w:tcPr>
           <w:p>
+            <w:proofErr w:type="spellStart"/>
             <w:r>
               <w:t>password_reset_tokens</w:t>
             </w:r>
+            <w:proofErr w:type="spellEnd"/>
           </w:p>
         </w:tc>
         <w:tc>
@@ -2148,9 +3697,11 @@
             <w:hideMark/>
           </w:tcPr>
           <w:p>
+            <w:proofErr w:type="spellStart"/>
             <w:r>
               <w:t>product_reports</w:t>
             </w:r>
+            <w:proofErr w:type="spellEnd"/>
           </w:p>
         </w:tc>
         <w:tc>
@@ -2218,6 +3769,7 @@
             <w:hideMark/>
           </w:tcPr>
           <w:p>
+            <w:proofErr w:type="spellStart"/>
             <w:proofErr w:type="gramStart"/>
             <w:r>
               <w:t>report</w:t>
@@ -2226,6 +3778,7 @@
             <w:r>
               <w:t>_reasons</w:t>
             </w:r>
+            <w:proofErr w:type="spellEnd"/>
           </w:p>
         </w:tc>
         <w:tc>
@@ -2293,9 +3846,11 @@
             <w:hideMark/>
           </w:tcPr>
           <w:p>
+            <w:proofErr w:type="spellStart"/>
             <w:r>
               <w:t>shipping_methods</w:t>
             </w:r>
+            <w:proofErr w:type="spellEnd"/>
           </w:p>
         </w:tc>
         <w:tc>
@@ -2328,9 +3883,11 @@
             <w:hideMark/>
           </w:tcPr>
           <w:p>
+            <w:proofErr w:type="spellStart"/>
             <w:r>
               <w:t>system_contents</w:t>
             </w:r>
+            <w:proofErr w:type="spellEnd"/>
           </w:p>
         </w:tc>
         <w:tc>
@@ -2364,8 +3921,46 @@
           </w:tcPr>
           <w:p>
             <w:r>
-              <w:t>users</w:t>
+              <w:t>U</w:t>
             </w:r>
+            <w:r>
+              <w:t>sers</w:t>
+            </w:r>
+          </w:p>
+        </w:tc>
+        <w:tc>
+          <w:tcPr>
+            <w:tcW w:w="3582" w:type="dxa"/>
+          </w:tcPr>
+          <w:p/>
+        </w:tc>
+      </w:tr>
+      <w:tr>
+        <w:trPr>
+          <w:tblCellSpacing w:w="15" w:type="dxa"/>
+        </w:trPr>
+        <w:tc>
+          <w:tcPr>
+            <w:tcW w:w="710" w:type="dxa"/>
+            <w:vAlign w:val="center"/>
+          </w:tcPr>
+          <w:p>
+            <w:r>
+              <w:t>20</w:t>
+            </w:r>
+          </w:p>
+        </w:tc>
+        <w:tc>
+          <w:tcPr>
+            <w:tcW w:w="4938" w:type="dxa"/>
+            <w:vAlign w:val="center"/>
+          </w:tcPr>
+          <w:p>
+            <w:proofErr w:type="spellStart"/>
+            <w:r>
+              <w:t>withdrawal_requests</w:t>
+            </w:r>
+            <w:proofErr w:type="spellEnd"/>
           </w:p>
         </w:tc>
         <w:tc>
@@ -3618,6 +5213,7 @@
   <w:style w:type="character" w:default="1" w:styleId="DefaultParagraphFont">
     <w:name w:val="Default Paragraph Font"/>
     <w:uiPriority w:val="1"/>
+    <w:semiHidden/>
     <w:unhideWhenUsed/>
   </w:style>
   <w:style w:type="table" w:default="1" w:styleId="TableNormal">

</xml_diff>

<commit_message>
Code completed for admin user activities
</commit_message>
<xml_diff>
--- a/AiNetsoft Functions Description.docx
+++ b/AiNetsoft Functions Description.docx
@@ -106,15 +106,7 @@
         </w:numPr>
       </w:pPr>
       <w:r>
-        <w:t xml:space="preserve">Edit all needed fields as the </w:t>
-      </w:r>
-      <w:proofErr w:type="gramStart"/>
-      <w:r>
-        <w:t>“ Ho</w:t>
-      </w:r>
-      <w:proofErr w:type="gramEnd"/>
-      <w:r>
-        <w:t xml:space="preserve"> so ca </w:t>
+        <w:t xml:space="preserve">Edit all needed fields as the “ Ho so ca </w:t>
       </w:r>
       <w:proofErr w:type="spellStart"/>
       <w:r>
@@ -122,15 +114,7 @@
       </w:r>
       <w:proofErr w:type="spellEnd"/>
       <w:r>
-        <w:t xml:space="preserve">”.  The scenario that Phone number can be sync from the Sell request data to this page, also same for email. Data is </w:t>
-      </w:r>
-      <w:proofErr w:type="gramStart"/>
-      <w:r>
-        <w:t>storing</w:t>
-      </w:r>
-      <w:proofErr w:type="gramEnd"/>
-      <w:r>
-        <w:t xml:space="preserve"> in the User collection</w:t>
+        <w:t>”.  The scenario that Phone number can be sync from the Sell request data to this page, also same for email. Data is storing in the User collection</w:t>
       </w:r>
     </w:p>
     <w:p>
@@ -305,21 +289,7 @@
         <w:rPr>
           <w:highlight w:val="yellow"/>
         </w:rPr>
-        <w:t xml:space="preserve">. Future will implement a validation email account to make sure fake email is not available. </w:t>
-      </w:r>
-      <w:proofErr w:type="gramStart"/>
-      <w:r>
-        <w:rPr>
-          <w:highlight w:val="yellow"/>
-        </w:rPr>
-        <w:t>Also</w:t>
-      </w:r>
-      <w:proofErr w:type="gramEnd"/>
-      <w:r>
-        <w:rPr>
-          <w:highlight w:val="yellow"/>
-        </w:rPr>
-        <w:t xml:space="preserve"> the password constrain will be asked for stronger.</w:t>
+        <w:t>. Future will implement a validation email account to make sure fake email is not available. Also the password constrain will be asked for stronger.</w:t>
       </w:r>
     </w:p>
     <w:p>
@@ -432,15 +402,7 @@
         </w:numPr>
       </w:pPr>
       <w:r>
-        <w:t xml:space="preserve">Become a seller: This contains a </w:t>
-      </w:r>
-      <w:proofErr w:type="gramStart"/>
-      <w:r>
-        <w:t>huge complex steps</w:t>
-      </w:r>
-      <w:proofErr w:type="gramEnd"/>
-      <w:r>
-        <w:t xml:space="preserve"> to register to become a Seller with using AI connection service support to scan to detect the fake CCCD info</w:t>
+        <w:t>Become a seller: This contains a huge complex steps to register to become a Seller with using AI connection service support to scan to detect the fake CCCD info</w:t>
       </w:r>
     </w:p>
     <w:p>
@@ -723,15 +685,7 @@
     <w:p/>
     <w:p>
       <w:r>
-        <w:t xml:space="preserve">Users must type the business type and </w:t>
-      </w:r>
-      <w:proofErr w:type="gramStart"/>
-      <w:r>
-        <w:t>full</w:t>
-      </w:r>
-      <w:proofErr w:type="gramEnd"/>
-      <w:r>
-        <w:t xml:space="preserve"> fill sufficient info and validation</w:t>
+        <w:t>Users must type the business type and full fill sufficient info and validation</w:t>
       </w:r>
     </w:p>
     <w:p>
@@ -778,15 +732,7 @@
     </w:p>
     <w:p>
       <w:r>
-        <w:t xml:space="preserve">Personal </w:t>
-      </w:r>
-      <w:proofErr w:type="gramStart"/>
-      <w:r>
-        <w:t>business( Same</w:t>
-      </w:r>
-      <w:proofErr w:type="gramEnd"/>
-      <w:r>
-        <w:t xml:space="preserve"> screen for Company business)</w:t>
+        <w:t>Personal business( Same screen for Company business)</w:t>
       </w:r>
     </w:p>
     <w:p>
@@ -893,15 +839,7 @@
     <w:p/>
     <w:p>
       <w:r>
-        <w:t xml:space="preserve">Users will be denied moving to next steps if checking failed the result and ask the user </w:t>
-      </w:r>
-      <w:proofErr w:type="gramStart"/>
-      <w:r>
-        <w:t>has to</w:t>
-      </w:r>
-      <w:proofErr w:type="gramEnd"/>
-      <w:r>
-        <w:t xml:space="preserve"> verify and update the correct information</w:t>
+        <w:t>Users will be denied moving to next steps if checking failed the result and ask the user has to verify and update the correct information</w:t>
       </w:r>
     </w:p>
     <w:p>
@@ -999,15 +937,7 @@
     <w:p/>
     <w:p>
       <w:r>
-        <w:t xml:space="preserve">After all information needed </w:t>
-      </w:r>
-      <w:proofErr w:type="gramStart"/>
-      <w:r>
-        <w:t>id</w:t>
-      </w:r>
-      <w:proofErr w:type="gramEnd"/>
-      <w:r>
-        <w:t xml:space="preserve"> valid, the requester will receive the notification and email as below</w:t>
+        <w:t>After all information needed id valid, the requester will receive the notification and email as below</w:t>
       </w:r>
       <w:r>
         <w:br/>
@@ -1439,15 +1369,7 @@
         <w:t>notification</w:t>
       </w:r>
       <w:r>
-        <w:t xml:space="preserve"> in the link /seller/</w:t>
-      </w:r>
-      <w:proofErr w:type="gramStart"/>
-      <w:r>
-        <w:t>register  the</w:t>
-      </w:r>
-      <w:proofErr w:type="gramEnd"/>
-      <w:r>
-        <w:t xml:space="preserve"> </w:t>
+        <w:t xml:space="preserve"> in the link /seller/register  the </w:t>
       </w:r>
       <w:r>
         <w:t>progress</w:t>
@@ -1759,21 +1681,7 @@
         <w:rPr>
           <w:color w:val="EE0000"/>
         </w:rPr>
-        <w:t xml:space="preserve">                Lý </w:t>
-      </w:r>
-      <w:proofErr w:type="gramStart"/>
-      <w:r>
-        <w:rPr>
-          <w:color w:val="EE0000"/>
-        </w:rPr>
-        <w:t>do</w:t>
-      </w:r>
-      <w:proofErr w:type="gramEnd"/>
-      <w:r>
-        <w:rPr>
-          <w:color w:val="EE0000"/>
-        </w:rPr>
-        <w:t xml:space="preserve">: </w:t>
+        <w:t xml:space="preserve">                Lý do: </w:t>
       </w:r>
       <w:proofErr w:type="spellStart"/>
       <w:r>
@@ -3005,11 +2913,9 @@
       <w:r>
         <w:t xml:space="preserve">When having any requests coming, the admin will </w:t>
       </w:r>
-      <w:proofErr w:type="gramStart"/>
-      <w:r>
-        <w:t>see  in</w:t>
-      </w:r>
-      <w:proofErr w:type="gramEnd"/>
+      <w:r>
+        <w:t>see in</w:t>
+      </w:r>
       <w:r>
         <w:t xml:space="preserve"> their Notification belling as below</w:t>
       </w:r>
@@ -3107,9 +3013,1220 @@
         </w:drawing>
       </w:r>
     </w:p>
+    <w:p>
+      <w:pPr>
+        <w:pStyle w:val="ListParagraph"/>
+        <w:numPr>
+          <w:ilvl w:val="0"/>
+          <w:numId w:val="4"/>
+        </w:numPr>
+      </w:pPr>
+      <w:r>
+        <w:t>Users summarize page: The page will show all users which are available in the database</w:t>
+      </w:r>
+    </w:p>
+    <w:p>
+      <w:pPr>
+        <w:pStyle w:val="ListParagraph"/>
+        <w:numPr>
+          <w:ilvl w:val="0"/>
+          <w:numId w:val="4"/>
+        </w:numPr>
+      </w:pPr>
+      <w:proofErr w:type="spellStart"/>
+      <w:r>
+        <w:t>Tổng</w:t>
+      </w:r>
+      <w:proofErr w:type="spellEnd"/>
+      <w:r>
+        <w:t xml:space="preserve"> </w:t>
+      </w:r>
+      <w:proofErr w:type="spellStart"/>
+      <w:r>
+        <w:t>quan</w:t>
+      </w:r>
+      <w:proofErr w:type="spellEnd"/>
+      <w:r>
+        <w:t xml:space="preserve"> Admin page: This shows the summarization of all the important parts and will be details one Admin user click to it</w:t>
+      </w:r>
+    </w:p>
+    <w:p>
+      <w:r>
+        <w:lastRenderedPageBreak/>
+        <w:drawing>
+          <wp:inline distT="0" distB="0" distL="0" distR="0" wp14:anchorId="57E58A03" wp14:editId="1993E0F0">
+            <wp:extent cx="5943600" cy="3883025"/>
+            <wp:effectExtent l="0" t="0" r="0" b="3175"/>
+            <wp:docPr id="1984145545" name="Picture 1"/>
+            <wp:cNvGraphicFramePr>
+              <a:graphicFrameLocks xmlns:a="http://schemas.openxmlformats.org/drawingml/2006/main" noChangeAspect="1"/>
+            </wp:cNvGraphicFramePr>
+            <a:graphic xmlns:a="http://schemas.openxmlformats.org/drawingml/2006/main">
+              <a:graphicData uri="http://schemas.openxmlformats.org/drawingml/2006/picture">
+                <pic:pic xmlns:pic="http://schemas.openxmlformats.org/drawingml/2006/picture">
+                  <pic:nvPicPr>
+                    <pic:cNvPr id="1984145545" name=""/>
+                    <pic:cNvPicPr/>
+                  </pic:nvPicPr>
+                  <pic:blipFill>
+                    <a:blip r:embed="rId37"/>
+                    <a:stretch>
+                      <a:fillRect/>
+                    </a:stretch>
+                  </pic:blipFill>
+                  <pic:spPr>
+                    <a:xfrm>
+                      <a:off x="0" y="0"/>
+                      <a:ext cx="5943600" cy="3883025"/>
+                    </a:xfrm>
+                    <a:prstGeom prst="rect">
+                      <a:avLst/>
+                    </a:prstGeom>
+                  </pic:spPr>
+                </pic:pic>
+              </a:graphicData>
+            </a:graphic>
+          </wp:inline>
+        </w:drawing>
+      </w:r>
+    </w:p>
+    <w:p>
+      <w:pPr>
+        <w:pStyle w:val="ListParagraph"/>
+        <w:numPr>
+          <w:ilvl w:val="0"/>
+          <w:numId w:val="4"/>
+        </w:numPr>
+      </w:pPr>
+      <w:proofErr w:type="spellStart"/>
+      <w:r>
+        <w:t>Tổng</w:t>
+      </w:r>
+      <w:proofErr w:type="spellEnd"/>
+      <w:r>
+        <w:t xml:space="preserve"> </w:t>
+      </w:r>
+      <w:proofErr w:type="spellStart"/>
+      <w:r>
+        <w:t>người</w:t>
+      </w:r>
+      <w:proofErr w:type="spellEnd"/>
+      <w:r>
+        <w:t xml:space="preserve"> dung:</w:t>
+      </w:r>
+    </w:p>
+    <w:p>
+      <w:pPr>
+        <w:pStyle w:val="ListParagraph"/>
+        <w:numPr>
+          <w:ilvl w:val="0"/>
+          <w:numId w:val="4"/>
+        </w:numPr>
+      </w:pPr>
+      <w:proofErr w:type="spellStart"/>
+      <w:r>
+        <w:t>Sản</w:t>
+      </w:r>
+      <w:proofErr w:type="spellEnd"/>
+      <w:r>
+        <w:t xml:space="preserve"> </w:t>
+      </w:r>
+      <w:proofErr w:type="spellStart"/>
+      <w:r>
+        <w:t>phẩm</w:t>
+      </w:r>
+      <w:proofErr w:type="spellEnd"/>
+      <w:r>
+        <w:t>: Show all products which the system is having. There is a quick access to the Seller pages</w:t>
+      </w:r>
+    </w:p>
+    <w:p>
+      <w:r>
+        <w:lastRenderedPageBreak/>
+        <w:drawing>
+          <wp:inline distT="0" distB="0" distL="0" distR="0" wp14:anchorId="6B5994E1" wp14:editId="41E9937E">
+            <wp:extent cx="5943600" cy="3467735"/>
+            <wp:effectExtent l="0" t="0" r="0" b="0"/>
+            <wp:docPr id="1729515188" name="Picture 1"/>
+            <wp:cNvGraphicFramePr>
+              <a:graphicFrameLocks xmlns:a="http://schemas.openxmlformats.org/drawingml/2006/main" noChangeAspect="1"/>
+            </wp:cNvGraphicFramePr>
+            <a:graphic xmlns:a="http://schemas.openxmlformats.org/drawingml/2006/main">
+              <a:graphicData uri="http://schemas.openxmlformats.org/drawingml/2006/picture">
+                <pic:pic xmlns:pic="http://schemas.openxmlformats.org/drawingml/2006/picture">
+                  <pic:nvPicPr>
+                    <pic:cNvPr id="1729515188" name=""/>
+                    <pic:cNvPicPr/>
+                  </pic:nvPicPr>
+                  <pic:blipFill>
+                    <a:blip r:embed="rId38"/>
+                    <a:stretch>
+                      <a:fillRect/>
+                    </a:stretch>
+                  </pic:blipFill>
+                  <pic:spPr>
+                    <a:xfrm>
+                      <a:off x="0" y="0"/>
+                      <a:ext cx="5943600" cy="3467735"/>
+                    </a:xfrm>
+                    <a:prstGeom prst="rect">
+                      <a:avLst/>
+                    </a:prstGeom>
+                  </pic:spPr>
+                </pic:pic>
+              </a:graphicData>
+            </a:graphic>
+          </wp:inline>
+        </w:drawing>
+      </w:r>
+    </w:p>
     <w:p/>
+    <w:p>
+      <w:pPr>
+        <w:pStyle w:val="ListParagraph"/>
+        <w:numPr>
+          <w:ilvl w:val="0"/>
+          <w:numId w:val="4"/>
+        </w:numPr>
+      </w:pPr>
+      <w:proofErr w:type="spellStart"/>
+      <w:r>
+        <w:t>Chờ</w:t>
+      </w:r>
+      <w:proofErr w:type="spellEnd"/>
+      <w:r>
+        <w:t xml:space="preserve"> </w:t>
+      </w:r>
+      <w:proofErr w:type="spellStart"/>
+      <w:r>
+        <w:t>duyệt</w:t>
+      </w:r>
+      <w:proofErr w:type="spellEnd"/>
+      <w:r>
+        <w:t xml:space="preserve"> SP: This contains all pending shop product and being waiting the admin page to approve</w:t>
+      </w:r>
+      <w:r>
+        <w:br/>
+      </w:r>
+      <w:r>
+        <w:drawing>
+          <wp:inline distT="0" distB="0" distL="0" distR="0" wp14:anchorId="3F7E3E9D" wp14:editId="1BE9BB0B">
+            <wp:extent cx="5943600" cy="3333750"/>
+            <wp:effectExtent l="0" t="0" r="0" b="0"/>
+            <wp:docPr id="1884427267" name="Picture 1"/>
+            <wp:cNvGraphicFramePr>
+              <a:graphicFrameLocks xmlns:a="http://schemas.openxmlformats.org/drawingml/2006/main" noChangeAspect="1"/>
+            </wp:cNvGraphicFramePr>
+            <a:graphic xmlns:a="http://schemas.openxmlformats.org/drawingml/2006/main">
+              <a:graphicData uri="http://schemas.openxmlformats.org/drawingml/2006/picture">
+                <pic:pic xmlns:pic="http://schemas.openxmlformats.org/drawingml/2006/picture">
+                  <pic:nvPicPr>
+                    <pic:cNvPr id="1884427267" name=""/>
+                    <pic:cNvPicPr/>
+                  </pic:nvPicPr>
+                  <pic:blipFill>
+                    <a:blip r:embed="rId39"/>
+                    <a:stretch>
+                      <a:fillRect/>
+                    </a:stretch>
+                  </pic:blipFill>
+                  <pic:spPr>
+                    <a:xfrm>
+                      <a:off x="0" y="0"/>
+                      <a:ext cx="5943600" cy="3333750"/>
+                    </a:xfrm>
+                    <a:prstGeom prst="rect">
+                      <a:avLst/>
+                    </a:prstGeom>
+                  </pic:spPr>
+                </pic:pic>
+              </a:graphicData>
+            </a:graphic>
+          </wp:inline>
+        </w:drawing>
+      </w:r>
+    </w:p>
+    <w:p>
+      <w:pPr>
+        <w:pStyle w:val="ListParagraph"/>
+        <w:numPr>
+          <w:ilvl w:val="0"/>
+          <w:numId w:val="4"/>
+        </w:numPr>
+      </w:pPr>
+      <w:proofErr w:type="spellStart"/>
+      <w:r>
+        <w:t>Chờ</w:t>
+      </w:r>
+      <w:proofErr w:type="spellEnd"/>
+      <w:r>
+        <w:t xml:space="preserve"> </w:t>
+      </w:r>
+      <w:proofErr w:type="spellStart"/>
+      <w:r>
+        <w:t>duyệt</w:t>
+      </w:r>
+      <w:proofErr w:type="spellEnd"/>
+      <w:r>
+        <w:t xml:space="preserve"> shop: This is the pending status of the users requesting for become the seller.</w:t>
+      </w:r>
+    </w:p>
+    <w:p>
+      <w:r>
+        <w:lastRenderedPageBreak/>
+        <w:drawing>
+          <wp:inline distT="0" distB="0" distL="0" distR="0" wp14:anchorId="028782AD" wp14:editId="7F040F09">
+            <wp:extent cx="5943600" cy="3910965"/>
+            <wp:effectExtent l="0" t="0" r="0" b="0"/>
+            <wp:docPr id="39320211" name="Picture 1"/>
+            <wp:cNvGraphicFramePr>
+              <a:graphicFrameLocks xmlns:a="http://schemas.openxmlformats.org/drawingml/2006/main" noChangeAspect="1"/>
+            </wp:cNvGraphicFramePr>
+            <a:graphic xmlns:a="http://schemas.openxmlformats.org/drawingml/2006/main">
+              <a:graphicData uri="http://schemas.openxmlformats.org/drawingml/2006/picture">
+                <pic:pic xmlns:pic="http://schemas.openxmlformats.org/drawingml/2006/picture">
+                  <pic:nvPicPr>
+                    <pic:cNvPr id="39320211" name=""/>
+                    <pic:cNvPicPr/>
+                  </pic:nvPicPr>
+                  <pic:blipFill>
+                    <a:blip r:embed="rId40"/>
+                    <a:stretch>
+                      <a:fillRect/>
+                    </a:stretch>
+                  </pic:blipFill>
+                  <pic:spPr>
+                    <a:xfrm>
+                      <a:off x="0" y="0"/>
+                      <a:ext cx="5943600" cy="3910965"/>
+                    </a:xfrm>
+                    <a:prstGeom prst="rect">
+                      <a:avLst/>
+                    </a:prstGeom>
+                  </pic:spPr>
+                </pic:pic>
+              </a:graphicData>
+            </a:graphic>
+          </wp:inline>
+        </w:drawing>
+      </w:r>
+    </w:p>
+    <w:p>
+      <w:pPr>
+        <w:pStyle w:val="ListParagraph"/>
+        <w:numPr>
+          <w:ilvl w:val="0"/>
+          <w:numId w:val="4"/>
+        </w:numPr>
+      </w:pPr>
+      <w:r>
+        <w:t>Details of “</w:t>
+      </w:r>
+      <w:proofErr w:type="spellStart"/>
+      <w:r>
+        <w:t>Người</w:t>
+      </w:r>
+      <w:proofErr w:type="spellEnd"/>
+      <w:r>
+        <w:t xml:space="preserve"> </w:t>
+      </w:r>
+      <w:proofErr w:type="spellStart"/>
+      <w:r>
+        <w:t>dùng</w:t>
+      </w:r>
+      <w:proofErr w:type="spellEnd"/>
+      <w:r>
+        <w:t xml:space="preserve">”: This shows very details of the user and many activities related to User management such as Lock, promote user to Admin, </w:t>
+      </w:r>
+      <w:r>
+        <w:t>denote user seller back to normal users…</w:t>
+      </w:r>
+    </w:p>
+    <w:p>
+      <w:pPr>
+        <w:pStyle w:val="ListParagraph"/>
+        <w:numPr>
+          <w:ilvl w:val="1"/>
+          <w:numId w:val="4"/>
+        </w:numPr>
+      </w:pPr>
+      <w:r>
+        <w:t>General view:</w:t>
+      </w:r>
+    </w:p>
+    <w:p>
+      <w:r>
+        <w:lastRenderedPageBreak/>
+        <w:drawing>
+          <wp:inline distT="0" distB="0" distL="0" distR="0" wp14:anchorId="3C76F8B7" wp14:editId="547CC34D">
+            <wp:extent cx="5943600" cy="4124325"/>
+            <wp:effectExtent l="0" t="0" r="0" b="9525"/>
+            <wp:docPr id="1523749862" name="Picture 1"/>
+            <wp:cNvGraphicFramePr>
+              <a:graphicFrameLocks xmlns:a="http://schemas.openxmlformats.org/drawingml/2006/main" noChangeAspect="1"/>
+            </wp:cNvGraphicFramePr>
+            <a:graphic xmlns:a="http://schemas.openxmlformats.org/drawingml/2006/main">
+              <a:graphicData uri="http://schemas.openxmlformats.org/drawingml/2006/picture">
+                <pic:pic xmlns:pic="http://schemas.openxmlformats.org/drawingml/2006/picture">
+                  <pic:nvPicPr>
+                    <pic:cNvPr id="1523749862" name=""/>
+                    <pic:cNvPicPr/>
+                  </pic:nvPicPr>
+                  <pic:blipFill>
+                    <a:blip r:embed="rId41"/>
+                    <a:stretch>
+                      <a:fillRect/>
+                    </a:stretch>
+                  </pic:blipFill>
+                  <pic:spPr>
+                    <a:xfrm>
+                      <a:off x="0" y="0"/>
+                      <a:ext cx="5943600" cy="4124325"/>
+                    </a:xfrm>
+                    <a:prstGeom prst="rect">
+                      <a:avLst/>
+                    </a:prstGeom>
+                  </pic:spPr>
+                </pic:pic>
+              </a:graphicData>
+            </a:graphic>
+          </wp:inline>
+        </w:drawing>
+      </w:r>
+    </w:p>
     <w:p/>
+    <w:p>
+      <w:r>
+        <w:t>Based on this view User Admin can perform many activities:</w:t>
+      </w:r>
+    </w:p>
+    <w:p>
+      <w:pPr>
+        <w:pStyle w:val="ListParagraph"/>
+        <w:numPr>
+          <w:ilvl w:val="1"/>
+          <w:numId w:val="4"/>
+        </w:numPr>
+      </w:pPr>
+      <w:r>
+        <w:t>View details:</w:t>
+      </w:r>
+    </w:p>
+    <w:p>
+      <w:r>
+        <w:drawing>
+          <wp:inline distT="0" distB="0" distL="0" distR="0" wp14:anchorId="63D45F45" wp14:editId="7399F20E">
+            <wp:extent cx="5943600" cy="2961005"/>
+            <wp:effectExtent l="0" t="0" r="0" b="0"/>
+            <wp:docPr id="646291551" name="Picture 1"/>
+            <wp:cNvGraphicFramePr>
+              <a:graphicFrameLocks xmlns:a="http://schemas.openxmlformats.org/drawingml/2006/main" noChangeAspect="1"/>
+            </wp:cNvGraphicFramePr>
+            <a:graphic xmlns:a="http://schemas.openxmlformats.org/drawingml/2006/main">
+              <a:graphicData uri="http://schemas.openxmlformats.org/drawingml/2006/picture">
+                <pic:pic xmlns:pic="http://schemas.openxmlformats.org/drawingml/2006/picture">
+                  <pic:nvPicPr>
+                    <pic:cNvPr id="646291551" name=""/>
+                    <pic:cNvPicPr/>
+                  </pic:nvPicPr>
+                  <pic:blipFill>
+                    <a:blip r:embed="rId42"/>
+                    <a:stretch>
+                      <a:fillRect/>
+                    </a:stretch>
+                  </pic:blipFill>
+                  <pic:spPr>
+                    <a:xfrm>
+                      <a:off x="0" y="0"/>
+                      <a:ext cx="5943600" cy="2961005"/>
+                    </a:xfrm>
+                    <a:prstGeom prst="rect">
+                      <a:avLst/>
+                    </a:prstGeom>
+                  </pic:spPr>
+                </pic:pic>
+              </a:graphicData>
+            </a:graphic>
+          </wp:inline>
+        </w:drawing>
+      </w:r>
+    </w:p>
+    <w:p>
+      <w:pPr>
+        <w:pStyle w:val="ListParagraph"/>
+        <w:numPr>
+          <w:ilvl w:val="1"/>
+          <w:numId w:val="4"/>
+        </w:numPr>
+      </w:pPr>
+      <w:r>
+        <w:lastRenderedPageBreak/>
+        <w:t>Upgrade to admin role</w:t>
+      </w:r>
+    </w:p>
+    <w:p>
+      <w:r>
+        <w:drawing>
+          <wp:inline distT="0" distB="0" distL="0" distR="0" wp14:anchorId="500D681A" wp14:editId="5A3A4CAB">
+            <wp:extent cx="5943600" cy="2051685"/>
+            <wp:effectExtent l="0" t="0" r="0" b="5715"/>
+            <wp:docPr id="1907778541" name="Picture 1"/>
+            <wp:cNvGraphicFramePr>
+              <a:graphicFrameLocks xmlns:a="http://schemas.openxmlformats.org/drawingml/2006/main" noChangeAspect="1"/>
+            </wp:cNvGraphicFramePr>
+            <a:graphic xmlns:a="http://schemas.openxmlformats.org/drawingml/2006/main">
+              <a:graphicData uri="http://schemas.openxmlformats.org/drawingml/2006/picture">
+                <pic:pic xmlns:pic="http://schemas.openxmlformats.org/drawingml/2006/picture">
+                  <pic:nvPicPr>
+                    <pic:cNvPr id="1907778541" name=""/>
+                    <pic:cNvPicPr/>
+                  </pic:nvPicPr>
+                  <pic:blipFill>
+                    <a:blip r:embed="rId43"/>
+                    <a:stretch>
+                      <a:fillRect/>
+                    </a:stretch>
+                  </pic:blipFill>
+                  <pic:spPr>
+                    <a:xfrm>
+                      <a:off x="0" y="0"/>
+                      <a:ext cx="5943600" cy="2051685"/>
+                    </a:xfrm>
+                    <a:prstGeom prst="rect">
+                      <a:avLst/>
+                    </a:prstGeom>
+                  </pic:spPr>
+                </pic:pic>
+              </a:graphicData>
+            </a:graphic>
+          </wp:inline>
+        </w:drawing>
+      </w:r>
+    </w:p>
+    <w:p>
+      <w:pPr>
+        <w:pStyle w:val="ListParagraph"/>
+        <w:numPr>
+          <w:ilvl w:val="1"/>
+          <w:numId w:val="4"/>
+        </w:numPr>
+      </w:pPr>
+      <w:r>
+        <w:t>Downgrade to user role</w:t>
+      </w:r>
+    </w:p>
+    <w:p>
+      <w:r>
+        <w:drawing>
+          <wp:inline distT="0" distB="0" distL="0" distR="0" wp14:anchorId="121DE39E" wp14:editId="6A9E2E71">
+            <wp:extent cx="5943600" cy="2179955"/>
+            <wp:effectExtent l="0" t="0" r="0" b="0"/>
+            <wp:docPr id="850094411" name="Picture 1"/>
+            <wp:cNvGraphicFramePr>
+              <a:graphicFrameLocks xmlns:a="http://schemas.openxmlformats.org/drawingml/2006/main" noChangeAspect="1"/>
+            </wp:cNvGraphicFramePr>
+            <a:graphic xmlns:a="http://schemas.openxmlformats.org/drawingml/2006/main">
+              <a:graphicData uri="http://schemas.openxmlformats.org/drawingml/2006/picture">
+                <pic:pic xmlns:pic="http://schemas.openxmlformats.org/drawingml/2006/picture">
+                  <pic:nvPicPr>
+                    <pic:cNvPr id="850094411" name=""/>
+                    <pic:cNvPicPr/>
+                  </pic:nvPicPr>
+                  <pic:blipFill>
+                    <a:blip r:embed="rId44"/>
+                    <a:stretch>
+                      <a:fillRect/>
+                    </a:stretch>
+                  </pic:blipFill>
+                  <pic:spPr>
+                    <a:xfrm>
+                      <a:off x="0" y="0"/>
+                      <a:ext cx="5943600" cy="2179955"/>
+                    </a:xfrm>
+                    <a:prstGeom prst="rect">
+                      <a:avLst/>
+                    </a:prstGeom>
+                  </pic:spPr>
+                </pic:pic>
+              </a:graphicData>
+            </a:graphic>
+          </wp:inline>
+        </w:drawing>
+      </w:r>
+    </w:p>
+    <w:p>
+      <w:pPr>
+        <w:pStyle w:val="ListParagraph"/>
+        <w:numPr>
+          <w:ilvl w:val="1"/>
+          <w:numId w:val="4"/>
+        </w:numPr>
+      </w:pPr>
+      <w:r>
+        <w:t>Downgrade to user role from seller role</w:t>
+      </w:r>
+    </w:p>
+    <w:p>
+      <w:r>
+        <w:drawing>
+          <wp:inline distT="0" distB="0" distL="0" distR="0" wp14:anchorId="7AB1225A" wp14:editId="31569A10">
+            <wp:extent cx="5943600" cy="2390775"/>
+            <wp:effectExtent l="0" t="0" r="0" b="9525"/>
+            <wp:docPr id="283537996" name="Picture 1"/>
+            <wp:cNvGraphicFramePr>
+              <a:graphicFrameLocks xmlns:a="http://schemas.openxmlformats.org/drawingml/2006/main" noChangeAspect="1"/>
+            </wp:cNvGraphicFramePr>
+            <a:graphic xmlns:a="http://schemas.openxmlformats.org/drawingml/2006/main">
+              <a:graphicData uri="http://schemas.openxmlformats.org/drawingml/2006/picture">
+                <pic:pic xmlns:pic="http://schemas.openxmlformats.org/drawingml/2006/picture">
+                  <pic:nvPicPr>
+                    <pic:cNvPr id="283537996" name=""/>
+                    <pic:cNvPicPr/>
+                  </pic:nvPicPr>
+                  <pic:blipFill>
+                    <a:blip r:embed="rId45"/>
+                    <a:stretch>
+                      <a:fillRect/>
+                    </a:stretch>
+                  </pic:blipFill>
+                  <pic:spPr>
+                    <a:xfrm>
+                      <a:off x="0" y="0"/>
+                      <a:ext cx="5943600" cy="2390775"/>
+                    </a:xfrm>
+                    <a:prstGeom prst="rect">
+                      <a:avLst/>
+                    </a:prstGeom>
+                  </pic:spPr>
+                </pic:pic>
+              </a:graphicData>
+            </a:graphic>
+          </wp:inline>
+        </w:drawing>
+      </w:r>
+    </w:p>
+    <w:p>
+      <w:pPr>
+        <w:pStyle w:val="ListParagraph"/>
+        <w:numPr>
+          <w:ilvl w:val="1"/>
+          <w:numId w:val="4"/>
+        </w:numPr>
+      </w:pPr>
+      <w:r>
+        <w:lastRenderedPageBreak/>
+        <w:t>Lock a user: Once user is blocked due to usage violation the policy then this will be locked</w:t>
+      </w:r>
+    </w:p>
+    <w:p>
+      <w:r>
+        <w:drawing>
+          <wp:inline distT="0" distB="0" distL="0" distR="0" wp14:anchorId="29DDE5D2" wp14:editId="19F98E37">
+            <wp:extent cx="5943600" cy="2066290"/>
+            <wp:effectExtent l="0" t="0" r="0" b="0"/>
+            <wp:docPr id="231890784" name="Picture 1"/>
+            <wp:cNvGraphicFramePr>
+              <a:graphicFrameLocks xmlns:a="http://schemas.openxmlformats.org/drawingml/2006/main" noChangeAspect="1"/>
+            </wp:cNvGraphicFramePr>
+            <a:graphic xmlns:a="http://schemas.openxmlformats.org/drawingml/2006/main">
+              <a:graphicData uri="http://schemas.openxmlformats.org/drawingml/2006/picture">
+                <pic:pic xmlns:pic="http://schemas.openxmlformats.org/drawingml/2006/picture">
+                  <pic:nvPicPr>
+                    <pic:cNvPr id="231890784" name=""/>
+                    <pic:cNvPicPr/>
+                  </pic:nvPicPr>
+                  <pic:blipFill>
+                    <a:blip r:embed="rId46"/>
+                    <a:stretch>
+                      <a:fillRect/>
+                    </a:stretch>
+                  </pic:blipFill>
+                  <pic:spPr>
+                    <a:xfrm>
+                      <a:off x="0" y="0"/>
+                      <a:ext cx="5943600" cy="2066290"/>
+                    </a:xfrm>
+                    <a:prstGeom prst="rect">
+                      <a:avLst/>
+                    </a:prstGeom>
+                  </pic:spPr>
+                </pic:pic>
+              </a:graphicData>
+            </a:graphic>
+          </wp:inline>
+        </w:drawing>
+      </w:r>
+    </w:p>
+    <w:p>
+      <w:pPr>
+        <w:pStyle w:val="ListParagraph"/>
+        <w:numPr>
+          <w:ilvl w:val="0"/>
+          <w:numId w:val="4"/>
+        </w:numPr>
+      </w:pPr>
+      <w:proofErr w:type="spellStart"/>
+      <w:r>
+        <w:t>Tất</w:t>
+      </w:r>
+      <w:proofErr w:type="spellEnd"/>
+      <w:r>
+        <w:t xml:space="preserve"> </w:t>
+      </w:r>
+      <w:proofErr w:type="spellStart"/>
+      <w:r>
+        <w:t>cả</w:t>
+      </w:r>
+      <w:proofErr w:type="spellEnd"/>
+      <w:r>
+        <w:t xml:space="preserve"> </w:t>
+      </w:r>
+      <w:proofErr w:type="spellStart"/>
+      <w:r>
+        <w:t>sảm</w:t>
+      </w:r>
+      <w:proofErr w:type="spellEnd"/>
+      <w:r>
+        <w:t xml:space="preserve"> </w:t>
+      </w:r>
+      <w:proofErr w:type="spellStart"/>
+      <w:r>
+        <w:t>phẩm</w:t>
+      </w:r>
+      <w:proofErr w:type="spellEnd"/>
+      <w:r>
+        <w:t>: Show all available products from all sellers. This is also has the pagination and quick access to the product owner page (Seller page)</w:t>
+      </w:r>
+    </w:p>
+    <w:p>
+      <w:r>
+        <w:drawing>
+          <wp:inline distT="0" distB="0" distL="0" distR="0" wp14:anchorId="4C343A43" wp14:editId="160FDF73">
+            <wp:extent cx="5943600" cy="3835400"/>
+            <wp:effectExtent l="0" t="0" r="0" b="0"/>
+            <wp:docPr id="178576902" name="Picture 1"/>
+            <wp:cNvGraphicFramePr>
+              <a:graphicFrameLocks xmlns:a="http://schemas.openxmlformats.org/drawingml/2006/main" noChangeAspect="1"/>
+            </wp:cNvGraphicFramePr>
+            <a:graphic xmlns:a="http://schemas.openxmlformats.org/drawingml/2006/main">
+              <a:graphicData uri="http://schemas.openxmlformats.org/drawingml/2006/picture">
+                <pic:pic xmlns:pic="http://schemas.openxmlformats.org/drawingml/2006/picture">
+                  <pic:nvPicPr>
+                    <pic:cNvPr id="178576902" name=""/>
+                    <pic:cNvPicPr/>
+                  </pic:nvPicPr>
+                  <pic:blipFill>
+                    <a:blip r:embed="rId47"/>
+                    <a:stretch>
+                      <a:fillRect/>
+                    </a:stretch>
+                  </pic:blipFill>
+                  <pic:spPr>
+                    <a:xfrm>
+                      <a:off x="0" y="0"/>
+                      <a:ext cx="5943600" cy="3835400"/>
+                    </a:xfrm>
+                    <a:prstGeom prst="rect">
+                      <a:avLst/>
+                    </a:prstGeom>
+                  </pic:spPr>
+                </pic:pic>
+              </a:graphicData>
+            </a:graphic>
+          </wp:inline>
+        </w:drawing>
+      </w:r>
+    </w:p>
     <w:p/>
+    <w:p>
+      <w:pPr>
+        <w:pStyle w:val="ListParagraph"/>
+        <w:numPr>
+          <w:ilvl w:val="0"/>
+          <w:numId w:val="4"/>
+        </w:numPr>
+      </w:pPr>
+      <w:proofErr w:type="spellStart"/>
+      <w:r>
+        <w:t>Duyệt</w:t>
+      </w:r>
+      <w:proofErr w:type="spellEnd"/>
+      <w:r>
+        <w:t xml:space="preserve"> shop: All seller product should be waited until got approval by Admin page and then visibility to the user (publicity).</w:t>
+      </w:r>
+    </w:p>
+    <w:p>
+      <w:r>
+        <w:lastRenderedPageBreak/>
+        <w:drawing>
+          <wp:inline distT="0" distB="0" distL="0" distR="0" wp14:anchorId="31AA88AC" wp14:editId="7139B311">
+            <wp:extent cx="5943600" cy="2676525"/>
+            <wp:effectExtent l="0" t="0" r="0" b="9525"/>
+            <wp:docPr id="684488663" name="Picture 1"/>
+            <wp:cNvGraphicFramePr>
+              <a:graphicFrameLocks xmlns:a="http://schemas.openxmlformats.org/drawingml/2006/main" noChangeAspect="1"/>
+            </wp:cNvGraphicFramePr>
+            <a:graphic xmlns:a="http://schemas.openxmlformats.org/drawingml/2006/main">
+              <a:graphicData uri="http://schemas.openxmlformats.org/drawingml/2006/picture">
+                <pic:pic xmlns:pic="http://schemas.openxmlformats.org/drawingml/2006/picture">
+                  <pic:nvPicPr>
+                    <pic:cNvPr id="684488663" name=""/>
+                    <pic:cNvPicPr/>
+                  </pic:nvPicPr>
+                  <pic:blipFill>
+                    <a:blip r:embed="rId48"/>
+                    <a:stretch>
+                      <a:fillRect/>
+                    </a:stretch>
+                  </pic:blipFill>
+                  <pic:spPr>
+                    <a:xfrm>
+                      <a:off x="0" y="0"/>
+                      <a:ext cx="5943600" cy="2676525"/>
+                    </a:xfrm>
+                    <a:prstGeom prst="rect">
+                      <a:avLst/>
+                    </a:prstGeom>
+                  </pic:spPr>
+                </pic:pic>
+              </a:graphicData>
+            </a:graphic>
+          </wp:inline>
+        </w:drawing>
+      </w:r>
+    </w:p>
+    <w:p>
+      <w:pPr>
+        <w:pStyle w:val="ListParagraph"/>
+        <w:numPr>
+          <w:ilvl w:val="0"/>
+          <w:numId w:val="4"/>
+        </w:numPr>
+      </w:pPr>
+      <w:proofErr w:type="spellStart"/>
+      <w:r>
+        <w:t>Duyệt</w:t>
+      </w:r>
+      <w:proofErr w:type="spellEnd"/>
+      <w:r>
+        <w:t xml:space="preserve"> shop – </w:t>
+      </w:r>
+      <w:proofErr w:type="spellStart"/>
+      <w:r>
+        <w:t>Becom</w:t>
+      </w:r>
+      <w:proofErr w:type="spellEnd"/>
+      <w:r>
+        <w:t xml:space="preserve"> seller from user role</w:t>
+      </w:r>
+    </w:p>
+    <w:p>
+      <w:r>
+        <w:drawing>
+          <wp:inline distT="0" distB="0" distL="0" distR="0" wp14:anchorId="2A74FB5F" wp14:editId="03D13278">
+            <wp:extent cx="5943600" cy="2482215"/>
+            <wp:effectExtent l="0" t="0" r="0" b="0"/>
+            <wp:docPr id="237655160" name="Picture 1"/>
+            <wp:cNvGraphicFramePr>
+              <a:graphicFrameLocks xmlns:a="http://schemas.openxmlformats.org/drawingml/2006/main" noChangeAspect="1"/>
+            </wp:cNvGraphicFramePr>
+            <a:graphic xmlns:a="http://schemas.openxmlformats.org/drawingml/2006/main">
+              <a:graphicData uri="http://schemas.openxmlformats.org/drawingml/2006/picture">
+                <pic:pic xmlns:pic="http://schemas.openxmlformats.org/drawingml/2006/picture">
+                  <pic:nvPicPr>
+                    <pic:cNvPr id="237655160" name=""/>
+                    <pic:cNvPicPr/>
+                  </pic:nvPicPr>
+                  <pic:blipFill>
+                    <a:blip r:embed="rId49"/>
+                    <a:stretch>
+                      <a:fillRect/>
+                    </a:stretch>
+                  </pic:blipFill>
+                  <pic:spPr>
+                    <a:xfrm>
+                      <a:off x="0" y="0"/>
+                      <a:ext cx="5943600" cy="2482215"/>
+                    </a:xfrm>
+                    <a:prstGeom prst="rect">
+                      <a:avLst/>
+                    </a:prstGeom>
+                  </pic:spPr>
+                </pic:pic>
+              </a:graphicData>
+            </a:graphic>
+          </wp:inline>
+        </w:drawing>
+      </w:r>
+    </w:p>
+    <w:p>
+      <w:pPr>
+        <w:pStyle w:val="ListParagraph"/>
+        <w:numPr>
+          <w:ilvl w:val="0"/>
+          <w:numId w:val="4"/>
+        </w:numPr>
+      </w:pPr>
+      <w:r>
+        <w:t xml:space="preserve">Báo </w:t>
+      </w:r>
+      <w:proofErr w:type="spellStart"/>
+      <w:r>
+        <w:t>cáo</w:t>
+      </w:r>
+      <w:proofErr w:type="spellEnd"/>
+      <w:r>
+        <w:t xml:space="preserve"> vi </w:t>
+      </w:r>
+      <w:proofErr w:type="spellStart"/>
+      <w:r>
+        <w:t>phạm</w:t>
+      </w:r>
+      <w:proofErr w:type="spellEnd"/>
+    </w:p>
+    <w:p>
+      <w:r>
+        <w:lastRenderedPageBreak/>
+        <w:drawing>
+          <wp:inline distT="0" distB="0" distL="0" distR="0" wp14:anchorId="06A79DA9" wp14:editId="5420E114">
+            <wp:extent cx="5943600" cy="2229485"/>
+            <wp:effectExtent l="0" t="0" r="0" b="0"/>
+            <wp:docPr id="1301654719" name="Picture 1"/>
+            <wp:cNvGraphicFramePr>
+              <a:graphicFrameLocks xmlns:a="http://schemas.openxmlformats.org/drawingml/2006/main" noChangeAspect="1"/>
+            </wp:cNvGraphicFramePr>
+            <a:graphic xmlns:a="http://schemas.openxmlformats.org/drawingml/2006/main">
+              <a:graphicData uri="http://schemas.openxmlformats.org/drawingml/2006/picture">
+                <pic:pic xmlns:pic="http://schemas.openxmlformats.org/drawingml/2006/picture">
+                  <pic:nvPicPr>
+                    <pic:cNvPr id="1301654719" name=""/>
+                    <pic:cNvPicPr/>
+                  </pic:nvPicPr>
+                  <pic:blipFill>
+                    <a:blip r:embed="rId50"/>
+                    <a:stretch>
+                      <a:fillRect/>
+                    </a:stretch>
+                  </pic:blipFill>
+                  <pic:spPr>
+                    <a:xfrm>
+                      <a:off x="0" y="0"/>
+                      <a:ext cx="5943600" cy="2229485"/>
+                    </a:xfrm>
+                    <a:prstGeom prst="rect">
+                      <a:avLst/>
+                    </a:prstGeom>
+                  </pic:spPr>
+                </pic:pic>
+              </a:graphicData>
+            </a:graphic>
+          </wp:inline>
+        </w:drawing>
+      </w:r>
+    </w:p>
+    <w:p/>
+    <w:p>
+      <w:pPr>
+        <w:pStyle w:val="ListParagraph"/>
+        <w:numPr>
+          <w:ilvl w:val="0"/>
+          <w:numId w:val="4"/>
+        </w:numPr>
+      </w:pPr>
+      <w:r>
+        <w:t xml:space="preserve">Quản </w:t>
+      </w:r>
+      <w:proofErr w:type="spellStart"/>
+      <w:r>
+        <w:t>lý</w:t>
+      </w:r>
+      <w:proofErr w:type="spellEnd"/>
+      <w:r>
+        <w:t xml:space="preserve"> </w:t>
+      </w:r>
+      <w:proofErr w:type="spellStart"/>
+      <w:r>
+        <w:t>đánh</w:t>
+      </w:r>
+      <w:proofErr w:type="spellEnd"/>
+      <w:r>
+        <w:t xml:space="preserve"> </w:t>
+      </w:r>
+      <w:proofErr w:type="spellStart"/>
+      <w:r>
+        <w:t>giá</w:t>
+      </w:r>
+      <w:proofErr w:type="spellEnd"/>
+    </w:p>
+    <w:p>
+      <w:r>
+        <w:drawing>
+          <wp:inline distT="0" distB="0" distL="0" distR="0" wp14:anchorId="52688553" wp14:editId="3164E104">
+            <wp:extent cx="5943600" cy="3026410"/>
+            <wp:effectExtent l="0" t="0" r="0" b="2540"/>
+            <wp:docPr id="1795651073" name="Picture 1"/>
+            <wp:cNvGraphicFramePr>
+              <a:graphicFrameLocks xmlns:a="http://schemas.openxmlformats.org/drawingml/2006/main" noChangeAspect="1"/>
+            </wp:cNvGraphicFramePr>
+            <a:graphic xmlns:a="http://schemas.openxmlformats.org/drawingml/2006/main">
+              <a:graphicData uri="http://schemas.openxmlformats.org/drawingml/2006/picture">
+                <pic:pic xmlns:pic="http://schemas.openxmlformats.org/drawingml/2006/picture">
+                  <pic:nvPicPr>
+                    <pic:cNvPr id="1795651073" name=""/>
+                    <pic:cNvPicPr/>
+                  </pic:nvPicPr>
+                  <pic:blipFill>
+                    <a:blip r:embed="rId51"/>
+                    <a:stretch>
+                      <a:fillRect/>
+                    </a:stretch>
+                  </pic:blipFill>
+                  <pic:spPr>
+                    <a:xfrm>
+                      <a:off x="0" y="0"/>
+                      <a:ext cx="5943600" cy="3026410"/>
+                    </a:xfrm>
+                    <a:prstGeom prst="rect">
+                      <a:avLst/>
+                    </a:prstGeom>
+                  </pic:spPr>
+                </pic:pic>
+              </a:graphicData>
+            </a:graphic>
+          </wp:inline>
+        </w:drawing>
+      </w:r>
+    </w:p>
+    <w:p>
+      <w:pPr>
+        <w:pStyle w:val="ListParagraph"/>
+        <w:numPr>
+          <w:ilvl w:val="0"/>
+          <w:numId w:val="4"/>
+        </w:numPr>
+      </w:pPr>
+      <w:r>
+        <w:t xml:space="preserve">Quản </w:t>
+      </w:r>
+      <w:proofErr w:type="spellStart"/>
+      <w:r>
+        <w:t>lý</w:t>
+      </w:r>
+      <w:proofErr w:type="spellEnd"/>
+      <w:r>
+        <w:t xml:space="preserve"> </w:t>
+      </w:r>
+      <w:proofErr w:type="spellStart"/>
+      <w:r>
+        <w:t>nội</w:t>
+      </w:r>
+      <w:proofErr w:type="spellEnd"/>
+      <w:r>
+        <w:t xml:space="preserve"> dung</w:t>
+      </w:r>
+    </w:p>
+    <w:p>
+      <w:r>
+        <w:lastRenderedPageBreak/>
+        <w:drawing>
+          <wp:inline distT="0" distB="0" distL="0" distR="0" wp14:anchorId="4E82F915" wp14:editId="411F0EA8">
+            <wp:extent cx="5943600" cy="6017895"/>
+            <wp:effectExtent l="0" t="0" r="0" b="1905"/>
+            <wp:docPr id="909103197" name="Picture 1"/>
+            <wp:cNvGraphicFramePr>
+              <a:graphicFrameLocks xmlns:a="http://schemas.openxmlformats.org/drawingml/2006/main" noChangeAspect="1"/>
+            </wp:cNvGraphicFramePr>
+            <a:graphic xmlns:a="http://schemas.openxmlformats.org/drawingml/2006/main">
+              <a:graphicData uri="http://schemas.openxmlformats.org/drawingml/2006/picture">
+                <pic:pic xmlns:pic="http://schemas.openxmlformats.org/drawingml/2006/picture">
+                  <pic:nvPicPr>
+                    <pic:cNvPr id="909103197" name=""/>
+                    <pic:cNvPicPr/>
+                  </pic:nvPicPr>
+                  <pic:blipFill>
+                    <a:blip r:embed="rId52"/>
+                    <a:stretch>
+                      <a:fillRect/>
+                    </a:stretch>
+                  </pic:blipFill>
+                  <pic:spPr>
+                    <a:xfrm>
+                      <a:off x="0" y="0"/>
+                      <a:ext cx="5943600" cy="6017895"/>
+                    </a:xfrm>
+                    <a:prstGeom prst="rect">
+                      <a:avLst/>
+                    </a:prstGeom>
+                  </pic:spPr>
+                </pic:pic>
+              </a:graphicData>
+            </a:graphic>
+          </wp:inline>
+        </w:drawing>
+      </w:r>
+    </w:p>
+    <w:p/>
+    <w:p>
+      <w:pPr>
+        <w:pStyle w:val="ListParagraph"/>
+        <w:numPr>
+          <w:ilvl w:val="0"/>
+          <w:numId w:val="4"/>
+        </w:numPr>
+      </w:pPr>
+      <w:r>
+        <w:t xml:space="preserve">Danh </w:t>
+      </w:r>
+      <w:proofErr w:type="spellStart"/>
+      <w:r>
+        <w:t>mục</w:t>
+      </w:r>
+      <w:proofErr w:type="spellEnd"/>
+      <w:r>
+        <w:t xml:space="preserve"> </w:t>
+      </w:r>
+      <w:proofErr w:type="spellStart"/>
+      <w:r>
+        <w:t>báo</w:t>
+      </w:r>
+      <w:proofErr w:type="spellEnd"/>
+      <w:r>
+        <w:t xml:space="preserve"> </w:t>
+      </w:r>
+      <w:proofErr w:type="spellStart"/>
+      <w:r>
+        <w:t>cáo</w:t>
+      </w:r>
+      <w:proofErr w:type="spellEnd"/>
+      <w:r>
+        <w:t xml:space="preserve">: This helps the admin to configure the “ Danh </w:t>
+      </w:r>
+      <w:proofErr w:type="spellStart"/>
+      <w:r>
+        <w:t>Muc</w:t>
+      </w:r>
+      <w:proofErr w:type="spellEnd"/>
+      <w:r>
+        <w:t xml:space="preserve"> Bao Cáo” that help users have quick chose the category they want to report</w:t>
+      </w:r>
+    </w:p>
+    <w:p/>
+    <w:p>
+      <w:r>
+        <w:lastRenderedPageBreak/>
+        <w:drawing>
+          <wp:inline distT="0" distB="0" distL="0" distR="0" wp14:anchorId="26B2DBFF" wp14:editId="4AEFAE7E">
+            <wp:extent cx="5943600" cy="3349625"/>
+            <wp:effectExtent l="0" t="0" r="0" b="3175"/>
+            <wp:docPr id="1764659028" name="Picture 1"/>
+            <wp:cNvGraphicFramePr>
+              <a:graphicFrameLocks xmlns:a="http://schemas.openxmlformats.org/drawingml/2006/main" noChangeAspect="1"/>
+            </wp:cNvGraphicFramePr>
+            <a:graphic xmlns:a="http://schemas.openxmlformats.org/drawingml/2006/main">
+              <a:graphicData uri="http://schemas.openxmlformats.org/drawingml/2006/picture">
+                <pic:pic xmlns:pic="http://schemas.openxmlformats.org/drawingml/2006/picture">
+                  <pic:nvPicPr>
+                    <pic:cNvPr id="1764659028" name=""/>
+                    <pic:cNvPicPr/>
+                  </pic:nvPicPr>
+                  <pic:blipFill>
+                    <a:blip r:embed="rId53"/>
+                    <a:stretch>
+                      <a:fillRect/>
+                    </a:stretch>
+                  </pic:blipFill>
+                  <pic:spPr>
+                    <a:xfrm>
+                      <a:off x="0" y="0"/>
+                      <a:ext cx="5943600" cy="3349625"/>
+                    </a:xfrm>
+                    <a:prstGeom prst="rect">
+                      <a:avLst/>
+                    </a:prstGeom>
+                  </pic:spPr>
+                </pic:pic>
+              </a:graphicData>
+            </a:graphic>
+          </wp:inline>
+        </w:drawing>
+      </w:r>
+    </w:p>
+    <w:p/>
+    <w:p>
+      <w:pPr>
+        <w:pStyle w:val="ListParagraph"/>
+        <w:numPr>
+          <w:ilvl w:val="0"/>
+          <w:numId w:val="4"/>
+        </w:numPr>
+      </w:pPr>
+      <w:r>
+        <w:t xml:space="preserve">Nhật </w:t>
+      </w:r>
+      <w:proofErr w:type="spellStart"/>
+      <w:r>
+        <w:t>ký</w:t>
+      </w:r>
+      <w:proofErr w:type="spellEnd"/>
+      <w:r>
+        <w:t xml:space="preserve"> </w:t>
+      </w:r>
+      <w:proofErr w:type="spellStart"/>
+      <w:r>
+        <w:t>hệ</w:t>
+      </w:r>
+      <w:proofErr w:type="spellEnd"/>
+      <w:r>
+        <w:t xml:space="preserve"> </w:t>
+      </w:r>
+      <w:proofErr w:type="spellStart"/>
+      <w:r>
+        <w:t>thống</w:t>
+      </w:r>
+      <w:proofErr w:type="spellEnd"/>
+      <w:r>
+        <w:t>: This help admin to trach what activities were happened in the past</w:t>
+      </w:r>
+    </w:p>
+    <w:p>
+      <w:r>
+        <w:drawing>
+          <wp:inline distT="0" distB="0" distL="0" distR="0" wp14:anchorId="796C2284" wp14:editId="45906D03">
+            <wp:extent cx="5943600" cy="3743325"/>
+            <wp:effectExtent l="0" t="0" r="0" b="9525"/>
+            <wp:docPr id="137190554" name="Picture 1"/>
+            <wp:cNvGraphicFramePr>
+              <a:graphicFrameLocks xmlns:a="http://schemas.openxmlformats.org/drawingml/2006/main" noChangeAspect="1"/>
+            </wp:cNvGraphicFramePr>
+            <a:graphic xmlns:a="http://schemas.openxmlformats.org/drawingml/2006/main">
+              <a:graphicData uri="http://schemas.openxmlformats.org/drawingml/2006/picture">
+                <pic:pic xmlns:pic="http://schemas.openxmlformats.org/drawingml/2006/picture">
+                  <pic:nvPicPr>
+                    <pic:cNvPr id="137190554" name=""/>
+                    <pic:cNvPicPr/>
+                  </pic:nvPicPr>
+                  <pic:blipFill>
+                    <a:blip r:embed="rId54"/>
+                    <a:stretch>
+                      <a:fillRect/>
+                    </a:stretch>
+                  </pic:blipFill>
+                  <pic:spPr>
+                    <a:xfrm>
+                      <a:off x="0" y="0"/>
+                      <a:ext cx="5943600" cy="3743325"/>
+                    </a:xfrm>
+                    <a:prstGeom prst="rect">
+                      <a:avLst/>
+                    </a:prstGeom>
+                  </pic:spPr>
+                </pic:pic>
+              </a:graphicData>
+            </a:graphic>
+          </wp:inline>
+        </w:drawing>
+      </w:r>
+    </w:p>
     <w:p>
       <w:pPr>
         <w:pStyle w:val="ListParagraph"/>
@@ -3119,6 +4236,7 @@
         </w:numPr>
       </w:pPr>
       <w:r>
+        <w:lastRenderedPageBreak/>
         <w:t>Database:</w:t>
       </w:r>
     </w:p>
@@ -3321,7 +4439,6 @@
           </w:tcPr>
           <w:p>
             <w:r>
-              <w:lastRenderedPageBreak/>
               <w:t>3</w:t>
             </w:r>
           </w:p>
@@ -3770,13 +4887,8 @@
           </w:tcPr>
           <w:p>
             <w:proofErr w:type="spellStart"/>
-            <w:proofErr w:type="gramStart"/>
             <w:r>
-              <w:t>report</w:t>
-            </w:r>
-            <w:proofErr w:type="gramEnd"/>
-            <w:r>
-              <w:t>_reasons</w:t>
+              <w:t>report_reasons</w:t>
             </w:r>
             <w:proofErr w:type="spellEnd"/>
           </w:p>
@@ -3909,6 +5021,7 @@
           </w:tcPr>
           <w:p>
             <w:r>
+              <w:lastRenderedPageBreak/>
               <w:t>19</w:t>
             </w:r>
           </w:p>
@@ -4379,7 +5492,7 @@
         <w:rFonts w:ascii="Aptos" w:eastAsiaTheme="minorHAnsi" w:hAnsi="Aptos" w:cstheme="minorBidi" w:hint="default"/>
       </w:rPr>
     </w:lvl>
-    <w:lvl w:ilvl="1" w:tplc="04090003" w:tentative="1">
+    <w:lvl w:ilvl="1" w:tplc="04090003">
       <w:start w:val="1"/>
       <w:numFmt w:val="bullet"/>
       <w:lvlText w:val="o"/>
@@ -4391,7 +5504,7 @@
         <w:rFonts w:ascii="Courier New" w:hAnsi="Courier New" w:cs="Courier New" w:hint="default"/>
       </w:rPr>
     </w:lvl>
-    <w:lvl w:ilvl="2" w:tplc="04090005" w:tentative="1">
+    <w:lvl w:ilvl="2" w:tplc="04090005">
       <w:start w:val="1"/>
       <w:numFmt w:val="bullet"/>
       <w:lvlText w:val=""/>

</xml_diff>

<commit_message>
Update code to make the user view more details
</commit_message>
<xml_diff>
--- a/AiNetsoft Functions Description.docx
+++ b/AiNetsoft Functions Description.docx
@@ -3,13 +3,8 @@
 <w:document xmlns:wpc="http://schemas.microsoft.com/office/word/2010/wordprocessingCanvas" xmlns:cx="http://schemas.microsoft.com/office/drawing/2014/chartex" xmlns:cx1="http://schemas.microsoft.com/office/drawing/2015/9/8/chartex" xmlns:cx2="http://schemas.microsoft.com/office/drawing/2015/10/21/chartex" xmlns:cx3="http://schemas.microsoft.com/office/drawing/2016/5/9/chartex" xmlns:cx4="http://schemas.microsoft.com/office/drawing/2016/5/10/chartex" xmlns:cx5="http://schemas.microsoft.com/office/drawing/2016/5/11/chartex" xmlns:cx6="http://schemas.microsoft.com/office/drawing/2016/5/12/chartex" xmlns:cx7="http://schemas.microsoft.com/office/drawing/2016/5/13/chartex" xmlns:cx8="http://schemas.microsoft.com/office/drawing/2016/5/14/chartex" xmlns:mc="http://schemas.openxmlformats.org/markup-compatibility/2006" xmlns:aink="http://schemas.microsoft.com/office/drawing/2016/ink" xmlns:am3d="http://schemas.microsoft.com/office/drawing/2017/model3d" xmlns:o="urn:schemas-microsoft-com:office:office" xmlns:oel="http://schemas.microsoft.com/office/2019/extlst" xmlns:r="http://schemas.openxmlformats.org/officeDocument/2006/relationships" xmlns:m="http://schemas.openxmlformats.org/officeDocument/2006/math" xmlns:v="urn:schemas-microsoft-com:vml" xmlns:wp14="http://schemas.microsoft.com/office/word/2010/wordprocessingDrawing" xmlns:wp="http://schemas.openxmlformats.org/drawingml/2006/wordprocessingDrawing" xmlns:w10="urn:schemas-microsoft-com:office:word" xmlns:w="http://schemas.openxmlformats.org/wordprocessingml/2006/main" xmlns:w14="http://schemas.microsoft.com/office/word/2010/wordml" xmlns:w15="http://schemas.microsoft.com/office/word/2012/wordml" xmlns:w16cex="http://schemas.microsoft.com/office/word/2018/wordml/cex" xmlns:w16cid="http://schemas.microsoft.com/office/word/2016/wordml/cid" xmlns:w16="http://schemas.microsoft.com/office/word/2018/wordml" xmlns:w16du="http://schemas.microsoft.com/office/word/2023/wordml/word16du" xmlns:w16sdtdh="http://schemas.microsoft.com/office/word/2020/wordml/sdtdatahash" xmlns:w16sdtfl="http://schemas.microsoft.com/office/word/2024/wordml/sdtformatlock" xmlns:w16se="http://schemas.microsoft.com/office/word/2015/wordml/symex" xmlns:wpg="http://schemas.microsoft.com/office/word/2010/wordprocessingGroup" xmlns:wpi="http://schemas.microsoft.com/office/word/2010/wordprocessingInk" xmlns:wne="http://schemas.microsoft.com/office/word/2006/wordml" xmlns:wps="http://schemas.microsoft.com/office/word/2010/wordprocessingShape" mc:Ignorable="w14 w15 w16se w16cid w16 w16cex w16sdtdh w16sdtfl w16du wp14">
   <w:body>
     <w:p>
-      <w:proofErr w:type="spellStart"/>
-      <w:r>
-        <w:t>AiNetsoft</w:t>
-      </w:r>
-      <w:proofErr w:type="spellEnd"/>
-      <w:r>
-        <w:t xml:space="preserve"> Functions Description</w:t>
+      <w:r>
+        <w:t>AiNetsoft Functions Description</w:t>
       </w:r>
     </w:p>
     <w:p/>
@@ -106,15 +101,7 @@
         </w:numPr>
       </w:pPr>
       <w:r>
-        <w:t xml:space="preserve">Edit all needed fields as the “ Ho so ca </w:t>
-      </w:r>
-      <w:proofErr w:type="spellStart"/>
-      <w:r>
-        <w:t>nhan</w:t>
-      </w:r>
-      <w:proofErr w:type="spellEnd"/>
-      <w:r>
-        <w:t>”.  The scenario that Phone number can be sync from the Sell request data to this page, also same for email. Data is storing in the User collection</w:t>
+        <w:t>Edit all needed fields as the “ Ho so ca nhan”.  The scenario that Phone number can be sync from the Sell request data to this page, also same for email. Data is storing in the User collection</w:t>
       </w:r>
     </w:p>
     <w:p>
@@ -126,34 +113,10 @@
         </w:numPr>
       </w:pPr>
       <w:r>
-        <w:t xml:space="preserve">Tài </w:t>
-      </w:r>
-      <w:proofErr w:type="spellStart"/>
-      <w:r>
-        <w:t>khoản</w:t>
-      </w:r>
-      <w:proofErr w:type="spellEnd"/>
-      <w:r>
-        <w:t xml:space="preserve"> </w:t>
-      </w:r>
-      <w:proofErr w:type="spellStart"/>
-      <w:r>
-        <w:t>ngân</w:t>
-      </w:r>
-      <w:proofErr w:type="spellEnd"/>
-      <w:r>
-        <w:t xml:space="preserve"> hang is being s</w:t>
-      </w:r>
-      <w:r>
-        <w:t xml:space="preserve">tored in the </w:t>
-      </w:r>
-      <w:proofErr w:type="spellStart"/>
-      <w:r>
-        <w:t>bank_account</w:t>
-      </w:r>
-      <w:proofErr w:type="spellEnd"/>
-      <w:r>
-        <w:t xml:space="preserve"> collection. This also be sync when user request to become a Seller</w:t>
+        <w:t>Tài khoản ngân hang is being s</w:t>
+      </w:r>
+      <w:r>
+        <w:t>tored in the bank_account collection. This also be sync when user request to become a Seller</w:t>
       </w:r>
     </w:p>
     <w:p>
@@ -206,30 +169,9 @@
           <w:numId w:val="5"/>
         </w:numPr>
       </w:pPr>
-      <w:proofErr w:type="spellStart"/>
       <w:r>
         <w:lastRenderedPageBreak/>
-        <w:t>Địa</w:t>
-      </w:r>
-      <w:proofErr w:type="spellEnd"/>
-      <w:r>
-        <w:t xml:space="preserve"> </w:t>
-      </w:r>
-      <w:proofErr w:type="spellStart"/>
-      <w:r>
-        <w:t>chỉ</w:t>
-      </w:r>
-      <w:proofErr w:type="spellEnd"/>
-      <w:r>
-        <w:t xml:space="preserve"> </w:t>
-      </w:r>
-      <w:proofErr w:type="spellStart"/>
-      <w:r>
-        <w:t>nhận</w:t>
-      </w:r>
-      <w:proofErr w:type="spellEnd"/>
-      <w:r>
-        <w:t xml:space="preserve"> hang: Users can update data here. This is also synced to the Seller registry from if use request to become a Seller</w:t>
+        <w:t>Địa chỉ nhận hang: Users can update data here. This is also synced to the Seller registry from if use request to become a Seller</w:t>
       </w:r>
     </w:p>
     <w:p>
@@ -490,6 +432,9 @@
     </w:p>
     <w:p>
       <w:r>
+        <w:rPr>
+          <w:noProof/>
+        </w:rPr>
         <w:drawing>
           <wp:inline distT="0" distB="0" distL="0" distR="0" wp14:anchorId="6631F90C" wp14:editId="732DD3FB">
             <wp:extent cx="5943600" cy="1915795"/>
@@ -839,7 +784,13 @@
     <w:p/>
     <w:p>
       <w:r>
-        <w:t>Users will be denied moving to next steps if checking failed the result and ask the user has to verify and update the correct information</w:t>
+        <w:t xml:space="preserve">Users will be denied moving to next steps if checking failed the result and ask the user </w:t>
+      </w:r>
+      <w:r>
+        <w:t>must</w:t>
+      </w:r>
+      <w:r>
+        <w:t xml:space="preserve"> verify and update the correct information</w:t>
       </w:r>
     </w:p>
     <w:p>
@@ -1068,239 +1019,7 @@
         <w:tab/>
       </w:r>
       <w:r>
-        <w:t>"</w:t>
-      </w:r>
-      <w:proofErr w:type="spellStart"/>
-      <w:r>
-        <w:t>Hồ</w:t>
-      </w:r>
-      <w:proofErr w:type="spellEnd"/>
-      <w:r>
-        <w:t xml:space="preserve"> </w:t>
-      </w:r>
-      <w:proofErr w:type="spellStart"/>
-      <w:r>
-        <w:t>sơ</w:t>
-      </w:r>
-      <w:proofErr w:type="spellEnd"/>
-      <w:r>
-        <w:t xml:space="preserve"> </w:t>
-      </w:r>
-      <w:proofErr w:type="spellStart"/>
-      <w:r>
-        <w:t>đang</w:t>
-      </w:r>
-      <w:proofErr w:type="spellEnd"/>
-      <w:r>
-        <w:t xml:space="preserve"> </w:t>
-      </w:r>
-      <w:proofErr w:type="spellStart"/>
-      <w:r>
-        <w:t>chờ</w:t>
-      </w:r>
-      <w:proofErr w:type="spellEnd"/>
-      <w:r>
-        <w:t xml:space="preserve"> </w:t>
-      </w:r>
-      <w:proofErr w:type="spellStart"/>
-      <w:r>
-        <w:t>phê</w:t>
-      </w:r>
-      <w:proofErr w:type="spellEnd"/>
-      <w:r>
-        <w:t xml:space="preserve"> </w:t>
-      </w:r>
-      <w:proofErr w:type="spellStart"/>
-      <w:r>
-        <w:t>duyệtYêu</w:t>
-      </w:r>
-      <w:proofErr w:type="spellEnd"/>
-      <w:r>
-        <w:t xml:space="preserve"> </w:t>
-      </w:r>
-      <w:proofErr w:type="spellStart"/>
-      <w:r>
-        <w:t>cầu</w:t>
-      </w:r>
-      <w:proofErr w:type="spellEnd"/>
-      <w:r>
-        <w:t xml:space="preserve"> </w:t>
-      </w:r>
-      <w:proofErr w:type="spellStart"/>
-      <w:r>
-        <w:t>đăng</w:t>
-      </w:r>
-      <w:proofErr w:type="spellEnd"/>
-      <w:r>
-        <w:t xml:space="preserve"> </w:t>
-      </w:r>
-      <w:proofErr w:type="spellStart"/>
-      <w:r>
-        <w:t>ký</w:t>
-      </w:r>
-      <w:proofErr w:type="spellEnd"/>
-      <w:r>
-        <w:t xml:space="preserve"> </w:t>
-      </w:r>
-      <w:proofErr w:type="spellStart"/>
-      <w:r>
-        <w:t>Người</w:t>
-      </w:r>
-      <w:proofErr w:type="spellEnd"/>
-      <w:r>
-        <w:t xml:space="preserve"> </w:t>
-      </w:r>
-      <w:proofErr w:type="spellStart"/>
-      <w:r>
-        <w:t>bán</w:t>
-      </w:r>
-      <w:proofErr w:type="spellEnd"/>
-      <w:r>
-        <w:t xml:space="preserve"> </w:t>
-      </w:r>
-      <w:proofErr w:type="spellStart"/>
-      <w:r>
-        <w:t>của</w:t>
-      </w:r>
-      <w:proofErr w:type="spellEnd"/>
-      <w:r>
-        <w:t xml:space="preserve"> </w:t>
-      </w:r>
-      <w:proofErr w:type="spellStart"/>
-      <w:r>
-        <w:t>bạn</w:t>
-      </w:r>
-      <w:proofErr w:type="spellEnd"/>
-      <w:r>
-        <w:t xml:space="preserve"> </w:t>
-      </w:r>
-      <w:proofErr w:type="spellStart"/>
-      <w:r>
-        <w:t>đã</w:t>
-      </w:r>
-      <w:proofErr w:type="spellEnd"/>
-      <w:r>
-        <w:t xml:space="preserve"> </w:t>
-      </w:r>
-      <w:proofErr w:type="spellStart"/>
-      <w:r>
-        <w:t>được</w:t>
-      </w:r>
-      <w:proofErr w:type="spellEnd"/>
-      <w:r>
-        <w:t xml:space="preserve"> </w:t>
-      </w:r>
-      <w:proofErr w:type="spellStart"/>
-      <w:r>
-        <w:t>tiếp</w:t>
-      </w:r>
-      <w:proofErr w:type="spellEnd"/>
-      <w:r>
-        <w:t xml:space="preserve"> </w:t>
-      </w:r>
-      <w:proofErr w:type="spellStart"/>
-      <w:r>
-        <w:t>nhận</w:t>
-      </w:r>
-      <w:proofErr w:type="spellEnd"/>
-      <w:r>
-        <w:t xml:space="preserve">. </w:t>
-      </w:r>
-      <w:proofErr w:type="spellStart"/>
-      <w:r>
-        <w:t>Đội</w:t>
-      </w:r>
-      <w:proofErr w:type="spellEnd"/>
-      <w:r>
-        <w:t xml:space="preserve"> </w:t>
-      </w:r>
-      <w:proofErr w:type="spellStart"/>
-      <w:r>
-        <w:t>ngũ</w:t>
-      </w:r>
-      <w:proofErr w:type="spellEnd"/>
-      <w:r>
-        <w:t xml:space="preserve"> </w:t>
-      </w:r>
-      <w:proofErr w:type="spellStart"/>
-      <w:r>
-        <w:t>kiểm</w:t>
-      </w:r>
-      <w:proofErr w:type="spellEnd"/>
-      <w:r>
-        <w:t xml:space="preserve"> </w:t>
-      </w:r>
-      <w:proofErr w:type="spellStart"/>
-      <w:r>
-        <w:t>duyệt</w:t>
-      </w:r>
-      <w:proofErr w:type="spellEnd"/>
-      <w:r>
-        <w:t xml:space="preserve"> </w:t>
-      </w:r>
-      <w:proofErr w:type="spellStart"/>
-      <w:r>
-        <w:t>sẽ</w:t>
-      </w:r>
-      <w:proofErr w:type="spellEnd"/>
-      <w:r>
-        <w:t xml:space="preserve"> </w:t>
-      </w:r>
-      <w:proofErr w:type="spellStart"/>
-      <w:r>
-        <w:t>phản</w:t>
-      </w:r>
-      <w:proofErr w:type="spellEnd"/>
-      <w:r>
-        <w:t xml:space="preserve"> </w:t>
-      </w:r>
-      <w:proofErr w:type="spellStart"/>
-      <w:r>
-        <w:t>hồi</w:t>
-      </w:r>
-      <w:proofErr w:type="spellEnd"/>
-      <w:r>
-        <w:t xml:space="preserve"> </w:t>
-      </w:r>
-      <w:proofErr w:type="spellStart"/>
-      <w:r>
-        <w:t>trong</w:t>
-      </w:r>
-      <w:proofErr w:type="spellEnd"/>
-      <w:r>
-        <w:t xml:space="preserve"> </w:t>
-      </w:r>
-      <w:proofErr w:type="spellStart"/>
-      <w:r>
-        <w:t>vòng</w:t>
-      </w:r>
-      <w:proofErr w:type="spellEnd"/>
-      <w:r>
-        <w:t xml:space="preserve"> 24 </w:t>
-      </w:r>
-      <w:proofErr w:type="spellStart"/>
-      <w:r>
-        <w:t>giờ</w:t>
-      </w:r>
-      <w:proofErr w:type="spellEnd"/>
-      <w:r>
-        <w:t xml:space="preserve"> </w:t>
-      </w:r>
-      <w:proofErr w:type="spellStart"/>
-      <w:r>
-        <w:t>làm</w:t>
-      </w:r>
-      <w:proofErr w:type="spellEnd"/>
-      <w:r>
-        <w:t xml:space="preserve"> </w:t>
-      </w:r>
-      <w:proofErr w:type="spellStart"/>
-      <w:r>
-        <w:t>việc</w:t>
-      </w:r>
-      <w:proofErr w:type="spellEnd"/>
-      <w:r>
-        <w:t>."</w:t>
+        <w:t>"Hồ sơ đang chờ phê duyệtYêu cầu đăng ký Người bán của bạn đã được tiếp nhận. Đội ngũ kiểm duyệt sẽ phản hồi trong vòng 24 giờ làm việc."</w:t>
       </w:r>
     </w:p>
     <w:p>
@@ -1310,13 +1029,8 @@
       </w:r>
       <w:r>
         <w:tab/>
-        <w:t xml:space="preserve">An email to the requester to confirm admin received the request and will check and </w:t>
-      </w:r>
-      <w:proofErr w:type="spellStart"/>
-      <w:r>
-        <w:t>appove</w:t>
-      </w:r>
-      <w:proofErr w:type="spellEnd"/>
+        <w:t>An email to the requester to confirm admin received the request and will check and appove</w:t>
+      </w:r>
     </w:p>
     <w:p>
       <w:r>
@@ -1375,202 +1089,18 @@
         <w:t>progress</w:t>
       </w:r>
       <w:r>
-        <w:t xml:space="preserve"> of the status and a notification also appear "</w:t>
-      </w:r>
-      <w:proofErr w:type="spellStart"/>
-      <w:r>
-        <w:t>Đăng</w:t>
-      </w:r>
-      <w:proofErr w:type="spellEnd"/>
-      <w:r>
-        <w:t xml:space="preserve"> </w:t>
-      </w:r>
-      <w:proofErr w:type="spellStart"/>
-      <w:r>
-        <w:t>ký</w:t>
-      </w:r>
-      <w:proofErr w:type="spellEnd"/>
-      <w:r>
-        <w:t xml:space="preserve"> </w:t>
-      </w:r>
-      <w:proofErr w:type="spellStart"/>
-      <w:r>
-        <w:t>thành</w:t>
-      </w:r>
-      <w:proofErr w:type="spellEnd"/>
-      <w:r>
-        <w:t xml:space="preserve"> </w:t>
-      </w:r>
-      <w:proofErr w:type="spellStart"/>
-      <w:r>
-        <w:t>công</w:t>
-      </w:r>
-      <w:proofErr w:type="spellEnd"/>
-      <w:r>
-        <w:t>!</w:t>
-      </w:r>
-    </w:p>
-    <w:p>
-      <w:r>
-        <w:t xml:space="preserve">                </w:t>
-      </w:r>
-      <w:proofErr w:type="spellStart"/>
-      <w:r>
-        <w:t>Hồ</w:t>
-      </w:r>
-      <w:proofErr w:type="spellEnd"/>
-      <w:r>
-        <w:t xml:space="preserve"> </w:t>
-      </w:r>
-      <w:proofErr w:type="spellStart"/>
-      <w:r>
-        <w:t>sơ</w:t>
-      </w:r>
-      <w:proofErr w:type="spellEnd"/>
-      <w:r>
-        <w:t xml:space="preserve"> </w:t>
-      </w:r>
-      <w:proofErr w:type="spellStart"/>
-      <w:r>
-        <w:t>của</w:t>
-      </w:r>
-      <w:proofErr w:type="spellEnd"/>
-      <w:r>
-        <w:t xml:space="preserve"> </w:t>
-      </w:r>
-      <w:proofErr w:type="spellStart"/>
-      <w:r>
-        <w:t>bạn</w:t>
-      </w:r>
-      <w:proofErr w:type="spellEnd"/>
-      <w:r>
-        <w:t xml:space="preserve"> </w:t>
-      </w:r>
-      <w:proofErr w:type="spellStart"/>
-      <w:r>
-        <w:t>đã</w:t>
-      </w:r>
-      <w:proofErr w:type="spellEnd"/>
-      <w:r>
-        <w:t xml:space="preserve"> </w:t>
-      </w:r>
-      <w:proofErr w:type="spellStart"/>
-      <w:r>
-        <w:t>được</w:t>
-      </w:r>
-      <w:proofErr w:type="spellEnd"/>
-      <w:r>
-        <w:t xml:space="preserve"> </w:t>
-      </w:r>
-      <w:proofErr w:type="spellStart"/>
-      <w:r>
-        <w:t>gửi</w:t>
-      </w:r>
-      <w:proofErr w:type="spellEnd"/>
-      <w:r>
-        <w:t xml:space="preserve">. </w:t>
-      </w:r>
-      <w:proofErr w:type="spellStart"/>
-      <w:r>
-        <w:t>Chúng</w:t>
-      </w:r>
-      <w:proofErr w:type="spellEnd"/>
-      <w:r>
-        <w:t xml:space="preserve"> </w:t>
-      </w:r>
-      <w:proofErr w:type="spellStart"/>
-      <w:r>
-        <w:t>tôi</w:t>
-      </w:r>
-      <w:proofErr w:type="spellEnd"/>
-      <w:r>
-        <w:t xml:space="preserve"> </w:t>
-      </w:r>
-      <w:proofErr w:type="spellStart"/>
-      <w:r>
-        <w:t>đã</w:t>
-      </w:r>
-      <w:proofErr w:type="spellEnd"/>
-      <w:r>
-        <w:t xml:space="preserve"> </w:t>
-      </w:r>
-      <w:proofErr w:type="spellStart"/>
-      <w:r>
-        <w:t>gửi</w:t>
-      </w:r>
-      <w:proofErr w:type="spellEnd"/>
-      <w:r>
-        <w:t xml:space="preserve"> email </w:t>
-      </w:r>
-      <w:proofErr w:type="spellStart"/>
-      <w:r>
-        <w:t>xác</w:t>
-      </w:r>
-      <w:proofErr w:type="spellEnd"/>
-      <w:r>
-        <w:t xml:space="preserve"> </w:t>
-      </w:r>
-      <w:proofErr w:type="spellStart"/>
-      <w:r>
-        <w:t>nhận</w:t>
-      </w:r>
-      <w:proofErr w:type="spellEnd"/>
-      <w:r>
-        <w:t xml:space="preserve"> </w:t>
-      </w:r>
-      <w:proofErr w:type="spellStart"/>
-      <w:r>
-        <w:t>đến</w:t>
-      </w:r>
-      <w:proofErr w:type="spellEnd"/>
-      <w:r>
-        <w:t xml:space="preserve"> pending@ainetsoft.com.</w:t>
+        <w:t xml:space="preserve"> of the status and a notification also appear "Đăng ký thành công!</w:t>
+      </w:r>
+    </w:p>
+    <w:p>
+      <w:r>
+        <w:t xml:space="preserve">                Hồ sơ của bạn đã được gửi. Chúng tôi đã gửi email xác nhận đến pending@ainetsoft.com.</w:t>
       </w:r>
     </w:p>
     <w:p/>
     <w:p>
       <w:r>
-        <w:t xml:space="preserve">                Phản </w:t>
-      </w:r>
-      <w:proofErr w:type="spellStart"/>
-      <w:r>
-        <w:t>hồi</w:t>
-      </w:r>
-      <w:proofErr w:type="spellEnd"/>
-      <w:r>
-        <w:t xml:space="preserve"> </w:t>
-      </w:r>
-      <w:proofErr w:type="spellStart"/>
-      <w:r>
-        <w:t>chậm</w:t>
-      </w:r>
-      <w:proofErr w:type="spellEnd"/>
-      <w:r>
-        <w:t xml:space="preserve"> </w:t>
-      </w:r>
-      <w:proofErr w:type="spellStart"/>
-      <w:r>
-        <w:t>nhất</w:t>
-      </w:r>
-      <w:proofErr w:type="spellEnd"/>
-      <w:r>
-        <w:t xml:space="preserve"> </w:t>
-      </w:r>
-      <w:proofErr w:type="spellStart"/>
-      <w:r>
-        <w:t>trong</w:t>
-      </w:r>
-      <w:proofErr w:type="spellEnd"/>
-      <w:r>
-        <w:t xml:space="preserve"> </w:t>
-      </w:r>
-      <w:proofErr w:type="spellStart"/>
-      <w:r>
-        <w:t>vòng</w:t>
-      </w:r>
-      <w:proofErr w:type="spellEnd"/>
-      <w:r>
-        <w:t xml:space="preserve"> 24h"</w:t>
+        <w:t xml:space="preserve">                Phản hồi chậm nhất trong vòng 24h"</w:t>
       </w:r>
     </w:p>
     <w:p>
@@ -1604,531 +1134,33 @@
         <w:rPr>
           <w:color w:val="EE0000"/>
         </w:rPr>
-        <w:t xml:space="preserve"> "</w:t>
-      </w:r>
-      <w:proofErr w:type="spellStart"/>
-      <w:r>
+        <w:t xml:space="preserve"> "Hồ sơ bị từ chối</w:t>
+      </w:r>
+    </w:p>
+    <w:p>
+      <w:pPr>
         <w:rPr>
           <w:color w:val="EE0000"/>
         </w:rPr>
-        <w:t>Hồ</w:t>
-      </w:r>
-      <w:proofErr w:type="spellEnd"/>
+      </w:pPr>
       <w:r>
         <w:rPr>
           <w:color w:val="EE0000"/>
         </w:rPr>
-        <w:t xml:space="preserve"> </w:t>
-      </w:r>
-      <w:proofErr w:type="spellStart"/>
-      <w:r>
+        <w:t xml:space="preserve">                Lý do: Chụp lại ảnh CCCD.</w:t>
+      </w:r>
+    </w:p>
+    <w:p>
+      <w:pPr>
         <w:rPr>
           <w:color w:val="EE0000"/>
         </w:rPr>
-        <w:t>sơ</w:t>
-      </w:r>
-      <w:proofErr w:type="spellEnd"/>
+      </w:pPr>
       <w:r>
         <w:rPr>
           <w:color w:val="EE0000"/>
         </w:rPr>
-        <w:t xml:space="preserve"> </w:t>
-      </w:r>
-      <w:proofErr w:type="spellStart"/>
-      <w:r>
-        <w:rPr>
-          <w:color w:val="EE0000"/>
-        </w:rPr>
-        <w:t>bị</w:t>
-      </w:r>
-      <w:proofErr w:type="spellEnd"/>
-      <w:r>
-        <w:rPr>
-          <w:color w:val="EE0000"/>
-        </w:rPr>
-        <w:t xml:space="preserve"> </w:t>
-      </w:r>
-      <w:proofErr w:type="spellStart"/>
-      <w:r>
-        <w:rPr>
-          <w:color w:val="EE0000"/>
-        </w:rPr>
-        <w:t>từ</w:t>
-      </w:r>
-      <w:proofErr w:type="spellEnd"/>
-      <w:r>
-        <w:rPr>
-          <w:color w:val="EE0000"/>
-        </w:rPr>
-        <w:t xml:space="preserve"> </w:t>
-      </w:r>
-      <w:proofErr w:type="spellStart"/>
-      <w:r>
-        <w:rPr>
-          <w:color w:val="EE0000"/>
-        </w:rPr>
-        <w:t>chối</w:t>
-      </w:r>
-      <w:proofErr w:type="spellEnd"/>
-    </w:p>
-    <w:p>
-      <w:pPr>
-        <w:rPr>
-          <w:color w:val="EE0000"/>
-        </w:rPr>
-      </w:pPr>
-      <w:r>
-        <w:rPr>
-          <w:color w:val="EE0000"/>
-        </w:rPr>
-        <w:t xml:space="preserve">                Lý do: </w:t>
-      </w:r>
-      <w:proofErr w:type="spellStart"/>
-      <w:r>
-        <w:rPr>
-          <w:color w:val="EE0000"/>
-        </w:rPr>
-        <w:t>Chụp</w:t>
-      </w:r>
-      <w:proofErr w:type="spellEnd"/>
-      <w:r>
-        <w:rPr>
-          <w:color w:val="EE0000"/>
-        </w:rPr>
-        <w:t xml:space="preserve"> </w:t>
-      </w:r>
-      <w:proofErr w:type="spellStart"/>
-      <w:r>
-        <w:rPr>
-          <w:color w:val="EE0000"/>
-        </w:rPr>
-        <w:t>lại</w:t>
-      </w:r>
-      <w:proofErr w:type="spellEnd"/>
-      <w:r>
-        <w:rPr>
-          <w:color w:val="EE0000"/>
-        </w:rPr>
-        <w:t xml:space="preserve"> </w:t>
-      </w:r>
-      <w:proofErr w:type="spellStart"/>
-      <w:r>
-        <w:rPr>
-          <w:color w:val="EE0000"/>
-        </w:rPr>
-        <w:t>ảnh</w:t>
-      </w:r>
-      <w:proofErr w:type="spellEnd"/>
-      <w:r>
-        <w:rPr>
-          <w:color w:val="EE0000"/>
-        </w:rPr>
-        <w:t xml:space="preserve"> CCCD.</w:t>
-      </w:r>
-    </w:p>
-    <w:p>
-      <w:pPr>
-        <w:rPr>
-          <w:color w:val="EE0000"/>
-        </w:rPr>
-      </w:pPr>
-      <w:r>
-        <w:rPr>
-          <w:color w:val="EE0000"/>
-        </w:rPr>
-        <w:t xml:space="preserve">                </w:t>
-      </w:r>
-      <w:proofErr w:type="spellStart"/>
-      <w:r>
-        <w:rPr>
-          <w:color w:val="EE0000"/>
-        </w:rPr>
-        <w:t>Hệ</w:t>
-      </w:r>
-      <w:proofErr w:type="spellEnd"/>
-      <w:r>
-        <w:rPr>
-          <w:color w:val="EE0000"/>
-        </w:rPr>
-        <w:t xml:space="preserve"> </w:t>
-      </w:r>
-      <w:proofErr w:type="spellStart"/>
-      <w:r>
-        <w:rPr>
-          <w:color w:val="EE0000"/>
-        </w:rPr>
-        <w:t>thống</w:t>
-      </w:r>
-      <w:proofErr w:type="spellEnd"/>
-      <w:r>
-        <w:rPr>
-          <w:color w:val="EE0000"/>
-        </w:rPr>
-        <w:t xml:space="preserve"> </w:t>
-      </w:r>
-      <w:proofErr w:type="spellStart"/>
-      <w:r>
-        <w:rPr>
-          <w:color w:val="EE0000"/>
-        </w:rPr>
-        <w:t>không</w:t>
-      </w:r>
-      <w:proofErr w:type="spellEnd"/>
-      <w:r>
-        <w:rPr>
-          <w:color w:val="EE0000"/>
-        </w:rPr>
-        <w:t xml:space="preserve"> </w:t>
-      </w:r>
-      <w:proofErr w:type="spellStart"/>
-      <w:r>
-        <w:rPr>
-          <w:color w:val="EE0000"/>
-        </w:rPr>
-        <w:t>thể</w:t>
-      </w:r>
-      <w:proofErr w:type="spellEnd"/>
-      <w:r>
-        <w:rPr>
-          <w:color w:val="EE0000"/>
-        </w:rPr>
-        <w:t xml:space="preserve"> </w:t>
-      </w:r>
-      <w:proofErr w:type="spellStart"/>
-      <w:r>
-        <w:rPr>
-          <w:color w:val="EE0000"/>
-        </w:rPr>
-        <w:t>xác</w:t>
-      </w:r>
-      <w:proofErr w:type="spellEnd"/>
-      <w:r>
-        <w:rPr>
-          <w:color w:val="EE0000"/>
-        </w:rPr>
-        <w:t xml:space="preserve"> </w:t>
-      </w:r>
-      <w:proofErr w:type="spellStart"/>
-      <w:r>
-        <w:rPr>
-          <w:color w:val="EE0000"/>
-        </w:rPr>
-        <w:t>thực</w:t>
-      </w:r>
-      <w:proofErr w:type="spellEnd"/>
-      <w:r>
-        <w:rPr>
-          <w:color w:val="EE0000"/>
-        </w:rPr>
-        <w:t xml:space="preserve"> </w:t>
-      </w:r>
-      <w:proofErr w:type="spellStart"/>
-      <w:r>
-        <w:rPr>
-          <w:color w:val="EE0000"/>
-        </w:rPr>
-        <w:t>một</w:t>
-      </w:r>
-      <w:proofErr w:type="spellEnd"/>
-      <w:r>
-        <w:rPr>
-          <w:color w:val="EE0000"/>
-        </w:rPr>
-        <w:t xml:space="preserve"> </w:t>
-      </w:r>
-      <w:proofErr w:type="spellStart"/>
-      <w:r>
-        <w:rPr>
-          <w:color w:val="EE0000"/>
-        </w:rPr>
-        <w:t>số</w:t>
-      </w:r>
-      <w:proofErr w:type="spellEnd"/>
-      <w:r>
-        <w:rPr>
-          <w:color w:val="EE0000"/>
-        </w:rPr>
-        <w:t xml:space="preserve"> </w:t>
-      </w:r>
-      <w:proofErr w:type="spellStart"/>
-      <w:r>
-        <w:rPr>
-          <w:color w:val="EE0000"/>
-        </w:rPr>
-        <w:t>thông</w:t>
-      </w:r>
-      <w:proofErr w:type="spellEnd"/>
-      <w:r>
-        <w:rPr>
-          <w:color w:val="EE0000"/>
-        </w:rPr>
-        <w:t xml:space="preserve"> tin </w:t>
-      </w:r>
-      <w:proofErr w:type="spellStart"/>
-      <w:r>
-        <w:rPr>
-          <w:color w:val="EE0000"/>
-        </w:rPr>
-        <w:t>của</w:t>
-      </w:r>
-      <w:proofErr w:type="spellEnd"/>
-      <w:r>
-        <w:rPr>
-          <w:color w:val="EE0000"/>
-        </w:rPr>
-        <w:t xml:space="preserve"> </w:t>
-      </w:r>
-      <w:proofErr w:type="spellStart"/>
-      <w:r>
-        <w:rPr>
-          <w:color w:val="EE0000"/>
-        </w:rPr>
-        <w:t>bạn</w:t>
-      </w:r>
-      <w:proofErr w:type="spellEnd"/>
-      <w:r>
-        <w:rPr>
-          <w:color w:val="EE0000"/>
-        </w:rPr>
-        <w:t xml:space="preserve">. Vui </w:t>
-      </w:r>
-      <w:proofErr w:type="spellStart"/>
-      <w:r>
-        <w:rPr>
-          <w:color w:val="EE0000"/>
-        </w:rPr>
-        <w:t>lòng</w:t>
-      </w:r>
-      <w:proofErr w:type="spellEnd"/>
-      <w:r>
-        <w:rPr>
-          <w:color w:val="EE0000"/>
-        </w:rPr>
-        <w:t xml:space="preserve"> </w:t>
-      </w:r>
-      <w:proofErr w:type="spellStart"/>
-      <w:r>
-        <w:rPr>
-          <w:color w:val="EE0000"/>
-        </w:rPr>
-        <w:t>kiểm</w:t>
-      </w:r>
-      <w:proofErr w:type="spellEnd"/>
-      <w:r>
-        <w:rPr>
-          <w:color w:val="EE0000"/>
-        </w:rPr>
-        <w:t xml:space="preserve"> </w:t>
-      </w:r>
-      <w:proofErr w:type="spellStart"/>
-      <w:r>
-        <w:rPr>
-          <w:color w:val="EE0000"/>
-        </w:rPr>
-        <w:t>tra</w:t>
-      </w:r>
-      <w:proofErr w:type="spellEnd"/>
-      <w:r>
-        <w:rPr>
-          <w:color w:val="EE0000"/>
-        </w:rPr>
-        <w:t xml:space="preserve"> </w:t>
-      </w:r>
-      <w:proofErr w:type="spellStart"/>
-      <w:r>
-        <w:rPr>
-          <w:color w:val="EE0000"/>
-        </w:rPr>
-        <w:t>lại</w:t>
-      </w:r>
-      <w:proofErr w:type="spellEnd"/>
-      <w:r>
-        <w:rPr>
-          <w:color w:val="EE0000"/>
-        </w:rPr>
-        <w:t xml:space="preserve"> </w:t>
-      </w:r>
-      <w:proofErr w:type="spellStart"/>
-      <w:r>
-        <w:rPr>
-          <w:color w:val="EE0000"/>
-        </w:rPr>
-        <w:t>lý</w:t>
-      </w:r>
-      <w:proofErr w:type="spellEnd"/>
-      <w:r>
-        <w:rPr>
-          <w:color w:val="EE0000"/>
-        </w:rPr>
-        <w:t xml:space="preserve"> do </w:t>
-      </w:r>
-      <w:proofErr w:type="spellStart"/>
-      <w:r>
-        <w:rPr>
-          <w:color w:val="EE0000"/>
-        </w:rPr>
-        <w:t>trên</w:t>
-      </w:r>
-      <w:proofErr w:type="spellEnd"/>
-      <w:r>
-        <w:rPr>
-          <w:color w:val="EE0000"/>
-        </w:rPr>
-        <w:t xml:space="preserve"> </w:t>
-      </w:r>
-      <w:proofErr w:type="spellStart"/>
-      <w:r>
-        <w:rPr>
-          <w:color w:val="EE0000"/>
-        </w:rPr>
-        <w:t>và</w:t>
-      </w:r>
-      <w:proofErr w:type="spellEnd"/>
-      <w:r>
-        <w:rPr>
-          <w:color w:val="EE0000"/>
-        </w:rPr>
-        <w:t xml:space="preserve"> </w:t>
-      </w:r>
-      <w:proofErr w:type="spellStart"/>
-      <w:r>
-        <w:rPr>
-          <w:color w:val="EE0000"/>
-        </w:rPr>
-        <w:t>cập</w:t>
-      </w:r>
-      <w:proofErr w:type="spellEnd"/>
-      <w:r>
-        <w:rPr>
-          <w:color w:val="EE0000"/>
-        </w:rPr>
-        <w:t xml:space="preserve"> </w:t>
-      </w:r>
-      <w:proofErr w:type="spellStart"/>
-      <w:r>
-        <w:rPr>
-          <w:color w:val="EE0000"/>
-        </w:rPr>
-        <w:t>nhật</w:t>
-      </w:r>
-      <w:proofErr w:type="spellEnd"/>
-      <w:r>
-        <w:rPr>
-          <w:color w:val="EE0000"/>
-        </w:rPr>
-        <w:t xml:space="preserve"> </w:t>
-      </w:r>
-      <w:proofErr w:type="spellStart"/>
-      <w:r>
-        <w:rPr>
-          <w:color w:val="EE0000"/>
-        </w:rPr>
-        <w:t>hồ</w:t>
-      </w:r>
-      <w:proofErr w:type="spellEnd"/>
-      <w:r>
-        <w:rPr>
-          <w:color w:val="EE0000"/>
-        </w:rPr>
-        <w:t xml:space="preserve"> </w:t>
-      </w:r>
-      <w:proofErr w:type="spellStart"/>
-      <w:r>
-        <w:rPr>
-          <w:color w:val="EE0000"/>
-        </w:rPr>
-        <w:t>sơ</w:t>
-      </w:r>
-      <w:proofErr w:type="spellEnd"/>
-      <w:r>
-        <w:rPr>
-          <w:color w:val="EE0000"/>
-        </w:rPr>
-        <w:t xml:space="preserve"> </w:t>
-      </w:r>
-      <w:proofErr w:type="spellStart"/>
-      <w:r>
-        <w:rPr>
-          <w:color w:val="EE0000"/>
-        </w:rPr>
-        <w:t>chính</w:t>
-      </w:r>
-      <w:proofErr w:type="spellEnd"/>
-      <w:r>
-        <w:rPr>
-          <w:color w:val="EE0000"/>
-        </w:rPr>
-        <w:t xml:space="preserve"> </w:t>
-      </w:r>
-      <w:proofErr w:type="spellStart"/>
-      <w:r>
-        <w:rPr>
-          <w:color w:val="EE0000"/>
-        </w:rPr>
-        <w:t>xác</w:t>
-      </w:r>
-      <w:proofErr w:type="spellEnd"/>
-      <w:r>
-        <w:rPr>
-          <w:color w:val="EE0000"/>
-        </w:rPr>
-        <w:t xml:space="preserve"> </w:t>
-      </w:r>
-      <w:proofErr w:type="spellStart"/>
-      <w:r>
-        <w:rPr>
-          <w:color w:val="EE0000"/>
-        </w:rPr>
-        <w:t>trước</w:t>
-      </w:r>
-      <w:proofErr w:type="spellEnd"/>
-      <w:r>
-        <w:rPr>
-          <w:color w:val="EE0000"/>
-        </w:rPr>
-        <w:t xml:space="preserve"> </w:t>
-      </w:r>
-      <w:proofErr w:type="spellStart"/>
-      <w:r>
-        <w:rPr>
-          <w:color w:val="EE0000"/>
-        </w:rPr>
-        <w:t>khi</w:t>
-      </w:r>
-      <w:proofErr w:type="spellEnd"/>
-      <w:r>
-        <w:rPr>
-          <w:color w:val="EE0000"/>
-        </w:rPr>
-        <w:t xml:space="preserve"> </w:t>
-      </w:r>
-      <w:proofErr w:type="spellStart"/>
-      <w:r>
-        <w:rPr>
-          <w:color w:val="EE0000"/>
-        </w:rPr>
-        <w:t>gửi</w:t>
-      </w:r>
-      <w:proofErr w:type="spellEnd"/>
-      <w:r>
-        <w:rPr>
-          <w:color w:val="EE0000"/>
-        </w:rPr>
-        <w:t xml:space="preserve"> </w:t>
-      </w:r>
-      <w:proofErr w:type="spellStart"/>
-      <w:r>
-        <w:rPr>
-          <w:color w:val="EE0000"/>
-        </w:rPr>
-        <w:t>lại</w:t>
-      </w:r>
-      <w:proofErr w:type="spellEnd"/>
-      <w:r>
-        <w:rPr>
-          <w:color w:val="EE0000"/>
-        </w:rPr>
-        <w:t>."</w:t>
+        <w:t xml:space="preserve">                Hệ thống không thể xác thực một số thông tin của bạn. Vui lòng kiểm tra lại lý do trên và cập nhật hồ sơ chính xác trước khi gửi lại."</w:t>
       </w:r>
     </w:p>
     <w:p/>
@@ -2378,6 +1410,9 @@
     </w:p>
     <w:p>
       <w:r>
+        <w:rPr>
+          <w:noProof/>
+        </w:rPr>
         <w:drawing>
           <wp:inline distT="0" distB="0" distL="0" distR="0" wp14:anchorId="097D2016" wp14:editId="6862D062">
             <wp:extent cx="5943600" cy="2296160"/>
@@ -2473,31 +1508,7 @@
     <w:p/>
     <w:p>
       <w:r>
-        <w:t xml:space="preserve">Danh </w:t>
-      </w:r>
-      <w:proofErr w:type="spellStart"/>
-      <w:r>
-        <w:t>sách</w:t>
-      </w:r>
-      <w:proofErr w:type="spellEnd"/>
-      <w:r>
-        <w:t xml:space="preserve"> </w:t>
-      </w:r>
-      <w:proofErr w:type="spellStart"/>
-      <w:r>
-        <w:t>sản</w:t>
-      </w:r>
-      <w:proofErr w:type="spellEnd"/>
-      <w:r>
-        <w:t xml:space="preserve"> </w:t>
-      </w:r>
-      <w:proofErr w:type="spellStart"/>
-      <w:r>
-        <w:t>phẩm</w:t>
-      </w:r>
-      <w:proofErr w:type="spellEnd"/>
-      <w:r>
-        <w:t>:</w:t>
+        <w:t>Danh sách sản phẩm:</w:t>
       </w:r>
     </w:p>
     <w:p>
@@ -2545,23 +1556,7 @@
     <w:p/>
     <w:p>
       <w:r>
-        <w:t xml:space="preserve">Quản </w:t>
-      </w:r>
-      <w:proofErr w:type="spellStart"/>
-      <w:r>
-        <w:t>lý</w:t>
-      </w:r>
-      <w:proofErr w:type="spellEnd"/>
-      <w:r>
-        <w:t xml:space="preserve"> </w:t>
-      </w:r>
-      <w:proofErr w:type="spellStart"/>
-      <w:r>
-        <w:t>đơn</w:t>
-      </w:r>
-      <w:proofErr w:type="spellEnd"/>
-      <w:r>
-        <w:t xml:space="preserve"> hang</w:t>
+        <w:t>Quản lý đơn hang</w:t>
       </w:r>
     </w:p>
     <w:p/>
@@ -2610,21 +1605,8 @@
     </w:p>
     <w:p/>
     <w:p>
-      <w:proofErr w:type="spellStart"/>
-      <w:r>
-        <w:t>Thiết</w:t>
-      </w:r>
-      <w:proofErr w:type="spellEnd"/>
-      <w:r>
-        <w:t xml:space="preserve"> </w:t>
-      </w:r>
-      <w:proofErr w:type="spellStart"/>
-      <w:r>
-        <w:t>lập</w:t>
-      </w:r>
-      <w:proofErr w:type="spellEnd"/>
-      <w:r>
-        <w:t xml:space="preserve"> shop:</w:t>
+      <w:r>
+        <w:t>Thiết lập shop:</w:t>
       </w:r>
     </w:p>
     <w:p>
@@ -2679,19 +1661,14 @@
       </w:pPr>
       <w:r>
         <w:lastRenderedPageBreak/>
-        <w:t xml:space="preserve">Money withdraw request: Seller can ask </w:t>
-      </w:r>
-      <w:proofErr w:type="spellStart"/>
-      <w:r>
-        <w:t>ainetsoft</w:t>
-      </w:r>
-      <w:proofErr w:type="spellEnd"/>
-      <w:r>
-        <w:t xml:space="preserve"> for a payment withdraw with the details form as below</w:t>
-      </w:r>
-    </w:p>
-    <w:p>
-      <w:r>
+        <w:t>Money withdraw request: Seller can ask ainetsoft for a payment withdraw with the details form as below</w:t>
+      </w:r>
+    </w:p>
+    <w:p>
+      <w:r>
+        <w:rPr>
+          <w:noProof/>
+        </w:rPr>
         <w:drawing>
           <wp:inline distT="0" distB="0" distL="0" distR="0" wp14:anchorId="76C8B276" wp14:editId="4D0B7C7D">
             <wp:extent cx="5943600" cy="2672080"/>
@@ -2746,6 +1723,9 @@
     <w:p/>
     <w:p>
       <w:r>
+        <w:rPr>
+          <w:noProof/>
+        </w:rPr>
         <w:drawing>
           <wp:inline distT="0" distB="0" distL="0" distR="0" wp14:anchorId="0117AFB6" wp14:editId="6C0368B9">
             <wp:extent cx="5943600" cy="2085340"/>
@@ -2815,6 +1795,9 @@
     </w:p>
     <w:p>
       <w:r>
+        <w:rPr>
+          <w:noProof/>
+        </w:rPr>
         <w:lastRenderedPageBreak/>
         <w:drawing>
           <wp:inline distT="0" distB="0" distL="0" distR="0" wp14:anchorId="46AF4CCB" wp14:editId="19F19FB7">
@@ -2868,6 +1851,9 @@
     </w:p>
     <w:p>
       <w:r>
+        <w:rPr>
+          <w:noProof/>
+        </w:rPr>
         <w:drawing>
           <wp:inline distT="0" distB="0" distL="0" distR="0" wp14:anchorId="01D8CA9D" wp14:editId="6980E033">
             <wp:extent cx="5943600" cy="2715260"/>
@@ -2925,6 +1911,9 @@
         <w:ind w:left="720" w:hanging="720"/>
       </w:pPr>
       <w:r>
+        <w:rPr>
+          <w:noProof/>
+        </w:rPr>
         <w:lastRenderedPageBreak/>
         <w:drawing>
           <wp:inline distT="0" distB="0" distL="0" distR="0" wp14:anchorId="21DAC788" wp14:editId="66A947E7">
@@ -2976,6 +1965,9 @@
         <w:br/>
       </w:r>
       <w:r>
+        <w:rPr>
+          <w:noProof/>
+        </w:rPr>
         <w:drawing>
           <wp:inline distT="0" distB="0" distL="0" distR="0" wp14:anchorId="1952F657" wp14:editId="5BB49912">
             <wp:extent cx="5943600" cy="2368550"/>
@@ -3033,25 +2025,15 @@
           <w:numId w:val="4"/>
         </w:numPr>
       </w:pPr>
-      <w:proofErr w:type="spellStart"/>
-      <w:r>
-        <w:t>Tổng</w:t>
-      </w:r>
-      <w:proofErr w:type="spellEnd"/>
-      <w:r>
-        <w:t xml:space="preserve"> </w:t>
-      </w:r>
-      <w:proofErr w:type="spellStart"/>
-      <w:r>
-        <w:t>quan</w:t>
-      </w:r>
-      <w:proofErr w:type="spellEnd"/>
-      <w:r>
-        <w:t xml:space="preserve"> Admin page: This shows the summarization of all the important parts and will be details one Admin user click to it</w:t>
-      </w:r>
-    </w:p>
-    <w:p>
-      <w:r>
+      <w:r>
+        <w:t>Tổng quan Admin page: This shows the summarization of all the important parts and will be details one Admin user click to it</w:t>
+      </w:r>
+    </w:p>
+    <w:p>
+      <w:r>
+        <w:rPr>
+          <w:noProof/>
+        </w:rPr>
         <w:lastRenderedPageBreak/>
         <w:drawing>
           <wp:inline distT="0" distB="0" distL="0" distR="0" wp14:anchorId="57E58A03" wp14:editId="1993E0F0">
@@ -3098,21 +2080,8 @@
           <w:numId w:val="4"/>
         </w:numPr>
       </w:pPr>
-      <w:proofErr w:type="spellStart"/>
-      <w:r>
-        <w:t>Tổng</w:t>
-      </w:r>
-      <w:proofErr w:type="spellEnd"/>
-      <w:r>
-        <w:t xml:space="preserve"> </w:t>
-      </w:r>
-      <w:proofErr w:type="spellStart"/>
-      <w:r>
-        <w:t>người</w:t>
-      </w:r>
-      <w:proofErr w:type="spellEnd"/>
-      <w:r>
-        <w:t xml:space="preserve"> dung:</w:t>
+      <w:r>
+        <w:t>Tổng người dung:</w:t>
       </w:r>
     </w:p>
     <w:p>
@@ -3123,25 +2092,15 @@
           <w:numId w:val="4"/>
         </w:numPr>
       </w:pPr>
-      <w:proofErr w:type="spellStart"/>
-      <w:r>
-        <w:t>Sản</w:t>
-      </w:r>
-      <w:proofErr w:type="spellEnd"/>
-      <w:r>
-        <w:t xml:space="preserve"> </w:t>
-      </w:r>
-      <w:proofErr w:type="spellStart"/>
-      <w:r>
-        <w:t>phẩm</w:t>
-      </w:r>
-      <w:proofErr w:type="spellEnd"/>
-      <w:r>
-        <w:t>: Show all products which the system is having. There is a quick access to the Seller pages</w:t>
-      </w:r>
-    </w:p>
-    <w:p>
-      <w:r>
+      <w:r>
+        <w:t>Sản phẩm: Show all products which the system is having. There is a quick access to the Seller pages</w:t>
+      </w:r>
+    </w:p>
+    <w:p>
+      <w:r>
+        <w:rPr>
+          <w:noProof/>
+        </w:rPr>
         <w:lastRenderedPageBreak/>
         <w:drawing>
           <wp:inline distT="0" distB="0" distL="0" distR="0" wp14:anchorId="6B5994E1" wp14:editId="41E9937E">
@@ -3189,26 +2148,16 @@
           <w:numId w:val="4"/>
         </w:numPr>
       </w:pPr>
-      <w:proofErr w:type="spellStart"/>
-      <w:r>
-        <w:t>Chờ</w:t>
-      </w:r>
-      <w:proofErr w:type="spellEnd"/>
-      <w:r>
-        <w:t xml:space="preserve"> </w:t>
-      </w:r>
-      <w:proofErr w:type="spellStart"/>
-      <w:r>
-        <w:t>duyệt</w:t>
-      </w:r>
-      <w:proofErr w:type="spellEnd"/>
-      <w:r>
-        <w:t xml:space="preserve"> SP: This contains all pending shop product and being waiting the admin page to approve</w:t>
+      <w:r>
+        <w:t>Chờ duyệt SP: This contains all pending shop product and being waiting the admin page to approve</w:t>
       </w:r>
       <w:r>
         <w:br/>
       </w:r>
       <w:r>
+        <w:rPr>
+          <w:noProof/>
+        </w:rPr>
         <w:drawing>
           <wp:inline distT="0" distB="0" distL="0" distR="0" wp14:anchorId="3F7E3E9D" wp14:editId="1BE9BB0B">
             <wp:extent cx="5943600" cy="3333750"/>
@@ -3254,25 +2203,15 @@
           <w:numId w:val="4"/>
         </w:numPr>
       </w:pPr>
-      <w:proofErr w:type="spellStart"/>
-      <w:r>
-        <w:t>Chờ</w:t>
-      </w:r>
-      <w:proofErr w:type="spellEnd"/>
-      <w:r>
-        <w:t xml:space="preserve"> </w:t>
-      </w:r>
-      <w:proofErr w:type="spellStart"/>
-      <w:r>
-        <w:t>duyệt</w:t>
-      </w:r>
-      <w:proofErr w:type="spellEnd"/>
-      <w:r>
-        <w:t xml:space="preserve"> shop: This is the pending status of the users requesting for become the seller.</w:t>
-      </w:r>
-    </w:p>
-    <w:p>
-      <w:r>
+      <w:r>
+        <w:t>Chờ duyệt shop: This is the pending status of the users requesting for become the seller.</w:t>
+      </w:r>
+    </w:p>
+    <w:p>
+      <w:r>
+        <w:rPr>
+          <w:noProof/>
+        </w:rPr>
         <w:lastRenderedPageBreak/>
         <w:drawing>
           <wp:inline distT="0" distB="0" distL="0" distR="0" wp14:anchorId="028782AD" wp14:editId="7F040F09">
@@ -3320,23 +2259,7 @@
         </w:numPr>
       </w:pPr>
       <w:r>
-        <w:t>Details of “</w:t>
-      </w:r>
-      <w:proofErr w:type="spellStart"/>
-      <w:r>
-        <w:t>Người</w:t>
-      </w:r>
-      <w:proofErr w:type="spellEnd"/>
-      <w:r>
-        <w:t xml:space="preserve"> </w:t>
-      </w:r>
-      <w:proofErr w:type="spellStart"/>
-      <w:r>
-        <w:t>dùng</w:t>
-      </w:r>
-      <w:proofErr w:type="spellEnd"/>
-      <w:r>
-        <w:t xml:space="preserve">”: This shows very details of the user and many activities related to User management such as Lock, promote user to Admin, </w:t>
+        <w:t xml:space="preserve">Details of “Người dùng”: This shows very details of the user and many activities related to User management such as Lock, promote user to Admin, </w:t>
       </w:r>
       <w:r>
         <w:t>denote user seller back to normal users…</w:t>
@@ -3358,10 +2281,10 @@
       <w:r>
         <w:lastRenderedPageBreak/>
         <w:drawing>
-          <wp:inline distT="0" distB="0" distL="0" distR="0" wp14:anchorId="3C76F8B7" wp14:editId="547CC34D">
-            <wp:extent cx="5943600" cy="4124325"/>
-            <wp:effectExtent l="0" t="0" r="0" b="9525"/>
-            <wp:docPr id="1523749862" name="Picture 1"/>
+          <wp:inline distT="0" distB="0" distL="0" distR="0" wp14:anchorId="31B1EC6A" wp14:editId="3C5F71CF">
+            <wp:extent cx="5943600" cy="3806190"/>
+            <wp:effectExtent l="0" t="0" r="0" b="3810"/>
+            <wp:docPr id="1880009487" name="Picture 1"/>
             <wp:cNvGraphicFramePr>
               <a:graphicFrameLocks xmlns:a="http://schemas.openxmlformats.org/drawingml/2006/main" noChangeAspect="1"/>
             </wp:cNvGraphicFramePr>
@@ -3369,7 +2292,7 @@
               <a:graphicData uri="http://schemas.openxmlformats.org/drawingml/2006/picture">
                 <pic:pic xmlns:pic="http://schemas.openxmlformats.org/drawingml/2006/picture">
                   <pic:nvPicPr>
-                    <pic:cNvPr id="1523749862" name=""/>
+                    <pic:cNvPr id="1880009487" name=""/>
                     <pic:cNvPicPr/>
                   </pic:nvPicPr>
                   <pic:blipFill>
@@ -3381,7 +2304,7 @@
                   <pic:spPr>
                     <a:xfrm>
                       <a:off x="0" y="0"/>
-                      <a:ext cx="5943600" cy="4124325"/>
+                      <a:ext cx="5943600" cy="3806190"/>
                     </a:xfrm>
                     <a:prstGeom prst="rect">
                       <a:avLst/>
@@ -3411,14 +2334,18 @@
       <w:r>
         <w:t>View details:</w:t>
       </w:r>
-    </w:p>
-    <w:p>
-      <w:r>
+      <w:r>
+        <w:t xml:space="preserve"> Admin guy can see the details of the registered users here in this screen when he click to the “eyes” icon</w:t>
+      </w:r>
+    </w:p>
+    <w:p>
+      <w:r>
+        <w:lastRenderedPageBreak/>
         <w:drawing>
-          <wp:inline distT="0" distB="0" distL="0" distR="0" wp14:anchorId="63D45F45" wp14:editId="7399F20E">
-            <wp:extent cx="5943600" cy="2961005"/>
-            <wp:effectExtent l="0" t="0" r="0" b="0"/>
-            <wp:docPr id="646291551" name="Picture 1"/>
+          <wp:inline distT="0" distB="0" distL="0" distR="0" wp14:anchorId="7C0A5B7D" wp14:editId="1448692C">
+            <wp:extent cx="5943600" cy="4494530"/>
+            <wp:effectExtent l="0" t="0" r="0" b="1270"/>
+            <wp:docPr id="70567682" name="Picture 1"/>
             <wp:cNvGraphicFramePr>
               <a:graphicFrameLocks xmlns:a="http://schemas.openxmlformats.org/drawingml/2006/main" noChangeAspect="1"/>
             </wp:cNvGraphicFramePr>
@@ -3426,7 +2353,7 @@
               <a:graphicData uri="http://schemas.openxmlformats.org/drawingml/2006/picture">
                 <pic:pic xmlns:pic="http://schemas.openxmlformats.org/drawingml/2006/picture">
                   <pic:nvPicPr>
-                    <pic:cNvPr id="646291551" name=""/>
+                    <pic:cNvPr id="70567682" name=""/>
                     <pic:cNvPicPr/>
                   </pic:nvPicPr>
                   <pic:blipFill>
@@ -3438,7 +2365,7 @@
                   <pic:spPr>
                     <a:xfrm>
                       <a:off x="0" y="0"/>
-                      <a:ext cx="5943600" cy="2961005"/>
+                      <a:ext cx="5943600" cy="4494530"/>
                     </a:xfrm>
                     <a:prstGeom prst="rect">
                       <a:avLst/>
@@ -3460,12 +2387,14 @@
         </w:numPr>
       </w:pPr>
       <w:r>
-        <w:lastRenderedPageBreak/>
         <w:t>Upgrade to admin role</w:t>
       </w:r>
     </w:p>
     <w:p>
       <w:r>
+        <w:rPr>
+          <w:noProof/>
+        </w:rPr>
         <w:drawing>
           <wp:inline distT="0" distB="0" distL="0" distR="0" wp14:anchorId="500D681A" wp14:editId="5A3A4CAB">
             <wp:extent cx="5943600" cy="2051685"/>
@@ -3517,6 +2446,10 @@
     </w:p>
     <w:p>
       <w:r>
+        <w:rPr>
+          <w:noProof/>
+        </w:rPr>
+        <w:lastRenderedPageBreak/>
         <w:drawing>
           <wp:inline distT="0" distB="0" distL="0" distR="0" wp14:anchorId="121DE39E" wp14:editId="6A9E2E71">
             <wp:extent cx="5943600" cy="2179955"/>
@@ -3568,6 +2501,9 @@
     </w:p>
     <w:p>
       <w:r>
+        <w:rPr>
+          <w:noProof/>
+        </w:rPr>
         <w:drawing>
           <wp:inline distT="0" distB="0" distL="0" distR="0" wp14:anchorId="7AB1225A" wp14:editId="31569A10">
             <wp:extent cx="5943600" cy="2390775"/>
@@ -3614,12 +2550,14 @@
         </w:numPr>
       </w:pPr>
       <w:r>
-        <w:lastRenderedPageBreak/>
         <w:t>Lock a user: Once user is blocked due to usage violation the policy then this will be locked</w:t>
       </w:r>
     </w:p>
     <w:p>
       <w:r>
+        <w:rPr>
+          <w:noProof/>
+        </w:rPr>
         <w:drawing>
           <wp:inline distT="0" distB="0" distL="0" distR="0" wp14:anchorId="29DDE5D2" wp14:editId="19F98E37">
             <wp:extent cx="5943600" cy="2066290"/>
@@ -3665,41 +2603,16 @@
           <w:numId w:val="4"/>
         </w:numPr>
       </w:pPr>
-      <w:proofErr w:type="spellStart"/>
-      <w:r>
-        <w:t>Tất</w:t>
-      </w:r>
-      <w:proofErr w:type="spellEnd"/>
-      <w:r>
-        <w:t xml:space="preserve"> </w:t>
-      </w:r>
-      <w:proofErr w:type="spellStart"/>
-      <w:r>
-        <w:t>cả</w:t>
-      </w:r>
-      <w:proofErr w:type="spellEnd"/>
-      <w:r>
-        <w:t xml:space="preserve"> </w:t>
-      </w:r>
-      <w:proofErr w:type="spellStart"/>
-      <w:r>
-        <w:t>sảm</w:t>
-      </w:r>
-      <w:proofErr w:type="spellEnd"/>
-      <w:r>
-        <w:t xml:space="preserve"> </w:t>
-      </w:r>
-      <w:proofErr w:type="spellStart"/>
-      <w:r>
-        <w:t>phẩm</w:t>
-      </w:r>
-      <w:proofErr w:type="spellEnd"/>
-      <w:r>
-        <w:t>: Show all available products from all sellers. This is also has the pagination and quick access to the product owner page (Seller page)</w:t>
-      </w:r>
-    </w:p>
-    <w:p>
-      <w:r>
+      <w:r>
+        <w:lastRenderedPageBreak/>
+        <w:t>Tất cả sảm phẩm: Show all available products from all sellers. This is also has the pagination and quick access to the product owner page (Seller page)</w:t>
+      </w:r>
+    </w:p>
+    <w:p>
+      <w:r>
+        <w:rPr>
+          <w:noProof/>
+        </w:rPr>
         <w:drawing>
           <wp:inline distT="0" distB="0" distL="0" distR="0" wp14:anchorId="4C343A43" wp14:editId="160FDF73">
             <wp:extent cx="5943600" cy="3835400"/>
@@ -3746,18 +2659,15 @@
           <w:numId w:val="4"/>
         </w:numPr>
       </w:pPr>
-      <w:proofErr w:type="spellStart"/>
-      <w:r>
-        <w:t>Duyệt</w:t>
-      </w:r>
-      <w:proofErr w:type="spellEnd"/>
-      <w:r>
-        <w:t xml:space="preserve"> shop: All seller product should be waited until got approval by Admin page and then visibility to the user (publicity).</w:t>
-      </w:r>
-    </w:p>
-    <w:p>
-      <w:r>
-        <w:lastRenderedPageBreak/>
+      <w:r>
+        <w:t>Duyệt shop: All seller product should be waited until got approval by Admin page and then visibility to the user (publicity).</w:t>
+      </w:r>
+    </w:p>
+    <w:p>
+      <w:r>
+        <w:rPr>
+          <w:noProof/>
+        </w:rPr>
         <w:drawing>
           <wp:inline distT="0" distB="0" distL="0" distR="0" wp14:anchorId="31AA88AC" wp14:editId="7139B311">
             <wp:extent cx="5943600" cy="2676525"/>
@@ -3803,25 +2713,16 @@
           <w:numId w:val="4"/>
         </w:numPr>
       </w:pPr>
-      <w:proofErr w:type="spellStart"/>
-      <w:r>
-        <w:t>Duyệt</w:t>
-      </w:r>
-      <w:proofErr w:type="spellEnd"/>
-      <w:r>
-        <w:t xml:space="preserve"> shop – </w:t>
-      </w:r>
-      <w:proofErr w:type="spellStart"/>
-      <w:r>
-        <w:t>Becom</w:t>
-      </w:r>
-      <w:proofErr w:type="spellEnd"/>
-      <w:r>
-        <w:t xml:space="preserve"> seller from user role</w:t>
-      </w:r>
-    </w:p>
-    <w:p>
-      <w:r>
+      <w:r>
+        <w:lastRenderedPageBreak/>
+        <w:t>Duyệt shop – Becom seller from user role</w:t>
+      </w:r>
+    </w:p>
+    <w:p>
+      <w:r>
+        <w:rPr>
+          <w:noProof/>
+        </w:rPr>
         <w:drawing>
           <wp:inline distT="0" distB="0" distL="0" distR="0" wp14:anchorId="2A74FB5F" wp14:editId="03D13278">
             <wp:extent cx="5943600" cy="2482215"/>
@@ -3868,25 +2769,14 @@
         </w:numPr>
       </w:pPr>
       <w:r>
-        <w:t xml:space="preserve">Báo </w:t>
-      </w:r>
-      <w:proofErr w:type="spellStart"/>
-      <w:r>
-        <w:t>cáo</w:t>
-      </w:r>
-      <w:proofErr w:type="spellEnd"/>
-      <w:r>
-        <w:t xml:space="preserve"> vi </w:t>
-      </w:r>
-      <w:proofErr w:type="spellStart"/>
-      <w:r>
-        <w:t>phạm</w:t>
-      </w:r>
-      <w:proofErr w:type="spellEnd"/>
-    </w:p>
-    <w:p>
-      <w:r>
-        <w:lastRenderedPageBreak/>
+        <w:t>Báo cáo vi phạm</w:t>
+      </w:r>
+    </w:p>
+    <w:p>
+      <w:r>
+        <w:rPr>
+          <w:noProof/>
+        </w:rPr>
         <w:drawing>
           <wp:inline distT="0" distB="0" distL="0" distR="0" wp14:anchorId="06A79DA9" wp14:editId="5420E114">
             <wp:extent cx="5943600" cy="2229485"/>
@@ -3934,32 +2824,15 @@
         </w:numPr>
       </w:pPr>
       <w:r>
-        <w:t xml:space="preserve">Quản </w:t>
-      </w:r>
-      <w:proofErr w:type="spellStart"/>
-      <w:r>
-        <w:t>lý</w:t>
-      </w:r>
-      <w:proofErr w:type="spellEnd"/>
-      <w:r>
-        <w:t xml:space="preserve"> </w:t>
-      </w:r>
-      <w:proofErr w:type="spellStart"/>
-      <w:r>
-        <w:t>đánh</w:t>
-      </w:r>
-      <w:proofErr w:type="spellEnd"/>
-      <w:r>
-        <w:t xml:space="preserve"> </w:t>
-      </w:r>
-      <w:proofErr w:type="spellStart"/>
-      <w:r>
-        <w:t>giá</w:t>
-      </w:r>
-      <w:proofErr w:type="spellEnd"/>
-    </w:p>
-    <w:p>
-      <w:r>
+        <w:t>Quản lý đánh giá</w:t>
+      </w:r>
+    </w:p>
+    <w:p>
+      <w:r>
+        <w:rPr>
+          <w:noProof/>
+        </w:rPr>
+        <w:lastRenderedPageBreak/>
         <w:drawing>
           <wp:inline distT="0" distB="0" distL="0" distR="0" wp14:anchorId="52688553" wp14:editId="3164E104">
             <wp:extent cx="5943600" cy="3026410"/>
@@ -4006,27 +2879,14 @@
         </w:numPr>
       </w:pPr>
       <w:r>
-        <w:t xml:space="preserve">Quản </w:t>
-      </w:r>
-      <w:proofErr w:type="spellStart"/>
-      <w:r>
-        <w:t>lý</w:t>
-      </w:r>
-      <w:proofErr w:type="spellEnd"/>
-      <w:r>
-        <w:t xml:space="preserve"> </w:t>
-      </w:r>
-      <w:proofErr w:type="spellStart"/>
-      <w:r>
-        <w:t>nội</w:t>
-      </w:r>
-      <w:proofErr w:type="spellEnd"/>
-      <w:r>
-        <w:t xml:space="preserve"> dung</w:t>
-      </w:r>
-    </w:p>
-    <w:p>
-      <w:r>
+        <w:t>Quản lý nội dung</w:t>
+      </w:r>
+    </w:p>
+    <w:p>
+      <w:r>
+        <w:rPr>
+          <w:noProof/>
+        </w:rPr>
         <w:lastRenderedPageBreak/>
         <w:drawing>
           <wp:inline distT="0" distB="0" distL="0" distR="0" wp14:anchorId="4E82F915" wp14:editId="411F0EA8">
@@ -4075,44 +2935,15 @@
         </w:numPr>
       </w:pPr>
       <w:r>
-        <w:t xml:space="preserve">Danh </w:t>
-      </w:r>
-      <w:proofErr w:type="spellStart"/>
-      <w:r>
-        <w:t>mục</w:t>
-      </w:r>
-      <w:proofErr w:type="spellEnd"/>
-      <w:r>
-        <w:t xml:space="preserve"> </w:t>
-      </w:r>
-      <w:proofErr w:type="spellStart"/>
-      <w:r>
-        <w:t>báo</w:t>
-      </w:r>
-      <w:proofErr w:type="spellEnd"/>
-      <w:r>
-        <w:t xml:space="preserve"> </w:t>
-      </w:r>
-      <w:proofErr w:type="spellStart"/>
-      <w:r>
-        <w:t>cáo</w:t>
-      </w:r>
-      <w:proofErr w:type="spellEnd"/>
-      <w:r>
-        <w:t xml:space="preserve">: This helps the admin to configure the “ Danh </w:t>
-      </w:r>
-      <w:proofErr w:type="spellStart"/>
-      <w:r>
-        <w:t>Muc</w:t>
-      </w:r>
-      <w:proofErr w:type="spellEnd"/>
-      <w:r>
-        <w:t xml:space="preserve"> Bao Cáo” that help users have quick chose the category they want to report</w:t>
+        <w:t>Danh mục báo cáo: This helps the admin to configure the “ Danh Muc Bao Cáo” that help users have quick chose the category they want to report</w:t>
       </w:r>
     </w:p>
     <w:p/>
     <w:p>
       <w:r>
+        <w:rPr>
+          <w:noProof/>
+        </w:rPr>
         <w:lastRenderedPageBreak/>
         <w:drawing>
           <wp:inline distT="0" distB="0" distL="0" distR="0" wp14:anchorId="26B2DBFF" wp14:editId="4AEFAE7E">
@@ -4161,35 +2992,14 @@
         </w:numPr>
       </w:pPr>
       <w:r>
-        <w:t xml:space="preserve">Nhật </w:t>
-      </w:r>
-      <w:proofErr w:type="spellStart"/>
-      <w:r>
-        <w:t>ký</w:t>
-      </w:r>
-      <w:proofErr w:type="spellEnd"/>
-      <w:r>
-        <w:t xml:space="preserve"> </w:t>
-      </w:r>
-      <w:proofErr w:type="spellStart"/>
-      <w:r>
-        <w:t>hệ</w:t>
-      </w:r>
-      <w:proofErr w:type="spellEnd"/>
-      <w:r>
-        <w:t xml:space="preserve"> </w:t>
-      </w:r>
-      <w:proofErr w:type="spellStart"/>
-      <w:r>
-        <w:t>thống</w:t>
-      </w:r>
-      <w:proofErr w:type="spellEnd"/>
-      <w:r>
-        <w:t>: This help admin to trach what activities were happened in the past</w:t>
-      </w:r>
-    </w:p>
-    <w:p>
-      <w:r>
+        <w:t>Nhật ký hệ thống: This help admin to trach what activities were happened in the past</w:t>
+      </w:r>
+    </w:p>
+    <w:p>
+      <w:r>
+        <w:rPr>
+          <w:noProof/>
+        </w:rPr>
         <w:drawing>
           <wp:inline distT="0" distB="0" distL="0" distR="0" wp14:anchorId="796C2284" wp14:editId="45906D03">
             <wp:extent cx="5943600" cy="3743325"/>
@@ -4376,11 +3186,9 @@
             <w:hideMark/>
           </w:tcPr>
           <w:p>
-            <w:proofErr w:type="spellStart"/>
             <w:r>
               <w:t>audit_logs</w:t>
             </w:r>
-            <w:proofErr w:type="spellEnd"/>
           </w:p>
         </w:tc>
         <w:tc>
@@ -4413,11 +3221,9 @@
             <w:hideMark/>
           </w:tcPr>
           <w:p>
-            <w:proofErr w:type="spellStart"/>
             <w:r>
               <w:t>bank_accounts</w:t>
             </w:r>
-            <w:proofErr w:type="spellEnd"/>
           </w:p>
         </w:tc>
         <w:tc>
@@ -4485,11 +3291,9 @@
             <w:hideMark/>
           </w:tcPr>
           <w:p>
-            <w:proofErr w:type="spellStart"/>
             <w:r>
               <w:t>chat_messages</w:t>
             </w:r>
-            <w:proofErr w:type="spellEnd"/>
           </w:p>
         </w:tc>
         <w:tc>
@@ -4522,11 +3326,9 @@
             <w:hideMark/>
           </w:tcPr>
           <w:p>
-            <w:proofErr w:type="spellStart"/>
             <w:r>
               <w:t>content_nodes</w:t>
             </w:r>
-            <w:proofErr w:type="spellEnd"/>
           </w:p>
         </w:tc>
         <w:tc>
@@ -4559,11 +3361,9 @@
             <w:hideMark/>
           </w:tcPr>
           <w:p>
-            <w:proofErr w:type="spellStart"/>
             <w:r>
               <w:t>feedback_templates</w:t>
             </w:r>
-            <w:proofErr w:type="spellEnd"/>
           </w:p>
         </w:tc>
         <w:tc>
@@ -4596,11 +3396,9 @@
             <w:hideMark/>
           </w:tcPr>
           <w:p>
-            <w:proofErr w:type="spellStart"/>
             <w:r>
               <w:t>footer_icons</w:t>
             </w:r>
-            <w:proofErr w:type="spellEnd"/>
           </w:p>
         </w:tc>
         <w:tc>
@@ -4633,11 +3431,9 @@
             <w:hideMark/>
           </w:tcPr>
           <w:p>
-            <w:proofErr w:type="spellStart"/>
             <w:r>
               <w:t>footer_menus</w:t>
             </w:r>
-            <w:proofErr w:type="spellEnd"/>
           </w:p>
         </w:tc>
         <w:tc>
@@ -4670,11 +3466,9 @@
             <w:hideMark/>
           </w:tcPr>
           <w:p>
-            <w:proofErr w:type="spellStart"/>
             <w:r>
               <w:t>help_nodes</w:t>
             </w:r>
-            <w:proofErr w:type="spellEnd"/>
           </w:p>
         </w:tc>
         <w:tc>
@@ -4777,11 +3571,9 @@
             <w:hideMark/>
           </w:tcPr>
           <w:p>
-            <w:proofErr w:type="spellStart"/>
             <w:r>
               <w:t>password_reset_tokens</w:t>
             </w:r>
-            <w:proofErr w:type="spellEnd"/>
           </w:p>
         </w:tc>
         <w:tc>
@@ -4814,11 +3606,9 @@
             <w:hideMark/>
           </w:tcPr>
           <w:p>
-            <w:proofErr w:type="spellStart"/>
             <w:r>
               <w:t>product_reports</w:t>
             </w:r>
-            <w:proofErr w:type="spellEnd"/>
           </w:p>
         </w:tc>
         <w:tc>
@@ -4886,11 +3676,9 @@
             <w:hideMark/>
           </w:tcPr>
           <w:p>
-            <w:proofErr w:type="spellStart"/>
             <w:r>
               <w:t>report_reasons</w:t>
             </w:r>
-            <w:proofErr w:type="spellEnd"/>
           </w:p>
         </w:tc>
         <w:tc>
@@ -4958,11 +3746,9 @@
             <w:hideMark/>
           </w:tcPr>
           <w:p>
-            <w:proofErr w:type="spellStart"/>
             <w:r>
               <w:t>shipping_methods</w:t>
             </w:r>
-            <w:proofErr w:type="spellEnd"/>
           </w:p>
         </w:tc>
         <w:tc>
@@ -4995,11 +3781,9 @@
             <w:hideMark/>
           </w:tcPr>
           <w:p>
-            <w:proofErr w:type="spellStart"/>
             <w:r>
               <w:t>system_contents</w:t>
             </w:r>
-            <w:proofErr w:type="spellEnd"/>
           </w:p>
         </w:tc>
         <w:tc>
@@ -5069,11 +3853,9 @@
             <w:vAlign w:val="center"/>
           </w:tcPr>
           <w:p>
-            <w:proofErr w:type="spellStart"/>
             <w:r>
               <w:t>withdrawal_requests</w:t>
             </w:r>
-            <w:proofErr w:type="spellEnd"/>
           </w:p>
         </w:tc>
         <w:tc>

</xml_diff>

<commit_message>
Update code to make the user view more details (#21)
Co-authored-by: Thanh Nguyen <toni@Vietnam-4228.localdomain>
</commit_message>
<xml_diff>
--- a/AiNetsoft Functions Description.docx
+++ b/AiNetsoft Functions Description.docx
@@ -3,13 +3,8 @@
 <w:document xmlns:wpc="http://schemas.microsoft.com/office/word/2010/wordprocessingCanvas" xmlns:cx="http://schemas.microsoft.com/office/drawing/2014/chartex" xmlns:cx1="http://schemas.microsoft.com/office/drawing/2015/9/8/chartex" xmlns:cx2="http://schemas.microsoft.com/office/drawing/2015/10/21/chartex" xmlns:cx3="http://schemas.microsoft.com/office/drawing/2016/5/9/chartex" xmlns:cx4="http://schemas.microsoft.com/office/drawing/2016/5/10/chartex" xmlns:cx5="http://schemas.microsoft.com/office/drawing/2016/5/11/chartex" xmlns:cx6="http://schemas.microsoft.com/office/drawing/2016/5/12/chartex" xmlns:cx7="http://schemas.microsoft.com/office/drawing/2016/5/13/chartex" xmlns:cx8="http://schemas.microsoft.com/office/drawing/2016/5/14/chartex" xmlns:mc="http://schemas.openxmlformats.org/markup-compatibility/2006" xmlns:aink="http://schemas.microsoft.com/office/drawing/2016/ink" xmlns:am3d="http://schemas.microsoft.com/office/drawing/2017/model3d" xmlns:o="urn:schemas-microsoft-com:office:office" xmlns:oel="http://schemas.microsoft.com/office/2019/extlst" xmlns:r="http://schemas.openxmlformats.org/officeDocument/2006/relationships" xmlns:m="http://schemas.openxmlformats.org/officeDocument/2006/math" xmlns:v="urn:schemas-microsoft-com:vml" xmlns:wp14="http://schemas.microsoft.com/office/word/2010/wordprocessingDrawing" xmlns:wp="http://schemas.openxmlformats.org/drawingml/2006/wordprocessingDrawing" xmlns:w10="urn:schemas-microsoft-com:office:word" xmlns:w="http://schemas.openxmlformats.org/wordprocessingml/2006/main" xmlns:w14="http://schemas.microsoft.com/office/word/2010/wordml" xmlns:w15="http://schemas.microsoft.com/office/word/2012/wordml" xmlns:w16cex="http://schemas.microsoft.com/office/word/2018/wordml/cex" xmlns:w16cid="http://schemas.microsoft.com/office/word/2016/wordml/cid" xmlns:w16="http://schemas.microsoft.com/office/word/2018/wordml" xmlns:w16du="http://schemas.microsoft.com/office/word/2023/wordml/word16du" xmlns:w16sdtdh="http://schemas.microsoft.com/office/word/2020/wordml/sdtdatahash" xmlns:w16sdtfl="http://schemas.microsoft.com/office/word/2024/wordml/sdtformatlock" xmlns:w16se="http://schemas.microsoft.com/office/word/2015/wordml/symex" xmlns:wpg="http://schemas.microsoft.com/office/word/2010/wordprocessingGroup" xmlns:wpi="http://schemas.microsoft.com/office/word/2010/wordprocessingInk" xmlns:wne="http://schemas.microsoft.com/office/word/2006/wordml" xmlns:wps="http://schemas.microsoft.com/office/word/2010/wordprocessingShape" mc:Ignorable="w14 w15 w16se w16cid w16 w16cex w16sdtdh w16sdtfl w16du wp14">
   <w:body>
     <w:p>
-      <w:proofErr w:type="spellStart"/>
-      <w:r>
-        <w:t>AiNetsoft</w:t>
-      </w:r>
-      <w:proofErr w:type="spellEnd"/>
-      <w:r>
-        <w:t xml:space="preserve"> Functions Description</w:t>
+      <w:r>
+        <w:t>AiNetsoft Functions Description</w:t>
       </w:r>
     </w:p>
     <w:p/>
@@ -106,15 +101,7 @@
         </w:numPr>
       </w:pPr>
       <w:r>
-        <w:t xml:space="preserve">Edit all needed fields as the “ Ho so ca </w:t>
-      </w:r>
-      <w:proofErr w:type="spellStart"/>
-      <w:r>
-        <w:t>nhan</w:t>
-      </w:r>
-      <w:proofErr w:type="spellEnd"/>
-      <w:r>
-        <w:t>”.  The scenario that Phone number can be sync from the Sell request data to this page, also same for email. Data is storing in the User collection</w:t>
+        <w:t>Edit all needed fields as the “ Ho so ca nhan”.  The scenario that Phone number can be sync from the Sell request data to this page, also same for email. Data is storing in the User collection</w:t>
       </w:r>
     </w:p>
     <w:p>
@@ -126,34 +113,10 @@
         </w:numPr>
       </w:pPr>
       <w:r>
-        <w:t xml:space="preserve">Tài </w:t>
-      </w:r>
-      <w:proofErr w:type="spellStart"/>
-      <w:r>
-        <w:t>khoản</w:t>
-      </w:r>
-      <w:proofErr w:type="spellEnd"/>
-      <w:r>
-        <w:t xml:space="preserve"> </w:t>
-      </w:r>
-      <w:proofErr w:type="spellStart"/>
-      <w:r>
-        <w:t>ngân</w:t>
-      </w:r>
-      <w:proofErr w:type="spellEnd"/>
-      <w:r>
-        <w:t xml:space="preserve"> hang is being s</w:t>
-      </w:r>
-      <w:r>
-        <w:t xml:space="preserve">tored in the </w:t>
-      </w:r>
-      <w:proofErr w:type="spellStart"/>
-      <w:r>
-        <w:t>bank_account</w:t>
-      </w:r>
-      <w:proofErr w:type="spellEnd"/>
-      <w:r>
-        <w:t xml:space="preserve"> collection. This also be sync when user request to become a Seller</w:t>
+        <w:t>Tài khoản ngân hang is being s</w:t>
+      </w:r>
+      <w:r>
+        <w:t>tored in the bank_account collection. This also be sync when user request to become a Seller</w:t>
       </w:r>
     </w:p>
     <w:p>
@@ -206,30 +169,9 @@
           <w:numId w:val="5"/>
         </w:numPr>
       </w:pPr>
-      <w:proofErr w:type="spellStart"/>
       <w:r>
         <w:lastRenderedPageBreak/>
-        <w:t>Địa</w:t>
-      </w:r>
-      <w:proofErr w:type="spellEnd"/>
-      <w:r>
-        <w:t xml:space="preserve"> </w:t>
-      </w:r>
-      <w:proofErr w:type="spellStart"/>
-      <w:r>
-        <w:t>chỉ</w:t>
-      </w:r>
-      <w:proofErr w:type="spellEnd"/>
-      <w:r>
-        <w:t xml:space="preserve"> </w:t>
-      </w:r>
-      <w:proofErr w:type="spellStart"/>
-      <w:r>
-        <w:t>nhận</w:t>
-      </w:r>
-      <w:proofErr w:type="spellEnd"/>
-      <w:r>
-        <w:t xml:space="preserve"> hang: Users can update data here. This is also synced to the Seller registry from if use request to become a Seller</w:t>
+        <w:t>Địa chỉ nhận hang: Users can update data here. This is also synced to the Seller registry from if use request to become a Seller</w:t>
       </w:r>
     </w:p>
     <w:p>
@@ -490,6 +432,9 @@
     </w:p>
     <w:p>
       <w:r>
+        <w:rPr>
+          <w:noProof/>
+        </w:rPr>
         <w:drawing>
           <wp:inline distT="0" distB="0" distL="0" distR="0" wp14:anchorId="6631F90C" wp14:editId="732DD3FB">
             <wp:extent cx="5943600" cy="1915795"/>
@@ -839,7 +784,13 @@
     <w:p/>
     <w:p>
       <w:r>
-        <w:t>Users will be denied moving to next steps if checking failed the result and ask the user has to verify and update the correct information</w:t>
+        <w:t xml:space="preserve">Users will be denied moving to next steps if checking failed the result and ask the user </w:t>
+      </w:r>
+      <w:r>
+        <w:t>must</w:t>
+      </w:r>
+      <w:r>
+        <w:t xml:space="preserve"> verify and update the correct information</w:t>
       </w:r>
     </w:p>
     <w:p>
@@ -1068,239 +1019,7 @@
         <w:tab/>
       </w:r>
       <w:r>
-        <w:t>"</w:t>
-      </w:r>
-      <w:proofErr w:type="spellStart"/>
-      <w:r>
-        <w:t>Hồ</w:t>
-      </w:r>
-      <w:proofErr w:type="spellEnd"/>
-      <w:r>
-        <w:t xml:space="preserve"> </w:t>
-      </w:r>
-      <w:proofErr w:type="spellStart"/>
-      <w:r>
-        <w:t>sơ</w:t>
-      </w:r>
-      <w:proofErr w:type="spellEnd"/>
-      <w:r>
-        <w:t xml:space="preserve"> </w:t>
-      </w:r>
-      <w:proofErr w:type="spellStart"/>
-      <w:r>
-        <w:t>đang</w:t>
-      </w:r>
-      <w:proofErr w:type="spellEnd"/>
-      <w:r>
-        <w:t xml:space="preserve"> </w:t>
-      </w:r>
-      <w:proofErr w:type="spellStart"/>
-      <w:r>
-        <w:t>chờ</w:t>
-      </w:r>
-      <w:proofErr w:type="spellEnd"/>
-      <w:r>
-        <w:t xml:space="preserve"> </w:t>
-      </w:r>
-      <w:proofErr w:type="spellStart"/>
-      <w:r>
-        <w:t>phê</w:t>
-      </w:r>
-      <w:proofErr w:type="spellEnd"/>
-      <w:r>
-        <w:t xml:space="preserve"> </w:t>
-      </w:r>
-      <w:proofErr w:type="spellStart"/>
-      <w:r>
-        <w:t>duyệtYêu</w:t>
-      </w:r>
-      <w:proofErr w:type="spellEnd"/>
-      <w:r>
-        <w:t xml:space="preserve"> </w:t>
-      </w:r>
-      <w:proofErr w:type="spellStart"/>
-      <w:r>
-        <w:t>cầu</w:t>
-      </w:r>
-      <w:proofErr w:type="spellEnd"/>
-      <w:r>
-        <w:t xml:space="preserve"> </w:t>
-      </w:r>
-      <w:proofErr w:type="spellStart"/>
-      <w:r>
-        <w:t>đăng</w:t>
-      </w:r>
-      <w:proofErr w:type="spellEnd"/>
-      <w:r>
-        <w:t xml:space="preserve"> </w:t>
-      </w:r>
-      <w:proofErr w:type="spellStart"/>
-      <w:r>
-        <w:t>ký</w:t>
-      </w:r>
-      <w:proofErr w:type="spellEnd"/>
-      <w:r>
-        <w:t xml:space="preserve"> </w:t>
-      </w:r>
-      <w:proofErr w:type="spellStart"/>
-      <w:r>
-        <w:t>Người</w:t>
-      </w:r>
-      <w:proofErr w:type="spellEnd"/>
-      <w:r>
-        <w:t xml:space="preserve"> </w:t>
-      </w:r>
-      <w:proofErr w:type="spellStart"/>
-      <w:r>
-        <w:t>bán</w:t>
-      </w:r>
-      <w:proofErr w:type="spellEnd"/>
-      <w:r>
-        <w:t xml:space="preserve"> </w:t>
-      </w:r>
-      <w:proofErr w:type="spellStart"/>
-      <w:r>
-        <w:t>của</w:t>
-      </w:r>
-      <w:proofErr w:type="spellEnd"/>
-      <w:r>
-        <w:t xml:space="preserve"> </w:t>
-      </w:r>
-      <w:proofErr w:type="spellStart"/>
-      <w:r>
-        <w:t>bạn</w:t>
-      </w:r>
-      <w:proofErr w:type="spellEnd"/>
-      <w:r>
-        <w:t xml:space="preserve"> </w:t>
-      </w:r>
-      <w:proofErr w:type="spellStart"/>
-      <w:r>
-        <w:t>đã</w:t>
-      </w:r>
-      <w:proofErr w:type="spellEnd"/>
-      <w:r>
-        <w:t xml:space="preserve"> </w:t>
-      </w:r>
-      <w:proofErr w:type="spellStart"/>
-      <w:r>
-        <w:t>được</w:t>
-      </w:r>
-      <w:proofErr w:type="spellEnd"/>
-      <w:r>
-        <w:t xml:space="preserve"> </w:t>
-      </w:r>
-      <w:proofErr w:type="spellStart"/>
-      <w:r>
-        <w:t>tiếp</w:t>
-      </w:r>
-      <w:proofErr w:type="spellEnd"/>
-      <w:r>
-        <w:t xml:space="preserve"> </w:t>
-      </w:r>
-      <w:proofErr w:type="spellStart"/>
-      <w:r>
-        <w:t>nhận</w:t>
-      </w:r>
-      <w:proofErr w:type="spellEnd"/>
-      <w:r>
-        <w:t xml:space="preserve">. </w:t>
-      </w:r>
-      <w:proofErr w:type="spellStart"/>
-      <w:r>
-        <w:t>Đội</w:t>
-      </w:r>
-      <w:proofErr w:type="spellEnd"/>
-      <w:r>
-        <w:t xml:space="preserve"> </w:t>
-      </w:r>
-      <w:proofErr w:type="spellStart"/>
-      <w:r>
-        <w:t>ngũ</w:t>
-      </w:r>
-      <w:proofErr w:type="spellEnd"/>
-      <w:r>
-        <w:t xml:space="preserve"> </w:t>
-      </w:r>
-      <w:proofErr w:type="spellStart"/>
-      <w:r>
-        <w:t>kiểm</w:t>
-      </w:r>
-      <w:proofErr w:type="spellEnd"/>
-      <w:r>
-        <w:t xml:space="preserve"> </w:t>
-      </w:r>
-      <w:proofErr w:type="spellStart"/>
-      <w:r>
-        <w:t>duyệt</w:t>
-      </w:r>
-      <w:proofErr w:type="spellEnd"/>
-      <w:r>
-        <w:t xml:space="preserve"> </w:t>
-      </w:r>
-      <w:proofErr w:type="spellStart"/>
-      <w:r>
-        <w:t>sẽ</w:t>
-      </w:r>
-      <w:proofErr w:type="spellEnd"/>
-      <w:r>
-        <w:t xml:space="preserve"> </w:t>
-      </w:r>
-      <w:proofErr w:type="spellStart"/>
-      <w:r>
-        <w:t>phản</w:t>
-      </w:r>
-      <w:proofErr w:type="spellEnd"/>
-      <w:r>
-        <w:t xml:space="preserve"> </w:t>
-      </w:r>
-      <w:proofErr w:type="spellStart"/>
-      <w:r>
-        <w:t>hồi</w:t>
-      </w:r>
-      <w:proofErr w:type="spellEnd"/>
-      <w:r>
-        <w:t xml:space="preserve"> </w:t>
-      </w:r>
-      <w:proofErr w:type="spellStart"/>
-      <w:r>
-        <w:t>trong</w:t>
-      </w:r>
-      <w:proofErr w:type="spellEnd"/>
-      <w:r>
-        <w:t xml:space="preserve"> </w:t>
-      </w:r>
-      <w:proofErr w:type="spellStart"/>
-      <w:r>
-        <w:t>vòng</w:t>
-      </w:r>
-      <w:proofErr w:type="spellEnd"/>
-      <w:r>
-        <w:t xml:space="preserve"> 24 </w:t>
-      </w:r>
-      <w:proofErr w:type="spellStart"/>
-      <w:r>
-        <w:t>giờ</w:t>
-      </w:r>
-      <w:proofErr w:type="spellEnd"/>
-      <w:r>
-        <w:t xml:space="preserve"> </w:t>
-      </w:r>
-      <w:proofErr w:type="spellStart"/>
-      <w:r>
-        <w:t>làm</w:t>
-      </w:r>
-      <w:proofErr w:type="spellEnd"/>
-      <w:r>
-        <w:t xml:space="preserve"> </w:t>
-      </w:r>
-      <w:proofErr w:type="spellStart"/>
-      <w:r>
-        <w:t>việc</w:t>
-      </w:r>
-      <w:proofErr w:type="spellEnd"/>
-      <w:r>
-        <w:t>."</w:t>
+        <w:t>"Hồ sơ đang chờ phê duyệtYêu cầu đăng ký Người bán của bạn đã được tiếp nhận. Đội ngũ kiểm duyệt sẽ phản hồi trong vòng 24 giờ làm việc."</w:t>
       </w:r>
     </w:p>
     <w:p>
@@ -1310,13 +1029,8 @@
       </w:r>
       <w:r>
         <w:tab/>
-        <w:t xml:space="preserve">An email to the requester to confirm admin received the request and will check and </w:t>
-      </w:r>
-      <w:proofErr w:type="spellStart"/>
-      <w:r>
-        <w:t>appove</w:t>
-      </w:r>
-      <w:proofErr w:type="spellEnd"/>
+        <w:t>An email to the requester to confirm admin received the request and will check and appove</w:t>
+      </w:r>
     </w:p>
     <w:p>
       <w:r>
@@ -1375,202 +1089,18 @@
         <w:t>progress</w:t>
       </w:r>
       <w:r>
-        <w:t xml:space="preserve"> of the status and a notification also appear "</w:t>
-      </w:r>
-      <w:proofErr w:type="spellStart"/>
-      <w:r>
-        <w:t>Đăng</w:t>
-      </w:r>
-      <w:proofErr w:type="spellEnd"/>
-      <w:r>
-        <w:t xml:space="preserve"> </w:t>
-      </w:r>
-      <w:proofErr w:type="spellStart"/>
-      <w:r>
-        <w:t>ký</w:t>
-      </w:r>
-      <w:proofErr w:type="spellEnd"/>
-      <w:r>
-        <w:t xml:space="preserve"> </w:t>
-      </w:r>
-      <w:proofErr w:type="spellStart"/>
-      <w:r>
-        <w:t>thành</w:t>
-      </w:r>
-      <w:proofErr w:type="spellEnd"/>
-      <w:r>
-        <w:t xml:space="preserve"> </w:t>
-      </w:r>
-      <w:proofErr w:type="spellStart"/>
-      <w:r>
-        <w:t>công</w:t>
-      </w:r>
-      <w:proofErr w:type="spellEnd"/>
-      <w:r>
-        <w:t>!</w:t>
-      </w:r>
-    </w:p>
-    <w:p>
-      <w:r>
-        <w:t xml:space="preserve">                </w:t>
-      </w:r>
-      <w:proofErr w:type="spellStart"/>
-      <w:r>
-        <w:t>Hồ</w:t>
-      </w:r>
-      <w:proofErr w:type="spellEnd"/>
-      <w:r>
-        <w:t xml:space="preserve"> </w:t>
-      </w:r>
-      <w:proofErr w:type="spellStart"/>
-      <w:r>
-        <w:t>sơ</w:t>
-      </w:r>
-      <w:proofErr w:type="spellEnd"/>
-      <w:r>
-        <w:t xml:space="preserve"> </w:t>
-      </w:r>
-      <w:proofErr w:type="spellStart"/>
-      <w:r>
-        <w:t>của</w:t>
-      </w:r>
-      <w:proofErr w:type="spellEnd"/>
-      <w:r>
-        <w:t xml:space="preserve"> </w:t>
-      </w:r>
-      <w:proofErr w:type="spellStart"/>
-      <w:r>
-        <w:t>bạn</w:t>
-      </w:r>
-      <w:proofErr w:type="spellEnd"/>
-      <w:r>
-        <w:t xml:space="preserve"> </w:t>
-      </w:r>
-      <w:proofErr w:type="spellStart"/>
-      <w:r>
-        <w:t>đã</w:t>
-      </w:r>
-      <w:proofErr w:type="spellEnd"/>
-      <w:r>
-        <w:t xml:space="preserve"> </w:t>
-      </w:r>
-      <w:proofErr w:type="spellStart"/>
-      <w:r>
-        <w:t>được</w:t>
-      </w:r>
-      <w:proofErr w:type="spellEnd"/>
-      <w:r>
-        <w:t xml:space="preserve"> </w:t>
-      </w:r>
-      <w:proofErr w:type="spellStart"/>
-      <w:r>
-        <w:t>gửi</w:t>
-      </w:r>
-      <w:proofErr w:type="spellEnd"/>
-      <w:r>
-        <w:t xml:space="preserve">. </w:t>
-      </w:r>
-      <w:proofErr w:type="spellStart"/>
-      <w:r>
-        <w:t>Chúng</w:t>
-      </w:r>
-      <w:proofErr w:type="spellEnd"/>
-      <w:r>
-        <w:t xml:space="preserve"> </w:t>
-      </w:r>
-      <w:proofErr w:type="spellStart"/>
-      <w:r>
-        <w:t>tôi</w:t>
-      </w:r>
-      <w:proofErr w:type="spellEnd"/>
-      <w:r>
-        <w:t xml:space="preserve"> </w:t>
-      </w:r>
-      <w:proofErr w:type="spellStart"/>
-      <w:r>
-        <w:t>đã</w:t>
-      </w:r>
-      <w:proofErr w:type="spellEnd"/>
-      <w:r>
-        <w:t xml:space="preserve"> </w:t>
-      </w:r>
-      <w:proofErr w:type="spellStart"/>
-      <w:r>
-        <w:t>gửi</w:t>
-      </w:r>
-      <w:proofErr w:type="spellEnd"/>
-      <w:r>
-        <w:t xml:space="preserve"> email </w:t>
-      </w:r>
-      <w:proofErr w:type="spellStart"/>
-      <w:r>
-        <w:t>xác</w:t>
-      </w:r>
-      <w:proofErr w:type="spellEnd"/>
-      <w:r>
-        <w:t xml:space="preserve"> </w:t>
-      </w:r>
-      <w:proofErr w:type="spellStart"/>
-      <w:r>
-        <w:t>nhận</w:t>
-      </w:r>
-      <w:proofErr w:type="spellEnd"/>
-      <w:r>
-        <w:t xml:space="preserve"> </w:t>
-      </w:r>
-      <w:proofErr w:type="spellStart"/>
-      <w:r>
-        <w:t>đến</w:t>
-      </w:r>
-      <w:proofErr w:type="spellEnd"/>
-      <w:r>
-        <w:t xml:space="preserve"> pending@ainetsoft.com.</w:t>
+        <w:t xml:space="preserve"> of the status and a notification also appear "Đăng ký thành công!</w:t>
+      </w:r>
+    </w:p>
+    <w:p>
+      <w:r>
+        <w:t xml:space="preserve">                Hồ sơ của bạn đã được gửi. Chúng tôi đã gửi email xác nhận đến pending@ainetsoft.com.</w:t>
       </w:r>
     </w:p>
     <w:p/>
     <w:p>
       <w:r>
-        <w:t xml:space="preserve">                Phản </w:t>
-      </w:r>
-      <w:proofErr w:type="spellStart"/>
-      <w:r>
-        <w:t>hồi</w:t>
-      </w:r>
-      <w:proofErr w:type="spellEnd"/>
-      <w:r>
-        <w:t xml:space="preserve"> </w:t>
-      </w:r>
-      <w:proofErr w:type="spellStart"/>
-      <w:r>
-        <w:t>chậm</w:t>
-      </w:r>
-      <w:proofErr w:type="spellEnd"/>
-      <w:r>
-        <w:t xml:space="preserve"> </w:t>
-      </w:r>
-      <w:proofErr w:type="spellStart"/>
-      <w:r>
-        <w:t>nhất</w:t>
-      </w:r>
-      <w:proofErr w:type="spellEnd"/>
-      <w:r>
-        <w:t xml:space="preserve"> </w:t>
-      </w:r>
-      <w:proofErr w:type="spellStart"/>
-      <w:r>
-        <w:t>trong</w:t>
-      </w:r>
-      <w:proofErr w:type="spellEnd"/>
-      <w:r>
-        <w:t xml:space="preserve"> </w:t>
-      </w:r>
-      <w:proofErr w:type="spellStart"/>
-      <w:r>
-        <w:t>vòng</w:t>
-      </w:r>
-      <w:proofErr w:type="spellEnd"/>
-      <w:r>
-        <w:t xml:space="preserve"> 24h"</w:t>
+        <w:t xml:space="preserve">                Phản hồi chậm nhất trong vòng 24h"</w:t>
       </w:r>
     </w:p>
     <w:p>
@@ -1604,531 +1134,33 @@
         <w:rPr>
           <w:color w:val="EE0000"/>
         </w:rPr>
-        <w:t xml:space="preserve"> "</w:t>
-      </w:r>
-      <w:proofErr w:type="spellStart"/>
-      <w:r>
+        <w:t xml:space="preserve"> "Hồ sơ bị từ chối</w:t>
+      </w:r>
+    </w:p>
+    <w:p>
+      <w:pPr>
         <w:rPr>
           <w:color w:val="EE0000"/>
         </w:rPr>
-        <w:t>Hồ</w:t>
-      </w:r>
-      <w:proofErr w:type="spellEnd"/>
+      </w:pPr>
       <w:r>
         <w:rPr>
           <w:color w:val="EE0000"/>
         </w:rPr>
-        <w:t xml:space="preserve"> </w:t>
-      </w:r>
-      <w:proofErr w:type="spellStart"/>
-      <w:r>
+        <w:t xml:space="preserve">                Lý do: Chụp lại ảnh CCCD.</w:t>
+      </w:r>
+    </w:p>
+    <w:p>
+      <w:pPr>
         <w:rPr>
           <w:color w:val="EE0000"/>
         </w:rPr>
-        <w:t>sơ</w:t>
-      </w:r>
-      <w:proofErr w:type="spellEnd"/>
+      </w:pPr>
       <w:r>
         <w:rPr>
           <w:color w:val="EE0000"/>
         </w:rPr>
-        <w:t xml:space="preserve"> </w:t>
-      </w:r>
-      <w:proofErr w:type="spellStart"/>
-      <w:r>
-        <w:rPr>
-          <w:color w:val="EE0000"/>
-        </w:rPr>
-        <w:t>bị</w:t>
-      </w:r>
-      <w:proofErr w:type="spellEnd"/>
-      <w:r>
-        <w:rPr>
-          <w:color w:val="EE0000"/>
-        </w:rPr>
-        <w:t xml:space="preserve"> </w:t>
-      </w:r>
-      <w:proofErr w:type="spellStart"/>
-      <w:r>
-        <w:rPr>
-          <w:color w:val="EE0000"/>
-        </w:rPr>
-        <w:t>từ</w:t>
-      </w:r>
-      <w:proofErr w:type="spellEnd"/>
-      <w:r>
-        <w:rPr>
-          <w:color w:val="EE0000"/>
-        </w:rPr>
-        <w:t xml:space="preserve"> </w:t>
-      </w:r>
-      <w:proofErr w:type="spellStart"/>
-      <w:r>
-        <w:rPr>
-          <w:color w:val="EE0000"/>
-        </w:rPr>
-        <w:t>chối</w:t>
-      </w:r>
-      <w:proofErr w:type="spellEnd"/>
-    </w:p>
-    <w:p>
-      <w:pPr>
-        <w:rPr>
-          <w:color w:val="EE0000"/>
-        </w:rPr>
-      </w:pPr>
-      <w:r>
-        <w:rPr>
-          <w:color w:val="EE0000"/>
-        </w:rPr>
-        <w:t xml:space="preserve">                Lý do: </w:t>
-      </w:r>
-      <w:proofErr w:type="spellStart"/>
-      <w:r>
-        <w:rPr>
-          <w:color w:val="EE0000"/>
-        </w:rPr>
-        <w:t>Chụp</w:t>
-      </w:r>
-      <w:proofErr w:type="spellEnd"/>
-      <w:r>
-        <w:rPr>
-          <w:color w:val="EE0000"/>
-        </w:rPr>
-        <w:t xml:space="preserve"> </w:t>
-      </w:r>
-      <w:proofErr w:type="spellStart"/>
-      <w:r>
-        <w:rPr>
-          <w:color w:val="EE0000"/>
-        </w:rPr>
-        <w:t>lại</w:t>
-      </w:r>
-      <w:proofErr w:type="spellEnd"/>
-      <w:r>
-        <w:rPr>
-          <w:color w:val="EE0000"/>
-        </w:rPr>
-        <w:t xml:space="preserve"> </w:t>
-      </w:r>
-      <w:proofErr w:type="spellStart"/>
-      <w:r>
-        <w:rPr>
-          <w:color w:val="EE0000"/>
-        </w:rPr>
-        <w:t>ảnh</w:t>
-      </w:r>
-      <w:proofErr w:type="spellEnd"/>
-      <w:r>
-        <w:rPr>
-          <w:color w:val="EE0000"/>
-        </w:rPr>
-        <w:t xml:space="preserve"> CCCD.</w:t>
-      </w:r>
-    </w:p>
-    <w:p>
-      <w:pPr>
-        <w:rPr>
-          <w:color w:val="EE0000"/>
-        </w:rPr>
-      </w:pPr>
-      <w:r>
-        <w:rPr>
-          <w:color w:val="EE0000"/>
-        </w:rPr>
-        <w:t xml:space="preserve">                </w:t>
-      </w:r>
-      <w:proofErr w:type="spellStart"/>
-      <w:r>
-        <w:rPr>
-          <w:color w:val="EE0000"/>
-        </w:rPr>
-        <w:t>Hệ</w:t>
-      </w:r>
-      <w:proofErr w:type="spellEnd"/>
-      <w:r>
-        <w:rPr>
-          <w:color w:val="EE0000"/>
-        </w:rPr>
-        <w:t xml:space="preserve"> </w:t>
-      </w:r>
-      <w:proofErr w:type="spellStart"/>
-      <w:r>
-        <w:rPr>
-          <w:color w:val="EE0000"/>
-        </w:rPr>
-        <w:t>thống</w:t>
-      </w:r>
-      <w:proofErr w:type="spellEnd"/>
-      <w:r>
-        <w:rPr>
-          <w:color w:val="EE0000"/>
-        </w:rPr>
-        <w:t xml:space="preserve"> </w:t>
-      </w:r>
-      <w:proofErr w:type="spellStart"/>
-      <w:r>
-        <w:rPr>
-          <w:color w:val="EE0000"/>
-        </w:rPr>
-        <w:t>không</w:t>
-      </w:r>
-      <w:proofErr w:type="spellEnd"/>
-      <w:r>
-        <w:rPr>
-          <w:color w:val="EE0000"/>
-        </w:rPr>
-        <w:t xml:space="preserve"> </w:t>
-      </w:r>
-      <w:proofErr w:type="spellStart"/>
-      <w:r>
-        <w:rPr>
-          <w:color w:val="EE0000"/>
-        </w:rPr>
-        <w:t>thể</w:t>
-      </w:r>
-      <w:proofErr w:type="spellEnd"/>
-      <w:r>
-        <w:rPr>
-          <w:color w:val="EE0000"/>
-        </w:rPr>
-        <w:t xml:space="preserve"> </w:t>
-      </w:r>
-      <w:proofErr w:type="spellStart"/>
-      <w:r>
-        <w:rPr>
-          <w:color w:val="EE0000"/>
-        </w:rPr>
-        <w:t>xác</w:t>
-      </w:r>
-      <w:proofErr w:type="spellEnd"/>
-      <w:r>
-        <w:rPr>
-          <w:color w:val="EE0000"/>
-        </w:rPr>
-        <w:t xml:space="preserve"> </w:t>
-      </w:r>
-      <w:proofErr w:type="spellStart"/>
-      <w:r>
-        <w:rPr>
-          <w:color w:val="EE0000"/>
-        </w:rPr>
-        <w:t>thực</w:t>
-      </w:r>
-      <w:proofErr w:type="spellEnd"/>
-      <w:r>
-        <w:rPr>
-          <w:color w:val="EE0000"/>
-        </w:rPr>
-        <w:t xml:space="preserve"> </w:t>
-      </w:r>
-      <w:proofErr w:type="spellStart"/>
-      <w:r>
-        <w:rPr>
-          <w:color w:val="EE0000"/>
-        </w:rPr>
-        <w:t>một</w:t>
-      </w:r>
-      <w:proofErr w:type="spellEnd"/>
-      <w:r>
-        <w:rPr>
-          <w:color w:val="EE0000"/>
-        </w:rPr>
-        <w:t xml:space="preserve"> </w:t>
-      </w:r>
-      <w:proofErr w:type="spellStart"/>
-      <w:r>
-        <w:rPr>
-          <w:color w:val="EE0000"/>
-        </w:rPr>
-        <w:t>số</w:t>
-      </w:r>
-      <w:proofErr w:type="spellEnd"/>
-      <w:r>
-        <w:rPr>
-          <w:color w:val="EE0000"/>
-        </w:rPr>
-        <w:t xml:space="preserve"> </w:t>
-      </w:r>
-      <w:proofErr w:type="spellStart"/>
-      <w:r>
-        <w:rPr>
-          <w:color w:val="EE0000"/>
-        </w:rPr>
-        <w:t>thông</w:t>
-      </w:r>
-      <w:proofErr w:type="spellEnd"/>
-      <w:r>
-        <w:rPr>
-          <w:color w:val="EE0000"/>
-        </w:rPr>
-        <w:t xml:space="preserve"> tin </w:t>
-      </w:r>
-      <w:proofErr w:type="spellStart"/>
-      <w:r>
-        <w:rPr>
-          <w:color w:val="EE0000"/>
-        </w:rPr>
-        <w:t>của</w:t>
-      </w:r>
-      <w:proofErr w:type="spellEnd"/>
-      <w:r>
-        <w:rPr>
-          <w:color w:val="EE0000"/>
-        </w:rPr>
-        <w:t xml:space="preserve"> </w:t>
-      </w:r>
-      <w:proofErr w:type="spellStart"/>
-      <w:r>
-        <w:rPr>
-          <w:color w:val="EE0000"/>
-        </w:rPr>
-        <w:t>bạn</w:t>
-      </w:r>
-      <w:proofErr w:type="spellEnd"/>
-      <w:r>
-        <w:rPr>
-          <w:color w:val="EE0000"/>
-        </w:rPr>
-        <w:t xml:space="preserve">. Vui </w:t>
-      </w:r>
-      <w:proofErr w:type="spellStart"/>
-      <w:r>
-        <w:rPr>
-          <w:color w:val="EE0000"/>
-        </w:rPr>
-        <w:t>lòng</w:t>
-      </w:r>
-      <w:proofErr w:type="spellEnd"/>
-      <w:r>
-        <w:rPr>
-          <w:color w:val="EE0000"/>
-        </w:rPr>
-        <w:t xml:space="preserve"> </w:t>
-      </w:r>
-      <w:proofErr w:type="spellStart"/>
-      <w:r>
-        <w:rPr>
-          <w:color w:val="EE0000"/>
-        </w:rPr>
-        <w:t>kiểm</w:t>
-      </w:r>
-      <w:proofErr w:type="spellEnd"/>
-      <w:r>
-        <w:rPr>
-          <w:color w:val="EE0000"/>
-        </w:rPr>
-        <w:t xml:space="preserve"> </w:t>
-      </w:r>
-      <w:proofErr w:type="spellStart"/>
-      <w:r>
-        <w:rPr>
-          <w:color w:val="EE0000"/>
-        </w:rPr>
-        <w:t>tra</w:t>
-      </w:r>
-      <w:proofErr w:type="spellEnd"/>
-      <w:r>
-        <w:rPr>
-          <w:color w:val="EE0000"/>
-        </w:rPr>
-        <w:t xml:space="preserve"> </w:t>
-      </w:r>
-      <w:proofErr w:type="spellStart"/>
-      <w:r>
-        <w:rPr>
-          <w:color w:val="EE0000"/>
-        </w:rPr>
-        <w:t>lại</w:t>
-      </w:r>
-      <w:proofErr w:type="spellEnd"/>
-      <w:r>
-        <w:rPr>
-          <w:color w:val="EE0000"/>
-        </w:rPr>
-        <w:t xml:space="preserve"> </w:t>
-      </w:r>
-      <w:proofErr w:type="spellStart"/>
-      <w:r>
-        <w:rPr>
-          <w:color w:val="EE0000"/>
-        </w:rPr>
-        <w:t>lý</w:t>
-      </w:r>
-      <w:proofErr w:type="spellEnd"/>
-      <w:r>
-        <w:rPr>
-          <w:color w:val="EE0000"/>
-        </w:rPr>
-        <w:t xml:space="preserve"> do </w:t>
-      </w:r>
-      <w:proofErr w:type="spellStart"/>
-      <w:r>
-        <w:rPr>
-          <w:color w:val="EE0000"/>
-        </w:rPr>
-        <w:t>trên</w:t>
-      </w:r>
-      <w:proofErr w:type="spellEnd"/>
-      <w:r>
-        <w:rPr>
-          <w:color w:val="EE0000"/>
-        </w:rPr>
-        <w:t xml:space="preserve"> </w:t>
-      </w:r>
-      <w:proofErr w:type="spellStart"/>
-      <w:r>
-        <w:rPr>
-          <w:color w:val="EE0000"/>
-        </w:rPr>
-        <w:t>và</w:t>
-      </w:r>
-      <w:proofErr w:type="spellEnd"/>
-      <w:r>
-        <w:rPr>
-          <w:color w:val="EE0000"/>
-        </w:rPr>
-        <w:t xml:space="preserve"> </w:t>
-      </w:r>
-      <w:proofErr w:type="spellStart"/>
-      <w:r>
-        <w:rPr>
-          <w:color w:val="EE0000"/>
-        </w:rPr>
-        <w:t>cập</w:t>
-      </w:r>
-      <w:proofErr w:type="spellEnd"/>
-      <w:r>
-        <w:rPr>
-          <w:color w:val="EE0000"/>
-        </w:rPr>
-        <w:t xml:space="preserve"> </w:t>
-      </w:r>
-      <w:proofErr w:type="spellStart"/>
-      <w:r>
-        <w:rPr>
-          <w:color w:val="EE0000"/>
-        </w:rPr>
-        <w:t>nhật</w:t>
-      </w:r>
-      <w:proofErr w:type="spellEnd"/>
-      <w:r>
-        <w:rPr>
-          <w:color w:val="EE0000"/>
-        </w:rPr>
-        <w:t xml:space="preserve"> </w:t>
-      </w:r>
-      <w:proofErr w:type="spellStart"/>
-      <w:r>
-        <w:rPr>
-          <w:color w:val="EE0000"/>
-        </w:rPr>
-        <w:t>hồ</w:t>
-      </w:r>
-      <w:proofErr w:type="spellEnd"/>
-      <w:r>
-        <w:rPr>
-          <w:color w:val="EE0000"/>
-        </w:rPr>
-        <w:t xml:space="preserve"> </w:t>
-      </w:r>
-      <w:proofErr w:type="spellStart"/>
-      <w:r>
-        <w:rPr>
-          <w:color w:val="EE0000"/>
-        </w:rPr>
-        <w:t>sơ</w:t>
-      </w:r>
-      <w:proofErr w:type="spellEnd"/>
-      <w:r>
-        <w:rPr>
-          <w:color w:val="EE0000"/>
-        </w:rPr>
-        <w:t xml:space="preserve"> </w:t>
-      </w:r>
-      <w:proofErr w:type="spellStart"/>
-      <w:r>
-        <w:rPr>
-          <w:color w:val="EE0000"/>
-        </w:rPr>
-        <w:t>chính</w:t>
-      </w:r>
-      <w:proofErr w:type="spellEnd"/>
-      <w:r>
-        <w:rPr>
-          <w:color w:val="EE0000"/>
-        </w:rPr>
-        <w:t xml:space="preserve"> </w:t>
-      </w:r>
-      <w:proofErr w:type="spellStart"/>
-      <w:r>
-        <w:rPr>
-          <w:color w:val="EE0000"/>
-        </w:rPr>
-        <w:t>xác</w:t>
-      </w:r>
-      <w:proofErr w:type="spellEnd"/>
-      <w:r>
-        <w:rPr>
-          <w:color w:val="EE0000"/>
-        </w:rPr>
-        <w:t xml:space="preserve"> </w:t>
-      </w:r>
-      <w:proofErr w:type="spellStart"/>
-      <w:r>
-        <w:rPr>
-          <w:color w:val="EE0000"/>
-        </w:rPr>
-        <w:t>trước</w:t>
-      </w:r>
-      <w:proofErr w:type="spellEnd"/>
-      <w:r>
-        <w:rPr>
-          <w:color w:val="EE0000"/>
-        </w:rPr>
-        <w:t xml:space="preserve"> </w:t>
-      </w:r>
-      <w:proofErr w:type="spellStart"/>
-      <w:r>
-        <w:rPr>
-          <w:color w:val="EE0000"/>
-        </w:rPr>
-        <w:t>khi</w:t>
-      </w:r>
-      <w:proofErr w:type="spellEnd"/>
-      <w:r>
-        <w:rPr>
-          <w:color w:val="EE0000"/>
-        </w:rPr>
-        <w:t xml:space="preserve"> </w:t>
-      </w:r>
-      <w:proofErr w:type="spellStart"/>
-      <w:r>
-        <w:rPr>
-          <w:color w:val="EE0000"/>
-        </w:rPr>
-        <w:t>gửi</w:t>
-      </w:r>
-      <w:proofErr w:type="spellEnd"/>
-      <w:r>
-        <w:rPr>
-          <w:color w:val="EE0000"/>
-        </w:rPr>
-        <w:t xml:space="preserve"> </w:t>
-      </w:r>
-      <w:proofErr w:type="spellStart"/>
-      <w:r>
-        <w:rPr>
-          <w:color w:val="EE0000"/>
-        </w:rPr>
-        <w:t>lại</w:t>
-      </w:r>
-      <w:proofErr w:type="spellEnd"/>
-      <w:r>
-        <w:rPr>
-          <w:color w:val="EE0000"/>
-        </w:rPr>
-        <w:t>."</w:t>
+        <w:t xml:space="preserve">                Hệ thống không thể xác thực một số thông tin của bạn. Vui lòng kiểm tra lại lý do trên và cập nhật hồ sơ chính xác trước khi gửi lại."</w:t>
       </w:r>
     </w:p>
     <w:p/>
@@ -2378,6 +1410,9 @@
     </w:p>
     <w:p>
       <w:r>
+        <w:rPr>
+          <w:noProof/>
+        </w:rPr>
         <w:drawing>
           <wp:inline distT="0" distB="0" distL="0" distR="0" wp14:anchorId="097D2016" wp14:editId="6862D062">
             <wp:extent cx="5943600" cy="2296160"/>
@@ -2473,31 +1508,7 @@
     <w:p/>
     <w:p>
       <w:r>
-        <w:t xml:space="preserve">Danh </w:t>
-      </w:r>
-      <w:proofErr w:type="spellStart"/>
-      <w:r>
-        <w:t>sách</w:t>
-      </w:r>
-      <w:proofErr w:type="spellEnd"/>
-      <w:r>
-        <w:t xml:space="preserve"> </w:t>
-      </w:r>
-      <w:proofErr w:type="spellStart"/>
-      <w:r>
-        <w:t>sản</w:t>
-      </w:r>
-      <w:proofErr w:type="spellEnd"/>
-      <w:r>
-        <w:t xml:space="preserve"> </w:t>
-      </w:r>
-      <w:proofErr w:type="spellStart"/>
-      <w:r>
-        <w:t>phẩm</w:t>
-      </w:r>
-      <w:proofErr w:type="spellEnd"/>
-      <w:r>
-        <w:t>:</w:t>
+        <w:t>Danh sách sản phẩm:</w:t>
       </w:r>
     </w:p>
     <w:p>
@@ -2545,23 +1556,7 @@
     <w:p/>
     <w:p>
       <w:r>
-        <w:t xml:space="preserve">Quản </w:t>
-      </w:r>
-      <w:proofErr w:type="spellStart"/>
-      <w:r>
-        <w:t>lý</w:t>
-      </w:r>
-      <w:proofErr w:type="spellEnd"/>
-      <w:r>
-        <w:t xml:space="preserve"> </w:t>
-      </w:r>
-      <w:proofErr w:type="spellStart"/>
-      <w:r>
-        <w:t>đơn</w:t>
-      </w:r>
-      <w:proofErr w:type="spellEnd"/>
-      <w:r>
-        <w:t xml:space="preserve"> hang</w:t>
+        <w:t>Quản lý đơn hang</w:t>
       </w:r>
     </w:p>
     <w:p/>
@@ -2610,21 +1605,8 @@
     </w:p>
     <w:p/>
     <w:p>
-      <w:proofErr w:type="spellStart"/>
-      <w:r>
-        <w:t>Thiết</w:t>
-      </w:r>
-      <w:proofErr w:type="spellEnd"/>
-      <w:r>
-        <w:t xml:space="preserve"> </w:t>
-      </w:r>
-      <w:proofErr w:type="spellStart"/>
-      <w:r>
-        <w:t>lập</w:t>
-      </w:r>
-      <w:proofErr w:type="spellEnd"/>
-      <w:r>
-        <w:t xml:space="preserve"> shop:</w:t>
+      <w:r>
+        <w:t>Thiết lập shop:</w:t>
       </w:r>
     </w:p>
     <w:p>
@@ -2679,19 +1661,14 @@
       </w:pPr>
       <w:r>
         <w:lastRenderedPageBreak/>
-        <w:t xml:space="preserve">Money withdraw request: Seller can ask </w:t>
-      </w:r>
-      <w:proofErr w:type="spellStart"/>
-      <w:r>
-        <w:t>ainetsoft</w:t>
-      </w:r>
-      <w:proofErr w:type="spellEnd"/>
-      <w:r>
-        <w:t xml:space="preserve"> for a payment withdraw with the details form as below</w:t>
-      </w:r>
-    </w:p>
-    <w:p>
-      <w:r>
+        <w:t>Money withdraw request: Seller can ask ainetsoft for a payment withdraw with the details form as below</w:t>
+      </w:r>
+    </w:p>
+    <w:p>
+      <w:r>
+        <w:rPr>
+          <w:noProof/>
+        </w:rPr>
         <w:drawing>
           <wp:inline distT="0" distB="0" distL="0" distR="0" wp14:anchorId="76C8B276" wp14:editId="4D0B7C7D">
             <wp:extent cx="5943600" cy="2672080"/>
@@ -2746,6 +1723,9 @@
     <w:p/>
     <w:p>
       <w:r>
+        <w:rPr>
+          <w:noProof/>
+        </w:rPr>
         <w:drawing>
           <wp:inline distT="0" distB="0" distL="0" distR="0" wp14:anchorId="0117AFB6" wp14:editId="6C0368B9">
             <wp:extent cx="5943600" cy="2085340"/>
@@ -2815,6 +1795,9 @@
     </w:p>
     <w:p>
       <w:r>
+        <w:rPr>
+          <w:noProof/>
+        </w:rPr>
         <w:lastRenderedPageBreak/>
         <w:drawing>
           <wp:inline distT="0" distB="0" distL="0" distR="0" wp14:anchorId="46AF4CCB" wp14:editId="19F19FB7">
@@ -2868,6 +1851,9 @@
     </w:p>
     <w:p>
       <w:r>
+        <w:rPr>
+          <w:noProof/>
+        </w:rPr>
         <w:drawing>
           <wp:inline distT="0" distB="0" distL="0" distR="0" wp14:anchorId="01D8CA9D" wp14:editId="6980E033">
             <wp:extent cx="5943600" cy="2715260"/>
@@ -2925,6 +1911,9 @@
         <w:ind w:left="720" w:hanging="720"/>
       </w:pPr>
       <w:r>
+        <w:rPr>
+          <w:noProof/>
+        </w:rPr>
         <w:lastRenderedPageBreak/>
         <w:drawing>
           <wp:inline distT="0" distB="0" distL="0" distR="0" wp14:anchorId="21DAC788" wp14:editId="66A947E7">
@@ -2976,6 +1965,9 @@
         <w:br/>
       </w:r>
       <w:r>
+        <w:rPr>
+          <w:noProof/>
+        </w:rPr>
         <w:drawing>
           <wp:inline distT="0" distB="0" distL="0" distR="0" wp14:anchorId="1952F657" wp14:editId="5BB49912">
             <wp:extent cx="5943600" cy="2368550"/>
@@ -3033,25 +2025,15 @@
           <w:numId w:val="4"/>
         </w:numPr>
       </w:pPr>
-      <w:proofErr w:type="spellStart"/>
-      <w:r>
-        <w:t>Tổng</w:t>
-      </w:r>
-      <w:proofErr w:type="spellEnd"/>
-      <w:r>
-        <w:t xml:space="preserve"> </w:t>
-      </w:r>
-      <w:proofErr w:type="spellStart"/>
-      <w:r>
-        <w:t>quan</w:t>
-      </w:r>
-      <w:proofErr w:type="spellEnd"/>
-      <w:r>
-        <w:t xml:space="preserve"> Admin page: This shows the summarization of all the important parts and will be details one Admin user click to it</w:t>
-      </w:r>
-    </w:p>
-    <w:p>
-      <w:r>
+      <w:r>
+        <w:t>Tổng quan Admin page: This shows the summarization of all the important parts and will be details one Admin user click to it</w:t>
+      </w:r>
+    </w:p>
+    <w:p>
+      <w:r>
+        <w:rPr>
+          <w:noProof/>
+        </w:rPr>
         <w:lastRenderedPageBreak/>
         <w:drawing>
           <wp:inline distT="0" distB="0" distL="0" distR="0" wp14:anchorId="57E58A03" wp14:editId="1993E0F0">
@@ -3098,21 +2080,8 @@
           <w:numId w:val="4"/>
         </w:numPr>
       </w:pPr>
-      <w:proofErr w:type="spellStart"/>
-      <w:r>
-        <w:t>Tổng</w:t>
-      </w:r>
-      <w:proofErr w:type="spellEnd"/>
-      <w:r>
-        <w:t xml:space="preserve"> </w:t>
-      </w:r>
-      <w:proofErr w:type="spellStart"/>
-      <w:r>
-        <w:t>người</w:t>
-      </w:r>
-      <w:proofErr w:type="spellEnd"/>
-      <w:r>
-        <w:t xml:space="preserve"> dung:</w:t>
+      <w:r>
+        <w:t>Tổng người dung:</w:t>
       </w:r>
     </w:p>
     <w:p>
@@ -3123,25 +2092,15 @@
           <w:numId w:val="4"/>
         </w:numPr>
       </w:pPr>
-      <w:proofErr w:type="spellStart"/>
-      <w:r>
-        <w:t>Sản</w:t>
-      </w:r>
-      <w:proofErr w:type="spellEnd"/>
-      <w:r>
-        <w:t xml:space="preserve"> </w:t>
-      </w:r>
-      <w:proofErr w:type="spellStart"/>
-      <w:r>
-        <w:t>phẩm</w:t>
-      </w:r>
-      <w:proofErr w:type="spellEnd"/>
-      <w:r>
-        <w:t>: Show all products which the system is having. There is a quick access to the Seller pages</w:t>
-      </w:r>
-    </w:p>
-    <w:p>
-      <w:r>
+      <w:r>
+        <w:t>Sản phẩm: Show all products which the system is having. There is a quick access to the Seller pages</w:t>
+      </w:r>
+    </w:p>
+    <w:p>
+      <w:r>
+        <w:rPr>
+          <w:noProof/>
+        </w:rPr>
         <w:lastRenderedPageBreak/>
         <w:drawing>
           <wp:inline distT="0" distB="0" distL="0" distR="0" wp14:anchorId="6B5994E1" wp14:editId="41E9937E">
@@ -3189,26 +2148,16 @@
           <w:numId w:val="4"/>
         </w:numPr>
       </w:pPr>
-      <w:proofErr w:type="spellStart"/>
-      <w:r>
-        <w:t>Chờ</w:t>
-      </w:r>
-      <w:proofErr w:type="spellEnd"/>
-      <w:r>
-        <w:t xml:space="preserve"> </w:t>
-      </w:r>
-      <w:proofErr w:type="spellStart"/>
-      <w:r>
-        <w:t>duyệt</w:t>
-      </w:r>
-      <w:proofErr w:type="spellEnd"/>
-      <w:r>
-        <w:t xml:space="preserve"> SP: This contains all pending shop product and being waiting the admin page to approve</w:t>
+      <w:r>
+        <w:t>Chờ duyệt SP: This contains all pending shop product and being waiting the admin page to approve</w:t>
       </w:r>
       <w:r>
         <w:br/>
       </w:r>
       <w:r>
+        <w:rPr>
+          <w:noProof/>
+        </w:rPr>
         <w:drawing>
           <wp:inline distT="0" distB="0" distL="0" distR="0" wp14:anchorId="3F7E3E9D" wp14:editId="1BE9BB0B">
             <wp:extent cx="5943600" cy="3333750"/>
@@ -3254,25 +2203,15 @@
           <w:numId w:val="4"/>
         </w:numPr>
       </w:pPr>
-      <w:proofErr w:type="spellStart"/>
-      <w:r>
-        <w:t>Chờ</w:t>
-      </w:r>
-      <w:proofErr w:type="spellEnd"/>
-      <w:r>
-        <w:t xml:space="preserve"> </w:t>
-      </w:r>
-      <w:proofErr w:type="spellStart"/>
-      <w:r>
-        <w:t>duyệt</w:t>
-      </w:r>
-      <w:proofErr w:type="spellEnd"/>
-      <w:r>
-        <w:t xml:space="preserve"> shop: This is the pending status of the users requesting for become the seller.</w:t>
-      </w:r>
-    </w:p>
-    <w:p>
-      <w:r>
+      <w:r>
+        <w:t>Chờ duyệt shop: This is the pending status of the users requesting for become the seller.</w:t>
+      </w:r>
+    </w:p>
+    <w:p>
+      <w:r>
+        <w:rPr>
+          <w:noProof/>
+        </w:rPr>
         <w:lastRenderedPageBreak/>
         <w:drawing>
           <wp:inline distT="0" distB="0" distL="0" distR="0" wp14:anchorId="028782AD" wp14:editId="7F040F09">
@@ -3320,23 +2259,7 @@
         </w:numPr>
       </w:pPr>
       <w:r>
-        <w:t>Details of “</w:t>
-      </w:r>
-      <w:proofErr w:type="spellStart"/>
-      <w:r>
-        <w:t>Người</w:t>
-      </w:r>
-      <w:proofErr w:type="spellEnd"/>
-      <w:r>
-        <w:t xml:space="preserve"> </w:t>
-      </w:r>
-      <w:proofErr w:type="spellStart"/>
-      <w:r>
-        <w:t>dùng</w:t>
-      </w:r>
-      <w:proofErr w:type="spellEnd"/>
-      <w:r>
-        <w:t xml:space="preserve">”: This shows very details of the user and many activities related to User management such as Lock, promote user to Admin, </w:t>
+        <w:t xml:space="preserve">Details of “Người dùng”: This shows very details of the user and many activities related to User management such as Lock, promote user to Admin, </w:t>
       </w:r>
       <w:r>
         <w:t>denote user seller back to normal users…</w:t>
@@ -3358,10 +2281,10 @@
       <w:r>
         <w:lastRenderedPageBreak/>
         <w:drawing>
-          <wp:inline distT="0" distB="0" distL="0" distR="0" wp14:anchorId="3C76F8B7" wp14:editId="547CC34D">
-            <wp:extent cx="5943600" cy="4124325"/>
-            <wp:effectExtent l="0" t="0" r="0" b="9525"/>
-            <wp:docPr id="1523749862" name="Picture 1"/>
+          <wp:inline distT="0" distB="0" distL="0" distR="0" wp14:anchorId="31B1EC6A" wp14:editId="3C5F71CF">
+            <wp:extent cx="5943600" cy="3806190"/>
+            <wp:effectExtent l="0" t="0" r="0" b="3810"/>
+            <wp:docPr id="1880009487" name="Picture 1"/>
             <wp:cNvGraphicFramePr>
               <a:graphicFrameLocks xmlns:a="http://schemas.openxmlformats.org/drawingml/2006/main" noChangeAspect="1"/>
             </wp:cNvGraphicFramePr>
@@ -3369,7 +2292,7 @@
               <a:graphicData uri="http://schemas.openxmlformats.org/drawingml/2006/picture">
                 <pic:pic xmlns:pic="http://schemas.openxmlformats.org/drawingml/2006/picture">
                   <pic:nvPicPr>
-                    <pic:cNvPr id="1523749862" name=""/>
+                    <pic:cNvPr id="1880009487" name=""/>
                     <pic:cNvPicPr/>
                   </pic:nvPicPr>
                   <pic:blipFill>
@@ -3381,7 +2304,7 @@
                   <pic:spPr>
                     <a:xfrm>
                       <a:off x="0" y="0"/>
-                      <a:ext cx="5943600" cy="4124325"/>
+                      <a:ext cx="5943600" cy="3806190"/>
                     </a:xfrm>
                     <a:prstGeom prst="rect">
                       <a:avLst/>
@@ -3411,14 +2334,18 @@
       <w:r>
         <w:t>View details:</w:t>
       </w:r>
-    </w:p>
-    <w:p>
-      <w:r>
+      <w:r>
+        <w:t xml:space="preserve"> Admin guy can see the details of the registered users here in this screen when he click to the “eyes” icon</w:t>
+      </w:r>
+    </w:p>
+    <w:p>
+      <w:r>
+        <w:lastRenderedPageBreak/>
         <w:drawing>
-          <wp:inline distT="0" distB="0" distL="0" distR="0" wp14:anchorId="63D45F45" wp14:editId="7399F20E">
-            <wp:extent cx="5943600" cy="2961005"/>
-            <wp:effectExtent l="0" t="0" r="0" b="0"/>
-            <wp:docPr id="646291551" name="Picture 1"/>
+          <wp:inline distT="0" distB="0" distL="0" distR="0" wp14:anchorId="7C0A5B7D" wp14:editId="1448692C">
+            <wp:extent cx="5943600" cy="4494530"/>
+            <wp:effectExtent l="0" t="0" r="0" b="1270"/>
+            <wp:docPr id="70567682" name="Picture 1"/>
             <wp:cNvGraphicFramePr>
               <a:graphicFrameLocks xmlns:a="http://schemas.openxmlformats.org/drawingml/2006/main" noChangeAspect="1"/>
             </wp:cNvGraphicFramePr>
@@ -3426,7 +2353,7 @@
               <a:graphicData uri="http://schemas.openxmlformats.org/drawingml/2006/picture">
                 <pic:pic xmlns:pic="http://schemas.openxmlformats.org/drawingml/2006/picture">
                   <pic:nvPicPr>
-                    <pic:cNvPr id="646291551" name=""/>
+                    <pic:cNvPr id="70567682" name=""/>
                     <pic:cNvPicPr/>
                   </pic:nvPicPr>
                   <pic:blipFill>
@@ -3438,7 +2365,7 @@
                   <pic:spPr>
                     <a:xfrm>
                       <a:off x="0" y="0"/>
-                      <a:ext cx="5943600" cy="2961005"/>
+                      <a:ext cx="5943600" cy="4494530"/>
                     </a:xfrm>
                     <a:prstGeom prst="rect">
                       <a:avLst/>
@@ -3460,12 +2387,14 @@
         </w:numPr>
       </w:pPr>
       <w:r>
-        <w:lastRenderedPageBreak/>
         <w:t>Upgrade to admin role</w:t>
       </w:r>
     </w:p>
     <w:p>
       <w:r>
+        <w:rPr>
+          <w:noProof/>
+        </w:rPr>
         <w:drawing>
           <wp:inline distT="0" distB="0" distL="0" distR="0" wp14:anchorId="500D681A" wp14:editId="5A3A4CAB">
             <wp:extent cx="5943600" cy="2051685"/>
@@ -3517,6 +2446,10 @@
     </w:p>
     <w:p>
       <w:r>
+        <w:rPr>
+          <w:noProof/>
+        </w:rPr>
+        <w:lastRenderedPageBreak/>
         <w:drawing>
           <wp:inline distT="0" distB="0" distL="0" distR="0" wp14:anchorId="121DE39E" wp14:editId="6A9E2E71">
             <wp:extent cx="5943600" cy="2179955"/>
@@ -3568,6 +2501,9 @@
     </w:p>
     <w:p>
       <w:r>
+        <w:rPr>
+          <w:noProof/>
+        </w:rPr>
         <w:drawing>
           <wp:inline distT="0" distB="0" distL="0" distR="0" wp14:anchorId="7AB1225A" wp14:editId="31569A10">
             <wp:extent cx="5943600" cy="2390775"/>
@@ -3614,12 +2550,14 @@
         </w:numPr>
       </w:pPr>
       <w:r>
-        <w:lastRenderedPageBreak/>
         <w:t>Lock a user: Once user is blocked due to usage violation the policy then this will be locked</w:t>
       </w:r>
     </w:p>
     <w:p>
       <w:r>
+        <w:rPr>
+          <w:noProof/>
+        </w:rPr>
         <w:drawing>
           <wp:inline distT="0" distB="0" distL="0" distR="0" wp14:anchorId="29DDE5D2" wp14:editId="19F98E37">
             <wp:extent cx="5943600" cy="2066290"/>
@@ -3665,41 +2603,16 @@
           <w:numId w:val="4"/>
         </w:numPr>
       </w:pPr>
-      <w:proofErr w:type="spellStart"/>
-      <w:r>
-        <w:t>Tất</w:t>
-      </w:r>
-      <w:proofErr w:type="spellEnd"/>
-      <w:r>
-        <w:t xml:space="preserve"> </w:t>
-      </w:r>
-      <w:proofErr w:type="spellStart"/>
-      <w:r>
-        <w:t>cả</w:t>
-      </w:r>
-      <w:proofErr w:type="spellEnd"/>
-      <w:r>
-        <w:t xml:space="preserve"> </w:t>
-      </w:r>
-      <w:proofErr w:type="spellStart"/>
-      <w:r>
-        <w:t>sảm</w:t>
-      </w:r>
-      <w:proofErr w:type="spellEnd"/>
-      <w:r>
-        <w:t xml:space="preserve"> </w:t>
-      </w:r>
-      <w:proofErr w:type="spellStart"/>
-      <w:r>
-        <w:t>phẩm</w:t>
-      </w:r>
-      <w:proofErr w:type="spellEnd"/>
-      <w:r>
-        <w:t>: Show all available products from all sellers. This is also has the pagination and quick access to the product owner page (Seller page)</w:t>
-      </w:r>
-    </w:p>
-    <w:p>
-      <w:r>
+      <w:r>
+        <w:lastRenderedPageBreak/>
+        <w:t>Tất cả sảm phẩm: Show all available products from all sellers. This is also has the pagination and quick access to the product owner page (Seller page)</w:t>
+      </w:r>
+    </w:p>
+    <w:p>
+      <w:r>
+        <w:rPr>
+          <w:noProof/>
+        </w:rPr>
         <w:drawing>
           <wp:inline distT="0" distB="0" distL="0" distR="0" wp14:anchorId="4C343A43" wp14:editId="160FDF73">
             <wp:extent cx="5943600" cy="3835400"/>
@@ -3746,18 +2659,15 @@
           <w:numId w:val="4"/>
         </w:numPr>
       </w:pPr>
-      <w:proofErr w:type="spellStart"/>
-      <w:r>
-        <w:t>Duyệt</w:t>
-      </w:r>
-      <w:proofErr w:type="spellEnd"/>
-      <w:r>
-        <w:t xml:space="preserve"> shop: All seller product should be waited until got approval by Admin page and then visibility to the user (publicity).</w:t>
-      </w:r>
-    </w:p>
-    <w:p>
-      <w:r>
-        <w:lastRenderedPageBreak/>
+      <w:r>
+        <w:t>Duyệt shop: All seller product should be waited until got approval by Admin page and then visibility to the user (publicity).</w:t>
+      </w:r>
+    </w:p>
+    <w:p>
+      <w:r>
+        <w:rPr>
+          <w:noProof/>
+        </w:rPr>
         <w:drawing>
           <wp:inline distT="0" distB="0" distL="0" distR="0" wp14:anchorId="31AA88AC" wp14:editId="7139B311">
             <wp:extent cx="5943600" cy="2676525"/>
@@ -3803,25 +2713,16 @@
           <w:numId w:val="4"/>
         </w:numPr>
       </w:pPr>
-      <w:proofErr w:type="spellStart"/>
-      <w:r>
-        <w:t>Duyệt</w:t>
-      </w:r>
-      <w:proofErr w:type="spellEnd"/>
-      <w:r>
-        <w:t xml:space="preserve"> shop – </w:t>
-      </w:r>
-      <w:proofErr w:type="spellStart"/>
-      <w:r>
-        <w:t>Becom</w:t>
-      </w:r>
-      <w:proofErr w:type="spellEnd"/>
-      <w:r>
-        <w:t xml:space="preserve"> seller from user role</w:t>
-      </w:r>
-    </w:p>
-    <w:p>
-      <w:r>
+      <w:r>
+        <w:lastRenderedPageBreak/>
+        <w:t>Duyệt shop – Becom seller from user role</w:t>
+      </w:r>
+    </w:p>
+    <w:p>
+      <w:r>
+        <w:rPr>
+          <w:noProof/>
+        </w:rPr>
         <w:drawing>
           <wp:inline distT="0" distB="0" distL="0" distR="0" wp14:anchorId="2A74FB5F" wp14:editId="03D13278">
             <wp:extent cx="5943600" cy="2482215"/>
@@ -3868,25 +2769,14 @@
         </w:numPr>
       </w:pPr>
       <w:r>
-        <w:t xml:space="preserve">Báo </w:t>
-      </w:r>
-      <w:proofErr w:type="spellStart"/>
-      <w:r>
-        <w:t>cáo</w:t>
-      </w:r>
-      <w:proofErr w:type="spellEnd"/>
-      <w:r>
-        <w:t xml:space="preserve"> vi </w:t>
-      </w:r>
-      <w:proofErr w:type="spellStart"/>
-      <w:r>
-        <w:t>phạm</w:t>
-      </w:r>
-      <w:proofErr w:type="spellEnd"/>
-    </w:p>
-    <w:p>
-      <w:r>
-        <w:lastRenderedPageBreak/>
+        <w:t>Báo cáo vi phạm</w:t>
+      </w:r>
+    </w:p>
+    <w:p>
+      <w:r>
+        <w:rPr>
+          <w:noProof/>
+        </w:rPr>
         <w:drawing>
           <wp:inline distT="0" distB="0" distL="0" distR="0" wp14:anchorId="06A79DA9" wp14:editId="5420E114">
             <wp:extent cx="5943600" cy="2229485"/>
@@ -3934,32 +2824,15 @@
         </w:numPr>
       </w:pPr>
       <w:r>
-        <w:t xml:space="preserve">Quản </w:t>
-      </w:r>
-      <w:proofErr w:type="spellStart"/>
-      <w:r>
-        <w:t>lý</w:t>
-      </w:r>
-      <w:proofErr w:type="spellEnd"/>
-      <w:r>
-        <w:t xml:space="preserve"> </w:t>
-      </w:r>
-      <w:proofErr w:type="spellStart"/>
-      <w:r>
-        <w:t>đánh</w:t>
-      </w:r>
-      <w:proofErr w:type="spellEnd"/>
-      <w:r>
-        <w:t xml:space="preserve"> </w:t>
-      </w:r>
-      <w:proofErr w:type="spellStart"/>
-      <w:r>
-        <w:t>giá</w:t>
-      </w:r>
-      <w:proofErr w:type="spellEnd"/>
-    </w:p>
-    <w:p>
-      <w:r>
+        <w:t>Quản lý đánh giá</w:t>
+      </w:r>
+    </w:p>
+    <w:p>
+      <w:r>
+        <w:rPr>
+          <w:noProof/>
+        </w:rPr>
+        <w:lastRenderedPageBreak/>
         <w:drawing>
           <wp:inline distT="0" distB="0" distL="0" distR="0" wp14:anchorId="52688553" wp14:editId="3164E104">
             <wp:extent cx="5943600" cy="3026410"/>
@@ -4006,27 +2879,14 @@
         </w:numPr>
       </w:pPr>
       <w:r>
-        <w:t xml:space="preserve">Quản </w:t>
-      </w:r>
-      <w:proofErr w:type="spellStart"/>
-      <w:r>
-        <w:t>lý</w:t>
-      </w:r>
-      <w:proofErr w:type="spellEnd"/>
-      <w:r>
-        <w:t xml:space="preserve"> </w:t>
-      </w:r>
-      <w:proofErr w:type="spellStart"/>
-      <w:r>
-        <w:t>nội</w:t>
-      </w:r>
-      <w:proofErr w:type="spellEnd"/>
-      <w:r>
-        <w:t xml:space="preserve"> dung</w:t>
-      </w:r>
-    </w:p>
-    <w:p>
-      <w:r>
+        <w:t>Quản lý nội dung</w:t>
+      </w:r>
+    </w:p>
+    <w:p>
+      <w:r>
+        <w:rPr>
+          <w:noProof/>
+        </w:rPr>
         <w:lastRenderedPageBreak/>
         <w:drawing>
           <wp:inline distT="0" distB="0" distL="0" distR="0" wp14:anchorId="4E82F915" wp14:editId="411F0EA8">
@@ -4075,44 +2935,15 @@
         </w:numPr>
       </w:pPr>
       <w:r>
-        <w:t xml:space="preserve">Danh </w:t>
-      </w:r>
-      <w:proofErr w:type="spellStart"/>
-      <w:r>
-        <w:t>mục</w:t>
-      </w:r>
-      <w:proofErr w:type="spellEnd"/>
-      <w:r>
-        <w:t xml:space="preserve"> </w:t>
-      </w:r>
-      <w:proofErr w:type="spellStart"/>
-      <w:r>
-        <w:t>báo</w:t>
-      </w:r>
-      <w:proofErr w:type="spellEnd"/>
-      <w:r>
-        <w:t xml:space="preserve"> </w:t>
-      </w:r>
-      <w:proofErr w:type="spellStart"/>
-      <w:r>
-        <w:t>cáo</w:t>
-      </w:r>
-      <w:proofErr w:type="spellEnd"/>
-      <w:r>
-        <w:t xml:space="preserve">: This helps the admin to configure the “ Danh </w:t>
-      </w:r>
-      <w:proofErr w:type="spellStart"/>
-      <w:r>
-        <w:t>Muc</w:t>
-      </w:r>
-      <w:proofErr w:type="spellEnd"/>
-      <w:r>
-        <w:t xml:space="preserve"> Bao Cáo” that help users have quick chose the category they want to report</w:t>
+        <w:t>Danh mục báo cáo: This helps the admin to configure the “ Danh Muc Bao Cáo” that help users have quick chose the category they want to report</w:t>
       </w:r>
     </w:p>
     <w:p/>
     <w:p>
       <w:r>
+        <w:rPr>
+          <w:noProof/>
+        </w:rPr>
         <w:lastRenderedPageBreak/>
         <w:drawing>
           <wp:inline distT="0" distB="0" distL="0" distR="0" wp14:anchorId="26B2DBFF" wp14:editId="4AEFAE7E">
@@ -4161,35 +2992,14 @@
         </w:numPr>
       </w:pPr>
       <w:r>
-        <w:t xml:space="preserve">Nhật </w:t>
-      </w:r>
-      <w:proofErr w:type="spellStart"/>
-      <w:r>
-        <w:t>ký</w:t>
-      </w:r>
-      <w:proofErr w:type="spellEnd"/>
-      <w:r>
-        <w:t xml:space="preserve"> </w:t>
-      </w:r>
-      <w:proofErr w:type="spellStart"/>
-      <w:r>
-        <w:t>hệ</w:t>
-      </w:r>
-      <w:proofErr w:type="spellEnd"/>
-      <w:r>
-        <w:t xml:space="preserve"> </w:t>
-      </w:r>
-      <w:proofErr w:type="spellStart"/>
-      <w:r>
-        <w:t>thống</w:t>
-      </w:r>
-      <w:proofErr w:type="spellEnd"/>
-      <w:r>
-        <w:t>: This help admin to trach what activities were happened in the past</w:t>
-      </w:r>
-    </w:p>
-    <w:p>
-      <w:r>
+        <w:t>Nhật ký hệ thống: This help admin to trach what activities were happened in the past</w:t>
+      </w:r>
+    </w:p>
+    <w:p>
+      <w:r>
+        <w:rPr>
+          <w:noProof/>
+        </w:rPr>
         <w:drawing>
           <wp:inline distT="0" distB="0" distL="0" distR="0" wp14:anchorId="796C2284" wp14:editId="45906D03">
             <wp:extent cx="5943600" cy="3743325"/>
@@ -4376,11 +3186,9 @@
             <w:hideMark/>
           </w:tcPr>
           <w:p>
-            <w:proofErr w:type="spellStart"/>
             <w:r>
               <w:t>audit_logs</w:t>
             </w:r>
-            <w:proofErr w:type="spellEnd"/>
           </w:p>
         </w:tc>
         <w:tc>
@@ -4413,11 +3221,9 @@
             <w:hideMark/>
           </w:tcPr>
           <w:p>
-            <w:proofErr w:type="spellStart"/>
             <w:r>
               <w:t>bank_accounts</w:t>
             </w:r>
-            <w:proofErr w:type="spellEnd"/>
           </w:p>
         </w:tc>
         <w:tc>
@@ -4485,11 +3291,9 @@
             <w:hideMark/>
           </w:tcPr>
           <w:p>
-            <w:proofErr w:type="spellStart"/>
             <w:r>
               <w:t>chat_messages</w:t>
             </w:r>
-            <w:proofErr w:type="spellEnd"/>
           </w:p>
         </w:tc>
         <w:tc>
@@ -4522,11 +3326,9 @@
             <w:hideMark/>
           </w:tcPr>
           <w:p>
-            <w:proofErr w:type="spellStart"/>
             <w:r>
               <w:t>content_nodes</w:t>
             </w:r>
-            <w:proofErr w:type="spellEnd"/>
           </w:p>
         </w:tc>
         <w:tc>
@@ -4559,11 +3361,9 @@
             <w:hideMark/>
           </w:tcPr>
           <w:p>
-            <w:proofErr w:type="spellStart"/>
             <w:r>
               <w:t>feedback_templates</w:t>
             </w:r>
-            <w:proofErr w:type="spellEnd"/>
           </w:p>
         </w:tc>
         <w:tc>
@@ -4596,11 +3396,9 @@
             <w:hideMark/>
           </w:tcPr>
           <w:p>
-            <w:proofErr w:type="spellStart"/>
             <w:r>
               <w:t>footer_icons</w:t>
             </w:r>
-            <w:proofErr w:type="spellEnd"/>
           </w:p>
         </w:tc>
         <w:tc>
@@ -4633,11 +3431,9 @@
             <w:hideMark/>
           </w:tcPr>
           <w:p>
-            <w:proofErr w:type="spellStart"/>
             <w:r>
               <w:t>footer_menus</w:t>
             </w:r>
-            <w:proofErr w:type="spellEnd"/>
           </w:p>
         </w:tc>
         <w:tc>
@@ -4670,11 +3466,9 @@
             <w:hideMark/>
           </w:tcPr>
           <w:p>
-            <w:proofErr w:type="spellStart"/>
             <w:r>
               <w:t>help_nodes</w:t>
             </w:r>
-            <w:proofErr w:type="spellEnd"/>
           </w:p>
         </w:tc>
         <w:tc>
@@ -4777,11 +3571,9 @@
             <w:hideMark/>
           </w:tcPr>
           <w:p>
-            <w:proofErr w:type="spellStart"/>
             <w:r>
               <w:t>password_reset_tokens</w:t>
             </w:r>
-            <w:proofErr w:type="spellEnd"/>
           </w:p>
         </w:tc>
         <w:tc>
@@ -4814,11 +3606,9 @@
             <w:hideMark/>
           </w:tcPr>
           <w:p>
-            <w:proofErr w:type="spellStart"/>
             <w:r>
               <w:t>product_reports</w:t>
             </w:r>
-            <w:proofErr w:type="spellEnd"/>
           </w:p>
         </w:tc>
         <w:tc>
@@ -4886,11 +3676,9 @@
             <w:hideMark/>
           </w:tcPr>
           <w:p>
-            <w:proofErr w:type="spellStart"/>
             <w:r>
               <w:t>report_reasons</w:t>
             </w:r>
-            <w:proofErr w:type="spellEnd"/>
           </w:p>
         </w:tc>
         <w:tc>
@@ -4958,11 +3746,9 @@
             <w:hideMark/>
           </w:tcPr>
           <w:p>
-            <w:proofErr w:type="spellStart"/>
             <w:r>
               <w:t>shipping_methods</w:t>
             </w:r>
-            <w:proofErr w:type="spellEnd"/>
           </w:p>
         </w:tc>
         <w:tc>
@@ -4995,11 +3781,9 @@
             <w:hideMark/>
           </w:tcPr>
           <w:p>
-            <w:proofErr w:type="spellStart"/>
             <w:r>
               <w:t>system_contents</w:t>
             </w:r>
-            <w:proofErr w:type="spellEnd"/>
           </w:p>
         </w:tc>
         <w:tc>
@@ -5069,11 +3853,9 @@
             <w:vAlign w:val="center"/>
           </w:tcPr>
           <w:p>
-            <w:proofErr w:type="spellStart"/>
             <w:r>
               <w:t>withdrawal_requests</w:t>
             </w:r>
-            <w:proofErr w:type="spellEnd"/>
           </w:p>
         </w:tc>
         <w:tc>

</xml_diff>

<commit_message>
Updated code for shop setting
</commit_message>
<xml_diff>
--- a/AiNetsoft Functions Description.docx
+++ b/AiNetsoft Functions Description.docx
@@ -171,7 +171,19 @@
       </w:pPr>
       <w:r>
         <w:lastRenderedPageBreak/>
-        <w:t>Địa chỉ nhận hang: Users can update data here. This is also synced to the Seller registry from if use request to become a Seller</w:t>
+        <w:t xml:space="preserve">Địa chỉ </w:t>
+      </w:r>
+      <w:r>
+        <w:t>ng</w:t>
+      </w:r>
+      <w:r>
+        <w:t>ận h</w:t>
+      </w:r>
+      <w:r>
+        <w:t>àng</w:t>
+      </w:r>
+      <w:r>
+        <w:t>: Users can update data here. This is also synced to the Seller registry from if use request to become a Seller</w:t>
       </w:r>
     </w:p>
     <w:p>
@@ -2279,6 +2291,9 @@
     </w:p>
     <w:p>
       <w:r>
+        <w:rPr>
+          <w:noProof/>
+        </w:rPr>
         <w:lastRenderedPageBreak/>
         <w:drawing>
           <wp:inline distT="0" distB="0" distL="0" distR="0" wp14:anchorId="31B1EC6A" wp14:editId="3C5F71CF">
@@ -2340,6 +2355,9 @@
     </w:p>
     <w:p>
       <w:r>
+        <w:rPr>
+          <w:noProof/>
+        </w:rPr>
         <w:lastRenderedPageBreak/>
         <w:drawing>
           <wp:inline distT="0" distB="0" distL="0" distR="0" wp14:anchorId="7C0A5B7D" wp14:editId="1448692C">

</xml_diff>

<commit_message>
Update code for user view with sufficient content
</commit_message>
<xml_diff>
--- a/AiNetsoft Functions Description.docx
+++ b/AiNetsoft Functions Description.docx
@@ -113,10 +113,28 @@
         </w:numPr>
       </w:pPr>
       <w:r>
-        <w:t>Tài khoản ngân hang is being s</w:t>
-      </w:r>
-      <w:r>
-        <w:t>tored in the bank_account collection. This also be sync when user request to become a Seller</w:t>
+        <w:t>Tài khoản ngân h</w:t>
+      </w:r>
+      <w:r>
+        <w:t>à</w:t>
+      </w:r>
+      <w:r>
+        <w:t>ng is being s</w:t>
+      </w:r>
+      <w:r>
+        <w:t xml:space="preserve">tored in the bank_account </w:t>
+      </w:r>
+      <w:r>
+        <w:t xml:space="preserve">database </w:t>
+      </w:r>
+      <w:r>
+        <w:t>collection. This also be sync</w:t>
+      </w:r>
+      <w:r>
+        <w:t>ed</w:t>
+      </w:r>
+      <w:r>
+        <w:t xml:space="preserve"> when user request to become a Seller</w:t>
       </w:r>
     </w:p>
     <w:p>
@@ -689,7 +707,13 @@
     </w:p>
     <w:p>
       <w:r>
-        <w:t>Personal business( Same screen for Company business)</w:t>
+        <w:t xml:space="preserve">Personal </w:t>
+      </w:r>
+      <w:r>
+        <w:t>business(Same</w:t>
+      </w:r>
+      <w:r>
+        <w:t xml:space="preserve"> screen for Company business)</w:t>
       </w:r>
     </w:p>
     <w:p>
@@ -796,13 +820,22 @@
     <w:p/>
     <w:p>
       <w:r>
-        <w:t xml:space="preserve">Users will be denied moving to next steps if checking failed the result and ask the user </w:t>
+        <w:t xml:space="preserve">Users will be denied moving to next steps </w:t>
+      </w:r>
+      <w:r>
+        <w:t>if they check</w:t>
+      </w:r>
+      <w:r>
+        <w:t xml:space="preserve"> the result and ask the user </w:t>
       </w:r>
       <w:r>
         <w:t>must</w:t>
       </w:r>
       <w:r>
         <w:t xml:space="preserve"> verify and update the correct information</w:t>
+      </w:r>
+      <w:r>
+        <w:t>.</w:t>
       </w:r>
     </w:p>
     <w:p>
@@ -1031,7 +1064,13 @@
         <w:tab/>
       </w:r>
       <w:r>
-        <w:t>"Hồ sơ đang chờ phê duyệtYêu cầu đăng ký Người bán của bạn đã được tiếp nhận. Đội ngũ kiểm duyệt sẽ phản hồi trong vòng 24 giờ làm việc."</w:t>
+        <w:t>"Hồ sơ đang chờ phê duyệt</w:t>
+      </w:r>
+      <w:r>
+        <w:t xml:space="preserve">. </w:t>
+      </w:r>
+      <w:r>
+        <w:t>Yêu cầu đăng ký Người bán của bạn đã được tiếp nhận. Đội ngũ kiểm duyệt sẽ phản hồi trong vòng 24 giờ làm việc."</w:t>
       </w:r>
     </w:p>
     <w:p>
@@ -1041,7 +1080,10 @@
       </w:r>
       <w:r>
         <w:tab/>
-        <w:t>An email to the requester to confirm admin received the request and will check and appove</w:t>
+        <w:t xml:space="preserve">An email to the requester to confirm admin received the request and will check and </w:t>
+      </w:r>
+      <w:r>
+        <w:t>approve</w:t>
       </w:r>
     </w:p>
     <w:p>
@@ -1095,7 +1137,13 @@
         <w:t>notification</w:t>
       </w:r>
       <w:r>
-        <w:t xml:space="preserve"> in the link /seller/register  the </w:t>
+        <w:t xml:space="preserve"> in the link /seller/</w:t>
+      </w:r>
+      <w:r>
+        <w:t>register the</w:t>
+      </w:r>
+      <w:r>
+        <w:t xml:space="preserve"> </w:t>
       </w:r>
       <w:r>
         <w:t>progress</w:t>
@@ -1408,10 +1456,27 @@
       </w:r>
     </w:p>
     <w:p>
-      <w:r>
+      <w:pPr>
+        <w:rPr>
+          <w:b/>
+          <w:bCs/>
+          <w:color w:val="EE0000"/>
+        </w:rPr>
+      </w:pPr>
+      <w:r>
+        <w:rPr>
+          <w:b/>
+          <w:bCs/>
+          <w:color w:val="EE0000"/>
+        </w:rPr>
         <w:t>3. Seller Admin Dashboard</w:t>
       </w:r>
       <w:r>
+        <w:rPr>
+          <w:b/>
+          <w:bCs/>
+          <w:color w:val="EE0000"/>
+        </w:rPr>
         <w:t>:</w:t>
       </w:r>
     </w:p>
@@ -1568,7 +1633,10 @@
     <w:p/>
     <w:p>
       <w:r>
-        <w:t>Quản lý đơn hang</w:t>
+        <w:t xml:space="preserve">Quản lý đơn </w:t>
+      </w:r>
+      <w:r>
+        <w:t>hang:</w:t>
       </w:r>
     </w:p>
     <w:p/>
@@ -1623,14 +1691,11 @@
     </w:p>
     <w:p>
       <w:r>
-        <w:rPr>
-          <w:noProof/>
-        </w:rPr>
         <w:drawing>
-          <wp:inline distT="0" distB="0" distL="0" distR="0" wp14:anchorId="71E5661F" wp14:editId="2881753B">
-            <wp:extent cx="5943600" cy="4066540"/>
-            <wp:effectExtent l="0" t="0" r="0" b="0"/>
-            <wp:docPr id="502501156" name="Picture 1"/>
+          <wp:inline distT="0" distB="0" distL="0" distR="0" wp14:anchorId="5CF0D2AB" wp14:editId="46ACCEA2">
+            <wp:extent cx="5943600" cy="2814955"/>
+            <wp:effectExtent l="0" t="0" r="0" b="4445"/>
+            <wp:docPr id="971468143" name="Picture 1"/>
             <wp:cNvGraphicFramePr>
               <a:graphicFrameLocks xmlns:a="http://schemas.openxmlformats.org/drawingml/2006/main" noChangeAspect="1"/>
             </wp:cNvGraphicFramePr>
@@ -1638,7 +1703,7 @@
               <a:graphicData uri="http://schemas.openxmlformats.org/drawingml/2006/picture">
                 <pic:pic xmlns:pic="http://schemas.openxmlformats.org/drawingml/2006/picture">
                   <pic:nvPicPr>
-                    <pic:cNvPr id="502501156" name=""/>
+                    <pic:cNvPr id="971468143" name=""/>
                     <pic:cNvPicPr/>
                   </pic:nvPicPr>
                   <pic:blipFill>
@@ -1650,7 +1715,7 @@
                   <pic:spPr>
                     <a:xfrm>
                       <a:off x="0" y="0"/>
-                      <a:ext cx="5943600" cy="4066540"/>
+                      <a:ext cx="5943600" cy="2814955"/>
                     </a:xfrm>
                     <a:prstGeom prst="rect">
                       <a:avLst/>
@@ -1664,6 +1729,52 @@
       </w:r>
     </w:p>
     <w:p>
+      <w:r>
+        <w:t>In the case of the seller who needs to change or update any information here, they need to wait until the changes are approved by Admin page. See below for the notification after submitting the changes</w:t>
+      </w:r>
+    </w:p>
+    <w:p>
+      <w:r>
+        <w:lastRenderedPageBreak/>
+        <w:drawing>
+          <wp:inline distT="0" distB="0" distL="0" distR="0" wp14:anchorId="3DBF79FC" wp14:editId="145C3BD9">
+            <wp:extent cx="5943600" cy="3652520"/>
+            <wp:effectExtent l="0" t="0" r="0" b="5080"/>
+            <wp:docPr id="354839155" name="Picture 1"/>
+            <wp:cNvGraphicFramePr>
+              <a:graphicFrameLocks xmlns:a="http://schemas.openxmlformats.org/drawingml/2006/main" noChangeAspect="1"/>
+            </wp:cNvGraphicFramePr>
+            <a:graphic xmlns:a="http://schemas.openxmlformats.org/drawingml/2006/main">
+              <a:graphicData uri="http://schemas.openxmlformats.org/drawingml/2006/picture">
+                <pic:pic xmlns:pic="http://schemas.openxmlformats.org/drawingml/2006/picture">
+                  <pic:nvPicPr>
+                    <pic:cNvPr id="354839155" name=""/>
+                    <pic:cNvPicPr/>
+                  </pic:nvPicPr>
+                  <pic:blipFill>
+                    <a:blip r:embed="rId31"/>
+                    <a:stretch>
+                      <a:fillRect/>
+                    </a:stretch>
+                  </pic:blipFill>
+                  <pic:spPr>
+                    <a:xfrm>
+                      <a:off x="0" y="0"/>
+                      <a:ext cx="5943600" cy="3652520"/>
+                    </a:xfrm>
+                    <a:prstGeom prst="rect">
+                      <a:avLst/>
+                    </a:prstGeom>
+                  </pic:spPr>
+                </pic:pic>
+              </a:graphicData>
+            </a:graphic>
+          </wp:inline>
+        </w:drawing>
+      </w:r>
+    </w:p>
+    <w:p/>
+    <w:p>
       <w:pPr>
         <w:pStyle w:val="ListParagraph"/>
         <w:numPr>
@@ -1672,7 +1783,6 @@
         </w:numPr>
       </w:pPr>
       <w:r>
-        <w:lastRenderedPageBreak/>
         <w:t>Money withdraw request: Seller can ask ainetsoft for a payment withdraw with the details form as below</w:t>
       </w:r>
     </w:p>
@@ -1697,7 +1807,7 @@
                     <pic:cNvPicPr/>
                   </pic:nvPicPr>
                   <pic:blipFill>
-                    <a:blip r:embed="rId31"/>
+                    <a:blip r:embed="rId32"/>
                     <a:stretch>
                       <a:fillRect/>
                     </a:stretch>
@@ -1754,7 +1864,7 @@
                     <pic:cNvPicPr/>
                   </pic:nvPicPr>
                   <pic:blipFill>
-                    <a:blip r:embed="rId32"/>
+                    <a:blip r:embed="rId33"/>
                     <a:stretch>
                       <a:fillRect/>
                     </a:stretch>
@@ -1810,7 +1920,6 @@
         <w:rPr>
           <w:noProof/>
         </w:rPr>
-        <w:lastRenderedPageBreak/>
         <w:drawing>
           <wp:inline distT="0" distB="0" distL="0" distR="0" wp14:anchorId="46AF4CCB" wp14:editId="19F19FB7">
             <wp:extent cx="5943600" cy="2252980"/>
@@ -1827,7 +1936,7 @@
                     <pic:cNvPicPr/>
                   </pic:nvPicPr>
                   <pic:blipFill>
-                    <a:blip r:embed="rId33"/>
+                    <a:blip r:embed="rId34"/>
                     <a:stretch>
                       <a:fillRect/>
                     </a:stretch>
@@ -1866,6 +1975,7 @@
         <w:rPr>
           <w:noProof/>
         </w:rPr>
+        <w:lastRenderedPageBreak/>
         <w:drawing>
           <wp:inline distT="0" distB="0" distL="0" distR="0" wp14:anchorId="01D8CA9D" wp14:editId="6980E033">
             <wp:extent cx="5943600" cy="2715260"/>
@@ -1882,7 +1992,7 @@
                     <pic:cNvPicPr/>
                   </pic:nvPicPr>
                   <pic:blipFill>
-                    <a:blip r:embed="rId34"/>
+                    <a:blip r:embed="rId35"/>
                     <a:stretch>
                       <a:fillRect/>
                     </a:stretch>
@@ -1926,7 +2036,6 @@
         <w:rPr>
           <w:noProof/>
         </w:rPr>
-        <w:lastRenderedPageBreak/>
         <w:drawing>
           <wp:inline distT="0" distB="0" distL="0" distR="0" wp14:anchorId="21DAC788" wp14:editId="66A947E7">
             <wp:extent cx="5943600" cy="1638935"/>
@@ -1943,7 +2052,7 @@
                     <pic:cNvPicPr/>
                   </pic:nvPicPr>
                   <pic:blipFill>
-                    <a:blip r:embed="rId35"/>
+                    <a:blip r:embed="rId36"/>
                     <a:stretch>
                       <a:fillRect/>
                     </a:stretch>
@@ -1971,6 +2080,7 @@
     </w:p>
     <w:p>
       <w:r>
+        <w:lastRenderedPageBreak/>
         <w:t>There is a filtering box that help the users can filter based on what that want for the seller request status</w:t>
       </w:r>
       <w:r>
@@ -1996,7 +2106,7 @@
                     <pic:cNvPicPr/>
                   </pic:nvPicPr>
                   <pic:blipFill>
-                    <a:blip r:embed="rId36"/>
+                    <a:blip r:embed="rId37"/>
                     <a:stretch>
                       <a:fillRect/>
                     </a:stretch>
@@ -2046,7 +2156,6 @@
         <w:rPr>
           <w:noProof/>
         </w:rPr>
-        <w:lastRenderedPageBreak/>
         <w:drawing>
           <wp:inline distT="0" distB="0" distL="0" distR="0" wp14:anchorId="57E58A03" wp14:editId="1993E0F0">
             <wp:extent cx="5943600" cy="3883025"/>
@@ -2063,7 +2172,7 @@
                     <pic:cNvPicPr/>
                   </pic:nvPicPr>
                   <pic:blipFill>
-                    <a:blip r:embed="rId37"/>
+                    <a:blip r:embed="rId38"/>
                     <a:stretch>
                       <a:fillRect/>
                     </a:stretch>
@@ -2105,6 +2214,7 @@
         </w:numPr>
       </w:pPr>
       <w:r>
+        <w:lastRenderedPageBreak/>
         <w:t>Sản phẩm: Show all products which the system is having. There is a quick access to the Seller pages</w:t>
       </w:r>
     </w:p>
@@ -2113,7 +2223,6 @@
         <w:rPr>
           <w:noProof/>
         </w:rPr>
-        <w:lastRenderedPageBreak/>
         <w:drawing>
           <wp:inline distT="0" distB="0" distL="0" distR="0" wp14:anchorId="6B5994E1" wp14:editId="41E9937E">
             <wp:extent cx="5943600" cy="3467735"/>
@@ -2130,7 +2239,7 @@
                     <pic:cNvPicPr/>
                   </pic:nvPicPr>
                   <pic:blipFill>
-                    <a:blip r:embed="rId38"/>
+                    <a:blip r:embed="rId39"/>
                     <a:stretch>
                       <a:fillRect/>
                     </a:stretch>
@@ -2186,7 +2295,7 @@
                     <pic:cNvPicPr/>
                   </pic:nvPicPr>
                   <pic:blipFill>
-                    <a:blip r:embed="rId39"/>
+                    <a:blip r:embed="rId40"/>
                     <a:stretch>
                       <a:fillRect/>
                     </a:stretch>
@@ -2216,6 +2325,7 @@
         </w:numPr>
       </w:pPr>
       <w:r>
+        <w:lastRenderedPageBreak/>
         <w:t>Chờ duyệt shop: This is the pending status of the users requesting for become the seller.</w:t>
       </w:r>
     </w:p>
@@ -2224,7 +2334,6 @@
         <w:rPr>
           <w:noProof/>
         </w:rPr>
-        <w:lastRenderedPageBreak/>
         <w:drawing>
           <wp:inline distT="0" distB="0" distL="0" distR="0" wp14:anchorId="028782AD" wp14:editId="7F040F09">
             <wp:extent cx="5943600" cy="3910965"/>
@@ -2241,7 +2350,7 @@
                     <pic:cNvPicPr/>
                   </pic:nvPicPr>
                   <pic:blipFill>
-                    <a:blip r:embed="rId40"/>
+                    <a:blip r:embed="rId41"/>
                     <a:stretch>
                       <a:fillRect/>
                     </a:stretch>
@@ -2311,7 +2420,7 @@
                     <pic:cNvPicPr/>
                   </pic:nvPicPr>
                   <pic:blipFill>
-                    <a:blip r:embed="rId41"/>
+                    <a:blip r:embed="rId42"/>
                     <a:stretch>
                       <a:fillRect/>
                     </a:stretch>
@@ -2350,20 +2459,23 @@
         <w:t>View details:</w:t>
       </w:r>
       <w:r>
-        <w:t xml:space="preserve"> Admin guy can see the details of the registered users here in this screen when he click to the “eyes” icon</w:t>
-      </w:r>
-    </w:p>
-    <w:p>
-      <w:r>
-        <w:rPr>
-          <w:noProof/>
-        </w:rPr>
+        <w:t xml:space="preserve"> Admin guy can see the details of the registered users here in this screen when he </w:t>
+      </w:r>
+      <w:r>
+        <w:t>clicks</w:t>
+      </w:r>
+      <w:r>
+        <w:t xml:space="preserve"> to the “eyes” icon</w:t>
+      </w:r>
+    </w:p>
+    <w:p>
+      <w:r>
         <w:lastRenderedPageBreak/>
         <w:drawing>
-          <wp:inline distT="0" distB="0" distL="0" distR="0" wp14:anchorId="7C0A5B7D" wp14:editId="1448692C">
-            <wp:extent cx="5943600" cy="4494530"/>
-            <wp:effectExtent l="0" t="0" r="0" b="1270"/>
-            <wp:docPr id="70567682" name="Picture 1"/>
+          <wp:inline distT="0" distB="0" distL="0" distR="0" wp14:anchorId="6B86C3D4" wp14:editId="570808DF">
+            <wp:extent cx="5943600" cy="5777230"/>
+            <wp:effectExtent l="0" t="0" r="0" b="0"/>
+            <wp:docPr id="390823864" name="Picture 1"/>
             <wp:cNvGraphicFramePr>
               <a:graphicFrameLocks xmlns:a="http://schemas.openxmlformats.org/drawingml/2006/main" noChangeAspect="1"/>
             </wp:cNvGraphicFramePr>
@@ -2371,11 +2483,11 @@
               <a:graphicData uri="http://schemas.openxmlformats.org/drawingml/2006/picture">
                 <pic:pic xmlns:pic="http://schemas.openxmlformats.org/drawingml/2006/picture">
                   <pic:nvPicPr>
-                    <pic:cNvPr id="70567682" name=""/>
+                    <pic:cNvPr id="390823864" name=""/>
                     <pic:cNvPicPr/>
                   </pic:nvPicPr>
                   <pic:blipFill>
-                    <a:blip r:embed="rId42"/>
+                    <a:blip r:embed="rId43"/>
                     <a:stretch>
                       <a:fillRect/>
                     </a:stretch>
@@ -2383,7 +2495,7 @@
                   <pic:spPr>
                     <a:xfrm>
                       <a:off x="0" y="0"/>
-                      <a:ext cx="5943600" cy="4494530"/>
+                      <a:ext cx="5943600" cy="5777230"/>
                     </a:xfrm>
                     <a:prstGeom prst="rect">
                       <a:avLst/>
@@ -2413,6 +2525,7 @@
         <w:rPr>
           <w:noProof/>
         </w:rPr>
+        <w:lastRenderedPageBreak/>
         <w:drawing>
           <wp:inline distT="0" distB="0" distL="0" distR="0" wp14:anchorId="500D681A" wp14:editId="5A3A4CAB">
             <wp:extent cx="5943600" cy="2051685"/>
@@ -2429,7 +2542,7 @@
                     <pic:cNvPicPr/>
                   </pic:nvPicPr>
                   <pic:blipFill>
-                    <a:blip r:embed="rId43"/>
+                    <a:blip r:embed="rId44"/>
                     <a:stretch>
                       <a:fillRect/>
                     </a:stretch>
@@ -2467,7 +2580,6 @@
         <w:rPr>
           <w:noProof/>
         </w:rPr>
-        <w:lastRenderedPageBreak/>
         <w:drawing>
           <wp:inline distT="0" distB="0" distL="0" distR="0" wp14:anchorId="121DE39E" wp14:editId="6A9E2E71">
             <wp:extent cx="5943600" cy="2179955"/>
@@ -2484,7 +2596,7 @@
                     <pic:cNvPicPr/>
                   </pic:nvPicPr>
                   <pic:blipFill>
-                    <a:blip r:embed="rId44"/>
+                    <a:blip r:embed="rId45"/>
                     <a:stretch>
                       <a:fillRect/>
                     </a:stretch>
@@ -2538,7 +2650,7 @@
                     <pic:cNvPicPr/>
                   </pic:nvPicPr>
                   <pic:blipFill>
-                    <a:blip r:embed="rId45"/>
+                    <a:blip r:embed="rId46"/>
                     <a:stretch>
                       <a:fillRect/>
                     </a:stretch>
@@ -2576,6 +2688,7 @@
         <w:rPr>
           <w:noProof/>
         </w:rPr>
+        <w:lastRenderedPageBreak/>
         <w:drawing>
           <wp:inline distT="0" distB="0" distL="0" distR="0" wp14:anchorId="29DDE5D2" wp14:editId="19F98E37">
             <wp:extent cx="5943600" cy="2066290"/>
@@ -2592,7 +2705,7 @@
                     <pic:cNvPicPr/>
                   </pic:nvPicPr>
                   <pic:blipFill>
-                    <a:blip r:embed="rId46"/>
+                    <a:blip r:embed="rId47"/>
                     <a:stretch>
                       <a:fillRect/>
                     </a:stretch>
@@ -2622,7 +2735,6 @@
         </w:numPr>
       </w:pPr>
       <w:r>
-        <w:lastRenderedPageBreak/>
         <w:t>Tất cả sảm phẩm: Show all available products from all sellers. This is also has the pagination and quick access to the product owner page (Seller page)</w:t>
       </w:r>
     </w:p>
@@ -2647,7 +2759,7 @@
                     <pic:cNvPicPr/>
                   </pic:nvPicPr>
                   <pic:blipFill>
-                    <a:blip r:embed="rId47"/>
+                    <a:blip r:embed="rId48"/>
                     <a:stretch>
                       <a:fillRect/>
                     </a:stretch>
@@ -2678,7 +2790,13 @@
         </w:numPr>
       </w:pPr>
       <w:r>
-        <w:t>Duyệt shop: All seller product should be waited until got approval by Admin page and then visibility to the user (publicity).</w:t>
+        <w:t xml:space="preserve">Duyệt shop: All seller </w:t>
+      </w:r>
+      <w:r>
+        <w:t>products</w:t>
+      </w:r>
+      <w:r>
+        <w:t xml:space="preserve"> should be waited until got approval by Admin page and then visibility to the user (publicity).</w:t>
       </w:r>
     </w:p>
     <w:p>
@@ -2686,6 +2804,7 @@
         <w:rPr>
           <w:noProof/>
         </w:rPr>
+        <w:lastRenderedPageBreak/>
         <w:drawing>
           <wp:inline distT="0" distB="0" distL="0" distR="0" wp14:anchorId="31AA88AC" wp14:editId="7139B311">
             <wp:extent cx="5943600" cy="2676525"/>
@@ -2702,7 +2821,7 @@
                     <pic:cNvPicPr/>
                   </pic:nvPicPr>
                   <pic:blipFill>
-                    <a:blip r:embed="rId48"/>
+                    <a:blip r:embed="rId49"/>
                     <a:stretch>
                       <a:fillRect/>
                     </a:stretch>
@@ -2732,15 +2851,70 @@
         </w:numPr>
       </w:pPr>
       <w:r>
-        <w:lastRenderedPageBreak/>
-        <w:t>Duyệt shop – Becom seller from user role</w:t>
-      </w:r>
-    </w:p>
+        <w:t xml:space="preserve">Duyệt shop – </w:t>
+      </w:r>
+      <w:r>
+        <w:t>Become</w:t>
+      </w:r>
+      <w:r>
+        <w:t xml:space="preserve"> seller from user role</w:t>
+      </w:r>
+    </w:p>
+    <w:p/>
+    <w:p/>
     <w:p>
       <w:r>
         <w:rPr>
           <w:noProof/>
         </w:rPr>
+        <w:drawing>
+          <wp:inline distT="0" distB="0" distL="0" distR="0" wp14:anchorId="3C239EC4" wp14:editId="71F86293">
+            <wp:extent cx="5943600" cy="2531110"/>
+            <wp:effectExtent l="0" t="0" r="0" b="2540"/>
+            <wp:docPr id="634286847" name="Picture 1"/>
+            <wp:cNvGraphicFramePr>
+              <a:graphicFrameLocks xmlns:a="http://schemas.openxmlformats.org/drawingml/2006/main" noChangeAspect="1"/>
+            </wp:cNvGraphicFramePr>
+            <a:graphic xmlns:a="http://schemas.openxmlformats.org/drawingml/2006/main">
+              <a:graphicData uri="http://schemas.openxmlformats.org/drawingml/2006/picture">
+                <pic:pic xmlns:pic="http://schemas.openxmlformats.org/drawingml/2006/picture">
+                  <pic:nvPicPr>
+                    <pic:cNvPr id="634286847" name=""/>
+                    <pic:cNvPicPr/>
+                  </pic:nvPicPr>
+                  <pic:blipFill>
+                    <a:blip r:embed="rId50"/>
+                    <a:stretch>
+                      <a:fillRect/>
+                    </a:stretch>
+                  </pic:blipFill>
+                  <pic:spPr>
+                    <a:xfrm>
+                      <a:off x="0" y="0"/>
+                      <a:ext cx="5943600" cy="2531110"/>
+                    </a:xfrm>
+                    <a:prstGeom prst="rect">
+                      <a:avLst/>
+                    </a:prstGeom>
+                  </pic:spPr>
+                </pic:pic>
+              </a:graphicData>
+            </a:graphic>
+          </wp:inline>
+        </w:drawing>
+      </w:r>
+    </w:p>
+    <w:p>
+      <w:r>
+        <w:t>The below screenshot tell that the current there is not any pending request to become a seller…</w:t>
+      </w:r>
+    </w:p>
+    <w:p>
+      <w:r>
+        <w:rPr>
+          <w:noProof/>
+        </w:rPr>
+        <w:lastRenderedPageBreak/>
         <w:drawing>
           <wp:inline distT="0" distB="0" distL="0" distR="0" wp14:anchorId="2A74FB5F" wp14:editId="03D13278">
             <wp:extent cx="5943600" cy="2482215"/>
@@ -2757,7 +2931,7 @@
                     <pic:cNvPicPr/>
                   </pic:nvPicPr>
                   <pic:blipFill>
-                    <a:blip r:embed="rId49"/>
+                    <a:blip r:embed="rId51"/>
                     <a:stretch>
                       <a:fillRect/>
                     </a:stretch>
@@ -2779,6 +2953,61 @@
       </w:r>
     </w:p>
     <w:p>
+      <w:r>
+        <w:t xml:space="preserve">In case the user seller needs change and </w:t>
+      </w:r>
+      <w:r>
+        <w:t>sends</w:t>
+      </w:r>
+      <w:r>
+        <w:t xml:space="preserve"> requests their updated information, the screens below will appear</w:t>
+      </w:r>
+      <w:r>
+        <w:t>. The action will happen at the admin page to approve of this request or deny if the information is not validated.</w:t>
+      </w:r>
+    </w:p>
+    <w:p>
+      <w:r>
+        <w:lastRenderedPageBreak/>
+        <w:drawing>
+          <wp:inline distT="0" distB="0" distL="0" distR="0" wp14:anchorId="6FD8B660" wp14:editId="74DD3FD6">
+            <wp:extent cx="5943600" cy="5710555"/>
+            <wp:effectExtent l="0" t="0" r="0" b="4445"/>
+            <wp:docPr id="1193305139" name="Picture 1"/>
+            <wp:cNvGraphicFramePr>
+              <a:graphicFrameLocks xmlns:a="http://schemas.openxmlformats.org/drawingml/2006/main" noChangeAspect="1"/>
+            </wp:cNvGraphicFramePr>
+            <a:graphic xmlns:a="http://schemas.openxmlformats.org/drawingml/2006/main">
+              <a:graphicData uri="http://schemas.openxmlformats.org/drawingml/2006/picture">
+                <pic:pic xmlns:pic="http://schemas.openxmlformats.org/drawingml/2006/picture">
+                  <pic:nvPicPr>
+                    <pic:cNvPr id="1193305139" name=""/>
+                    <pic:cNvPicPr/>
+                  </pic:nvPicPr>
+                  <pic:blipFill>
+                    <a:blip r:embed="rId52"/>
+                    <a:stretch>
+                      <a:fillRect/>
+                    </a:stretch>
+                  </pic:blipFill>
+                  <pic:spPr>
+                    <a:xfrm>
+                      <a:off x="0" y="0"/>
+                      <a:ext cx="5943600" cy="5710555"/>
+                    </a:xfrm>
+                    <a:prstGeom prst="rect">
+                      <a:avLst/>
+                    </a:prstGeom>
+                  </pic:spPr>
+                </pic:pic>
+              </a:graphicData>
+            </a:graphic>
+          </wp:inline>
+        </w:drawing>
+      </w:r>
+    </w:p>
+    <w:p/>
+    <w:p>
       <w:pPr>
         <w:pStyle w:val="ListParagraph"/>
         <w:numPr>
@@ -2789,12 +3018,16 @@
       <w:r>
         <w:t>Báo cáo vi phạm</w:t>
       </w:r>
+      <w:r>
+        <w:t>:</w:t>
+      </w:r>
     </w:p>
     <w:p>
       <w:r>
         <w:rPr>
           <w:noProof/>
         </w:rPr>
+        <w:lastRenderedPageBreak/>
         <w:drawing>
           <wp:inline distT="0" distB="0" distL="0" distR="0" wp14:anchorId="06A79DA9" wp14:editId="5420E114">
             <wp:extent cx="5943600" cy="2229485"/>
@@ -2811,7 +3044,7 @@
                     <pic:cNvPicPr/>
                   </pic:nvPicPr>
                   <pic:blipFill>
-                    <a:blip r:embed="rId50"/>
+                    <a:blip r:embed="rId53"/>
                     <a:stretch>
                       <a:fillRect/>
                     </a:stretch>
@@ -2844,13 +3077,15 @@
       <w:r>
         <w:t>Quản lý đánh giá</w:t>
       </w:r>
+      <w:r>
+        <w:t>:</w:t>
+      </w:r>
     </w:p>
     <w:p>
       <w:r>
         <w:rPr>
           <w:noProof/>
         </w:rPr>
-        <w:lastRenderedPageBreak/>
         <w:drawing>
           <wp:inline distT="0" distB="0" distL="0" distR="0" wp14:anchorId="52688553" wp14:editId="3164E104">
             <wp:extent cx="5943600" cy="3026410"/>
@@ -2867,7 +3102,7 @@
                     <pic:cNvPicPr/>
                   </pic:nvPicPr>
                   <pic:blipFill>
-                    <a:blip r:embed="rId51"/>
+                    <a:blip r:embed="rId54"/>
                     <a:stretch>
                       <a:fillRect/>
                     </a:stretch>
@@ -2898,6 +3133,9 @@
       </w:pPr>
       <w:r>
         <w:t>Quản lý nội dung</w:t>
+      </w:r>
+      <w:r>
+        <w:t>:</w:t>
       </w:r>
     </w:p>
     <w:p>
@@ -2922,7 +3160,7 @@
                     <pic:cNvPicPr/>
                   </pic:nvPicPr>
                   <pic:blipFill>
-                    <a:blip r:embed="rId52"/>
+                    <a:blip r:embed="rId55"/>
                     <a:stretch>
                       <a:fillRect/>
                     </a:stretch>
@@ -2979,7 +3217,7 @@
                     <pic:cNvPicPr/>
                   </pic:nvPicPr>
                   <pic:blipFill>
-                    <a:blip r:embed="rId53"/>
+                    <a:blip r:embed="rId56"/>
                     <a:stretch>
                       <a:fillRect/>
                     </a:stretch>
@@ -3034,7 +3272,7 @@
                     <pic:cNvPicPr/>
                   </pic:nvPicPr>
                   <pic:blipFill>
-                    <a:blip r:embed="rId54"/>
+                    <a:blip r:embed="rId57"/>
                     <a:stretch>
                       <a:fillRect/>
                     </a:stretch>

</xml_diff>

<commit_message>
Final code for admin pages at Seller and Administrator (#22)
* Updated code for shop setting

* Update code for user view with sufficient content

* Final  code for seller and admin page for administration stuff

---------

Co-authored-by: Thanh Nguyen <toni@Vietnam-4228.localdomain>
</commit_message>
<xml_diff>
--- a/AiNetsoft Functions Description.docx
+++ b/AiNetsoft Functions Description.docx
@@ -113,10 +113,28 @@
         </w:numPr>
       </w:pPr>
       <w:r>
-        <w:t>Tài khoản ngân hang is being s</w:t>
-      </w:r>
-      <w:r>
-        <w:t>tored in the bank_account collection. This also be sync when user request to become a Seller</w:t>
+        <w:t>Tài khoản ngân h</w:t>
+      </w:r>
+      <w:r>
+        <w:t>à</w:t>
+      </w:r>
+      <w:r>
+        <w:t>ng is being s</w:t>
+      </w:r>
+      <w:r>
+        <w:t xml:space="preserve">tored in the bank_account </w:t>
+      </w:r>
+      <w:r>
+        <w:t xml:space="preserve">database </w:t>
+      </w:r>
+      <w:r>
+        <w:t>collection. This also be sync</w:t>
+      </w:r>
+      <w:r>
+        <w:t>ed</w:t>
+      </w:r>
+      <w:r>
+        <w:t xml:space="preserve"> when user request to become a Seller</w:t>
       </w:r>
     </w:p>
     <w:p>
@@ -171,7 +189,19 @@
       </w:pPr>
       <w:r>
         <w:lastRenderedPageBreak/>
-        <w:t>Địa chỉ nhận hang: Users can update data here. This is also synced to the Seller registry from if use request to become a Seller</w:t>
+        <w:t xml:space="preserve">Địa chỉ </w:t>
+      </w:r>
+      <w:r>
+        <w:t>ng</w:t>
+      </w:r>
+      <w:r>
+        <w:t>ận h</w:t>
+      </w:r>
+      <w:r>
+        <w:t>àng</w:t>
+      </w:r>
+      <w:r>
+        <w:t>: Users can update data here. This is also synced to the Seller registry from if use request to become a Seller</w:t>
       </w:r>
     </w:p>
     <w:p>
@@ -677,7 +707,13 @@
     </w:p>
     <w:p>
       <w:r>
-        <w:t>Personal business( Same screen for Company business)</w:t>
+        <w:t xml:space="preserve">Personal </w:t>
+      </w:r>
+      <w:r>
+        <w:t>business(Same</w:t>
+      </w:r>
+      <w:r>
+        <w:t xml:space="preserve"> screen for Company business)</w:t>
       </w:r>
     </w:p>
     <w:p>
@@ -784,13 +820,22 @@
     <w:p/>
     <w:p>
       <w:r>
-        <w:t xml:space="preserve">Users will be denied moving to next steps if checking failed the result and ask the user </w:t>
+        <w:t xml:space="preserve">Users will be denied moving to next steps </w:t>
+      </w:r>
+      <w:r>
+        <w:t>if they check</w:t>
+      </w:r>
+      <w:r>
+        <w:t xml:space="preserve"> the result and ask the user </w:t>
       </w:r>
       <w:r>
         <w:t>must</w:t>
       </w:r>
       <w:r>
         <w:t xml:space="preserve"> verify and update the correct information</w:t>
+      </w:r>
+      <w:r>
+        <w:t>.</w:t>
       </w:r>
     </w:p>
     <w:p>
@@ -1019,7 +1064,13 @@
         <w:tab/>
       </w:r>
       <w:r>
-        <w:t>"Hồ sơ đang chờ phê duyệtYêu cầu đăng ký Người bán của bạn đã được tiếp nhận. Đội ngũ kiểm duyệt sẽ phản hồi trong vòng 24 giờ làm việc."</w:t>
+        <w:t>"Hồ sơ đang chờ phê duyệt</w:t>
+      </w:r>
+      <w:r>
+        <w:t xml:space="preserve">. </w:t>
+      </w:r>
+      <w:r>
+        <w:t>Yêu cầu đăng ký Người bán của bạn đã được tiếp nhận. Đội ngũ kiểm duyệt sẽ phản hồi trong vòng 24 giờ làm việc."</w:t>
       </w:r>
     </w:p>
     <w:p>
@@ -1029,7 +1080,10 @@
       </w:r>
       <w:r>
         <w:tab/>
-        <w:t>An email to the requester to confirm admin received the request and will check and appove</w:t>
+        <w:t xml:space="preserve">An email to the requester to confirm admin received the request and will check and </w:t>
+      </w:r>
+      <w:r>
+        <w:t>approve</w:t>
       </w:r>
     </w:p>
     <w:p>
@@ -1083,7 +1137,13 @@
         <w:t>notification</w:t>
       </w:r>
       <w:r>
-        <w:t xml:space="preserve"> in the link /seller/register  the </w:t>
+        <w:t xml:space="preserve"> in the link /seller/</w:t>
+      </w:r>
+      <w:r>
+        <w:t>register the</w:t>
+      </w:r>
+      <w:r>
+        <w:t xml:space="preserve"> </w:t>
       </w:r>
       <w:r>
         <w:t>progress</w:t>
@@ -1396,10 +1456,27 @@
       </w:r>
     </w:p>
     <w:p>
-      <w:r>
+      <w:pPr>
+        <w:rPr>
+          <w:b/>
+          <w:bCs/>
+          <w:color w:val="EE0000"/>
+        </w:rPr>
+      </w:pPr>
+      <w:r>
+        <w:rPr>
+          <w:b/>
+          <w:bCs/>
+          <w:color w:val="EE0000"/>
+        </w:rPr>
         <w:t>3. Seller Admin Dashboard</w:t>
       </w:r>
       <w:r>
+        <w:rPr>
+          <w:b/>
+          <w:bCs/>
+          <w:color w:val="EE0000"/>
+        </w:rPr>
         <w:t>:</w:t>
       </w:r>
     </w:p>
@@ -1556,7 +1633,10 @@
     <w:p/>
     <w:p>
       <w:r>
-        <w:t>Quản lý đơn hang</w:t>
+        <w:t xml:space="preserve">Quản lý đơn </w:t>
+      </w:r>
+      <w:r>
+        <w:t>hang:</w:t>
       </w:r>
     </w:p>
     <w:p/>
@@ -1611,14 +1691,11 @@
     </w:p>
     <w:p>
       <w:r>
-        <w:rPr>
-          <w:noProof/>
-        </w:rPr>
         <w:drawing>
-          <wp:inline distT="0" distB="0" distL="0" distR="0" wp14:anchorId="71E5661F" wp14:editId="2881753B">
-            <wp:extent cx="5943600" cy="4066540"/>
-            <wp:effectExtent l="0" t="0" r="0" b="0"/>
-            <wp:docPr id="502501156" name="Picture 1"/>
+          <wp:inline distT="0" distB="0" distL="0" distR="0" wp14:anchorId="5CF0D2AB" wp14:editId="46ACCEA2">
+            <wp:extent cx="5943600" cy="2814955"/>
+            <wp:effectExtent l="0" t="0" r="0" b="4445"/>
+            <wp:docPr id="971468143" name="Picture 1"/>
             <wp:cNvGraphicFramePr>
               <a:graphicFrameLocks xmlns:a="http://schemas.openxmlformats.org/drawingml/2006/main" noChangeAspect="1"/>
             </wp:cNvGraphicFramePr>
@@ -1626,7 +1703,7 @@
               <a:graphicData uri="http://schemas.openxmlformats.org/drawingml/2006/picture">
                 <pic:pic xmlns:pic="http://schemas.openxmlformats.org/drawingml/2006/picture">
                   <pic:nvPicPr>
-                    <pic:cNvPr id="502501156" name=""/>
+                    <pic:cNvPr id="971468143" name=""/>
                     <pic:cNvPicPr/>
                   </pic:nvPicPr>
                   <pic:blipFill>
@@ -1638,7 +1715,7 @@
                   <pic:spPr>
                     <a:xfrm>
                       <a:off x="0" y="0"/>
-                      <a:ext cx="5943600" cy="4066540"/>
+                      <a:ext cx="5943600" cy="2814955"/>
                     </a:xfrm>
                     <a:prstGeom prst="rect">
                       <a:avLst/>
@@ -1652,6 +1729,52 @@
       </w:r>
     </w:p>
     <w:p>
+      <w:r>
+        <w:t>In the case of the seller who needs to change or update any information here, they need to wait until the changes are approved by Admin page. See below for the notification after submitting the changes</w:t>
+      </w:r>
+    </w:p>
+    <w:p>
+      <w:r>
+        <w:lastRenderedPageBreak/>
+        <w:drawing>
+          <wp:inline distT="0" distB="0" distL="0" distR="0" wp14:anchorId="3DBF79FC" wp14:editId="145C3BD9">
+            <wp:extent cx="5943600" cy="3652520"/>
+            <wp:effectExtent l="0" t="0" r="0" b="5080"/>
+            <wp:docPr id="354839155" name="Picture 1"/>
+            <wp:cNvGraphicFramePr>
+              <a:graphicFrameLocks xmlns:a="http://schemas.openxmlformats.org/drawingml/2006/main" noChangeAspect="1"/>
+            </wp:cNvGraphicFramePr>
+            <a:graphic xmlns:a="http://schemas.openxmlformats.org/drawingml/2006/main">
+              <a:graphicData uri="http://schemas.openxmlformats.org/drawingml/2006/picture">
+                <pic:pic xmlns:pic="http://schemas.openxmlformats.org/drawingml/2006/picture">
+                  <pic:nvPicPr>
+                    <pic:cNvPr id="354839155" name=""/>
+                    <pic:cNvPicPr/>
+                  </pic:nvPicPr>
+                  <pic:blipFill>
+                    <a:blip r:embed="rId31"/>
+                    <a:stretch>
+                      <a:fillRect/>
+                    </a:stretch>
+                  </pic:blipFill>
+                  <pic:spPr>
+                    <a:xfrm>
+                      <a:off x="0" y="0"/>
+                      <a:ext cx="5943600" cy="3652520"/>
+                    </a:xfrm>
+                    <a:prstGeom prst="rect">
+                      <a:avLst/>
+                    </a:prstGeom>
+                  </pic:spPr>
+                </pic:pic>
+              </a:graphicData>
+            </a:graphic>
+          </wp:inline>
+        </w:drawing>
+      </w:r>
+    </w:p>
+    <w:p/>
+    <w:p>
       <w:pPr>
         <w:pStyle w:val="ListParagraph"/>
         <w:numPr>
@@ -1660,7 +1783,6 @@
         </w:numPr>
       </w:pPr>
       <w:r>
-        <w:lastRenderedPageBreak/>
         <w:t>Money withdraw request: Seller can ask ainetsoft for a payment withdraw with the details form as below</w:t>
       </w:r>
     </w:p>
@@ -1685,7 +1807,7 @@
                     <pic:cNvPicPr/>
                   </pic:nvPicPr>
                   <pic:blipFill>
-                    <a:blip r:embed="rId31"/>
+                    <a:blip r:embed="rId32"/>
                     <a:stretch>
                       <a:fillRect/>
                     </a:stretch>
@@ -1742,7 +1864,7 @@
                     <pic:cNvPicPr/>
                   </pic:nvPicPr>
                   <pic:blipFill>
-                    <a:blip r:embed="rId32"/>
+                    <a:blip r:embed="rId33"/>
                     <a:stretch>
                       <a:fillRect/>
                     </a:stretch>
@@ -1798,7 +1920,6 @@
         <w:rPr>
           <w:noProof/>
         </w:rPr>
-        <w:lastRenderedPageBreak/>
         <w:drawing>
           <wp:inline distT="0" distB="0" distL="0" distR="0" wp14:anchorId="46AF4CCB" wp14:editId="19F19FB7">
             <wp:extent cx="5943600" cy="2252980"/>
@@ -1815,7 +1936,7 @@
                     <pic:cNvPicPr/>
                   </pic:nvPicPr>
                   <pic:blipFill>
-                    <a:blip r:embed="rId33"/>
+                    <a:blip r:embed="rId34"/>
                     <a:stretch>
                       <a:fillRect/>
                     </a:stretch>
@@ -1854,6 +1975,7 @@
         <w:rPr>
           <w:noProof/>
         </w:rPr>
+        <w:lastRenderedPageBreak/>
         <w:drawing>
           <wp:inline distT="0" distB="0" distL="0" distR="0" wp14:anchorId="01D8CA9D" wp14:editId="6980E033">
             <wp:extent cx="5943600" cy="2715260"/>
@@ -1870,7 +1992,7 @@
                     <pic:cNvPicPr/>
                   </pic:nvPicPr>
                   <pic:blipFill>
-                    <a:blip r:embed="rId34"/>
+                    <a:blip r:embed="rId35"/>
                     <a:stretch>
                       <a:fillRect/>
                     </a:stretch>
@@ -1914,7 +2036,6 @@
         <w:rPr>
           <w:noProof/>
         </w:rPr>
-        <w:lastRenderedPageBreak/>
         <w:drawing>
           <wp:inline distT="0" distB="0" distL="0" distR="0" wp14:anchorId="21DAC788" wp14:editId="66A947E7">
             <wp:extent cx="5943600" cy="1638935"/>
@@ -1931,7 +2052,7 @@
                     <pic:cNvPicPr/>
                   </pic:nvPicPr>
                   <pic:blipFill>
-                    <a:blip r:embed="rId35"/>
+                    <a:blip r:embed="rId36"/>
                     <a:stretch>
                       <a:fillRect/>
                     </a:stretch>
@@ -1959,6 +2080,7 @@
     </w:p>
     <w:p>
       <w:r>
+        <w:lastRenderedPageBreak/>
         <w:t>There is a filtering box that help the users can filter based on what that want for the seller request status</w:t>
       </w:r>
       <w:r>
@@ -1984,7 +2106,7 @@
                     <pic:cNvPicPr/>
                   </pic:nvPicPr>
                   <pic:blipFill>
-                    <a:blip r:embed="rId36"/>
+                    <a:blip r:embed="rId37"/>
                     <a:stretch>
                       <a:fillRect/>
                     </a:stretch>
@@ -2034,7 +2156,6 @@
         <w:rPr>
           <w:noProof/>
         </w:rPr>
-        <w:lastRenderedPageBreak/>
         <w:drawing>
           <wp:inline distT="0" distB="0" distL="0" distR="0" wp14:anchorId="57E58A03" wp14:editId="1993E0F0">
             <wp:extent cx="5943600" cy="3883025"/>
@@ -2051,7 +2172,7 @@
                     <pic:cNvPicPr/>
                   </pic:nvPicPr>
                   <pic:blipFill>
-                    <a:blip r:embed="rId37"/>
+                    <a:blip r:embed="rId38"/>
                     <a:stretch>
                       <a:fillRect/>
                     </a:stretch>
@@ -2093,6 +2214,7 @@
         </w:numPr>
       </w:pPr>
       <w:r>
+        <w:lastRenderedPageBreak/>
         <w:t>Sản phẩm: Show all products which the system is having. There is a quick access to the Seller pages</w:t>
       </w:r>
     </w:p>
@@ -2101,7 +2223,6 @@
         <w:rPr>
           <w:noProof/>
         </w:rPr>
-        <w:lastRenderedPageBreak/>
         <w:drawing>
           <wp:inline distT="0" distB="0" distL="0" distR="0" wp14:anchorId="6B5994E1" wp14:editId="41E9937E">
             <wp:extent cx="5943600" cy="3467735"/>
@@ -2118,7 +2239,7 @@
                     <pic:cNvPicPr/>
                   </pic:nvPicPr>
                   <pic:blipFill>
-                    <a:blip r:embed="rId38"/>
+                    <a:blip r:embed="rId39"/>
                     <a:stretch>
                       <a:fillRect/>
                     </a:stretch>
@@ -2174,7 +2295,7 @@
                     <pic:cNvPicPr/>
                   </pic:nvPicPr>
                   <pic:blipFill>
-                    <a:blip r:embed="rId39"/>
+                    <a:blip r:embed="rId40"/>
                     <a:stretch>
                       <a:fillRect/>
                     </a:stretch>
@@ -2204,6 +2325,7 @@
         </w:numPr>
       </w:pPr>
       <w:r>
+        <w:lastRenderedPageBreak/>
         <w:t>Chờ duyệt shop: This is the pending status of the users requesting for become the seller.</w:t>
       </w:r>
     </w:p>
@@ -2212,7 +2334,6 @@
         <w:rPr>
           <w:noProof/>
         </w:rPr>
-        <w:lastRenderedPageBreak/>
         <w:drawing>
           <wp:inline distT="0" distB="0" distL="0" distR="0" wp14:anchorId="028782AD" wp14:editId="7F040F09">
             <wp:extent cx="5943600" cy="3910965"/>
@@ -2229,7 +2350,7 @@
                     <pic:cNvPicPr/>
                   </pic:nvPicPr>
                   <pic:blipFill>
-                    <a:blip r:embed="rId40"/>
+                    <a:blip r:embed="rId41"/>
                     <a:stretch>
                       <a:fillRect/>
                     </a:stretch>
@@ -2279,6 +2400,9 @@
     </w:p>
     <w:p>
       <w:r>
+        <w:rPr>
+          <w:noProof/>
+        </w:rPr>
         <w:lastRenderedPageBreak/>
         <w:drawing>
           <wp:inline distT="0" distB="0" distL="0" distR="0" wp14:anchorId="31B1EC6A" wp14:editId="3C5F71CF">
@@ -2296,7 +2420,7 @@
                     <pic:cNvPicPr/>
                   </pic:nvPicPr>
                   <pic:blipFill>
-                    <a:blip r:embed="rId41"/>
+                    <a:blip r:embed="rId42"/>
                     <a:stretch>
                       <a:fillRect/>
                     </a:stretch>
@@ -2335,17 +2459,23 @@
         <w:t>View details:</w:t>
       </w:r>
       <w:r>
-        <w:t xml:space="preserve"> Admin guy can see the details of the registered users here in this screen when he click to the “eyes” icon</w:t>
+        <w:t xml:space="preserve"> Admin guy can see the details of the registered users here in this screen when he </w:t>
+      </w:r>
+      <w:r>
+        <w:t>clicks</w:t>
+      </w:r>
+      <w:r>
+        <w:t xml:space="preserve"> to the “eyes” icon</w:t>
       </w:r>
     </w:p>
     <w:p>
       <w:r>
         <w:lastRenderedPageBreak/>
         <w:drawing>
-          <wp:inline distT="0" distB="0" distL="0" distR="0" wp14:anchorId="7C0A5B7D" wp14:editId="1448692C">
-            <wp:extent cx="5943600" cy="4494530"/>
-            <wp:effectExtent l="0" t="0" r="0" b="1270"/>
-            <wp:docPr id="70567682" name="Picture 1"/>
+          <wp:inline distT="0" distB="0" distL="0" distR="0" wp14:anchorId="6B86C3D4" wp14:editId="570808DF">
+            <wp:extent cx="5943600" cy="5777230"/>
+            <wp:effectExtent l="0" t="0" r="0" b="0"/>
+            <wp:docPr id="390823864" name="Picture 1"/>
             <wp:cNvGraphicFramePr>
               <a:graphicFrameLocks xmlns:a="http://schemas.openxmlformats.org/drawingml/2006/main" noChangeAspect="1"/>
             </wp:cNvGraphicFramePr>
@@ -2353,11 +2483,11 @@
               <a:graphicData uri="http://schemas.openxmlformats.org/drawingml/2006/picture">
                 <pic:pic xmlns:pic="http://schemas.openxmlformats.org/drawingml/2006/picture">
                   <pic:nvPicPr>
-                    <pic:cNvPr id="70567682" name=""/>
+                    <pic:cNvPr id="390823864" name=""/>
                     <pic:cNvPicPr/>
                   </pic:nvPicPr>
                   <pic:blipFill>
-                    <a:blip r:embed="rId42"/>
+                    <a:blip r:embed="rId43"/>
                     <a:stretch>
                       <a:fillRect/>
                     </a:stretch>
@@ -2365,7 +2495,7 @@
                   <pic:spPr>
                     <a:xfrm>
                       <a:off x="0" y="0"/>
-                      <a:ext cx="5943600" cy="4494530"/>
+                      <a:ext cx="5943600" cy="5777230"/>
                     </a:xfrm>
                     <a:prstGeom prst="rect">
                       <a:avLst/>
@@ -2395,6 +2525,7 @@
         <w:rPr>
           <w:noProof/>
         </w:rPr>
+        <w:lastRenderedPageBreak/>
         <w:drawing>
           <wp:inline distT="0" distB="0" distL="0" distR="0" wp14:anchorId="500D681A" wp14:editId="5A3A4CAB">
             <wp:extent cx="5943600" cy="2051685"/>
@@ -2411,7 +2542,7 @@
                     <pic:cNvPicPr/>
                   </pic:nvPicPr>
                   <pic:blipFill>
-                    <a:blip r:embed="rId43"/>
+                    <a:blip r:embed="rId44"/>
                     <a:stretch>
                       <a:fillRect/>
                     </a:stretch>
@@ -2449,7 +2580,6 @@
         <w:rPr>
           <w:noProof/>
         </w:rPr>
-        <w:lastRenderedPageBreak/>
         <w:drawing>
           <wp:inline distT="0" distB="0" distL="0" distR="0" wp14:anchorId="121DE39E" wp14:editId="6A9E2E71">
             <wp:extent cx="5943600" cy="2179955"/>
@@ -2466,7 +2596,7 @@
                     <pic:cNvPicPr/>
                   </pic:nvPicPr>
                   <pic:blipFill>
-                    <a:blip r:embed="rId44"/>
+                    <a:blip r:embed="rId45"/>
                     <a:stretch>
                       <a:fillRect/>
                     </a:stretch>
@@ -2520,7 +2650,7 @@
                     <pic:cNvPicPr/>
                   </pic:nvPicPr>
                   <pic:blipFill>
-                    <a:blip r:embed="rId45"/>
+                    <a:blip r:embed="rId46"/>
                     <a:stretch>
                       <a:fillRect/>
                     </a:stretch>
@@ -2558,6 +2688,7 @@
         <w:rPr>
           <w:noProof/>
         </w:rPr>
+        <w:lastRenderedPageBreak/>
         <w:drawing>
           <wp:inline distT="0" distB="0" distL="0" distR="0" wp14:anchorId="29DDE5D2" wp14:editId="19F98E37">
             <wp:extent cx="5943600" cy="2066290"/>
@@ -2574,7 +2705,7 @@
                     <pic:cNvPicPr/>
                   </pic:nvPicPr>
                   <pic:blipFill>
-                    <a:blip r:embed="rId46"/>
+                    <a:blip r:embed="rId47"/>
                     <a:stretch>
                       <a:fillRect/>
                     </a:stretch>
@@ -2604,7 +2735,6 @@
         </w:numPr>
       </w:pPr>
       <w:r>
-        <w:lastRenderedPageBreak/>
         <w:t>Tất cả sảm phẩm: Show all available products from all sellers. This is also has the pagination and quick access to the product owner page (Seller page)</w:t>
       </w:r>
     </w:p>
@@ -2629,7 +2759,7 @@
                     <pic:cNvPicPr/>
                   </pic:nvPicPr>
                   <pic:blipFill>
-                    <a:blip r:embed="rId47"/>
+                    <a:blip r:embed="rId48"/>
                     <a:stretch>
                       <a:fillRect/>
                     </a:stretch>
@@ -2660,7 +2790,13 @@
         </w:numPr>
       </w:pPr>
       <w:r>
-        <w:t>Duyệt shop: All seller product should be waited until got approval by Admin page and then visibility to the user (publicity).</w:t>
+        <w:t xml:space="preserve">Duyệt shop: All seller </w:t>
+      </w:r>
+      <w:r>
+        <w:t>products</w:t>
+      </w:r>
+      <w:r>
+        <w:t xml:space="preserve"> should be waited until got approval by Admin page and then visibility to the user (publicity).</w:t>
       </w:r>
     </w:p>
     <w:p>
@@ -2668,6 +2804,7 @@
         <w:rPr>
           <w:noProof/>
         </w:rPr>
+        <w:lastRenderedPageBreak/>
         <w:drawing>
           <wp:inline distT="0" distB="0" distL="0" distR="0" wp14:anchorId="31AA88AC" wp14:editId="7139B311">
             <wp:extent cx="5943600" cy="2676525"/>
@@ -2684,7 +2821,7 @@
                     <pic:cNvPicPr/>
                   </pic:nvPicPr>
                   <pic:blipFill>
-                    <a:blip r:embed="rId48"/>
+                    <a:blip r:embed="rId49"/>
                     <a:stretch>
                       <a:fillRect/>
                     </a:stretch>
@@ -2714,15 +2851,70 @@
         </w:numPr>
       </w:pPr>
       <w:r>
-        <w:lastRenderedPageBreak/>
-        <w:t>Duyệt shop – Becom seller from user role</w:t>
-      </w:r>
-    </w:p>
+        <w:t xml:space="preserve">Duyệt shop – </w:t>
+      </w:r>
+      <w:r>
+        <w:t>Become</w:t>
+      </w:r>
+      <w:r>
+        <w:t xml:space="preserve"> seller from user role</w:t>
+      </w:r>
+    </w:p>
+    <w:p/>
+    <w:p/>
     <w:p>
       <w:r>
         <w:rPr>
           <w:noProof/>
         </w:rPr>
+        <w:drawing>
+          <wp:inline distT="0" distB="0" distL="0" distR="0" wp14:anchorId="3C239EC4" wp14:editId="71F86293">
+            <wp:extent cx="5943600" cy="2531110"/>
+            <wp:effectExtent l="0" t="0" r="0" b="2540"/>
+            <wp:docPr id="634286847" name="Picture 1"/>
+            <wp:cNvGraphicFramePr>
+              <a:graphicFrameLocks xmlns:a="http://schemas.openxmlformats.org/drawingml/2006/main" noChangeAspect="1"/>
+            </wp:cNvGraphicFramePr>
+            <a:graphic xmlns:a="http://schemas.openxmlformats.org/drawingml/2006/main">
+              <a:graphicData uri="http://schemas.openxmlformats.org/drawingml/2006/picture">
+                <pic:pic xmlns:pic="http://schemas.openxmlformats.org/drawingml/2006/picture">
+                  <pic:nvPicPr>
+                    <pic:cNvPr id="634286847" name=""/>
+                    <pic:cNvPicPr/>
+                  </pic:nvPicPr>
+                  <pic:blipFill>
+                    <a:blip r:embed="rId50"/>
+                    <a:stretch>
+                      <a:fillRect/>
+                    </a:stretch>
+                  </pic:blipFill>
+                  <pic:spPr>
+                    <a:xfrm>
+                      <a:off x="0" y="0"/>
+                      <a:ext cx="5943600" cy="2531110"/>
+                    </a:xfrm>
+                    <a:prstGeom prst="rect">
+                      <a:avLst/>
+                    </a:prstGeom>
+                  </pic:spPr>
+                </pic:pic>
+              </a:graphicData>
+            </a:graphic>
+          </wp:inline>
+        </w:drawing>
+      </w:r>
+    </w:p>
+    <w:p>
+      <w:r>
+        <w:t>The below screenshot tell that the current there is not any pending request to become a seller…</w:t>
+      </w:r>
+    </w:p>
+    <w:p>
+      <w:r>
+        <w:rPr>
+          <w:noProof/>
+        </w:rPr>
+        <w:lastRenderedPageBreak/>
         <w:drawing>
           <wp:inline distT="0" distB="0" distL="0" distR="0" wp14:anchorId="2A74FB5F" wp14:editId="03D13278">
             <wp:extent cx="5943600" cy="2482215"/>
@@ -2739,7 +2931,7 @@
                     <pic:cNvPicPr/>
                   </pic:nvPicPr>
                   <pic:blipFill>
-                    <a:blip r:embed="rId49"/>
+                    <a:blip r:embed="rId51"/>
                     <a:stretch>
                       <a:fillRect/>
                     </a:stretch>
@@ -2761,6 +2953,61 @@
       </w:r>
     </w:p>
     <w:p>
+      <w:r>
+        <w:t xml:space="preserve">In case the user seller needs change and </w:t>
+      </w:r>
+      <w:r>
+        <w:t>sends</w:t>
+      </w:r>
+      <w:r>
+        <w:t xml:space="preserve"> requests their updated information, the screens below will appear</w:t>
+      </w:r>
+      <w:r>
+        <w:t>. The action will happen at the admin page to approve of this request or deny if the information is not validated.</w:t>
+      </w:r>
+    </w:p>
+    <w:p>
+      <w:r>
+        <w:lastRenderedPageBreak/>
+        <w:drawing>
+          <wp:inline distT="0" distB="0" distL="0" distR="0" wp14:anchorId="6FD8B660" wp14:editId="74DD3FD6">
+            <wp:extent cx="5943600" cy="5710555"/>
+            <wp:effectExtent l="0" t="0" r="0" b="4445"/>
+            <wp:docPr id="1193305139" name="Picture 1"/>
+            <wp:cNvGraphicFramePr>
+              <a:graphicFrameLocks xmlns:a="http://schemas.openxmlformats.org/drawingml/2006/main" noChangeAspect="1"/>
+            </wp:cNvGraphicFramePr>
+            <a:graphic xmlns:a="http://schemas.openxmlformats.org/drawingml/2006/main">
+              <a:graphicData uri="http://schemas.openxmlformats.org/drawingml/2006/picture">
+                <pic:pic xmlns:pic="http://schemas.openxmlformats.org/drawingml/2006/picture">
+                  <pic:nvPicPr>
+                    <pic:cNvPr id="1193305139" name=""/>
+                    <pic:cNvPicPr/>
+                  </pic:nvPicPr>
+                  <pic:blipFill>
+                    <a:blip r:embed="rId52"/>
+                    <a:stretch>
+                      <a:fillRect/>
+                    </a:stretch>
+                  </pic:blipFill>
+                  <pic:spPr>
+                    <a:xfrm>
+                      <a:off x="0" y="0"/>
+                      <a:ext cx="5943600" cy="5710555"/>
+                    </a:xfrm>
+                    <a:prstGeom prst="rect">
+                      <a:avLst/>
+                    </a:prstGeom>
+                  </pic:spPr>
+                </pic:pic>
+              </a:graphicData>
+            </a:graphic>
+          </wp:inline>
+        </w:drawing>
+      </w:r>
+    </w:p>
+    <w:p/>
+    <w:p>
       <w:pPr>
         <w:pStyle w:val="ListParagraph"/>
         <w:numPr>
@@ -2771,12 +3018,16 @@
       <w:r>
         <w:t>Báo cáo vi phạm</w:t>
       </w:r>
+      <w:r>
+        <w:t>:</w:t>
+      </w:r>
     </w:p>
     <w:p>
       <w:r>
         <w:rPr>
           <w:noProof/>
         </w:rPr>
+        <w:lastRenderedPageBreak/>
         <w:drawing>
           <wp:inline distT="0" distB="0" distL="0" distR="0" wp14:anchorId="06A79DA9" wp14:editId="5420E114">
             <wp:extent cx="5943600" cy="2229485"/>
@@ -2793,7 +3044,7 @@
                     <pic:cNvPicPr/>
                   </pic:nvPicPr>
                   <pic:blipFill>
-                    <a:blip r:embed="rId50"/>
+                    <a:blip r:embed="rId53"/>
                     <a:stretch>
                       <a:fillRect/>
                     </a:stretch>
@@ -2826,13 +3077,15 @@
       <w:r>
         <w:t>Quản lý đánh giá</w:t>
       </w:r>
+      <w:r>
+        <w:t>:</w:t>
+      </w:r>
     </w:p>
     <w:p>
       <w:r>
         <w:rPr>
           <w:noProof/>
         </w:rPr>
-        <w:lastRenderedPageBreak/>
         <w:drawing>
           <wp:inline distT="0" distB="0" distL="0" distR="0" wp14:anchorId="52688553" wp14:editId="3164E104">
             <wp:extent cx="5943600" cy="3026410"/>
@@ -2849,7 +3102,7 @@
                     <pic:cNvPicPr/>
                   </pic:nvPicPr>
                   <pic:blipFill>
-                    <a:blip r:embed="rId51"/>
+                    <a:blip r:embed="rId54"/>
                     <a:stretch>
                       <a:fillRect/>
                     </a:stretch>
@@ -2880,6 +3133,9 @@
       </w:pPr>
       <w:r>
         <w:t>Quản lý nội dung</w:t>
+      </w:r>
+      <w:r>
+        <w:t>:</w:t>
       </w:r>
     </w:p>
     <w:p>
@@ -2904,7 +3160,7 @@
                     <pic:cNvPicPr/>
                   </pic:nvPicPr>
                   <pic:blipFill>
-                    <a:blip r:embed="rId52"/>
+                    <a:blip r:embed="rId55"/>
                     <a:stretch>
                       <a:fillRect/>
                     </a:stretch>
@@ -2961,7 +3217,7 @@
                     <pic:cNvPicPr/>
                   </pic:nvPicPr>
                   <pic:blipFill>
-                    <a:blip r:embed="rId53"/>
+                    <a:blip r:embed="rId56"/>
                     <a:stretch>
                       <a:fillRect/>
                     </a:stretch>
@@ -3016,7 +3272,7 @@
                     <pic:cNvPicPr/>
                   </pic:nvPicPr>
                   <pic:blipFill>
-                    <a:blip r:embed="rId54"/>
+                    <a:blip r:embed="rId57"/>
                     <a:stretch>
                       <a:fillRect/>
                     </a:stretch>

</xml_diff>

<commit_message>
Final code for mail validation of user registration
</commit_message>
<xml_diff>
--- a/AiNetsoft Functions Description.docx
+++ b/AiNetsoft Functions Description.docx
@@ -3,8 +3,13 @@
 <w:document xmlns:wpc="http://schemas.microsoft.com/office/word/2010/wordprocessingCanvas" xmlns:cx="http://schemas.microsoft.com/office/drawing/2014/chartex" xmlns:cx1="http://schemas.microsoft.com/office/drawing/2015/9/8/chartex" xmlns:cx2="http://schemas.microsoft.com/office/drawing/2015/10/21/chartex" xmlns:cx3="http://schemas.microsoft.com/office/drawing/2016/5/9/chartex" xmlns:cx4="http://schemas.microsoft.com/office/drawing/2016/5/10/chartex" xmlns:cx5="http://schemas.microsoft.com/office/drawing/2016/5/11/chartex" xmlns:cx6="http://schemas.microsoft.com/office/drawing/2016/5/12/chartex" xmlns:cx7="http://schemas.microsoft.com/office/drawing/2016/5/13/chartex" xmlns:cx8="http://schemas.microsoft.com/office/drawing/2016/5/14/chartex" xmlns:mc="http://schemas.openxmlformats.org/markup-compatibility/2006" xmlns:aink="http://schemas.microsoft.com/office/drawing/2016/ink" xmlns:am3d="http://schemas.microsoft.com/office/drawing/2017/model3d" xmlns:o="urn:schemas-microsoft-com:office:office" xmlns:oel="http://schemas.microsoft.com/office/2019/extlst" xmlns:r="http://schemas.openxmlformats.org/officeDocument/2006/relationships" xmlns:m="http://schemas.openxmlformats.org/officeDocument/2006/math" xmlns:v="urn:schemas-microsoft-com:vml" xmlns:wp14="http://schemas.microsoft.com/office/word/2010/wordprocessingDrawing" xmlns:wp="http://schemas.openxmlformats.org/drawingml/2006/wordprocessingDrawing" xmlns:w10="urn:schemas-microsoft-com:office:word" xmlns:w="http://schemas.openxmlformats.org/wordprocessingml/2006/main" xmlns:w14="http://schemas.microsoft.com/office/word/2010/wordml" xmlns:w15="http://schemas.microsoft.com/office/word/2012/wordml" xmlns:w16cex="http://schemas.microsoft.com/office/word/2018/wordml/cex" xmlns:w16cid="http://schemas.microsoft.com/office/word/2016/wordml/cid" xmlns:w16="http://schemas.microsoft.com/office/word/2018/wordml" xmlns:w16du="http://schemas.microsoft.com/office/word/2023/wordml/word16du" xmlns:w16sdtdh="http://schemas.microsoft.com/office/word/2020/wordml/sdtdatahash" xmlns:w16sdtfl="http://schemas.microsoft.com/office/word/2024/wordml/sdtformatlock" xmlns:w16se="http://schemas.microsoft.com/office/word/2015/wordml/symex" xmlns:wpg="http://schemas.microsoft.com/office/word/2010/wordprocessingGroup" xmlns:wpi="http://schemas.microsoft.com/office/word/2010/wordprocessingInk" xmlns:wne="http://schemas.microsoft.com/office/word/2006/wordml" xmlns:wps="http://schemas.microsoft.com/office/word/2010/wordprocessingShape" mc:Ignorable="w14 w15 w16se w16cid w16 w16cex w16sdtdh w16sdtfl w16du wp14">
   <w:body>
     <w:p>
-      <w:r>
-        <w:t>AiNetsoft Functions Description</w:t>
+      <w:proofErr w:type="spellStart"/>
+      <w:r>
+        <w:t>AiNetsoft</w:t>
+      </w:r>
+      <w:proofErr w:type="spellEnd"/>
+      <w:r>
+        <w:t xml:space="preserve"> Functions Description</w:t>
       </w:r>
     </w:p>
     <w:p/>
@@ -18,6 +23,194 @@
       </w:pPr>
       <w:r>
         <w:t>Users:</w:t>
+      </w:r>
+    </w:p>
+    <w:p>
+      <w:pPr>
+        <w:pStyle w:val="ListParagraph"/>
+        <w:numPr>
+          <w:ilvl w:val="0"/>
+          <w:numId w:val="5"/>
+        </w:numPr>
+      </w:pPr>
+      <w:r>
+        <w:t>Users register:</w:t>
+      </w:r>
+    </w:p>
+    <w:p>
+      <w:pPr>
+        <w:ind w:left="720"/>
+      </w:pPr>
+      <w:r>
+        <w:t xml:space="preserve">To register to become a member of the app, the users have many ways to register: Using </w:t>
+      </w:r>
+      <w:r>
+        <w:rPr>
+          <w:highlight w:val="yellow"/>
+        </w:rPr>
+        <w:t>cell phone number</w:t>
+      </w:r>
+      <w:r>
+        <w:t>, social network, Google mail, personal mail account</w:t>
+      </w:r>
+    </w:p>
+    <w:p>
+      <w:pPr>
+        <w:ind w:left="720"/>
+      </w:pPr>
+      <w:r>
+        <w:t>Once using the email for registration, an email validation will be sent to the registered user to notify the confirmation as below</w:t>
+      </w:r>
+    </w:p>
+    <w:p>
+      <w:pPr>
+        <w:ind w:left="720"/>
+        <w:jc w:val="center"/>
+      </w:pPr>
+      <w:r>
+        <w:drawing>
+          <wp:inline distT="0" distB="0" distL="0" distR="0" wp14:anchorId="132EDA3A" wp14:editId="5EBFA534">
+            <wp:extent cx="4089400" cy="5457411"/>
+            <wp:effectExtent l="0" t="0" r="6350" b="0"/>
+            <wp:docPr id="1820225153" name="Picture 1"/>
+            <wp:cNvGraphicFramePr>
+              <a:graphicFrameLocks xmlns:a="http://schemas.openxmlformats.org/drawingml/2006/main" noChangeAspect="1"/>
+            </wp:cNvGraphicFramePr>
+            <a:graphic xmlns:a="http://schemas.openxmlformats.org/drawingml/2006/main">
+              <a:graphicData uri="http://schemas.openxmlformats.org/drawingml/2006/picture">
+                <pic:pic xmlns:pic="http://schemas.openxmlformats.org/drawingml/2006/picture">
+                  <pic:nvPicPr>
+                    <pic:cNvPr id="1820225153" name=""/>
+                    <pic:cNvPicPr/>
+                  </pic:nvPicPr>
+                  <pic:blipFill>
+                    <a:blip r:embed="rId5"/>
+                    <a:stretch>
+                      <a:fillRect/>
+                    </a:stretch>
+                  </pic:blipFill>
+                  <pic:spPr>
+                    <a:xfrm>
+                      <a:off x="0" y="0"/>
+                      <a:ext cx="4090003" cy="5458216"/>
+                    </a:xfrm>
+                    <a:prstGeom prst="rect">
+                      <a:avLst/>
+                    </a:prstGeom>
+                  </pic:spPr>
+                </pic:pic>
+              </a:graphicData>
+            </a:graphic>
+          </wp:inline>
+        </w:drawing>
+      </w:r>
+    </w:p>
+    <w:p>
+      <w:pPr>
+        <w:ind w:left="720"/>
+      </w:pPr>
+      <w:r>
+        <w:t>The screenshot below is the confirmation tells that the user should receive the mail confirmation for the final step of the registration progress</w:t>
+      </w:r>
+    </w:p>
+    <w:p>
+      <w:pPr>
+        <w:ind w:left="720"/>
+        <w:jc w:val="center"/>
+      </w:pPr>
+      <w:r>
+        <w:lastRenderedPageBreak/>
+        <w:drawing>
+          <wp:inline distT="0" distB="0" distL="0" distR="0" wp14:anchorId="3C956DD0" wp14:editId="3BFB7BBA">
+            <wp:extent cx="4781550" cy="1866133"/>
+            <wp:effectExtent l="0" t="0" r="0" b="1270"/>
+            <wp:docPr id="2145858457" name="Picture 1"/>
+            <wp:cNvGraphicFramePr>
+              <a:graphicFrameLocks xmlns:a="http://schemas.openxmlformats.org/drawingml/2006/main" noChangeAspect="1"/>
+            </wp:cNvGraphicFramePr>
+            <a:graphic xmlns:a="http://schemas.openxmlformats.org/drawingml/2006/main">
+              <a:graphicData uri="http://schemas.openxmlformats.org/drawingml/2006/picture">
+                <pic:pic xmlns:pic="http://schemas.openxmlformats.org/drawingml/2006/picture">
+                  <pic:nvPicPr>
+                    <pic:cNvPr id="2145858457" name=""/>
+                    <pic:cNvPicPr/>
+                  </pic:nvPicPr>
+                  <pic:blipFill>
+                    <a:blip r:embed="rId6"/>
+                    <a:stretch>
+                      <a:fillRect/>
+                    </a:stretch>
+                  </pic:blipFill>
+                  <pic:spPr>
+                    <a:xfrm>
+                      <a:off x="0" y="0"/>
+                      <a:ext cx="4791364" cy="1869963"/>
+                    </a:xfrm>
+                    <a:prstGeom prst="rect">
+                      <a:avLst/>
+                    </a:prstGeom>
+                  </pic:spPr>
+                </pic:pic>
+              </a:graphicData>
+            </a:graphic>
+          </wp:inline>
+        </w:drawing>
+      </w:r>
+    </w:p>
+    <w:p>
+      <w:pPr>
+        <w:ind w:left="720"/>
+      </w:pPr>
+    </w:p>
+    <w:p>
+      <w:pPr>
+        <w:ind w:left="720"/>
+      </w:pPr>
+      <w:r>
+        <w:t>After confirming the message below will tell the user ready for login the application</w:t>
+      </w:r>
+    </w:p>
+    <w:p>
+      <w:pPr>
+        <w:ind w:left="720"/>
+        <w:jc w:val="center"/>
+      </w:pPr>
+      <w:r>
+        <w:drawing>
+          <wp:inline distT="0" distB="0" distL="0" distR="0" wp14:anchorId="2E44240F" wp14:editId="0936A4EC">
+            <wp:extent cx="3962400" cy="2381250"/>
+            <wp:effectExtent l="0" t="0" r="0" b="0"/>
+            <wp:docPr id="1479252684" name="Picture 1"/>
+            <wp:cNvGraphicFramePr>
+              <a:graphicFrameLocks xmlns:a="http://schemas.openxmlformats.org/drawingml/2006/main" noChangeAspect="1"/>
+            </wp:cNvGraphicFramePr>
+            <a:graphic xmlns:a="http://schemas.openxmlformats.org/drawingml/2006/main">
+              <a:graphicData uri="http://schemas.openxmlformats.org/drawingml/2006/picture">
+                <pic:pic xmlns:pic="http://schemas.openxmlformats.org/drawingml/2006/picture">
+                  <pic:nvPicPr>
+                    <pic:cNvPr id="1479252684" name=""/>
+                    <pic:cNvPicPr/>
+                  </pic:nvPicPr>
+                  <pic:blipFill>
+                    <a:blip r:embed="rId7"/>
+                    <a:stretch>
+                      <a:fillRect/>
+                    </a:stretch>
+                  </pic:blipFill>
+                  <pic:spPr>
+                    <a:xfrm>
+                      <a:off x="0" y="0"/>
+                      <a:ext cx="3964442" cy="2382477"/>
+                    </a:xfrm>
+                    <a:prstGeom prst="rect">
+                      <a:avLst/>
+                    </a:prstGeom>
+                  </pic:spPr>
+                </pic:pic>
+              </a:graphicData>
+            </a:graphic>
+          </wp:inline>
+        </w:drawing>
       </w:r>
     </w:p>
     <w:p>
@@ -66,7 +259,7 @@
                     <pic:cNvPicPr/>
                   </pic:nvPicPr>
                   <pic:blipFill>
-                    <a:blip r:embed="rId5"/>
+                    <a:blip r:embed="rId8"/>
                     <a:stretch>
                       <a:fillRect/>
                     </a:stretch>
@@ -89,6 +282,7 @@
     </w:p>
     <w:p>
       <w:r>
+        <w:lastRenderedPageBreak/>
         <w:t>Normal users can edit their information via each page</w:t>
       </w:r>
     </w:p>
@@ -101,7 +295,31 @@
         </w:numPr>
       </w:pPr>
       <w:r>
-        <w:t>Edit all needed fields as the “ Ho so ca nhan”.  The scenario that Phone number can be sync from the Sell request data to this page, also same for email. Data is storing in the User collection</w:t>
+        <w:t xml:space="preserve">Edit all needed fields as the </w:t>
+      </w:r>
+      <w:proofErr w:type="gramStart"/>
+      <w:r>
+        <w:t>“ Ho</w:t>
+      </w:r>
+      <w:proofErr w:type="gramEnd"/>
+      <w:r>
+        <w:t xml:space="preserve"> so ca </w:t>
+      </w:r>
+      <w:proofErr w:type="spellStart"/>
+      <w:r>
+        <w:t>nhan</w:t>
+      </w:r>
+      <w:proofErr w:type="spellEnd"/>
+      <w:r>
+        <w:t xml:space="preserve">”.  The scenario that Phone number can be sync from the Sell request data to this page, also same for email. Data is </w:t>
+      </w:r>
+      <w:proofErr w:type="gramStart"/>
+      <w:r>
+        <w:t>storing</w:t>
+      </w:r>
+      <w:proofErr w:type="gramEnd"/>
+      <w:r>
+        <w:t xml:space="preserve"> in the User collection</w:t>
       </w:r>
     </w:p>
     <w:p>
@@ -113,16 +331,48 @@
         </w:numPr>
       </w:pPr>
       <w:r>
-        <w:t>Tài khoản ngân h</w:t>
+        <w:t xml:space="preserve">Tài </w:t>
+      </w:r>
+      <w:proofErr w:type="spellStart"/>
+      <w:r>
+        <w:t>khoản</w:t>
+      </w:r>
+      <w:proofErr w:type="spellEnd"/>
+      <w:r>
+        <w:t xml:space="preserve"> </w:t>
+      </w:r>
+      <w:proofErr w:type="spellStart"/>
+      <w:r>
+        <w:t>ngân</w:t>
+      </w:r>
+      <w:proofErr w:type="spellEnd"/>
+      <w:r>
+        <w:t xml:space="preserve"> </w:t>
+      </w:r>
+      <w:proofErr w:type="spellStart"/>
+      <w:r>
+        <w:t>h</w:t>
       </w:r>
       <w:r>
         <w:t>à</w:t>
       </w:r>
       <w:r>
-        <w:t>ng is being s</w:t>
-      </w:r>
-      <w:r>
-        <w:t xml:space="preserve">tored in the bank_account </w:t>
+        <w:t>ng</w:t>
+      </w:r>
+      <w:proofErr w:type="spellEnd"/>
+      <w:r>
+        <w:t xml:space="preserve"> is being s</w:t>
+      </w:r>
+      <w:r>
+        <w:t xml:space="preserve">tored in the </w:t>
+      </w:r>
+      <w:proofErr w:type="spellStart"/>
+      <w:r>
+        <w:t>bank_account</w:t>
+      </w:r>
+      <w:proofErr w:type="spellEnd"/>
+      <w:r>
+        <w:t xml:space="preserve"> </w:t>
       </w:r>
       <w:r>
         <w:t xml:space="preserve">database </w:t>
@@ -134,7 +384,15 @@
         <w:t>ed</w:t>
       </w:r>
       <w:r>
-        <w:t xml:space="preserve"> when user request to become a Seller</w:t>
+        <w:t xml:space="preserve"> when user </w:t>
+      </w:r>
+      <w:proofErr w:type="gramStart"/>
+      <w:r>
+        <w:t>request</w:t>
+      </w:r>
+      <w:proofErr w:type="gramEnd"/>
+      <w:r>
+        <w:t xml:space="preserve"> to become a Seller</w:t>
       </w:r>
     </w:p>
     <w:p>
@@ -158,7 +416,7 @@
                     <pic:cNvPicPr/>
                   </pic:nvPicPr>
                   <pic:blipFill>
-                    <a:blip r:embed="rId6"/>
+                    <a:blip r:embed="rId9"/>
                     <a:stretch>
                       <a:fillRect/>
                     </a:stretch>
@@ -187,19 +445,41 @@
           <w:numId w:val="5"/>
         </w:numPr>
       </w:pPr>
-      <w:r>
-        <w:lastRenderedPageBreak/>
-        <w:t xml:space="preserve">Địa chỉ </w:t>
-      </w:r>
+      <w:proofErr w:type="spellStart"/>
+      <w:r>
+        <w:t>Địa</w:t>
+      </w:r>
+      <w:proofErr w:type="spellEnd"/>
+      <w:r>
+        <w:t xml:space="preserve"> </w:t>
+      </w:r>
+      <w:proofErr w:type="spellStart"/>
+      <w:r>
+        <w:t>chỉ</w:t>
+      </w:r>
+      <w:proofErr w:type="spellEnd"/>
+      <w:r>
+        <w:t xml:space="preserve"> </w:t>
+      </w:r>
+      <w:proofErr w:type="spellStart"/>
       <w:r>
         <w:t>ng</w:t>
       </w:r>
       <w:r>
-        <w:t>ận h</w:t>
+        <w:t>ận</w:t>
+      </w:r>
+      <w:proofErr w:type="spellEnd"/>
+      <w:r>
+        <w:t xml:space="preserve"> </w:t>
+      </w:r>
+      <w:proofErr w:type="spellStart"/>
+      <w:r>
+        <w:t>h</w:t>
       </w:r>
       <w:r>
         <w:t>àng</w:t>
       </w:r>
+      <w:proofErr w:type="spellEnd"/>
       <w:r>
         <w:t>: Users can update data here. This is also synced to the Seller registry from if use request to become a Seller</w:t>
       </w:r>
@@ -225,7 +505,7 @@
                     <pic:cNvPicPr/>
                   </pic:nvPicPr>
                   <pic:blipFill>
-                    <a:blip r:embed="rId7"/>
+                    <a:blip r:embed="rId10"/>
                     <a:stretch>
                       <a:fillRect/>
                     </a:stretch>
@@ -261,17 +541,33 @@
         <w:rPr>
           <w:highlight w:val="yellow"/>
         </w:rPr>
-        <w:t>. Future will implement a validation email account to make sure fake email is not available. Also the password constrain will be asked for stronger.</w:t>
+        <w:t xml:space="preserve">. Future will implement a validation email account to make sure fake email is not available. </w:t>
+      </w:r>
+      <w:proofErr w:type="gramStart"/>
+      <w:r>
+        <w:rPr>
+          <w:highlight w:val="yellow"/>
+        </w:rPr>
+        <w:t>Also</w:t>
+      </w:r>
+      <w:proofErr w:type="gramEnd"/>
+      <w:r>
+        <w:rPr>
+          <w:highlight w:val="yellow"/>
+        </w:rPr>
+        <w:t xml:space="preserve"> the password constrain will be asked for stronger.</w:t>
       </w:r>
     </w:p>
     <w:p>
       <w:pPr>
         <w:pStyle w:val="ListParagraph"/>
+        <w:jc w:val="center"/>
       </w:pPr>
       <w:r>
         <w:rPr>
           <w:noProof/>
         </w:rPr>
+        <w:lastRenderedPageBreak/>
         <w:drawing>
           <wp:inline distT="0" distB="0" distL="0" distR="0" wp14:anchorId="54CCB5FC" wp14:editId="535D6361">
             <wp:extent cx="5943600" cy="2646045"/>
@@ -288,7 +584,7 @@
                     <pic:cNvPicPr/>
                   </pic:nvPicPr>
                   <pic:blipFill>
-                    <a:blip r:embed="rId8"/>
+                    <a:blip r:embed="rId11"/>
                     <a:stretch>
                       <a:fillRect/>
                     </a:stretch>
@@ -322,11 +618,13 @@
       </w:r>
     </w:p>
     <w:p>
+      <w:pPr>
+        <w:jc w:val="center"/>
+      </w:pPr>
       <w:r>
         <w:rPr>
           <w:noProof/>
         </w:rPr>
-        <w:lastRenderedPageBreak/>
         <w:drawing>
           <wp:inline distT="0" distB="0" distL="0" distR="0" wp14:anchorId="309E4F4B" wp14:editId="45173F7B">
             <wp:extent cx="5943600" cy="2635250"/>
@@ -343,7 +641,7 @@
                     <pic:cNvPicPr/>
                   </pic:nvPicPr>
                   <pic:blipFill>
-                    <a:blip r:embed="rId9"/>
+                    <a:blip r:embed="rId12"/>
                     <a:stretch>
                       <a:fillRect/>
                     </a:stretch>
@@ -374,14 +672,26 @@
         </w:numPr>
       </w:pPr>
       <w:r>
-        <w:t>Become a seller: This contains a huge complex steps to register to become a Seller with using AI connection service support to scan to detect the fake CCCD info</w:t>
-      </w:r>
-    </w:p>
-    <w:p>
+        <w:t xml:space="preserve">Become a seller: This contains a </w:t>
+      </w:r>
+      <w:proofErr w:type="gramStart"/>
+      <w:r>
+        <w:t>huge complex steps</w:t>
+      </w:r>
+      <w:proofErr w:type="gramEnd"/>
+      <w:r>
+        <w:t xml:space="preserve"> to register to become a Seller with using AI connection service support to scan to detect the fake CCCD info</w:t>
+      </w:r>
+    </w:p>
+    <w:p>
+      <w:pPr>
+        <w:jc w:val="center"/>
+      </w:pPr>
       <w:r>
         <w:rPr>
           <w:noProof/>
         </w:rPr>
+        <w:lastRenderedPageBreak/>
         <w:drawing>
           <wp:inline distT="0" distB="0" distL="0" distR="0" wp14:anchorId="28A55FF1" wp14:editId="1F817A24">
             <wp:extent cx="5943600" cy="3066415"/>
@@ -398,7 +708,7 @@
                     <pic:cNvPicPr/>
                   </pic:nvPicPr>
                   <pic:blipFill>
-                    <a:blip r:embed="rId10"/>
+                    <a:blip r:embed="rId13"/>
                     <a:stretch>
                       <a:fillRect/>
                     </a:stretch>
@@ -454,13 +764,13 @@
       </w:r>
       <w:r>
         <w:br/>
-      </w:r>
-      <w:r>
-        <w:lastRenderedPageBreak/>
         <w:t>The scenario that users will be redirected to the bank account to ask the user fill bank information’s. After fully filled this, the app will redirect to the detail steps of seller register.</w:t>
       </w:r>
     </w:p>
     <w:p>
+      <w:pPr>
+        <w:jc w:val="center"/>
+      </w:pPr>
       <w:r>
         <w:rPr>
           <w:noProof/>
@@ -481,7 +791,7 @@
                     <pic:cNvPicPr/>
                   </pic:nvPicPr>
                   <pic:blipFill>
-                    <a:blip r:embed="rId11"/>
+                    <a:blip r:embed="rId14"/>
                     <a:stretch>
                       <a:fillRect/>
                     </a:stretch>
@@ -509,10 +819,14 @@
       </w:r>
     </w:p>
     <w:p>
+      <w:pPr>
+        <w:jc w:val="center"/>
+      </w:pPr>
       <w:r>
         <w:rPr>
           <w:noProof/>
         </w:rPr>
+        <w:lastRenderedPageBreak/>
         <w:drawing>
           <wp:inline distT="0" distB="0" distL="0" distR="0" wp14:anchorId="73DFCE24" wp14:editId="209ECB89">
             <wp:extent cx="5943600" cy="3066415"/>
@@ -529,7 +843,7 @@
                     <pic:cNvPicPr/>
                   </pic:nvPicPr>
                   <pic:blipFill>
-                    <a:blip r:embed="rId10"/>
+                    <a:blip r:embed="rId13"/>
                     <a:stretch>
                       <a:fillRect/>
                     </a:stretch>
@@ -558,11 +872,13 @@
       </w:r>
     </w:p>
     <w:p>
+      <w:pPr>
+        <w:jc w:val="center"/>
+      </w:pPr>
       <w:r>
         <w:rPr>
           <w:noProof/>
         </w:rPr>
-        <w:lastRenderedPageBreak/>
         <w:drawing>
           <wp:inline distT="0" distB="0" distL="0" distR="0" wp14:anchorId="47CF53DD" wp14:editId="51107850">
             <wp:extent cx="5943600" cy="3136265"/>
@@ -579,7 +895,7 @@
                     <pic:cNvPicPr/>
                   </pic:nvPicPr>
                   <pic:blipFill>
-                    <a:blip r:embed="rId12"/>
+                    <a:blip r:embed="rId15"/>
                     <a:stretch>
                       <a:fillRect/>
                     </a:stretch>
@@ -608,10 +924,14 @@
     </w:p>
     <w:p>
       <w:r>
+        <w:lastRenderedPageBreak/>
         <w:t>Next screen that asks users to fill the method of transportation</w:t>
       </w:r>
     </w:p>
     <w:p>
+      <w:pPr>
+        <w:jc w:val="center"/>
+      </w:pPr>
       <w:r>
         <w:rPr>
           <w:noProof/>
@@ -632,7 +952,7 @@
                     <pic:cNvPicPr/>
                   </pic:nvPicPr>
                   <pic:blipFill>
-                    <a:blip r:embed="rId13"/>
+                    <a:blip r:embed="rId16"/>
                     <a:stretch>
                       <a:fillRect/>
                     </a:stretch>
@@ -660,10 +980,21 @@
     <w:p/>
     <w:p>
       <w:r>
-        <w:t>Users must type the business type and full fill sufficient info and validation</w:t>
-      </w:r>
-    </w:p>
-    <w:p>
+        <w:t xml:space="preserve">Users must type the business type and </w:t>
+      </w:r>
+      <w:proofErr w:type="gramStart"/>
+      <w:r>
+        <w:t>full</w:t>
+      </w:r>
+      <w:proofErr w:type="gramEnd"/>
+      <w:r>
+        <w:t xml:space="preserve"> fill sufficient info and validation</w:t>
+      </w:r>
+    </w:p>
+    <w:p>
+      <w:pPr>
+        <w:jc w:val="center"/>
+      </w:pPr>
       <w:r>
         <w:rPr>
           <w:noProof/>
@@ -684,7 +1015,7 @@
                     <pic:cNvPicPr/>
                   </pic:nvPicPr>
                   <pic:blipFill>
-                    <a:blip r:embed="rId14"/>
+                    <a:blip r:embed="rId17"/>
                     <a:stretch>
                       <a:fillRect/>
                     </a:stretch>
@@ -707,16 +1038,25 @@
     </w:p>
     <w:p>
       <w:r>
+        <w:lastRenderedPageBreak/>
         <w:t xml:space="preserve">Personal </w:t>
       </w:r>
-      <w:r>
-        <w:t>business(Same</w:t>
+      <w:proofErr w:type="gramStart"/>
+      <w:r>
+        <w:t>business(</w:t>
+      </w:r>
+      <w:proofErr w:type="gramEnd"/>
+      <w:r>
+        <w:t>Same</w:t>
       </w:r>
       <w:r>
         <w:t xml:space="preserve"> screen for Company business)</w:t>
       </w:r>
     </w:p>
     <w:p>
+      <w:pPr>
+        <w:jc w:val="center"/>
+      </w:pPr>
       <w:r>
         <w:rPr>
           <w:noProof/>
@@ -737,7 +1077,7 @@
                     <pic:cNvPicPr/>
                   </pic:nvPicPr>
                   <pic:blipFill>
-                    <a:blip r:embed="rId15"/>
+                    <a:blip r:embed="rId18"/>
                     <a:stretch>
                       <a:fillRect/>
                     </a:stretch>
@@ -760,8 +1100,10 @@
     </w:p>
     <w:p/>
     <w:p>
-      <w:r>
-        <w:lastRenderedPageBreak/>
+      <w:pPr>
+        <w:jc w:val="center"/>
+      </w:pPr>
+      <w:r>
         <w:t xml:space="preserve">Users must </w:t>
       </w:r>
       <w:r>
@@ -796,7 +1138,7 @@
                     <pic:cNvPicPr/>
                   </pic:nvPicPr>
                   <pic:blipFill>
-                    <a:blip r:embed="rId16"/>
+                    <a:blip r:embed="rId19"/>
                     <a:stretch>
                       <a:fillRect/>
                     </a:stretch>
@@ -820,6 +1162,7 @@
     <w:p/>
     <w:p>
       <w:r>
+        <w:lastRenderedPageBreak/>
         <w:t xml:space="preserve">Users will be denied moving to next steps </w:t>
       </w:r>
       <w:r>
@@ -828,22 +1171,29 @@
       <w:r>
         <w:t xml:space="preserve"> the result and ask the user </w:t>
       </w:r>
+      <w:proofErr w:type="gramStart"/>
       <w:r>
         <w:t>must</w:t>
       </w:r>
       <w:r>
-        <w:t xml:space="preserve"> verify and update the correct information</w:t>
+        <w:t xml:space="preserve"> verify</w:t>
+      </w:r>
+      <w:proofErr w:type="gramEnd"/>
+      <w:r>
+        <w:t xml:space="preserve"> and update the correct information</w:t>
       </w:r>
       <w:r>
         <w:t>.</w:t>
       </w:r>
     </w:p>
     <w:p>
+      <w:pPr>
+        <w:jc w:val="center"/>
+      </w:pPr>
       <w:r>
         <w:rPr>
           <w:noProof/>
         </w:rPr>
-        <w:lastRenderedPageBreak/>
         <w:drawing>
           <wp:inline distT="0" distB="0" distL="0" distR="0" wp14:anchorId="2714DCDE" wp14:editId="72553935">
             <wp:extent cx="5943600" cy="4973320"/>
@@ -860,7 +1210,7 @@
                     <pic:cNvPicPr/>
                   </pic:nvPicPr>
                   <pic:blipFill>
-                    <a:blip r:embed="rId17"/>
+                    <a:blip r:embed="rId20"/>
                     <a:stretch>
                       <a:fillRect/>
                     </a:stretch>
@@ -888,6 +1238,9 @@
       </w:r>
     </w:p>
     <w:p>
+      <w:pPr>
+        <w:jc w:val="center"/>
+      </w:pPr>
       <w:r>
         <w:rPr>
           <w:noProof/>
@@ -909,7 +1262,7 @@
                     <pic:cNvPicPr/>
                   </pic:nvPicPr>
                   <pic:blipFill>
-                    <a:blip r:embed="rId18"/>
+                    <a:blip r:embed="rId21"/>
                     <a:stretch>
                       <a:fillRect/>
                     </a:stretch>
@@ -932,8 +1285,19 @@
     </w:p>
     <w:p/>
     <w:p>
-      <w:r>
-        <w:t>After all information needed id valid, the requester will receive the notification and email as below</w:t>
+      <w:pPr>
+        <w:jc w:val="center"/>
+      </w:pPr>
+      <w:r>
+        <w:t xml:space="preserve">After all information needed </w:t>
+      </w:r>
+      <w:proofErr w:type="gramStart"/>
+      <w:r>
+        <w:t>id</w:t>
+      </w:r>
+      <w:proofErr w:type="gramEnd"/>
+      <w:r>
+        <w:t xml:space="preserve"> valid, the requester will receive the notification and email as below</w:t>
       </w:r>
       <w:r>
         <w:br/>
@@ -961,7 +1325,7 @@
                     <pic:cNvPicPr/>
                   </pic:nvPicPr>
                   <pic:blipFill>
-                    <a:blip r:embed="rId19"/>
+                    <a:blip r:embed="rId22"/>
                     <a:stretch>
                       <a:fillRect/>
                     </a:stretch>
@@ -984,6 +1348,9 @@
     </w:p>
     <w:p/>
     <w:p>
+      <w:pPr>
+        <w:jc w:val="center"/>
+      </w:pPr>
       <w:r>
         <w:rPr>
           <w:noProof/>
@@ -1005,7 +1372,7 @@
                     <pic:cNvPicPr/>
                   </pic:nvPicPr>
                   <pic:blipFill>
-                    <a:blip r:embed="rId20"/>
+                    <a:blip r:embed="rId23"/>
                     <a:stretch>
                       <a:fillRect/>
                     </a:stretch>
@@ -1064,13 +1431,247 @@
         <w:tab/>
       </w:r>
       <w:r>
-        <w:t>"Hồ sơ đang chờ phê duyệt</w:t>
-      </w:r>
+        <w:t>"</w:t>
+      </w:r>
+      <w:proofErr w:type="spellStart"/>
+      <w:r>
+        <w:t>Hồ</w:t>
+      </w:r>
+      <w:proofErr w:type="spellEnd"/>
+      <w:r>
+        <w:t xml:space="preserve"> </w:t>
+      </w:r>
+      <w:proofErr w:type="spellStart"/>
+      <w:r>
+        <w:t>sơ</w:t>
+      </w:r>
+      <w:proofErr w:type="spellEnd"/>
+      <w:r>
+        <w:t xml:space="preserve"> </w:t>
+      </w:r>
+      <w:proofErr w:type="spellStart"/>
+      <w:r>
+        <w:t>đang</w:t>
+      </w:r>
+      <w:proofErr w:type="spellEnd"/>
+      <w:r>
+        <w:t xml:space="preserve"> </w:t>
+      </w:r>
+      <w:proofErr w:type="spellStart"/>
+      <w:r>
+        <w:t>chờ</w:t>
+      </w:r>
+      <w:proofErr w:type="spellEnd"/>
+      <w:r>
+        <w:t xml:space="preserve"> </w:t>
+      </w:r>
+      <w:proofErr w:type="spellStart"/>
+      <w:r>
+        <w:t>phê</w:t>
+      </w:r>
+      <w:proofErr w:type="spellEnd"/>
+      <w:r>
+        <w:t xml:space="preserve"> </w:t>
+      </w:r>
+      <w:proofErr w:type="spellStart"/>
+      <w:r>
+        <w:t>duyệt</w:t>
+      </w:r>
+      <w:proofErr w:type="spellEnd"/>
       <w:r>
         <w:t xml:space="preserve">. </w:t>
       </w:r>
-      <w:r>
-        <w:t>Yêu cầu đăng ký Người bán của bạn đã được tiếp nhận. Đội ngũ kiểm duyệt sẽ phản hồi trong vòng 24 giờ làm việc."</w:t>
+      <w:proofErr w:type="spellStart"/>
+      <w:r>
+        <w:t>Yêu</w:t>
+      </w:r>
+      <w:proofErr w:type="spellEnd"/>
+      <w:r>
+        <w:t xml:space="preserve"> </w:t>
+      </w:r>
+      <w:proofErr w:type="spellStart"/>
+      <w:r>
+        <w:t>cầu</w:t>
+      </w:r>
+      <w:proofErr w:type="spellEnd"/>
+      <w:r>
+        <w:t xml:space="preserve"> </w:t>
+      </w:r>
+      <w:proofErr w:type="spellStart"/>
+      <w:r>
+        <w:t>đăng</w:t>
+      </w:r>
+      <w:proofErr w:type="spellEnd"/>
+      <w:r>
+        <w:t xml:space="preserve"> </w:t>
+      </w:r>
+      <w:proofErr w:type="spellStart"/>
+      <w:r>
+        <w:t>ký</w:t>
+      </w:r>
+      <w:proofErr w:type="spellEnd"/>
+      <w:r>
+        <w:t xml:space="preserve"> </w:t>
+      </w:r>
+      <w:proofErr w:type="spellStart"/>
+      <w:r>
+        <w:t>Người</w:t>
+      </w:r>
+      <w:proofErr w:type="spellEnd"/>
+      <w:r>
+        <w:t xml:space="preserve"> </w:t>
+      </w:r>
+      <w:proofErr w:type="spellStart"/>
+      <w:r>
+        <w:t>bán</w:t>
+      </w:r>
+      <w:proofErr w:type="spellEnd"/>
+      <w:r>
+        <w:t xml:space="preserve"> </w:t>
+      </w:r>
+      <w:proofErr w:type="spellStart"/>
+      <w:r>
+        <w:t>của</w:t>
+      </w:r>
+      <w:proofErr w:type="spellEnd"/>
+      <w:r>
+        <w:t xml:space="preserve"> </w:t>
+      </w:r>
+      <w:proofErr w:type="spellStart"/>
+      <w:r>
+        <w:t>bạn</w:t>
+      </w:r>
+      <w:proofErr w:type="spellEnd"/>
+      <w:r>
+        <w:t xml:space="preserve"> </w:t>
+      </w:r>
+      <w:proofErr w:type="spellStart"/>
+      <w:r>
+        <w:t>đã</w:t>
+      </w:r>
+      <w:proofErr w:type="spellEnd"/>
+      <w:r>
+        <w:t xml:space="preserve"> </w:t>
+      </w:r>
+      <w:proofErr w:type="spellStart"/>
+      <w:r>
+        <w:t>được</w:t>
+      </w:r>
+      <w:proofErr w:type="spellEnd"/>
+      <w:r>
+        <w:t xml:space="preserve"> </w:t>
+      </w:r>
+      <w:proofErr w:type="spellStart"/>
+      <w:r>
+        <w:t>tiếp</w:t>
+      </w:r>
+      <w:proofErr w:type="spellEnd"/>
+      <w:r>
+        <w:t xml:space="preserve"> </w:t>
+      </w:r>
+      <w:proofErr w:type="spellStart"/>
+      <w:r>
+        <w:t>nhận</w:t>
+      </w:r>
+      <w:proofErr w:type="spellEnd"/>
+      <w:r>
+        <w:t xml:space="preserve">. </w:t>
+      </w:r>
+      <w:proofErr w:type="spellStart"/>
+      <w:r>
+        <w:t>Đội</w:t>
+      </w:r>
+      <w:proofErr w:type="spellEnd"/>
+      <w:r>
+        <w:t xml:space="preserve"> </w:t>
+      </w:r>
+      <w:proofErr w:type="spellStart"/>
+      <w:r>
+        <w:t>ngũ</w:t>
+      </w:r>
+      <w:proofErr w:type="spellEnd"/>
+      <w:r>
+        <w:t xml:space="preserve"> </w:t>
+      </w:r>
+      <w:proofErr w:type="spellStart"/>
+      <w:r>
+        <w:t>kiểm</w:t>
+      </w:r>
+      <w:proofErr w:type="spellEnd"/>
+      <w:r>
+        <w:t xml:space="preserve"> </w:t>
+      </w:r>
+      <w:proofErr w:type="spellStart"/>
+      <w:r>
+        <w:t>duyệt</w:t>
+      </w:r>
+      <w:proofErr w:type="spellEnd"/>
+      <w:r>
+        <w:t xml:space="preserve"> </w:t>
+      </w:r>
+      <w:proofErr w:type="spellStart"/>
+      <w:r>
+        <w:t>sẽ</w:t>
+      </w:r>
+      <w:proofErr w:type="spellEnd"/>
+      <w:r>
+        <w:t xml:space="preserve"> </w:t>
+      </w:r>
+      <w:proofErr w:type="spellStart"/>
+      <w:r>
+        <w:t>phản</w:t>
+      </w:r>
+      <w:proofErr w:type="spellEnd"/>
+      <w:r>
+        <w:t xml:space="preserve"> </w:t>
+      </w:r>
+      <w:proofErr w:type="spellStart"/>
+      <w:r>
+        <w:t>hồi</w:t>
+      </w:r>
+      <w:proofErr w:type="spellEnd"/>
+      <w:r>
+        <w:t xml:space="preserve"> </w:t>
+      </w:r>
+      <w:proofErr w:type="spellStart"/>
+      <w:r>
+        <w:t>trong</w:t>
+      </w:r>
+      <w:proofErr w:type="spellEnd"/>
+      <w:r>
+        <w:t xml:space="preserve"> </w:t>
+      </w:r>
+      <w:proofErr w:type="spellStart"/>
+      <w:r>
+        <w:t>vòng</w:t>
+      </w:r>
+      <w:proofErr w:type="spellEnd"/>
+      <w:r>
+        <w:t xml:space="preserve"> 24 </w:t>
+      </w:r>
+      <w:proofErr w:type="spellStart"/>
+      <w:r>
+        <w:t>giờ</w:t>
+      </w:r>
+      <w:proofErr w:type="spellEnd"/>
+      <w:r>
+        <w:t xml:space="preserve"> </w:t>
+      </w:r>
+      <w:proofErr w:type="spellStart"/>
+      <w:r>
+        <w:t>làm</w:t>
+      </w:r>
+      <w:proofErr w:type="spellEnd"/>
+      <w:r>
+        <w:t xml:space="preserve"> </w:t>
+      </w:r>
+      <w:proofErr w:type="spellStart"/>
+      <w:r>
+        <w:t>việc</w:t>
+      </w:r>
+      <w:proofErr w:type="spellEnd"/>
+      <w:r>
+        <w:t>."</w:t>
       </w:r>
     </w:p>
     <w:p>
@@ -1087,6 +1688,9 @@
       </w:r>
     </w:p>
     <w:p>
+      <w:pPr>
+        <w:jc w:val="center"/>
+      </w:pPr>
       <w:r>
         <w:rPr>
           <w:noProof/>
@@ -1108,7 +1712,7 @@
                     <pic:cNvPicPr/>
                   </pic:nvPicPr>
                   <pic:blipFill>
-                    <a:blip r:embed="rId21"/>
+                    <a:blip r:embed="rId24"/>
                     <a:stretch>
                       <a:fillRect/>
                     </a:stretch>
@@ -1149,18 +1753,202 @@
         <w:t>progress</w:t>
       </w:r>
       <w:r>
-        <w:t xml:space="preserve"> of the status and a notification also appear "Đăng ký thành công!</w:t>
-      </w:r>
-    </w:p>
-    <w:p>
-      <w:r>
-        <w:t xml:space="preserve">                Hồ sơ của bạn đã được gửi. Chúng tôi đã gửi email xác nhận đến pending@ainetsoft.com.</w:t>
+        <w:t xml:space="preserve"> of the status and a notification also appear "</w:t>
+      </w:r>
+      <w:proofErr w:type="spellStart"/>
+      <w:r>
+        <w:t>Đăng</w:t>
+      </w:r>
+      <w:proofErr w:type="spellEnd"/>
+      <w:r>
+        <w:t xml:space="preserve"> </w:t>
+      </w:r>
+      <w:proofErr w:type="spellStart"/>
+      <w:r>
+        <w:t>ký</w:t>
+      </w:r>
+      <w:proofErr w:type="spellEnd"/>
+      <w:r>
+        <w:t xml:space="preserve"> </w:t>
+      </w:r>
+      <w:proofErr w:type="spellStart"/>
+      <w:r>
+        <w:t>thành</w:t>
+      </w:r>
+      <w:proofErr w:type="spellEnd"/>
+      <w:r>
+        <w:t xml:space="preserve"> </w:t>
+      </w:r>
+      <w:proofErr w:type="spellStart"/>
+      <w:r>
+        <w:t>công</w:t>
+      </w:r>
+      <w:proofErr w:type="spellEnd"/>
+      <w:r>
+        <w:t>!</w:t>
+      </w:r>
+    </w:p>
+    <w:p>
+      <w:r>
+        <w:t xml:space="preserve">                </w:t>
+      </w:r>
+      <w:proofErr w:type="spellStart"/>
+      <w:r>
+        <w:t>Hồ</w:t>
+      </w:r>
+      <w:proofErr w:type="spellEnd"/>
+      <w:r>
+        <w:t xml:space="preserve"> </w:t>
+      </w:r>
+      <w:proofErr w:type="spellStart"/>
+      <w:r>
+        <w:t>sơ</w:t>
+      </w:r>
+      <w:proofErr w:type="spellEnd"/>
+      <w:r>
+        <w:t xml:space="preserve"> </w:t>
+      </w:r>
+      <w:proofErr w:type="spellStart"/>
+      <w:r>
+        <w:t>của</w:t>
+      </w:r>
+      <w:proofErr w:type="spellEnd"/>
+      <w:r>
+        <w:t xml:space="preserve"> </w:t>
+      </w:r>
+      <w:proofErr w:type="spellStart"/>
+      <w:r>
+        <w:t>bạn</w:t>
+      </w:r>
+      <w:proofErr w:type="spellEnd"/>
+      <w:r>
+        <w:t xml:space="preserve"> </w:t>
+      </w:r>
+      <w:proofErr w:type="spellStart"/>
+      <w:r>
+        <w:t>đã</w:t>
+      </w:r>
+      <w:proofErr w:type="spellEnd"/>
+      <w:r>
+        <w:t xml:space="preserve"> </w:t>
+      </w:r>
+      <w:proofErr w:type="spellStart"/>
+      <w:r>
+        <w:t>được</w:t>
+      </w:r>
+      <w:proofErr w:type="spellEnd"/>
+      <w:r>
+        <w:t xml:space="preserve"> </w:t>
+      </w:r>
+      <w:proofErr w:type="spellStart"/>
+      <w:r>
+        <w:t>gửi</w:t>
+      </w:r>
+      <w:proofErr w:type="spellEnd"/>
+      <w:r>
+        <w:t xml:space="preserve">. </w:t>
+      </w:r>
+      <w:proofErr w:type="spellStart"/>
+      <w:r>
+        <w:t>Chúng</w:t>
+      </w:r>
+      <w:proofErr w:type="spellEnd"/>
+      <w:r>
+        <w:t xml:space="preserve"> </w:t>
+      </w:r>
+      <w:proofErr w:type="spellStart"/>
+      <w:r>
+        <w:t>tôi</w:t>
+      </w:r>
+      <w:proofErr w:type="spellEnd"/>
+      <w:r>
+        <w:t xml:space="preserve"> </w:t>
+      </w:r>
+      <w:proofErr w:type="spellStart"/>
+      <w:r>
+        <w:t>đã</w:t>
+      </w:r>
+      <w:proofErr w:type="spellEnd"/>
+      <w:r>
+        <w:t xml:space="preserve"> </w:t>
+      </w:r>
+      <w:proofErr w:type="spellStart"/>
+      <w:r>
+        <w:t>gửi</w:t>
+      </w:r>
+      <w:proofErr w:type="spellEnd"/>
+      <w:r>
+        <w:t xml:space="preserve"> email </w:t>
+      </w:r>
+      <w:proofErr w:type="spellStart"/>
+      <w:r>
+        <w:t>xác</w:t>
+      </w:r>
+      <w:proofErr w:type="spellEnd"/>
+      <w:r>
+        <w:t xml:space="preserve"> </w:t>
+      </w:r>
+      <w:proofErr w:type="spellStart"/>
+      <w:r>
+        <w:t>nhận</w:t>
+      </w:r>
+      <w:proofErr w:type="spellEnd"/>
+      <w:r>
+        <w:t xml:space="preserve"> </w:t>
+      </w:r>
+      <w:proofErr w:type="spellStart"/>
+      <w:r>
+        <w:t>đến</w:t>
+      </w:r>
+      <w:proofErr w:type="spellEnd"/>
+      <w:r>
+        <w:t xml:space="preserve"> pending@ainetsoft.com.</w:t>
       </w:r>
     </w:p>
     <w:p/>
     <w:p>
       <w:r>
-        <w:t xml:space="preserve">                Phản hồi chậm nhất trong vòng 24h"</w:t>
+        <w:t xml:space="preserve">                Phản </w:t>
+      </w:r>
+      <w:proofErr w:type="spellStart"/>
+      <w:r>
+        <w:t>hồi</w:t>
+      </w:r>
+      <w:proofErr w:type="spellEnd"/>
+      <w:r>
+        <w:t xml:space="preserve"> </w:t>
+      </w:r>
+      <w:proofErr w:type="spellStart"/>
+      <w:r>
+        <w:t>chậm</w:t>
+      </w:r>
+      <w:proofErr w:type="spellEnd"/>
+      <w:r>
+        <w:t xml:space="preserve"> </w:t>
+      </w:r>
+      <w:proofErr w:type="spellStart"/>
+      <w:r>
+        <w:t>nhất</w:t>
+      </w:r>
+      <w:proofErr w:type="spellEnd"/>
+      <w:r>
+        <w:t xml:space="preserve"> </w:t>
+      </w:r>
+      <w:proofErr w:type="spellStart"/>
+      <w:r>
+        <w:t>trong</w:t>
+      </w:r>
+      <w:proofErr w:type="spellEnd"/>
+      <w:r>
+        <w:t xml:space="preserve"> </w:t>
+      </w:r>
+      <w:proofErr w:type="spellStart"/>
+      <w:r>
+        <w:t>vòng</w:t>
+      </w:r>
+      <w:proofErr w:type="spellEnd"/>
+      <w:r>
+        <w:t xml:space="preserve"> 24h"</w:t>
       </w:r>
     </w:p>
     <w:p>
@@ -1194,33 +1982,545 @@
         <w:rPr>
           <w:color w:val="EE0000"/>
         </w:rPr>
-        <w:t xml:space="preserve"> "Hồ sơ bị từ chối</w:t>
-      </w:r>
-    </w:p>
-    <w:p>
-      <w:pPr>
-        <w:rPr>
-          <w:color w:val="EE0000"/>
-        </w:rPr>
-      </w:pPr>
-      <w:r>
-        <w:rPr>
-          <w:color w:val="EE0000"/>
-        </w:rPr>
-        <w:t xml:space="preserve">                Lý do: Chụp lại ảnh CCCD.</w:t>
-      </w:r>
-    </w:p>
-    <w:p>
-      <w:pPr>
-        <w:rPr>
-          <w:color w:val="EE0000"/>
-        </w:rPr>
-      </w:pPr>
-      <w:r>
-        <w:rPr>
-          <w:color w:val="EE0000"/>
-        </w:rPr>
-        <w:t xml:space="preserve">                Hệ thống không thể xác thực một số thông tin của bạn. Vui lòng kiểm tra lại lý do trên và cập nhật hồ sơ chính xác trước khi gửi lại."</w:t>
+        <w:t xml:space="preserve"> "</w:t>
+      </w:r>
+      <w:proofErr w:type="spellStart"/>
+      <w:r>
+        <w:rPr>
+          <w:color w:val="EE0000"/>
+        </w:rPr>
+        <w:t>Hồ</w:t>
+      </w:r>
+      <w:proofErr w:type="spellEnd"/>
+      <w:r>
+        <w:rPr>
+          <w:color w:val="EE0000"/>
+        </w:rPr>
+        <w:t xml:space="preserve"> </w:t>
+      </w:r>
+      <w:proofErr w:type="spellStart"/>
+      <w:r>
+        <w:rPr>
+          <w:color w:val="EE0000"/>
+        </w:rPr>
+        <w:t>sơ</w:t>
+      </w:r>
+      <w:proofErr w:type="spellEnd"/>
+      <w:r>
+        <w:rPr>
+          <w:color w:val="EE0000"/>
+        </w:rPr>
+        <w:t xml:space="preserve"> </w:t>
+      </w:r>
+      <w:proofErr w:type="spellStart"/>
+      <w:r>
+        <w:rPr>
+          <w:color w:val="EE0000"/>
+        </w:rPr>
+        <w:t>bị</w:t>
+      </w:r>
+      <w:proofErr w:type="spellEnd"/>
+      <w:r>
+        <w:rPr>
+          <w:color w:val="EE0000"/>
+        </w:rPr>
+        <w:t xml:space="preserve"> </w:t>
+      </w:r>
+      <w:proofErr w:type="spellStart"/>
+      <w:r>
+        <w:rPr>
+          <w:color w:val="EE0000"/>
+        </w:rPr>
+        <w:t>từ</w:t>
+      </w:r>
+      <w:proofErr w:type="spellEnd"/>
+      <w:r>
+        <w:rPr>
+          <w:color w:val="EE0000"/>
+        </w:rPr>
+        <w:t xml:space="preserve"> </w:t>
+      </w:r>
+      <w:proofErr w:type="spellStart"/>
+      <w:r>
+        <w:rPr>
+          <w:color w:val="EE0000"/>
+        </w:rPr>
+        <w:t>chối</w:t>
+      </w:r>
+      <w:proofErr w:type="spellEnd"/>
+    </w:p>
+    <w:p>
+      <w:pPr>
+        <w:rPr>
+          <w:color w:val="EE0000"/>
+        </w:rPr>
+      </w:pPr>
+      <w:r>
+        <w:rPr>
+          <w:color w:val="EE0000"/>
+        </w:rPr>
+        <w:t xml:space="preserve">                Lý </w:t>
+      </w:r>
+      <w:proofErr w:type="gramStart"/>
+      <w:r>
+        <w:rPr>
+          <w:color w:val="EE0000"/>
+        </w:rPr>
+        <w:t>do</w:t>
+      </w:r>
+      <w:proofErr w:type="gramEnd"/>
+      <w:r>
+        <w:rPr>
+          <w:color w:val="EE0000"/>
+        </w:rPr>
+        <w:t xml:space="preserve">: </w:t>
+      </w:r>
+      <w:proofErr w:type="spellStart"/>
+      <w:r>
+        <w:rPr>
+          <w:color w:val="EE0000"/>
+        </w:rPr>
+        <w:t>Chụp</w:t>
+      </w:r>
+      <w:proofErr w:type="spellEnd"/>
+      <w:r>
+        <w:rPr>
+          <w:color w:val="EE0000"/>
+        </w:rPr>
+        <w:t xml:space="preserve"> </w:t>
+      </w:r>
+      <w:proofErr w:type="spellStart"/>
+      <w:r>
+        <w:rPr>
+          <w:color w:val="EE0000"/>
+        </w:rPr>
+        <w:t>lại</w:t>
+      </w:r>
+      <w:proofErr w:type="spellEnd"/>
+      <w:r>
+        <w:rPr>
+          <w:color w:val="EE0000"/>
+        </w:rPr>
+        <w:t xml:space="preserve"> </w:t>
+      </w:r>
+      <w:proofErr w:type="spellStart"/>
+      <w:r>
+        <w:rPr>
+          <w:color w:val="EE0000"/>
+        </w:rPr>
+        <w:t>ảnh</w:t>
+      </w:r>
+      <w:proofErr w:type="spellEnd"/>
+      <w:r>
+        <w:rPr>
+          <w:color w:val="EE0000"/>
+        </w:rPr>
+        <w:t xml:space="preserve"> CCCD.</w:t>
+      </w:r>
+    </w:p>
+    <w:p>
+      <w:pPr>
+        <w:rPr>
+          <w:color w:val="EE0000"/>
+        </w:rPr>
+      </w:pPr>
+      <w:r>
+        <w:rPr>
+          <w:color w:val="EE0000"/>
+        </w:rPr>
+        <w:t xml:space="preserve">                </w:t>
+      </w:r>
+      <w:proofErr w:type="spellStart"/>
+      <w:r>
+        <w:rPr>
+          <w:color w:val="EE0000"/>
+        </w:rPr>
+        <w:t>Hệ</w:t>
+      </w:r>
+      <w:proofErr w:type="spellEnd"/>
+      <w:r>
+        <w:rPr>
+          <w:color w:val="EE0000"/>
+        </w:rPr>
+        <w:t xml:space="preserve"> </w:t>
+      </w:r>
+      <w:proofErr w:type="spellStart"/>
+      <w:r>
+        <w:rPr>
+          <w:color w:val="EE0000"/>
+        </w:rPr>
+        <w:t>thống</w:t>
+      </w:r>
+      <w:proofErr w:type="spellEnd"/>
+      <w:r>
+        <w:rPr>
+          <w:color w:val="EE0000"/>
+        </w:rPr>
+        <w:t xml:space="preserve"> </w:t>
+      </w:r>
+      <w:proofErr w:type="spellStart"/>
+      <w:r>
+        <w:rPr>
+          <w:color w:val="EE0000"/>
+        </w:rPr>
+        <w:t>không</w:t>
+      </w:r>
+      <w:proofErr w:type="spellEnd"/>
+      <w:r>
+        <w:rPr>
+          <w:color w:val="EE0000"/>
+        </w:rPr>
+        <w:t xml:space="preserve"> </w:t>
+      </w:r>
+      <w:proofErr w:type="spellStart"/>
+      <w:r>
+        <w:rPr>
+          <w:color w:val="EE0000"/>
+        </w:rPr>
+        <w:t>thể</w:t>
+      </w:r>
+      <w:proofErr w:type="spellEnd"/>
+      <w:r>
+        <w:rPr>
+          <w:color w:val="EE0000"/>
+        </w:rPr>
+        <w:t xml:space="preserve"> </w:t>
+      </w:r>
+      <w:proofErr w:type="spellStart"/>
+      <w:r>
+        <w:rPr>
+          <w:color w:val="EE0000"/>
+        </w:rPr>
+        <w:t>xác</w:t>
+      </w:r>
+      <w:proofErr w:type="spellEnd"/>
+      <w:r>
+        <w:rPr>
+          <w:color w:val="EE0000"/>
+        </w:rPr>
+        <w:t xml:space="preserve"> </w:t>
+      </w:r>
+      <w:proofErr w:type="spellStart"/>
+      <w:r>
+        <w:rPr>
+          <w:color w:val="EE0000"/>
+        </w:rPr>
+        <w:t>thực</w:t>
+      </w:r>
+      <w:proofErr w:type="spellEnd"/>
+      <w:r>
+        <w:rPr>
+          <w:color w:val="EE0000"/>
+        </w:rPr>
+        <w:t xml:space="preserve"> </w:t>
+      </w:r>
+      <w:proofErr w:type="spellStart"/>
+      <w:r>
+        <w:rPr>
+          <w:color w:val="EE0000"/>
+        </w:rPr>
+        <w:t>một</w:t>
+      </w:r>
+      <w:proofErr w:type="spellEnd"/>
+      <w:r>
+        <w:rPr>
+          <w:color w:val="EE0000"/>
+        </w:rPr>
+        <w:t xml:space="preserve"> </w:t>
+      </w:r>
+      <w:proofErr w:type="spellStart"/>
+      <w:r>
+        <w:rPr>
+          <w:color w:val="EE0000"/>
+        </w:rPr>
+        <w:t>số</w:t>
+      </w:r>
+      <w:proofErr w:type="spellEnd"/>
+      <w:r>
+        <w:rPr>
+          <w:color w:val="EE0000"/>
+        </w:rPr>
+        <w:t xml:space="preserve"> </w:t>
+      </w:r>
+      <w:proofErr w:type="spellStart"/>
+      <w:r>
+        <w:rPr>
+          <w:color w:val="EE0000"/>
+        </w:rPr>
+        <w:t>thông</w:t>
+      </w:r>
+      <w:proofErr w:type="spellEnd"/>
+      <w:r>
+        <w:rPr>
+          <w:color w:val="EE0000"/>
+        </w:rPr>
+        <w:t xml:space="preserve"> tin </w:t>
+      </w:r>
+      <w:proofErr w:type="spellStart"/>
+      <w:r>
+        <w:rPr>
+          <w:color w:val="EE0000"/>
+        </w:rPr>
+        <w:t>của</w:t>
+      </w:r>
+      <w:proofErr w:type="spellEnd"/>
+      <w:r>
+        <w:rPr>
+          <w:color w:val="EE0000"/>
+        </w:rPr>
+        <w:t xml:space="preserve"> </w:t>
+      </w:r>
+      <w:proofErr w:type="spellStart"/>
+      <w:r>
+        <w:rPr>
+          <w:color w:val="EE0000"/>
+        </w:rPr>
+        <w:t>bạn</w:t>
+      </w:r>
+      <w:proofErr w:type="spellEnd"/>
+      <w:r>
+        <w:rPr>
+          <w:color w:val="EE0000"/>
+        </w:rPr>
+        <w:t xml:space="preserve">. Vui </w:t>
+      </w:r>
+      <w:proofErr w:type="spellStart"/>
+      <w:r>
+        <w:rPr>
+          <w:color w:val="EE0000"/>
+        </w:rPr>
+        <w:t>lòng</w:t>
+      </w:r>
+      <w:proofErr w:type="spellEnd"/>
+      <w:r>
+        <w:rPr>
+          <w:color w:val="EE0000"/>
+        </w:rPr>
+        <w:t xml:space="preserve"> </w:t>
+      </w:r>
+      <w:proofErr w:type="spellStart"/>
+      <w:r>
+        <w:rPr>
+          <w:color w:val="EE0000"/>
+        </w:rPr>
+        <w:t>kiểm</w:t>
+      </w:r>
+      <w:proofErr w:type="spellEnd"/>
+      <w:r>
+        <w:rPr>
+          <w:color w:val="EE0000"/>
+        </w:rPr>
+        <w:t xml:space="preserve"> </w:t>
+      </w:r>
+      <w:proofErr w:type="spellStart"/>
+      <w:r>
+        <w:rPr>
+          <w:color w:val="EE0000"/>
+        </w:rPr>
+        <w:t>tra</w:t>
+      </w:r>
+      <w:proofErr w:type="spellEnd"/>
+      <w:r>
+        <w:rPr>
+          <w:color w:val="EE0000"/>
+        </w:rPr>
+        <w:t xml:space="preserve"> </w:t>
+      </w:r>
+      <w:proofErr w:type="spellStart"/>
+      <w:r>
+        <w:rPr>
+          <w:color w:val="EE0000"/>
+        </w:rPr>
+        <w:t>lại</w:t>
+      </w:r>
+      <w:proofErr w:type="spellEnd"/>
+      <w:r>
+        <w:rPr>
+          <w:color w:val="EE0000"/>
+        </w:rPr>
+        <w:t xml:space="preserve"> </w:t>
+      </w:r>
+      <w:proofErr w:type="spellStart"/>
+      <w:r>
+        <w:rPr>
+          <w:color w:val="EE0000"/>
+        </w:rPr>
+        <w:t>lý</w:t>
+      </w:r>
+      <w:proofErr w:type="spellEnd"/>
+      <w:r>
+        <w:rPr>
+          <w:color w:val="EE0000"/>
+        </w:rPr>
+        <w:t xml:space="preserve"> do </w:t>
+      </w:r>
+      <w:proofErr w:type="spellStart"/>
+      <w:r>
+        <w:rPr>
+          <w:color w:val="EE0000"/>
+        </w:rPr>
+        <w:t>trên</w:t>
+      </w:r>
+      <w:proofErr w:type="spellEnd"/>
+      <w:r>
+        <w:rPr>
+          <w:color w:val="EE0000"/>
+        </w:rPr>
+        <w:t xml:space="preserve"> </w:t>
+      </w:r>
+      <w:proofErr w:type="spellStart"/>
+      <w:r>
+        <w:rPr>
+          <w:color w:val="EE0000"/>
+        </w:rPr>
+        <w:t>và</w:t>
+      </w:r>
+      <w:proofErr w:type="spellEnd"/>
+      <w:r>
+        <w:rPr>
+          <w:color w:val="EE0000"/>
+        </w:rPr>
+        <w:t xml:space="preserve"> </w:t>
+      </w:r>
+      <w:proofErr w:type="spellStart"/>
+      <w:r>
+        <w:rPr>
+          <w:color w:val="EE0000"/>
+        </w:rPr>
+        <w:t>cập</w:t>
+      </w:r>
+      <w:proofErr w:type="spellEnd"/>
+      <w:r>
+        <w:rPr>
+          <w:color w:val="EE0000"/>
+        </w:rPr>
+        <w:t xml:space="preserve"> </w:t>
+      </w:r>
+      <w:proofErr w:type="spellStart"/>
+      <w:r>
+        <w:rPr>
+          <w:color w:val="EE0000"/>
+        </w:rPr>
+        <w:t>nhật</w:t>
+      </w:r>
+      <w:proofErr w:type="spellEnd"/>
+      <w:r>
+        <w:rPr>
+          <w:color w:val="EE0000"/>
+        </w:rPr>
+        <w:t xml:space="preserve"> </w:t>
+      </w:r>
+      <w:proofErr w:type="spellStart"/>
+      <w:r>
+        <w:rPr>
+          <w:color w:val="EE0000"/>
+        </w:rPr>
+        <w:t>hồ</w:t>
+      </w:r>
+      <w:proofErr w:type="spellEnd"/>
+      <w:r>
+        <w:rPr>
+          <w:color w:val="EE0000"/>
+        </w:rPr>
+        <w:t xml:space="preserve"> </w:t>
+      </w:r>
+      <w:proofErr w:type="spellStart"/>
+      <w:r>
+        <w:rPr>
+          <w:color w:val="EE0000"/>
+        </w:rPr>
+        <w:t>sơ</w:t>
+      </w:r>
+      <w:proofErr w:type="spellEnd"/>
+      <w:r>
+        <w:rPr>
+          <w:color w:val="EE0000"/>
+        </w:rPr>
+        <w:t xml:space="preserve"> </w:t>
+      </w:r>
+      <w:proofErr w:type="spellStart"/>
+      <w:r>
+        <w:rPr>
+          <w:color w:val="EE0000"/>
+        </w:rPr>
+        <w:t>chính</w:t>
+      </w:r>
+      <w:proofErr w:type="spellEnd"/>
+      <w:r>
+        <w:rPr>
+          <w:color w:val="EE0000"/>
+        </w:rPr>
+        <w:t xml:space="preserve"> </w:t>
+      </w:r>
+      <w:proofErr w:type="spellStart"/>
+      <w:r>
+        <w:rPr>
+          <w:color w:val="EE0000"/>
+        </w:rPr>
+        <w:t>xác</w:t>
+      </w:r>
+      <w:proofErr w:type="spellEnd"/>
+      <w:r>
+        <w:rPr>
+          <w:color w:val="EE0000"/>
+        </w:rPr>
+        <w:t xml:space="preserve"> </w:t>
+      </w:r>
+      <w:proofErr w:type="spellStart"/>
+      <w:r>
+        <w:rPr>
+          <w:color w:val="EE0000"/>
+        </w:rPr>
+        <w:t>trước</w:t>
+      </w:r>
+      <w:proofErr w:type="spellEnd"/>
+      <w:r>
+        <w:rPr>
+          <w:color w:val="EE0000"/>
+        </w:rPr>
+        <w:t xml:space="preserve"> </w:t>
+      </w:r>
+      <w:proofErr w:type="spellStart"/>
+      <w:r>
+        <w:rPr>
+          <w:color w:val="EE0000"/>
+        </w:rPr>
+        <w:t>khi</w:t>
+      </w:r>
+      <w:proofErr w:type="spellEnd"/>
+      <w:r>
+        <w:rPr>
+          <w:color w:val="EE0000"/>
+        </w:rPr>
+        <w:t xml:space="preserve"> </w:t>
+      </w:r>
+      <w:proofErr w:type="spellStart"/>
+      <w:r>
+        <w:rPr>
+          <w:color w:val="EE0000"/>
+        </w:rPr>
+        <w:t>gửi</w:t>
+      </w:r>
+      <w:proofErr w:type="spellEnd"/>
+      <w:r>
+        <w:rPr>
+          <w:color w:val="EE0000"/>
+        </w:rPr>
+        <w:t xml:space="preserve"> </w:t>
+      </w:r>
+      <w:proofErr w:type="spellStart"/>
+      <w:r>
+        <w:rPr>
+          <w:color w:val="EE0000"/>
+        </w:rPr>
+        <w:t>lại</w:t>
+      </w:r>
+      <w:proofErr w:type="spellEnd"/>
+      <w:r>
+        <w:rPr>
+          <w:color w:val="EE0000"/>
+        </w:rPr>
+        <w:t>."</w:t>
       </w:r>
     </w:p>
     <w:p/>
@@ -1237,6 +2537,9 @@
     </w:p>
     <w:p/>
     <w:p>
+      <w:pPr>
+        <w:jc w:val="center"/>
+      </w:pPr>
       <w:r>
         <w:rPr>
           <w:noProof/>
@@ -1258,7 +2561,7 @@
                     <pic:cNvPicPr/>
                   </pic:nvPicPr>
                   <pic:blipFill>
-                    <a:blip r:embed="rId22"/>
+                    <a:blip r:embed="rId25"/>
                     <a:stretch>
                       <a:fillRect/>
                     </a:stretch>
@@ -1318,7 +2621,7 @@
                     <pic:cNvPicPr/>
                   </pic:nvPicPr>
                   <pic:blipFill>
-                    <a:blip r:embed="rId23"/>
+                    <a:blip r:embed="rId26"/>
                     <a:stretch>
                       <a:fillRect/>
                     </a:stretch>
@@ -1379,7 +2682,7 @@
                     <pic:cNvPicPr/>
                   </pic:nvPicPr>
                   <pic:blipFill>
-                    <a:blip r:embed="rId24"/>
+                    <a:blip r:embed="rId27"/>
                     <a:stretch>
                       <a:fillRect/>
                     </a:stretch>
@@ -1434,7 +2737,7 @@
                     <pic:cNvPicPr/>
                   </pic:nvPicPr>
                   <pic:blipFill>
-                    <a:blip r:embed="rId25"/>
+                    <a:blip r:embed="rId28"/>
                     <a:stretch>
                       <a:fillRect/>
                     </a:stretch>
@@ -1506,7 +2809,7 @@
                     <pic:cNvPicPr/>
                   </pic:nvPicPr>
                   <pic:blipFill>
-                    <a:blip r:embed="rId26"/>
+                    <a:blip r:embed="rId29"/>
                     <a:stretch>
                       <a:fillRect/>
                     </a:stretch>
@@ -1561,7 +2864,7 @@
                     <pic:cNvPicPr/>
                   </pic:nvPicPr>
                   <pic:blipFill>
-                    <a:blip r:embed="rId27"/>
+                    <a:blip r:embed="rId30"/>
                     <a:stretch>
                       <a:fillRect/>
                     </a:stretch>
@@ -1585,7 +2888,31 @@
     <w:p/>
     <w:p>
       <w:r>
-        <w:t>Danh sách sản phẩm:</w:t>
+        <w:t xml:space="preserve">Danh </w:t>
+      </w:r>
+      <w:proofErr w:type="spellStart"/>
+      <w:r>
+        <w:t>sách</w:t>
+      </w:r>
+      <w:proofErr w:type="spellEnd"/>
+      <w:r>
+        <w:t xml:space="preserve"> </w:t>
+      </w:r>
+      <w:proofErr w:type="spellStart"/>
+      <w:r>
+        <w:t>sản</w:t>
+      </w:r>
+      <w:proofErr w:type="spellEnd"/>
+      <w:r>
+        <w:t xml:space="preserve"> </w:t>
+      </w:r>
+      <w:proofErr w:type="spellStart"/>
+      <w:r>
+        <w:t>phẩm</w:t>
+      </w:r>
+      <w:proofErr w:type="spellEnd"/>
+      <w:r>
+        <w:t>:</w:t>
       </w:r>
     </w:p>
     <w:p>
@@ -1609,7 +2936,7 @@
                     <pic:cNvPicPr/>
                   </pic:nvPicPr>
                   <pic:blipFill>
-                    <a:blip r:embed="rId28"/>
+                    <a:blip r:embed="rId31"/>
                     <a:stretch>
                       <a:fillRect/>
                     </a:stretch>
@@ -1633,7 +2960,23 @@
     <w:p/>
     <w:p>
       <w:r>
-        <w:t xml:space="preserve">Quản lý đơn </w:t>
+        <w:t xml:space="preserve">Quản </w:t>
+      </w:r>
+      <w:proofErr w:type="spellStart"/>
+      <w:r>
+        <w:t>lý</w:t>
+      </w:r>
+      <w:proofErr w:type="spellEnd"/>
+      <w:r>
+        <w:t xml:space="preserve"> </w:t>
+      </w:r>
+      <w:proofErr w:type="spellStart"/>
+      <w:r>
+        <w:t>đơn</w:t>
+      </w:r>
+      <w:proofErr w:type="spellEnd"/>
+      <w:r>
+        <w:t xml:space="preserve"> </w:t>
       </w:r>
       <w:r>
         <w:t>hang:</w:t>
@@ -1662,7 +3005,7 @@
                     <pic:cNvPicPr/>
                   </pic:nvPicPr>
                   <pic:blipFill>
-                    <a:blip r:embed="rId29"/>
+                    <a:blip r:embed="rId32"/>
                     <a:stretch>
                       <a:fillRect/>
                     </a:stretch>
@@ -1685,12 +3028,28 @@
     </w:p>
     <w:p/>
     <w:p>
-      <w:r>
-        <w:t>Thiết lập shop:</w:t>
-      </w:r>
-    </w:p>
-    <w:p>
-      <w:r>
+      <w:proofErr w:type="spellStart"/>
+      <w:r>
+        <w:t>Thiết</w:t>
+      </w:r>
+      <w:proofErr w:type="spellEnd"/>
+      <w:r>
+        <w:t xml:space="preserve"> </w:t>
+      </w:r>
+      <w:proofErr w:type="spellStart"/>
+      <w:r>
+        <w:t>lập</w:t>
+      </w:r>
+      <w:proofErr w:type="spellEnd"/>
+      <w:r>
+        <w:t xml:space="preserve"> shop:</w:t>
+      </w:r>
+    </w:p>
+    <w:p>
+      <w:r>
+        <w:rPr>
+          <w:noProof/>
+        </w:rPr>
         <w:drawing>
           <wp:inline distT="0" distB="0" distL="0" distR="0" wp14:anchorId="5CF0D2AB" wp14:editId="46ACCEA2">
             <wp:extent cx="5943600" cy="2814955"/>
@@ -1707,7 +3066,7 @@
                     <pic:cNvPicPr/>
                   </pic:nvPicPr>
                   <pic:blipFill>
-                    <a:blip r:embed="rId30"/>
+                    <a:blip r:embed="rId33"/>
                     <a:stretch>
                       <a:fillRect/>
                     </a:stretch>
@@ -1735,6 +3094,9 @@
     </w:p>
     <w:p>
       <w:r>
+        <w:rPr>
+          <w:noProof/>
+        </w:rPr>
         <w:lastRenderedPageBreak/>
         <w:drawing>
           <wp:inline distT="0" distB="0" distL="0" distR="0" wp14:anchorId="3DBF79FC" wp14:editId="145C3BD9">
@@ -1752,7 +3114,7 @@
                     <pic:cNvPicPr/>
                   </pic:nvPicPr>
                   <pic:blipFill>
-                    <a:blip r:embed="rId31"/>
+                    <a:blip r:embed="rId34"/>
                     <a:stretch>
                       <a:fillRect/>
                     </a:stretch>
@@ -1783,7 +3145,15 @@
         </w:numPr>
       </w:pPr>
       <w:r>
-        <w:t>Money withdraw request: Seller can ask ainetsoft for a payment withdraw with the details form as below</w:t>
+        <w:t xml:space="preserve">Money withdraw request: Seller can ask </w:t>
+      </w:r>
+      <w:proofErr w:type="spellStart"/>
+      <w:r>
+        <w:t>ainetsoft</w:t>
+      </w:r>
+      <w:proofErr w:type="spellEnd"/>
+      <w:r>
+        <w:t xml:space="preserve"> for a payment withdraw with the details form as below</w:t>
       </w:r>
     </w:p>
     <w:p>
@@ -1807,7 +3177,7 @@
                     <pic:cNvPicPr/>
                   </pic:nvPicPr>
                   <pic:blipFill>
-                    <a:blip r:embed="rId32"/>
+                    <a:blip r:embed="rId35"/>
                     <a:stretch>
                       <a:fillRect/>
                     </a:stretch>
@@ -1864,7 +3234,7 @@
                     <pic:cNvPicPr/>
                   </pic:nvPicPr>
                   <pic:blipFill>
-                    <a:blip r:embed="rId33"/>
+                    <a:blip r:embed="rId36"/>
                     <a:stretch>
                       <a:fillRect/>
                     </a:stretch>
@@ -1936,7 +3306,7 @@
                     <pic:cNvPicPr/>
                   </pic:nvPicPr>
                   <pic:blipFill>
-                    <a:blip r:embed="rId34"/>
+                    <a:blip r:embed="rId37"/>
                     <a:stretch>
                       <a:fillRect/>
                     </a:stretch>
@@ -1992,7 +3362,7 @@
                     <pic:cNvPicPr/>
                   </pic:nvPicPr>
                   <pic:blipFill>
-                    <a:blip r:embed="rId35"/>
+                    <a:blip r:embed="rId38"/>
                     <a:stretch>
                       <a:fillRect/>
                     </a:stretch>
@@ -2052,7 +3422,7 @@
                     <pic:cNvPicPr/>
                   </pic:nvPicPr>
                   <pic:blipFill>
-                    <a:blip r:embed="rId36"/>
+                    <a:blip r:embed="rId39"/>
                     <a:stretch>
                       <a:fillRect/>
                     </a:stretch>
@@ -2106,7 +3476,7 @@
                     <pic:cNvPicPr/>
                   </pic:nvPicPr>
                   <pic:blipFill>
-                    <a:blip r:embed="rId37"/>
+                    <a:blip r:embed="rId40"/>
                     <a:stretch>
                       <a:fillRect/>
                     </a:stretch>
@@ -2147,8 +3517,21 @@
           <w:numId w:val="4"/>
         </w:numPr>
       </w:pPr>
-      <w:r>
-        <w:t>Tổng quan Admin page: This shows the summarization of all the important parts and will be details one Admin user click to it</w:t>
+      <w:proofErr w:type="spellStart"/>
+      <w:r>
+        <w:t>Tổng</w:t>
+      </w:r>
+      <w:proofErr w:type="spellEnd"/>
+      <w:r>
+        <w:t xml:space="preserve"> </w:t>
+      </w:r>
+      <w:proofErr w:type="spellStart"/>
+      <w:r>
+        <w:t>quan</w:t>
+      </w:r>
+      <w:proofErr w:type="spellEnd"/>
+      <w:r>
+        <w:t xml:space="preserve"> Admin page: This shows the summarization of all the important parts and will be details one Admin user click to it</w:t>
       </w:r>
     </w:p>
     <w:p>
@@ -2172,7 +3555,7 @@
                     <pic:cNvPicPr/>
                   </pic:nvPicPr>
                   <pic:blipFill>
-                    <a:blip r:embed="rId38"/>
+                    <a:blip r:embed="rId41"/>
                     <a:stretch>
                       <a:fillRect/>
                     </a:stretch>
@@ -2201,8 +3584,21 @@
           <w:numId w:val="4"/>
         </w:numPr>
       </w:pPr>
-      <w:r>
-        <w:t>Tổng người dung:</w:t>
+      <w:proofErr w:type="spellStart"/>
+      <w:r>
+        <w:t>Tổng</w:t>
+      </w:r>
+      <w:proofErr w:type="spellEnd"/>
+      <w:r>
+        <w:t xml:space="preserve"> </w:t>
+      </w:r>
+      <w:proofErr w:type="spellStart"/>
+      <w:r>
+        <w:t>người</w:t>
+      </w:r>
+      <w:proofErr w:type="spellEnd"/>
+      <w:r>
+        <w:t xml:space="preserve"> dung:</w:t>
       </w:r>
     </w:p>
     <w:p>
@@ -2213,9 +3609,22 @@
           <w:numId w:val="4"/>
         </w:numPr>
       </w:pPr>
+      <w:proofErr w:type="spellStart"/>
       <w:r>
         <w:lastRenderedPageBreak/>
-        <w:t>Sản phẩm: Show all products which the system is having. There is a quick access to the Seller pages</w:t>
+        <w:t>Sản</w:t>
+      </w:r>
+      <w:proofErr w:type="spellEnd"/>
+      <w:r>
+        <w:t xml:space="preserve"> </w:t>
+      </w:r>
+      <w:proofErr w:type="spellStart"/>
+      <w:r>
+        <w:t>phẩm</w:t>
+      </w:r>
+      <w:proofErr w:type="spellEnd"/>
+      <w:r>
+        <w:t>: Show all products which the system is having. There is a quick access to the Seller pages</w:t>
       </w:r>
     </w:p>
     <w:p>
@@ -2239,7 +3648,7 @@
                     <pic:cNvPicPr/>
                   </pic:nvPicPr>
                   <pic:blipFill>
-                    <a:blip r:embed="rId39"/>
+                    <a:blip r:embed="rId42"/>
                     <a:stretch>
                       <a:fillRect/>
                     </a:stretch>
@@ -2269,8 +3678,21 @@
           <w:numId w:val="4"/>
         </w:numPr>
       </w:pPr>
-      <w:r>
-        <w:t>Chờ duyệt SP: This contains all pending shop product and being waiting the admin page to approve</w:t>
+      <w:proofErr w:type="spellStart"/>
+      <w:r>
+        <w:t>Chờ</w:t>
+      </w:r>
+      <w:proofErr w:type="spellEnd"/>
+      <w:r>
+        <w:t xml:space="preserve"> </w:t>
+      </w:r>
+      <w:proofErr w:type="spellStart"/>
+      <w:r>
+        <w:t>duyệt</w:t>
+      </w:r>
+      <w:proofErr w:type="spellEnd"/>
+      <w:r>
+        <w:t xml:space="preserve"> SP: This contains all pending shop product and being waiting the admin page to approve</w:t>
       </w:r>
       <w:r>
         <w:br/>
@@ -2295,7 +3717,7 @@
                     <pic:cNvPicPr/>
                   </pic:nvPicPr>
                   <pic:blipFill>
-                    <a:blip r:embed="rId40"/>
+                    <a:blip r:embed="rId43"/>
                     <a:stretch>
                       <a:fillRect/>
                     </a:stretch>
@@ -2324,9 +3746,22 @@
           <w:numId w:val="4"/>
         </w:numPr>
       </w:pPr>
+      <w:proofErr w:type="spellStart"/>
       <w:r>
         <w:lastRenderedPageBreak/>
-        <w:t>Chờ duyệt shop: This is the pending status of the users requesting for become the seller.</w:t>
+        <w:t>Chờ</w:t>
+      </w:r>
+      <w:proofErr w:type="spellEnd"/>
+      <w:r>
+        <w:t xml:space="preserve"> </w:t>
+      </w:r>
+      <w:proofErr w:type="spellStart"/>
+      <w:r>
+        <w:t>duyệt</w:t>
+      </w:r>
+      <w:proofErr w:type="spellEnd"/>
+      <w:r>
+        <w:t xml:space="preserve"> shop: This is the pending status of the users requesting for become the seller.</w:t>
       </w:r>
     </w:p>
     <w:p>
@@ -2350,7 +3785,7 @@
                     <pic:cNvPicPr/>
                   </pic:nvPicPr>
                   <pic:blipFill>
-                    <a:blip r:embed="rId41"/>
+                    <a:blip r:embed="rId44"/>
                     <a:stretch>
                       <a:fillRect/>
                     </a:stretch>
@@ -2380,7 +3815,23 @@
         </w:numPr>
       </w:pPr>
       <w:r>
-        <w:t xml:space="preserve">Details of “Người dùng”: This shows very details of the user and many activities related to User management such as Lock, promote user to Admin, </w:t>
+        <w:t>Details of “</w:t>
+      </w:r>
+      <w:proofErr w:type="spellStart"/>
+      <w:r>
+        <w:t>Người</w:t>
+      </w:r>
+      <w:proofErr w:type="spellEnd"/>
+      <w:r>
+        <w:t xml:space="preserve"> </w:t>
+      </w:r>
+      <w:proofErr w:type="spellStart"/>
+      <w:r>
+        <w:t>dùng</w:t>
+      </w:r>
+      <w:proofErr w:type="spellEnd"/>
+      <w:r>
+        <w:t xml:space="preserve">”: This shows very details of the user and many activities related to User management such as Lock, promote user to Admin, </w:t>
       </w:r>
       <w:r>
         <w:t>denote user seller back to normal users…</w:t>
@@ -2420,7 +3871,7 @@
                     <pic:cNvPicPr/>
                   </pic:nvPicPr>
                   <pic:blipFill>
-                    <a:blip r:embed="rId42"/>
+                    <a:blip r:embed="rId45"/>
                     <a:stretch>
                       <a:fillRect/>
                     </a:stretch>
@@ -2470,6 +3921,9 @@
     </w:p>
     <w:p>
       <w:r>
+        <w:rPr>
+          <w:noProof/>
+        </w:rPr>
         <w:lastRenderedPageBreak/>
         <w:drawing>
           <wp:inline distT="0" distB="0" distL="0" distR="0" wp14:anchorId="6B86C3D4" wp14:editId="570808DF">
@@ -2487,7 +3941,7 @@
                     <pic:cNvPicPr/>
                   </pic:nvPicPr>
                   <pic:blipFill>
-                    <a:blip r:embed="rId43"/>
+                    <a:blip r:embed="rId46"/>
                     <a:stretch>
                       <a:fillRect/>
                     </a:stretch>
@@ -2542,7 +3996,7 @@
                     <pic:cNvPicPr/>
                   </pic:nvPicPr>
                   <pic:blipFill>
-                    <a:blip r:embed="rId44"/>
+                    <a:blip r:embed="rId47"/>
                     <a:stretch>
                       <a:fillRect/>
                     </a:stretch>
@@ -2596,7 +4050,7 @@
                     <pic:cNvPicPr/>
                   </pic:nvPicPr>
                   <pic:blipFill>
-                    <a:blip r:embed="rId45"/>
+                    <a:blip r:embed="rId48"/>
                     <a:stretch>
                       <a:fillRect/>
                     </a:stretch>
@@ -2650,7 +4104,7 @@
                     <pic:cNvPicPr/>
                   </pic:nvPicPr>
                   <pic:blipFill>
-                    <a:blip r:embed="rId46"/>
+                    <a:blip r:embed="rId49"/>
                     <a:stretch>
                       <a:fillRect/>
                     </a:stretch>
@@ -2705,7 +4159,7 @@
                     <pic:cNvPicPr/>
                   </pic:nvPicPr>
                   <pic:blipFill>
-                    <a:blip r:embed="rId47"/>
+                    <a:blip r:embed="rId50"/>
                     <a:stretch>
                       <a:fillRect/>
                     </a:stretch>
@@ -2734,8 +4188,45 @@
           <w:numId w:val="4"/>
         </w:numPr>
       </w:pPr>
-      <w:r>
-        <w:t>Tất cả sảm phẩm: Show all available products from all sellers. This is also has the pagination and quick access to the product owner page (Seller page)</w:t>
+      <w:proofErr w:type="spellStart"/>
+      <w:r>
+        <w:t>Tất</w:t>
+      </w:r>
+      <w:proofErr w:type="spellEnd"/>
+      <w:r>
+        <w:t xml:space="preserve"> </w:t>
+      </w:r>
+      <w:proofErr w:type="spellStart"/>
+      <w:r>
+        <w:t>cả</w:t>
+      </w:r>
+      <w:proofErr w:type="spellEnd"/>
+      <w:r>
+        <w:t xml:space="preserve"> </w:t>
+      </w:r>
+      <w:proofErr w:type="spellStart"/>
+      <w:r>
+        <w:t>sảm</w:t>
+      </w:r>
+      <w:proofErr w:type="spellEnd"/>
+      <w:r>
+        <w:t xml:space="preserve"> </w:t>
+      </w:r>
+      <w:proofErr w:type="spellStart"/>
+      <w:r>
+        <w:t>phẩm</w:t>
+      </w:r>
+      <w:proofErr w:type="spellEnd"/>
+      <w:r>
+        <w:t xml:space="preserve">: Show all available products from all sellers. This </w:t>
+      </w:r>
+      <w:proofErr w:type="gramStart"/>
+      <w:r>
+        <w:t>is also has</w:t>
+      </w:r>
+      <w:proofErr w:type="gramEnd"/>
+      <w:r>
+        <w:t xml:space="preserve"> the pagination and quick access to the product owner page (Seller page)</w:t>
       </w:r>
     </w:p>
     <w:p>
@@ -2759,7 +4250,7 @@
                     <pic:cNvPicPr/>
                   </pic:nvPicPr>
                   <pic:blipFill>
-                    <a:blip r:embed="rId48"/>
+                    <a:blip r:embed="rId51"/>
                     <a:stretch>
                       <a:fillRect/>
                     </a:stretch>
@@ -2789,8 +4280,13 @@
           <w:numId w:val="4"/>
         </w:numPr>
       </w:pPr>
-      <w:r>
-        <w:t xml:space="preserve">Duyệt shop: All seller </w:t>
+      <w:proofErr w:type="spellStart"/>
+      <w:r>
+        <w:t>Duyệt</w:t>
+      </w:r>
+      <w:proofErr w:type="spellEnd"/>
+      <w:r>
+        <w:t xml:space="preserve"> shop: All seller </w:t>
       </w:r>
       <w:r>
         <w:t>products</w:t>
@@ -2821,7 +4317,7 @@
                     <pic:cNvPicPr/>
                   </pic:nvPicPr>
                   <pic:blipFill>
-                    <a:blip r:embed="rId49"/>
+                    <a:blip r:embed="rId52"/>
                     <a:stretch>
                       <a:fillRect/>
                     </a:stretch>
@@ -2850,8 +4346,13 @@
           <w:numId w:val="4"/>
         </w:numPr>
       </w:pPr>
-      <w:r>
-        <w:t xml:space="preserve">Duyệt shop – </w:t>
+      <w:proofErr w:type="spellStart"/>
+      <w:r>
+        <w:t>Duyệt</w:t>
+      </w:r>
+      <w:proofErr w:type="spellEnd"/>
+      <w:r>
+        <w:t xml:space="preserve"> shop – </w:t>
       </w:r>
       <w:r>
         <w:t>Become</w:t>
@@ -2883,7 +4384,7 @@
                     <pic:cNvPicPr/>
                   </pic:nvPicPr>
                   <pic:blipFill>
-                    <a:blip r:embed="rId50"/>
+                    <a:blip r:embed="rId53"/>
                     <a:stretch>
                       <a:fillRect/>
                     </a:stretch>
@@ -2906,7 +4407,15 @@
     </w:p>
     <w:p>
       <w:r>
-        <w:t>The below screenshot tell that the current there is not any pending request to become a seller…</w:t>
+        <w:t xml:space="preserve">The below screenshot </w:t>
+      </w:r>
+      <w:proofErr w:type="gramStart"/>
+      <w:r>
+        <w:t>tell</w:t>
+      </w:r>
+      <w:proofErr w:type="gramEnd"/>
+      <w:r>
+        <w:t xml:space="preserve"> that the current there is not any pending request to become a seller…</w:t>
       </w:r>
     </w:p>
     <w:p>
@@ -2931,7 +4440,7 @@
                     <pic:cNvPicPr/>
                   </pic:nvPicPr>
                   <pic:blipFill>
-                    <a:blip r:embed="rId51"/>
+                    <a:blip r:embed="rId54"/>
                     <a:stretch>
                       <a:fillRect/>
                     </a:stretch>
@@ -2968,6 +4477,9 @@
     </w:p>
     <w:p>
       <w:r>
+        <w:rPr>
+          <w:noProof/>
+        </w:rPr>
         <w:lastRenderedPageBreak/>
         <w:drawing>
           <wp:inline distT="0" distB="0" distL="0" distR="0" wp14:anchorId="6FD8B660" wp14:editId="74DD3FD6">
@@ -2985,7 +4497,7 @@
                     <pic:cNvPicPr/>
                   </pic:nvPicPr>
                   <pic:blipFill>
-                    <a:blip r:embed="rId52"/>
+                    <a:blip r:embed="rId55"/>
                     <a:stretch>
                       <a:fillRect/>
                     </a:stretch>
@@ -3016,8 +4528,21 @@
         </w:numPr>
       </w:pPr>
       <w:r>
-        <w:t>Báo cáo vi phạm</w:t>
-      </w:r>
+        <w:t xml:space="preserve">Báo </w:t>
+      </w:r>
+      <w:proofErr w:type="spellStart"/>
+      <w:r>
+        <w:t>cáo</w:t>
+      </w:r>
+      <w:proofErr w:type="spellEnd"/>
+      <w:r>
+        <w:t xml:space="preserve"> vi </w:t>
+      </w:r>
+      <w:proofErr w:type="spellStart"/>
+      <w:r>
+        <w:t>phạm</w:t>
+      </w:r>
+      <w:proofErr w:type="spellEnd"/>
       <w:r>
         <w:t>:</w:t>
       </w:r>
@@ -3044,7 +4569,7 @@
                     <pic:cNvPicPr/>
                   </pic:nvPicPr>
                   <pic:blipFill>
-                    <a:blip r:embed="rId53"/>
+                    <a:blip r:embed="rId56"/>
                     <a:stretch>
                       <a:fillRect/>
                     </a:stretch>
@@ -3075,8 +4600,29 @@
         </w:numPr>
       </w:pPr>
       <w:r>
-        <w:t>Quản lý đánh giá</w:t>
-      </w:r>
+        <w:t xml:space="preserve">Quản </w:t>
+      </w:r>
+      <w:proofErr w:type="spellStart"/>
+      <w:r>
+        <w:t>lý</w:t>
+      </w:r>
+      <w:proofErr w:type="spellEnd"/>
+      <w:r>
+        <w:t xml:space="preserve"> </w:t>
+      </w:r>
+      <w:proofErr w:type="spellStart"/>
+      <w:r>
+        <w:t>đánh</w:t>
+      </w:r>
+      <w:proofErr w:type="spellEnd"/>
+      <w:r>
+        <w:t xml:space="preserve"> </w:t>
+      </w:r>
+      <w:proofErr w:type="spellStart"/>
+      <w:r>
+        <w:t>giá</w:t>
+      </w:r>
+      <w:proofErr w:type="spellEnd"/>
       <w:r>
         <w:t>:</w:t>
       </w:r>
@@ -3102,7 +4648,7 @@
                     <pic:cNvPicPr/>
                   </pic:nvPicPr>
                   <pic:blipFill>
-                    <a:blip r:embed="rId54"/>
+                    <a:blip r:embed="rId57"/>
                     <a:stretch>
                       <a:fillRect/>
                     </a:stretch>
@@ -3132,7 +4678,23 @@
         </w:numPr>
       </w:pPr>
       <w:r>
-        <w:t>Quản lý nội dung</w:t>
+        <w:t xml:space="preserve">Quản </w:t>
+      </w:r>
+      <w:proofErr w:type="spellStart"/>
+      <w:r>
+        <w:t>lý</w:t>
+      </w:r>
+      <w:proofErr w:type="spellEnd"/>
+      <w:r>
+        <w:t xml:space="preserve"> </w:t>
+      </w:r>
+      <w:proofErr w:type="spellStart"/>
+      <w:r>
+        <w:t>nội</w:t>
+      </w:r>
+      <w:proofErr w:type="spellEnd"/>
+      <w:r>
+        <w:t xml:space="preserve"> dung</w:t>
       </w:r>
       <w:r>
         <w:t>:</w:t>
@@ -3160,7 +4722,7 @@
                     <pic:cNvPicPr/>
                   </pic:nvPicPr>
                   <pic:blipFill>
-                    <a:blip r:embed="rId55"/>
+                    <a:blip r:embed="rId58"/>
                     <a:stretch>
                       <a:fillRect/>
                     </a:stretch>
@@ -3191,7 +4753,55 @@
         </w:numPr>
       </w:pPr>
       <w:r>
-        <w:t>Danh mục báo cáo: This helps the admin to configure the “ Danh Muc Bao Cáo” that help users have quick chose the category they want to report</w:t>
+        <w:t xml:space="preserve">Danh </w:t>
+      </w:r>
+      <w:proofErr w:type="spellStart"/>
+      <w:r>
+        <w:t>mục</w:t>
+      </w:r>
+      <w:proofErr w:type="spellEnd"/>
+      <w:r>
+        <w:t xml:space="preserve"> </w:t>
+      </w:r>
+      <w:proofErr w:type="spellStart"/>
+      <w:r>
+        <w:t>báo</w:t>
+      </w:r>
+      <w:proofErr w:type="spellEnd"/>
+      <w:r>
+        <w:t xml:space="preserve"> </w:t>
+      </w:r>
+      <w:proofErr w:type="spellStart"/>
+      <w:r>
+        <w:t>cáo</w:t>
+      </w:r>
+      <w:proofErr w:type="spellEnd"/>
+      <w:r>
+        <w:t xml:space="preserve">: This helps the admin to configure the </w:t>
+      </w:r>
+      <w:proofErr w:type="gramStart"/>
+      <w:r>
+        <w:t>“ Danh</w:t>
+      </w:r>
+      <w:proofErr w:type="gramEnd"/>
+      <w:r>
+        <w:t xml:space="preserve"> </w:t>
+      </w:r>
+      <w:proofErr w:type="spellStart"/>
+      <w:r>
+        <w:t>Muc</w:t>
+      </w:r>
+      <w:proofErr w:type="spellEnd"/>
+      <w:r>
+        <w:t xml:space="preserve"> Bao Cáo” that help users have quick </w:t>
+      </w:r>
+      <w:proofErr w:type="gramStart"/>
+      <w:r>
+        <w:t>chose</w:t>
+      </w:r>
+      <w:proofErr w:type="gramEnd"/>
+      <w:r>
+        <w:t xml:space="preserve"> the category they want to report</w:t>
       </w:r>
     </w:p>
     <w:p/>
@@ -3217,7 +4827,7 @@
                     <pic:cNvPicPr/>
                   </pic:nvPicPr>
                   <pic:blipFill>
-                    <a:blip r:embed="rId56"/>
+                    <a:blip r:embed="rId59"/>
                     <a:stretch>
                       <a:fillRect/>
                     </a:stretch>
@@ -3248,7 +4858,31 @@
         </w:numPr>
       </w:pPr>
       <w:r>
-        <w:t>Nhật ký hệ thống: This help admin to trach what activities were happened in the past</w:t>
+        <w:t xml:space="preserve">Nhật </w:t>
+      </w:r>
+      <w:proofErr w:type="spellStart"/>
+      <w:r>
+        <w:t>ký</w:t>
+      </w:r>
+      <w:proofErr w:type="spellEnd"/>
+      <w:r>
+        <w:t xml:space="preserve"> </w:t>
+      </w:r>
+      <w:proofErr w:type="spellStart"/>
+      <w:r>
+        <w:t>hệ</w:t>
+      </w:r>
+      <w:proofErr w:type="spellEnd"/>
+      <w:r>
+        <w:t xml:space="preserve"> </w:t>
+      </w:r>
+      <w:proofErr w:type="spellStart"/>
+      <w:r>
+        <w:t>thống</w:t>
+      </w:r>
+      <w:proofErr w:type="spellEnd"/>
+      <w:r>
+        <w:t>: This help admin to trach what activities were happened in the past</w:t>
       </w:r>
     </w:p>
     <w:p>
@@ -3272,7 +4906,7 @@
                     <pic:cNvPicPr/>
                   </pic:nvPicPr>
                   <pic:blipFill>
-                    <a:blip r:embed="rId57"/>
+                    <a:blip r:embed="rId60"/>
                     <a:stretch>
                       <a:fillRect/>
                     </a:stretch>
@@ -3442,9 +5076,11 @@
             <w:hideMark/>
           </w:tcPr>
           <w:p>
+            <w:proofErr w:type="spellStart"/>
             <w:r>
               <w:t>audit_logs</w:t>
             </w:r>
+            <w:proofErr w:type="spellEnd"/>
           </w:p>
         </w:tc>
         <w:tc>
@@ -3477,9 +5113,11 @@
             <w:hideMark/>
           </w:tcPr>
           <w:p>
+            <w:proofErr w:type="spellStart"/>
             <w:r>
               <w:t>bank_accounts</w:t>
             </w:r>
+            <w:proofErr w:type="spellEnd"/>
           </w:p>
         </w:tc>
         <w:tc>
@@ -3547,9 +5185,11 @@
             <w:hideMark/>
           </w:tcPr>
           <w:p>
+            <w:proofErr w:type="spellStart"/>
             <w:r>
               <w:t>chat_messages</w:t>
             </w:r>
+            <w:proofErr w:type="spellEnd"/>
           </w:p>
         </w:tc>
         <w:tc>
@@ -3582,9 +5222,11 @@
             <w:hideMark/>
           </w:tcPr>
           <w:p>
+            <w:proofErr w:type="spellStart"/>
             <w:r>
               <w:t>content_nodes</w:t>
             </w:r>
+            <w:proofErr w:type="spellEnd"/>
           </w:p>
         </w:tc>
         <w:tc>
@@ -3617,9 +5259,11 @@
             <w:hideMark/>
           </w:tcPr>
           <w:p>
+            <w:proofErr w:type="spellStart"/>
             <w:r>
               <w:t>feedback_templates</w:t>
             </w:r>
+            <w:proofErr w:type="spellEnd"/>
           </w:p>
         </w:tc>
         <w:tc>
@@ -3652,9 +5296,11 @@
             <w:hideMark/>
           </w:tcPr>
           <w:p>
+            <w:proofErr w:type="spellStart"/>
             <w:r>
               <w:t>footer_icons</w:t>
             </w:r>
+            <w:proofErr w:type="spellEnd"/>
           </w:p>
         </w:tc>
         <w:tc>
@@ -3687,9 +5333,11 @@
             <w:hideMark/>
           </w:tcPr>
           <w:p>
+            <w:proofErr w:type="spellStart"/>
             <w:r>
               <w:t>footer_menus</w:t>
             </w:r>
+            <w:proofErr w:type="spellEnd"/>
           </w:p>
         </w:tc>
         <w:tc>
@@ -3722,9 +5370,11 @@
             <w:hideMark/>
           </w:tcPr>
           <w:p>
+            <w:proofErr w:type="spellStart"/>
             <w:r>
               <w:t>help_nodes</w:t>
             </w:r>
+            <w:proofErr w:type="spellEnd"/>
           </w:p>
         </w:tc>
         <w:tc>
@@ -3827,9 +5477,11 @@
             <w:hideMark/>
           </w:tcPr>
           <w:p>
+            <w:proofErr w:type="spellStart"/>
             <w:r>
               <w:t>password_reset_tokens</w:t>
             </w:r>
+            <w:proofErr w:type="spellEnd"/>
           </w:p>
         </w:tc>
         <w:tc>
@@ -3862,9 +5514,11 @@
             <w:hideMark/>
           </w:tcPr>
           <w:p>
+            <w:proofErr w:type="spellStart"/>
             <w:r>
               <w:t>product_reports</w:t>
             </w:r>
+            <w:proofErr w:type="spellEnd"/>
           </w:p>
         </w:tc>
         <w:tc>
@@ -3932,9 +5586,16 @@
             <w:hideMark/>
           </w:tcPr>
           <w:p>
+            <w:proofErr w:type="spellStart"/>
+            <w:proofErr w:type="gramStart"/>
             <w:r>
-              <w:t>report_reasons</w:t>
+              <w:t>report</w:t>
             </w:r>
+            <w:proofErr w:type="gramEnd"/>
+            <w:r>
+              <w:t>_reasons</w:t>
+            </w:r>
+            <w:proofErr w:type="spellEnd"/>
           </w:p>
         </w:tc>
         <w:tc>
@@ -4002,9 +5663,11 @@
             <w:hideMark/>
           </w:tcPr>
           <w:p>
+            <w:proofErr w:type="spellStart"/>
             <w:r>
               <w:t>shipping_methods</w:t>
             </w:r>
+            <w:proofErr w:type="spellEnd"/>
           </w:p>
         </w:tc>
         <w:tc>
@@ -4037,9 +5700,11 @@
             <w:hideMark/>
           </w:tcPr>
           <w:p>
+            <w:proofErr w:type="spellStart"/>
             <w:r>
               <w:t>system_contents</w:t>
             </w:r>
+            <w:proofErr w:type="spellEnd"/>
           </w:p>
         </w:tc>
         <w:tc>
@@ -4109,9 +5774,11 @@
             <w:vAlign w:val="center"/>
           </w:tcPr>
           <w:p>
+            <w:proofErr w:type="spellStart"/>
             <w:r>
               <w:t>withdrawal_requests</w:t>
             </w:r>
+            <w:proofErr w:type="spellEnd"/>
           </w:p>
         </w:tc>
         <w:tc>

</xml_diff>

<commit_message>
Final code for mail validation of user registration (#24)
Co-authored-by: Thanh Nguyen <toni@Vietnam-4228.localdomain>
</commit_message>
<xml_diff>
--- a/AiNetsoft Functions Description.docx
+++ b/AiNetsoft Functions Description.docx
@@ -3,8 +3,13 @@
 <w:document xmlns:wpc="http://schemas.microsoft.com/office/word/2010/wordprocessingCanvas" xmlns:cx="http://schemas.microsoft.com/office/drawing/2014/chartex" xmlns:cx1="http://schemas.microsoft.com/office/drawing/2015/9/8/chartex" xmlns:cx2="http://schemas.microsoft.com/office/drawing/2015/10/21/chartex" xmlns:cx3="http://schemas.microsoft.com/office/drawing/2016/5/9/chartex" xmlns:cx4="http://schemas.microsoft.com/office/drawing/2016/5/10/chartex" xmlns:cx5="http://schemas.microsoft.com/office/drawing/2016/5/11/chartex" xmlns:cx6="http://schemas.microsoft.com/office/drawing/2016/5/12/chartex" xmlns:cx7="http://schemas.microsoft.com/office/drawing/2016/5/13/chartex" xmlns:cx8="http://schemas.microsoft.com/office/drawing/2016/5/14/chartex" xmlns:mc="http://schemas.openxmlformats.org/markup-compatibility/2006" xmlns:aink="http://schemas.microsoft.com/office/drawing/2016/ink" xmlns:am3d="http://schemas.microsoft.com/office/drawing/2017/model3d" xmlns:o="urn:schemas-microsoft-com:office:office" xmlns:oel="http://schemas.microsoft.com/office/2019/extlst" xmlns:r="http://schemas.openxmlformats.org/officeDocument/2006/relationships" xmlns:m="http://schemas.openxmlformats.org/officeDocument/2006/math" xmlns:v="urn:schemas-microsoft-com:vml" xmlns:wp14="http://schemas.microsoft.com/office/word/2010/wordprocessingDrawing" xmlns:wp="http://schemas.openxmlformats.org/drawingml/2006/wordprocessingDrawing" xmlns:w10="urn:schemas-microsoft-com:office:word" xmlns:w="http://schemas.openxmlformats.org/wordprocessingml/2006/main" xmlns:w14="http://schemas.microsoft.com/office/word/2010/wordml" xmlns:w15="http://schemas.microsoft.com/office/word/2012/wordml" xmlns:w16cex="http://schemas.microsoft.com/office/word/2018/wordml/cex" xmlns:w16cid="http://schemas.microsoft.com/office/word/2016/wordml/cid" xmlns:w16="http://schemas.microsoft.com/office/word/2018/wordml" xmlns:w16du="http://schemas.microsoft.com/office/word/2023/wordml/word16du" xmlns:w16sdtdh="http://schemas.microsoft.com/office/word/2020/wordml/sdtdatahash" xmlns:w16sdtfl="http://schemas.microsoft.com/office/word/2024/wordml/sdtformatlock" xmlns:w16se="http://schemas.microsoft.com/office/word/2015/wordml/symex" xmlns:wpg="http://schemas.microsoft.com/office/word/2010/wordprocessingGroup" xmlns:wpi="http://schemas.microsoft.com/office/word/2010/wordprocessingInk" xmlns:wne="http://schemas.microsoft.com/office/word/2006/wordml" xmlns:wps="http://schemas.microsoft.com/office/word/2010/wordprocessingShape" mc:Ignorable="w14 w15 w16se w16cid w16 w16cex w16sdtdh w16sdtfl w16du wp14">
   <w:body>
     <w:p>
-      <w:r>
-        <w:t>AiNetsoft Functions Description</w:t>
+      <w:proofErr w:type="spellStart"/>
+      <w:r>
+        <w:t>AiNetsoft</w:t>
+      </w:r>
+      <w:proofErr w:type="spellEnd"/>
+      <w:r>
+        <w:t xml:space="preserve"> Functions Description</w:t>
       </w:r>
     </w:p>
     <w:p/>
@@ -18,6 +23,194 @@
       </w:pPr>
       <w:r>
         <w:t>Users:</w:t>
+      </w:r>
+    </w:p>
+    <w:p>
+      <w:pPr>
+        <w:pStyle w:val="ListParagraph"/>
+        <w:numPr>
+          <w:ilvl w:val="0"/>
+          <w:numId w:val="5"/>
+        </w:numPr>
+      </w:pPr>
+      <w:r>
+        <w:t>Users register:</w:t>
+      </w:r>
+    </w:p>
+    <w:p>
+      <w:pPr>
+        <w:ind w:left="720"/>
+      </w:pPr>
+      <w:r>
+        <w:t xml:space="preserve">To register to become a member of the app, the users have many ways to register: Using </w:t>
+      </w:r>
+      <w:r>
+        <w:rPr>
+          <w:highlight w:val="yellow"/>
+        </w:rPr>
+        <w:t>cell phone number</w:t>
+      </w:r>
+      <w:r>
+        <w:t>, social network, Google mail, personal mail account</w:t>
+      </w:r>
+    </w:p>
+    <w:p>
+      <w:pPr>
+        <w:ind w:left="720"/>
+      </w:pPr>
+      <w:r>
+        <w:t>Once using the email for registration, an email validation will be sent to the registered user to notify the confirmation as below</w:t>
+      </w:r>
+    </w:p>
+    <w:p>
+      <w:pPr>
+        <w:ind w:left="720"/>
+        <w:jc w:val="center"/>
+      </w:pPr>
+      <w:r>
+        <w:drawing>
+          <wp:inline distT="0" distB="0" distL="0" distR="0" wp14:anchorId="132EDA3A" wp14:editId="5EBFA534">
+            <wp:extent cx="4089400" cy="5457411"/>
+            <wp:effectExtent l="0" t="0" r="6350" b="0"/>
+            <wp:docPr id="1820225153" name="Picture 1"/>
+            <wp:cNvGraphicFramePr>
+              <a:graphicFrameLocks xmlns:a="http://schemas.openxmlformats.org/drawingml/2006/main" noChangeAspect="1"/>
+            </wp:cNvGraphicFramePr>
+            <a:graphic xmlns:a="http://schemas.openxmlformats.org/drawingml/2006/main">
+              <a:graphicData uri="http://schemas.openxmlformats.org/drawingml/2006/picture">
+                <pic:pic xmlns:pic="http://schemas.openxmlformats.org/drawingml/2006/picture">
+                  <pic:nvPicPr>
+                    <pic:cNvPr id="1820225153" name=""/>
+                    <pic:cNvPicPr/>
+                  </pic:nvPicPr>
+                  <pic:blipFill>
+                    <a:blip r:embed="rId5"/>
+                    <a:stretch>
+                      <a:fillRect/>
+                    </a:stretch>
+                  </pic:blipFill>
+                  <pic:spPr>
+                    <a:xfrm>
+                      <a:off x="0" y="0"/>
+                      <a:ext cx="4090003" cy="5458216"/>
+                    </a:xfrm>
+                    <a:prstGeom prst="rect">
+                      <a:avLst/>
+                    </a:prstGeom>
+                  </pic:spPr>
+                </pic:pic>
+              </a:graphicData>
+            </a:graphic>
+          </wp:inline>
+        </w:drawing>
+      </w:r>
+    </w:p>
+    <w:p>
+      <w:pPr>
+        <w:ind w:left="720"/>
+      </w:pPr>
+      <w:r>
+        <w:t>The screenshot below is the confirmation tells that the user should receive the mail confirmation for the final step of the registration progress</w:t>
+      </w:r>
+    </w:p>
+    <w:p>
+      <w:pPr>
+        <w:ind w:left="720"/>
+        <w:jc w:val="center"/>
+      </w:pPr>
+      <w:r>
+        <w:lastRenderedPageBreak/>
+        <w:drawing>
+          <wp:inline distT="0" distB="0" distL="0" distR="0" wp14:anchorId="3C956DD0" wp14:editId="3BFB7BBA">
+            <wp:extent cx="4781550" cy="1866133"/>
+            <wp:effectExtent l="0" t="0" r="0" b="1270"/>
+            <wp:docPr id="2145858457" name="Picture 1"/>
+            <wp:cNvGraphicFramePr>
+              <a:graphicFrameLocks xmlns:a="http://schemas.openxmlformats.org/drawingml/2006/main" noChangeAspect="1"/>
+            </wp:cNvGraphicFramePr>
+            <a:graphic xmlns:a="http://schemas.openxmlformats.org/drawingml/2006/main">
+              <a:graphicData uri="http://schemas.openxmlformats.org/drawingml/2006/picture">
+                <pic:pic xmlns:pic="http://schemas.openxmlformats.org/drawingml/2006/picture">
+                  <pic:nvPicPr>
+                    <pic:cNvPr id="2145858457" name=""/>
+                    <pic:cNvPicPr/>
+                  </pic:nvPicPr>
+                  <pic:blipFill>
+                    <a:blip r:embed="rId6"/>
+                    <a:stretch>
+                      <a:fillRect/>
+                    </a:stretch>
+                  </pic:blipFill>
+                  <pic:spPr>
+                    <a:xfrm>
+                      <a:off x="0" y="0"/>
+                      <a:ext cx="4791364" cy="1869963"/>
+                    </a:xfrm>
+                    <a:prstGeom prst="rect">
+                      <a:avLst/>
+                    </a:prstGeom>
+                  </pic:spPr>
+                </pic:pic>
+              </a:graphicData>
+            </a:graphic>
+          </wp:inline>
+        </w:drawing>
+      </w:r>
+    </w:p>
+    <w:p>
+      <w:pPr>
+        <w:ind w:left="720"/>
+      </w:pPr>
+    </w:p>
+    <w:p>
+      <w:pPr>
+        <w:ind w:left="720"/>
+      </w:pPr>
+      <w:r>
+        <w:t>After confirming the message below will tell the user ready for login the application</w:t>
+      </w:r>
+    </w:p>
+    <w:p>
+      <w:pPr>
+        <w:ind w:left="720"/>
+        <w:jc w:val="center"/>
+      </w:pPr>
+      <w:r>
+        <w:drawing>
+          <wp:inline distT="0" distB="0" distL="0" distR="0" wp14:anchorId="2E44240F" wp14:editId="0936A4EC">
+            <wp:extent cx="3962400" cy="2381250"/>
+            <wp:effectExtent l="0" t="0" r="0" b="0"/>
+            <wp:docPr id="1479252684" name="Picture 1"/>
+            <wp:cNvGraphicFramePr>
+              <a:graphicFrameLocks xmlns:a="http://schemas.openxmlformats.org/drawingml/2006/main" noChangeAspect="1"/>
+            </wp:cNvGraphicFramePr>
+            <a:graphic xmlns:a="http://schemas.openxmlformats.org/drawingml/2006/main">
+              <a:graphicData uri="http://schemas.openxmlformats.org/drawingml/2006/picture">
+                <pic:pic xmlns:pic="http://schemas.openxmlformats.org/drawingml/2006/picture">
+                  <pic:nvPicPr>
+                    <pic:cNvPr id="1479252684" name=""/>
+                    <pic:cNvPicPr/>
+                  </pic:nvPicPr>
+                  <pic:blipFill>
+                    <a:blip r:embed="rId7"/>
+                    <a:stretch>
+                      <a:fillRect/>
+                    </a:stretch>
+                  </pic:blipFill>
+                  <pic:spPr>
+                    <a:xfrm>
+                      <a:off x="0" y="0"/>
+                      <a:ext cx="3964442" cy="2382477"/>
+                    </a:xfrm>
+                    <a:prstGeom prst="rect">
+                      <a:avLst/>
+                    </a:prstGeom>
+                  </pic:spPr>
+                </pic:pic>
+              </a:graphicData>
+            </a:graphic>
+          </wp:inline>
+        </w:drawing>
       </w:r>
     </w:p>
     <w:p>
@@ -66,7 +259,7 @@
                     <pic:cNvPicPr/>
                   </pic:nvPicPr>
                   <pic:blipFill>
-                    <a:blip r:embed="rId5"/>
+                    <a:blip r:embed="rId8"/>
                     <a:stretch>
                       <a:fillRect/>
                     </a:stretch>
@@ -89,6 +282,7 @@
     </w:p>
     <w:p>
       <w:r>
+        <w:lastRenderedPageBreak/>
         <w:t>Normal users can edit their information via each page</w:t>
       </w:r>
     </w:p>
@@ -101,7 +295,31 @@
         </w:numPr>
       </w:pPr>
       <w:r>
-        <w:t>Edit all needed fields as the “ Ho so ca nhan”.  The scenario that Phone number can be sync from the Sell request data to this page, also same for email. Data is storing in the User collection</w:t>
+        <w:t xml:space="preserve">Edit all needed fields as the </w:t>
+      </w:r>
+      <w:proofErr w:type="gramStart"/>
+      <w:r>
+        <w:t>“ Ho</w:t>
+      </w:r>
+      <w:proofErr w:type="gramEnd"/>
+      <w:r>
+        <w:t xml:space="preserve"> so ca </w:t>
+      </w:r>
+      <w:proofErr w:type="spellStart"/>
+      <w:r>
+        <w:t>nhan</w:t>
+      </w:r>
+      <w:proofErr w:type="spellEnd"/>
+      <w:r>
+        <w:t xml:space="preserve">”.  The scenario that Phone number can be sync from the Sell request data to this page, also same for email. Data is </w:t>
+      </w:r>
+      <w:proofErr w:type="gramStart"/>
+      <w:r>
+        <w:t>storing</w:t>
+      </w:r>
+      <w:proofErr w:type="gramEnd"/>
+      <w:r>
+        <w:t xml:space="preserve"> in the User collection</w:t>
       </w:r>
     </w:p>
     <w:p>
@@ -113,16 +331,48 @@
         </w:numPr>
       </w:pPr>
       <w:r>
-        <w:t>Tài khoản ngân h</w:t>
+        <w:t xml:space="preserve">Tài </w:t>
+      </w:r>
+      <w:proofErr w:type="spellStart"/>
+      <w:r>
+        <w:t>khoản</w:t>
+      </w:r>
+      <w:proofErr w:type="spellEnd"/>
+      <w:r>
+        <w:t xml:space="preserve"> </w:t>
+      </w:r>
+      <w:proofErr w:type="spellStart"/>
+      <w:r>
+        <w:t>ngân</w:t>
+      </w:r>
+      <w:proofErr w:type="spellEnd"/>
+      <w:r>
+        <w:t xml:space="preserve"> </w:t>
+      </w:r>
+      <w:proofErr w:type="spellStart"/>
+      <w:r>
+        <w:t>h</w:t>
       </w:r>
       <w:r>
         <w:t>à</w:t>
       </w:r>
       <w:r>
-        <w:t>ng is being s</w:t>
-      </w:r>
-      <w:r>
-        <w:t xml:space="preserve">tored in the bank_account </w:t>
+        <w:t>ng</w:t>
+      </w:r>
+      <w:proofErr w:type="spellEnd"/>
+      <w:r>
+        <w:t xml:space="preserve"> is being s</w:t>
+      </w:r>
+      <w:r>
+        <w:t xml:space="preserve">tored in the </w:t>
+      </w:r>
+      <w:proofErr w:type="spellStart"/>
+      <w:r>
+        <w:t>bank_account</w:t>
+      </w:r>
+      <w:proofErr w:type="spellEnd"/>
+      <w:r>
+        <w:t xml:space="preserve"> </w:t>
       </w:r>
       <w:r>
         <w:t xml:space="preserve">database </w:t>
@@ -134,7 +384,15 @@
         <w:t>ed</w:t>
       </w:r>
       <w:r>
-        <w:t xml:space="preserve"> when user request to become a Seller</w:t>
+        <w:t xml:space="preserve"> when user </w:t>
+      </w:r>
+      <w:proofErr w:type="gramStart"/>
+      <w:r>
+        <w:t>request</w:t>
+      </w:r>
+      <w:proofErr w:type="gramEnd"/>
+      <w:r>
+        <w:t xml:space="preserve"> to become a Seller</w:t>
       </w:r>
     </w:p>
     <w:p>
@@ -158,7 +416,7 @@
                     <pic:cNvPicPr/>
                   </pic:nvPicPr>
                   <pic:blipFill>
-                    <a:blip r:embed="rId6"/>
+                    <a:blip r:embed="rId9"/>
                     <a:stretch>
                       <a:fillRect/>
                     </a:stretch>
@@ -187,19 +445,41 @@
           <w:numId w:val="5"/>
         </w:numPr>
       </w:pPr>
-      <w:r>
-        <w:lastRenderedPageBreak/>
-        <w:t xml:space="preserve">Địa chỉ </w:t>
-      </w:r>
+      <w:proofErr w:type="spellStart"/>
+      <w:r>
+        <w:t>Địa</w:t>
+      </w:r>
+      <w:proofErr w:type="spellEnd"/>
+      <w:r>
+        <w:t xml:space="preserve"> </w:t>
+      </w:r>
+      <w:proofErr w:type="spellStart"/>
+      <w:r>
+        <w:t>chỉ</w:t>
+      </w:r>
+      <w:proofErr w:type="spellEnd"/>
+      <w:r>
+        <w:t xml:space="preserve"> </w:t>
+      </w:r>
+      <w:proofErr w:type="spellStart"/>
       <w:r>
         <w:t>ng</w:t>
       </w:r>
       <w:r>
-        <w:t>ận h</w:t>
+        <w:t>ận</w:t>
+      </w:r>
+      <w:proofErr w:type="spellEnd"/>
+      <w:r>
+        <w:t xml:space="preserve"> </w:t>
+      </w:r>
+      <w:proofErr w:type="spellStart"/>
+      <w:r>
+        <w:t>h</w:t>
       </w:r>
       <w:r>
         <w:t>àng</w:t>
       </w:r>
+      <w:proofErr w:type="spellEnd"/>
       <w:r>
         <w:t>: Users can update data here. This is also synced to the Seller registry from if use request to become a Seller</w:t>
       </w:r>
@@ -225,7 +505,7 @@
                     <pic:cNvPicPr/>
                   </pic:nvPicPr>
                   <pic:blipFill>
-                    <a:blip r:embed="rId7"/>
+                    <a:blip r:embed="rId10"/>
                     <a:stretch>
                       <a:fillRect/>
                     </a:stretch>
@@ -261,17 +541,33 @@
         <w:rPr>
           <w:highlight w:val="yellow"/>
         </w:rPr>
-        <w:t>. Future will implement a validation email account to make sure fake email is not available. Also the password constrain will be asked for stronger.</w:t>
+        <w:t xml:space="preserve">. Future will implement a validation email account to make sure fake email is not available. </w:t>
+      </w:r>
+      <w:proofErr w:type="gramStart"/>
+      <w:r>
+        <w:rPr>
+          <w:highlight w:val="yellow"/>
+        </w:rPr>
+        <w:t>Also</w:t>
+      </w:r>
+      <w:proofErr w:type="gramEnd"/>
+      <w:r>
+        <w:rPr>
+          <w:highlight w:val="yellow"/>
+        </w:rPr>
+        <w:t xml:space="preserve"> the password constrain will be asked for stronger.</w:t>
       </w:r>
     </w:p>
     <w:p>
       <w:pPr>
         <w:pStyle w:val="ListParagraph"/>
+        <w:jc w:val="center"/>
       </w:pPr>
       <w:r>
         <w:rPr>
           <w:noProof/>
         </w:rPr>
+        <w:lastRenderedPageBreak/>
         <w:drawing>
           <wp:inline distT="0" distB="0" distL="0" distR="0" wp14:anchorId="54CCB5FC" wp14:editId="535D6361">
             <wp:extent cx="5943600" cy="2646045"/>
@@ -288,7 +584,7 @@
                     <pic:cNvPicPr/>
                   </pic:nvPicPr>
                   <pic:blipFill>
-                    <a:blip r:embed="rId8"/>
+                    <a:blip r:embed="rId11"/>
                     <a:stretch>
                       <a:fillRect/>
                     </a:stretch>
@@ -322,11 +618,13 @@
       </w:r>
     </w:p>
     <w:p>
+      <w:pPr>
+        <w:jc w:val="center"/>
+      </w:pPr>
       <w:r>
         <w:rPr>
           <w:noProof/>
         </w:rPr>
-        <w:lastRenderedPageBreak/>
         <w:drawing>
           <wp:inline distT="0" distB="0" distL="0" distR="0" wp14:anchorId="309E4F4B" wp14:editId="45173F7B">
             <wp:extent cx="5943600" cy="2635250"/>
@@ -343,7 +641,7 @@
                     <pic:cNvPicPr/>
                   </pic:nvPicPr>
                   <pic:blipFill>
-                    <a:blip r:embed="rId9"/>
+                    <a:blip r:embed="rId12"/>
                     <a:stretch>
                       <a:fillRect/>
                     </a:stretch>
@@ -374,14 +672,26 @@
         </w:numPr>
       </w:pPr>
       <w:r>
-        <w:t>Become a seller: This contains a huge complex steps to register to become a Seller with using AI connection service support to scan to detect the fake CCCD info</w:t>
-      </w:r>
-    </w:p>
-    <w:p>
+        <w:t xml:space="preserve">Become a seller: This contains a </w:t>
+      </w:r>
+      <w:proofErr w:type="gramStart"/>
+      <w:r>
+        <w:t>huge complex steps</w:t>
+      </w:r>
+      <w:proofErr w:type="gramEnd"/>
+      <w:r>
+        <w:t xml:space="preserve"> to register to become a Seller with using AI connection service support to scan to detect the fake CCCD info</w:t>
+      </w:r>
+    </w:p>
+    <w:p>
+      <w:pPr>
+        <w:jc w:val="center"/>
+      </w:pPr>
       <w:r>
         <w:rPr>
           <w:noProof/>
         </w:rPr>
+        <w:lastRenderedPageBreak/>
         <w:drawing>
           <wp:inline distT="0" distB="0" distL="0" distR="0" wp14:anchorId="28A55FF1" wp14:editId="1F817A24">
             <wp:extent cx="5943600" cy="3066415"/>
@@ -398,7 +708,7 @@
                     <pic:cNvPicPr/>
                   </pic:nvPicPr>
                   <pic:blipFill>
-                    <a:blip r:embed="rId10"/>
+                    <a:blip r:embed="rId13"/>
                     <a:stretch>
                       <a:fillRect/>
                     </a:stretch>
@@ -454,13 +764,13 @@
       </w:r>
       <w:r>
         <w:br/>
-      </w:r>
-      <w:r>
-        <w:lastRenderedPageBreak/>
         <w:t>The scenario that users will be redirected to the bank account to ask the user fill bank information’s. After fully filled this, the app will redirect to the detail steps of seller register.</w:t>
       </w:r>
     </w:p>
     <w:p>
+      <w:pPr>
+        <w:jc w:val="center"/>
+      </w:pPr>
       <w:r>
         <w:rPr>
           <w:noProof/>
@@ -481,7 +791,7 @@
                     <pic:cNvPicPr/>
                   </pic:nvPicPr>
                   <pic:blipFill>
-                    <a:blip r:embed="rId11"/>
+                    <a:blip r:embed="rId14"/>
                     <a:stretch>
                       <a:fillRect/>
                     </a:stretch>
@@ -509,10 +819,14 @@
       </w:r>
     </w:p>
     <w:p>
+      <w:pPr>
+        <w:jc w:val="center"/>
+      </w:pPr>
       <w:r>
         <w:rPr>
           <w:noProof/>
         </w:rPr>
+        <w:lastRenderedPageBreak/>
         <w:drawing>
           <wp:inline distT="0" distB="0" distL="0" distR="0" wp14:anchorId="73DFCE24" wp14:editId="209ECB89">
             <wp:extent cx="5943600" cy="3066415"/>
@@ -529,7 +843,7 @@
                     <pic:cNvPicPr/>
                   </pic:nvPicPr>
                   <pic:blipFill>
-                    <a:blip r:embed="rId10"/>
+                    <a:blip r:embed="rId13"/>
                     <a:stretch>
                       <a:fillRect/>
                     </a:stretch>
@@ -558,11 +872,13 @@
       </w:r>
     </w:p>
     <w:p>
+      <w:pPr>
+        <w:jc w:val="center"/>
+      </w:pPr>
       <w:r>
         <w:rPr>
           <w:noProof/>
         </w:rPr>
-        <w:lastRenderedPageBreak/>
         <w:drawing>
           <wp:inline distT="0" distB="0" distL="0" distR="0" wp14:anchorId="47CF53DD" wp14:editId="51107850">
             <wp:extent cx="5943600" cy="3136265"/>
@@ -579,7 +895,7 @@
                     <pic:cNvPicPr/>
                   </pic:nvPicPr>
                   <pic:blipFill>
-                    <a:blip r:embed="rId12"/>
+                    <a:blip r:embed="rId15"/>
                     <a:stretch>
                       <a:fillRect/>
                     </a:stretch>
@@ -608,10 +924,14 @@
     </w:p>
     <w:p>
       <w:r>
+        <w:lastRenderedPageBreak/>
         <w:t>Next screen that asks users to fill the method of transportation</w:t>
       </w:r>
     </w:p>
     <w:p>
+      <w:pPr>
+        <w:jc w:val="center"/>
+      </w:pPr>
       <w:r>
         <w:rPr>
           <w:noProof/>
@@ -632,7 +952,7 @@
                     <pic:cNvPicPr/>
                   </pic:nvPicPr>
                   <pic:blipFill>
-                    <a:blip r:embed="rId13"/>
+                    <a:blip r:embed="rId16"/>
                     <a:stretch>
                       <a:fillRect/>
                     </a:stretch>
@@ -660,10 +980,21 @@
     <w:p/>
     <w:p>
       <w:r>
-        <w:t>Users must type the business type and full fill sufficient info and validation</w:t>
-      </w:r>
-    </w:p>
-    <w:p>
+        <w:t xml:space="preserve">Users must type the business type and </w:t>
+      </w:r>
+      <w:proofErr w:type="gramStart"/>
+      <w:r>
+        <w:t>full</w:t>
+      </w:r>
+      <w:proofErr w:type="gramEnd"/>
+      <w:r>
+        <w:t xml:space="preserve"> fill sufficient info and validation</w:t>
+      </w:r>
+    </w:p>
+    <w:p>
+      <w:pPr>
+        <w:jc w:val="center"/>
+      </w:pPr>
       <w:r>
         <w:rPr>
           <w:noProof/>
@@ -684,7 +1015,7 @@
                     <pic:cNvPicPr/>
                   </pic:nvPicPr>
                   <pic:blipFill>
-                    <a:blip r:embed="rId14"/>
+                    <a:blip r:embed="rId17"/>
                     <a:stretch>
                       <a:fillRect/>
                     </a:stretch>
@@ -707,16 +1038,25 @@
     </w:p>
     <w:p>
       <w:r>
+        <w:lastRenderedPageBreak/>
         <w:t xml:space="preserve">Personal </w:t>
       </w:r>
-      <w:r>
-        <w:t>business(Same</w:t>
+      <w:proofErr w:type="gramStart"/>
+      <w:r>
+        <w:t>business(</w:t>
+      </w:r>
+      <w:proofErr w:type="gramEnd"/>
+      <w:r>
+        <w:t>Same</w:t>
       </w:r>
       <w:r>
         <w:t xml:space="preserve"> screen for Company business)</w:t>
       </w:r>
     </w:p>
     <w:p>
+      <w:pPr>
+        <w:jc w:val="center"/>
+      </w:pPr>
       <w:r>
         <w:rPr>
           <w:noProof/>
@@ -737,7 +1077,7 @@
                     <pic:cNvPicPr/>
                   </pic:nvPicPr>
                   <pic:blipFill>
-                    <a:blip r:embed="rId15"/>
+                    <a:blip r:embed="rId18"/>
                     <a:stretch>
                       <a:fillRect/>
                     </a:stretch>
@@ -760,8 +1100,10 @@
     </w:p>
     <w:p/>
     <w:p>
-      <w:r>
-        <w:lastRenderedPageBreak/>
+      <w:pPr>
+        <w:jc w:val="center"/>
+      </w:pPr>
+      <w:r>
         <w:t xml:space="preserve">Users must </w:t>
       </w:r>
       <w:r>
@@ -796,7 +1138,7 @@
                     <pic:cNvPicPr/>
                   </pic:nvPicPr>
                   <pic:blipFill>
-                    <a:blip r:embed="rId16"/>
+                    <a:blip r:embed="rId19"/>
                     <a:stretch>
                       <a:fillRect/>
                     </a:stretch>
@@ -820,6 +1162,7 @@
     <w:p/>
     <w:p>
       <w:r>
+        <w:lastRenderedPageBreak/>
         <w:t xml:space="preserve">Users will be denied moving to next steps </w:t>
       </w:r>
       <w:r>
@@ -828,22 +1171,29 @@
       <w:r>
         <w:t xml:space="preserve"> the result and ask the user </w:t>
       </w:r>
+      <w:proofErr w:type="gramStart"/>
       <w:r>
         <w:t>must</w:t>
       </w:r>
       <w:r>
-        <w:t xml:space="preserve"> verify and update the correct information</w:t>
+        <w:t xml:space="preserve"> verify</w:t>
+      </w:r>
+      <w:proofErr w:type="gramEnd"/>
+      <w:r>
+        <w:t xml:space="preserve"> and update the correct information</w:t>
       </w:r>
       <w:r>
         <w:t>.</w:t>
       </w:r>
     </w:p>
     <w:p>
+      <w:pPr>
+        <w:jc w:val="center"/>
+      </w:pPr>
       <w:r>
         <w:rPr>
           <w:noProof/>
         </w:rPr>
-        <w:lastRenderedPageBreak/>
         <w:drawing>
           <wp:inline distT="0" distB="0" distL="0" distR="0" wp14:anchorId="2714DCDE" wp14:editId="72553935">
             <wp:extent cx="5943600" cy="4973320"/>
@@ -860,7 +1210,7 @@
                     <pic:cNvPicPr/>
                   </pic:nvPicPr>
                   <pic:blipFill>
-                    <a:blip r:embed="rId17"/>
+                    <a:blip r:embed="rId20"/>
                     <a:stretch>
                       <a:fillRect/>
                     </a:stretch>
@@ -888,6 +1238,9 @@
       </w:r>
     </w:p>
     <w:p>
+      <w:pPr>
+        <w:jc w:val="center"/>
+      </w:pPr>
       <w:r>
         <w:rPr>
           <w:noProof/>
@@ -909,7 +1262,7 @@
                     <pic:cNvPicPr/>
                   </pic:nvPicPr>
                   <pic:blipFill>
-                    <a:blip r:embed="rId18"/>
+                    <a:blip r:embed="rId21"/>
                     <a:stretch>
                       <a:fillRect/>
                     </a:stretch>
@@ -932,8 +1285,19 @@
     </w:p>
     <w:p/>
     <w:p>
-      <w:r>
-        <w:t>After all information needed id valid, the requester will receive the notification and email as below</w:t>
+      <w:pPr>
+        <w:jc w:val="center"/>
+      </w:pPr>
+      <w:r>
+        <w:t xml:space="preserve">After all information needed </w:t>
+      </w:r>
+      <w:proofErr w:type="gramStart"/>
+      <w:r>
+        <w:t>id</w:t>
+      </w:r>
+      <w:proofErr w:type="gramEnd"/>
+      <w:r>
+        <w:t xml:space="preserve"> valid, the requester will receive the notification and email as below</w:t>
       </w:r>
       <w:r>
         <w:br/>
@@ -961,7 +1325,7 @@
                     <pic:cNvPicPr/>
                   </pic:nvPicPr>
                   <pic:blipFill>
-                    <a:blip r:embed="rId19"/>
+                    <a:blip r:embed="rId22"/>
                     <a:stretch>
                       <a:fillRect/>
                     </a:stretch>
@@ -984,6 +1348,9 @@
     </w:p>
     <w:p/>
     <w:p>
+      <w:pPr>
+        <w:jc w:val="center"/>
+      </w:pPr>
       <w:r>
         <w:rPr>
           <w:noProof/>
@@ -1005,7 +1372,7 @@
                     <pic:cNvPicPr/>
                   </pic:nvPicPr>
                   <pic:blipFill>
-                    <a:blip r:embed="rId20"/>
+                    <a:blip r:embed="rId23"/>
                     <a:stretch>
                       <a:fillRect/>
                     </a:stretch>
@@ -1064,13 +1431,247 @@
         <w:tab/>
       </w:r>
       <w:r>
-        <w:t>"Hồ sơ đang chờ phê duyệt</w:t>
-      </w:r>
+        <w:t>"</w:t>
+      </w:r>
+      <w:proofErr w:type="spellStart"/>
+      <w:r>
+        <w:t>Hồ</w:t>
+      </w:r>
+      <w:proofErr w:type="spellEnd"/>
+      <w:r>
+        <w:t xml:space="preserve"> </w:t>
+      </w:r>
+      <w:proofErr w:type="spellStart"/>
+      <w:r>
+        <w:t>sơ</w:t>
+      </w:r>
+      <w:proofErr w:type="spellEnd"/>
+      <w:r>
+        <w:t xml:space="preserve"> </w:t>
+      </w:r>
+      <w:proofErr w:type="spellStart"/>
+      <w:r>
+        <w:t>đang</w:t>
+      </w:r>
+      <w:proofErr w:type="spellEnd"/>
+      <w:r>
+        <w:t xml:space="preserve"> </w:t>
+      </w:r>
+      <w:proofErr w:type="spellStart"/>
+      <w:r>
+        <w:t>chờ</w:t>
+      </w:r>
+      <w:proofErr w:type="spellEnd"/>
+      <w:r>
+        <w:t xml:space="preserve"> </w:t>
+      </w:r>
+      <w:proofErr w:type="spellStart"/>
+      <w:r>
+        <w:t>phê</w:t>
+      </w:r>
+      <w:proofErr w:type="spellEnd"/>
+      <w:r>
+        <w:t xml:space="preserve"> </w:t>
+      </w:r>
+      <w:proofErr w:type="spellStart"/>
+      <w:r>
+        <w:t>duyệt</w:t>
+      </w:r>
+      <w:proofErr w:type="spellEnd"/>
       <w:r>
         <w:t xml:space="preserve">. </w:t>
       </w:r>
-      <w:r>
-        <w:t>Yêu cầu đăng ký Người bán của bạn đã được tiếp nhận. Đội ngũ kiểm duyệt sẽ phản hồi trong vòng 24 giờ làm việc."</w:t>
+      <w:proofErr w:type="spellStart"/>
+      <w:r>
+        <w:t>Yêu</w:t>
+      </w:r>
+      <w:proofErr w:type="spellEnd"/>
+      <w:r>
+        <w:t xml:space="preserve"> </w:t>
+      </w:r>
+      <w:proofErr w:type="spellStart"/>
+      <w:r>
+        <w:t>cầu</w:t>
+      </w:r>
+      <w:proofErr w:type="spellEnd"/>
+      <w:r>
+        <w:t xml:space="preserve"> </w:t>
+      </w:r>
+      <w:proofErr w:type="spellStart"/>
+      <w:r>
+        <w:t>đăng</w:t>
+      </w:r>
+      <w:proofErr w:type="spellEnd"/>
+      <w:r>
+        <w:t xml:space="preserve"> </w:t>
+      </w:r>
+      <w:proofErr w:type="spellStart"/>
+      <w:r>
+        <w:t>ký</w:t>
+      </w:r>
+      <w:proofErr w:type="spellEnd"/>
+      <w:r>
+        <w:t xml:space="preserve"> </w:t>
+      </w:r>
+      <w:proofErr w:type="spellStart"/>
+      <w:r>
+        <w:t>Người</w:t>
+      </w:r>
+      <w:proofErr w:type="spellEnd"/>
+      <w:r>
+        <w:t xml:space="preserve"> </w:t>
+      </w:r>
+      <w:proofErr w:type="spellStart"/>
+      <w:r>
+        <w:t>bán</w:t>
+      </w:r>
+      <w:proofErr w:type="spellEnd"/>
+      <w:r>
+        <w:t xml:space="preserve"> </w:t>
+      </w:r>
+      <w:proofErr w:type="spellStart"/>
+      <w:r>
+        <w:t>của</w:t>
+      </w:r>
+      <w:proofErr w:type="spellEnd"/>
+      <w:r>
+        <w:t xml:space="preserve"> </w:t>
+      </w:r>
+      <w:proofErr w:type="spellStart"/>
+      <w:r>
+        <w:t>bạn</w:t>
+      </w:r>
+      <w:proofErr w:type="spellEnd"/>
+      <w:r>
+        <w:t xml:space="preserve"> </w:t>
+      </w:r>
+      <w:proofErr w:type="spellStart"/>
+      <w:r>
+        <w:t>đã</w:t>
+      </w:r>
+      <w:proofErr w:type="spellEnd"/>
+      <w:r>
+        <w:t xml:space="preserve"> </w:t>
+      </w:r>
+      <w:proofErr w:type="spellStart"/>
+      <w:r>
+        <w:t>được</w:t>
+      </w:r>
+      <w:proofErr w:type="spellEnd"/>
+      <w:r>
+        <w:t xml:space="preserve"> </w:t>
+      </w:r>
+      <w:proofErr w:type="spellStart"/>
+      <w:r>
+        <w:t>tiếp</w:t>
+      </w:r>
+      <w:proofErr w:type="spellEnd"/>
+      <w:r>
+        <w:t xml:space="preserve"> </w:t>
+      </w:r>
+      <w:proofErr w:type="spellStart"/>
+      <w:r>
+        <w:t>nhận</w:t>
+      </w:r>
+      <w:proofErr w:type="spellEnd"/>
+      <w:r>
+        <w:t xml:space="preserve">. </w:t>
+      </w:r>
+      <w:proofErr w:type="spellStart"/>
+      <w:r>
+        <w:t>Đội</w:t>
+      </w:r>
+      <w:proofErr w:type="spellEnd"/>
+      <w:r>
+        <w:t xml:space="preserve"> </w:t>
+      </w:r>
+      <w:proofErr w:type="spellStart"/>
+      <w:r>
+        <w:t>ngũ</w:t>
+      </w:r>
+      <w:proofErr w:type="spellEnd"/>
+      <w:r>
+        <w:t xml:space="preserve"> </w:t>
+      </w:r>
+      <w:proofErr w:type="spellStart"/>
+      <w:r>
+        <w:t>kiểm</w:t>
+      </w:r>
+      <w:proofErr w:type="spellEnd"/>
+      <w:r>
+        <w:t xml:space="preserve"> </w:t>
+      </w:r>
+      <w:proofErr w:type="spellStart"/>
+      <w:r>
+        <w:t>duyệt</w:t>
+      </w:r>
+      <w:proofErr w:type="spellEnd"/>
+      <w:r>
+        <w:t xml:space="preserve"> </w:t>
+      </w:r>
+      <w:proofErr w:type="spellStart"/>
+      <w:r>
+        <w:t>sẽ</w:t>
+      </w:r>
+      <w:proofErr w:type="spellEnd"/>
+      <w:r>
+        <w:t xml:space="preserve"> </w:t>
+      </w:r>
+      <w:proofErr w:type="spellStart"/>
+      <w:r>
+        <w:t>phản</w:t>
+      </w:r>
+      <w:proofErr w:type="spellEnd"/>
+      <w:r>
+        <w:t xml:space="preserve"> </w:t>
+      </w:r>
+      <w:proofErr w:type="spellStart"/>
+      <w:r>
+        <w:t>hồi</w:t>
+      </w:r>
+      <w:proofErr w:type="spellEnd"/>
+      <w:r>
+        <w:t xml:space="preserve"> </w:t>
+      </w:r>
+      <w:proofErr w:type="spellStart"/>
+      <w:r>
+        <w:t>trong</w:t>
+      </w:r>
+      <w:proofErr w:type="spellEnd"/>
+      <w:r>
+        <w:t xml:space="preserve"> </w:t>
+      </w:r>
+      <w:proofErr w:type="spellStart"/>
+      <w:r>
+        <w:t>vòng</w:t>
+      </w:r>
+      <w:proofErr w:type="spellEnd"/>
+      <w:r>
+        <w:t xml:space="preserve"> 24 </w:t>
+      </w:r>
+      <w:proofErr w:type="spellStart"/>
+      <w:r>
+        <w:t>giờ</w:t>
+      </w:r>
+      <w:proofErr w:type="spellEnd"/>
+      <w:r>
+        <w:t xml:space="preserve"> </w:t>
+      </w:r>
+      <w:proofErr w:type="spellStart"/>
+      <w:r>
+        <w:t>làm</w:t>
+      </w:r>
+      <w:proofErr w:type="spellEnd"/>
+      <w:r>
+        <w:t xml:space="preserve"> </w:t>
+      </w:r>
+      <w:proofErr w:type="spellStart"/>
+      <w:r>
+        <w:t>việc</w:t>
+      </w:r>
+      <w:proofErr w:type="spellEnd"/>
+      <w:r>
+        <w:t>."</w:t>
       </w:r>
     </w:p>
     <w:p>
@@ -1087,6 +1688,9 @@
       </w:r>
     </w:p>
     <w:p>
+      <w:pPr>
+        <w:jc w:val="center"/>
+      </w:pPr>
       <w:r>
         <w:rPr>
           <w:noProof/>
@@ -1108,7 +1712,7 @@
                     <pic:cNvPicPr/>
                   </pic:nvPicPr>
                   <pic:blipFill>
-                    <a:blip r:embed="rId21"/>
+                    <a:blip r:embed="rId24"/>
                     <a:stretch>
                       <a:fillRect/>
                     </a:stretch>
@@ -1149,18 +1753,202 @@
         <w:t>progress</w:t>
       </w:r>
       <w:r>
-        <w:t xml:space="preserve"> of the status and a notification also appear "Đăng ký thành công!</w:t>
-      </w:r>
-    </w:p>
-    <w:p>
-      <w:r>
-        <w:t xml:space="preserve">                Hồ sơ của bạn đã được gửi. Chúng tôi đã gửi email xác nhận đến pending@ainetsoft.com.</w:t>
+        <w:t xml:space="preserve"> of the status and a notification also appear "</w:t>
+      </w:r>
+      <w:proofErr w:type="spellStart"/>
+      <w:r>
+        <w:t>Đăng</w:t>
+      </w:r>
+      <w:proofErr w:type="spellEnd"/>
+      <w:r>
+        <w:t xml:space="preserve"> </w:t>
+      </w:r>
+      <w:proofErr w:type="spellStart"/>
+      <w:r>
+        <w:t>ký</w:t>
+      </w:r>
+      <w:proofErr w:type="spellEnd"/>
+      <w:r>
+        <w:t xml:space="preserve"> </w:t>
+      </w:r>
+      <w:proofErr w:type="spellStart"/>
+      <w:r>
+        <w:t>thành</w:t>
+      </w:r>
+      <w:proofErr w:type="spellEnd"/>
+      <w:r>
+        <w:t xml:space="preserve"> </w:t>
+      </w:r>
+      <w:proofErr w:type="spellStart"/>
+      <w:r>
+        <w:t>công</w:t>
+      </w:r>
+      <w:proofErr w:type="spellEnd"/>
+      <w:r>
+        <w:t>!</w:t>
+      </w:r>
+    </w:p>
+    <w:p>
+      <w:r>
+        <w:t xml:space="preserve">                </w:t>
+      </w:r>
+      <w:proofErr w:type="spellStart"/>
+      <w:r>
+        <w:t>Hồ</w:t>
+      </w:r>
+      <w:proofErr w:type="spellEnd"/>
+      <w:r>
+        <w:t xml:space="preserve"> </w:t>
+      </w:r>
+      <w:proofErr w:type="spellStart"/>
+      <w:r>
+        <w:t>sơ</w:t>
+      </w:r>
+      <w:proofErr w:type="spellEnd"/>
+      <w:r>
+        <w:t xml:space="preserve"> </w:t>
+      </w:r>
+      <w:proofErr w:type="spellStart"/>
+      <w:r>
+        <w:t>của</w:t>
+      </w:r>
+      <w:proofErr w:type="spellEnd"/>
+      <w:r>
+        <w:t xml:space="preserve"> </w:t>
+      </w:r>
+      <w:proofErr w:type="spellStart"/>
+      <w:r>
+        <w:t>bạn</w:t>
+      </w:r>
+      <w:proofErr w:type="spellEnd"/>
+      <w:r>
+        <w:t xml:space="preserve"> </w:t>
+      </w:r>
+      <w:proofErr w:type="spellStart"/>
+      <w:r>
+        <w:t>đã</w:t>
+      </w:r>
+      <w:proofErr w:type="spellEnd"/>
+      <w:r>
+        <w:t xml:space="preserve"> </w:t>
+      </w:r>
+      <w:proofErr w:type="spellStart"/>
+      <w:r>
+        <w:t>được</w:t>
+      </w:r>
+      <w:proofErr w:type="spellEnd"/>
+      <w:r>
+        <w:t xml:space="preserve"> </w:t>
+      </w:r>
+      <w:proofErr w:type="spellStart"/>
+      <w:r>
+        <w:t>gửi</w:t>
+      </w:r>
+      <w:proofErr w:type="spellEnd"/>
+      <w:r>
+        <w:t xml:space="preserve">. </w:t>
+      </w:r>
+      <w:proofErr w:type="spellStart"/>
+      <w:r>
+        <w:t>Chúng</w:t>
+      </w:r>
+      <w:proofErr w:type="spellEnd"/>
+      <w:r>
+        <w:t xml:space="preserve"> </w:t>
+      </w:r>
+      <w:proofErr w:type="spellStart"/>
+      <w:r>
+        <w:t>tôi</w:t>
+      </w:r>
+      <w:proofErr w:type="spellEnd"/>
+      <w:r>
+        <w:t xml:space="preserve"> </w:t>
+      </w:r>
+      <w:proofErr w:type="spellStart"/>
+      <w:r>
+        <w:t>đã</w:t>
+      </w:r>
+      <w:proofErr w:type="spellEnd"/>
+      <w:r>
+        <w:t xml:space="preserve"> </w:t>
+      </w:r>
+      <w:proofErr w:type="spellStart"/>
+      <w:r>
+        <w:t>gửi</w:t>
+      </w:r>
+      <w:proofErr w:type="spellEnd"/>
+      <w:r>
+        <w:t xml:space="preserve"> email </w:t>
+      </w:r>
+      <w:proofErr w:type="spellStart"/>
+      <w:r>
+        <w:t>xác</w:t>
+      </w:r>
+      <w:proofErr w:type="spellEnd"/>
+      <w:r>
+        <w:t xml:space="preserve"> </w:t>
+      </w:r>
+      <w:proofErr w:type="spellStart"/>
+      <w:r>
+        <w:t>nhận</w:t>
+      </w:r>
+      <w:proofErr w:type="spellEnd"/>
+      <w:r>
+        <w:t xml:space="preserve"> </w:t>
+      </w:r>
+      <w:proofErr w:type="spellStart"/>
+      <w:r>
+        <w:t>đến</w:t>
+      </w:r>
+      <w:proofErr w:type="spellEnd"/>
+      <w:r>
+        <w:t xml:space="preserve"> pending@ainetsoft.com.</w:t>
       </w:r>
     </w:p>
     <w:p/>
     <w:p>
       <w:r>
-        <w:t xml:space="preserve">                Phản hồi chậm nhất trong vòng 24h"</w:t>
+        <w:t xml:space="preserve">                Phản </w:t>
+      </w:r>
+      <w:proofErr w:type="spellStart"/>
+      <w:r>
+        <w:t>hồi</w:t>
+      </w:r>
+      <w:proofErr w:type="spellEnd"/>
+      <w:r>
+        <w:t xml:space="preserve"> </w:t>
+      </w:r>
+      <w:proofErr w:type="spellStart"/>
+      <w:r>
+        <w:t>chậm</w:t>
+      </w:r>
+      <w:proofErr w:type="spellEnd"/>
+      <w:r>
+        <w:t xml:space="preserve"> </w:t>
+      </w:r>
+      <w:proofErr w:type="spellStart"/>
+      <w:r>
+        <w:t>nhất</w:t>
+      </w:r>
+      <w:proofErr w:type="spellEnd"/>
+      <w:r>
+        <w:t xml:space="preserve"> </w:t>
+      </w:r>
+      <w:proofErr w:type="spellStart"/>
+      <w:r>
+        <w:t>trong</w:t>
+      </w:r>
+      <w:proofErr w:type="spellEnd"/>
+      <w:r>
+        <w:t xml:space="preserve"> </w:t>
+      </w:r>
+      <w:proofErr w:type="spellStart"/>
+      <w:r>
+        <w:t>vòng</w:t>
+      </w:r>
+      <w:proofErr w:type="spellEnd"/>
+      <w:r>
+        <w:t xml:space="preserve"> 24h"</w:t>
       </w:r>
     </w:p>
     <w:p>
@@ -1194,33 +1982,545 @@
         <w:rPr>
           <w:color w:val="EE0000"/>
         </w:rPr>
-        <w:t xml:space="preserve"> "Hồ sơ bị từ chối</w:t>
-      </w:r>
-    </w:p>
-    <w:p>
-      <w:pPr>
-        <w:rPr>
-          <w:color w:val="EE0000"/>
-        </w:rPr>
-      </w:pPr>
-      <w:r>
-        <w:rPr>
-          <w:color w:val="EE0000"/>
-        </w:rPr>
-        <w:t xml:space="preserve">                Lý do: Chụp lại ảnh CCCD.</w:t>
-      </w:r>
-    </w:p>
-    <w:p>
-      <w:pPr>
-        <w:rPr>
-          <w:color w:val="EE0000"/>
-        </w:rPr>
-      </w:pPr>
-      <w:r>
-        <w:rPr>
-          <w:color w:val="EE0000"/>
-        </w:rPr>
-        <w:t xml:space="preserve">                Hệ thống không thể xác thực một số thông tin của bạn. Vui lòng kiểm tra lại lý do trên và cập nhật hồ sơ chính xác trước khi gửi lại."</w:t>
+        <w:t xml:space="preserve"> "</w:t>
+      </w:r>
+      <w:proofErr w:type="spellStart"/>
+      <w:r>
+        <w:rPr>
+          <w:color w:val="EE0000"/>
+        </w:rPr>
+        <w:t>Hồ</w:t>
+      </w:r>
+      <w:proofErr w:type="spellEnd"/>
+      <w:r>
+        <w:rPr>
+          <w:color w:val="EE0000"/>
+        </w:rPr>
+        <w:t xml:space="preserve"> </w:t>
+      </w:r>
+      <w:proofErr w:type="spellStart"/>
+      <w:r>
+        <w:rPr>
+          <w:color w:val="EE0000"/>
+        </w:rPr>
+        <w:t>sơ</w:t>
+      </w:r>
+      <w:proofErr w:type="spellEnd"/>
+      <w:r>
+        <w:rPr>
+          <w:color w:val="EE0000"/>
+        </w:rPr>
+        <w:t xml:space="preserve"> </w:t>
+      </w:r>
+      <w:proofErr w:type="spellStart"/>
+      <w:r>
+        <w:rPr>
+          <w:color w:val="EE0000"/>
+        </w:rPr>
+        <w:t>bị</w:t>
+      </w:r>
+      <w:proofErr w:type="spellEnd"/>
+      <w:r>
+        <w:rPr>
+          <w:color w:val="EE0000"/>
+        </w:rPr>
+        <w:t xml:space="preserve"> </w:t>
+      </w:r>
+      <w:proofErr w:type="spellStart"/>
+      <w:r>
+        <w:rPr>
+          <w:color w:val="EE0000"/>
+        </w:rPr>
+        <w:t>từ</w:t>
+      </w:r>
+      <w:proofErr w:type="spellEnd"/>
+      <w:r>
+        <w:rPr>
+          <w:color w:val="EE0000"/>
+        </w:rPr>
+        <w:t xml:space="preserve"> </w:t>
+      </w:r>
+      <w:proofErr w:type="spellStart"/>
+      <w:r>
+        <w:rPr>
+          <w:color w:val="EE0000"/>
+        </w:rPr>
+        <w:t>chối</w:t>
+      </w:r>
+      <w:proofErr w:type="spellEnd"/>
+    </w:p>
+    <w:p>
+      <w:pPr>
+        <w:rPr>
+          <w:color w:val="EE0000"/>
+        </w:rPr>
+      </w:pPr>
+      <w:r>
+        <w:rPr>
+          <w:color w:val="EE0000"/>
+        </w:rPr>
+        <w:t xml:space="preserve">                Lý </w:t>
+      </w:r>
+      <w:proofErr w:type="gramStart"/>
+      <w:r>
+        <w:rPr>
+          <w:color w:val="EE0000"/>
+        </w:rPr>
+        <w:t>do</w:t>
+      </w:r>
+      <w:proofErr w:type="gramEnd"/>
+      <w:r>
+        <w:rPr>
+          <w:color w:val="EE0000"/>
+        </w:rPr>
+        <w:t xml:space="preserve">: </w:t>
+      </w:r>
+      <w:proofErr w:type="spellStart"/>
+      <w:r>
+        <w:rPr>
+          <w:color w:val="EE0000"/>
+        </w:rPr>
+        <w:t>Chụp</w:t>
+      </w:r>
+      <w:proofErr w:type="spellEnd"/>
+      <w:r>
+        <w:rPr>
+          <w:color w:val="EE0000"/>
+        </w:rPr>
+        <w:t xml:space="preserve"> </w:t>
+      </w:r>
+      <w:proofErr w:type="spellStart"/>
+      <w:r>
+        <w:rPr>
+          <w:color w:val="EE0000"/>
+        </w:rPr>
+        <w:t>lại</w:t>
+      </w:r>
+      <w:proofErr w:type="spellEnd"/>
+      <w:r>
+        <w:rPr>
+          <w:color w:val="EE0000"/>
+        </w:rPr>
+        <w:t xml:space="preserve"> </w:t>
+      </w:r>
+      <w:proofErr w:type="spellStart"/>
+      <w:r>
+        <w:rPr>
+          <w:color w:val="EE0000"/>
+        </w:rPr>
+        <w:t>ảnh</w:t>
+      </w:r>
+      <w:proofErr w:type="spellEnd"/>
+      <w:r>
+        <w:rPr>
+          <w:color w:val="EE0000"/>
+        </w:rPr>
+        <w:t xml:space="preserve"> CCCD.</w:t>
+      </w:r>
+    </w:p>
+    <w:p>
+      <w:pPr>
+        <w:rPr>
+          <w:color w:val="EE0000"/>
+        </w:rPr>
+      </w:pPr>
+      <w:r>
+        <w:rPr>
+          <w:color w:val="EE0000"/>
+        </w:rPr>
+        <w:t xml:space="preserve">                </w:t>
+      </w:r>
+      <w:proofErr w:type="spellStart"/>
+      <w:r>
+        <w:rPr>
+          <w:color w:val="EE0000"/>
+        </w:rPr>
+        <w:t>Hệ</w:t>
+      </w:r>
+      <w:proofErr w:type="spellEnd"/>
+      <w:r>
+        <w:rPr>
+          <w:color w:val="EE0000"/>
+        </w:rPr>
+        <w:t xml:space="preserve"> </w:t>
+      </w:r>
+      <w:proofErr w:type="spellStart"/>
+      <w:r>
+        <w:rPr>
+          <w:color w:val="EE0000"/>
+        </w:rPr>
+        <w:t>thống</w:t>
+      </w:r>
+      <w:proofErr w:type="spellEnd"/>
+      <w:r>
+        <w:rPr>
+          <w:color w:val="EE0000"/>
+        </w:rPr>
+        <w:t xml:space="preserve"> </w:t>
+      </w:r>
+      <w:proofErr w:type="spellStart"/>
+      <w:r>
+        <w:rPr>
+          <w:color w:val="EE0000"/>
+        </w:rPr>
+        <w:t>không</w:t>
+      </w:r>
+      <w:proofErr w:type="spellEnd"/>
+      <w:r>
+        <w:rPr>
+          <w:color w:val="EE0000"/>
+        </w:rPr>
+        <w:t xml:space="preserve"> </w:t>
+      </w:r>
+      <w:proofErr w:type="spellStart"/>
+      <w:r>
+        <w:rPr>
+          <w:color w:val="EE0000"/>
+        </w:rPr>
+        <w:t>thể</w:t>
+      </w:r>
+      <w:proofErr w:type="spellEnd"/>
+      <w:r>
+        <w:rPr>
+          <w:color w:val="EE0000"/>
+        </w:rPr>
+        <w:t xml:space="preserve"> </w:t>
+      </w:r>
+      <w:proofErr w:type="spellStart"/>
+      <w:r>
+        <w:rPr>
+          <w:color w:val="EE0000"/>
+        </w:rPr>
+        <w:t>xác</w:t>
+      </w:r>
+      <w:proofErr w:type="spellEnd"/>
+      <w:r>
+        <w:rPr>
+          <w:color w:val="EE0000"/>
+        </w:rPr>
+        <w:t xml:space="preserve"> </w:t>
+      </w:r>
+      <w:proofErr w:type="spellStart"/>
+      <w:r>
+        <w:rPr>
+          <w:color w:val="EE0000"/>
+        </w:rPr>
+        <w:t>thực</w:t>
+      </w:r>
+      <w:proofErr w:type="spellEnd"/>
+      <w:r>
+        <w:rPr>
+          <w:color w:val="EE0000"/>
+        </w:rPr>
+        <w:t xml:space="preserve"> </w:t>
+      </w:r>
+      <w:proofErr w:type="spellStart"/>
+      <w:r>
+        <w:rPr>
+          <w:color w:val="EE0000"/>
+        </w:rPr>
+        <w:t>một</w:t>
+      </w:r>
+      <w:proofErr w:type="spellEnd"/>
+      <w:r>
+        <w:rPr>
+          <w:color w:val="EE0000"/>
+        </w:rPr>
+        <w:t xml:space="preserve"> </w:t>
+      </w:r>
+      <w:proofErr w:type="spellStart"/>
+      <w:r>
+        <w:rPr>
+          <w:color w:val="EE0000"/>
+        </w:rPr>
+        <w:t>số</w:t>
+      </w:r>
+      <w:proofErr w:type="spellEnd"/>
+      <w:r>
+        <w:rPr>
+          <w:color w:val="EE0000"/>
+        </w:rPr>
+        <w:t xml:space="preserve"> </w:t>
+      </w:r>
+      <w:proofErr w:type="spellStart"/>
+      <w:r>
+        <w:rPr>
+          <w:color w:val="EE0000"/>
+        </w:rPr>
+        <w:t>thông</w:t>
+      </w:r>
+      <w:proofErr w:type="spellEnd"/>
+      <w:r>
+        <w:rPr>
+          <w:color w:val="EE0000"/>
+        </w:rPr>
+        <w:t xml:space="preserve"> tin </w:t>
+      </w:r>
+      <w:proofErr w:type="spellStart"/>
+      <w:r>
+        <w:rPr>
+          <w:color w:val="EE0000"/>
+        </w:rPr>
+        <w:t>của</w:t>
+      </w:r>
+      <w:proofErr w:type="spellEnd"/>
+      <w:r>
+        <w:rPr>
+          <w:color w:val="EE0000"/>
+        </w:rPr>
+        <w:t xml:space="preserve"> </w:t>
+      </w:r>
+      <w:proofErr w:type="spellStart"/>
+      <w:r>
+        <w:rPr>
+          <w:color w:val="EE0000"/>
+        </w:rPr>
+        <w:t>bạn</w:t>
+      </w:r>
+      <w:proofErr w:type="spellEnd"/>
+      <w:r>
+        <w:rPr>
+          <w:color w:val="EE0000"/>
+        </w:rPr>
+        <w:t xml:space="preserve">. Vui </w:t>
+      </w:r>
+      <w:proofErr w:type="spellStart"/>
+      <w:r>
+        <w:rPr>
+          <w:color w:val="EE0000"/>
+        </w:rPr>
+        <w:t>lòng</w:t>
+      </w:r>
+      <w:proofErr w:type="spellEnd"/>
+      <w:r>
+        <w:rPr>
+          <w:color w:val="EE0000"/>
+        </w:rPr>
+        <w:t xml:space="preserve"> </w:t>
+      </w:r>
+      <w:proofErr w:type="spellStart"/>
+      <w:r>
+        <w:rPr>
+          <w:color w:val="EE0000"/>
+        </w:rPr>
+        <w:t>kiểm</w:t>
+      </w:r>
+      <w:proofErr w:type="spellEnd"/>
+      <w:r>
+        <w:rPr>
+          <w:color w:val="EE0000"/>
+        </w:rPr>
+        <w:t xml:space="preserve"> </w:t>
+      </w:r>
+      <w:proofErr w:type="spellStart"/>
+      <w:r>
+        <w:rPr>
+          <w:color w:val="EE0000"/>
+        </w:rPr>
+        <w:t>tra</w:t>
+      </w:r>
+      <w:proofErr w:type="spellEnd"/>
+      <w:r>
+        <w:rPr>
+          <w:color w:val="EE0000"/>
+        </w:rPr>
+        <w:t xml:space="preserve"> </w:t>
+      </w:r>
+      <w:proofErr w:type="spellStart"/>
+      <w:r>
+        <w:rPr>
+          <w:color w:val="EE0000"/>
+        </w:rPr>
+        <w:t>lại</w:t>
+      </w:r>
+      <w:proofErr w:type="spellEnd"/>
+      <w:r>
+        <w:rPr>
+          <w:color w:val="EE0000"/>
+        </w:rPr>
+        <w:t xml:space="preserve"> </w:t>
+      </w:r>
+      <w:proofErr w:type="spellStart"/>
+      <w:r>
+        <w:rPr>
+          <w:color w:val="EE0000"/>
+        </w:rPr>
+        <w:t>lý</w:t>
+      </w:r>
+      <w:proofErr w:type="spellEnd"/>
+      <w:r>
+        <w:rPr>
+          <w:color w:val="EE0000"/>
+        </w:rPr>
+        <w:t xml:space="preserve"> do </w:t>
+      </w:r>
+      <w:proofErr w:type="spellStart"/>
+      <w:r>
+        <w:rPr>
+          <w:color w:val="EE0000"/>
+        </w:rPr>
+        <w:t>trên</w:t>
+      </w:r>
+      <w:proofErr w:type="spellEnd"/>
+      <w:r>
+        <w:rPr>
+          <w:color w:val="EE0000"/>
+        </w:rPr>
+        <w:t xml:space="preserve"> </w:t>
+      </w:r>
+      <w:proofErr w:type="spellStart"/>
+      <w:r>
+        <w:rPr>
+          <w:color w:val="EE0000"/>
+        </w:rPr>
+        <w:t>và</w:t>
+      </w:r>
+      <w:proofErr w:type="spellEnd"/>
+      <w:r>
+        <w:rPr>
+          <w:color w:val="EE0000"/>
+        </w:rPr>
+        <w:t xml:space="preserve"> </w:t>
+      </w:r>
+      <w:proofErr w:type="spellStart"/>
+      <w:r>
+        <w:rPr>
+          <w:color w:val="EE0000"/>
+        </w:rPr>
+        <w:t>cập</w:t>
+      </w:r>
+      <w:proofErr w:type="spellEnd"/>
+      <w:r>
+        <w:rPr>
+          <w:color w:val="EE0000"/>
+        </w:rPr>
+        <w:t xml:space="preserve"> </w:t>
+      </w:r>
+      <w:proofErr w:type="spellStart"/>
+      <w:r>
+        <w:rPr>
+          <w:color w:val="EE0000"/>
+        </w:rPr>
+        <w:t>nhật</w:t>
+      </w:r>
+      <w:proofErr w:type="spellEnd"/>
+      <w:r>
+        <w:rPr>
+          <w:color w:val="EE0000"/>
+        </w:rPr>
+        <w:t xml:space="preserve"> </w:t>
+      </w:r>
+      <w:proofErr w:type="spellStart"/>
+      <w:r>
+        <w:rPr>
+          <w:color w:val="EE0000"/>
+        </w:rPr>
+        <w:t>hồ</w:t>
+      </w:r>
+      <w:proofErr w:type="spellEnd"/>
+      <w:r>
+        <w:rPr>
+          <w:color w:val="EE0000"/>
+        </w:rPr>
+        <w:t xml:space="preserve"> </w:t>
+      </w:r>
+      <w:proofErr w:type="spellStart"/>
+      <w:r>
+        <w:rPr>
+          <w:color w:val="EE0000"/>
+        </w:rPr>
+        <w:t>sơ</w:t>
+      </w:r>
+      <w:proofErr w:type="spellEnd"/>
+      <w:r>
+        <w:rPr>
+          <w:color w:val="EE0000"/>
+        </w:rPr>
+        <w:t xml:space="preserve"> </w:t>
+      </w:r>
+      <w:proofErr w:type="spellStart"/>
+      <w:r>
+        <w:rPr>
+          <w:color w:val="EE0000"/>
+        </w:rPr>
+        <w:t>chính</w:t>
+      </w:r>
+      <w:proofErr w:type="spellEnd"/>
+      <w:r>
+        <w:rPr>
+          <w:color w:val="EE0000"/>
+        </w:rPr>
+        <w:t xml:space="preserve"> </w:t>
+      </w:r>
+      <w:proofErr w:type="spellStart"/>
+      <w:r>
+        <w:rPr>
+          <w:color w:val="EE0000"/>
+        </w:rPr>
+        <w:t>xác</w:t>
+      </w:r>
+      <w:proofErr w:type="spellEnd"/>
+      <w:r>
+        <w:rPr>
+          <w:color w:val="EE0000"/>
+        </w:rPr>
+        <w:t xml:space="preserve"> </w:t>
+      </w:r>
+      <w:proofErr w:type="spellStart"/>
+      <w:r>
+        <w:rPr>
+          <w:color w:val="EE0000"/>
+        </w:rPr>
+        <w:t>trước</w:t>
+      </w:r>
+      <w:proofErr w:type="spellEnd"/>
+      <w:r>
+        <w:rPr>
+          <w:color w:val="EE0000"/>
+        </w:rPr>
+        <w:t xml:space="preserve"> </w:t>
+      </w:r>
+      <w:proofErr w:type="spellStart"/>
+      <w:r>
+        <w:rPr>
+          <w:color w:val="EE0000"/>
+        </w:rPr>
+        <w:t>khi</w:t>
+      </w:r>
+      <w:proofErr w:type="spellEnd"/>
+      <w:r>
+        <w:rPr>
+          <w:color w:val="EE0000"/>
+        </w:rPr>
+        <w:t xml:space="preserve"> </w:t>
+      </w:r>
+      <w:proofErr w:type="spellStart"/>
+      <w:r>
+        <w:rPr>
+          <w:color w:val="EE0000"/>
+        </w:rPr>
+        <w:t>gửi</w:t>
+      </w:r>
+      <w:proofErr w:type="spellEnd"/>
+      <w:r>
+        <w:rPr>
+          <w:color w:val="EE0000"/>
+        </w:rPr>
+        <w:t xml:space="preserve"> </w:t>
+      </w:r>
+      <w:proofErr w:type="spellStart"/>
+      <w:r>
+        <w:rPr>
+          <w:color w:val="EE0000"/>
+        </w:rPr>
+        <w:t>lại</w:t>
+      </w:r>
+      <w:proofErr w:type="spellEnd"/>
+      <w:r>
+        <w:rPr>
+          <w:color w:val="EE0000"/>
+        </w:rPr>
+        <w:t>."</w:t>
       </w:r>
     </w:p>
     <w:p/>
@@ -1237,6 +2537,9 @@
     </w:p>
     <w:p/>
     <w:p>
+      <w:pPr>
+        <w:jc w:val="center"/>
+      </w:pPr>
       <w:r>
         <w:rPr>
           <w:noProof/>
@@ -1258,7 +2561,7 @@
                     <pic:cNvPicPr/>
                   </pic:nvPicPr>
                   <pic:blipFill>
-                    <a:blip r:embed="rId22"/>
+                    <a:blip r:embed="rId25"/>
                     <a:stretch>
                       <a:fillRect/>
                     </a:stretch>
@@ -1318,7 +2621,7 @@
                     <pic:cNvPicPr/>
                   </pic:nvPicPr>
                   <pic:blipFill>
-                    <a:blip r:embed="rId23"/>
+                    <a:blip r:embed="rId26"/>
                     <a:stretch>
                       <a:fillRect/>
                     </a:stretch>
@@ -1379,7 +2682,7 @@
                     <pic:cNvPicPr/>
                   </pic:nvPicPr>
                   <pic:blipFill>
-                    <a:blip r:embed="rId24"/>
+                    <a:blip r:embed="rId27"/>
                     <a:stretch>
                       <a:fillRect/>
                     </a:stretch>
@@ -1434,7 +2737,7 @@
                     <pic:cNvPicPr/>
                   </pic:nvPicPr>
                   <pic:blipFill>
-                    <a:blip r:embed="rId25"/>
+                    <a:blip r:embed="rId28"/>
                     <a:stretch>
                       <a:fillRect/>
                     </a:stretch>
@@ -1506,7 +2809,7 @@
                     <pic:cNvPicPr/>
                   </pic:nvPicPr>
                   <pic:blipFill>
-                    <a:blip r:embed="rId26"/>
+                    <a:blip r:embed="rId29"/>
                     <a:stretch>
                       <a:fillRect/>
                     </a:stretch>
@@ -1561,7 +2864,7 @@
                     <pic:cNvPicPr/>
                   </pic:nvPicPr>
                   <pic:blipFill>
-                    <a:blip r:embed="rId27"/>
+                    <a:blip r:embed="rId30"/>
                     <a:stretch>
                       <a:fillRect/>
                     </a:stretch>
@@ -1585,7 +2888,31 @@
     <w:p/>
     <w:p>
       <w:r>
-        <w:t>Danh sách sản phẩm:</w:t>
+        <w:t xml:space="preserve">Danh </w:t>
+      </w:r>
+      <w:proofErr w:type="spellStart"/>
+      <w:r>
+        <w:t>sách</w:t>
+      </w:r>
+      <w:proofErr w:type="spellEnd"/>
+      <w:r>
+        <w:t xml:space="preserve"> </w:t>
+      </w:r>
+      <w:proofErr w:type="spellStart"/>
+      <w:r>
+        <w:t>sản</w:t>
+      </w:r>
+      <w:proofErr w:type="spellEnd"/>
+      <w:r>
+        <w:t xml:space="preserve"> </w:t>
+      </w:r>
+      <w:proofErr w:type="spellStart"/>
+      <w:r>
+        <w:t>phẩm</w:t>
+      </w:r>
+      <w:proofErr w:type="spellEnd"/>
+      <w:r>
+        <w:t>:</w:t>
       </w:r>
     </w:p>
     <w:p>
@@ -1609,7 +2936,7 @@
                     <pic:cNvPicPr/>
                   </pic:nvPicPr>
                   <pic:blipFill>
-                    <a:blip r:embed="rId28"/>
+                    <a:blip r:embed="rId31"/>
                     <a:stretch>
                       <a:fillRect/>
                     </a:stretch>
@@ -1633,7 +2960,23 @@
     <w:p/>
     <w:p>
       <w:r>
-        <w:t xml:space="preserve">Quản lý đơn </w:t>
+        <w:t xml:space="preserve">Quản </w:t>
+      </w:r>
+      <w:proofErr w:type="spellStart"/>
+      <w:r>
+        <w:t>lý</w:t>
+      </w:r>
+      <w:proofErr w:type="spellEnd"/>
+      <w:r>
+        <w:t xml:space="preserve"> </w:t>
+      </w:r>
+      <w:proofErr w:type="spellStart"/>
+      <w:r>
+        <w:t>đơn</w:t>
+      </w:r>
+      <w:proofErr w:type="spellEnd"/>
+      <w:r>
+        <w:t xml:space="preserve"> </w:t>
       </w:r>
       <w:r>
         <w:t>hang:</w:t>
@@ -1662,7 +3005,7 @@
                     <pic:cNvPicPr/>
                   </pic:nvPicPr>
                   <pic:blipFill>
-                    <a:blip r:embed="rId29"/>
+                    <a:blip r:embed="rId32"/>
                     <a:stretch>
                       <a:fillRect/>
                     </a:stretch>
@@ -1685,12 +3028,28 @@
     </w:p>
     <w:p/>
     <w:p>
-      <w:r>
-        <w:t>Thiết lập shop:</w:t>
-      </w:r>
-    </w:p>
-    <w:p>
-      <w:r>
+      <w:proofErr w:type="spellStart"/>
+      <w:r>
+        <w:t>Thiết</w:t>
+      </w:r>
+      <w:proofErr w:type="spellEnd"/>
+      <w:r>
+        <w:t xml:space="preserve"> </w:t>
+      </w:r>
+      <w:proofErr w:type="spellStart"/>
+      <w:r>
+        <w:t>lập</w:t>
+      </w:r>
+      <w:proofErr w:type="spellEnd"/>
+      <w:r>
+        <w:t xml:space="preserve"> shop:</w:t>
+      </w:r>
+    </w:p>
+    <w:p>
+      <w:r>
+        <w:rPr>
+          <w:noProof/>
+        </w:rPr>
         <w:drawing>
           <wp:inline distT="0" distB="0" distL="0" distR="0" wp14:anchorId="5CF0D2AB" wp14:editId="46ACCEA2">
             <wp:extent cx="5943600" cy="2814955"/>
@@ -1707,7 +3066,7 @@
                     <pic:cNvPicPr/>
                   </pic:nvPicPr>
                   <pic:blipFill>
-                    <a:blip r:embed="rId30"/>
+                    <a:blip r:embed="rId33"/>
                     <a:stretch>
                       <a:fillRect/>
                     </a:stretch>
@@ -1735,6 +3094,9 @@
     </w:p>
     <w:p>
       <w:r>
+        <w:rPr>
+          <w:noProof/>
+        </w:rPr>
         <w:lastRenderedPageBreak/>
         <w:drawing>
           <wp:inline distT="0" distB="0" distL="0" distR="0" wp14:anchorId="3DBF79FC" wp14:editId="145C3BD9">
@@ -1752,7 +3114,7 @@
                     <pic:cNvPicPr/>
                   </pic:nvPicPr>
                   <pic:blipFill>
-                    <a:blip r:embed="rId31"/>
+                    <a:blip r:embed="rId34"/>
                     <a:stretch>
                       <a:fillRect/>
                     </a:stretch>
@@ -1783,7 +3145,15 @@
         </w:numPr>
       </w:pPr>
       <w:r>
-        <w:t>Money withdraw request: Seller can ask ainetsoft for a payment withdraw with the details form as below</w:t>
+        <w:t xml:space="preserve">Money withdraw request: Seller can ask </w:t>
+      </w:r>
+      <w:proofErr w:type="spellStart"/>
+      <w:r>
+        <w:t>ainetsoft</w:t>
+      </w:r>
+      <w:proofErr w:type="spellEnd"/>
+      <w:r>
+        <w:t xml:space="preserve"> for a payment withdraw with the details form as below</w:t>
       </w:r>
     </w:p>
     <w:p>
@@ -1807,7 +3177,7 @@
                     <pic:cNvPicPr/>
                   </pic:nvPicPr>
                   <pic:blipFill>
-                    <a:blip r:embed="rId32"/>
+                    <a:blip r:embed="rId35"/>
                     <a:stretch>
                       <a:fillRect/>
                     </a:stretch>
@@ -1864,7 +3234,7 @@
                     <pic:cNvPicPr/>
                   </pic:nvPicPr>
                   <pic:blipFill>
-                    <a:blip r:embed="rId33"/>
+                    <a:blip r:embed="rId36"/>
                     <a:stretch>
                       <a:fillRect/>
                     </a:stretch>
@@ -1936,7 +3306,7 @@
                     <pic:cNvPicPr/>
                   </pic:nvPicPr>
                   <pic:blipFill>
-                    <a:blip r:embed="rId34"/>
+                    <a:blip r:embed="rId37"/>
                     <a:stretch>
                       <a:fillRect/>
                     </a:stretch>
@@ -1992,7 +3362,7 @@
                     <pic:cNvPicPr/>
                   </pic:nvPicPr>
                   <pic:blipFill>
-                    <a:blip r:embed="rId35"/>
+                    <a:blip r:embed="rId38"/>
                     <a:stretch>
                       <a:fillRect/>
                     </a:stretch>
@@ -2052,7 +3422,7 @@
                     <pic:cNvPicPr/>
                   </pic:nvPicPr>
                   <pic:blipFill>
-                    <a:blip r:embed="rId36"/>
+                    <a:blip r:embed="rId39"/>
                     <a:stretch>
                       <a:fillRect/>
                     </a:stretch>
@@ -2106,7 +3476,7 @@
                     <pic:cNvPicPr/>
                   </pic:nvPicPr>
                   <pic:blipFill>
-                    <a:blip r:embed="rId37"/>
+                    <a:blip r:embed="rId40"/>
                     <a:stretch>
                       <a:fillRect/>
                     </a:stretch>
@@ -2147,8 +3517,21 @@
           <w:numId w:val="4"/>
         </w:numPr>
       </w:pPr>
-      <w:r>
-        <w:t>Tổng quan Admin page: This shows the summarization of all the important parts and will be details one Admin user click to it</w:t>
+      <w:proofErr w:type="spellStart"/>
+      <w:r>
+        <w:t>Tổng</w:t>
+      </w:r>
+      <w:proofErr w:type="spellEnd"/>
+      <w:r>
+        <w:t xml:space="preserve"> </w:t>
+      </w:r>
+      <w:proofErr w:type="spellStart"/>
+      <w:r>
+        <w:t>quan</w:t>
+      </w:r>
+      <w:proofErr w:type="spellEnd"/>
+      <w:r>
+        <w:t xml:space="preserve"> Admin page: This shows the summarization of all the important parts and will be details one Admin user click to it</w:t>
       </w:r>
     </w:p>
     <w:p>
@@ -2172,7 +3555,7 @@
                     <pic:cNvPicPr/>
                   </pic:nvPicPr>
                   <pic:blipFill>
-                    <a:blip r:embed="rId38"/>
+                    <a:blip r:embed="rId41"/>
                     <a:stretch>
                       <a:fillRect/>
                     </a:stretch>
@@ -2201,8 +3584,21 @@
           <w:numId w:val="4"/>
         </w:numPr>
       </w:pPr>
-      <w:r>
-        <w:t>Tổng người dung:</w:t>
+      <w:proofErr w:type="spellStart"/>
+      <w:r>
+        <w:t>Tổng</w:t>
+      </w:r>
+      <w:proofErr w:type="spellEnd"/>
+      <w:r>
+        <w:t xml:space="preserve"> </w:t>
+      </w:r>
+      <w:proofErr w:type="spellStart"/>
+      <w:r>
+        <w:t>người</w:t>
+      </w:r>
+      <w:proofErr w:type="spellEnd"/>
+      <w:r>
+        <w:t xml:space="preserve"> dung:</w:t>
       </w:r>
     </w:p>
     <w:p>
@@ -2213,9 +3609,22 @@
           <w:numId w:val="4"/>
         </w:numPr>
       </w:pPr>
+      <w:proofErr w:type="spellStart"/>
       <w:r>
         <w:lastRenderedPageBreak/>
-        <w:t>Sản phẩm: Show all products which the system is having. There is a quick access to the Seller pages</w:t>
+        <w:t>Sản</w:t>
+      </w:r>
+      <w:proofErr w:type="spellEnd"/>
+      <w:r>
+        <w:t xml:space="preserve"> </w:t>
+      </w:r>
+      <w:proofErr w:type="spellStart"/>
+      <w:r>
+        <w:t>phẩm</w:t>
+      </w:r>
+      <w:proofErr w:type="spellEnd"/>
+      <w:r>
+        <w:t>: Show all products which the system is having. There is a quick access to the Seller pages</w:t>
       </w:r>
     </w:p>
     <w:p>
@@ -2239,7 +3648,7 @@
                     <pic:cNvPicPr/>
                   </pic:nvPicPr>
                   <pic:blipFill>
-                    <a:blip r:embed="rId39"/>
+                    <a:blip r:embed="rId42"/>
                     <a:stretch>
                       <a:fillRect/>
                     </a:stretch>
@@ -2269,8 +3678,21 @@
           <w:numId w:val="4"/>
         </w:numPr>
       </w:pPr>
-      <w:r>
-        <w:t>Chờ duyệt SP: This contains all pending shop product and being waiting the admin page to approve</w:t>
+      <w:proofErr w:type="spellStart"/>
+      <w:r>
+        <w:t>Chờ</w:t>
+      </w:r>
+      <w:proofErr w:type="spellEnd"/>
+      <w:r>
+        <w:t xml:space="preserve"> </w:t>
+      </w:r>
+      <w:proofErr w:type="spellStart"/>
+      <w:r>
+        <w:t>duyệt</w:t>
+      </w:r>
+      <w:proofErr w:type="spellEnd"/>
+      <w:r>
+        <w:t xml:space="preserve"> SP: This contains all pending shop product and being waiting the admin page to approve</w:t>
       </w:r>
       <w:r>
         <w:br/>
@@ -2295,7 +3717,7 @@
                     <pic:cNvPicPr/>
                   </pic:nvPicPr>
                   <pic:blipFill>
-                    <a:blip r:embed="rId40"/>
+                    <a:blip r:embed="rId43"/>
                     <a:stretch>
                       <a:fillRect/>
                     </a:stretch>
@@ -2324,9 +3746,22 @@
           <w:numId w:val="4"/>
         </w:numPr>
       </w:pPr>
+      <w:proofErr w:type="spellStart"/>
       <w:r>
         <w:lastRenderedPageBreak/>
-        <w:t>Chờ duyệt shop: This is the pending status of the users requesting for become the seller.</w:t>
+        <w:t>Chờ</w:t>
+      </w:r>
+      <w:proofErr w:type="spellEnd"/>
+      <w:r>
+        <w:t xml:space="preserve"> </w:t>
+      </w:r>
+      <w:proofErr w:type="spellStart"/>
+      <w:r>
+        <w:t>duyệt</w:t>
+      </w:r>
+      <w:proofErr w:type="spellEnd"/>
+      <w:r>
+        <w:t xml:space="preserve"> shop: This is the pending status of the users requesting for become the seller.</w:t>
       </w:r>
     </w:p>
     <w:p>
@@ -2350,7 +3785,7 @@
                     <pic:cNvPicPr/>
                   </pic:nvPicPr>
                   <pic:blipFill>
-                    <a:blip r:embed="rId41"/>
+                    <a:blip r:embed="rId44"/>
                     <a:stretch>
                       <a:fillRect/>
                     </a:stretch>
@@ -2380,7 +3815,23 @@
         </w:numPr>
       </w:pPr>
       <w:r>
-        <w:t xml:space="preserve">Details of “Người dùng”: This shows very details of the user and many activities related to User management such as Lock, promote user to Admin, </w:t>
+        <w:t>Details of “</w:t>
+      </w:r>
+      <w:proofErr w:type="spellStart"/>
+      <w:r>
+        <w:t>Người</w:t>
+      </w:r>
+      <w:proofErr w:type="spellEnd"/>
+      <w:r>
+        <w:t xml:space="preserve"> </w:t>
+      </w:r>
+      <w:proofErr w:type="spellStart"/>
+      <w:r>
+        <w:t>dùng</w:t>
+      </w:r>
+      <w:proofErr w:type="spellEnd"/>
+      <w:r>
+        <w:t xml:space="preserve">”: This shows very details of the user and many activities related to User management such as Lock, promote user to Admin, </w:t>
       </w:r>
       <w:r>
         <w:t>denote user seller back to normal users…</w:t>
@@ -2420,7 +3871,7 @@
                     <pic:cNvPicPr/>
                   </pic:nvPicPr>
                   <pic:blipFill>
-                    <a:blip r:embed="rId42"/>
+                    <a:blip r:embed="rId45"/>
                     <a:stretch>
                       <a:fillRect/>
                     </a:stretch>
@@ -2470,6 +3921,9 @@
     </w:p>
     <w:p>
       <w:r>
+        <w:rPr>
+          <w:noProof/>
+        </w:rPr>
         <w:lastRenderedPageBreak/>
         <w:drawing>
           <wp:inline distT="0" distB="0" distL="0" distR="0" wp14:anchorId="6B86C3D4" wp14:editId="570808DF">
@@ -2487,7 +3941,7 @@
                     <pic:cNvPicPr/>
                   </pic:nvPicPr>
                   <pic:blipFill>
-                    <a:blip r:embed="rId43"/>
+                    <a:blip r:embed="rId46"/>
                     <a:stretch>
                       <a:fillRect/>
                     </a:stretch>
@@ -2542,7 +3996,7 @@
                     <pic:cNvPicPr/>
                   </pic:nvPicPr>
                   <pic:blipFill>
-                    <a:blip r:embed="rId44"/>
+                    <a:blip r:embed="rId47"/>
                     <a:stretch>
                       <a:fillRect/>
                     </a:stretch>
@@ -2596,7 +4050,7 @@
                     <pic:cNvPicPr/>
                   </pic:nvPicPr>
                   <pic:blipFill>
-                    <a:blip r:embed="rId45"/>
+                    <a:blip r:embed="rId48"/>
                     <a:stretch>
                       <a:fillRect/>
                     </a:stretch>
@@ -2650,7 +4104,7 @@
                     <pic:cNvPicPr/>
                   </pic:nvPicPr>
                   <pic:blipFill>
-                    <a:blip r:embed="rId46"/>
+                    <a:blip r:embed="rId49"/>
                     <a:stretch>
                       <a:fillRect/>
                     </a:stretch>
@@ -2705,7 +4159,7 @@
                     <pic:cNvPicPr/>
                   </pic:nvPicPr>
                   <pic:blipFill>
-                    <a:blip r:embed="rId47"/>
+                    <a:blip r:embed="rId50"/>
                     <a:stretch>
                       <a:fillRect/>
                     </a:stretch>
@@ -2734,8 +4188,45 @@
           <w:numId w:val="4"/>
         </w:numPr>
       </w:pPr>
-      <w:r>
-        <w:t>Tất cả sảm phẩm: Show all available products from all sellers. This is also has the pagination and quick access to the product owner page (Seller page)</w:t>
+      <w:proofErr w:type="spellStart"/>
+      <w:r>
+        <w:t>Tất</w:t>
+      </w:r>
+      <w:proofErr w:type="spellEnd"/>
+      <w:r>
+        <w:t xml:space="preserve"> </w:t>
+      </w:r>
+      <w:proofErr w:type="spellStart"/>
+      <w:r>
+        <w:t>cả</w:t>
+      </w:r>
+      <w:proofErr w:type="spellEnd"/>
+      <w:r>
+        <w:t xml:space="preserve"> </w:t>
+      </w:r>
+      <w:proofErr w:type="spellStart"/>
+      <w:r>
+        <w:t>sảm</w:t>
+      </w:r>
+      <w:proofErr w:type="spellEnd"/>
+      <w:r>
+        <w:t xml:space="preserve"> </w:t>
+      </w:r>
+      <w:proofErr w:type="spellStart"/>
+      <w:r>
+        <w:t>phẩm</w:t>
+      </w:r>
+      <w:proofErr w:type="spellEnd"/>
+      <w:r>
+        <w:t xml:space="preserve">: Show all available products from all sellers. This </w:t>
+      </w:r>
+      <w:proofErr w:type="gramStart"/>
+      <w:r>
+        <w:t>is also has</w:t>
+      </w:r>
+      <w:proofErr w:type="gramEnd"/>
+      <w:r>
+        <w:t xml:space="preserve"> the pagination and quick access to the product owner page (Seller page)</w:t>
       </w:r>
     </w:p>
     <w:p>
@@ -2759,7 +4250,7 @@
                     <pic:cNvPicPr/>
                   </pic:nvPicPr>
                   <pic:blipFill>
-                    <a:blip r:embed="rId48"/>
+                    <a:blip r:embed="rId51"/>
                     <a:stretch>
                       <a:fillRect/>
                     </a:stretch>
@@ -2789,8 +4280,13 @@
           <w:numId w:val="4"/>
         </w:numPr>
       </w:pPr>
-      <w:r>
-        <w:t xml:space="preserve">Duyệt shop: All seller </w:t>
+      <w:proofErr w:type="spellStart"/>
+      <w:r>
+        <w:t>Duyệt</w:t>
+      </w:r>
+      <w:proofErr w:type="spellEnd"/>
+      <w:r>
+        <w:t xml:space="preserve"> shop: All seller </w:t>
       </w:r>
       <w:r>
         <w:t>products</w:t>
@@ -2821,7 +4317,7 @@
                     <pic:cNvPicPr/>
                   </pic:nvPicPr>
                   <pic:blipFill>
-                    <a:blip r:embed="rId49"/>
+                    <a:blip r:embed="rId52"/>
                     <a:stretch>
                       <a:fillRect/>
                     </a:stretch>
@@ -2850,8 +4346,13 @@
           <w:numId w:val="4"/>
         </w:numPr>
       </w:pPr>
-      <w:r>
-        <w:t xml:space="preserve">Duyệt shop – </w:t>
+      <w:proofErr w:type="spellStart"/>
+      <w:r>
+        <w:t>Duyệt</w:t>
+      </w:r>
+      <w:proofErr w:type="spellEnd"/>
+      <w:r>
+        <w:t xml:space="preserve"> shop – </w:t>
       </w:r>
       <w:r>
         <w:t>Become</w:t>
@@ -2883,7 +4384,7 @@
                     <pic:cNvPicPr/>
                   </pic:nvPicPr>
                   <pic:blipFill>
-                    <a:blip r:embed="rId50"/>
+                    <a:blip r:embed="rId53"/>
                     <a:stretch>
                       <a:fillRect/>
                     </a:stretch>
@@ -2906,7 +4407,15 @@
     </w:p>
     <w:p>
       <w:r>
-        <w:t>The below screenshot tell that the current there is not any pending request to become a seller…</w:t>
+        <w:t xml:space="preserve">The below screenshot </w:t>
+      </w:r>
+      <w:proofErr w:type="gramStart"/>
+      <w:r>
+        <w:t>tell</w:t>
+      </w:r>
+      <w:proofErr w:type="gramEnd"/>
+      <w:r>
+        <w:t xml:space="preserve"> that the current there is not any pending request to become a seller…</w:t>
       </w:r>
     </w:p>
     <w:p>
@@ -2931,7 +4440,7 @@
                     <pic:cNvPicPr/>
                   </pic:nvPicPr>
                   <pic:blipFill>
-                    <a:blip r:embed="rId51"/>
+                    <a:blip r:embed="rId54"/>
                     <a:stretch>
                       <a:fillRect/>
                     </a:stretch>
@@ -2968,6 +4477,9 @@
     </w:p>
     <w:p>
       <w:r>
+        <w:rPr>
+          <w:noProof/>
+        </w:rPr>
         <w:lastRenderedPageBreak/>
         <w:drawing>
           <wp:inline distT="0" distB="0" distL="0" distR="0" wp14:anchorId="6FD8B660" wp14:editId="74DD3FD6">
@@ -2985,7 +4497,7 @@
                     <pic:cNvPicPr/>
                   </pic:nvPicPr>
                   <pic:blipFill>
-                    <a:blip r:embed="rId52"/>
+                    <a:blip r:embed="rId55"/>
                     <a:stretch>
                       <a:fillRect/>
                     </a:stretch>
@@ -3016,8 +4528,21 @@
         </w:numPr>
       </w:pPr>
       <w:r>
-        <w:t>Báo cáo vi phạm</w:t>
-      </w:r>
+        <w:t xml:space="preserve">Báo </w:t>
+      </w:r>
+      <w:proofErr w:type="spellStart"/>
+      <w:r>
+        <w:t>cáo</w:t>
+      </w:r>
+      <w:proofErr w:type="spellEnd"/>
+      <w:r>
+        <w:t xml:space="preserve"> vi </w:t>
+      </w:r>
+      <w:proofErr w:type="spellStart"/>
+      <w:r>
+        <w:t>phạm</w:t>
+      </w:r>
+      <w:proofErr w:type="spellEnd"/>
       <w:r>
         <w:t>:</w:t>
       </w:r>
@@ -3044,7 +4569,7 @@
                     <pic:cNvPicPr/>
                   </pic:nvPicPr>
                   <pic:blipFill>
-                    <a:blip r:embed="rId53"/>
+                    <a:blip r:embed="rId56"/>
                     <a:stretch>
                       <a:fillRect/>
                     </a:stretch>
@@ -3075,8 +4600,29 @@
         </w:numPr>
       </w:pPr>
       <w:r>
-        <w:t>Quản lý đánh giá</w:t>
-      </w:r>
+        <w:t xml:space="preserve">Quản </w:t>
+      </w:r>
+      <w:proofErr w:type="spellStart"/>
+      <w:r>
+        <w:t>lý</w:t>
+      </w:r>
+      <w:proofErr w:type="spellEnd"/>
+      <w:r>
+        <w:t xml:space="preserve"> </w:t>
+      </w:r>
+      <w:proofErr w:type="spellStart"/>
+      <w:r>
+        <w:t>đánh</w:t>
+      </w:r>
+      <w:proofErr w:type="spellEnd"/>
+      <w:r>
+        <w:t xml:space="preserve"> </w:t>
+      </w:r>
+      <w:proofErr w:type="spellStart"/>
+      <w:r>
+        <w:t>giá</w:t>
+      </w:r>
+      <w:proofErr w:type="spellEnd"/>
       <w:r>
         <w:t>:</w:t>
       </w:r>
@@ -3102,7 +4648,7 @@
                     <pic:cNvPicPr/>
                   </pic:nvPicPr>
                   <pic:blipFill>
-                    <a:blip r:embed="rId54"/>
+                    <a:blip r:embed="rId57"/>
                     <a:stretch>
                       <a:fillRect/>
                     </a:stretch>
@@ -3132,7 +4678,23 @@
         </w:numPr>
       </w:pPr>
       <w:r>
-        <w:t>Quản lý nội dung</w:t>
+        <w:t xml:space="preserve">Quản </w:t>
+      </w:r>
+      <w:proofErr w:type="spellStart"/>
+      <w:r>
+        <w:t>lý</w:t>
+      </w:r>
+      <w:proofErr w:type="spellEnd"/>
+      <w:r>
+        <w:t xml:space="preserve"> </w:t>
+      </w:r>
+      <w:proofErr w:type="spellStart"/>
+      <w:r>
+        <w:t>nội</w:t>
+      </w:r>
+      <w:proofErr w:type="spellEnd"/>
+      <w:r>
+        <w:t xml:space="preserve"> dung</w:t>
       </w:r>
       <w:r>
         <w:t>:</w:t>
@@ -3160,7 +4722,7 @@
                     <pic:cNvPicPr/>
                   </pic:nvPicPr>
                   <pic:blipFill>
-                    <a:blip r:embed="rId55"/>
+                    <a:blip r:embed="rId58"/>
                     <a:stretch>
                       <a:fillRect/>
                     </a:stretch>
@@ -3191,7 +4753,55 @@
         </w:numPr>
       </w:pPr>
       <w:r>
-        <w:t>Danh mục báo cáo: This helps the admin to configure the “ Danh Muc Bao Cáo” that help users have quick chose the category they want to report</w:t>
+        <w:t xml:space="preserve">Danh </w:t>
+      </w:r>
+      <w:proofErr w:type="spellStart"/>
+      <w:r>
+        <w:t>mục</w:t>
+      </w:r>
+      <w:proofErr w:type="spellEnd"/>
+      <w:r>
+        <w:t xml:space="preserve"> </w:t>
+      </w:r>
+      <w:proofErr w:type="spellStart"/>
+      <w:r>
+        <w:t>báo</w:t>
+      </w:r>
+      <w:proofErr w:type="spellEnd"/>
+      <w:r>
+        <w:t xml:space="preserve"> </w:t>
+      </w:r>
+      <w:proofErr w:type="spellStart"/>
+      <w:r>
+        <w:t>cáo</w:t>
+      </w:r>
+      <w:proofErr w:type="spellEnd"/>
+      <w:r>
+        <w:t xml:space="preserve">: This helps the admin to configure the </w:t>
+      </w:r>
+      <w:proofErr w:type="gramStart"/>
+      <w:r>
+        <w:t>“ Danh</w:t>
+      </w:r>
+      <w:proofErr w:type="gramEnd"/>
+      <w:r>
+        <w:t xml:space="preserve"> </w:t>
+      </w:r>
+      <w:proofErr w:type="spellStart"/>
+      <w:r>
+        <w:t>Muc</w:t>
+      </w:r>
+      <w:proofErr w:type="spellEnd"/>
+      <w:r>
+        <w:t xml:space="preserve"> Bao Cáo” that help users have quick </w:t>
+      </w:r>
+      <w:proofErr w:type="gramStart"/>
+      <w:r>
+        <w:t>chose</w:t>
+      </w:r>
+      <w:proofErr w:type="gramEnd"/>
+      <w:r>
+        <w:t xml:space="preserve"> the category they want to report</w:t>
       </w:r>
     </w:p>
     <w:p/>
@@ -3217,7 +4827,7 @@
                     <pic:cNvPicPr/>
                   </pic:nvPicPr>
                   <pic:blipFill>
-                    <a:blip r:embed="rId56"/>
+                    <a:blip r:embed="rId59"/>
                     <a:stretch>
                       <a:fillRect/>
                     </a:stretch>
@@ -3248,7 +4858,31 @@
         </w:numPr>
       </w:pPr>
       <w:r>
-        <w:t>Nhật ký hệ thống: This help admin to trach what activities were happened in the past</w:t>
+        <w:t xml:space="preserve">Nhật </w:t>
+      </w:r>
+      <w:proofErr w:type="spellStart"/>
+      <w:r>
+        <w:t>ký</w:t>
+      </w:r>
+      <w:proofErr w:type="spellEnd"/>
+      <w:r>
+        <w:t xml:space="preserve"> </w:t>
+      </w:r>
+      <w:proofErr w:type="spellStart"/>
+      <w:r>
+        <w:t>hệ</w:t>
+      </w:r>
+      <w:proofErr w:type="spellEnd"/>
+      <w:r>
+        <w:t xml:space="preserve"> </w:t>
+      </w:r>
+      <w:proofErr w:type="spellStart"/>
+      <w:r>
+        <w:t>thống</w:t>
+      </w:r>
+      <w:proofErr w:type="spellEnd"/>
+      <w:r>
+        <w:t>: This help admin to trach what activities were happened in the past</w:t>
       </w:r>
     </w:p>
     <w:p>
@@ -3272,7 +4906,7 @@
                     <pic:cNvPicPr/>
                   </pic:nvPicPr>
                   <pic:blipFill>
-                    <a:blip r:embed="rId57"/>
+                    <a:blip r:embed="rId60"/>
                     <a:stretch>
                       <a:fillRect/>
                     </a:stretch>
@@ -3442,9 +5076,11 @@
             <w:hideMark/>
           </w:tcPr>
           <w:p>
+            <w:proofErr w:type="spellStart"/>
             <w:r>
               <w:t>audit_logs</w:t>
             </w:r>
+            <w:proofErr w:type="spellEnd"/>
           </w:p>
         </w:tc>
         <w:tc>
@@ -3477,9 +5113,11 @@
             <w:hideMark/>
           </w:tcPr>
           <w:p>
+            <w:proofErr w:type="spellStart"/>
             <w:r>
               <w:t>bank_accounts</w:t>
             </w:r>
+            <w:proofErr w:type="spellEnd"/>
           </w:p>
         </w:tc>
         <w:tc>
@@ -3547,9 +5185,11 @@
             <w:hideMark/>
           </w:tcPr>
           <w:p>
+            <w:proofErr w:type="spellStart"/>
             <w:r>
               <w:t>chat_messages</w:t>
             </w:r>
+            <w:proofErr w:type="spellEnd"/>
           </w:p>
         </w:tc>
         <w:tc>
@@ -3582,9 +5222,11 @@
             <w:hideMark/>
           </w:tcPr>
           <w:p>
+            <w:proofErr w:type="spellStart"/>
             <w:r>
               <w:t>content_nodes</w:t>
             </w:r>
+            <w:proofErr w:type="spellEnd"/>
           </w:p>
         </w:tc>
         <w:tc>
@@ -3617,9 +5259,11 @@
             <w:hideMark/>
           </w:tcPr>
           <w:p>
+            <w:proofErr w:type="spellStart"/>
             <w:r>
               <w:t>feedback_templates</w:t>
             </w:r>
+            <w:proofErr w:type="spellEnd"/>
           </w:p>
         </w:tc>
         <w:tc>
@@ -3652,9 +5296,11 @@
             <w:hideMark/>
           </w:tcPr>
           <w:p>
+            <w:proofErr w:type="spellStart"/>
             <w:r>
               <w:t>footer_icons</w:t>
             </w:r>
+            <w:proofErr w:type="spellEnd"/>
           </w:p>
         </w:tc>
         <w:tc>
@@ -3687,9 +5333,11 @@
             <w:hideMark/>
           </w:tcPr>
           <w:p>
+            <w:proofErr w:type="spellStart"/>
             <w:r>
               <w:t>footer_menus</w:t>
             </w:r>
+            <w:proofErr w:type="spellEnd"/>
           </w:p>
         </w:tc>
         <w:tc>
@@ -3722,9 +5370,11 @@
             <w:hideMark/>
           </w:tcPr>
           <w:p>
+            <w:proofErr w:type="spellStart"/>
             <w:r>
               <w:t>help_nodes</w:t>
             </w:r>
+            <w:proofErr w:type="spellEnd"/>
           </w:p>
         </w:tc>
         <w:tc>
@@ -3827,9 +5477,11 @@
             <w:hideMark/>
           </w:tcPr>
           <w:p>
+            <w:proofErr w:type="spellStart"/>
             <w:r>
               <w:t>password_reset_tokens</w:t>
             </w:r>
+            <w:proofErr w:type="spellEnd"/>
           </w:p>
         </w:tc>
         <w:tc>
@@ -3862,9 +5514,11 @@
             <w:hideMark/>
           </w:tcPr>
           <w:p>
+            <w:proofErr w:type="spellStart"/>
             <w:r>
               <w:t>product_reports</w:t>
             </w:r>
+            <w:proofErr w:type="spellEnd"/>
           </w:p>
         </w:tc>
         <w:tc>
@@ -3932,9 +5586,16 @@
             <w:hideMark/>
           </w:tcPr>
           <w:p>
+            <w:proofErr w:type="spellStart"/>
+            <w:proofErr w:type="gramStart"/>
             <w:r>
-              <w:t>report_reasons</w:t>
+              <w:t>report</w:t>
             </w:r>
+            <w:proofErr w:type="gramEnd"/>
+            <w:r>
+              <w:t>_reasons</w:t>
+            </w:r>
+            <w:proofErr w:type="spellEnd"/>
           </w:p>
         </w:tc>
         <w:tc>
@@ -4002,9 +5663,11 @@
             <w:hideMark/>
           </w:tcPr>
           <w:p>
+            <w:proofErr w:type="spellStart"/>
             <w:r>
               <w:t>shipping_methods</w:t>
             </w:r>
+            <w:proofErr w:type="spellEnd"/>
           </w:p>
         </w:tc>
         <w:tc>
@@ -4037,9 +5700,11 @@
             <w:hideMark/>
           </w:tcPr>
           <w:p>
+            <w:proofErr w:type="spellStart"/>
             <w:r>
               <w:t>system_contents</w:t>
             </w:r>
+            <w:proofErr w:type="spellEnd"/>
           </w:p>
         </w:tc>
         <w:tc>
@@ -4109,9 +5774,11 @@
             <w:vAlign w:val="center"/>
           </w:tcPr>
           <w:p>
+            <w:proofErr w:type="spellStart"/>
             <w:r>
               <w:t>withdrawal_requests</w:t>
             </w:r>
+            <w:proofErr w:type="spellEnd"/>
           </w:p>
         </w:tc>
         <w:tc>

</xml_diff>

<commit_message>
Updated code for using social with previous email registered
</commit_message>
<xml_diff>
--- a/AiNetsoft Functions Description.docx
+++ b/AiNetsoft Functions Description.docx
@@ -242,6 +242,9 @@
     </w:p>
     <w:p>
       <w:r>
+        <w:rPr>
+          <w:noProof/>
+        </w:rPr>
         <w:drawing>
           <wp:inline distT="0" distB="0" distL="0" distR="0" wp14:anchorId="591C68AC" wp14:editId="1E04DBF7">
             <wp:extent cx="5943600" cy="2038985"/>
@@ -3092,17 +3095,26 @@
       <w:r>
         <w:t xml:space="preserve"> shop:</w:t>
       </w:r>
-    </w:p>
-    <w:p>
-      <w:r>
-        <w:rPr>
-          <w:noProof/>
-        </w:rPr>
+      <w:r>
+        <w:t xml:space="preserve"> It is permitted the page name </w:t>
+      </w:r>
+      <w:proofErr w:type="spellStart"/>
+      <w:r>
+        <w:t>url</w:t>
+      </w:r>
+      <w:proofErr w:type="spellEnd"/>
+      <w:r>
+        <w:t xml:space="preserve"> change each after 30 days. Except the logo of seller page take effect immediately, other need approval by Admin page</w:t>
+      </w:r>
+    </w:p>
+    <w:p>
+      <w:r>
+        <w:lastRenderedPageBreak/>
         <w:drawing>
-          <wp:inline distT="0" distB="0" distL="0" distR="0" wp14:anchorId="5CF0D2AB" wp14:editId="46ACCEA2">
-            <wp:extent cx="5943600" cy="2814955"/>
-            <wp:effectExtent l="0" t="0" r="0" b="4445"/>
-            <wp:docPr id="971468143" name="Picture 1"/>
+          <wp:inline distT="0" distB="0" distL="0" distR="0" wp14:anchorId="10F3043C" wp14:editId="7C61F361">
+            <wp:extent cx="5943600" cy="6233795"/>
+            <wp:effectExtent l="0" t="0" r="0" b="0"/>
+            <wp:docPr id="1654509566" name="Picture 1"/>
             <wp:cNvGraphicFramePr>
               <a:graphicFrameLocks xmlns:a="http://schemas.openxmlformats.org/drawingml/2006/main" noChangeAspect="1"/>
             </wp:cNvGraphicFramePr>
@@ -3110,7 +3122,7 @@
               <a:graphicData uri="http://schemas.openxmlformats.org/drawingml/2006/picture">
                 <pic:pic xmlns:pic="http://schemas.openxmlformats.org/drawingml/2006/picture">
                   <pic:nvPicPr>
-                    <pic:cNvPr id="971468143" name=""/>
+                    <pic:cNvPr id="1654509566" name=""/>
                     <pic:cNvPicPr/>
                   </pic:nvPicPr>
                   <pic:blipFill>
@@ -3122,7 +3134,7 @@
                   <pic:spPr>
                     <a:xfrm>
                       <a:off x="0" y="0"/>
-                      <a:ext cx="5943600" cy="2814955"/>
+                      <a:ext cx="5943600" cy="6233795"/>
                     </a:xfrm>
                     <a:prstGeom prst="rect">
                       <a:avLst/>

</xml_diff>

<commit_message>
Updated changes for app docs
</commit_message>
<xml_diff>
--- a/AiNetsoft Functions Description.docx
+++ b/AiNetsoft Functions Description.docx
@@ -3111,10 +3111,10 @@
       <w:r>
         <w:lastRenderedPageBreak/>
         <w:drawing>
-          <wp:inline distT="0" distB="0" distL="0" distR="0" wp14:anchorId="10F3043C" wp14:editId="7C61F361">
-            <wp:extent cx="5943600" cy="6233795"/>
+          <wp:inline distT="0" distB="0" distL="0" distR="0" wp14:anchorId="73DEE639" wp14:editId="0DB06E17">
+            <wp:extent cx="5943600" cy="6348730"/>
             <wp:effectExtent l="0" t="0" r="0" b="0"/>
-            <wp:docPr id="1654509566" name="Picture 1"/>
+            <wp:docPr id="1585568487" name="Picture 1"/>
             <wp:cNvGraphicFramePr>
               <a:graphicFrameLocks xmlns:a="http://schemas.openxmlformats.org/drawingml/2006/main" noChangeAspect="1"/>
             </wp:cNvGraphicFramePr>
@@ -3122,7 +3122,7 @@
               <a:graphicData uri="http://schemas.openxmlformats.org/drawingml/2006/picture">
                 <pic:pic xmlns:pic="http://schemas.openxmlformats.org/drawingml/2006/picture">
                   <pic:nvPicPr>
-                    <pic:cNvPr id="1654509566" name=""/>
+                    <pic:cNvPr id="1585568487" name=""/>
                     <pic:cNvPicPr/>
                   </pic:nvPicPr>
                   <pic:blipFill>
@@ -3134,7 +3134,7 @@
                   <pic:spPr>
                     <a:xfrm>
                       <a:off x="0" y="0"/>
-                      <a:ext cx="5943600" cy="6233795"/>
+                      <a:ext cx="5943600" cy="6348730"/>
                     </a:xfrm>
                     <a:prstGeom prst="rect">
                       <a:avLst/>

</xml_diff>

<commit_message>
Updated code for pageable
</commit_message>
<xml_diff>
--- a/AiNetsoft Functions Description.docx
+++ b/AiNetsoft Functions Description.docx
@@ -3,13 +3,8 @@
 <w:document xmlns:wpc="http://schemas.microsoft.com/office/word/2010/wordprocessingCanvas" xmlns:cx="http://schemas.microsoft.com/office/drawing/2014/chartex" xmlns:cx1="http://schemas.microsoft.com/office/drawing/2015/9/8/chartex" xmlns:cx2="http://schemas.microsoft.com/office/drawing/2015/10/21/chartex" xmlns:cx3="http://schemas.microsoft.com/office/drawing/2016/5/9/chartex" xmlns:cx4="http://schemas.microsoft.com/office/drawing/2016/5/10/chartex" xmlns:cx5="http://schemas.microsoft.com/office/drawing/2016/5/11/chartex" xmlns:cx6="http://schemas.microsoft.com/office/drawing/2016/5/12/chartex" xmlns:cx7="http://schemas.microsoft.com/office/drawing/2016/5/13/chartex" xmlns:cx8="http://schemas.microsoft.com/office/drawing/2016/5/14/chartex" xmlns:mc="http://schemas.openxmlformats.org/markup-compatibility/2006" xmlns:aink="http://schemas.microsoft.com/office/drawing/2016/ink" xmlns:am3d="http://schemas.microsoft.com/office/drawing/2017/model3d" xmlns:o="urn:schemas-microsoft-com:office:office" xmlns:oel="http://schemas.microsoft.com/office/2019/extlst" xmlns:r="http://schemas.openxmlformats.org/officeDocument/2006/relationships" xmlns:m="http://schemas.openxmlformats.org/officeDocument/2006/math" xmlns:v="urn:schemas-microsoft-com:vml" xmlns:wp14="http://schemas.microsoft.com/office/word/2010/wordprocessingDrawing" xmlns:wp="http://schemas.openxmlformats.org/drawingml/2006/wordprocessingDrawing" xmlns:w10="urn:schemas-microsoft-com:office:word" xmlns:w="http://schemas.openxmlformats.org/wordprocessingml/2006/main" xmlns:w14="http://schemas.microsoft.com/office/word/2010/wordml" xmlns:w15="http://schemas.microsoft.com/office/word/2012/wordml" xmlns:w16cex="http://schemas.microsoft.com/office/word/2018/wordml/cex" xmlns:w16cid="http://schemas.microsoft.com/office/word/2016/wordml/cid" xmlns:w16="http://schemas.microsoft.com/office/word/2018/wordml" xmlns:w16du="http://schemas.microsoft.com/office/word/2023/wordml/word16du" xmlns:w16sdtdh="http://schemas.microsoft.com/office/word/2020/wordml/sdtdatahash" xmlns:w16sdtfl="http://schemas.microsoft.com/office/word/2024/wordml/sdtformatlock" xmlns:w16se="http://schemas.microsoft.com/office/word/2015/wordml/symex" xmlns:wpg="http://schemas.microsoft.com/office/word/2010/wordprocessingGroup" xmlns:wpi="http://schemas.microsoft.com/office/word/2010/wordprocessingInk" xmlns:wne="http://schemas.microsoft.com/office/word/2006/wordml" xmlns:wps="http://schemas.microsoft.com/office/word/2010/wordprocessingShape" mc:Ignorable="w14 w15 w16se w16cid w16 w16cex w16sdtdh w16sdtfl w16du wp14">
   <w:body>
     <w:p>
-      <w:proofErr w:type="spellStart"/>
-      <w:r>
-        <w:t>AiNetsoft</w:t>
-      </w:r>
-      <w:proofErr w:type="spellEnd"/>
-      <w:r>
-        <w:t xml:space="preserve"> Functions Description</w:t>
+      <w:r>
+        <w:t>AiNetsoft Functions Description</w:t>
       </w:r>
     </w:p>
     <w:p/>
@@ -364,23 +359,7 @@
         </w:numPr>
       </w:pPr>
       <w:r>
-        <w:t xml:space="preserve">Edit all needed fields as the </w:t>
-      </w:r>
-      <w:proofErr w:type="gramStart"/>
-      <w:r>
-        <w:t>“ Ho</w:t>
-      </w:r>
-      <w:proofErr w:type="gramEnd"/>
-      <w:r>
-        <w:t xml:space="preserve"> so ca </w:t>
-      </w:r>
-      <w:proofErr w:type="spellStart"/>
-      <w:r>
-        <w:t>nhan</w:t>
-      </w:r>
-      <w:proofErr w:type="spellEnd"/>
-      <w:r>
-        <w:t xml:space="preserve">”.  The scenario that Phone number can be sync from the Sell request data to this page, also same for email. Data is </w:t>
+        <w:t xml:space="preserve">Edit all needed fields as the “ Ho so ca nhan”.  The scenario that Phone number can be sync from the Sell request data to this page, also same for email. Data is </w:t>
       </w:r>
       <w:r>
         <w:t>stored</w:t>
@@ -398,47 +377,23 @@
         </w:numPr>
       </w:pPr>
       <w:r>
-        <w:t xml:space="preserve">Tài </w:t>
-      </w:r>
-      <w:proofErr w:type="spellStart"/>
-      <w:r>
-        <w:t>khoản</w:t>
-      </w:r>
-      <w:proofErr w:type="spellEnd"/>
+        <w:t>Tài khoản ngân h</w:t>
+      </w:r>
+      <w:r>
+        <w:t>à</w:t>
+      </w:r>
+      <w:r>
+        <w:t>ng is being s</w:t>
+      </w:r>
+      <w:r>
+        <w:t xml:space="preserve">tored in the </w:t>
+      </w:r>
+      <w:r>
+        <w:t>bank account</w:t>
+      </w:r>
       <w:r>
         <w:t xml:space="preserve"> </w:t>
       </w:r>
-      <w:proofErr w:type="spellStart"/>
-      <w:r>
-        <w:t>ngân</w:t>
-      </w:r>
-      <w:proofErr w:type="spellEnd"/>
-      <w:r>
-        <w:t xml:space="preserve"> </w:t>
-      </w:r>
-      <w:proofErr w:type="spellStart"/>
-      <w:r>
-        <w:t>h</w:t>
-      </w:r>
-      <w:r>
-        <w:t>à</w:t>
-      </w:r>
-      <w:r>
-        <w:t>ng</w:t>
-      </w:r>
-      <w:proofErr w:type="spellEnd"/>
-      <w:r>
-        <w:t xml:space="preserve"> is being s</w:t>
-      </w:r>
-      <w:r>
-        <w:t xml:space="preserve">tored in the </w:t>
-      </w:r>
-      <w:r>
-        <w:t>bank account</w:t>
-      </w:r>
-      <w:r>
-        <w:t xml:space="preserve"> </w:t>
-      </w:r>
       <w:r>
         <w:t xml:space="preserve">database </w:t>
       </w:r>
@@ -449,15 +404,7 @@
         <w:t>ed</w:t>
       </w:r>
       <w:r>
-        <w:t xml:space="preserve"> when user </w:t>
-      </w:r>
-      <w:proofErr w:type="gramStart"/>
-      <w:r>
-        <w:t>request</w:t>
-      </w:r>
-      <w:proofErr w:type="gramEnd"/>
-      <w:r>
-        <w:t xml:space="preserve"> to become a Seller</w:t>
+        <w:t xml:space="preserve"> when user request to become a Seller</w:t>
       </w:r>
     </w:p>
     <w:p>
@@ -510,41 +457,18 @@
           <w:numId w:val="5"/>
         </w:numPr>
       </w:pPr>
-      <w:proofErr w:type="spellStart"/>
-      <w:r>
-        <w:t>Địa</w:t>
-      </w:r>
-      <w:proofErr w:type="spellEnd"/>
-      <w:r>
-        <w:t xml:space="preserve"> </w:t>
-      </w:r>
-      <w:proofErr w:type="spellStart"/>
-      <w:r>
-        <w:t>chỉ</w:t>
-      </w:r>
-      <w:proofErr w:type="spellEnd"/>
-      <w:r>
-        <w:t xml:space="preserve"> </w:t>
-      </w:r>
-      <w:proofErr w:type="spellStart"/>
+      <w:r>
+        <w:t xml:space="preserve">Địa chỉ </w:t>
+      </w:r>
       <w:r>
         <w:t>ng</w:t>
       </w:r>
       <w:r>
-        <w:t>ận</w:t>
-      </w:r>
-      <w:proofErr w:type="spellEnd"/>
-      <w:r>
-        <w:t xml:space="preserve"> </w:t>
-      </w:r>
-      <w:proofErr w:type="spellStart"/>
-      <w:r>
-        <w:t>h</w:t>
+        <w:t>ận h</w:t>
       </w:r>
       <w:r>
         <w:t>àng</w:t>
       </w:r>
-      <w:proofErr w:type="spellEnd"/>
       <w:r>
         <w:t>: Users can update data here. This is also synced to the Seller registry from if use request to become a Seller</w:t>
       </w:r>
@@ -607,21 +531,7 @@
         <w:rPr>
           <w:highlight w:val="yellow"/>
         </w:rPr>
-        <w:t xml:space="preserve">. Future will implement a validation email account to make sure fake email is not available. </w:t>
-      </w:r>
-      <w:proofErr w:type="gramStart"/>
-      <w:r>
-        <w:rPr>
-          <w:highlight w:val="yellow"/>
-        </w:rPr>
-        <w:t>Also</w:t>
-      </w:r>
-      <w:proofErr w:type="gramEnd"/>
-      <w:r>
-        <w:rPr>
-          <w:highlight w:val="yellow"/>
-        </w:rPr>
-        <w:t xml:space="preserve"> the password constrain will be asked for stronger.</w:t>
+        <w:t>. Future will implement a validation email account to make sure fake email is not available. Also the password constrain will be asked for stronger.</w:t>
       </w:r>
     </w:p>
     <w:p>
@@ -738,15 +648,7 @@
         </w:numPr>
       </w:pPr>
       <w:r>
-        <w:t xml:space="preserve">Become a seller: This contains a </w:t>
-      </w:r>
-      <w:proofErr w:type="gramStart"/>
-      <w:r>
-        <w:t>huge complex steps</w:t>
-      </w:r>
-      <w:proofErr w:type="gramEnd"/>
-      <w:r>
-        <w:t xml:space="preserve"> to register to become a Seller with using AI connection service support to scan to detect the fake CCCD info</w:t>
+        <w:t>Become a seller: This contains a huge complex steps to register to become a Seller with using AI connection service support to scan to detect the fake CCCD info</w:t>
       </w:r>
     </w:p>
     <w:p>
@@ -1047,15 +949,7 @@
     <w:p/>
     <w:p>
       <w:r>
-        <w:t xml:space="preserve">Users must type the business type and </w:t>
-      </w:r>
-      <w:proofErr w:type="gramStart"/>
-      <w:r>
-        <w:t>full</w:t>
-      </w:r>
-      <w:proofErr w:type="gramEnd"/>
-      <w:r>
-        <w:t xml:space="preserve"> fill sufficient info and validation</w:t>
+        <w:t>Users must type the business type and full fill sufficient info and validation</w:t>
       </w:r>
     </w:p>
     <w:p>
@@ -1107,13 +1001,8 @@
       <w:r>
         <w:t xml:space="preserve">Personal </w:t>
       </w:r>
-      <w:proofErr w:type="gramStart"/>
-      <w:r>
-        <w:t>business(</w:t>
-      </w:r>
-      <w:proofErr w:type="gramEnd"/>
-      <w:r>
-        <w:t>Same</w:t>
+      <w:r>
+        <w:t>business(Same</w:t>
       </w:r>
       <w:r>
         <w:t xml:space="preserve"> screen for Company business)</w:t>
@@ -1237,16 +1126,11 @@
       <w:r>
         <w:t xml:space="preserve"> the result and ask the user </w:t>
       </w:r>
-      <w:proofErr w:type="gramStart"/>
       <w:r>
         <w:t>must</w:t>
       </w:r>
       <w:r>
-        <w:t xml:space="preserve"> verify</w:t>
-      </w:r>
-      <w:proofErr w:type="gramEnd"/>
-      <w:r>
-        <w:t xml:space="preserve"> and update the correct information</w:t>
+        <w:t xml:space="preserve"> verify and update the correct information</w:t>
       </w:r>
       <w:r>
         <w:t>.</w:t>
@@ -1356,15 +1240,7 @@
         <w:jc w:val="center"/>
       </w:pPr>
       <w:r>
-        <w:t xml:space="preserve">After all information needed </w:t>
-      </w:r>
-      <w:proofErr w:type="gramStart"/>
-      <w:r>
-        <w:t>id</w:t>
-      </w:r>
-      <w:proofErr w:type="gramEnd"/>
-      <w:r>
-        <w:t xml:space="preserve"> valid, the requester will receive the notification and email as below</w:t>
+        <w:t>After all information needed id valid, the requester will receive the notification and email as below</w:t>
       </w:r>
       <w:r>
         <w:br/>
@@ -1498,247 +1374,13 @@
         <w:tab/>
       </w:r>
       <w:r>
-        <w:t>"</w:t>
-      </w:r>
-      <w:proofErr w:type="spellStart"/>
-      <w:r>
-        <w:t>Hồ</w:t>
-      </w:r>
-      <w:proofErr w:type="spellEnd"/>
-      <w:r>
-        <w:t xml:space="preserve"> </w:t>
-      </w:r>
-      <w:proofErr w:type="spellStart"/>
-      <w:r>
-        <w:t>sơ</w:t>
-      </w:r>
-      <w:proofErr w:type="spellEnd"/>
-      <w:r>
-        <w:t xml:space="preserve"> </w:t>
-      </w:r>
-      <w:proofErr w:type="spellStart"/>
-      <w:r>
-        <w:t>đang</w:t>
-      </w:r>
-      <w:proofErr w:type="spellEnd"/>
-      <w:r>
-        <w:t xml:space="preserve"> </w:t>
-      </w:r>
-      <w:proofErr w:type="spellStart"/>
-      <w:r>
-        <w:t>chờ</w:t>
-      </w:r>
-      <w:proofErr w:type="spellEnd"/>
-      <w:r>
-        <w:t xml:space="preserve"> </w:t>
-      </w:r>
-      <w:proofErr w:type="spellStart"/>
-      <w:r>
-        <w:t>phê</w:t>
-      </w:r>
-      <w:proofErr w:type="spellEnd"/>
-      <w:r>
-        <w:t xml:space="preserve"> </w:t>
-      </w:r>
-      <w:proofErr w:type="spellStart"/>
-      <w:r>
-        <w:t>duyệt</w:t>
-      </w:r>
-      <w:proofErr w:type="spellEnd"/>
+        <w:t>"Hồ sơ đang chờ phê duyệt</w:t>
+      </w:r>
       <w:r>
         <w:t xml:space="preserve">. </w:t>
       </w:r>
-      <w:proofErr w:type="spellStart"/>
-      <w:r>
-        <w:t>Yêu</w:t>
-      </w:r>
-      <w:proofErr w:type="spellEnd"/>
-      <w:r>
-        <w:t xml:space="preserve"> </w:t>
-      </w:r>
-      <w:proofErr w:type="spellStart"/>
-      <w:r>
-        <w:t>cầu</w:t>
-      </w:r>
-      <w:proofErr w:type="spellEnd"/>
-      <w:r>
-        <w:t xml:space="preserve"> </w:t>
-      </w:r>
-      <w:proofErr w:type="spellStart"/>
-      <w:r>
-        <w:t>đăng</w:t>
-      </w:r>
-      <w:proofErr w:type="spellEnd"/>
-      <w:r>
-        <w:t xml:space="preserve"> </w:t>
-      </w:r>
-      <w:proofErr w:type="spellStart"/>
-      <w:r>
-        <w:t>ký</w:t>
-      </w:r>
-      <w:proofErr w:type="spellEnd"/>
-      <w:r>
-        <w:t xml:space="preserve"> </w:t>
-      </w:r>
-      <w:proofErr w:type="spellStart"/>
-      <w:r>
-        <w:t>Người</w:t>
-      </w:r>
-      <w:proofErr w:type="spellEnd"/>
-      <w:r>
-        <w:t xml:space="preserve"> </w:t>
-      </w:r>
-      <w:proofErr w:type="spellStart"/>
-      <w:r>
-        <w:t>bán</w:t>
-      </w:r>
-      <w:proofErr w:type="spellEnd"/>
-      <w:r>
-        <w:t xml:space="preserve"> </w:t>
-      </w:r>
-      <w:proofErr w:type="spellStart"/>
-      <w:r>
-        <w:t>của</w:t>
-      </w:r>
-      <w:proofErr w:type="spellEnd"/>
-      <w:r>
-        <w:t xml:space="preserve"> </w:t>
-      </w:r>
-      <w:proofErr w:type="spellStart"/>
-      <w:r>
-        <w:t>bạn</w:t>
-      </w:r>
-      <w:proofErr w:type="spellEnd"/>
-      <w:r>
-        <w:t xml:space="preserve"> </w:t>
-      </w:r>
-      <w:proofErr w:type="spellStart"/>
-      <w:r>
-        <w:t>đã</w:t>
-      </w:r>
-      <w:proofErr w:type="spellEnd"/>
-      <w:r>
-        <w:t xml:space="preserve"> </w:t>
-      </w:r>
-      <w:proofErr w:type="spellStart"/>
-      <w:r>
-        <w:t>được</w:t>
-      </w:r>
-      <w:proofErr w:type="spellEnd"/>
-      <w:r>
-        <w:t xml:space="preserve"> </w:t>
-      </w:r>
-      <w:proofErr w:type="spellStart"/>
-      <w:r>
-        <w:t>tiếp</w:t>
-      </w:r>
-      <w:proofErr w:type="spellEnd"/>
-      <w:r>
-        <w:t xml:space="preserve"> </w:t>
-      </w:r>
-      <w:proofErr w:type="spellStart"/>
-      <w:r>
-        <w:t>nhận</w:t>
-      </w:r>
-      <w:proofErr w:type="spellEnd"/>
-      <w:r>
-        <w:t xml:space="preserve">. </w:t>
-      </w:r>
-      <w:proofErr w:type="spellStart"/>
-      <w:r>
-        <w:t>Đội</w:t>
-      </w:r>
-      <w:proofErr w:type="spellEnd"/>
-      <w:r>
-        <w:t xml:space="preserve"> </w:t>
-      </w:r>
-      <w:proofErr w:type="spellStart"/>
-      <w:r>
-        <w:t>ngũ</w:t>
-      </w:r>
-      <w:proofErr w:type="spellEnd"/>
-      <w:r>
-        <w:t xml:space="preserve"> </w:t>
-      </w:r>
-      <w:proofErr w:type="spellStart"/>
-      <w:r>
-        <w:t>kiểm</w:t>
-      </w:r>
-      <w:proofErr w:type="spellEnd"/>
-      <w:r>
-        <w:t xml:space="preserve"> </w:t>
-      </w:r>
-      <w:proofErr w:type="spellStart"/>
-      <w:r>
-        <w:t>duyệt</w:t>
-      </w:r>
-      <w:proofErr w:type="spellEnd"/>
-      <w:r>
-        <w:t xml:space="preserve"> </w:t>
-      </w:r>
-      <w:proofErr w:type="spellStart"/>
-      <w:r>
-        <w:t>sẽ</w:t>
-      </w:r>
-      <w:proofErr w:type="spellEnd"/>
-      <w:r>
-        <w:t xml:space="preserve"> </w:t>
-      </w:r>
-      <w:proofErr w:type="spellStart"/>
-      <w:r>
-        <w:t>phản</w:t>
-      </w:r>
-      <w:proofErr w:type="spellEnd"/>
-      <w:r>
-        <w:t xml:space="preserve"> </w:t>
-      </w:r>
-      <w:proofErr w:type="spellStart"/>
-      <w:r>
-        <w:t>hồi</w:t>
-      </w:r>
-      <w:proofErr w:type="spellEnd"/>
-      <w:r>
-        <w:t xml:space="preserve"> </w:t>
-      </w:r>
-      <w:proofErr w:type="spellStart"/>
-      <w:r>
-        <w:t>trong</w:t>
-      </w:r>
-      <w:proofErr w:type="spellEnd"/>
-      <w:r>
-        <w:t xml:space="preserve"> </w:t>
-      </w:r>
-      <w:proofErr w:type="spellStart"/>
-      <w:r>
-        <w:t>vòng</w:t>
-      </w:r>
-      <w:proofErr w:type="spellEnd"/>
-      <w:r>
-        <w:t xml:space="preserve"> 24 </w:t>
-      </w:r>
-      <w:proofErr w:type="spellStart"/>
-      <w:r>
-        <w:t>giờ</w:t>
-      </w:r>
-      <w:proofErr w:type="spellEnd"/>
-      <w:r>
-        <w:t xml:space="preserve"> </w:t>
-      </w:r>
-      <w:proofErr w:type="spellStart"/>
-      <w:r>
-        <w:t>làm</w:t>
-      </w:r>
-      <w:proofErr w:type="spellEnd"/>
-      <w:r>
-        <w:t xml:space="preserve"> </w:t>
-      </w:r>
-      <w:proofErr w:type="spellStart"/>
-      <w:r>
-        <w:t>việc</w:t>
-      </w:r>
-      <w:proofErr w:type="spellEnd"/>
-      <w:r>
-        <w:t>."</w:t>
+      <w:r>
+        <w:t>Yêu cầu đăng ký Người bán của bạn đã được tiếp nhận. Đội ngũ kiểm duyệt sẽ phản hồi trong vòng 24 giờ làm việc."</w:t>
       </w:r>
     </w:p>
     <w:p>
@@ -1820,186 +1462,18 @@
         <w:t>progress</w:t>
       </w:r>
       <w:r>
-        <w:t xml:space="preserve"> of the status and a notification also appear "</w:t>
-      </w:r>
-      <w:proofErr w:type="spellStart"/>
-      <w:r>
-        <w:t>Đăng</w:t>
-      </w:r>
-      <w:proofErr w:type="spellEnd"/>
-      <w:r>
-        <w:t xml:space="preserve"> ký thành </w:t>
-      </w:r>
-      <w:proofErr w:type="spellStart"/>
-      <w:r>
-        <w:t>công</w:t>
-      </w:r>
-      <w:proofErr w:type="spellEnd"/>
-      <w:r>
-        <w:t>!</w:t>
-      </w:r>
-    </w:p>
-    <w:p>
-      <w:r>
-        <w:t xml:space="preserve">                </w:t>
-      </w:r>
-      <w:proofErr w:type="spellStart"/>
-      <w:r>
-        <w:t>Hồ</w:t>
-      </w:r>
-      <w:proofErr w:type="spellEnd"/>
-      <w:r>
-        <w:t xml:space="preserve"> </w:t>
-      </w:r>
-      <w:proofErr w:type="spellStart"/>
-      <w:r>
-        <w:t>sơ</w:t>
-      </w:r>
-      <w:proofErr w:type="spellEnd"/>
-      <w:r>
-        <w:t xml:space="preserve"> </w:t>
-      </w:r>
-      <w:proofErr w:type="spellStart"/>
-      <w:r>
-        <w:t>của</w:t>
-      </w:r>
-      <w:proofErr w:type="spellEnd"/>
-      <w:r>
-        <w:t xml:space="preserve"> </w:t>
-      </w:r>
-      <w:proofErr w:type="spellStart"/>
-      <w:r>
-        <w:t>bạn</w:t>
-      </w:r>
-      <w:proofErr w:type="spellEnd"/>
-      <w:r>
-        <w:t xml:space="preserve"> </w:t>
-      </w:r>
-      <w:proofErr w:type="spellStart"/>
-      <w:r>
-        <w:t>đã</w:t>
-      </w:r>
-      <w:proofErr w:type="spellEnd"/>
-      <w:r>
-        <w:t xml:space="preserve"> </w:t>
-      </w:r>
-      <w:proofErr w:type="spellStart"/>
-      <w:r>
-        <w:t>được</w:t>
-      </w:r>
-      <w:proofErr w:type="spellEnd"/>
-      <w:r>
-        <w:t xml:space="preserve"> </w:t>
-      </w:r>
-      <w:proofErr w:type="spellStart"/>
-      <w:r>
-        <w:t>gửi</w:t>
-      </w:r>
-      <w:proofErr w:type="spellEnd"/>
-      <w:r>
-        <w:t xml:space="preserve">. </w:t>
-      </w:r>
-      <w:proofErr w:type="spellStart"/>
-      <w:r>
-        <w:t>Chúng</w:t>
-      </w:r>
-      <w:proofErr w:type="spellEnd"/>
-      <w:r>
-        <w:t xml:space="preserve"> </w:t>
-      </w:r>
-      <w:proofErr w:type="spellStart"/>
-      <w:r>
-        <w:t>tôi</w:t>
-      </w:r>
-      <w:proofErr w:type="spellEnd"/>
-      <w:r>
-        <w:t xml:space="preserve"> </w:t>
-      </w:r>
-      <w:proofErr w:type="spellStart"/>
-      <w:r>
-        <w:t>đã</w:t>
-      </w:r>
-      <w:proofErr w:type="spellEnd"/>
-      <w:r>
-        <w:t xml:space="preserve"> </w:t>
-      </w:r>
-      <w:proofErr w:type="spellStart"/>
-      <w:r>
-        <w:t>gửi</w:t>
-      </w:r>
-      <w:proofErr w:type="spellEnd"/>
-      <w:r>
-        <w:t xml:space="preserve"> email </w:t>
-      </w:r>
-      <w:proofErr w:type="spellStart"/>
-      <w:r>
-        <w:t>xác</w:t>
-      </w:r>
-      <w:proofErr w:type="spellEnd"/>
-      <w:r>
-        <w:t xml:space="preserve"> </w:t>
-      </w:r>
-      <w:proofErr w:type="spellStart"/>
-      <w:r>
-        <w:t>nhận</w:t>
-      </w:r>
-      <w:proofErr w:type="spellEnd"/>
-      <w:r>
-        <w:t xml:space="preserve"> </w:t>
-      </w:r>
-      <w:proofErr w:type="spellStart"/>
-      <w:r>
-        <w:t>đến</w:t>
-      </w:r>
-      <w:proofErr w:type="spellEnd"/>
-      <w:r>
-        <w:t xml:space="preserve"> pending@ainetsoft.com.</w:t>
+        <w:t xml:space="preserve"> of the status and a notification also appear "Đăng ký thành công!</w:t>
+      </w:r>
+    </w:p>
+    <w:p>
+      <w:r>
+        <w:t xml:space="preserve">                Hồ sơ của bạn đã được gửi. Chúng tôi đã gửi email xác nhận đến pending@ainetsoft.com.</w:t>
       </w:r>
     </w:p>
     <w:p/>
     <w:p>
       <w:r>
-        <w:t xml:space="preserve">                Phản </w:t>
-      </w:r>
-      <w:proofErr w:type="spellStart"/>
-      <w:r>
-        <w:t>hồi</w:t>
-      </w:r>
-      <w:proofErr w:type="spellEnd"/>
-      <w:r>
-        <w:t xml:space="preserve"> </w:t>
-      </w:r>
-      <w:proofErr w:type="spellStart"/>
-      <w:r>
-        <w:t>chậm</w:t>
-      </w:r>
-      <w:proofErr w:type="spellEnd"/>
-      <w:r>
-        <w:t xml:space="preserve"> </w:t>
-      </w:r>
-      <w:proofErr w:type="spellStart"/>
-      <w:r>
-        <w:t>nhất</w:t>
-      </w:r>
-      <w:proofErr w:type="spellEnd"/>
-      <w:r>
-        <w:t xml:space="preserve"> </w:t>
-      </w:r>
-      <w:proofErr w:type="spellStart"/>
-      <w:r>
-        <w:t>trong</w:t>
-      </w:r>
-      <w:proofErr w:type="spellEnd"/>
-      <w:r>
-        <w:t xml:space="preserve"> </w:t>
-      </w:r>
-      <w:proofErr w:type="spellStart"/>
-      <w:r>
-        <w:t>vòng</w:t>
-      </w:r>
-      <w:proofErr w:type="spellEnd"/>
-      <w:r>
-        <w:t xml:space="preserve"> 24h"</w:t>
+        <w:t xml:space="preserve">                Phản hồi chậm nhất trong vòng 24h"</w:t>
       </w:r>
     </w:p>
     <w:p>
@@ -2033,545 +1507,33 @@
         <w:rPr>
           <w:color w:val="EE0000"/>
         </w:rPr>
-        <w:t xml:space="preserve"> "</w:t>
-      </w:r>
-      <w:proofErr w:type="spellStart"/>
-      <w:r>
+        <w:t xml:space="preserve"> "Hồ sơ bị từ chối</w:t>
+      </w:r>
+    </w:p>
+    <w:p>
+      <w:pPr>
         <w:rPr>
           <w:color w:val="EE0000"/>
         </w:rPr>
-        <w:t>Hồ</w:t>
-      </w:r>
-      <w:proofErr w:type="spellEnd"/>
+      </w:pPr>
       <w:r>
         <w:rPr>
           <w:color w:val="EE0000"/>
         </w:rPr>
-        <w:t xml:space="preserve"> </w:t>
-      </w:r>
-      <w:proofErr w:type="spellStart"/>
-      <w:r>
+        <w:t xml:space="preserve">                Lý do: Chụp lại ảnh CCCD.</w:t>
+      </w:r>
+    </w:p>
+    <w:p>
+      <w:pPr>
         <w:rPr>
           <w:color w:val="EE0000"/>
         </w:rPr>
-        <w:t>sơ</w:t>
-      </w:r>
-      <w:proofErr w:type="spellEnd"/>
+      </w:pPr>
       <w:r>
         <w:rPr>
           <w:color w:val="EE0000"/>
         </w:rPr>
-        <w:t xml:space="preserve"> </w:t>
-      </w:r>
-      <w:proofErr w:type="spellStart"/>
-      <w:r>
-        <w:rPr>
-          <w:color w:val="EE0000"/>
-        </w:rPr>
-        <w:t>bị</w:t>
-      </w:r>
-      <w:proofErr w:type="spellEnd"/>
-      <w:r>
-        <w:rPr>
-          <w:color w:val="EE0000"/>
-        </w:rPr>
-        <w:t xml:space="preserve"> </w:t>
-      </w:r>
-      <w:proofErr w:type="spellStart"/>
-      <w:r>
-        <w:rPr>
-          <w:color w:val="EE0000"/>
-        </w:rPr>
-        <w:t>từ</w:t>
-      </w:r>
-      <w:proofErr w:type="spellEnd"/>
-      <w:r>
-        <w:rPr>
-          <w:color w:val="EE0000"/>
-        </w:rPr>
-        <w:t xml:space="preserve"> </w:t>
-      </w:r>
-      <w:proofErr w:type="spellStart"/>
-      <w:r>
-        <w:rPr>
-          <w:color w:val="EE0000"/>
-        </w:rPr>
-        <w:t>chối</w:t>
-      </w:r>
-      <w:proofErr w:type="spellEnd"/>
-    </w:p>
-    <w:p>
-      <w:pPr>
-        <w:rPr>
-          <w:color w:val="EE0000"/>
-        </w:rPr>
-      </w:pPr>
-      <w:r>
-        <w:rPr>
-          <w:color w:val="EE0000"/>
-        </w:rPr>
-        <w:t xml:space="preserve">                Lý </w:t>
-      </w:r>
-      <w:proofErr w:type="gramStart"/>
-      <w:r>
-        <w:rPr>
-          <w:color w:val="EE0000"/>
-        </w:rPr>
-        <w:t>do</w:t>
-      </w:r>
-      <w:proofErr w:type="gramEnd"/>
-      <w:r>
-        <w:rPr>
-          <w:color w:val="EE0000"/>
-        </w:rPr>
-        <w:t xml:space="preserve">: </w:t>
-      </w:r>
-      <w:proofErr w:type="spellStart"/>
-      <w:r>
-        <w:rPr>
-          <w:color w:val="EE0000"/>
-        </w:rPr>
-        <w:t>Chụp</w:t>
-      </w:r>
-      <w:proofErr w:type="spellEnd"/>
-      <w:r>
-        <w:rPr>
-          <w:color w:val="EE0000"/>
-        </w:rPr>
-        <w:t xml:space="preserve"> </w:t>
-      </w:r>
-      <w:proofErr w:type="spellStart"/>
-      <w:r>
-        <w:rPr>
-          <w:color w:val="EE0000"/>
-        </w:rPr>
-        <w:t>lại</w:t>
-      </w:r>
-      <w:proofErr w:type="spellEnd"/>
-      <w:r>
-        <w:rPr>
-          <w:color w:val="EE0000"/>
-        </w:rPr>
-        <w:t xml:space="preserve"> </w:t>
-      </w:r>
-      <w:proofErr w:type="spellStart"/>
-      <w:r>
-        <w:rPr>
-          <w:color w:val="EE0000"/>
-        </w:rPr>
-        <w:t>ảnh</w:t>
-      </w:r>
-      <w:proofErr w:type="spellEnd"/>
-      <w:r>
-        <w:rPr>
-          <w:color w:val="EE0000"/>
-        </w:rPr>
-        <w:t xml:space="preserve"> CCCD.</w:t>
-      </w:r>
-    </w:p>
-    <w:p>
-      <w:pPr>
-        <w:rPr>
-          <w:color w:val="EE0000"/>
-        </w:rPr>
-      </w:pPr>
-      <w:r>
-        <w:rPr>
-          <w:color w:val="EE0000"/>
-        </w:rPr>
-        <w:t xml:space="preserve">                </w:t>
-      </w:r>
-      <w:proofErr w:type="spellStart"/>
-      <w:r>
-        <w:rPr>
-          <w:color w:val="EE0000"/>
-        </w:rPr>
-        <w:t>Hệ</w:t>
-      </w:r>
-      <w:proofErr w:type="spellEnd"/>
-      <w:r>
-        <w:rPr>
-          <w:color w:val="EE0000"/>
-        </w:rPr>
-        <w:t xml:space="preserve"> </w:t>
-      </w:r>
-      <w:proofErr w:type="spellStart"/>
-      <w:r>
-        <w:rPr>
-          <w:color w:val="EE0000"/>
-        </w:rPr>
-        <w:t>thống</w:t>
-      </w:r>
-      <w:proofErr w:type="spellEnd"/>
-      <w:r>
-        <w:rPr>
-          <w:color w:val="EE0000"/>
-        </w:rPr>
-        <w:t xml:space="preserve"> </w:t>
-      </w:r>
-      <w:proofErr w:type="spellStart"/>
-      <w:r>
-        <w:rPr>
-          <w:color w:val="EE0000"/>
-        </w:rPr>
-        <w:t>không</w:t>
-      </w:r>
-      <w:proofErr w:type="spellEnd"/>
-      <w:r>
-        <w:rPr>
-          <w:color w:val="EE0000"/>
-        </w:rPr>
-        <w:t xml:space="preserve"> </w:t>
-      </w:r>
-      <w:proofErr w:type="spellStart"/>
-      <w:r>
-        <w:rPr>
-          <w:color w:val="EE0000"/>
-        </w:rPr>
-        <w:t>thể</w:t>
-      </w:r>
-      <w:proofErr w:type="spellEnd"/>
-      <w:r>
-        <w:rPr>
-          <w:color w:val="EE0000"/>
-        </w:rPr>
-        <w:t xml:space="preserve"> </w:t>
-      </w:r>
-      <w:proofErr w:type="spellStart"/>
-      <w:r>
-        <w:rPr>
-          <w:color w:val="EE0000"/>
-        </w:rPr>
-        <w:t>xác</w:t>
-      </w:r>
-      <w:proofErr w:type="spellEnd"/>
-      <w:r>
-        <w:rPr>
-          <w:color w:val="EE0000"/>
-        </w:rPr>
-        <w:t xml:space="preserve"> </w:t>
-      </w:r>
-      <w:proofErr w:type="spellStart"/>
-      <w:r>
-        <w:rPr>
-          <w:color w:val="EE0000"/>
-        </w:rPr>
-        <w:t>thực</w:t>
-      </w:r>
-      <w:proofErr w:type="spellEnd"/>
-      <w:r>
-        <w:rPr>
-          <w:color w:val="EE0000"/>
-        </w:rPr>
-        <w:t xml:space="preserve"> </w:t>
-      </w:r>
-      <w:proofErr w:type="spellStart"/>
-      <w:r>
-        <w:rPr>
-          <w:color w:val="EE0000"/>
-        </w:rPr>
-        <w:t>một</w:t>
-      </w:r>
-      <w:proofErr w:type="spellEnd"/>
-      <w:r>
-        <w:rPr>
-          <w:color w:val="EE0000"/>
-        </w:rPr>
-        <w:t xml:space="preserve"> </w:t>
-      </w:r>
-      <w:proofErr w:type="spellStart"/>
-      <w:r>
-        <w:rPr>
-          <w:color w:val="EE0000"/>
-        </w:rPr>
-        <w:t>số</w:t>
-      </w:r>
-      <w:proofErr w:type="spellEnd"/>
-      <w:r>
-        <w:rPr>
-          <w:color w:val="EE0000"/>
-        </w:rPr>
-        <w:t xml:space="preserve"> </w:t>
-      </w:r>
-      <w:proofErr w:type="spellStart"/>
-      <w:r>
-        <w:rPr>
-          <w:color w:val="EE0000"/>
-        </w:rPr>
-        <w:t>thông</w:t>
-      </w:r>
-      <w:proofErr w:type="spellEnd"/>
-      <w:r>
-        <w:rPr>
-          <w:color w:val="EE0000"/>
-        </w:rPr>
-        <w:t xml:space="preserve"> tin </w:t>
-      </w:r>
-      <w:proofErr w:type="spellStart"/>
-      <w:r>
-        <w:rPr>
-          <w:color w:val="EE0000"/>
-        </w:rPr>
-        <w:t>của</w:t>
-      </w:r>
-      <w:proofErr w:type="spellEnd"/>
-      <w:r>
-        <w:rPr>
-          <w:color w:val="EE0000"/>
-        </w:rPr>
-        <w:t xml:space="preserve"> </w:t>
-      </w:r>
-      <w:proofErr w:type="spellStart"/>
-      <w:r>
-        <w:rPr>
-          <w:color w:val="EE0000"/>
-        </w:rPr>
-        <w:t>bạn</w:t>
-      </w:r>
-      <w:proofErr w:type="spellEnd"/>
-      <w:r>
-        <w:rPr>
-          <w:color w:val="EE0000"/>
-        </w:rPr>
-        <w:t xml:space="preserve">. Vui </w:t>
-      </w:r>
-      <w:proofErr w:type="spellStart"/>
-      <w:r>
-        <w:rPr>
-          <w:color w:val="EE0000"/>
-        </w:rPr>
-        <w:t>lòng</w:t>
-      </w:r>
-      <w:proofErr w:type="spellEnd"/>
-      <w:r>
-        <w:rPr>
-          <w:color w:val="EE0000"/>
-        </w:rPr>
-        <w:t xml:space="preserve"> </w:t>
-      </w:r>
-      <w:proofErr w:type="spellStart"/>
-      <w:r>
-        <w:rPr>
-          <w:color w:val="EE0000"/>
-        </w:rPr>
-        <w:t>kiểm</w:t>
-      </w:r>
-      <w:proofErr w:type="spellEnd"/>
-      <w:r>
-        <w:rPr>
-          <w:color w:val="EE0000"/>
-        </w:rPr>
-        <w:t xml:space="preserve"> </w:t>
-      </w:r>
-      <w:proofErr w:type="spellStart"/>
-      <w:r>
-        <w:rPr>
-          <w:color w:val="EE0000"/>
-        </w:rPr>
-        <w:t>tra</w:t>
-      </w:r>
-      <w:proofErr w:type="spellEnd"/>
-      <w:r>
-        <w:rPr>
-          <w:color w:val="EE0000"/>
-        </w:rPr>
-        <w:t xml:space="preserve"> </w:t>
-      </w:r>
-      <w:proofErr w:type="spellStart"/>
-      <w:r>
-        <w:rPr>
-          <w:color w:val="EE0000"/>
-        </w:rPr>
-        <w:t>lại</w:t>
-      </w:r>
-      <w:proofErr w:type="spellEnd"/>
-      <w:r>
-        <w:rPr>
-          <w:color w:val="EE0000"/>
-        </w:rPr>
-        <w:t xml:space="preserve"> </w:t>
-      </w:r>
-      <w:proofErr w:type="spellStart"/>
-      <w:r>
-        <w:rPr>
-          <w:color w:val="EE0000"/>
-        </w:rPr>
-        <w:t>lý</w:t>
-      </w:r>
-      <w:proofErr w:type="spellEnd"/>
-      <w:r>
-        <w:rPr>
-          <w:color w:val="EE0000"/>
-        </w:rPr>
-        <w:t xml:space="preserve"> do </w:t>
-      </w:r>
-      <w:proofErr w:type="spellStart"/>
-      <w:r>
-        <w:rPr>
-          <w:color w:val="EE0000"/>
-        </w:rPr>
-        <w:t>trên</w:t>
-      </w:r>
-      <w:proofErr w:type="spellEnd"/>
-      <w:r>
-        <w:rPr>
-          <w:color w:val="EE0000"/>
-        </w:rPr>
-        <w:t xml:space="preserve"> </w:t>
-      </w:r>
-      <w:proofErr w:type="spellStart"/>
-      <w:r>
-        <w:rPr>
-          <w:color w:val="EE0000"/>
-        </w:rPr>
-        <w:t>và</w:t>
-      </w:r>
-      <w:proofErr w:type="spellEnd"/>
-      <w:r>
-        <w:rPr>
-          <w:color w:val="EE0000"/>
-        </w:rPr>
-        <w:t xml:space="preserve"> </w:t>
-      </w:r>
-      <w:proofErr w:type="spellStart"/>
-      <w:r>
-        <w:rPr>
-          <w:color w:val="EE0000"/>
-        </w:rPr>
-        <w:t>cập</w:t>
-      </w:r>
-      <w:proofErr w:type="spellEnd"/>
-      <w:r>
-        <w:rPr>
-          <w:color w:val="EE0000"/>
-        </w:rPr>
-        <w:t xml:space="preserve"> </w:t>
-      </w:r>
-      <w:proofErr w:type="spellStart"/>
-      <w:r>
-        <w:rPr>
-          <w:color w:val="EE0000"/>
-        </w:rPr>
-        <w:t>nhật</w:t>
-      </w:r>
-      <w:proofErr w:type="spellEnd"/>
-      <w:r>
-        <w:rPr>
-          <w:color w:val="EE0000"/>
-        </w:rPr>
-        <w:t xml:space="preserve"> </w:t>
-      </w:r>
-      <w:proofErr w:type="spellStart"/>
-      <w:r>
-        <w:rPr>
-          <w:color w:val="EE0000"/>
-        </w:rPr>
-        <w:t>hồ</w:t>
-      </w:r>
-      <w:proofErr w:type="spellEnd"/>
-      <w:r>
-        <w:rPr>
-          <w:color w:val="EE0000"/>
-        </w:rPr>
-        <w:t xml:space="preserve"> </w:t>
-      </w:r>
-      <w:proofErr w:type="spellStart"/>
-      <w:r>
-        <w:rPr>
-          <w:color w:val="EE0000"/>
-        </w:rPr>
-        <w:t>sơ</w:t>
-      </w:r>
-      <w:proofErr w:type="spellEnd"/>
-      <w:r>
-        <w:rPr>
-          <w:color w:val="EE0000"/>
-        </w:rPr>
-        <w:t xml:space="preserve"> </w:t>
-      </w:r>
-      <w:proofErr w:type="spellStart"/>
-      <w:r>
-        <w:rPr>
-          <w:color w:val="EE0000"/>
-        </w:rPr>
-        <w:t>chính</w:t>
-      </w:r>
-      <w:proofErr w:type="spellEnd"/>
-      <w:r>
-        <w:rPr>
-          <w:color w:val="EE0000"/>
-        </w:rPr>
-        <w:t xml:space="preserve"> </w:t>
-      </w:r>
-      <w:proofErr w:type="spellStart"/>
-      <w:r>
-        <w:rPr>
-          <w:color w:val="EE0000"/>
-        </w:rPr>
-        <w:t>xác</w:t>
-      </w:r>
-      <w:proofErr w:type="spellEnd"/>
-      <w:r>
-        <w:rPr>
-          <w:color w:val="EE0000"/>
-        </w:rPr>
-        <w:t xml:space="preserve"> </w:t>
-      </w:r>
-      <w:proofErr w:type="spellStart"/>
-      <w:r>
-        <w:rPr>
-          <w:color w:val="EE0000"/>
-        </w:rPr>
-        <w:t>trước</w:t>
-      </w:r>
-      <w:proofErr w:type="spellEnd"/>
-      <w:r>
-        <w:rPr>
-          <w:color w:val="EE0000"/>
-        </w:rPr>
-        <w:t xml:space="preserve"> </w:t>
-      </w:r>
-      <w:proofErr w:type="spellStart"/>
-      <w:r>
-        <w:rPr>
-          <w:color w:val="EE0000"/>
-        </w:rPr>
-        <w:t>khi</w:t>
-      </w:r>
-      <w:proofErr w:type="spellEnd"/>
-      <w:r>
-        <w:rPr>
-          <w:color w:val="EE0000"/>
-        </w:rPr>
-        <w:t xml:space="preserve"> </w:t>
-      </w:r>
-      <w:proofErr w:type="spellStart"/>
-      <w:r>
-        <w:rPr>
-          <w:color w:val="EE0000"/>
-        </w:rPr>
-        <w:t>gửi</w:t>
-      </w:r>
-      <w:proofErr w:type="spellEnd"/>
-      <w:r>
-        <w:rPr>
-          <w:color w:val="EE0000"/>
-        </w:rPr>
-        <w:t xml:space="preserve"> </w:t>
-      </w:r>
-      <w:proofErr w:type="spellStart"/>
-      <w:r>
-        <w:rPr>
-          <w:color w:val="EE0000"/>
-        </w:rPr>
-        <w:t>lại</w:t>
-      </w:r>
-      <w:proofErr w:type="spellEnd"/>
-      <w:r>
-        <w:rPr>
-          <w:color w:val="EE0000"/>
-        </w:rPr>
-        <w:t>."</w:t>
+        <w:t xml:space="preserve">                Hệ thống không thể xác thực một số thông tin của bạn. Vui lòng kiểm tra lại lý do trên và cập nhật hồ sơ chính xác trước khi gửi lại."</w:t>
       </w:r>
     </w:p>
     <w:p/>
@@ -2939,31 +1901,7 @@
     <w:p/>
     <w:p>
       <w:r>
-        <w:t xml:space="preserve">Danh </w:t>
-      </w:r>
-      <w:proofErr w:type="spellStart"/>
-      <w:r>
-        <w:t>sách</w:t>
-      </w:r>
-      <w:proofErr w:type="spellEnd"/>
-      <w:r>
-        <w:t xml:space="preserve"> </w:t>
-      </w:r>
-      <w:proofErr w:type="spellStart"/>
-      <w:r>
-        <w:t>sản</w:t>
-      </w:r>
-      <w:proofErr w:type="spellEnd"/>
-      <w:r>
-        <w:t xml:space="preserve"> </w:t>
-      </w:r>
-      <w:proofErr w:type="spellStart"/>
-      <w:r>
-        <w:t>phẩm</w:t>
-      </w:r>
-      <w:proofErr w:type="spellEnd"/>
-      <w:r>
-        <w:t>:</w:t>
+        <w:t>Danh sách sản phẩm:</w:t>
       </w:r>
     </w:p>
     <w:p>
@@ -3011,23 +1949,7 @@
     <w:p/>
     <w:p>
       <w:r>
-        <w:t xml:space="preserve">Quản </w:t>
-      </w:r>
-      <w:proofErr w:type="spellStart"/>
-      <w:r>
-        <w:t>lý</w:t>
-      </w:r>
-      <w:proofErr w:type="spellEnd"/>
-      <w:r>
-        <w:t xml:space="preserve"> </w:t>
-      </w:r>
-      <w:proofErr w:type="spellStart"/>
-      <w:r>
-        <w:t>đơn</w:t>
-      </w:r>
-      <w:proofErr w:type="spellEnd"/>
-      <w:r>
-        <w:t xml:space="preserve"> </w:t>
+        <w:t xml:space="preserve">Quản lý đơn </w:t>
       </w:r>
       <w:r>
         <w:t>hang:</w:t>
@@ -3079,36 +2001,18 @@
     </w:p>
     <w:p/>
     <w:p>
-      <w:proofErr w:type="spellStart"/>
-      <w:r>
-        <w:t>Thiết</w:t>
-      </w:r>
-      <w:proofErr w:type="spellEnd"/>
-      <w:r>
-        <w:t xml:space="preserve"> </w:t>
-      </w:r>
-      <w:proofErr w:type="spellStart"/>
-      <w:r>
-        <w:t>lập</w:t>
-      </w:r>
-      <w:proofErr w:type="spellEnd"/>
-      <w:r>
-        <w:t xml:space="preserve"> shop:</w:t>
-      </w:r>
-      <w:r>
-        <w:t xml:space="preserve"> It is permitted the page name </w:t>
-      </w:r>
-      <w:proofErr w:type="spellStart"/>
-      <w:r>
-        <w:t>url</w:t>
-      </w:r>
-      <w:proofErr w:type="spellEnd"/>
-      <w:r>
-        <w:t xml:space="preserve"> change each after 30 days. Except the logo of seller page take effect immediately, other need approval by Admin page</w:t>
-      </w:r>
-    </w:p>
-    <w:p>
-      <w:r>
+      <w:r>
+        <w:t>Thiết lập shop:</w:t>
+      </w:r>
+      <w:r>
+        <w:t xml:space="preserve"> It is permitted the page name url change each after 30 days. Except the logo of seller page take effect immediately, other need approval by Admin page</w:t>
+      </w:r>
+    </w:p>
+    <w:p>
+      <w:r>
+        <w:rPr>
+          <w:noProof/>
+        </w:rPr>
         <w:lastRenderedPageBreak/>
         <w:drawing>
           <wp:inline distT="0" distB="0" distL="0" distR="0" wp14:anchorId="73DEE639" wp14:editId="0DB06E17">
@@ -3205,15 +2109,7 @@
         </w:numPr>
       </w:pPr>
       <w:r>
-        <w:t xml:space="preserve">Money withdraw request: Seller can ask </w:t>
-      </w:r>
-      <w:proofErr w:type="spellStart"/>
-      <w:r>
-        <w:t>ainetsoft</w:t>
-      </w:r>
-      <w:proofErr w:type="spellEnd"/>
-      <w:r>
-        <w:t xml:space="preserve"> for a payment withdraw with the details form as below</w:t>
+        <w:t>Money withdraw request: Seller can ask ainetsoft for a payment withdraw with the details form as below</w:t>
       </w:r>
     </w:p>
     <w:p>
@@ -3577,21 +2473,8 @@
           <w:numId w:val="4"/>
         </w:numPr>
       </w:pPr>
-      <w:proofErr w:type="spellStart"/>
-      <w:r>
-        <w:t>Tổng</w:t>
-      </w:r>
-      <w:proofErr w:type="spellEnd"/>
-      <w:r>
-        <w:t xml:space="preserve"> </w:t>
-      </w:r>
-      <w:proofErr w:type="spellStart"/>
-      <w:r>
-        <w:t>quan</w:t>
-      </w:r>
-      <w:proofErr w:type="spellEnd"/>
-      <w:r>
-        <w:t xml:space="preserve"> Admin page: This shows the summarization of all the important parts and will be details one Admin user click to it</w:t>
+      <w:r>
+        <w:t>Tổng quan Admin page: This shows the summarization of all the important parts and will be details one Admin user click to it</w:t>
       </w:r>
     </w:p>
     <w:p>
@@ -3644,21 +2527,57 @@
           <w:numId w:val="4"/>
         </w:numPr>
       </w:pPr>
-      <w:proofErr w:type="spellStart"/>
-      <w:r>
-        <w:t>Tổng</w:t>
-      </w:r>
-      <w:proofErr w:type="spellEnd"/>
-      <w:r>
-        <w:t xml:space="preserve"> </w:t>
-      </w:r>
-      <w:proofErr w:type="spellStart"/>
-      <w:r>
-        <w:t>người</w:t>
-      </w:r>
-      <w:proofErr w:type="spellEnd"/>
-      <w:r>
-        <w:t xml:space="preserve"> dung:</w:t>
+      <w:r>
+        <w:lastRenderedPageBreak/>
+        <w:t xml:space="preserve">Tổng người </w:t>
+      </w:r>
+      <w:r>
+        <w:t>dùng</w:t>
+      </w:r>
+      <w:r>
+        <w:t>:</w:t>
+      </w:r>
+      <w:r>
+        <w:t xml:space="preserve"> Each page in this board has its own pagination as the screenshot. Same for “Người dung – products” and “Nhật ký hệ thống” </w:t>
+      </w:r>
+    </w:p>
+    <w:p>
+      <w:r>
+        <w:drawing>
+          <wp:inline distT="0" distB="0" distL="0" distR="0" wp14:anchorId="6208E325" wp14:editId="06D5E263">
+            <wp:extent cx="5943600" cy="4095750"/>
+            <wp:effectExtent l="0" t="0" r="0" b="0"/>
+            <wp:docPr id="1696056089" name="Picture 1"/>
+            <wp:cNvGraphicFramePr>
+              <a:graphicFrameLocks xmlns:a="http://schemas.openxmlformats.org/drawingml/2006/main" noChangeAspect="1"/>
+            </wp:cNvGraphicFramePr>
+            <a:graphic xmlns:a="http://schemas.openxmlformats.org/drawingml/2006/main">
+              <a:graphicData uri="http://schemas.openxmlformats.org/drawingml/2006/picture">
+                <pic:pic xmlns:pic="http://schemas.openxmlformats.org/drawingml/2006/picture">
+                  <pic:nvPicPr>
+                    <pic:cNvPr id="1696056089" name=""/>
+                    <pic:cNvPicPr/>
+                  </pic:nvPicPr>
+                  <pic:blipFill>
+                    <a:blip r:embed="rId43"/>
+                    <a:stretch>
+                      <a:fillRect/>
+                    </a:stretch>
+                  </pic:blipFill>
+                  <pic:spPr>
+                    <a:xfrm>
+                      <a:off x="0" y="0"/>
+                      <a:ext cx="5943600" cy="4095750"/>
+                    </a:xfrm>
+                    <a:prstGeom prst="rect">
+                      <a:avLst/>
+                    </a:prstGeom>
+                  </pic:spPr>
+                </pic:pic>
+              </a:graphicData>
+            </a:graphic>
+          </wp:inline>
+        </w:drawing>
       </w:r>
     </w:p>
     <w:p>
@@ -3669,29 +2588,16 @@
           <w:numId w:val="4"/>
         </w:numPr>
       </w:pPr>
-      <w:proofErr w:type="spellStart"/>
-      <w:r>
+      <w:r>
+        <w:t>Sản phẩm: Show all products which the system is having. There is a quick access to the Seller pages</w:t>
+      </w:r>
+    </w:p>
+    <w:p>
+      <w:r>
+        <w:rPr>
+          <w:noProof/>
+        </w:rPr>
         <w:lastRenderedPageBreak/>
-        <w:t>Sản</w:t>
-      </w:r>
-      <w:proofErr w:type="spellEnd"/>
-      <w:r>
-        <w:t xml:space="preserve"> </w:t>
-      </w:r>
-      <w:proofErr w:type="spellStart"/>
-      <w:r>
-        <w:t>phẩm</w:t>
-      </w:r>
-      <w:proofErr w:type="spellEnd"/>
-      <w:r>
-        <w:t>: Show all products which the system is having. There is a quick access to the Seller pages</w:t>
-      </w:r>
-    </w:p>
-    <w:p>
-      <w:r>
-        <w:rPr>
-          <w:noProof/>
-        </w:rPr>
         <w:drawing>
           <wp:inline distT="0" distB="0" distL="0" distR="0" wp14:anchorId="6B5994E1" wp14:editId="41E9937E">
             <wp:extent cx="5943600" cy="3467735"/>
@@ -3708,7 +2614,7 @@
                     <pic:cNvPicPr/>
                   </pic:nvPicPr>
                   <pic:blipFill>
-                    <a:blip r:embed="rId43"/>
+                    <a:blip r:embed="rId44"/>
                     <a:stretch>
                       <a:fillRect/>
                     </a:stretch>
@@ -3738,21 +2644,8 @@
           <w:numId w:val="4"/>
         </w:numPr>
       </w:pPr>
-      <w:proofErr w:type="spellStart"/>
-      <w:r>
-        <w:t>Chờ</w:t>
-      </w:r>
-      <w:proofErr w:type="spellEnd"/>
-      <w:r>
-        <w:t xml:space="preserve"> </w:t>
-      </w:r>
-      <w:proofErr w:type="spellStart"/>
-      <w:r>
-        <w:t>duyệt</w:t>
-      </w:r>
-      <w:proofErr w:type="spellEnd"/>
-      <w:r>
-        <w:t xml:space="preserve"> SP: This contains all pending shop product and being waiting the admin page to approve</w:t>
+      <w:r>
+        <w:t>Chờ duyệt SP: This contains all pending shop product and being waiting the admin page to approve</w:t>
       </w:r>
       <w:r>
         <w:br/>
@@ -3777,7 +2670,7 @@
                     <pic:cNvPicPr/>
                   </pic:nvPicPr>
                   <pic:blipFill>
-                    <a:blip r:embed="rId44"/>
+                    <a:blip r:embed="rId45"/>
                     <a:stretch>
                       <a:fillRect/>
                     </a:stretch>
@@ -3806,29 +2699,16 @@
           <w:numId w:val="4"/>
         </w:numPr>
       </w:pPr>
-      <w:proofErr w:type="spellStart"/>
-      <w:r>
+      <w:r>
+        <w:t>Chờ duyệt shop: This is the pending status of the users requesting for become the seller.</w:t>
+      </w:r>
+    </w:p>
+    <w:p>
+      <w:r>
+        <w:rPr>
+          <w:noProof/>
+        </w:rPr>
         <w:lastRenderedPageBreak/>
-        <w:t>Chờ</w:t>
-      </w:r>
-      <w:proofErr w:type="spellEnd"/>
-      <w:r>
-        <w:t xml:space="preserve"> </w:t>
-      </w:r>
-      <w:proofErr w:type="spellStart"/>
-      <w:r>
-        <w:t>duyệt</w:t>
-      </w:r>
-      <w:proofErr w:type="spellEnd"/>
-      <w:r>
-        <w:t xml:space="preserve"> shop: This is the pending status of the users requesting for become the seller.</w:t>
-      </w:r>
-    </w:p>
-    <w:p>
-      <w:r>
-        <w:rPr>
-          <w:noProof/>
-        </w:rPr>
         <w:drawing>
           <wp:inline distT="0" distB="0" distL="0" distR="0" wp14:anchorId="028782AD" wp14:editId="7F040F09">
             <wp:extent cx="5943600" cy="3910965"/>
@@ -3845,7 +2725,7 @@
                     <pic:cNvPicPr/>
                   </pic:nvPicPr>
                   <pic:blipFill>
-                    <a:blip r:embed="rId45"/>
+                    <a:blip r:embed="rId46"/>
                     <a:stretch>
                       <a:fillRect/>
                     </a:stretch>
@@ -3875,23 +2755,7 @@
         </w:numPr>
       </w:pPr>
       <w:r>
-        <w:t>Details of “</w:t>
-      </w:r>
-      <w:proofErr w:type="spellStart"/>
-      <w:r>
-        <w:t>Người</w:t>
-      </w:r>
-      <w:proofErr w:type="spellEnd"/>
-      <w:r>
-        <w:t xml:space="preserve"> </w:t>
-      </w:r>
-      <w:proofErr w:type="spellStart"/>
-      <w:r>
-        <w:t>dùng</w:t>
-      </w:r>
-      <w:proofErr w:type="spellEnd"/>
-      <w:r>
-        <w:t xml:space="preserve">”: This shows very details of the user and many activities related to User management such as Lock, promote user to Admin, </w:t>
+        <w:t xml:space="preserve">Details of “Người dùng”: This shows very details of the user and many activities related to User management such as Lock, promote user to Admin, </w:t>
       </w:r>
       <w:r>
         <w:t>denote user seller back to normal users…</w:t>
@@ -3931,7 +2795,7 @@
                     <pic:cNvPicPr/>
                   </pic:nvPicPr>
                   <pic:blipFill>
-                    <a:blip r:embed="rId46"/>
+                    <a:blip r:embed="rId47"/>
                     <a:stretch>
                       <a:fillRect/>
                     </a:stretch>
@@ -4001,7 +2865,7 @@
                     <pic:cNvPicPr/>
                   </pic:nvPicPr>
                   <pic:blipFill>
-                    <a:blip r:embed="rId47"/>
+                    <a:blip r:embed="rId48"/>
                     <a:stretch>
                       <a:fillRect/>
                     </a:stretch>
@@ -4056,7 +2920,7 @@
                     <pic:cNvPicPr/>
                   </pic:nvPicPr>
                   <pic:blipFill>
-                    <a:blip r:embed="rId48"/>
+                    <a:blip r:embed="rId49"/>
                     <a:stretch>
                       <a:fillRect/>
                     </a:stretch>
@@ -4110,7 +2974,7 @@
                     <pic:cNvPicPr/>
                   </pic:nvPicPr>
                   <pic:blipFill>
-                    <a:blip r:embed="rId49"/>
+                    <a:blip r:embed="rId50"/>
                     <a:stretch>
                       <a:fillRect/>
                     </a:stretch>
@@ -4164,7 +3028,7 @@
                     <pic:cNvPicPr/>
                   </pic:nvPicPr>
                   <pic:blipFill>
-                    <a:blip r:embed="rId50"/>
+                    <a:blip r:embed="rId51"/>
                     <a:stretch>
                       <a:fillRect/>
                     </a:stretch>
@@ -4219,7 +3083,7 @@
                     <pic:cNvPicPr/>
                   </pic:nvPicPr>
                   <pic:blipFill>
-                    <a:blip r:embed="rId51"/>
+                    <a:blip r:embed="rId52"/>
                     <a:stretch>
                       <a:fillRect/>
                     </a:stretch>
@@ -4248,45 +3112,8 @@
           <w:numId w:val="4"/>
         </w:numPr>
       </w:pPr>
-      <w:proofErr w:type="spellStart"/>
-      <w:r>
-        <w:t>Tất</w:t>
-      </w:r>
-      <w:proofErr w:type="spellEnd"/>
-      <w:r>
-        <w:t xml:space="preserve"> </w:t>
-      </w:r>
-      <w:proofErr w:type="spellStart"/>
-      <w:r>
-        <w:t>cả</w:t>
-      </w:r>
-      <w:proofErr w:type="spellEnd"/>
-      <w:r>
-        <w:t xml:space="preserve"> </w:t>
-      </w:r>
-      <w:proofErr w:type="spellStart"/>
-      <w:r>
-        <w:t>sảm</w:t>
-      </w:r>
-      <w:proofErr w:type="spellEnd"/>
-      <w:r>
-        <w:t xml:space="preserve"> </w:t>
-      </w:r>
-      <w:proofErr w:type="spellStart"/>
-      <w:r>
-        <w:t>phẩm</w:t>
-      </w:r>
-      <w:proofErr w:type="spellEnd"/>
-      <w:r>
-        <w:t xml:space="preserve">: Show all available products from all sellers. This </w:t>
-      </w:r>
-      <w:proofErr w:type="gramStart"/>
-      <w:r>
-        <w:t>is also has</w:t>
-      </w:r>
-      <w:proofErr w:type="gramEnd"/>
-      <w:r>
-        <w:t xml:space="preserve"> the pagination and quick access to the product owner page (Seller page)</w:t>
+      <w:r>
+        <w:t>Tất cả sảm phẩm: Show all available products from all sellers. This is also has the pagination and quick access to the product owner page (Seller page)</w:t>
       </w:r>
     </w:p>
     <w:p>
@@ -4310,7 +3137,7 @@
                     <pic:cNvPicPr/>
                   </pic:nvPicPr>
                   <pic:blipFill>
-                    <a:blip r:embed="rId52"/>
+                    <a:blip r:embed="rId53"/>
                     <a:stretch>
                       <a:fillRect/>
                     </a:stretch>
@@ -4340,13 +3167,8 @@
           <w:numId w:val="4"/>
         </w:numPr>
       </w:pPr>
-      <w:proofErr w:type="spellStart"/>
-      <w:r>
-        <w:t>Duyệt</w:t>
-      </w:r>
-      <w:proofErr w:type="spellEnd"/>
-      <w:r>
-        <w:t xml:space="preserve"> shop: All seller </w:t>
+      <w:r>
+        <w:t xml:space="preserve">Duyệt shop: All seller </w:t>
       </w:r>
       <w:r>
         <w:t>products</w:t>
@@ -4377,7 +3199,7 @@
                     <pic:cNvPicPr/>
                   </pic:nvPicPr>
                   <pic:blipFill>
-                    <a:blip r:embed="rId53"/>
+                    <a:blip r:embed="rId54"/>
                     <a:stretch>
                       <a:fillRect/>
                     </a:stretch>
@@ -4406,13 +3228,8 @@
           <w:numId w:val="4"/>
         </w:numPr>
       </w:pPr>
-      <w:proofErr w:type="spellStart"/>
-      <w:r>
-        <w:t>Duyệt</w:t>
-      </w:r>
-      <w:proofErr w:type="spellEnd"/>
-      <w:r>
-        <w:t xml:space="preserve"> shop – </w:t>
+      <w:r>
+        <w:t xml:space="preserve">Duyệt shop – </w:t>
       </w:r>
       <w:r>
         <w:t>Become</w:t>
@@ -4444,7 +3261,7 @@
                     <pic:cNvPicPr/>
                   </pic:nvPicPr>
                   <pic:blipFill>
-                    <a:blip r:embed="rId54"/>
+                    <a:blip r:embed="rId55"/>
                     <a:stretch>
                       <a:fillRect/>
                     </a:stretch>
@@ -4467,15 +3284,7 @@
     </w:p>
     <w:p>
       <w:r>
-        <w:t xml:space="preserve">The below screenshot </w:t>
-      </w:r>
-      <w:proofErr w:type="gramStart"/>
-      <w:r>
-        <w:t>tell</w:t>
-      </w:r>
-      <w:proofErr w:type="gramEnd"/>
-      <w:r>
-        <w:t xml:space="preserve"> that the current there is not any pending request to become a seller…</w:t>
+        <w:t>The below screenshot tell that the current there is not any pending request to become a seller…</w:t>
       </w:r>
     </w:p>
     <w:p>
@@ -4500,7 +3309,7 @@
                     <pic:cNvPicPr/>
                   </pic:nvPicPr>
                   <pic:blipFill>
-                    <a:blip r:embed="rId55"/>
+                    <a:blip r:embed="rId56"/>
                     <a:stretch>
                       <a:fillRect/>
                     </a:stretch>
@@ -4557,7 +3366,7 @@
                     <pic:cNvPicPr/>
                   </pic:nvPicPr>
                   <pic:blipFill>
-                    <a:blip r:embed="rId56"/>
+                    <a:blip r:embed="rId57"/>
                     <a:stretch>
                       <a:fillRect/>
                     </a:stretch>
@@ -4588,21 +3397,8 @@
         </w:numPr>
       </w:pPr>
       <w:r>
-        <w:t xml:space="preserve">Báo </w:t>
-      </w:r>
-      <w:proofErr w:type="spellStart"/>
-      <w:r>
-        <w:t>cáo</w:t>
-      </w:r>
-      <w:proofErr w:type="spellEnd"/>
-      <w:r>
-        <w:t xml:space="preserve"> vi </w:t>
-      </w:r>
-      <w:proofErr w:type="spellStart"/>
-      <w:r>
-        <w:t>phạm</w:t>
-      </w:r>
-      <w:proofErr w:type="spellEnd"/>
+        <w:t>Báo cáo vi phạm</w:t>
+      </w:r>
       <w:r>
         <w:t>:</w:t>
       </w:r>
@@ -4629,7 +3425,7 @@
                     <pic:cNvPicPr/>
                   </pic:nvPicPr>
                   <pic:blipFill>
-                    <a:blip r:embed="rId57"/>
+                    <a:blip r:embed="rId58"/>
                     <a:stretch>
                       <a:fillRect/>
                     </a:stretch>
@@ -4660,29 +3456,8 @@
         </w:numPr>
       </w:pPr>
       <w:r>
-        <w:t xml:space="preserve">Quản </w:t>
-      </w:r>
-      <w:proofErr w:type="spellStart"/>
-      <w:r>
-        <w:t>lý</w:t>
-      </w:r>
-      <w:proofErr w:type="spellEnd"/>
-      <w:r>
-        <w:t xml:space="preserve"> </w:t>
-      </w:r>
-      <w:proofErr w:type="spellStart"/>
-      <w:r>
-        <w:t>đánh</w:t>
-      </w:r>
-      <w:proofErr w:type="spellEnd"/>
-      <w:r>
-        <w:t xml:space="preserve"> </w:t>
-      </w:r>
-      <w:proofErr w:type="spellStart"/>
-      <w:r>
-        <w:t>giá</w:t>
-      </w:r>
-      <w:proofErr w:type="spellEnd"/>
+        <w:t>Quản lý đánh giá</w:t>
+      </w:r>
       <w:r>
         <w:t>:</w:t>
       </w:r>
@@ -4708,7 +3483,7 @@
                     <pic:cNvPicPr/>
                   </pic:nvPicPr>
                   <pic:blipFill>
-                    <a:blip r:embed="rId58"/>
+                    <a:blip r:embed="rId59"/>
                     <a:stretch>
                       <a:fillRect/>
                     </a:stretch>
@@ -4738,23 +3513,7 @@
         </w:numPr>
       </w:pPr>
       <w:r>
-        <w:t xml:space="preserve">Quản </w:t>
-      </w:r>
-      <w:proofErr w:type="spellStart"/>
-      <w:r>
-        <w:t>lý</w:t>
-      </w:r>
-      <w:proofErr w:type="spellEnd"/>
-      <w:r>
-        <w:t xml:space="preserve"> </w:t>
-      </w:r>
-      <w:proofErr w:type="spellStart"/>
-      <w:r>
-        <w:t>nội</w:t>
-      </w:r>
-      <w:proofErr w:type="spellEnd"/>
-      <w:r>
-        <w:t xml:space="preserve"> dung</w:t>
+        <w:t>Quản lý nội dung</w:t>
       </w:r>
       <w:r>
         <w:t>:</w:t>
@@ -4782,7 +3541,7 @@
                     <pic:cNvPicPr/>
                   </pic:nvPicPr>
                   <pic:blipFill>
-                    <a:blip r:embed="rId59"/>
+                    <a:blip r:embed="rId60"/>
                     <a:stretch>
                       <a:fillRect/>
                     </a:stretch>
@@ -4813,55 +3572,7 @@
         </w:numPr>
       </w:pPr>
       <w:r>
-        <w:t xml:space="preserve">Danh </w:t>
-      </w:r>
-      <w:proofErr w:type="spellStart"/>
-      <w:r>
-        <w:t>mục</w:t>
-      </w:r>
-      <w:proofErr w:type="spellEnd"/>
-      <w:r>
-        <w:t xml:space="preserve"> </w:t>
-      </w:r>
-      <w:proofErr w:type="spellStart"/>
-      <w:r>
-        <w:t>báo</w:t>
-      </w:r>
-      <w:proofErr w:type="spellEnd"/>
-      <w:r>
-        <w:t xml:space="preserve"> </w:t>
-      </w:r>
-      <w:proofErr w:type="spellStart"/>
-      <w:r>
-        <w:t>cáo</w:t>
-      </w:r>
-      <w:proofErr w:type="spellEnd"/>
-      <w:r>
-        <w:t xml:space="preserve">: This helps the admin to configure the </w:t>
-      </w:r>
-      <w:proofErr w:type="gramStart"/>
-      <w:r>
-        <w:t>“ Danh</w:t>
-      </w:r>
-      <w:proofErr w:type="gramEnd"/>
-      <w:r>
-        <w:t xml:space="preserve"> </w:t>
-      </w:r>
-      <w:proofErr w:type="spellStart"/>
-      <w:r>
-        <w:t>Muc</w:t>
-      </w:r>
-      <w:proofErr w:type="spellEnd"/>
-      <w:r>
-        <w:t xml:space="preserve"> Bao Cáo” that help users have quick </w:t>
-      </w:r>
-      <w:proofErr w:type="gramStart"/>
-      <w:r>
-        <w:t>chose</w:t>
-      </w:r>
-      <w:proofErr w:type="gramEnd"/>
-      <w:r>
-        <w:t xml:space="preserve"> the category they want to report</w:t>
+        <w:t>Danh mục báo cáo: This helps the admin to configure the “ Danh Muc Bao Cáo” that help users have quick chose the category they want to report</w:t>
       </w:r>
     </w:p>
     <w:p/>
@@ -4887,7 +3598,7 @@
                     <pic:cNvPicPr/>
                   </pic:nvPicPr>
                   <pic:blipFill>
-                    <a:blip r:embed="rId60"/>
+                    <a:blip r:embed="rId61"/>
                     <a:stretch>
                       <a:fillRect/>
                     </a:stretch>
@@ -4918,31 +3629,7 @@
         </w:numPr>
       </w:pPr>
       <w:r>
-        <w:t xml:space="preserve">Nhật </w:t>
-      </w:r>
-      <w:proofErr w:type="spellStart"/>
-      <w:r>
-        <w:t>ký</w:t>
-      </w:r>
-      <w:proofErr w:type="spellEnd"/>
-      <w:r>
-        <w:t xml:space="preserve"> </w:t>
-      </w:r>
-      <w:proofErr w:type="spellStart"/>
-      <w:r>
-        <w:t>hệ</w:t>
-      </w:r>
-      <w:proofErr w:type="spellEnd"/>
-      <w:r>
-        <w:t xml:space="preserve"> </w:t>
-      </w:r>
-      <w:proofErr w:type="spellStart"/>
-      <w:r>
-        <w:t>thống</w:t>
-      </w:r>
-      <w:proofErr w:type="spellEnd"/>
-      <w:r>
-        <w:t>: This help admin to trach what activities were happened in the past</w:t>
+        <w:t>Nhật ký hệ thống: This help admin to trach what activities were happened in the past</w:t>
       </w:r>
     </w:p>
     <w:p>
@@ -4966,7 +3653,7 @@
                     <pic:cNvPicPr/>
                   </pic:nvPicPr>
                   <pic:blipFill>
-                    <a:blip r:embed="rId61"/>
+                    <a:blip r:embed="rId62"/>
                     <a:stretch>
                       <a:fillRect/>
                     </a:stretch>
@@ -5136,11 +3823,9 @@
             <w:hideMark/>
           </w:tcPr>
           <w:p>
-            <w:proofErr w:type="spellStart"/>
             <w:r>
               <w:t>audit_logs</w:t>
             </w:r>
-            <w:proofErr w:type="spellEnd"/>
           </w:p>
         </w:tc>
         <w:tc>
@@ -5173,11 +3858,9 @@
             <w:hideMark/>
           </w:tcPr>
           <w:p>
-            <w:proofErr w:type="spellStart"/>
             <w:r>
               <w:t>bank_accounts</w:t>
             </w:r>
-            <w:proofErr w:type="spellEnd"/>
           </w:p>
         </w:tc>
         <w:tc>
@@ -5245,11 +3928,9 @@
             <w:hideMark/>
           </w:tcPr>
           <w:p>
-            <w:proofErr w:type="spellStart"/>
             <w:r>
               <w:t>chat_messages</w:t>
             </w:r>
-            <w:proofErr w:type="spellEnd"/>
           </w:p>
         </w:tc>
         <w:tc>
@@ -5282,11 +3963,9 @@
             <w:hideMark/>
           </w:tcPr>
           <w:p>
-            <w:proofErr w:type="spellStart"/>
             <w:r>
               <w:t>content_nodes</w:t>
             </w:r>
-            <w:proofErr w:type="spellEnd"/>
           </w:p>
         </w:tc>
         <w:tc>
@@ -5319,11 +3998,9 @@
             <w:hideMark/>
           </w:tcPr>
           <w:p>
-            <w:proofErr w:type="spellStart"/>
             <w:r>
               <w:t>feedback_templates</w:t>
             </w:r>
-            <w:proofErr w:type="spellEnd"/>
           </w:p>
         </w:tc>
         <w:tc>
@@ -5356,11 +4033,9 @@
             <w:hideMark/>
           </w:tcPr>
           <w:p>
-            <w:proofErr w:type="spellStart"/>
             <w:r>
               <w:t>footer_icons</w:t>
             </w:r>
-            <w:proofErr w:type="spellEnd"/>
           </w:p>
         </w:tc>
         <w:tc>
@@ -5393,11 +4068,9 @@
             <w:hideMark/>
           </w:tcPr>
           <w:p>
-            <w:proofErr w:type="spellStart"/>
             <w:r>
               <w:t>footer_menus</w:t>
             </w:r>
-            <w:proofErr w:type="spellEnd"/>
           </w:p>
         </w:tc>
         <w:tc>
@@ -5430,11 +4103,9 @@
             <w:hideMark/>
           </w:tcPr>
           <w:p>
-            <w:proofErr w:type="spellStart"/>
             <w:r>
               <w:t>help_nodes</w:t>
             </w:r>
-            <w:proofErr w:type="spellEnd"/>
           </w:p>
         </w:tc>
         <w:tc>
@@ -5537,11 +4208,9 @@
             <w:hideMark/>
           </w:tcPr>
           <w:p>
-            <w:proofErr w:type="spellStart"/>
             <w:r>
               <w:t>password_reset_tokens</w:t>
             </w:r>
-            <w:proofErr w:type="spellEnd"/>
           </w:p>
         </w:tc>
         <w:tc>
@@ -5574,11 +4243,9 @@
             <w:hideMark/>
           </w:tcPr>
           <w:p>
-            <w:proofErr w:type="spellStart"/>
             <w:r>
               <w:t>product_reports</w:t>
             </w:r>
-            <w:proofErr w:type="spellEnd"/>
           </w:p>
         </w:tc>
         <w:tc>
@@ -5646,16 +4313,9 @@
             <w:hideMark/>
           </w:tcPr>
           <w:p>
-            <w:proofErr w:type="spellStart"/>
-            <w:proofErr w:type="gramStart"/>
             <w:r>
-              <w:t>report</w:t>
+              <w:t>report_reasons</w:t>
             </w:r>
-            <w:proofErr w:type="gramEnd"/>
-            <w:r>
-              <w:t>_reasons</w:t>
-            </w:r>
-            <w:proofErr w:type="spellEnd"/>
           </w:p>
         </w:tc>
         <w:tc>
@@ -5723,11 +4383,9 @@
             <w:hideMark/>
           </w:tcPr>
           <w:p>
-            <w:proofErr w:type="spellStart"/>
             <w:r>
               <w:t>shipping_methods</w:t>
             </w:r>
-            <w:proofErr w:type="spellEnd"/>
           </w:p>
         </w:tc>
         <w:tc>
@@ -5760,11 +4418,9 @@
             <w:hideMark/>
           </w:tcPr>
           <w:p>
-            <w:proofErr w:type="spellStart"/>
             <w:r>
               <w:t>system_contents</w:t>
             </w:r>
-            <w:proofErr w:type="spellEnd"/>
           </w:p>
         </w:tc>
         <w:tc>
@@ -5834,11 +4490,9 @@
             <w:vAlign w:val="center"/>
           </w:tcPr>
           <w:p>
-            <w:proofErr w:type="spellStart"/>
             <w:r>
               <w:t>withdrawal_requests</w:t>
             </w:r>
-            <w:proofErr w:type="spellEnd"/>
           </w:p>
         </w:tc>
         <w:tc>

</xml_diff>

<commit_message>
Updated code for pageable (#26)
Co-authored-by: Thanh Nguyen <toni@Vietnam-4228.localdomain>
</commit_message>
<xml_diff>
--- a/AiNetsoft Functions Description.docx
+++ b/AiNetsoft Functions Description.docx
@@ -3,13 +3,8 @@
 <w:document xmlns:wpc="http://schemas.microsoft.com/office/word/2010/wordprocessingCanvas" xmlns:cx="http://schemas.microsoft.com/office/drawing/2014/chartex" xmlns:cx1="http://schemas.microsoft.com/office/drawing/2015/9/8/chartex" xmlns:cx2="http://schemas.microsoft.com/office/drawing/2015/10/21/chartex" xmlns:cx3="http://schemas.microsoft.com/office/drawing/2016/5/9/chartex" xmlns:cx4="http://schemas.microsoft.com/office/drawing/2016/5/10/chartex" xmlns:cx5="http://schemas.microsoft.com/office/drawing/2016/5/11/chartex" xmlns:cx6="http://schemas.microsoft.com/office/drawing/2016/5/12/chartex" xmlns:cx7="http://schemas.microsoft.com/office/drawing/2016/5/13/chartex" xmlns:cx8="http://schemas.microsoft.com/office/drawing/2016/5/14/chartex" xmlns:mc="http://schemas.openxmlformats.org/markup-compatibility/2006" xmlns:aink="http://schemas.microsoft.com/office/drawing/2016/ink" xmlns:am3d="http://schemas.microsoft.com/office/drawing/2017/model3d" xmlns:o="urn:schemas-microsoft-com:office:office" xmlns:oel="http://schemas.microsoft.com/office/2019/extlst" xmlns:r="http://schemas.openxmlformats.org/officeDocument/2006/relationships" xmlns:m="http://schemas.openxmlformats.org/officeDocument/2006/math" xmlns:v="urn:schemas-microsoft-com:vml" xmlns:wp14="http://schemas.microsoft.com/office/word/2010/wordprocessingDrawing" xmlns:wp="http://schemas.openxmlformats.org/drawingml/2006/wordprocessingDrawing" xmlns:w10="urn:schemas-microsoft-com:office:word" xmlns:w="http://schemas.openxmlformats.org/wordprocessingml/2006/main" xmlns:w14="http://schemas.microsoft.com/office/word/2010/wordml" xmlns:w15="http://schemas.microsoft.com/office/word/2012/wordml" xmlns:w16cex="http://schemas.microsoft.com/office/word/2018/wordml/cex" xmlns:w16cid="http://schemas.microsoft.com/office/word/2016/wordml/cid" xmlns:w16="http://schemas.microsoft.com/office/word/2018/wordml" xmlns:w16du="http://schemas.microsoft.com/office/word/2023/wordml/word16du" xmlns:w16sdtdh="http://schemas.microsoft.com/office/word/2020/wordml/sdtdatahash" xmlns:w16sdtfl="http://schemas.microsoft.com/office/word/2024/wordml/sdtformatlock" xmlns:w16se="http://schemas.microsoft.com/office/word/2015/wordml/symex" xmlns:wpg="http://schemas.microsoft.com/office/word/2010/wordprocessingGroup" xmlns:wpi="http://schemas.microsoft.com/office/word/2010/wordprocessingInk" xmlns:wne="http://schemas.microsoft.com/office/word/2006/wordml" xmlns:wps="http://schemas.microsoft.com/office/word/2010/wordprocessingShape" mc:Ignorable="w14 w15 w16se w16cid w16 w16cex w16sdtdh w16sdtfl w16du wp14">
   <w:body>
     <w:p>
-      <w:proofErr w:type="spellStart"/>
-      <w:r>
-        <w:t>AiNetsoft</w:t>
-      </w:r>
-      <w:proofErr w:type="spellEnd"/>
-      <w:r>
-        <w:t xml:space="preserve"> Functions Description</w:t>
+      <w:r>
+        <w:t>AiNetsoft Functions Description</w:t>
       </w:r>
     </w:p>
     <w:p/>
@@ -364,23 +359,7 @@
         </w:numPr>
       </w:pPr>
       <w:r>
-        <w:t xml:space="preserve">Edit all needed fields as the </w:t>
-      </w:r>
-      <w:proofErr w:type="gramStart"/>
-      <w:r>
-        <w:t>“ Ho</w:t>
-      </w:r>
-      <w:proofErr w:type="gramEnd"/>
-      <w:r>
-        <w:t xml:space="preserve"> so ca </w:t>
-      </w:r>
-      <w:proofErr w:type="spellStart"/>
-      <w:r>
-        <w:t>nhan</w:t>
-      </w:r>
-      <w:proofErr w:type="spellEnd"/>
-      <w:r>
-        <w:t xml:space="preserve">”.  The scenario that Phone number can be sync from the Sell request data to this page, also same for email. Data is </w:t>
+        <w:t xml:space="preserve">Edit all needed fields as the “ Ho so ca nhan”.  The scenario that Phone number can be sync from the Sell request data to this page, also same for email. Data is </w:t>
       </w:r>
       <w:r>
         <w:t>stored</w:t>
@@ -398,47 +377,23 @@
         </w:numPr>
       </w:pPr>
       <w:r>
-        <w:t xml:space="preserve">Tài </w:t>
-      </w:r>
-      <w:proofErr w:type="spellStart"/>
-      <w:r>
-        <w:t>khoản</w:t>
-      </w:r>
-      <w:proofErr w:type="spellEnd"/>
+        <w:t>Tài khoản ngân h</w:t>
+      </w:r>
+      <w:r>
+        <w:t>à</w:t>
+      </w:r>
+      <w:r>
+        <w:t>ng is being s</w:t>
+      </w:r>
+      <w:r>
+        <w:t xml:space="preserve">tored in the </w:t>
+      </w:r>
+      <w:r>
+        <w:t>bank account</w:t>
+      </w:r>
       <w:r>
         <w:t xml:space="preserve"> </w:t>
       </w:r>
-      <w:proofErr w:type="spellStart"/>
-      <w:r>
-        <w:t>ngân</w:t>
-      </w:r>
-      <w:proofErr w:type="spellEnd"/>
-      <w:r>
-        <w:t xml:space="preserve"> </w:t>
-      </w:r>
-      <w:proofErr w:type="spellStart"/>
-      <w:r>
-        <w:t>h</w:t>
-      </w:r>
-      <w:r>
-        <w:t>à</w:t>
-      </w:r>
-      <w:r>
-        <w:t>ng</w:t>
-      </w:r>
-      <w:proofErr w:type="spellEnd"/>
-      <w:r>
-        <w:t xml:space="preserve"> is being s</w:t>
-      </w:r>
-      <w:r>
-        <w:t xml:space="preserve">tored in the </w:t>
-      </w:r>
-      <w:r>
-        <w:t>bank account</w:t>
-      </w:r>
-      <w:r>
-        <w:t xml:space="preserve"> </w:t>
-      </w:r>
       <w:r>
         <w:t xml:space="preserve">database </w:t>
       </w:r>
@@ -449,15 +404,7 @@
         <w:t>ed</w:t>
       </w:r>
       <w:r>
-        <w:t xml:space="preserve"> when user </w:t>
-      </w:r>
-      <w:proofErr w:type="gramStart"/>
-      <w:r>
-        <w:t>request</w:t>
-      </w:r>
-      <w:proofErr w:type="gramEnd"/>
-      <w:r>
-        <w:t xml:space="preserve"> to become a Seller</w:t>
+        <w:t xml:space="preserve"> when user request to become a Seller</w:t>
       </w:r>
     </w:p>
     <w:p>
@@ -510,41 +457,18 @@
           <w:numId w:val="5"/>
         </w:numPr>
       </w:pPr>
-      <w:proofErr w:type="spellStart"/>
-      <w:r>
-        <w:t>Địa</w:t>
-      </w:r>
-      <w:proofErr w:type="spellEnd"/>
-      <w:r>
-        <w:t xml:space="preserve"> </w:t>
-      </w:r>
-      <w:proofErr w:type="spellStart"/>
-      <w:r>
-        <w:t>chỉ</w:t>
-      </w:r>
-      <w:proofErr w:type="spellEnd"/>
-      <w:r>
-        <w:t xml:space="preserve"> </w:t>
-      </w:r>
-      <w:proofErr w:type="spellStart"/>
+      <w:r>
+        <w:t xml:space="preserve">Địa chỉ </w:t>
+      </w:r>
       <w:r>
         <w:t>ng</w:t>
       </w:r>
       <w:r>
-        <w:t>ận</w:t>
-      </w:r>
-      <w:proofErr w:type="spellEnd"/>
-      <w:r>
-        <w:t xml:space="preserve"> </w:t>
-      </w:r>
-      <w:proofErr w:type="spellStart"/>
-      <w:r>
-        <w:t>h</w:t>
+        <w:t>ận h</w:t>
       </w:r>
       <w:r>
         <w:t>àng</w:t>
       </w:r>
-      <w:proofErr w:type="spellEnd"/>
       <w:r>
         <w:t>: Users can update data here. This is also synced to the Seller registry from if use request to become a Seller</w:t>
       </w:r>
@@ -607,21 +531,7 @@
         <w:rPr>
           <w:highlight w:val="yellow"/>
         </w:rPr>
-        <w:t xml:space="preserve">. Future will implement a validation email account to make sure fake email is not available. </w:t>
-      </w:r>
-      <w:proofErr w:type="gramStart"/>
-      <w:r>
-        <w:rPr>
-          <w:highlight w:val="yellow"/>
-        </w:rPr>
-        <w:t>Also</w:t>
-      </w:r>
-      <w:proofErr w:type="gramEnd"/>
-      <w:r>
-        <w:rPr>
-          <w:highlight w:val="yellow"/>
-        </w:rPr>
-        <w:t xml:space="preserve"> the password constrain will be asked for stronger.</w:t>
+        <w:t>. Future will implement a validation email account to make sure fake email is not available. Also the password constrain will be asked for stronger.</w:t>
       </w:r>
     </w:p>
     <w:p>
@@ -738,15 +648,7 @@
         </w:numPr>
       </w:pPr>
       <w:r>
-        <w:t xml:space="preserve">Become a seller: This contains a </w:t>
-      </w:r>
-      <w:proofErr w:type="gramStart"/>
-      <w:r>
-        <w:t>huge complex steps</w:t>
-      </w:r>
-      <w:proofErr w:type="gramEnd"/>
-      <w:r>
-        <w:t xml:space="preserve"> to register to become a Seller with using AI connection service support to scan to detect the fake CCCD info</w:t>
+        <w:t>Become a seller: This contains a huge complex steps to register to become a Seller with using AI connection service support to scan to detect the fake CCCD info</w:t>
       </w:r>
     </w:p>
     <w:p>
@@ -1047,15 +949,7 @@
     <w:p/>
     <w:p>
       <w:r>
-        <w:t xml:space="preserve">Users must type the business type and </w:t>
-      </w:r>
-      <w:proofErr w:type="gramStart"/>
-      <w:r>
-        <w:t>full</w:t>
-      </w:r>
-      <w:proofErr w:type="gramEnd"/>
-      <w:r>
-        <w:t xml:space="preserve"> fill sufficient info and validation</w:t>
+        <w:t>Users must type the business type and full fill sufficient info and validation</w:t>
       </w:r>
     </w:p>
     <w:p>
@@ -1107,13 +1001,8 @@
       <w:r>
         <w:t xml:space="preserve">Personal </w:t>
       </w:r>
-      <w:proofErr w:type="gramStart"/>
-      <w:r>
-        <w:t>business(</w:t>
-      </w:r>
-      <w:proofErr w:type="gramEnd"/>
-      <w:r>
-        <w:t>Same</w:t>
+      <w:r>
+        <w:t>business(Same</w:t>
       </w:r>
       <w:r>
         <w:t xml:space="preserve"> screen for Company business)</w:t>
@@ -1237,16 +1126,11 @@
       <w:r>
         <w:t xml:space="preserve"> the result and ask the user </w:t>
       </w:r>
-      <w:proofErr w:type="gramStart"/>
       <w:r>
         <w:t>must</w:t>
       </w:r>
       <w:r>
-        <w:t xml:space="preserve"> verify</w:t>
-      </w:r>
-      <w:proofErr w:type="gramEnd"/>
-      <w:r>
-        <w:t xml:space="preserve"> and update the correct information</w:t>
+        <w:t xml:space="preserve"> verify and update the correct information</w:t>
       </w:r>
       <w:r>
         <w:t>.</w:t>
@@ -1356,15 +1240,7 @@
         <w:jc w:val="center"/>
       </w:pPr>
       <w:r>
-        <w:t xml:space="preserve">After all information needed </w:t>
-      </w:r>
-      <w:proofErr w:type="gramStart"/>
-      <w:r>
-        <w:t>id</w:t>
-      </w:r>
-      <w:proofErr w:type="gramEnd"/>
-      <w:r>
-        <w:t xml:space="preserve"> valid, the requester will receive the notification and email as below</w:t>
+        <w:t>After all information needed id valid, the requester will receive the notification and email as below</w:t>
       </w:r>
       <w:r>
         <w:br/>
@@ -1498,247 +1374,13 @@
         <w:tab/>
       </w:r>
       <w:r>
-        <w:t>"</w:t>
-      </w:r>
-      <w:proofErr w:type="spellStart"/>
-      <w:r>
-        <w:t>Hồ</w:t>
-      </w:r>
-      <w:proofErr w:type="spellEnd"/>
-      <w:r>
-        <w:t xml:space="preserve"> </w:t>
-      </w:r>
-      <w:proofErr w:type="spellStart"/>
-      <w:r>
-        <w:t>sơ</w:t>
-      </w:r>
-      <w:proofErr w:type="spellEnd"/>
-      <w:r>
-        <w:t xml:space="preserve"> </w:t>
-      </w:r>
-      <w:proofErr w:type="spellStart"/>
-      <w:r>
-        <w:t>đang</w:t>
-      </w:r>
-      <w:proofErr w:type="spellEnd"/>
-      <w:r>
-        <w:t xml:space="preserve"> </w:t>
-      </w:r>
-      <w:proofErr w:type="spellStart"/>
-      <w:r>
-        <w:t>chờ</w:t>
-      </w:r>
-      <w:proofErr w:type="spellEnd"/>
-      <w:r>
-        <w:t xml:space="preserve"> </w:t>
-      </w:r>
-      <w:proofErr w:type="spellStart"/>
-      <w:r>
-        <w:t>phê</w:t>
-      </w:r>
-      <w:proofErr w:type="spellEnd"/>
-      <w:r>
-        <w:t xml:space="preserve"> </w:t>
-      </w:r>
-      <w:proofErr w:type="spellStart"/>
-      <w:r>
-        <w:t>duyệt</w:t>
-      </w:r>
-      <w:proofErr w:type="spellEnd"/>
+        <w:t>"Hồ sơ đang chờ phê duyệt</w:t>
+      </w:r>
       <w:r>
         <w:t xml:space="preserve">. </w:t>
       </w:r>
-      <w:proofErr w:type="spellStart"/>
-      <w:r>
-        <w:t>Yêu</w:t>
-      </w:r>
-      <w:proofErr w:type="spellEnd"/>
-      <w:r>
-        <w:t xml:space="preserve"> </w:t>
-      </w:r>
-      <w:proofErr w:type="spellStart"/>
-      <w:r>
-        <w:t>cầu</w:t>
-      </w:r>
-      <w:proofErr w:type="spellEnd"/>
-      <w:r>
-        <w:t xml:space="preserve"> </w:t>
-      </w:r>
-      <w:proofErr w:type="spellStart"/>
-      <w:r>
-        <w:t>đăng</w:t>
-      </w:r>
-      <w:proofErr w:type="spellEnd"/>
-      <w:r>
-        <w:t xml:space="preserve"> </w:t>
-      </w:r>
-      <w:proofErr w:type="spellStart"/>
-      <w:r>
-        <w:t>ký</w:t>
-      </w:r>
-      <w:proofErr w:type="spellEnd"/>
-      <w:r>
-        <w:t xml:space="preserve"> </w:t>
-      </w:r>
-      <w:proofErr w:type="spellStart"/>
-      <w:r>
-        <w:t>Người</w:t>
-      </w:r>
-      <w:proofErr w:type="spellEnd"/>
-      <w:r>
-        <w:t xml:space="preserve"> </w:t>
-      </w:r>
-      <w:proofErr w:type="spellStart"/>
-      <w:r>
-        <w:t>bán</w:t>
-      </w:r>
-      <w:proofErr w:type="spellEnd"/>
-      <w:r>
-        <w:t xml:space="preserve"> </w:t>
-      </w:r>
-      <w:proofErr w:type="spellStart"/>
-      <w:r>
-        <w:t>của</w:t>
-      </w:r>
-      <w:proofErr w:type="spellEnd"/>
-      <w:r>
-        <w:t xml:space="preserve"> </w:t>
-      </w:r>
-      <w:proofErr w:type="spellStart"/>
-      <w:r>
-        <w:t>bạn</w:t>
-      </w:r>
-      <w:proofErr w:type="spellEnd"/>
-      <w:r>
-        <w:t xml:space="preserve"> </w:t>
-      </w:r>
-      <w:proofErr w:type="spellStart"/>
-      <w:r>
-        <w:t>đã</w:t>
-      </w:r>
-      <w:proofErr w:type="spellEnd"/>
-      <w:r>
-        <w:t xml:space="preserve"> </w:t>
-      </w:r>
-      <w:proofErr w:type="spellStart"/>
-      <w:r>
-        <w:t>được</w:t>
-      </w:r>
-      <w:proofErr w:type="spellEnd"/>
-      <w:r>
-        <w:t xml:space="preserve"> </w:t>
-      </w:r>
-      <w:proofErr w:type="spellStart"/>
-      <w:r>
-        <w:t>tiếp</w:t>
-      </w:r>
-      <w:proofErr w:type="spellEnd"/>
-      <w:r>
-        <w:t xml:space="preserve"> </w:t>
-      </w:r>
-      <w:proofErr w:type="spellStart"/>
-      <w:r>
-        <w:t>nhận</w:t>
-      </w:r>
-      <w:proofErr w:type="spellEnd"/>
-      <w:r>
-        <w:t xml:space="preserve">. </w:t>
-      </w:r>
-      <w:proofErr w:type="spellStart"/>
-      <w:r>
-        <w:t>Đội</w:t>
-      </w:r>
-      <w:proofErr w:type="spellEnd"/>
-      <w:r>
-        <w:t xml:space="preserve"> </w:t>
-      </w:r>
-      <w:proofErr w:type="spellStart"/>
-      <w:r>
-        <w:t>ngũ</w:t>
-      </w:r>
-      <w:proofErr w:type="spellEnd"/>
-      <w:r>
-        <w:t xml:space="preserve"> </w:t>
-      </w:r>
-      <w:proofErr w:type="spellStart"/>
-      <w:r>
-        <w:t>kiểm</w:t>
-      </w:r>
-      <w:proofErr w:type="spellEnd"/>
-      <w:r>
-        <w:t xml:space="preserve"> </w:t>
-      </w:r>
-      <w:proofErr w:type="spellStart"/>
-      <w:r>
-        <w:t>duyệt</w:t>
-      </w:r>
-      <w:proofErr w:type="spellEnd"/>
-      <w:r>
-        <w:t xml:space="preserve"> </w:t>
-      </w:r>
-      <w:proofErr w:type="spellStart"/>
-      <w:r>
-        <w:t>sẽ</w:t>
-      </w:r>
-      <w:proofErr w:type="spellEnd"/>
-      <w:r>
-        <w:t xml:space="preserve"> </w:t>
-      </w:r>
-      <w:proofErr w:type="spellStart"/>
-      <w:r>
-        <w:t>phản</w:t>
-      </w:r>
-      <w:proofErr w:type="spellEnd"/>
-      <w:r>
-        <w:t xml:space="preserve"> </w:t>
-      </w:r>
-      <w:proofErr w:type="spellStart"/>
-      <w:r>
-        <w:t>hồi</w:t>
-      </w:r>
-      <w:proofErr w:type="spellEnd"/>
-      <w:r>
-        <w:t xml:space="preserve"> </w:t>
-      </w:r>
-      <w:proofErr w:type="spellStart"/>
-      <w:r>
-        <w:t>trong</w:t>
-      </w:r>
-      <w:proofErr w:type="spellEnd"/>
-      <w:r>
-        <w:t xml:space="preserve"> </w:t>
-      </w:r>
-      <w:proofErr w:type="spellStart"/>
-      <w:r>
-        <w:t>vòng</w:t>
-      </w:r>
-      <w:proofErr w:type="spellEnd"/>
-      <w:r>
-        <w:t xml:space="preserve"> 24 </w:t>
-      </w:r>
-      <w:proofErr w:type="spellStart"/>
-      <w:r>
-        <w:t>giờ</w:t>
-      </w:r>
-      <w:proofErr w:type="spellEnd"/>
-      <w:r>
-        <w:t xml:space="preserve"> </w:t>
-      </w:r>
-      <w:proofErr w:type="spellStart"/>
-      <w:r>
-        <w:t>làm</w:t>
-      </w:r>
-      <w:proofErr w:type="spellEnd"/>
-      <w:r>
-        <w:t xml:space="preserve"> </w:t>
-      </w:r>
-      <w:proofErr w:type="spellStart"/>
-      <w:r>
-        <w:t>việc</w:t>
-      </w:r>
-      <w:proofErr w:type="spellEnd"/>
-      <w:r>
-        <w:t>."</w:t>
+      <w:r>
+        <w:t>Yêu cầu đăng ký Người bán của bạn đã được tiếp nhận. Đội ngũ kiểm duyệt sẽ phản hồi trong vòng 24 giờ làm việc."</w:t>
       </w:r>
     </w:p>
     <w:p>
@@ -1820,186 +1462,18 @@
         <w:t>progress</w:t>
       </w:r>
       <w:r>
-        <w:t xml:space="preserve"> of the status and a notification also appear "</w:t>
-      </w:r>
-      <w:proofErr w:type="spellStart"/>
-      <w:r>
-        <w:t>Đăng</w:t>
-      </w:r>
-      <w:proofErr w:type="spellEnd"/>
-      <w:r>
-        <w:t xml:space="preserve"> ký thành </w:t>
-      </w:r>
-      <w:proofErr w:type="spellStart"/>
-      <w:r>
-        <w:t>công</w:t>
-      </w:r>
-      <w:proofErr w:type="spellEnd"/>
-      <w:r>
-        <w:t>!</w:t>
-      </w:r>
-    </w:p>
-    <w:p>
-      <w:r>
-        <w:t xml:space="preserve">                </w:t>
-      </w:r>
-      <w:proofErr w:type="spellStart"/>
-      <w:r>
-        <w:t>Hồ</w:t>
-      </w:r>
-      <w:proofErr w:type="spellEnd"/>
-      <w:r>
-        <w:t xml:space="preserve"> </w:t>
-      </w:r>
-      <w:proofErr w:type="spellStart"/>
-      <w:r>
-        <w:t>sơ</w:t>
-      </w:r>
-      <w:proofErr w:type="spellEnd"/>
-      <w:r>
-        <w:t xml:space="preserve"> </w:t>
-      </w:r>
-      <w:proofErr w:type="spellStart"/>
-      <w:r>
-        <w:t>của</w:t>
-      </w:r>
-      <w:proofErr w:type="spellEnd"/>
-      <w:r>
-        <w:t xml:space="preserve"> </w:t>
-      </w:r>
-      <w:proofErr w:type="spellStart"/>
-      <w:r>
-        <w:t>bạn</w:t>
-      </w:r>
-      <w:proofErr w:type="spellEnd"/>
-      <w:r>
-        <w:t xml:space="preserve"> </w:t>
-      </w:r>
-      <w:proofErr w:type="spellStart"/>
-      <w:r>
-        <w:t>đã</w:t>
-      </w:r>
-      <w:proofErr w:type="spellEnd"/>
-      <w:r>
-        <w:t xml:space="preserve"> </w:t>
-      </w:r>
-      <w:proofErr w:type="spellStart"/>
-      <w:r>
-        <w:t>được</w:t>
-      </w:r>
-      <w:proofErr w:type="spellEnd"/>
-      <w:r>
-        <w:t xml:space="preserve"> </w:t>
-      </w:r>
-      <w:proofErr w:type="spellStart"/>
-      <w:r>
-        <w:t>gửi</w:t>
-      </w:r>
-      <w:proofErr w:type="spellEnd"/>
-      <w:r>
-        <w:t xml:space="preserve">. </w:t>
-      </w:r>
-      <w:proofErr w:type="spellStart"/>
-      <w:r>
-        <w:t>Chúng</w:t>
-      </w:r>
-      <w:proofErr w:type="spellEnd"/>
-      <w:r>
-        <w:t xml:space="preserve"> </w:t>
-      </w:r>
-      <w:proofErr w:type="spellStart"/>
-      <w:r>
-        <w:t>tôi</w:t>
-      </w:r>
-      <w:proofErr w:type="spellEnd"/>
-      <w:r>
-        <w:t xml:space="preserve"> </w:t>
-      </w:r>
-      <w:proofErr w:type="spellStart"/>
-      <w:r>
-        <w:t>đã</w:t>
-      </w:r>
-      <w:proofErr w:type="spellEnd"/>
-      <w:r>
-        <w:t xml:space="preserve"> </w:t>
-      </w:r>
-      <w:proofErr w:type="spellStart"/>
-      <w:r>
-        <w:t>gửi</w:t>
-      </w:r>
-      <w:proofErr w:type="spellEnd"/>
-      <w:r>
-        <w:t xml:space="preserve"> email </w:t>
-      </w:r>
-      <w:proofErr w:type="spellStart"/>
-      <w:r>
-        <w:t>xác</w:t>
-      </w:r>
-      <w:proofErr w:type="spellEnd"/>
-      <w:r>
-        <w:t xml:space="preserve"> </w:t>
-      </w:r>
-      <w:proofErr w:type="spellStart"/>
-      <w:r>
-        <w:t>nhận</w:t>
-      </w:r>
-      <w:proofErr w:type="spellEnd"/>
-      <w:r>
-        <w:t xml:space="preserve"> </w:t>
-      </w:r>
-      <w:proofErr w:type="spellStart"/>
-      <w:r>
-        <w:t>đến</w:t>
-      </w:r>
-      <w:proofErr w:type="spellEnd"/>
-      <w:r>
-        <w:t xml:space="preserve"> pending@ainetsoft.com.</w:t>
+        <w:t xml:space="preserve"> of the status and a notification also appear "Đăng ký thành công!</w:t>
+      </w:r>
+    </w:p>
+    <w:p>
+      <w:r>
+        <w:t xml:space="preserve">                Hồ sơ của bạn đã được gửi. Chúng tôi đã gửi email xác nhận đến pending@ainetsoft.com.</w:t>
       </w:r>
     </w:p>
     <w:p/>
     <w:p>
       <w:r>
-        <w:t xml:space="preserve">                Phản </w:t>
-      </w:r>
-      <w:proofErr w:type="spellStart"/>
-      <w:r>
-        <w:t>hồi</w:t>
-      </w:r>
-      <w:proofErr w:type="spellEnd"/>
-      <w:r>
-        <w:t xml:space="preserve"> </w:t>
-      </w:r>
-      <w:proofErr w:type="spellStart"/>
-      <w:r>
-        <w:t>chậm</w:t>
-      </w:r>
-      <w:proofErr w:type="spellEnd"/>
-      <w:r>
-        <w:t xml:space="preserve"> </w:t>
-      </w:r>
-      <w:proofErr w:type="spellStart"/>
-      <w:r>
-        <w:t>nhất</w:t>
-      </w:r>
-      <w:proofErr w:type="spellEnd"/>
-      <w:r>
-        <w:t xml:space="preserve"> </w:t>
-      </w:r>
-      <w:proofErr w:type="spellStart"/>
-      <w:r>
-        <w:t>trong</w:t>
-      </w:r>
-      <w:proofErr w:type="spellEnd"/>
-      <w:r>
-        <w:t xml:space="preserve"> </w:t>
-      </w:r>
-      <w:proofErr w:type="spellStart"/>
-      <w:r>
-        <w:t>vòng</w:t>
-      </w:r>
-      <w:proofErr w:type="spellEnd"/>
-      <w:r>
-        <w:t xml:space="preserve"> 24h"</w:t>
+        <w:t xml:space="preserve">                Phản hồi chậm nhất trong vòng 24h"</w:t>
       </w:r>
     </w:p>
     <w:p>
@@ -2033,545 +1507,33 @@
         <w:rPr>
           <w:color w:val="EE0000"/>
         </w:rPr>
-        <w:t xml:space="preserve"> "</w:t>
-      </w:r>
-      <w:proofErr w:type="spellStart"/>
-      <w:r>
+        <w:t xml:space="preserve"> "Hồ sơ bị từ chối</w:t>
+      </w:r>
+    </w:p>
+    <w:p>
+      <w:pPr>
         <w:rPr>
           <w:color w:val="EE0000"/>
         </w:rPr>
-        <w:t>Hồ</w:t>
-      </w:r>
-      <w:proofErr w:type="spellEnd"/>
+      </w:pPr>
       <w:r>
         <w:rPr>
           <w:color w:val="EE0000"/>
         </w:rPr>
-        <w:t xml:space="preserve"> </w:t>
-      </w:r>
-      <w:proofErr w:type="spellStart"/>
-      <w:r>
+        <w:t xml:space="preserve">                Lý do: Chụp lại ảnh CCCD.</w:t>
+      </w:r>
+    </w:p>
+    <w:p>
+      <w:pPr>
         <w:rPr>
           <w:color w:val="EE0000"/>
         </w:rPr>
-        <w:t>sơ</w:t>
-      </w:r>
-      <w:proofErr w:type="spellEnd"/>
+      </w:pPr>
       <w:r>
         <w:rPr>
           <w:color w:val="EE0000"/>
         </w:rPr>
-        <w:t xml:space="preserve"> </w:t>
-      </w:r>
-      <w:proofErr w:type="spellStart"/>
-      <w:r>
-        <w:rPr>
-          <w:color w:val="EE0000"/>
-        </w:rPr>
-        <w:t>bị</w:t>
-      </w:r>
-      <w:proofErr w:type="spellEnd"/>
-      <w:r>
-        <w:rPr>
-          <w:color w:val="EE0000"/>
-        </w:rPr>
-        <w:t xml:space="preserve"> </w:t>
-      </w:r>
-      <w:proofErr w:type="spellStart"/>
-      <w:r>
-        <w:rPr>
-          <w:color w:val="EE0000"/>
-        </w:rPr>
-        <w:t>từ</w:t>
-      </w:r>
-      <w:proofErr w:type="spellEnd"/>
-      <w:r>
-        <w:rPr>
-          <w:color w:val="EE0000"/>
-        </w:rPr>
-        <w:t xml:space="preserve"> </w:t>
-      </w:r>
-      <w:proofErr w:type="spellStart"/>
-      <w:r>
-        <w:rPr>
-          <w:color w:val="EE0000"/>
-        </w:rPr>
-        <w:t>chối</w:t>
-      </w:r>
-      <w:proofErr w:type="spellEnd"/>
-    </w:p>
-    <w:p>
-      <w:pPr>
-        <w:rPr>
-          <w:color w:val="EE0000"/>
-        </w:rPr>
-      </w:pPr>
-      <w:r>
-        <w:rPr>
-          <w:color w:val="EE0000"/>
-        </w:rPr>
-        <w:t xml:space="preserve">                Lý </w:t>
-      </w:r>
-      <w:proofErr w:type="gramStart"/>
-      <w:r>
-        <w:rPr>
-          <w:color w:val="EE0000"/>
-        </w:rPr>
-        <w:t>do</w:t>
-      </w:r>
-      <w:proofErr w:type="gramEnd"/>
-      <w:r>
-        <w:rPr>
-          <w:color w:val="EE0000"/>
-        </w:rPr>
-        <w:t xml:space="preserve">: </w:t>
-      </w:r>
-      <w:proofErr w:type="spellStart"/>
-      <w:r>
-        <w:rPr>
-          <w:color w:val="EE0000"/>
-        </w:rPr>
-        <w:t>Chụp</w:t>
-      </w:r>
-      <w:proofErr w:type="spellEnd"/>
-      <w:r>
-        <w:rPr>
-          <w:color w:val="EE0000"/>
-        </w:rPr>
-        <w:t xml:space="preserve"> </w:t>
-      </w:r>
-      <w:proofErr w:type="spellStart"/>
-      <w:r>
-        <w:rPr>
-          <w:color w:val="EE0000"/>
-        </w:rPr>
-        <w:t>lại</w:t>
-      </w:r>
-      <w:proofErr w:type="spellEnd"/>
-      <w:r>
-        <w:rPr>
-          <w:color w:val="EE0000"/>
-        </w:rPr>
-        <w:t xml:space="preserve"> </w:t>
-      </w:r>
-      <w:proofErr w:type="spellStart"/>
-      <w:r>
-        <w:rPr>
-          <w:color w:val="EE0000"/>
-        </w:rPr>
-        <w:t>ảnh</w:t>
-      </w:r>
-      <w:proofErr w:type="spellEnd"/>
-      <w:r>
-        <w:rPr>
-          <w:color w:val="EE0000"/>
-        </w:rPr>
-        <w:t xml:space="preserve"> CCCD.</w:t>
-      </w:r>
-    </w:p>
-    <w:p>
-      <w:pPr>
-        <w:rPr>
-          <w:color w:val="EE0000"/>
-        </w:rPr>
-      </w:pPr>
-      <w:r>
-        <w:rPr>
-          <w:color w:val="EE0000"/>
-        </w:rPr>
-        <w:t xml:space="preserve">                </w:t>
-      </w:r>
-      <w:proofErr w:type="spellStart"/>
-      <w:r>
-        <w:rPr>
-          <w:color w:val="EE0000"/>
-        </w:rPr>
-        <w:t>Hệ</w:t>
-      </w:r>
-      <w:proofErr w:type="spellEnd"/>
-      <w:r>
-        <w:rPr>
-          <w:color w:val="EE0000"/>
-        </w:rPr>
-        <w:t xml:space="preserve"> </w:t>
-      </w:r>
-      <w:proofErr w:type="spellStart"/>
-      <w:r>
-        <w:rPr>
-          <w:color w:val="EE0000"/>
-        </w:rPr>
-        <w:t>thống</w:t>
-      </w:r>
-      <w:proofErr w:type="spellEnd"/>
-      <w:r>
-        <w:rPr>
-          <w:color w:val="EE0000"/>
-        </w:rPr>
-        <w:t xml:space="preserve"> </w:t>
-      </w:r>
-      <w:proofErr w:type="spellStart"/>
-      <w:r>
-        <w:rPr>
-          <w:color w:val="EE0000"/>
-        </w:rPr>
-        <w:t>không</w:t>
-      </w:r>
-      <w:proofErr w:type="spellEnd"/>
-      <w:r>
-        <w:rPr>
-          <w:color w:val="EE0000"/>
-        </w:rPr>
-        <w:t xml:space="preserve"> </w:t>
-      </w:r>
-      <w:proofErr w:type="spellStart"/>
-      <w:r>
-        <w:rPr>
-          <w:color w:val="EE0000"/>
-        </w:rPr>
-        <w:t>thể</w:t>
-      </w:r>
-      <w:proofErr w:type="spellEnd"/>
-      <w:r>
-        <w:rPr>
-          <w:color w:val="EE0000"/>
-        </w:rPr>
-        <w:t xml:space="preserve"> </w:t>
-      </w:r>
-      <w:proofErr w:type="spellStart"/>
-      <w:r>
-        <w:rPr>
-          <w:color w:val="EE0000"/>
-        </w:rPr>
-        <w:t>xác</w:t>
-      </w:r>
-      <w:proofErr w:type="spellEnd"/>
-      <w:r>
-        <w:rPr>
-          <w:color w:val="EE0000"/>
-        </w:rPr>
-        <w:t xml:space="preserve"> </w:t>
-      </w:r>
-      <w:proofErr w:type="spellStart"/>
-      <w:r>
-        <w:rPr>
-          <w:color w:val="EE0000"/>
-        </w:rPr>
-        <w:t>thực</w:t>
-      </w:r>
-      <w:proofErr w:type="spellEnd"/>
-      <w:r>
-        <w:rPr>
-          <w:color w:val="EE0000"/>
-        </w:rPr>
-        <w:t xml:space="preserve"> </w:t>
-      </w:r>
-      <w:proofErr w:type="spellStart"/>
-      <w:r>
-        <w:rPr>
-          <w:color w:val="EE0000"/>
-        </w:rPr>
-        <w:t>một</w:t>
-      </w:r>
-      <w:proofErr w:type="spellEnd"/>
-      <w:r>
-        <w:rPr>
-          <w:color w:val="EE0000"/>
-        </w:rPr>
-        <w:t xml:space="preserve"> </w:t>
-      </w:r>
-      <w:proofErr w:type="spellStart"/>
-      <w:r>
-        <w:rPr>
-          <w:color w:val="EE0000"/>
-        </w:rPr>
-        <w:t>số</w:t>
-      </w:r>
-      <w:proofErr w:type="spellEnd"/>
-      <w:r>
-        <w:rPr>
-          <w:color w:val="EE0000"/>
-        </w:rPr>
-        <w:t xml:space="preserve"> </w:t>
-      </w:r>
-      <w:proofErr w:type="spellStart"/>
-      <w:r>
-        <w:rPr>
-          <w:color w:val="EE0000"/>
-        </w:rPr>
-        <w:t>thông</w:t>
-      </w:r>
-      <w:proofErr w:type="spellEnd"/>
-      <w:r>
-        <w:rPr>
-          <w:color w:val="EE0000"/>
-        </w:rPr>
-        <w:t xml:space="preserve"> tin </w:t>
-      </w:r>
-      <w:proofErr w:type="spellStart"/>
-      <w:r>
-        <w:rPr>
-          <w:color w:val="EE0000"/>
-        </w:rPr>
-        <w:t>của</w:t>
-      </w:r>
-      <w:proofErr w:type="spellEnd"/>
-      <w:r>
-        <w:rPr>
-          <w:color w:val="EE0000"/>
-        </w:rPr>
-        <w:t xml:space="preserve"> </w:t>
-      </w:r>
-      <w:proofErr w:type="spellStart"/>
-      <w:r>
-        <w:rPr>
-          <w:color w:val="EE0000"/>
-        </w:rPr>
-        <w:t>bạn</w:t>
-      </w:r>
-      <w:proofErr w:type="spellEnd"/>
-      <w:r>
-        <w:rPr>
-          <w:color w:val="EE0000"/>
-        </w:rPr>
-        <w:t xml:space="preserve">. Vui </w:t>
-      </w:r>
-      <w:proofErr w:type="spellStart"/>
-      <w:r>
-        <w:rPr>
-          <w:color w:val="EE0000"/>
-        </w:rPr>
-        <w:t>lòng</w:t>
-      </w:r>
-      <w:proofErr w:type="spellEnd"/>
-      <w:r>
-        <w:rPr>
-          <w:color w:val="EE0000"/>
-        </w:rPr>
-        <w:t xml:space="preserve"> </w:t>
-      </w:r>
-      <w:proofErr w:type="spellStart"/>
-      <w:r>
-        <w:rPr>
-          <w:color w:val="EE0000"/>
-        </w:rPr>
-        <w:t>kiểm</w:t>
-      </w:r>
-      <w:proofErr w:type="spellEnd"/>
-      <w:r>
-        <w:rPr>
-          <w:color w:val="EE0000"/>
-        </w:rPr>
-        <w:t xml:space="preserve"> </w:t>
-      </w:r>
-      <w:proofErr w:type="spellStart"/>
-      <w:r>
-        <w:rPr>
-          <w:color w:val="EE0000"/>
-        </w:rPr>
-        <w:t>tra</w:t>
-      </w:r>
-      <w:proofErr w:type="spellEnd"/>
-      <w:r>
-        <w:rPr>
-          <w:color w:val="EE0000"/>
-        </w:rPr>
-        <w:t xml:space="preserve"> </w:t>
-      </w:r>
-      <w:proofErr w:type="spellStart"/>
-      <w:r>
-        <w:rPr>
-          <w:color w:val="EE0000"/>
-        </w:rPr>
-        <w:t>lại</w:t>
-      </w:r>
-      <w:proofErr w:type="spellEnd"/>
-      <w:r>
-        <w:rPr>
-          <w:color w:val="EE0000"/>
-        </w:rPr>
-        <w:t xml:space="preserve"> </w:t>
-      </w:r>
-      <w:proofErr w:type="spellStart"/>
-      <w:r>
-        <w:rPr>
-          <w:color w:val="EE0000"/>
-        </w:rPr>
-        <w:t>lý</w:t>
-      </w:r>
-      <w:proofErr w:type="spellEnd"/>
-      <w:r>
-        <w:rPr>
-          <w:color w:val="EE0000"/>
-        </w:rPr>
-        <w:t xml:space="preserve"> do </w:t>
-      </w:r>
-      <w:proofErr w:type="spellStart"/>
-      <w:r>
-        <w:rPr>
-          <w:color w:val="EE0000"/>
-        </w:rPr>
-        <w:t>trên</w:t>
-      </w:r>
-      <w:proofErr w:type="spellEnd"/>
-      <w:r>
-        <w:rPr>
-          <w:color w:val="EE0000"/>
-        </w:rPr>
-        <w:t xml:space="preserve"> </w:t>
-      </w:r>
-      <w:proofErr w:type="spellStart"/>
-      <w:r>
-        <w:rPr>
-          <w:color w:val="EE0000"/>
-        </w:rPr>
-        <w:t>và</w:t>
-      </w:r>
-      <w:proofErr w:type="spellEnd"/>
-      <w:r>
-        <w:rPr>
-          <w:color w:val="EE0000"/>
-        </w:rPr>
-        <w:t xml:space="preserve"> </w:t>
-      </w:r>
-      <w:proofErr w:type="spellStart"/>
-      <w:r>
-        <w:rPr>
-          <w:color w:val="EE0000"/>
-        </w:rPr>
-        <w:t>cập</w:t>
-      </w:r>
-      <w:proofErr w:type="spellEnd"/>
-      <w:r>
-        <w:rPr>
-          <w:color w:val="EE0000"/>
-        </w:rPr>
-        <w:t xml:space="preserve"> </w:t>
-      </w:r>
-      <w:proofErr w:type="spellStart"/>
-      <w:r>
-        <w:rPr>
-          <w:color w:val="EE0000"/>
-        </w:rPr>
-        <w:t>nhật</w:t>
-      </w:r>
-      <w:proofErr w:type="spellEnd"/>
-      <w:r>
-        <w:rPr>
-          <w:color w:val="EE0000"/>
-        </w:rPr>
-        <w:t xml:space="preserve"> </w:t>
-      </w:r>
-      <w:proofErr w:type="spellStart"/>
-      <w:r>
-        <w:rPr>
-          <w:color w:val="EE0000"/>
-        </w:rPr>
-        <w:t>hồ</w:t>
-      </w:r>
-      <w:proofErr w:type="spellEnd"/>
-      <w:r>
-        <w:rPr>
-          <w:color w:val="EE0000"/>
-        </w:rPr>
-        <w:t xml:space="preserve"> </w:t>
-      </w:r>
-      <w:proofErr w:type="spellStart"/>
-      <w:r>
-        <w:rPr>
-          <w:color w:val="EE0000"/>
-        </w:rPr>
-        <w:t>sơ</w:t>
-      </w:r>
-      <w:proofErr w:type="spellEnd"/>
-      <w:r>
-        <w:rPr>
-          <w:color w:val="EE0000"/>
-        </w:rPr>
-        <w:t xml:space="preserve"> </w:t>
-      </w:r>
-      <w:proofErr w:type="spellStart"/>
-      <w:r>
-        <w:rPr>
-          <w:color w:val="EE0000"/>
-        </w:rPr>
-        <w:t>chính</w:t>
-      </w:r>
-      <w:proofErr w:type="spellEnd"/>
-      <w:r>
-        <w:rPr>
-          <w:color w:val="EE0000"/>
-        </w:rPr>
-        <w:t xml:space="preserve"> </w:t>
-      </w:r>
-      <w:proofErr w:type="spellStart"/>
-      <w:r>
-        <w:rPr>
-          <w:color w:val="EE0000"/>
-        </w:rPr>
-        <w:t>xác</w:t>
-      </w:r>
-      <w:proofErr w:type="spellEnd"/>
-      <w:r>
-        <w:rPr>
-          <w:color w:val="EE0000"/>
-        </w:rPr>
-        <w:t xml:space="preserve"> </w:t>
-      </w:r>
-      <w:proofErr w:type="spellStart"/>
-      <w:r>
-        <w:rPr>
-          <w:color w:val="EE0000"/>
-        </w:rPr>
-        <w:t>trước</w:t>
-      </w:r>
-      <w:proofErr w:type="spellEnd"/>
-      <w:r>
-        <w:rPr>
-          <w:color w:val="EE0000"/>
-        </w:rPr>
-        <w:t xml:space="preserve"> </w:t>
-      </w:r>
-      <w:proofErr w:type="spellStart"/>
-      <w:r>
-        <w:rPr>
-          <w:color w:val="EE0000"/>
-        </w:rPr>
-        <w:t>khi</w:t>
-      </w:r>
-      <w:proofErr w:type="spellEnd"/>
-      <w:r>
-        <w:rPr>
-          <w:color w:val="EE0000"/>
-        </w:rPr>
-        <w:t xml:space="preserve"> </w:t>
-      </w:r>
-      <w:proofErr w:type="spellStart"/>
-      <w:r>
-        <w:rPr>
-          <w:color w:val="EE0000"/>
-        </w:rPr>
-        <w:t>gửi</w:t>
-      </w:r>
-      <w:proofErr w:type="spellEnd"/>
-      <w:r>
-        <w:rPr>
-          <w:color w:val="EE0000"/>
-        </w:rPr>
-        <w:t xml:space="preserve"> </w:t>
-      </w:r>
-      <w:proofErr w:type="spellStart"/>
-      <w:r>
-        <w:rPr>
-          <w:color w:val="EE0000"/>
-        </w:rPr>
-        <w:t>lại</w:t>
-      </w:r>
-      <w:proofErr w:type="spellEnd"/>
-      <w:r>
-        <w:rPr>
-          <w:color w:val="EE0000"/>
-        </w:rPr>
-        <w:t>."</w:t>
+        <w:t xml:space="preserve">                Hệ thống không thể xác thực một số thông tin của bạn. Vui lòng kiểm tra lại lý do trên và cập nhật hồ sơ chính xác trước khi gửi lại."</w:t>
       </w:r>
     </w:p>
     <w:p/>
@@ -2939,31 +1901,7 @@
     <w:p/>
     <w:p>
       <w:r>
-        <w:t xml:space="preserve">Danh </w:t>
-      </w:r>
-      <w:proofErr w:type="spellStart"/>
-      <w:r>
-        <w:t>sách</w:t>
-      </w:r>
-      <w:proofErr w:type="spellEnd"/>
-      <w:r>
-        <w:t xml:space="preserve"> </w:t>
-      </w:r>
-      <w:proofErr w:type="spellStart"/>
-      <w:r>
-        <w:t>sản</w:t>
-      </w:r>
-      <w:proofErr w:type="spellEnd"/>
-      <w:r>
-        <w:t xml:space="preserve"> </w:t>
-      </w:r>
-      <w:proofErr w:type="spellStart"/>
-      <w:r>
-        <w:t>phẩm</w:t>
-      </w:r>
-      <w:proofErr w:type="spellEnd"/>
-      <w:r>
-        <w:t>:</w:t>
+        <w:t>Danh sách sản phẩm:</w:t>
       </w:r>
     </w:p>
     <w:p>
@@ -3011,23 +1949,7 @@
     <w:p/>
     <w:p>
       <w:r>
-        <w:t xml:space="preserve">Quản </w:t>
-      </w:r>
-      <w:proofErr w:type="spellStart"/>
-      <w:r>
-        <w:t>lý</w:t>
-      </w:r>
-      <w:proofErr w:type="spellEnd"/>
-      <w:r>
-        <w:t xml:space="preserve"> </w:t>
-      </w:r>
-      <w:proofErr w:type="spellStart"/>
-      <w:r>
-        <w:t>đơn</w:t>
-      </w:r>
-      <w:proofErr w:type="spellEnd"/>
-      <w:r>
-        <w:t xml:space="preserve"> </w:t>
+        <w:t xml:space="preserve">Quản lý đơn </w:t>
       </w:r>
       <w:r>
         <w:t>hang:</w:t>
@@ -3079,36 +2001,18 @@
     </w:p>
     <w:p/>
     <w:p>
-      <w:proofErr w:type="spellStart"/>
-      <w:r>
-        <w:t>Thiết</w:t>
-      </w:r>
-      <w:proofErr w:type="spellEnd"/>
-      <w:r>
-        <w:t xml:space="preserve"> </w:t>
-      </w:r>
-      <w:proofErr w:type="spellStart"/>
-      <w:r>
-        <w:t>lập</w:t>
-      </w:r>
-      <w:proofErr w:type="spellEnd"/>
-      <w:r>
-        <w:t xml:space="preserve"> shop:</w:t>
-      </w:r>
-      <w:r>
-        <w:t xml:space="preserve"> It is permitted the page name </w:t>
-      </w:r>
-      <w:proofErr w:type="spellStart"/>
-      <w:r>
-        <w:t>url</w:t>
-      </w:r>
-      <w:proofErr w:type="spellEnd"/>
-      <w:r>
-        <w:t xml:space="preserve"> change each after 30 days. Except the logo of seller page take effect immediately, other need approval by Admin page</w:t>
-      </w:r>
-    </w:p>
-    <w:p>
-      <w:r>
+      <w:r>
+        <w:t>Thiết lập shop:</w:t>
+      </w:r>
+      <w:r>
+        <w:t xml:space="preserve"> It is permitted the page name url change each after 30 days. Except the logo of seller page take effect immediately, other need approval by Admin page</w:t>
+      </w:r>
+    </w:p>
+    <w:p>
+      <w:r>
+        <w:rPr>
+          <w:noProof/>
+        </w:rPr>
         <w:lastRenderedPageBreak/>
         <w:drawing>
           <wp:inline distT="0" distB="0" distL="0" distR="0" wp14:anchorId="73DEE639" wp14:editId="0DB06E17">
@@ -3205,15 +2109,7 @@
         </w:numPr>
       </w:pPr>
       <w:r>
-        <w:t xml:space="preserve">Money withdraw request: Seller can ask </w:t>
-      </w:r>
-      <w:proofErr w:type="spellStart"/>
-      <w:r>
-        <w:t>ainetsoft</w:t>
-      </w:r>
-      <w:proofErr w:type="spellEnd"/>
-      <w:r>
-        <w:t xml:space="preserve"> for a payment withdraw with the details form as below</w:t>
+        <w:t>Money withdraw request: Seller can ask ainetsoft for a payment withdraw with the details form as below</w:t>
       </w:r>
     </w:p>
     <w:p>
@@ -3577,21 +2473,8 @@
           <w:numId w:val="4"/>
         </w:numPr>
       </w:pPr>
-      <w:proofErr w:type="spellStart"/>
-      <w:r>
-        <w:t>Tổng</w:t>
-      </w:r>
-      <w:proofErr w:type="spellEnd"/>
-      <w:r>
-        <w:t xml:space="preserve"> </w:t>
-      </w:r>
-      <w:proofErr w:type="spellStart"/>
-      <w:r>
-        <w:t>quan</w:t>
-      </w:r>
-      <w:proofErr w:type="spellEnd"/>
-      <w:r>
-        <w:t xml:space="preserve"> Admin page: This shows the summarization of all the important parts and will be details one Admin user click to it</w:t>
+      <w:r>
+        <w:t>Tổng quan Admin page: This shows the summarization of all the important parts and will be details one Admin user click to it</w:t>
       </w:r>
     </w:p>
     <w:p>
@@ -3644,21 +2527,57 @@
           <w:numId w:val="4"/>
         </w:numPr>
       </w:pPr>
-      <w:proofErr w:type="spellStart"/>
-      <w:r>
-        <w:t>Tổng</w:t>
-      </w:r>
-      <w:proofErr w:type="spellEnd"/>
-      <w:r>
-        <w:t xml:space="preserve"> </w:t>
-      </w:r>
-      <w:proofErr w:type="spellStart"/>
-      <w:r>
-        <w:t>người</w:t>
-      </w:r>
-      <w:proofErr w:type="spellEnd"/>
-      <w:r>
-        <w:t xml:space="preserve"> dung:</w:t>
+      <w:r>
+        <w:lastRenderedPageBreak/>
+        <w:t xml:space="preserve">Tổng người </w:t>
+      </w:r>
+      <w:r>
+        <w:t>dùng</w:t>
+      </w:r>
+      <w:r>
+        <w:t>:</w:t>
+      </w:r>
+      <w:r>
+        <w:t xml:space="preserve"> Each page in this board has its own pagination as the screenshot. Same for “Người dung – products” and “Nhật ký hệ thống” </w:t>
+      </w:r>
+    </w:p>
+    <w:p>
+      <w:r>
+        <w:drawing>
+          <wp:inline distT="0" distB="0" distL="0" distR="0" wp14:anchorId="6208E325" wp14:editId="06D5E263">
+            <wp:extent cx="5943600" cy="4095750"/>
+            <wp:effectExtent l="0" t="0" r="0" b="0"/>
+            <wp:docPr id="1696056089" name="Picture 1"/>
+            <wp:cNvGraphicFramePr>
+              <a:graphicFrameLocks xmlns:a="http://schemas.openxmlformats.org/drawingml/2006/main" noChangeAspect="1"/>
+            </wp:cNvGraphicFramePr>
+            <a:graphic xmlns:a="http://schemas.openxmlformats.org/drawingml/2006/main">
+              <a:graphicData uri="http://schemas.openxmlformats.org/drawingml/2006/picture">
+                <pic:pic xmlns:pic="http://schemas.openxmlformats.org/drawingml/2006/picture">
+                  <pic:nvPicPr>
+                    <pic:cNvPr id="1696056089" name=""/>
+                    <pic:cNvPicPr/>
+                  </pic:nvPicPr>
+                  <pic:blipFill>
+                    <a:blip r:embed="rId43"/>
+                    <a:stretch>
+                      <a:fillRect/>
+                    </a:stretch>
+                  </pic:blipFill>
+                  <pic:spPr>
+                    <a:xfrm>
+                      <a:off x="0" y="0"/>
+                      <a:ext cx="5943600" cy="4095750"/>
+                    </a:xfrm>
+                    <a:prstGeom prst="rect">
+                      <a:avLst/>
+                    </a:prstGeom>
+                  </pic:spPr>
+                </pic:pic>
+              </a:graphicData>
+            </a:graphic>
+          </wp:inline>
+        </w:drawing>
       </w:r>
     </w:p>
     <w:p>
@@ -3669,29 +2588,16 @@
           <w:numId w:val="4"/>
         </w:numPr>
       </w:pPr>
-      <w:proofErr w:type="spellStart"/>
-      <w:r>
+      <w:r>
+        <w:t>Sản phẩm: Show all products which the system is having. There is a quick access to the Seller pages</w:t>
+      </w:r>
+    </w:p>
+    <w:p>
+      <w:r>
+        <w:rPr>
+          <w:noProof/>
+        </w:rPr>
         <w:lastRenderedPageBreak/>
-        <w:t>Sản</w:t>
-      </w:r>
-      <w:proofErr w:type="spellEnd"/>
-      <w:r>
-        <w:t xml:space="preserve"> </w:t>
-      </w:r>
-      <w:proofErr w:type="spellStart"/>
-      <w:r>
-        <w:t>phẩm</w:t>
-      </w:r>
-      <w:proofErr w:type="spellEnd"/>
-      <w:r>
-        <w:t>: Show all products which the system is having. There is a quick access to the Seller pages</w:t>
-      </w:r>
-    </w:p>
-    <w:p>
-      <w:r>
-        <w:rPr>
-          <w:noProof/>
-        </w:rPr>
         <w:drawing>
           <wp:inline distT="0" distB="0" distL="0" distR="0" wp14:anchorId="6B5994E1" wp14:editId="41E9937E">
             <wp:extent cx="5943600" cy="3467735"/>
@@ -3708,7 +2614,7 @@
                     <pic:cNvPicPr/>
                   </pic:nvPicPr>
                   <pic:blipFill>
-                    <a:blip r:embed="rId43"/>
+                    <a:blip r:embed="rId44"/>
                     <a:stretch>
                       <a:fillRect/>
                     </a:stretch>
@@ -3738,21 +2644,8 @@
           <w:numId w:val="4"/>
         </w:numPr>
       </w:pPr>
-      <w:proofErr w:type="spellStart"/>
-      <w:r>
-        <w:t>Chờ</w:t>
-      </w:r>
-      <w:proofErr w:type="spellEnd"/>
-      <w:r>
-        <w:t xml:space="preserve"> </w:t>
-      </w:r>
-      <w:proofErr w:type="spellStart"/>
-      <w:r>
-        <w:t>duyệt</w:t>
-      </w:r>
-      <w:proofErr w:type="spellEnd"/>
-      <w:r>
-        <w:t xml:space="preserve"> SP: This contains all pending shop product and being waiting the admin page to approve</w:t>
+      <w:r>
+        <w:t>Chờ duyệt SP: This contains all pending shop product and being waiting the admin page to approve</w:t>
       </w:r>
       <w:r>
         <w:br/>
@@ -3777,7 +2670,7 @@
                     <pic:cNvPicPr/>
                   </pic:nvPicPr>
                   <pic:blipFill>
-                    <a:blip r:embed="rId44"/>
+                    <a:blip r:embed="rId45"/>
                     <a:stretch>
                       <a:fillRect/>
                     </a:stretch>
@@ -3806,29 +2699,16 @@
           <w:numId w:val="4"/>
         </w:numPr>
       </w:pPr>
-      <w:proofErr w:type="spellStart"/>
-      <w:r>
+      <w:r>
+        <w:t>Chờ duyệt shop: This is the pending status of the users requesting for become the seller.</w:t>
+      </w:r>
+    </w:p>
+    <w:p>
+      <w:r>
+        <w:rPr>
+          <w:noProof/>
+        </w:rPr>
         <w:lastRenderedPageBreak/>
-        <w:t>Chờ</w:t>
-      </w:r>
-      <w:proofErr w:type="spellEnd"/>
-      <w:r>
-        <w:t xml:space="preserve"> </w:t>
-      </w:r>
-      <w:proofErr w:type="spellStart"/>
-      <w:r>
-        <w:t>duyệt</w:t>
-      </w:r>
-      <w:proofErr w:type="spellEnd"/>
-      <w:r>
-        <w:t xml:space="preserve"> shop: This is the pending status of the users requesting for become the seller.</w:t>
-      </w:r>
-    </w:p>
-    <w:p>
-      <w:r>
-        <w:rPr>
-          <w:noProof/>
-        </w:rPr>
         <w:drawing>
           <wp:inline distT="0" distB="0" distL="0" distR="0" wp14:anchorId="028782AD" wp14:editId="7F040F09">
             <wp:extent cx="5943600" cy="3910965"/>
@@ -3845,7 +2725,7 @@
                     <pic:cNvPicPr/>
                   </pic:nvPicPr>
                   <pic:blipFill>
-                    <a:blip r:embed="rId45"/>
+                    <a:blip r:embed="rId46"/>
                     <a:stretch>
                       <a:fillRect/>
                     </a:stretch>
@@ -3875,23 +2755,7 @@
         </w:numPr>
       </w:pPr>
       <w:r>
-        <w:t>Details of “</w:t>
-      </w:r>
-      <w:proofErr w:type="spellStart"/>
-      <w:r>
-        <w:t>Người</w:t>
-      </w:r>
-      <w:proofErr w:type="spellEnd"/>
-      <w:r>
-        <w:t xml:space="preserve"> </w:t>
-      </w:r>
-      <w:proofErr w:type="spellStart"/>
-      <w:r>
-        <w:t>dùng</w:t>
-      </w:r>
-      <w:proofErr w:type="spellEnd"/>
-      <w:r>
-        <w:t xml:space="preserve">”: This shows very details of the user and many activities related to User management such as Lock, promote user to Admin, </w:t>
+        <w:t xml:space="preserve">Details of “Người dùng”: This shows very details of the user and many activities related to User management such as Lock, promote user to Admin, </w:t>
       </w:r>
       <w:r>
         <w:t>denote user seller back to normal users…</w:t>
@@ -3931,7 +2795,7 @@
                     <pic:cNvPicPr/>
                   </pic:nvPicPr>
                   <pic:blipFill>
-                    <a:blip r:embed="rId46"/>
+                    <a:blip r:embed="rId47"/>
                     <a:stretch>
                       <a:fillRect/>
                     </a:stretch>
@@ -4001,7 +2865,7 @@
                     <pic:cNvPicPr/>
                   </pic:nvPicPr>
                   <pic:blipFill>
-                    <a:blip r:embed="rId47"/>
+                    <a:blip r:embed="rId48"/>
                     <a:stretch>
                       <a:fillRect/>
                     </a:stretch>
@@ -4056,7 +2920,7 @@
                     <pic:cNvPicPr/>
                   </pic:nvPicPr>
                   <pic:blipFill>
-                    <a:blip r:embed="rId48"/>
+                    <a:blip r:embed="rId49"/>
                     <a:stretch>
                       <a:fillRect/>
                     </a:stretch>
@@ -4110,7 +2974,7 @@
                     <pic:cNvPicPr/>
                   </pic:nvPicPr>
                   <pic:blipFill>
-                    <a:blip r:embed="rId49"/>
+                    <a:blip r:embed="rId50"/>
                     <a:stretch>
                       <a:fillRect/>
                     </a:stretch>
@@ -4164,7 +3028,7 @@
                     <pic:cNvPicPr/>
                   </pic:nvPicPr>
                   <pic:blipFill>
-                    <a:blip r:embed="rId50"/>
+                    <a:blip r:embed="rId51"/>
                     <a:stretch>
                       <a:fillRect/>
                     </a:stretch>
@@ -4219,7 +3083,7 @@
                     <pic:cNvPicPr/>
                   </pic:nvPicPr>
                   <pic:blipFill>
-                    <a:blip r:embed="rId51"/>
+                    <a:blip r:embed="rId52"/>
                     <a:stretch>
                       <a:fillRect/>
                     </a:stretch>
@@ -4248,45 +3112,8 @@
           <w:numId w:val="4"/>
         </w:numPr>
       </w:pPr>
-      <w:proofErr w:type="spellStart"/>
-      <w:r>
-        <w:t>Tất</w:t>
-      </w:r>
-      <w:proofErr w:type="spellEnd"/>
-      <w:r>
-        <w:t xml:space="preserve"> </w:t>
-      </w:r>
-      <w:proofErr w:type="spellStart"/>
-      <w:r>
-        <w:t>cả</w:t>
-      </w:r>
-      <w:proofErr w:type="spellEnd"/>
-      <w:r>
-        <w:t xml:space="preserve"> </w:t>
-      </w:r>
-      <w:proofErr w:type="spellStart"/>
-      <w:r>
-        <w:t>sảm</w:t>
-      </w:r>
-      <w:proofErr w:type="spellEnd"/>
-      <w:r>
-        <w:t xml:space="preserve"> </w:t>
-      </w:r>
-      <w:proofErr w:type="spellStart"/>
-      <w:r>
-        <w:t>phẩm</w:t>
-      </w:r>
-      <w:proofErr w:type="spellEnd"/>
-      <w:r>
-        <w:t xml:space="preserve">: Show all available products from all sellers. This </w:t>
-      </w:r>
-      <w:proofErr w:type="gramStart"/>
-      <w:r>
-        <w:t>is also has</w:t>
-      </w:r>
-      <w:proofErr w:type="gramEnd"/>
-      <w:r>
-        <w:t xml:space="preserve"> the pagination and quick access to the product owner page (Seller page)</w:t>
+      <w:r>
+        <w:t>Tất cả sảm phẩm: Show all available products from all sellers. This is also has the pagination and quick access to the product owner page (Seller page)</w:t>
       </w:r>
     </w:p>
     <w:p>
@@ -4310,7 +3137,7 @@
                     <pic:cNvPicPr/>
                   </pic:nvPicPr>
                   <pic:blipFill>
-                    <a:blip r:embed="rId52"/>
+                    <a:blip r:embed="rId53"/>
                     <a:stretch>
                       <a:fillRect/>
                     </a:stretch>
@@ -4340,13 +3167,8 @@
           <w:numId w:val="4"/>
         </w:numPr>
       </w:pPr>
-      <w:proofErr w:type="spellStart"/>
-      <w:r>
-        <w:t>Duyệt</w:t>
-      </w:r>
-      <w:proofErr w:type="spellEnd"/>
-      <w:r>
-        <w:t xml:space="preserve"> shop: All seller </w:t>
+      <w:r>
+        <w:t xml:space="preserve">Duyệt shop: All seller </w:t>
       </w:r>
       <w:r>
         <w:t>products</w:t>
@@ -4377,7 +3199,7 @@
                     <pic:cNvPicPr/>
                   </pic:nvPicPr>
                   <pic:blipFill>
-                    <a:blip r:embed="rId53"/>
+                    <a:blip r:embed="rId54"/>
                     <a:stretch>
                       <a:fillRect/>
                     </a:stretch>
@@ -4406,13 +3228,8 @@
           <w:numId w:val="4"/>
         </w:numPr>
       </w:pPr>
-      <w:proofErr w:type="spellStart"/>
-      <w:r>
-        <w:t>Duyệt</w:t>
-      </w:r>
-      <w:proofErr w:type="spellEnd"/>
-      <w:r>
-        <w:t xml:space="preserve"> shop – </w:t>
+      <w:r>
+        <w:t xml:space="preserve">Duyệt shop – </w:t>
       </w:r>
       <w:r>
         <w:t>Become</w:t>
@@ -4444,7 +3261,7 @@
                     <pic:cNvPicPr/>
                   </pic:nvPicPr>
                   <pic:blipFill>
-                    <a:blip r:embed="rId54"/>
+                    <a:blip r:embed="rId55"/>
                     <a:stretch>
                       <a:fillRect/>
                     </a:stretch>
@@ -4467,15 +3284,7 @@
     </w:p>
     <w:p>
       <w:r>
-        <w:t xml:space="preserve">The below screenshot </w:t>
-      </w:r>
-      <w:proofErr w:type="gramStart"/>
-      <w:r>
-        <w:t>tell</w:t>
-      </w:r>
-      <w:proofErr w:type="gramEnd"/>
-      <w:r>
-        <w:t xml:space="preserve"> that the current there is not any pending request to become a seller…</w:t>
+        <w:t>The below screenshot tell that the current there is not any pending request to become a seller…</w:t>
       </w:r>
     </w:p>
     <w:p>
@@ -4500,7 +3309,7 @@
                     <pic:cNvPicPr/>
                   </pic:nvPicPr>
                   <pic:blipFill>
-                    <a:blip r:embed="rId55"/>
+                    <a:blip r:embed="rId56"/>
                     <a:stretch>
                       <a:fillRect/>
                     </a:stretch>
@@ -4557,7 +3366,7 @@
                     <pic:cNvPicPr/>
                   </pic:nvPicPr>
                   <pic:blipFill>
-                    <a:blip r:embed="rId56"/>
+                    <a:blip r:embed="rId57"/>
                     <a:stretch>
                       <a:fillRect/>
                     </a:stretch>
@@ -4588,21 +3397,8 @@
         </w:numPr>
       </w:pPr>
       <w:r>
-        <w:t xml:space="preserve">Báo </w:t>
-      </w:r>
-      <w:proofErr w:type="spellStart"/>
-      <w:r>
-        <w:t>cáo</w:t>
-      </w:r>
-      <w:proofErr w:type="spellEnd"/>
-      <w:r>
-        <w:t xml:space="preserve"> vi </w:t>
-      </w:r>
-      <w:proofErr w:type="spellStart"/>
-      <w:r>
-        <w:t>phạm</w:t>
-      </w:r>
-      <w:proofErr w:type="spellEnd"/>
+        <w:t>Báo cáo vi phạm</w:t>
+      </w:r>
       <w:r>
         <w:t>:</w:t>
       </w:r>
@@ -4629,7 +3425,7 @@
                     <pic:cNvPicPr/>
                   </pic:nvPicPr>
                   <pic:blipFill>
-                    <a:blip r:embed="rId57"/>
+                    <a:blip r:embed="rId58"/>
                     <a:stretch>
                       <a:fillRect/>
                     </a:stretch>
@@ -4660,29 +3456,8 @@
         </w:numPr>
       </w:pPr>
       <w:r>
-        <w:t xml:space="preserve">Quản </w:t>
-      </w:r>
-      <w:proofErr w:type="spellStart"/>
-      <w:r>
-        <w:t>lý</w:t>
-      </w:r>
-      <w:proofErr w:type="spellEnd"/>
-      <w:r>
-        <w:t xml:space="preserve"> </w:t>
-      </w:r>
-      <w:proofErr w:type="spellStart"/>
-      <w:r>
-        <w:t>đánh</w:t>
-      </w:r>
-      <w:proofErr w:type="spellEnd"/>
-      <w:r>
-        <w:t xml:space="preserve"> </w:t>
-      </w:r>
-      <w:proofErr w:type="spellStart"/>
-      <w:r>
-        <w:t>giá</w:t>
-      </w:r>
-      <w:proofErr w:type="spellEnd"/>
+        <w:t>Quản lý đánh giá</w:t>
+      </w:r>
       <w:r>
         <w:t>:</w:t>
       </w:r>
@@ -4708,7 +3483,7 @@
                     <pic:cNvPicPr/>
                   </pic:nvPicPr>
                   <pic:blipFill>
-                    <a:blip r:embed="rId58"/>
+                    <a:blip r:embed="rId59"/>
                     <a:stretch>
                       <a:fillRect/>
                     </a:stretch>
@@ -4738,23 +3513,7 @@
         </w:numPr>
       </w:pPr>
       <w:r>
-        <w:t xml:space="preserve">Quản </w:t>
-      </w:r>
-      <w:proofErr w:type="spellStart"/>
-      <w:r>
-        <w:t>lý</w:t>
-      </w:r>
-      <w:proofErr w:type="spellEnd"/>
-      <w:r>
-        <w:t xml:space="preserve"> </w:t>
-      </w:r>
-      <w:proofErr w:type="spellStart"/>
-      <w:r>
-        <w:t>nội</w:t>
-      </w:r>
-      <w:proofErr w:type="spellEnd"/>
-      <w:r>
-        <w:t xml:space="preserve"> dung</w:t>
+        <w:t>Quản lý nội dung</w:t>
       </w:r>
       <w:r>
         <w:t>:</w:t>
@@ -4782,7 +3541,7 @@
                     <pic:cNvPicPr/>
                   </pic:nvPicPr>
                   <pic:blipFill>
-                    <a:blip r:embed="rId59"/>
+                    <a:blip r:embed="rId60"/>
                     <a:stretch>
                       <a:fillRect/>
                     </a:stretch>
@@ -4813,55 +3572,7 @@
         </w:numPr>
       </w:pPr>
       <w:r>
-        <w:t xml:space="preserve">Danh </w:t>
-      </w:r>
-      <w:proofErr w:type="spellStart"/>
-      <w:r>
-        <w:t>mục</w:t>
-      </w:r>
-      <w:proofErr w:type="spellEnd"/>
-      <w:r>
-        <w:t xml:space="preserve"> </w:t>
-      </w:r>
-      <w:proofErr w:type="spellStart"/>
-      <w:r>
-        <w:t>báo</w:t>
-      </w:r>
-      <w:proofErr w:type="spellEnd"/>
-      <w:r>
-        <w:t xml:space="preserve"> </w:t>
-      </w:r>
-      <w:proofErr w:type="spellStart"/>
-      <w:r>
-        <w:t>cáo</w:t>
-      </w:r>
-      <w:proofErr w:type="spellEnd"/>
-      <w:r>
-        <w:t xml:space="preserve">: This helps the admin to configure the </w:t>
-      </w:r>
-      <w:proofErr w:type="gramStart"/>
-      <w:r>
-        <w:t>“ Danh</w:t>
-      </w:r>
-      <w:proofErr w:type="gramEnd"/>
-      <w:r>
-        <w:t xml:space="preserve"> </w:t>
-      </w:r>
-      <w:proofErr w:type="spellStart"/>
-      <w:r>
-        <w:t>Muc</w:t>
-      </w:r>
-      <w:proofErr w:type="spellEnd"/>
-      <w:r>
-        <w:t xml:space="preserve"> Bao Cáo” that help users have quick </w:t>
-      </w:r>
-      <w:proofErr w:type="gramStart"/>
-      <w:r>
-        <w:t>chose</w:t>
-      </w:r>
-      <w:proofErr w:type="gramEnd"/>
-      <w:r>
-        <w:t xml:space="preserve"> the category they want to report</w:t>
+        <w:t>Danh mục báo cáo: This helps the admin to configure the “ Danh Muc Bao Cáo” that help users have quick chose the category they want to report</w:t>
       </w:r>
     </w:p>
     <w:p/>
@@ -4887,7 +3598,7 @@
                     <pic:cNvPicPr/>
                   </pic:nvPicPr>
                   <pic:blipFill>
-                    <a:blip r:embed="rId60"/>
+                    <a:blip r:embed="rId61"/>
                     <a:stretch>
                       <a:fillRect/>
                     </a:stretch>
@@ -4918,31 +3629,7 @@
         </w:numPr>
       </w:pPr>
       <w:r>
-        <w:t xml:space="preserve">Nhật </w:t>
-      </w:r>
-      <w:proofErr w:type="spellStart"/>
-      <w:r>
-        <w:t>ký</w:t>
-      </w:r>
-      <w:proofErr w:type="spellEnd"/>
-      <w:r>
-        <w:t xml:space="preserve"> </w:t>
-      </w:r>
-      <w:proofErr w:type="spellStart"/>
-      <w:r>
-        <w:t>hệ</w:t>
-      </w:r>
-      <w:proofErr w:type="spellEnd"/>
-      <w:r>
-        <w:t xml:space="preserve"> </w:t>
-      </w:r>
-      <w:proofErr w:type="spellStart"/>
-      <w:r>
-        <w:t>thống</w:t>
-      </w:r>
-      <w:proofErr w:type="spellEnd"/>
-      <w:r>
-        <w:t>: This help admin to trach what activities were happened in the past</w:t>
+        <w:t>Nhật ký hệ thống: This help admin to trach what activities were happened in the past</w:t>
       </w:r>
     </w:p>
     <w:p>
@@ -4966,7 +3653,7 @@
                     <pic:cNvPicPr/>
                   </pic:nvPicPr>
                   <pic:blipFill>
-                    <a:blip r:embed="rId61"/>
+                    <a:blip r:embed="rId62"/>
                     <a:stretch>
                       <a:fillRect/>
                     </a:stretch>
@@ -5136,11 +3823,9 @@
             <w:hideMark/>
           </w:tcPr>
           <w:p>
-            <w:proofErr w:type="spellStart"/>
             <w:r>
               <w:t>audit_logs</w:t>
             </w:r>
-            <w:proofErr w:type="spellEnd"/>
           </w:p>
         </w:tc>
         <w:tc>
@@ -5173,11 +3858,9 @@
             <w:hideMark/>
           </w:tcPr>
           <w:p>
-            <w:proofErr w:type="spellStart"/>
             <w:r>
               <w:t>bank_accounts</w:t>
             </w:r>
-            <w:proofErr w:type="spellEnd"/>
           </w:p>
         </w:tc>
         <w:tc>
@@ -5245,11 +3928,9 @@
             <w:hideMark/>
           </w:tcPr>
           <w:p>
-            <w:proofErr w:type="spellStart"/>
             <w:r>
               <w:t>chat_messages</w:t>
             </w:r>
-            <w:proofErr w:type="spellEnd"/>
           </w:p>
         </w:tc>
         <w:tc>
@@ -5282,11 +3963,9 @@
             <w:hideMark/>
           </w:tcPr>
           <w:p>
-            <w:proofErr w:type="spellStart"/>
             <w:r>
               <w:t>content_nodes</w:t>
             </w:r>
-            <w:proofErr w:type="spellEnd"/>
           </w:p>
         </w:tc>
         <w:tc>
@@ -5319,11 +3998,9 @@
             <w:hideMark/>
           </w:tcPr>
           <w:p>
-            <w:proofErr w:type="spellStart"/>
             <w:r>
               <w:t>feedback_templates</w:t>
             </w:r>
-            <w:proofErr w:type="spellEnd"/>
           </w:p>
         </w:tc>
         <w:tc>
@@ -5356,11 +4033,9 @@
             <w:hideMark/>
           </w:tcPr>
           <w:p>
-            <w:proofErr w:type="spellStart"/>
             <w:r>
               <w:t>footer_icons</w:t>
             </w:r>
-            <w:proofErr w:type="spellEnd"/>
           </w:p>
         </w:tc>
         <w:tc>
@@ -5393,11 +4068,9 @@
             <w:hideMark/>
           </w:tcPr>
           <w:p>
-            <w:proofErr w:type="spellStart"/>
             <w:r>
               <w:t>footer_menus</w:t>
             </w:r>
-            <w:proofErr w:type="spellEnd"/>
           </w:p>
         </w:tc>
         <w:tc>
@@ -5430,11 +4103,9 @@
             <w:hideMark/>
           </w:tcPr>
           <w:p>
-            <w:proofErr w:type="spellStart"/>
             <w:r>
               <w:t>help_nodes</w:t>
             </w:r>
-            <w:proofErr w:type="spellEnd"/>
           </w:p>
         </w:tc>
         <w:tc>
@@ -5537,11 +4208,9 @@
             <w:hideMark/>
           </w:tcPr>
           <w:p>
-            <w:proofErr w:type="spellStart"/>
             <w:r>
               <w:t>password_reset_tokens</w:t>
             </w:r>
-            <w:proofErr w:type="spellEnd"/>
           </w:p>
         </w:tc>
         <w:tc>
@@ -5574,11 +4243,9 @@
             <w:hideMark/>
           </w:tcPr>
           <w:p>
-            <w:proofErr w:type="spellStart"/>
             <w:r>
               <w:t>product_reports</w:t>
             </w:r>
-            <w:proofErr w:type="spellEnd"/>
           </w:p>
         </w:tc>
         <w:tc>
@@ -5646,16 +4313,9 @@
             <w:hideMark/>
           </w:tcPr>
           <w:p>
-            <w:proofErr w:type="spellStart"/>
-            <w:proofErr w:type="gramStart"/>
             <w:r>
-              <w:t>report</w:t>
+              <w:t>report_reasons</w:t>
             </w:r>
-            <w:proofErr w:type="gramEnd"/>
-            <w:r>
-              <w:t>_reasons</w:t>
-            </w:r>
-            <w:proofErr w:type="spellEnd"/>
           </w:p>
         </w:tc>
         <w:tc>
@@ -5723,11 +4383,9 @@
             <w:hideMark/>
           </w:tcPr>
           <w:p>
-            <w:proofErr w:type="spellStart"/>
             <w:r>
               <w:t>shipping_methods</w:t>
             </w:r>
-            <w:proofErr w:type="spellEnd"/>
           </w:p>
         </w:tc>
         <w:tc>
@@ -5760,11 +4418,9 @@
             <w:hideMark/>
           </w:tcPr>
           <w:p>
-            <w:proofErr w:type="spellStart"/>
             <w:r>
               <w:t>system_contents</w:t>
             </w:r>
-            <w:proofErr w:type="spellEnd"/>
           </w:p>
         </w:tc>
         <w:tc>
@@ -5834,11 +4490,9 @@
             <w:vAlign w:val="center"/>
           </w:tcPr>
           <w:p>
-            <w:proofErr w:type="spellStart"/>
             <w:r>
               <w:t>withdrawal_requests</w:t>
             </w:r>
-            <w:proofErr w:type="spellEnd"/>
           </w:p>
         </w:tc>
         <w:tc>

</xml_diff>